<commit_message>
release: prepare Samsung Switch Watch v0.9.0-poc
</commit_message>
<xml_diff>
--- a/docs/SamsungSwitchWatch_User_Manual_KO.docx
+++ b/docs/SamsungSwitchWatch_User_Manual_KO.docx
@@ -532,7 +532,21 @@
         <w:rPr>
           <w:rFonts w:ascii="맑은 고딕" w:hAnsi="맑은 고딕" w:eastAsia="맑은 고딕" w:cs="맑은 고딕"/>
         </w:rPr>
-        <w:t>Viewer PC에서 Viewer를 실행하고 Agent 주소만 입력합니다. HTTPS/18443은 자동입니다.</w:t>
+        <w:t>Viewer PC에서 Viewer ZIP을 풀고 Install-or-Update-Viewer.cmd를 실행합니다.</w:t>
+      </w:r>
+    </w:p>
+    <w:p>
+      <w:pPr>
+        <w:numPr>
+          <w:ilvl w:val="0"/>
+          <w:numId w:val="12"/>
+        </w:numPr>
+      </w:pPr>
+      <w:r>
+        <w:rPr>
+          <w:rFonts w:ascii="맑은 고딕" w:hAnsi="맑은 고딕" w:eastAsia="맑은 고딕" w:cs="맑은 고딕"/>
+        </w:rPr>
+        <w:t>Viewer가 열리면 Agent 주소만 입력합니다. HTTPS/18443은 자동입니다.</w:t>
       </w:r>
     </w:p>
     <w:p>
@@ -1046,7 +1060,7 @@
           <w:color w:val="2E74B5"/>
           <w:sz w:val="32"/>
         </w:rPr>
-        <w:t>Agent 설치와 Viewer 연결</w:t>
+        <w:t>Agent와 Viewer 설치·연결</w:t>
       </w:r>
     </w:p>
     <w:p>
@@ -1172,6 +1186,93 @@
           <w:sz w:val="17"/>
         </w:rPr>
         <w:t>통신 포트            : HTTPS/TCP 18443</w:t>
+      </w:r>
+    </w:p>
+    <w:p>
+      <w:pPr>
+        <w:pStyle w:val="Heading2"/>
+        <w:numPr>
+          <w:ilvl w:val="1"/>
+          <w:numId w:val="11"/>
+        </w:numPr>
+      </w:pPr>
+      <w:r>
+        <w:rPr>
+          <w:rFonts w:ascii="맑은 고딕" w:hAnsi="맑은 고딕" w:eastAsia="맑은 고딕" w:cs="맑은 고딕"/>
+          <w:b/>
+          <w:color w:val="2E74B5"/>
+          <w:sz w:val="26"/>
+        </w:rPr>
+        <w:t>Viewer 설치</w:t>
+      </w:r>
+    </w:p>
+    <w:p>
+      <w:pPr>
+        <w:numPr>
+          <w:ilvl w:val="0"/>
+          <w:numId w:val="14"/>
+        </w:numPr>
+      </w:pPr>
+      <w:r>
+        <w:rPr>
+          <w:rFonts w:ascii="맑은 고딕" w:hAnsi="맑은 고딕" w:eastAsia="맑은 고딕" w:cs="맑은 고딕"/>
+        </w:rPr>
+        <w:t>Viewer 릴리스 ZIP을 운영자 PC의 임시 폴더에 압축 해제합니다.</w:t>
+      </w:r>
+    </w:p>
+    <w:p>
+      <w:pPr>
+        <w:numPr>
+          <w:ilvl w:val="0"/>
+          <w:numId w:val="14"/>
+        </w:numPr>
+      </w:pPr>
+      <w:r>
+        <w:rPr>
+          <w:rFonts w:ascii="맑은 고딕" w:hAnsi="맑은 고딕" w:eastAsia="맑은 고딕" w:cs="맑은 고딕"/>
+        </w:rPr>
+        <w:t>Install-or-Update-Viewer.cmd를 더블클릭합니다. 관리자 권한은 필요하지 않습니다.</w:t>
+      </w:r>
+    </w:p>
+    <w:p>
+      <w:pPr>
+        <w:numPr>
+          <w:ilvl w:val="0"/>
+          <w:numId w:val="14"/>
+        </w:numPr>
+      </w:pPr>
+      <w:r>
+        <w:rPr>
+          <w:rFonts w:ascii="맑은 고딕" w:hAnsi="맑은 고딕" w:eastAsia="맑은 고딕" w:cs="맑은 고딕"/>
+        </w:rPr>
+        <w:t>설치 완료 뒤 Viewer가 실행되고 다음 Windows 로그인부터 자동 시작되는지 확인합니다.</w:t>
+      </w:r>
+    </w:p>
+    <w:p>
+      <w:pPr>
+        <w:spacing w:before="80" w:after="160" w:line="283" w:lineRule="auto"/>
+        <w:ind w:left="115" w:right="58"/>
+        <w:shd w:fill="E8EEF5"/>
+        <w:pBdr>
+          <w:left w:val="single" w:sz="16" w:space="8" w:color="2E74B5"/>
+        </w:pBdr>
+      </w:pPr>
+      <w:r>
+        <w:rPr>
+          <w:rFonts w:ascii="맑은 고딕" w:hAnsi="맑은 고딕" w:eastAsia="맑은 고딕" w:cs="맑은 고딕"/>
+          <w:b/>
+          <w:color w:val="2E74B5"/>
+          <w:sz w:val="21"/>
+        </w:rPr>
+        <w:t xml:space="preserve">고급 설치  </w:t>
+      </w:r>
+      <w:r>
+        <w:rPr>
+          <w:rFonts w:ascii="맑은 고딕" w:hAnsi="맑은 고딕" w:eastAsia="맑은 고딕" w:cs="맑은 고딕"/>
+          <w:color w:val="16324F"/>
+          <w:sz w:val="21"/>
+        </w:rPr>
+        <w:t>설치 전 검사, 설치 위치 또는 자동 시작 상태를 직접 지정할 때만 INSTALL_KO.md의 install-viewer.ps1 옵션을 사용하세요.</w:t>
       </w:r>
     </w:p>
     <w:p>
@@ -2831,7 +2932,7 @@
                 <w:rFonts w:ascii="맑은 고딕" w:hAnsi="맑은 고딕" w:eastAsia="맑은 고딕" w:cs="맑은 고딕"/>
                 <w:sz w:val="18"/>
               </w:rPr>
-              <w:t>미지원이면 show syslog tail num 100 재시도</w:t>
+              <w:t>미지원이면 show syslog tail num 100, show log ram 순서로 재시도</w:t>
             </w:r>
           </w:p>
         </w:tc>
@@ -2867,7 +2968,21 @@
         <w:rPr>
           <w:rFonts w:ascii="맑은 고딕" w:hAnsi="맑은 고딕" w:eastAsia="맑은 고딕" w:cs="맑은 고딕"/>
         </w:rPr>
-        <w:t>포트 상태는 의미 있는 필드로 비교해 Up → Down, Down → Up을 표시합니다.</w:t>
+        <w:t>포트 상태는 의미 있는 필드로 비교합니다. 최초 Down은 기존 상태로 보고, 이후 Up → Down과 Down → Up만 표시합니다.</w:t>
+      </w:r>
+    </w:p>
+    <w:p>
+      <w:pPr>
+        <w:numPr>
+          <w:ilvl w:val="0"/>
+          <w:numId w:val="10"/>
+        </w:numPr>
+      </w:pPr>
+      <w:r>
+        <w:rPr>
+          <w:rFonts w:ascii="맑은 고딕" w:hAnsi="맑은 고딕" w:eastAsia="맑은 고딕" w:cs="맑은 고딕"/>
+        </w:rPr>
+        <w:t>중요 업링크로 지정되지 않은 일반 포트 변화는 장애가 아닌 경고로 표시하며, 케이블·상대 장비와 실제 사용 여부를 확인합니다.</w:t>
       </w:r>
     </w:p>
     <w:p>
@@ -3268,7 +3383,7 @@
                 <w:rFonts w:ascii="맑은 고딕" w:hAnsi="맑은 고딕" w:eastAsia="맑은 고딕" w:cs="맑은 고딕"/>
                 <w:sz w:val="18"/>
               </w:rPr>
-              <w:t>전체/정상/경고/장애/연결 끊김 수</w:t>
+              <w:t>현재 확인/마지막 확인, 정상/경고/장애/연결 끊김/미감시 수</w:t>
             </w:r>
           </w:p>
         </w:tc>
@@ -3320,7 +3435,7 @@
                 <w:rFonts w:ascii="맑은 고딕" w:hAnsi="맑은 고딕" w:eastAsia="맑은 고딕" w:cs="맑은 고딕"/>
                 <w:sz w:val="18"/>
               </w:rPr>
-              <w:t>등록 장비와 마지막 확인 상태</w:t>
+              <w:t>문제 우선으로 정렬된 등록 장비와 마지막 확인 시각</w:t>
             </w:r>
           </w:p>
         </w:tc>
@@ -3702,6 +3817,20 @@
           <w:rFonts w:ascii="맑은 고딕" w:hAnsi="맑은 고딕" w:eastAsia="맑은 고딕" w:cs="맑은 고딕"/>
         </w:rPr>
         <w:t>같은 장애 지속 중에는 팝업을 반복하지 않고 복구 시 별도 알림</w:t>
+      </w:r>
+    </w:p>
+    <w:p>
+      <w:pPr>
+        <w:numPr>
+          <w:ilvl w:val="0"/>
+          <w:numId w:val="10"/>
+        </w:numPr>
+      </w:pPr>
+      <w:r>
+        <w:rPr>
+          <w:rFonts w:ascii="맑은 고딕" w:hAnsi="맑은 고딕" w:eastAsia="맑은 고딕" w:cs="맑은 고딕"/>
+        </w:rPr>
+        <w:t>팝업 위에 마우스를 두거나 키보드 포커스가 있으면 읽는 동안 자동으로 닫히지 않음</w:t>
       </w:r>
     </w:p>
     <w:p>
@@ -4845,7 +4974,7 @@
                 <w:rFonts w:ascii="맑은 고딕" w:hAnsi="맑은 고딕" w:eastAsia="맑은 고딕" w:cs="맑은 고딕"/>
                 <w:sz w:val="18"/>
               </w:rPr>
-              <w:t>COMMAND_NOT_ALLOWED</w:t>
+              <w:t>QUERY_COMMAND_BLOCKED</w:t>
             </w:r>
           </w:p>
         </w:tc>
@@ -5057,7 +5186,7 @@
                 <w:rFonts w:ascii="맑은 고딕" w:hAnsi="맑은 고딕" w:eastAsia="맑은 고딕" w:cs="맑은 고딕"/>
                 <w:sz w:val="18"/>
               </w:rPr>
-              <w:t>OUTPUT_TRUNCATED</w:t>
+              <w:t>OUTPUT_LIMIT_EXCEEDED</w:t>
             </w:r>
           </w:p>
         </w:tc>
@@ -5082,7 +5211,113 @@
                 <w:rFonts w:ascii="맑은 고딕" w:hAnsi="맑은 고딕" w:eastAsia="맑은 고딕" w:cs="맑은 고딕"/>
                 <w:sz w:val="18"/>
               </w:rPr>
-              <w:t>64KiB를 넘지 않도록 더 좁은 show 명령 사용</w:t>
+              <w:t>세션 처리 안전 한도 초과. 더 좁은 show 명령 사용</w:t>
+            </w:r>
+          </w:p>
+        </w:tc>
+      </w:tr>
+      <w:tr>
+        <w:tc>
+          <w:tcPr>
+            <w:tcW w:type="dxa" w:w="2800"/>
+            <w:shd w:fill="FAFBFC"/>
+            <w:tcMar>
+              <w:top w:w="80" w:type="dxa"/>
+              <w:start w:w="120" w:type="dxa"/>
+              <w:bottom w:w="80" w:type="dxa"/>
+              <w:end w:w="120" w:type="dxa"/>
+            </w:tcMar>
+            <w:vAlign w:val="center"/>
+          </w:tcPr>
+          <w:p>
+            <w:pPr>
+              <w:spacing w:before="0" w:after="0" w:line="269" w:lineRule="auto"/>
+              <w:jc w:val="left"/>
+            </w:pPr>
+            <w:r>
+              <w:rPr>
+                <w:rFonts w:ascii="맑은 고딕" w:hAnsi="맑은 고딕" w:eastAsia="맑은 고딕" w:cs="맑은 고딕"/>
+                <w:sz w:val="18"/>
+              </w:rPr>
+              <w:t>VIEWER_DEVICE_STORE_CORRUPT</w:t>
+            </w:r>
+          </w:p>
+        </w:tc>
+        <w:tc>
+          <w:tcPr>
+            <w:tcW w:type="dxa" w:w="6560"/>
+            <w:shd w:fill="FAFBFC"/>
+            <w:tcMar>
+              <w:top w:w="80" w:type="dxa"/>
+              <w:start w:w="120" w:type="dxa"/>
+              <w:bottom w:w="80" w:type="dxa"/>
+              <w:end w:w="120" w:type="dxa"/>
+            </w:tcMar>
+            <w:vAlign w:val="center"/>
+          </w:tcPr>
+          <w:p>
+            <w:pPr>
+              <w:spacing w:before="0" w:after="0" w:line="269" w:lineRule="auto"/>
+              <w:jc w:val="left"/>
+            </w:pPr>
+            <w:r>
+              <w:rPr>
+                <w:rFonts w:ascii="맑은 고딕" w:hAnsi="맑은 고딕" w:eastAsia="맑은 고딕" w:cs="맑은 고딕"/>
+                <w:sz w:val="18"/>
+              </w:rPr>
+              <w:t>손상 파일은 자동 격리됨. 장비 관리에서 장비를 다시 등록</w:t>
+            </w:r>
+          </w:p>
+        </w:tc>
+      </w:tr>
+      <w:tr>
+        <w:tc>
+          <w:tcPr>
+            <w:tcW w:type="dxa" w:w="2800"/>
+            <w:tcMar>
+              <w:top w:w="80" w:type="dxa"/>
+              <w:start w:w="120" w:type="dxa"/>
+              <w:bottom w:w="80" w:type="dxa"/>
+              <w:end w:w="120" w:type="dxa"/>
+            </w:tcMar>
+            <w:vAlign w:val="center"/>
+          </w:tcPr>
+          <w:p>
+            <w:pPr>
+              <w:spacing w:before="0" w:after="0" w:line="269" w:lineRule="auto"/>
+              <w:jc w:val="left"/>
+            </w:pPr>
+            <w:r>
+              <w:rPr>
+                <w:rFonts w:ascii="맑은 고딕" w:hAnsi="맑은 고딕" w:eastAsia="맑은 고딕" w:cs="맑은 고딕"/>
+                <w:sz w:val="18"/>
+              </w:rPr>
+              <w:t>VIEWER_DEVICE_STORE_UNAVAILABLE</w:t>
+            </w:r>
+          </w:p>
+        </w:tc>
+        <w:tc>
+          <w:tcPr>
+            <w:tcW w:type="dxa" w:w="6560"/>
+            <w:tcMar>
+              <w:top w:w="80" w:type="dxa"/>
+              <w:start w:w="120" w:type="dxa"/>
+              <w:bottom w:w="80" w:type="dxa"/>
+              <w:end w:w="120" w:type="dxa"/>
+            </w:tcMar>
+            <w:vAlign w:val="center"/>
+          </w:tcPr>
+          <w:p>
+            <w:pPr>
+              <w:spacing w:before="0" w:after="0" w:line="269" w:lineRule="auto"/>
+              <w:jc w:val="left"/>
+            </w:pPr>
+            <w:r>
+              <w:rPr>
+                <w:rFonts w:ascii="맑은 고딕" w:hAnsi="맑은 고딕" w:eastAsia="맑은 고딕" w:cs="맑은 고딕"/>
+                <w:sz w:val="18"/>
+              </w:rPr>
+              <w:t>Viewer 사용자 폴더의 파일 권한과 다른 프로세스의 잠금 확인</w:t>
             </w:r>
           </w:p>
         </w:tc>
@@ -5197,7 +5432,7 @@
       <w:pPr>
         <w:numPr>
           <w:ilvl w:val="0"/>
-          <w:numId w:val="14"/>
+          <w:numId w:val="15"/>
         </w:numPr>
       </w:pPr>
       <w:r>
@@ -5211,7 +5446,7 @@
       <w:pPr>
         <w:numPr>
           <w:ilvl w:val="0"/>
-          <w:numId w:val="14"/>
+          <w:numId w:val="15"/>
         </w:numPr>
       </w:pPr>
       <w:r>
@@ -5225,21 +5460,21 @@
       <w:pPr>
         <w:numPr>
           <w:ilvl w:val="0"/>
-          <w:numId w:val="14"/>
+          <w:numId w:val="15"/>
         </w:numPr>
       </w:pPr>
       <w:r>
         <w:rPr>
           <w:rFonts w:ascii="맑은 고딕" w:hAnsi="맑은 고딕" w:eastAsia="맑은 고딕" w:cs="맑은 고딕"/>
         </w:rPr>
-        <w:t>Viewer PC에서 기존 Viewer를 종료하고 새 Viewer 패키지의 설치 스크립트를 실행합니다.</w:t>
+        <w:t>Viewer PC에서 새 Viewer 패키지의 Install-or-Update-Viewer.cmd를 실행합니다.</w:t>
       </w:r>
     </w:p>
     <w:p>
       <w:pPr>
         <w:numPr>
           <w:ilvl w:val="0"/>
-          <w:numId w:val="14"/>
+          <w:numId w:val="15"/>
         </w:numPr>
       </w:pPr>
       <w:r>
@@ -5501,7 +5736,7 @@
         <w:color w:val="64748B"/>
         <w:sz w:val="17"/>
       </w:rPr>
-      <w:t xml:space="preserve">v0.8.0-poc  |  </w:t>
+      <w:t xml:space="preserve">v0.9.0-poc  |  </w:t>
     </w:r>
     <w:r>
       <w:rPr>
@@ -5532,7 +5767,7 @@
         <w:color w:val="64748B"/>
         <w:sz w:val="17"/>
       </w:rPr>
-      <w:t>v0.8.0-poc  |  2026-07-23</w:t>
+      <w:t>v0.9.0-poc  |  2026-07-23</w:t>
     </w:r>
   </w:p>
 </w:ftr>
@@ -5875,6 +6110,26 @@
       </w:rPr>
     </w:lvl>
   </w:abstractNum>
+  <w:abstractNum w:abstractNumId="14">
+    <w:multiLevelType w:val="singleLevel"/>
+    <w:lvl w:ilvl="0">
+      <w:start w:val="1"/>
+      <w:numFmt w:val="decimal"/>
+      <w:lvlText w:val="%1."/>
+      <w:lvlJc w:val="left"/>
+      <w:suff w:val="tab"/>
+      <w:pPr>
+        <w:tabs>
+          <w:tab w:val="num" w:pos="540"/>
+        </w:tabs>
+        <w:ind w:left="540" w:hanging="270"/>
+        <w:spacing w:after="80" w:line="300" w:lineRule="auto"/>
+      </w:pPr>
+      <w:rPr>
+        <w:rFonts w:ascii="맑은 고딕" w:hAnsi="맑은 고딕" w:eastAsia="맑은 고딕"/>
+      </w:rPr>
+    </w:lvl>
+  </w:abstractNum>
   <w:num w:numId="1">
     <w:abstractNumId w:val="8"/>
   </w:num>
@@ -5916,6 +6171,9 @@
   </w:num>
   <w:num w:numId="14">
     <w:abstractNumId w:val="13"/>
+  </w:num>
+  <w:num w:numId="15">
+    <w:abstractNumId w:val="14"/>
   </w:num>
 </w:numbering>
 </file>

</xml_diff>

<commit_message>
release: prepare Samsung Switch Watch v0.9.0-poc (#10)
</commit_message>
<xml_diff>
--- a/docs/SamsungSwitchWatch_User_Manual_KO.docx
+++ b/docs/SamsungSwitchWatch_User_Manual_KO.docx
@@ -532,7 +532,21 @@
         <w:rPr>
           <w:rFonts w:ascii="맑은 고딕" w:hAnsi="맑은 고딕" w:eastAsia="맑은 고딕" w:cs="맑은 고딕"/>
         </w:rPr>
-        <w:t>Viewer PC에서 Viewer를 실행하고 Agent 주소만 입력합니다. HTTPS/18443은 자동입니다.</w:t>
+        <w:t>Viewer PC에서 Viewer ZIP을 풀고 Install-or-Update-Viewer.cmd를 실행합니다.</w:t>
+      </w:r>
+    </w:p>
+    <w:p>
+      <w:pPr>
+        <w:numPr>
+          <w:ilvl w:val="0"/>
+          <w:numId w:val="12"/>
+        </w:numPr>
+      </w:pPr>
+      <w:r>
+        <w:rPr>
+          <w:rFonts w:ascii="맑은 고딕" w:hAnsi="맑은 고딕" w:eastAsia="맑은 고딕" w:cs="맑은 고딕"/>
+        </w:rPr>
+        <w:t>Viewer가 열리면 Agent 주소만 입력합니다. HTTPS/18443은 자동입니다.</w:t>
       </w:r>
     </w:p>
     <w:p>
@@ -1046,7 +1060,7 @@
           <w:color w:val="2E74B5"/>
           <w:sz w:val="32"/>
         </w:rPr>
-        <w:t>Agent 설치와 Viewer 연결</w:t>
+        <w:t>Agent와 Viewer 설치·연결</w:t>
       </w:r>
     </w:p>
     <w:p>
@@ -1172,6 +1186,93 @@
           <w:sz w:val="17"/>
         </w:rPr>
         <w:t>통신 포트            : HTTPS/TCP 18443</w:t>
+      </w:r>
+    </w:p>
+    <w:p>
+      <w:pPr>
+        <w:pStyle w:val="Heading2"/>
+        <w:numPr>
+          <w:ilvl w:val="1"/>
+          <w:numId w:val="11"/>
+        </w:numPr>
+      </w:pPr>
+      <w:r>
+        <w:rPr>
+          <w:rFonts w:ascii="맑은 고딕" w:hAnsi="맑은 고딕" w:eastAsia="맑은 고딕" w:cs="맑은 고딕"/>
+          <w:b/>
+          <w:color w:val="2E74B5"/>
+          <w:sz w:val="26"/>
+        </w:rPr>
+        <w:t>Viewer 설치</w:t>
+      </w:r>
+    </w:p>
+    <w:p>
+      <w:pPr>
+        <w:numPr>
+          <w:ilvl w:val="0"/>
+          <w:numId w:val="14"/>
+        </w:numPr>
+      </w:pPr>
+      <w:r>
+        <w:rPr>
+          <w:rFonts w:ascii="맑은 고딕" w:hAnsi="맑은 고딕" w:eastAsia="맑은 고딕" w:cs="맑은 고딕"/>
+        </w:rPr>
+        <w:t>Viewer 릴리스 ZIP을 운영자 PC의 임시 폴더에 압축 해제합니다.</w:t>
+      </w:r>
+    </w:p>
+    <w:p>
+      <w:pPr>
+        <w:numPr>
+          <w:ilvl w:val="0"/>
+          <w:numId w:val="14"/>
+        </w:numPr>
+      </w:pPr>
+      <w:r>
+        <w:rPr>
+          <w:rFonts w:ascii="맑은 고딕" w:hAnsi="맑은 고딕" w:eastAsia="맑은 고딕" w:cs="맑은 고딕"/>
+        </w:rPr>
+        <w:t>Install-or-Update-Viewer.cmd를 더블클릭합니다. 관리자 권한은 필요하지 않습니다.</w:t>
+      </w:r>
+    </w:p>
+    <w:p>
+      <w:pPr>
+        <w:numPr>
+          <w:ilvl w:val="0"/>
+          <w:numId w:val="14"/>
+        </w:numPr>
+      </w:pPr>
+      <w:r>
+        <w:rPr>
+          <w:rFonts w:ascii="맑은 고딕" w:hAnsi="맑은 고딕" w:eastAsia="맑은 고딕" w:cs="맑은 고딕"/>
+        </w:rPr>
+        <w:t>설치 완료 뒤 Viewer가 실행되고 다음 Windows 로그인부터 자동 시작되는지 확인합니다.</w:t>
+      </w:r>
+    </w:p>
+    <w:p>
+      <w:pPr>
+        <w:spacing w:before="80" w:after="160" w:line="283" w:lineRule="auto"/>
+        <w:ind w:left="115" w:right="58"/>
+        <w:shd w:fill="E8EEF5"/>
+        <w:pBdr>
+          <w:left w:val="single" w:sz="16" w:space="8" w:color="2E74B5"/>
+        </w:pBdr>
+      </w:pPr>
+      <w:r>
+        <w:rPr>
+          <w:rFonts w:ascii="맑은 고딕" w:hAnsi="맑은 고딕" w:eastAsia="맑은 고딕" w:cs="맑은 고딕"/>
+          <w:b/>
+          <w:color w:val="2E74B5"/>
+          <w:sz w:val="21"/>
+        </w:rPr>
+        <w:t xml:space="preserve">고급 설치  </w:t>
+      </w:r>
+      <w:r>
+        <w:rPr>
+          <w:rFonts w:ascii="맑은 고딕" w:hAnsi="맑은 고딕" w:eastAsia="맑은 고딕" w:cs="맑은 고딕"/>
+          <w:color w:val="16324F"/>
+          <w:sz w:val="21"/>
+        </w:rPr>
+        <w:t>설치 전 검사, 설치 위치 또는 자동 시작 상태를 직접 지정할 때만 INSTALL_KO.md의 install-viewer.ps1 옵션을 사용하세요.</w:t>
       </w:r>
     </w:p>
     <w:p>
@@ -2831,7 +2932,7 @@
                 <w:rFonts w:ascii="맑은 고딕" w:hAnsi="맑은 고딕" w:eastAsia="맑은 고딕" w:cs="맑은 고딕"/>
                 <w:sz w:val="18"/>
               </w:rPr>
-              <w:t>미지원이면 show syslog tail num 100 재시도</w:t>
+              <w:t>미지원이면 show syslog tail num 100, show log ram 순서로 재시도</w:t>
             </w:r>
           </w:p>
         </w:tc>
@@ -2867,7 +2968,21 @@
         <w:rPr>
           <w:rFonts w:ascii="맑은 고딕" w:hAnsi="맑은 고딕" w:eastAsia="맑은 고딕" w:cs="맑은 고딕"/>
         </w:rPr>
-        <w:t>포트 상태는 의미 있는 필드로 비교해 Up → Down, Down → Up을 표시합니다.</w:t>
+        <w:t>포트 상태는 의미 있는 필드로 비교합니다. 최초 Down은 기존 상태로 보고, 이후 Up → Down과 Down → Up만 표시합니다.</w:t>
+      </w:r>
+    </w:p>
+    <w:p>
+      <w:pPr>
+        <w:numPr>
+          <w:ilvl w:val="0"/>
+          <w:numId w:val="10"/>
+        </w:numPr>
+      </w:pPr>
+      <w:r>
+        <w:rPr>
+          <w:rFonts w:ascii="맑은 고딕" w:hAnsi="맑은 고딕" w:eastAsia="맑은 고딕" w:cs="맑은 고딕"/>
+        </w:rPr>
+        <w:t>중요 업링크로 지정되지 않은 일반 포트 변화는 장애가 아닌 경고로 표시하며, 케이블·상대 장비와 실제 사용 여부를 확인합니다.</w:t>
       </w:r>
     </w:p>
     <w:p>
@@ -3268,7 +3383,7 @@
                 <w:rFonts w:ascii="맑은 고딕" w:hAnsi="맑은 고딕" w:eastAsia="맑은 고딕" w:cs="맑은 고딕"/>
                 <w:sz w:val="18"/>
               </w:rPr>
-              <w:t>전체/정상/경고/장애/연결 끊김 수</w:t>
+              <w:t>현재 확인/마지막 확인, 정상/경고/장애/연결 끊김/미감시 수</w:t>
             </w:r>
           </w:p>
         </w:tc>
@@ -3320,7 +3435,7 @@
                 <w:rFonts w:ascii="맑은 고딕" w:hAnsi="맑은 고딕" w:eastAsia="맑은 고딕" w:cs="맑은 고딕"/>
                 <w:sz w:val="18"/>
               </w:rPr>
-              <w:t>등록 장비와 마지막 확인 상태</w:t>
+              <w:t>문제 우선으로 정렬된 등록 장비와 마지막 확인 시각</w:t>
             </w:r>
           </w:p>
         </w:tc>
@@ -3702,6 +3817,20 @@
           <w:rFonts w:ascii="맑은 고딕" w:hAnsi="맑은 고딕" w:eastAsia="맑은 고딕" w:cs="맑은 고딕"/>
         </w:rPr>
         <w:t>같은 장애 지속 중에는 팝업을 반복하지 않고 복구 시 별도 알림</w:t>
+      </w:r>
+    </w:p>
+    <w:p>
+      <w:pPr>
+        <w:numPr>
+          <w:ilvl w:val="0"/>
+          <w:numId w:val="10"/>
+        </w:numPr>
+      </w:pPr>
+      <w:r>
+        <w:rPr>
+          <w:rFonts w:ascii="맑은 고딕" w:hAnsi="맑은 고딕" w:eastAsia="맑은 고딕" w:cs="맑은 고딕"/>
+        </w:rPr>
+        <w:t>팝업 위에 마우스를 두거나 키보드 포커스가 있으면 읽는 동안 자동으로 닫히지 않음</w:t>
       </w:r>
     </w:p>
     <w:p>
@@ -4845,7 +4974,7 @@
                 <w:rFonts w:ascii="맑은 고딕" w:hAnsi="맑은 고딕" w:eastAsia="맑은 고딕" w:cs="맑은 고딕"/>
                 <w:sz w:val="18"/>
               </w:rPr>
-              <w:t>COMMAND_NOT_ALLOWED</w:t>
+              <w:t>QUERY_COMMAND_BLOCKED</w:t>
             </w:r>
           </w:p>
         </w:tc>
@@ -5057,7 +5186,7 @@
                 <w:rFonts w:ascii="맑은 고딕" w:hAnsi="맑은 고딕" w:eastAsia="맑은 고딕" w:cs="맑은 고딕"/>
                 <w:sz w:val="18"/>
               </w:rPr>
-              <w:t>OUTPUT_TRUNCATED</w:t>
+              <w:t>OUTPUT_LIMIT_EXCEEDED</w:t>
             </w:r>
           </w:p>
         </w:tc>
@@ -5082,7 +5211,113 @@
                 <w:rFonts w:ascii="맑은 고딕" w:hAnsi="맑은 고딕" w:eastAsia="맑은 고딕" w:cs="맑은 고딕"/>
                 <w:sz w:val="18"/>
               </w:rPr>
-              <w:t>64KiB를 넘지 않도록 더 좁은 show 명령 사용</w:t>
+              <w:t>세션 처리 안전 한도 초과. 더 좁은 show 명령 사용</w:t>
+            </w:r>
+          </w:p>
+        </w:tc>
+      </w:tr>
+      <w:tr>
+        <w:tc>
+          <w:tcPr>
+            <w:tcW w:type="dxa" w:w="2800"/>
+            <w:shd w:fill="FAFBFC"/>
+            <w:tcMar>
+              <w:top w:w="80" w:type="dxa"/>
+              <w:start w:w="120" w:type="dxa"/>
+              <w:bottom w:w="80" w:type="dxa"/>
+              <w:end w:w="120" w:type="dxa"/>
+            </w:tcMar>
+            <w:vAlign w:val="center"/>
+          </w:tcPr>
+          <w:p>
+            <w:pPr>
+              <w:spacing w:before="0" w:after="0" w:line="269" w:lineRule="auto"/>
+              <w:jc w:val="left"/>
+            </w:pPr>
+            <w:r>
+              <w:rPr>
+                <w:rFonts w:ascii="맑은 고딕" w:hAnsi="맑은 고딕" w:eastAsia="맑은 고딕" w:cs="맑은 고딕"/>
+                <w:sz w:val="18"/>
+              </w:rPr>
+              <w:t>VIEWER_DEVICE_STORE_CORRUPT</w:t>
+            </w:r>
+          </w:p>
+        </w:tc>
+        <w:tc>
+          <w:tcPr>
+            <w:tcW w:type="dxa" w:w="6560"/>
+            <w:shd w:fill="FAFBFC"/>
+            <w:tcMar>
+              <w:top w:w="80" w:type="dxa"/>
+              <w:start w:w="120" w:type="dxa"/>
+              <w:bottom w:w="80" w:type="dxa"/>
+              <w:end w:w="120" w:type="dxa"/>
+            </w:tcMar>
+            <w:vAlign w:val="center"/>
+          </w:tcPr>
+          <w:p>
+            <w:pPr>
+              <w:spacing w:before="0" w:after="0" w:line="269" w:lineRule="auto"/>
+              <w:jc w:val="left"/>
+            </w:pPr>
+            <w:r>
+              <w:rPr>
+                <w:rFonts w:ascii="맑은 고딕" w:hAnsi="맑은 고딕" w:eastAsia="맑은 고딕" w:cs="맑은 고딕"/>
+                <w:sz w:val="18"/>
+              </w:rPr>
+              <w:t>손상 파일은 자동 격리됨. 장비 관리에서 장비를 다시 등록</w:t>
+            </w:r>
+          </w:p>
+        </w:tc>
+      </w:tr>
+      <w:tr>
+        <w:tc>
+          <w:tcPr>
+            <w:tcW w:type="dxa" w:w="2800"/>
+            <w:tcMar>
+              <w:top w:w="80" w:type="dxa"/>
+              <w:start w:w="120" w:type="dxa"/>
+              <w:bottom w:w="80" w:type="dxa"/>
+              <w:end w:w="120" w:type="dxa"/>
+            </w:tcMar>
+            <w:vAlign w:val="center"/>
+          </w:tcPr>
+          <w:p>
+            <w:pPr>
+              <w:spacing w:before="0" w:after="0" w:line="269" w:lineRule="auto"/>
+              <w:jc w:val="left"/>
+            </w:pPr>
+            <w:r>
+              <w:rPr>
+                <w:rFonts w:ascii="맑은 고딕" w:hAnsi="맑은 고딕" w:eastAsia="맑은 고딕" w:cs="맑은 고딕"/>
+                <w:sz w:val="18"/>
+              </w:rPr>
+              <w:t>VIEWER_DEVICE_STORE_UNAVAILABLE</w:t>
+            </w:r>
+          </w:p>
+        </w:tc>
+        <w:tc>
+          <w:tcPr>
+            <w:tcW w:type="dxa" w:w="6560"/>
+            <w:tcMar>
+              <w:top w:w="80" w:type="dxa"/>
+              <w:start w:w="120" w:type="dxa"/>
+              <w:bottom w:w="80" w:type="dxa"/>
+              <w:end w:w="120" w:type="dxa"/>
+            </w:tcMar>
+            <w:vAlign w:val="center"/>
+          </w:tcPr>
+          <w:p>
+            <w:pPr>
+              <w:spacing w:before="0" w:after="0" w:line="269" w:lineRule="auto"/>
+              <w:jc w:val="left"/>
+            </w:pPr>
+            <w:r>
+              <w:rPr>
+                <w:rFonts w:ascii="맑은 고딕" w:hAnsi="맑은 고딕" w:eastAsia="맑은 고딕" w:cs="맑은 고딕"/>
+                <w:sz w:val="18"/>
+              </w:rPr>
+              <w:t>Viewer 사용자 폴더의 파일 권한과 다른 프로세스의 잠금 확인</w:t>
             </w:r>
           </w:p>
         </w:tc>
@@ -5197,7 +5432,7 @@
       <w:pPr>
         <w:numPr>
           <w:ilvl w:val="0"/>
-          <w:numId w:val="14"/>
+          <w:numId w:val="15"/>
         </w:numPr>
       </w:pPr>
       <w:r>
@@ -5211,7 +5446,7 @@
       <w:pPr>
         <w:numPr>
           <w:ilvl w:val="0"/>
-          <w:numId w:val="14"/>
+          <w:numId w:val="15"/>
         </w:numPr>
       </w:pPr>
       <w:r>
@@ -5225,21 +5460,21 @@
       <w:pPr>
         <w:numPr>
           <w:ilvl w:val="0"/>
-          <w:numId w:val="14"/>
+          <w:numId w:val="15"/>
         </w:numPr>
       </w:pPr>
       <w:r>
         <w:rPr>
           <w:rFonts w:ascii="맑은 고딕" w:hAnsi="맑은 고딕" w:eastAsia="맑은 고딕" w:cs="맑은 고딕"/>
         </w:rPr>
-        <w:t>Viewer PC에서 기존 Viewer를 종료하고 새 Viewer 패키지의 설치 스크립트를 실행합니다.</w:t>
+        <w:t>Viewer PC에서 새 Viewer 패키지의 Install-or-Update-Viewer.cmd를 실행합니다.</w:t>
       </w:r>
     </w:p>
     <w:p>
       <w:pPr>
         <w:numPr>
           <w:ilvl w:val="0"/>
-          <w:numId w:val="14"/>
+          <w:numId w:val="15"/>
         </w:numPr>
       </w:pPr>
       <w:r>
@@ -5501,7 +5736,7 @@
         <w:color w:val="64748B"/>
         <w:sz w:val="17"/>
       </w:rPr>
-      <w:t xml:space="preserve">v0.8.0-poc  |  </w:t>
+      <w:t xml:space="preserve">v0.9.0-poc  |  </w:t>
     </w:r>
     <w:r>
       <w:rPr>
@@ -5532,7 +5767,7 @@
         <w:color w:val="64748B"/>
         <w:sz w:val="17"/>
       </w:rPr>
-      <w:t>v0.8.0-poc  |  2026-07-23</w:t>
+      <w:t>v0.9.0-poc  |  2026-07-23</w:t>
     </w:r>
   </w:p>
 </w:ftr>
@@ -5875,6 +6110,26 @@
       </w:rPr>
     </w:lvl>
   </w:abstractNum>
+  <w:abstractNum w:abstractNumId="14">
+    <w:multiLevelType w:val="singleLevel"/>
+    <w:lvl w:ilvl="0">
+      <w:start w:val="1"/>
+      <w:numFmt w:val="decimal"/>
+      <w:lvlText w:val="%1."/>
+      <w:lvlJc w:val="left"/>
+      <w:suff w:val="tab"/>
+      <w:pPr>
+        <w:tabs>
+          <w:tab w:val="num" w:pos="540"/>
+        </w:tabs>
+        <w:ind w:left="540" w:hanging="270"/>
+        <w:spacing w:after="80" w:line="300" w:lineRule="auto"/>
+      </w:pPr>
+      <w:rPr>
+        <w:rFonts w:ascii="맑은 고딕" w:hAnsi="맑은 고딕" w:eastAsia="맑은 고딕"/>
+      </w:rPr>
+    </w:lvl>
+  </w:abstractNum>
   <w:num w:numId="1">
     <w:abstractNumId w:val="8"/>
   </w:num>
@@ -5916,6 +6171,9 @@
   </w:num>
   <w:num w:numId="14">
     <w:abstractNumId w:val="13"/>
+  </w:num>
+  <w:num w:numId="15">
+    <w:abstractNumId w:val="14"/>
   </w:num>
 </w:numbering>
 </file>

</xml_diff>

<commit_message>
fix: preserve active monitoring events
</commit_message>
<xml_diff>
--- a/docs/SamsungSwitchWatch_User_Manual_KO.docx
+++ b/docs/SamsungSwitchWatch_User_Manual_KO.docx
@@ -5736,7 +5736,7 @@
         <w:color w:val="64748B"/>
         <w:sz w:val="17"/>
       </w:rPr>
-      <w:t xml:space="preserve">v0.9.0-poc  |  </w:t>
+      <w:t xml:space="preserve">v0.9.1-poc  |  </w:t>
     </w:r>
     <w:r>
       <w:rPr>
@@ -5767,7 +5767,7 @@
         <w:color w:val="64748B"/>
         <w:sz w:val="17"/>
       </w:rPr>
-      <w:t>v0.9.0-poc  |  2026-07-23</w:t>
+      <w:t>v0.9.1-poc  |  2026-07-23</w:t>
     </w:r>
   </w:p>
 </w:ftr>

</xml_diff>

<commit_message>
fix: preserve active monitoring events (#11)
</commit_message>
<xml_diff>
--- a/docs/SamsungSwitchWatch_User_Manual_KO.docx
+++ b/docs/SamsungSwitchWatch_User_Manual_KO.docx
@@ -5736,7 +5736,7 @@
         <w:color w:val="64748B"/>
         <w:sz w:val="17"/>
       </w:rPr>
-      <w:t xml:space="preserve">v0.9.0-poc  |  </w:t>
+      <w:t xml:space="preserve">v0.9.1-poc  |  </w:t>
     </w:r>
     <w:r>
       <w:rPr>
@@ -5767,7 +5767,7 @@
         <w:color w:val="64748B"/>
         <w:sz w:val="17"/>
       </w:rPr>
-      <w:t>v0.9.0-poc  |  2026-07-23</w:t>
+      <w:t>v0.9.1-poc  |  2026-07-23</w:t>
     </w:r>
   </w:p>
 </w:ftr>

</xml_diff>

<commit_message>
fix: retry release attestation verification
</commit_message>
<xml_diff>
--- a/docs/SamsungSwitchWatch_User_Manual_KO.docx
+++ b/docs/SamsungSwitchWatch_User_Manual_KO.docx
@@ -5736,7 +5736,7 @@
         <w:color w:val="64748B"/>
         <w:sz w:val="17"/>
       </w:rPr>
-      <w:t xml:space="preserve">v0.9.1-poc  |  </w:t>
+      <w:t xml:space="preserve">v0.9.2-poc  |  </w:t>
     </w:r>
     <w:r>
       <w:rPr>
@@ -5767,7 +5767,7 @@
         <w:color w:val="64748B"/>
         <w:sz w:val="17"/>
       </w:rPr>
-      <w:t>v0.9.1-poc  |  2026-07-23</w:t>
+      <w:t>v0.9.2-poc  |  2026-07-23</w:t>
     </w:r>
   </w:p>
 </w:ftr>

</xml_diff>

<commit_message>
fix: retry release attestation verification (#12)
</commit_message>
<xml_diff>
--- a/docs/SamsungSwitchWatch_User_Manual_KO.docx
+++ b/docs/SamsungSwitchWatch_User_Manual_KO.docx
@@ -5736,7 +5736,7 @@
         <w:color w:val="64748B"/>
         <w:sz w:val="17"/>
       </w:rPr>
-      <w:t xml:space="preserve">v0.9.1-poc  |  </w:t>
+      <w:t xml:space="preserve">v0.9.2-poc  |  </w:t>
     </w:r>
     <w:r>
       <w:rPr>
@@ -5767,7 +5767,7 @@
         <w:color w:val="64748B"/>
         <w:sz w:val="17"/>
       </w:rPr>
-      <w:t>v0.9.1-poc  |  2026-07-23</w:t>
+      <w:t>v0.9.2-poc  |  2026-07-23</w:t>
     </w:r>
   </w:p>
 </w:ftr>

</xml_diff>

<commit_message>
fix: recover interrupted Agent identity creation
</commit_message>
<xml_diff>
--- a/docs/SamsungSwitchWatch_User_Manual_KO.docx
+++ b/docs/SamsungSwitchWatch_User_Manual_KO.docx
@@ -5736,7 +5736,7 @@
         <w:color w:val="64748B"/>
         <w:sz w:val="17"/>
       </w:rPr>
-      <w:t xml:space="preserve">v0.9.2-poc  |  </w:t>
+      <w:t xml:space="preserve">v0.9.3-poc  |  </w:t>
     </w:r>
     <w:r>
       <w:rPr>
@@ -5767,7 +5767,7 @@
         <w:color w:val="64748B"/>
         <w:sz w:val="17"/>
       </w:rPr>
-      <w:t>v0.9.2-poc  |  2026-07-23</w:t>
+      <w:t>v0.9.3-poc  |  2026-07-23</w:t>
     </w:r>
   </w:p>
 </w:ftr>

</xml_diff>

<commit_message>
fix: recover interrupted Agent identity creation (#13)
</commit_message>
<xml_diff>
--- a/docs/SamsungSwitchWatch_User_Manual_KO.docx
+++ b/docs/SamsungSwitchWatch_User_Manual_KO.docx
@@ -5736,7 +5736,7 @@
         <w:color w:val="64748B"/>
         <w:sz w:val="17"/>
       </w:rPr>
-      <w:t xml:space="preserve">v0.9.2-poc  |  </w:t>
+      <w:t xml:space="preserve">v0.9.3-poc  |  </w:t>
     </w:r>
     <w:r>
       <w:rPr>
@@ -5767,7 +5767,7 @@
         <w:color w:val="64748B"/>
         <w:sz w:val="17"/>
       </w:rPr>
-      <w:t>v0.9.2-poc  |  2026-07-23</w:t>
+      <w:t>v0.9.3-poc  |  2026-07-23</w:t>
     </w:r>
   </w:p>
 </w:ftr>

</xml_diff>

<commit_message>
fix: reuse validated Agent identity
</commit_message>
<xml_diff>
--- a/docs/SamsungSwitchWatch_User_Manual_KO.docx
+++ b/docs/SamsungSwitchWatch_User_Manual_KO.docx
@@ -5736,7 +5736,7 @@
         <w:color w:val="64748B"/>
         <w:sz w:val="17"/>
       </w:rPr>
-      <w:t xml:space="preserve">v0.9.3-poc  |  </w:t>
+      <w:t xml:space="preserve">v0.9.4-poc  |  </w:t>
     </w:r>
     <w:r>
       <w:rPr>
@@ -5767,7 +5767,7 @@
         <w:color w:val="64748B"/>
         <w:sz w:val="17"/>
       </w:rPr>
-      <w:t>v0.9.3-poc  |  2026-07-23</w:t>
+      <w:t>v0.9.4-poc  |  2026-07-23</w:t>
     </w:r>
   </w:p>
 </w:ftr>

</xml_diff>

<commit_message>
fix: harden viewer persistence reporting
</commit_message>
<xml_diff>
--- a/docs/SamsungSwitchWatch_User_Manual_KO.docx
+++ b/docs/SamsungSwitchWatch_User_Manual_KO.docx
@@ -1066,6 +1066,7 @@
     <w:p>
       <w:pPr>
         <w:pStyle w:val="Heading2"/>
+        <w:pageBreakBefore w:val="0"/>
         <w:numPr>
           <w:ilvl w:val="1"/>
           <w:numId w:val="11"/>
@@ -1191,6 +1192,7 @@
     <w:p>
       <w:pPr>
         <w:pStyle w:val="Heading2"/>
+        <w:pageBreakBefore w:val="0"/>
         <w:numPr>
           <w:ilvl w:val="1"/>
           <w:numId w:val="11"/>
@@ -1278,6 +1280,7 @@
     <w:p>
       <w:pPr>
         <w:pStyle w:val="Heading2"/>
+        <w:pageBreakBefore w:val="0"/>
         <w:numPr>
           <w:ilvl w:val="1"/>
           <w:numId w:val="11"/>
@@ -3057,6 +3060,7 @@
     <w:p>
       <w:pPr>
         <w:pStyle w:val="Heading2"/>
+        <w:pageBreakBefore w:val="0"/>
         <w:numPr>
           <w:ilvl w:val="1"/>
           <w:numId w:val="11"/>
@@ -4570,8 +4574,8 @@
         </w:tblBorders>
       </w:tblPr>
       <w:tblGrid>
-        <w:gridCol w:w="2800"/>
-        <w:gridCol w:w="6560"/>
+        <w:gridCol w:w="3600"/>
+        <w:gridCol w:w="5760"/>
       </w:tblGrid>
       <w:tr>
         <w:trPr>
@@ -4579,7 +4583,7 @@
         </w:trPr>
         <w:tc>
           <w:tcPr>
-            <w:tcW w:type="dxa" w:w="2800"/>
+            <w:tcW w:type="dxa" w:w="3600"/>
             <w:tcMar>
               <w:top w:w="80" w:type="dxa"/>
               <w:start w:w="120" w:type="dxa"/>
@@ -4607,7 +4611,7 @@
         </w:tc>
         <w:tc>
           <w:tcPr>
-            <w:tcW w:type="dxa" w:w="6560"/>
+            <w:tcW w:type="dxa" w:w="5760"/>
             <w:tcMar>
               <w:top w:w="80" w:type="dxa"/>
               <w:start w:w="120" w:type="dxa"/>
@@ -4637,7 +4641,7 @@
       <w:tr>
         <w:tc>
           <w:tcPr>
-            <w:tcW w:type="dxa" w:w="2800"/>
+            <w:tcW w:type="dxa" w:w="3600"/>
             <w:tcMar>
               <w:top w:w="80" w:type="dxa"/>
               <w:start w:w="120" w:type="dxa"/>
@@ -4662,7 +4666,7 @@
         </w:tc>
         <w:tc>
           <w:tcPr>
-            <w:tcW w:type="dxa" w:w="6560"/>
+            <w:tcW w:type="dxa" w:w="5760"/>
             <w:tcMar>
               <w:top w:w="80" w:type="dxa"/>
               <w:start w:w="120" w:type="dxa"/>
@@ -4689,7 +4693,7 @@
       <w:tr>
         <w:tc>
           <w:tcPr>
-            <w:tcW w:type="dxa" w:w="2800"/>
+            <w:tcW w:type="dxa" w:w="3600"/>
             <w:shd w:fill="FAFBFC"/>
             <w:tcMar>
               <w:top w:w="80" w:type="dxa"/>
@@ -4715,7 +4719,7 @@
         </w:tc>
         <w:tc>
           <w:tcPr>
-            <w:tcW w:type="dxa" w:w="6560"/>
+            <w:tcW w:type="dxa" w:w="5760"/>
             <w:shd w:fill="FAFBFC"/>
             <w:tcMar>
               <w:top w:w="80" w:type="dxa"/>
@@ -4743,7 +4747,7 @@
       <w:tr>
         <w:tc>
           <w:tcPr>
-            <w:tcW w:type="dxa" w:w="2800"/>
+            <w:tcW w:type="dxa" w:w="3600"/>
             <w:tcMar>
               <w:top w:w="80" w:type="dxa"/>
               <w:start w:w="120" w:type="dxa"/>
@@ -4768,7 +4772,7 @@
         </w:tc>
         <w:tc>
           <w:tcPr>
-            <w:tcW w:type="dxa" w:w="6560"/>
+            <w:tcW w:type="dxa" w:w="5760"/>
             <w:tcMar>
               <w:top w:w="80" w:type="dxa"/>
               <w:start w:w="120" w:type="dxa"/>
@@ -4795,7 +4799,7 @@
       <w:tr>
         <w:tc>
           <w:tcPr>
-            <w:tcW w:type="dxa" w:w="2800"/>
+            <w:tcW w:type="dxa" w:w="3600"/>
             <w:shd w:fill="FAFBFC"/>
             <w:tcMar>
               <w:top w:w="80" w:type="dxa"/>
@@ -4821,7 +4825,7 @@
         </w:tc>
         <w:tc>
           <w:tcPr>
-            <w:tcW w:type="dxa" w:w="6560"/>
+            <w:tcW w:type="dxa" w:w="5760"/>
             <w:shd w:fill="FAFBFC"/>
             <w:tcMar>
               <w:top w:w="80" w:type="dxa"/>
@@ -4849,7 +4853,7 @@
       <w:tr>
         <w:tc>
           <w:tcPr>
-            <w:tcW w:type="dxa" w:w="2800"/>
+            <w:tcW w:type="dxa" w:w="3600"/>
             <w:tcMar>
               <w:top w:w="80" w:type="dxa"/>
               <w:start w:w="120" w:type="dxa"/>
@@ -4874,7 +4878,7 @@
         </w:tc>
         <w:tc>
           <w:tcPr>
-            <w:tcW w:type="dxa" w:w="6560"/>
+            <w:tcW w:type="dxa" w:w="5760"/>
             <w:tcMar>
               <w:top w:w="80" w:type="dxa"/>
               <w:start w:w="120" w:type="dxa"/>
@@ -4893,7 +4897,7 @@
                 <w:rFonts w:ascii="맑은 고딕" w:hAnsi="맑은 고딕" w:eastAsia="맑은 고딕" w:cs="맑은 고딕"/>
                 <w:sz w:val="18"/>
               </w:rPr>
-              <w:t>ID/PW와 login local 적용 여부 확인</w:t>
+              <w:t>감시를 즉시 차단함. ID/PW와 login local 적용 여부 확인</w:t>
             </w:r>
           </w:p>
         </w:tc>
@@ -4901,7 +4905,7 @@
       <w:tr>
         <w:tc>
           <w:tcPr>
-            <w:tcW w:type="dxa" w:w="2800"/>
+            <w:tcW w:type="dxa" w:w="3600"/>
             <w:shd w:fill="FAFBFC"/>
             <w:tcMar>
               <w:top w:w="80" w:type="dxa"/>
@@ -4927,7 +4931,7 @@
         </w:tc>
         <w:tc>
           <w:tcPr>
-            <w:tcW w:type="dxa" w:w="6560"/>
+            <w:tcW w:type="dxa" w:w="5760"/>
             <w:shd w:fill="FAFBFC"/>
             <w:tcMar>
               <w:top w:w="80" w:type="dxa"/>
@@ -4955,7 +4959,7 @@
       <w:tr>
         <w:tc>
           <w:tcPr>
-            <w:tcW w:type="dxa" w:w="2800"/>
+            <w:tcW w:type="dxa" w:w="3600"/>
             <w:tcMar>
               <w:top w:w="80" w:type="dxa"/>
               <w:start w:w="120" w:type="dxa"/>
@@ -4980,7 +4984,7 @@
         </w:tc>
         <w:tc>
           <w:tcPr>
-            <w:tcW w:type="dxa" w:w="6560"/>
+            <w:tcW w:type="dxa" w:w="5760"/>
             <w:tcMar>
               <w:top w:w="80" w:type="dxa"/>
               <w:start w:w="120" w:type="dxa"/>
@@ -5007,7 +5011,7 @@
       <w:tr>
         <w:tc>
           <w:tcPr>
-            <w:tcW w:type="dxa" w:w="2800"/>
+            <w:tcW w:type="dxa" w:w="3600"/>
             <w:shd w:fill="FAFBFC"/>
             <w:tcMar>
               <w:top w:w="80" w:type="dxa"/>
@@ -5033,7 +5037,7 @@
         </w:tc>
         <w:tc>
           <w:tcPr>
-            <w:tcW w:type="dxa" w:w="6560"/>
+            <w:tcW w:type="dxa" w:w="5760"/>
             <w:shd w:fill="FAFBFC"/>
             <w:tcMar>
               <w:top w:w="80" w:type="dxa"/>
@@ -5061,7 +5065,7 @@
       <w:tr>
         <w:tc>
           <w:tcPr>
-            <w:tcW w:type="dxa" w:w="2800"/>
+            <w:tcW w:type="dxa" w:w="3600"/>
             <w:tcMar>
               <w:top w:w="80" w:type="dxa"/>
               <w:start w:w="120" w:type="dxa"/>
@@ -5086,7 +5090,7 @@
         </w:tc>
         <w:tc>
           <w:tcPr>
-            <w:tcW w:type="dxa" w:w="6560"/>
+            <w:tcW w:type="dxa" w:w="5760"/>
             <w:tcMar>
               <w:top w:w="80" w:type="dxa"/>
               <w:start w:w="120" w:type="dxa"/>
@@ -5113,7 +5117,7 @@
       <w:tr>
         <w:tc>
           <w:tcPr>
-            <w:tcW w:type="dxa" w:w="2800"/>
+            <w:tcW w:type="dxa" w:w="3600"/>
             <w:shd w:fill="FAFBFC"/>
             <w:tcMar>
               <w:top w:w="80" w:type="dxa"/>
@@ -5139,7 +5143,7 @@
         </w:tc>
         <w:tc>
           <w:tcPr>
-            <w:tcW w:type="dxa" w:w="6560"/>
+            <w:tcW w:type="dxa" w:w="5760"/>
             <w:shd w:fill="FAFBFC"/>
             <w:tcMar>
               <w:top w:w="80" w:type="dxa"/>
@@ -5167,7 +5171,7 @@
       <w:tr>
         <w:tc>
           <w:tcPr>
-            <w:tcW w:type="dxa" w:w="2800"/>
+            <w:tcW w:type="dxa" w:w="3600"/>
             <w:tcMar>
               <w:top w:w="80" w:type="dxa"/>
               <w:start w:w="120" w:type="dxa"/>
@@ -5192,7 +5196,7 @@
         </w:tc>
         <w:tc>
           <w:tcPr>
-            <w:tcW w:type="dxa" w:w="6560"/>
+            <w:tcW w:type="dxa" w:w="5760"/>
             <w:tcMar>
               <w:top w:w="80" w:type="dxa"/>
               <w:start w:w="120" w:type="dxa"/>
@@ -5219,7 +5223,7 @@
       <w:tr>
         <w:tc>
           <w:tcPr>
-            <w:tcW w:type="dxa" w:w="2800"/>
+            <w:tcW w:type="dxa" w:w="3600"/>
             <w:shd w:fill="FAFBFC"/>
             <w:tcMar>
               <w:top w:w="80" w:type="dxa"/>
@@ -5245,7 +5249,7 @@
         </w:tc>
         <w:tc>
           <w:tcPr>
-            <w:tcW w:type="dxa" w:w="6560"/>
+            <w:tcW w:type="dxa" w:w="5760"/>
             <w:shd w:fill="FAFBFC"/>
             <w:tcMar>
               <w:top w:w="80" w:type="dxa"/>
@@ -5273,7 +5277,7 @@
       <w:tr>
         <w:tc>
           <w:tcPr>
-            <w:tcW w:type="dxa" w:w="2800"/>
+            <w:tcW w:type="dxa" w:w="3600"/>
             <w:tcMar>
               <w:top w:w="80" w:type="dxa"/>
               <w:start w:w="120" w:type="dxa"/>
@@ -5298,7 +5302,7 @@
         </w:tc>
         <w:tc>
           <w:tcPr>
-            <w:tcW w:type="dxa" w:w="6560"/>
+            <w:tcW w:type="dxa" w:w="5760"/>
             <w:tcMar>
               <w:top w:w="80" w:type="dxa"/>
               <w:start w:w="120" w:type="dxa"/>
@@ -5322,6 +5326,166 @@
           </w:p>
         </w:tc>
       </w:tr>
+      <w:tr>
+        <w:tc>
+          <w:tcPr>
+            <w:tcW w:type="dxa" w:w="3600"/>
+            <w:shd w:fill="FAFBFC"/>
+            <w:tcMar>
+              <w:top w:w="80" w:type="dxa"/>
+              <w:start w:w="120" w:type="dxa"/>
+              <w:bottom w:w="80" w:type="dxa"/>
+              <w:end w:w="120" w:type="dxa"/>
+            </w:tcMar>
+            <w:vAlign w:val="center"/>
+          </w:tcPr>
+          <w:p>
+            <w:pPr>
+              <w:spacing w:before="0" w:after="0" w:line="269" w:lineRule="auto"/>
+              <w:jc w:val="left"/>
+            </w:pPr>
+            <w:r>
+              <w:rPr>
+                <w:rFonts w:ascii="맑은 고딕" w:hAnsi="맑은 고딕" w:eastAsia="맑은 고딕" w:cs="맑은 고딕"/>
+                <w:sz w:val="18"/>
+              </w:rPr>
+              <w:t>VIEWER_SETTINGS_WRITE_FAILED</w:t>
+            </w:r>
+          </w:p>
+        </w:tc>
+        <w:tc>
+          <w:tcPr>
+            <w:tcW w:type="dxa" w:w="5760"/>
+            <w:shd w:fill="FAFBFC"/>
+            <w:tcMar>
+              <w:top w:w="80" w:type="dxa"/>
+              <w:start w:w="120" w:type="dxa"/>
+              <w:bottom w:w="80" w:type="dxa"/>
+              <w:end w:w="120" w:type="dxa"/>
+            </w:tcMar>
+            <w:vAlign w:val="center"/>
+          </w:tcPr>
+          <w:p>
+            <w:pPr>
+              <w:spacing w:before="0" w:after="0" w:line="269" w:lineRule="auto"/>
+              <w:jc w:val="left"/>
+            </w:pPr>
+            <w:r>
+              <w:rPr>
+                <w:rFonts w:ascii="맑은 고딕" w:hAnsi="맑은 고딕" w:eastAsia="맑은 고딕" w:cs="맑은 고딕"/>
+                <w:sz w:val="18"/>
+              </w:rPr>
+              <w:t>Agent 연결은 유지됨. Viewer 사용자 폴더 권한과 디스크 여유 공간 확인</w:t>
+            </w:r>
+          </w:p>
+        </w:tc>
+      </w:tr>
+      <w:tr>
+        <w:tc>
+          <w:tcPr>
+            <w:tcW w:type="dxa" w:w="3600"/>
+            <w:tcMar>
+              <w:top w:w="80" w:type="dxa"/>
+              <w:start w:w="120" w:type="dxa"/>
+              <w:bottom w:w="80" w:type="dxa"/>
+              <w:end w:w="120" w:type="dxa"/>
+            </w:tcMar>
+            <w:vAlign w:val="center"/>
+          </w:tcPr>
+          <w:p>
+            <w:pPr>
+              <w:spacing w:before="0" w:after="0" w:line="269" w:lineRule="auto"/>
+              <w:jc w:val="left"/>
+            </w:pPr>
+            <w:r>
+              <w:rPr>
+                <w:rFonts w:ascii="맑은 고딕" w:hAnsi="맑은 고딕" w:eastAsia="맑은 고딕" w:cs="맑은 고딕"/>
+                <w:sz w:val="18"/>
+              </w:rPr>
+              <w:t>VIEWER_MONITOR_STATE_WRITE_FAILED</w:t>
+            </w:r>
+          </w:p>
+        </w:tc>
+        <w:tc>
+          <w:tcPr>
+            <w:tcW w:type="dxa" w:w="5760"/>
+            <w:tcMar>
+              <w:top w:w="80" w:type="dxa"/>
+              <w:start w:w="120" w:type="dxa"/>
+              <w:bottom w:w="80" w:type="dxa"/>
+              <w:end w:w="120" w:type="dxa"/>
+            </w:tcMar>
+            <w:vAlign w:val="center"/>
+          </w:tcPr>
+          <w:p>
+            <w:pPr>
+              <w:spacing w:before="0" w:after="0" w:line="269" w:lineRule="auto"/>
+              <w:jc w:val="left"/>
+            </w:pPr>
+            <w:r>
+              <w:rPr>
+                <w:rFonts w:ascii="맑은 고딕" w:hAnsi="맑은 고딕" w:eastAsia="맑은 고딕" w:cs="맑은 고딕"/>
+                <w:sz w:val="18"/>
+              </w:rPr>
+              <w:t>감시 이력이 저장되지 않음. 사용자 폴더 권한·잠금·디스크 확인</w:t>
+            </w:r>
+          </w:p>
+        </w:tc>
+      </w:tr>
+      <w:tr>
+        <w:tc>
+          <w:tcPr>
+            <w:tcW w:type="dxa" w:w="3600"/>
+            <w:shd w:fill="FAFBFC"/>
+            <w:tcMar>
+              <w:top w:w="80" w:type="dxa"/>
+              <w:start w:w="120" w:type="dxa"/>
+              <w:bottom w:w="80" w:type="dxa"/>
+              <w:end w:w="120" w:type="dxa"/>
+            </w:tcMar>
+            <w:vAlign w:val="center"/>
+          </w:tcPr>
+          <w:p>
+            <w:pPr>
+              <w:spacing w:before="0" w:after="0" w:line="269" w:lineRule="auto"/>
+              <w:jc w:val="left"/>
+            </w:pPr>
+            <w:r>
+              <w:rPr>
+                <w:rFonts w:ascii="맑은 고딕" w:hAnsi="맑은 고딕" w:eastAsia="맑은 고딕" w:cs="맑은 고딕"/>
+                <w:sz w:val="18"/>
+              </w:rPr>
+              <w:t>VIEWER_MONITOR_CYCLE_FAILED</w:t>
+            </w:r>
+          </w:p>
+        </w:tc>
+        <w:tc>
+          <w:tcPr>
+            <w:tcW w:type="dxa" w:w="5760"/>
+            <w:shd w:fill="FAFBFC"/>
+            <w:tcMar>
+              <w:top w:w="80" w:type="dxa"/>
+              <w:start w:w="120" w:type="dxa"/>
+              <w:bottom w:w="80" w:type="dxa"/>
+              <w:end w:w="120" w:type="dxa"/>
+            </w:tcMar>
+            <w:vAlign w:val="center"/>
+          </w:tcPr>
+          <w:p>
+            <w:pPr>
+              <w:spacing w:before="0" w:after="0" w:line="269" w:lineRule="auto"/>
+              <w:jc w:val="left"/>
+            </w:pPr>
+            <w:r>
+              <w:rPr>
+                <w:rFonts w:ascii="맑은 고딕" w:hAnsi="맑은 고딕" w:eastAsia="맑은 고딕" w:cs="맑은 고딕"/>
+                <w:sz w:val="18"/>
+              </w:rPr>
+              <w:t>다음 주기 재시도를 기다리고 반복되면 Viewer 진단 로그 확인</w:t>
+            </w:r>
+          </w:p>
+        </w:tc>
+      </w:tr>
     </w:tbl>
     <w:p>
       <w:pPr>
@@ -5331,6 +5495,7 @@
     <w:p>
       <w:pPr>
         <w:pStyle w:val="Heading2"/>
+        <w:pageBreakBefore w:val="0"/>
         <w:numPr>
           <w:ilvl w:val="1"/>
           <w:numId w:val="11"/>
@@ -5394,7 +5559,7 @@
     <w:p>
       <w:pPr>
         <w:pStyle w:val="Heading1"/>
-        <w:pageBreakBefore/>
+        <w:pageBreakBefore w:val="0"/>
         <w:numPr>
           <w:ilvl w:val="0"/>
           <w:numId w:val="11"/>
@@ -5413,6 +5578,7 @@
     <w:p>
       <w:pPr>
         <w:pStyle w:val="Heading2"/>
+        <w:pageBreakBefore w:val="0"/>
         <w:numPr>
           <w:ilvl w:val="1"/>
           <w:numId w:val="11"/>
@@ -5487,6 +5653,7 @@
     <w:p>
       <w:pPr>
         <w:pStyle w:val="Heading2"/>
+        <w:pageBreakBefore w:val="0"/>
         <w:numPr>
           <w:ilvl w:val="1"/>
           <w:numId w:val="11"/>
@@ -5582,6 +5749,7 @@
     <w:p>
       <w:pPr>
         <w:pStyle w:val="Heading2"/>
+        <w:pageBreakBefore w:val="0"/>
         <w:numPr>
           <w:ilvl w:val="1"/>
           <w:numId w:val="11"/>
@@ -5736,7 +5904,7 @@
         <w:color w:val="64748B"/>
         <w:sz w:val="17"/>
       </w:rPr>
-      <w:t xml:space="preserve">v0.9.4-poc  |  </w:t>
+      <w:t xml:space="preserve">v0.9.5-poc  |  </w:t>
     </w:r>
     <w:r>
       <w:rPr>
@@ -5767,7 +5935,7 @@
         <w:color w:val="64748B"/>
         <w:sz w:val="17"/>
       </w:rPr>
-      <w:t>v0.9.4-poc  |  2026-07-23</w:t>
+      <w:t>v0.9.5-poc  |  2026-07-24</w:t>
     </w:r>
   </w:p>
 </w:ftr>

</xml_diff>

<commit_message>
fix: serialize Viewer settings persistence
</commit_message>
<xml_diff>
--- a/docs/SamsungSwitchWatch_User_Manual_KO.docx
+++ b/docs/SamsungSwitchWatch_User_Manual_KO.docx
@@ -5904,7 +5904,7 @@
         <w:color w:val="64748B"/>
         <w:sz w:val="17"/>
       </w:rPr>
-      <w:t xml:space="preserve">v0.9.5-poc  |  </w:t>
+      <w:t xml:space="preserve">v0.9.6-poc  |  </w:t>
     </w:r>
     <w:r>
       <w:rPr>
@@ -5935,7 +5935,7 @@
         <w:color w:val="64748B"/>
         <w:sz w:val="17"/>
       </w:rPr>
-      <w:t>v0.9.5-poc  |  2026-07-24</w:t>
+      <w:t>v0.9.6-poc  |  2026-07-24</w:t>
     </w:r>
   </w:p>
 </w:ftr>

</xml_diff>

<commit_message>
Harden Viewer device management persistence
</commit_message>
<xml_diff>
--- a/docs/SamsungSwitchWatch_User_Manual_KO.docx
+++ b/docs/SamsungSwitchWatch_User_Manual_KO.docx
@@ -4603,7 +4603,7 @@
                 <w:rFonts w:ascii="맑은 고딕" w:hAnsi="맑은 고딕" w:eastAsia="맑은 고딕" w:cs="맑은 고딕"/>
                 <w:b/>
                 <w:color w:val="16324F"/>
-                <w:sz w:val="18"/>
+                <w:sz w:val="17"/>
               </w:rPr>
               <w:t>표시 코드/증상</w:t>
             </w:r>
@@ -4631,7 +4631,7 @@
                 <w:rFonts w:ascii="맑은 고딕" w:hAnsi="맑은 고딕" w:eastAsia="맑은 고딕" w:cs="맑은 고딕"/>
                 <w:b/>
                 <w:color w:val="16324F"/>
-                <w:sz w:val="18"/>
+                <w:sz w:val="17"/>
               </w:rPr>
               <w:t>확인 순서</w:t>
             </w:r>
@@ -4652,13 +4652,13 @@
           </w:tcPr>
           <w:p>
             <w:pPr>
-              <w:spacing w:before="0" w:after="0" w:line="269" w:lineRule="auto"/>
+              <w:spacing w:before="0" w:after="0" w:line="240" w:lineRule="auto"/>
               <w:jc w:val="left"/>
             </w:pPr>
             <w:r>
               <w:rPr>
                 <w:rFonts w:ascii="맑은 고딕" w:hAnsi="맑은 고딕" w:eastAsia="맑은 고딕" w:cs="맑은 고딕"/>
-                <w:sz w:val="18"/>
+                <w:sz w:val="16"/>
               </w:rPr>
               <w:t>AGENT_HTTPS_UNREACHABLE</w:t>
             </w:r>
@@ -4677,13 +4677,13 @@
           </w:tcPr>
           <w:p>
             <w:pPr>
-              <w:spacing w:before="0" w:after="0" w:line="269" w:lineRule="auto"/>
+              <w:spacing w:before="0" w:after="0" w:line="240" w:lineRule="auto"/>
               <w:jc w:val="left"/>
             </w:pPr>
             <w:r>
               <w:rPr>
                 <w:rFonts w:ascii="맑은 고딕" w:hAnsi="맑은 고딕" w:eastAsia="맑은 고딕" w:cs="맑은 고딕"/>
-                <w:sz w:val="18"/>
+                <w:sz w:val="16"/>
               </w:rPr>
               <w:t>Agent 서비스 → TCP/18443 경로 → Viewer 관리 CIDR 방화벽</w:t>
             </w:r>
@@ -4705,13 +4705,13 @@
           </w:tcPr>
           <w:p>
             <w:pPr>
-              <w:spacing w:before="0" w:after="0" w:line="269" w:lineRule="auto"/>
+              <w:spacing w:before="0" w:after="0" w:line="240" w:lineRule="auto"/>
               <w:jc w:val="left"/>
             </w:pPr>
             <w:r>
               <w:rPr>
                 <w:rFonts w:ascii="맑은 고딕" w:hAnsi="맑은 고딕" w:eastAsia="맑은 고딕" w:cs="맑은 고딕"/>
-                <w:sz w:val="18"/>
+                <w:sz w:val="16"/>
               </w:rPr>
               <w:t>AGENT_IDENTITY_CHANGED</w:t>
             </w:r>
@@ -4731,13 +4731,13 @@
           </w:tcPr>
           <w:p>
             <w:pPr>
-              <w:spacing w:before="0" w:after="0" w:line="269" w:lineRule="auto"/>
+              <w:spacing w:before="0" w:after="0" w:line="240" w:lineRule="auto"/>
               <w:jc w:val="left"/>
             </w:pPr>
             <w:r>
               <w:rPr>
                 <w:rFonts w:ascii="맑은 고딕" w:hAnsi="맑은 고딕" w:eastAsia="맑은 고딕" w:cs="맑은 고딕"/>
-                <w:sz w:val="18"/>
+                <w:sz w:val="16"/>
               </w:rPr>
               <w:t>Agent PC 교체/재설치 사실을 관리자에게 확인한 뒤 다시 연결</w:t>
             </w:r>
@@ -4758,13 +4758,13 @@
           </w:tcPr>
           <w:p>
             <w:pPr>
-              <w:spacing w:before="0" w:after="0" w:line="269" w:lineRule="auto"/>
+              <w:spacing w:before="0" w:after="0" w:line="240" w:lineRule="auto"/>
               <w:jc w:val="left"/>
             </w:pPr>
             <w:r>
               <w:rPr>
                 <w:rFonts w:ascii="맑은 고딕" w:hAnsi="맑은 고딕" w:eastAsia="맑은 고딕" w:cs="맑은 고딕"/>
-                <w:sz w:val="18"/>
+                <w:sz w:val="16"/>
               </w:rPr>
               <w:t>TARGET_NOT_ALLOWED</w:t>
             </w:r>
@@ -4783,13 +4783,13 @@
           </w:tcPr>
           <w:p>
             <w:pPr>
-              <w:spacing w:before="0" w:after="0" w:line="269" w:lineRule="auto"/>
+              <w:spacing w:before="0" w:after="0" w:line="240" w:lineRule="auto"/>
               <w:jc w:val="left"/>
             </w:pPr>
             <w:r>
               <w:rPr>
                 <w:rFonts w:ascii="맑은 고딕" w:hAnsi="맑은 고딕" w:eastAsia="맑은 고딕" w:cs="맑은 고딕"/>
-                <w:sz w:val="18"/>
+                <w:sz w:val="16"/>
               </w:rPr>
               <w:t>장비 IPv4가 Agent 설치 시 지정한 대상 CIDR 안인지 확인</w:t>
             </w:r>
@@ -4811,13 +4811,13 @@
           </w:tcPr>
           <w:p>
             <w:pPr>
-              <w:spacing w:before="0" w:after="0" w:line="269" w:lineRule="auto"/>
+              <w:spacing w:before="0" w:after="0" w:line="240" w:lineRule="auto"/>
               <w:jc w:val="left"/>
             </w:pPr>
             <w:r>
               <w:rPr>
                 <w:rFonts w:ascii="맑은 고딕" w:hAnsi="맑은 고딕" w:eastAsia="맑은 고딕" w:cs="맑은 고딕"/>
-                <w:sz w:val="18"/>
+                <w:sz w:val="16"/>
               </w:rPr>
               <w:t>TCP_TIMEOUT</w:t>
             </w:r>
@@ -4837,13 +4837,13 @@
           </w:tcPr>
           <w:p>
             <w:pPr>
-              <w:spacing w:before="0" w:after="0" w:line="269" w:lineRule="auto"/>
+              <w:spacing w:before="0" w:after="0" w:line="240" w:lineRule="auto"/>
               <w:jc w:val="left"/>
             </w:pPr>
             <w:r>
               <w:rPr>
                 <w:rFonts w:ascii="맑은 고딕" w:hAnsi="맑은 고딕" w:eastAsia="맑은 고딕" w:cs="맑은 고딕"/>
-                <w:sz w:val="18"/>
+                <w:sz w:val="16"/>
               </w:rPr>
               <w:t>Agent PC에서 장비 TCP/23 경로, ACL, 장비 Telnet 상태 확인</w:t>
             </w:r>
@@ -4864,13 +4864,13 @@
           </w:tcPr>
           <w:p>
             <w:pPr>
-              <w:spacing w:before="0" w:after="0" w:line="269" w:lineRule="auto"/>
+              <w:spacing w:before="0" w:after="0" w:line="240" w:lineRule="auto"/>
               <w:jc w:val="left"/>
             </w:pPr>
             <w:r>
               <w:rPr>
                 <w:rFonts w:ascii="맑은 고딕" w:hAnsi="맑은 고딕" w:eastAsia="맑은 고딕" w:cs="맑은 고딕"/>
-                <w:sz w:val="18"/>
+                <w:sz w:val="16"/>
               </w:rPr>
               <w:t>AUTH_FAILED</w:t>
             </w:r>
@@ -4889,13 +4889,13 @@
           </w:tcPr>
           <w:p>
             <w:pPr>
-              <w:spacing w:before="0" w:after="0" w:line="269" w:lineRule="auto"/>
+              <w:spacing w:before="0" w:after="0" w:line="240" w:lineRule="auto"/>
               <w:jc w:val="left"/>
             </w:pPr>
             <w:r>
               <w:rPr>
                 <w:rFonts w:ascii="맑은 고딕" w:hAnsi="맑은 고딕" w:eastAsia="맑은 고딕" w:cs="맑은 고딕"/>
-                <w:sz w:val="18"/>
+                <w:sz w:val="16"/>
               </w:rPr>
               <w:t>감시를 즉시 차단함. ID/PW와 login local 적용 여부 확인</w:t>
             </w:r>
@@ -4917,13 +4917,13 @@
           </w:tcPr>
           <w:p>
             <w:pPr>
-              <w:spacing w:before="0" w:after="0" w:line="269" w:lineRule="auto"/>
+              <w:spacing w:before="0" w:after="0" w:line="240" w:lineRule="auto"/>
               <w:jc w:val="left"/>
             </w:pPr>
             <w:r>
               <w:rPr>
                 <w:rFonts w:ascii="맑은 고딕" w:hAnsi="맑은 고딕" w:eastAsia="맑은 고딕" w:cs="맑은 고딕"/>
-                <w:sz w:val="18"/>
+                <w:sz w:val="16"/>
               </w:rPr>
               <w:t>ENABLE_FAILED</w:t>
             </w:r>
@@ -4943,13 +4943,13 @@
           </w:tcPr>
           <w:p>
             <w:pPr>
-              <w:spacing w:before="0" w:after="0" w:line="269" w:lineRule="auto"/>
+              <w:spacing w:before="0" w:after="0" w:line="240" w:lineRule="auto"/>
               <w:jc w:val="left"/>
             </w:pPr>
             <w:r>
               <w:rPr>
                 <w:rFonts w:ascii="맑은 고딕" w:hAnsi="맑은 고딕" w:eastAsia="맑은 고딕" w:cs="맑은 고딕"/>
-                <w:sz w:val="18"/>
+                <w:sz w:val="16"/>
               </w:rPr>
               <w:t>enable 필요 여부와 enable PW, 로그인 직후 프롬프트 확인</w:t>
             </w:r>
@@ -4970,13 +4970,13 @@
           </w:tcPr>
           <w:p>
             <w:pPr>
-              <w:spacing w:before="0" w:after="0" w:line="269" w:lineRule="auto"/>
+              <w:spacing w:before="0" w:after="0" w:line="240" w:lineRule="auto"/>
               <w:jc w:val="left"/>
             </w:pPr>
             <w:r>
               <w:rPr>
                 <w:rFonts w:ascii="맑은 고딕" w:hAnsi="맑은 고딕" w:eastAsia="맑은 고딕" w:cs="맑은 고딕"/>
-                <w:sz w:val="18"/>
+                <w:sz w:val="16"/>
               </w:rPr>
               <w:t>QUERY_COMMAND_BLOCKED</w:t>
             </w:r>
@@ -4995,13 +4995,13 @@
           </w:tcPr>
           <w:p>
             <w:pPr>
-              <w:spacing w:before="0" w:after="0" w:line="269" w:lineRule="auto"/>
+              <w:spacing w:before="0" w:after="0" w:line="240" w:lineRule="auto"/>
               <w:jc w:val="left"/>
             </w:pPr>
             <w:r>
               <w:rPr>
                 <w:rFonts w:ascii="맑은 고딕" w:hAnsi="맑은 고딕" w:eastAsia="맑은 고딕" w:cs="맑은 고딕"/>
-                <w:sz w:val="18"/>
+                <w:sz w:val="16"/>
               </w:rPr>
               <w:t>한 줄 show 형식, 줄바꿈/구분자 포함 여부 확인</w:t>
             </w:r>
@@ -5023,13 +5023,13 @@
           </w:tcPr>
           <w:p>
             <w:pPr>
-              <w:spacing w:before="0" w:after="0" w:line="269" w:lineRule="auto"/>
+              <w:spacing w:before="0" w:after="0" w:line="240" w:lineRule="auto"/>
               <w:jc w:val="left"/>
             </w:pPr>
             <w:r>
               <w:rPr>
                 <w:rFonts w:ascii="맑은 고딕" w:hAnsi="맑은 고딕" w:eastAsia="맑은 고딕" w:cs="맑은 고딕"/>
-                <w:sz w:val="18"/>
+                <w:sz w:val="16"/>
               </w:rPr>
               <w:t>COMMAND_TIMEOUT</w:t>
             </w:r>
@@ -5049,13 +5049,13 @@
           </w:tcPr>
           <w:p>
             <w:pPr>
-              <w:spacing w:before="0" w:after="0" w:line="269" w:lineRule="auto"/>
+              <w:spacing w:before="0" w:after="0" w:line="240" w:lineRule="auto"/>
               <w:jc w:val="left"/>
             </w:pPr>
             <w:r>
               <w:rPr>
                 <w:rFonts w:ascii="맑은 고딕" w:hAnsi="맑은 고딕" w:eastAsia="맑은 고딕" w:cs="맑은 고딕"/>
-                <w:sz w:val="18"/>
+                <w:sz w:val="16"/>
               </w:rPr>
               <w:t>출력 페이징, 장비 부하, 프롬프트 복귀와 세션 시간 확인</w:t>
             </w:r>
@@ -5076,13 +5076,13 @@
           </w:tcPr>
           <w:p>
             <w:pPr>
-              <w:spacing w:before="0" w:after="0" w:line="269" w:lineRule="auto"/>
+              <w:spacing w:before="0" w:after="0" w:line="240" w:lineRule="auto"/>
               <w:jc w:val="left"/>
             </w:pPr>
             <w:r>
               <w:rPr>
                 <w:rFonts w:ascii="맑은 고딕" w:hAnsi="맑은 고딕" w:eastAsia="맑은 고딕" w:cs="맑은 고딕"/>
-                <w:sz w:val="18"/>
+                <w:sz w:val="16"/>
               </w:rPr>
               <w:t>TELNET_SESSION_CLOSED</w:t>
             </w:r>
@@ -5101,13 +5101,13 @@
           </w:tcPr>
           <w:p>
             <w:pPr>
-              <w:spacing w:before="0" w:after="0" w:line="269" w:lineRule="auto"/>
+              <w:spacing w:before="0" w:after="0" w:line="240" w:lineRule="auto"/>
               <w:jc w:val="left"/>
             </w:pPr>
             <w:r>
               <w:rPr>
                 <w:rFonts w:ascii="맑은 고딕" w:hAnsi="맑은 고딕" w:eastAsia="맑은 고딕" w:cs="맑은 고딕"/>
-                <w:sz w:val="18"/>
+                <w:sz w:val="16"/>
               </w:rPr>
               <w:t>재연결 1회 뒤에도 종료됨. 완료된 결과와 남은 명령을 확인</w:t>
             </w:r>
@@ -5129,13 +5129,13 @@
           </w:tcPr>
           <w:p>
             <w:pPr>
-              <w:spacing w:before="0" w:after="0" w:line="269" w:lineRule="auto"/>
+              <w:spacing w:before="0" w:after="0" w:line="240" w:lineRule="auto"/>
               <w:jc w:val="left"/>
             </w:pPr>
             <w:r>
               <w:rPr>
                 <w:rFonts w:ascii="맑은 고딕" w:hAnsi="맑은 고딕" w:eastAsia="맑은 고딕" w:cs="맑은 고딕"/>
-                <w:sz w:val="18"/>
+                <w:sz w:val="16"/>
               </w:rPr>
               <w:t>PROMPT_PARSE_FAILED</w:t>
             </w:r>
@@ -5155,13 +5155,13 @@
           </w:tcPr>
           <w:p>
             <w:pPr>
-              <w:spacing w:before="0" w:after="0" w:line="269" w:lineRule="auto"/>
+              <w:spacing w:before="0" w:after="0" w:line="240" w:lineRule="auto"/>
               <w:jc w:val="left"/>
             </w:pPr>
             <w:r>
               <w:rPr>
                 <w:rFonts w:ascii="맑은 고딕" w:hAnsi="맑은 고딕" w:eastAsia="맑은 고딕" w:cs="맑은 고딕"/>
-                <w:sz w:val="18"/>
+                <w:sz w:val="16"/>
               </w:rPr>
               <w:t>로그인 후 &gt; 또는 # 프롬프트 형식을 확인</w:t>
             </w:r>
@@ -5182,13 +5182,13 @@
           </w:tcPr>
           <w:p>
             <w:pPr>
-              <w:spacing w:before="0" w:after="0" w:line="269" w:lineRule="auto"/>
+              <w:spacing w:before="0" w:after="0" w:line="240" w:lineRule="auto"/>
               <w:jc w:val="left"/>
             </w:pPr>
             <w:r>
               <w:rPr>
                 <w:rFonts w:ascii="맑은 고딕" w:hAnsi="맑은 고딕" w:eastAsia="맑은 고딕" w:cs="맑은 고딕"/>
-                <w:sz w:val="18"/>
+                <w:sz w:val="16"/>
               </w:rPr>
               <w:t>OUTPUT_LIMIT_EXCEEDED</w:t>
             </w:r>
@@ -5207,13 +5207,13 @@
           </w:tcPr>
           <w:p>
             <w:pPr>
-              <w:spacing w:before="0" w:after="0" w:line="269" w:lineRule="auto"/>
+              <w:spacing w:before="0" w:after="0" w:line="240" w:lineRule="auto"/>
               <w:jc w:val="left"/>
             </w:pPr>
             <w:r>
               <w:rPr>
                 <w:rFonts w:ascii="맑은 고딕" w:hAnsi="맑은 고딕" w:eastAsia="맑은 고딕" w:cs="맑은 고딕"/>
-                <w:sz w:val="18"/>
+                <w:sz w:val="16"/>
               </w:rPr>
               <w:t>세션 처리 안전 한도 초과. 더 좁은 show 명령 사용</w:t>
             </w:r>
@@ -5235,13 +5235,13 @@
           </w:tcPr>
           <w:p>
             <w:pPr>
-              <w:spacing w:before="0" w:after="0" w:line="269" w:lineRule="auto"/>
+              <w:spacing w:before="0" w:after="0" w:line="240" w:lineRule="auto"/>
               <w:jc w:val="left"/>
             </w:pPr>
             <w:r>
               <w:rPr>
                 <w:rFonts w:ascii="맑은 고딕" w:hAnsi="맑은 고딕" w:eastAsia="맑은 고딕" w:cs="맑은 고딕"/>
-                <w:sz w:val="18"/>
+                <w:sz w:val="16"/>
               </w:rPr>
               <w:t>VIEWER_DEVICE_STORE_CORRUPT</w:t>
             </w:r>
@@ -5261,13 +5261,13 @@
           </w:tcPr>
           <w:p>
             <w:pPr>
-              <w:spacing w:before="0" w:after="0" w:line="269" w:lineRule="auto"/>
+              <w:spacing w:before="0" w:after="0" w:line="240" w:lineRule="auto"/>
               <w:jc w:val="left"/>
             </w:pPr>
             <w:r>
               <w:rPr>
                 <w:rFonts w:ascii="맑은 고딕" w:hAnsi="맑은 고딕" w:eastAsia="맑은 고딕" w:cs="맑은 고딕"/>
-                <w:sz w:val="18"/>
+                <w:sz w:val="16"/>
               </w:rPr>
               <w:t>손상 파일은 자동 격리됨. 장비 관리에서 장비를 다시 등록</w:t>
             </w:r>
@@ -5288,13 +5288,13 @@
           </w:tcPr>
           <w:p>
             <w:pPr>
-              <w:spacing w:before="0" w:after="0" w:line="269" w:lineRule="auto"/>
+              <w:spacing w:before="0" w:after="0" w:line="240" w:lineRule="auto"/>
               <w:jc w:val="left"/>
             </w:pPr>
             <w:r>
               <w:rPr>
                 <w:rFonts w:ascii="맑은 고딕" w:hAnsi="맑은 고딕" w:eastAsia="맑은 고딕" w:cs="맑은 고딕"/>
-                <w:sz w:val="18"/>
+                <w:sz w:val="16"/>
               </w:rPr>
               <w:t>VIEWER_DEVICE_STORE_UNAVAILABLE</w:t>
             </w:r>
@@ -5313,13 +5313,13 @@
           </w:tcPr>
           <w:p>
             <w:pPr>
-              <w:spacing w:before="0" w:after="0" w:line="269" w:lineRule="auto"/>
+              <w:spacing w:before="0" w:after="0" w:line="240" w:lineRule="auto"/>
               <w:jc w:val="left"/>
             </w:pPr>
             <w:r>
               <w:rPr>
                 <w:rFonts w:ascii="맑은 고딕" w:hAnsi="맑은 고딕" w:eastAsia="맑은 고딕" w:cs="맑은 고딕"/>
-                <w:sz w:val="18"/>
+                <w:sz w:val="16"/>
               </w:rPr>
               <w:t>Viewer 사용자 폴더의 파일 권한과 다른 프로세스의 잠금 확인</w:t>
             </w:r>
@@ -5341,15 +5341,15 @@
           </w:tcPr>
           <w:p>
             <w:pPr>
-              <w:spacing w:before="0" w:after="0" w:line="269" w:lineRule="auto"/>
+              <w:spacing w:before="0" w:after="0" w:line="240" w:lineRule="auto"/>
               <w:jc w:val="left"/>
             </w:pPr>
             <w:r>
               <w:rPr>
                 <w:rFonts w:ascii="맑은 고딕" w:hAnsi="맑은 고딕" w:eastAsia="맑은 고딕" w:cs="맑은 고딕"/>
-                <w:sz w:val="18"/>
+                <w:sz w:val="16"/>
               </w:rPr>
-              <w:t>VIEWER_SETTINGS_WRITE_FAILED</w:t>
+              <w:t>VIEWER_DEVICE_STORE_WRITE_FAILED</w:t>
             </w:r>
           </w:p>
         </w:tc>
@@ -5367,15 +5367,15 @@
           </w:tcPr>
           <w:p>
             <w:pPr>
-              <w:spacing w:before="0" w:after="0" w:line="269" w:lineRule="auto"/>
+              <w:spacing w:before="0" w:after="0" w:line="240" w:lineRule="auto"/>
               <w:jc w:val="left"/>
             </w:pPr>
             <w:r>
               <w:rPr>
                 <w:rFonts w:ascii="맑은 고딕" w:hAnsi="맑은 고딕" w:eastAsia="맑은 고딕" w:cs="맑은 고딕"/>
-                <w:sz w:val="18"/>
+                <w:sz w:val="16"/>
               </w:rPr>
-              <w:t>Agent 연결은 유지됨. Viewer 사용자 폴더 권한과 디스크 여유 공간 확인</w:t>
+              <w:t>입력은 유지됨. Viewer 사용자 폴더 권한·잠금·디스크 확인 후 다시 저장</w:t>
             </w:r>
           </w:p>
         </w:tc>
@@ -5394,15 +5394,15 @@
           </w:tcPr>
           <w:p>
             <w:pPr>
-              <w:spacing w:before="0" w:after="0" w:line="269" w:lineRule="auto"/>
+              <w:spacing w:before="0" w:after="0" w:line="240" w:lineRule="auto"/>
               <w:jc w:val="left"/>
             </w:pPr>
             <w:r>
               <w:rPr>
                 <w:rFonts w:ascii="맑은 고딕" w:hAnsi="맑은 고딕" w:eastAsia="맑은 고딕" w:cs="맑은 고딕"/>
-                <w:sz w:val="18"/>
+                <w:sz w:val="16"/>
               </w:rPr>
-              <w:t>VIEWER_MONITOR_STATE_WRITE_FAILED</w:t>
+              <w:t>VIEWER_SETTINGS_WRITE_FAILED</w:t>
             </w:r>
           </w:p>
         </w:tc>
@@ -5419,15 +5419,15 @@
           </w:tcPr>
           <w:p>
             <w:pPr>
-              <w:spacing w:before="0" w:after="0" w:line="269" w:lineRule="auto"/>
+              <w:spacing w:before="0" w:after="0" w:line="240" w:lineRule="auto"/>
               <w:jc w:val="left"/>
             </w:pPr>
             <w:r>
               <w:rPr>
                 <w:rFonts w:ascii="맑은 고딕" w:hAnsi="맑은 고딕" w:eastAsia="맑은 고딕" w:cs="맑은 고딕"/>
-                <w:sz w:val="18"/>
+                <w:sz w:val="16"/>
               </w:rPr>
-              <w:t>감시 이력이 저장되지 않음. 사용자 폴더 권한·잠금·디스크 확인</w:t>
+              <w:t>Agent 연결은 유지됨. Viewer 사용자 폴더 권한과 디스크 여유 공간 확인</w:t>
             </w:r>
           </w:p>
         </w:tc>
@@ -5447,15 +5447,15 @@
           </w:tcPr>
           <w:p>
             <w:pPr>
-              <w:spacing w:before="0" w:after="0" w:line="269" w:lineRule="auto"/>
+              <w:spacing w:before="0" w:after="0" w:line="240" w:lineRule="auto"/>
               <w:jc w:val="left"/>
             </w:pPr>
             <w:r>
               <w:rPr>
                 <w:rFonts w:ascii="맑은 고딕" w:hAnsi="맑은 고딕" w:eastAsia="맑은 고딕" w:cs="맑은 고딕"/>
-                <w:sz w:val="18"/>
+                <w:sz w:val="16"/>
               </w:rPr>
-              <w:t>VIEWER_MONITOR_CYCLE_FAILED</w:t>
+              <w:t>VIEWER_MONITOR_STATE_WRITE_FAILED</w:t>
             </w:r>
           </w:p>
         </w:tc>
@@ -5473,13 +5473,65 @@
           </w:tcPr>
           <w:p>
             <w:pPr>
-              <w:spacing w:before="0" w:after="0" w:line="269" w:lineRule="auto"/>
+              <w:spacing w:before="0" w:after="0" w:line="240" w:lineRule="auto"/>
               <w:jc w:val="left"/>
             </w:pPr>
             <w:r>
               <w:rPr>
                 <w:rFonts w:ascii="맑은 고딕" w:hAnsi="맑은 고딕" w:eastAsia="맑은 고딕" w:cs="맑은 고딕"/>
-                <w:sz w:val="18"/>
+                <w:sz w:val="16"/>
+              </w:rPr>
+              <w:t>장비 설정은 저장될 수 있음. 중복 등록하지 말고 감시 이력 파일 권한·잠금·디스크 확인</w:t>
+            </w:r>
+          </w:p>
+        </w:tc>
+      </w:tr>
+      <w:tr>
+        <w:tc>
+          <w:tcPr>
+            <w:tcW w:type="dxa" w:w="3600"/>
+            <w:tcMar>
+              <w:top w:w="80" w:type="dxa"/>
+              <w:start w:w="120" w:type="dxa"/>
+              <w:bottom w:w="80" w:type="dxa"/>
+              <w:end w:w="120" w:type="dxa"/>
+            </w:tcMar>
+            <w:vAlign w:val="center"/>
+          </w:tcPr>
+          <w:p>
+            <w:pPr>
+              <w:spacing w:before="0" w:after="0" w:line="240" w:lineRule="auto"/>
+              <w:jc w:val="left"/>
+            </w:pPr>
+            <w:r>
+              <w:rPr>
+                <w:rFonts w:ascii="맑은 고딕" w:hAnsi="맑은 고딕" w:eastAsia="맑은 고딕" w:cs="맑은 고딕"/>
+                <w:sz w:val="16"/>
+              </w:rPr>
+              <w:t>VIEWER_MONITOR_CYCLE_FAILED</w:t>
+            </w:r>
+          </w:p>
+        </w:tc>
+        <w:tc>
+          <w:tcPr>
+            <w:tcW w:type="dxa" w:w="5760"/>
+            <w:tcMar>
+              <w:top w:w="80" w:type="dxa"/>
+              <w:start w:w="120" w:type="dxa"/>
+              <w:bottom w:w="80" w:type="dxa"/>
+              <w:end w:w="120" w:type="dxa"/>
+            </w:tcMar>
+            <w:vAlign w:val="center"/>
+          </w:tcPr>
+          <w:p>
+            <w:pPr>
+              <w:spacing w:before="0" w:after="0" w:line="240" w:lineRule="auto"/>
+              <w:jc w:val="left"/>
+            </w:pPr>
+            <w:r>
+              <w:rPr>
+                <w:rFonts w:ascii="맑은 고딕" w:hAnsi="맑은 고딕" w:eastAsia="맑은 고딕" w:cs="맑은 고딕"/>
+                <w:sz w:val="16"/>
               </w:rPr>
               <w:t>다음 주기 재시도를 기다리고 반복되면 Viewer 진단 로그 확인</w:t>
             </w:r>
@@ -5904,7 +5956,7 @@
         <w:color w:val="64748B"/>
         <w:sz w:val="17"/>
       </w:rPr>
-      <w:t xml:space="preserve">v0.9.6-poc  |  </w:t>
+      <w:t xml:space="preserve">v0.9.7-poc  |  </w:t>
     </w:r>
     <w:r>
       <w:rPr>
@@ -5935,7 +5987,7 @@
         <w:color w:val="64748B"/>
         <w:sz w:val="17"/>
       </w:rPr>
-      <w:t>v0.9.6-poc  |  2026-07-24</w:t>
+      <w:t>v0.9.7-poc  |  2026-07-24</w:t>
     </w:r>
   </w:p>
 </w:ftr>

</xml_diff>

<commit_message>
Derive Viewer user agent from build version
</commit_message>
<xml_diff>
--- a/docs/SamsungSwitchWatch_User_Manual_KO.docx
+++ b/docs/SamsungSwitchWatch_User_Manual_KO.docx
@@ -5956,7 +5956,7 @@
         <w:color w:val="64748B"/>
         <w:sz w:val="17"/>
       </w:rPr>
-      <w:t xml:space="preserve">v0.9.7-poc  |  </w:t>
+      <w:t xml:space="preserve">v0.9.8-poc  |  </w:t>
     </w:r>
     <w:r>
       <w:rPr>
@@ -5987,7 +5987,7 @@
         <w:color w:val="64748B"/>
         <w:sz w:val="17"/>
       </w:rPr>
-      <w:t>v0.9.7-poc  |  2026-07-24</w:t>
+      <w:t>v0.9.8-poc  |  2026-07-24</w:t>
     </w:r>
   </w:p>
 </w:ftr>

</xml_diff>

<commit_message>
Fix first-run Agent address handling
</commit_message>
<xml_diff>
--- a/docs/SamsungSwitchWatch_User_Manual_KO.docx
+++ b/docs/SamsungSwitchWatch_User_Manual_KO.docx
@@ -546,7 +546,7 @@
         <w:rPr>
           <w:rFonts w:ascii="맑은 고딕" w:hAnsi="맑은 고딕" w:eastAsia="맑은 고딕" w:cs="맑은 고딕"/>
         </w:rPr>
-        <w:t>Viewer가 열리면 Agent 주소만 입력합니다. HTTPS/18443은 자동입니다.</w:t>
+        <w:t>Viewer가 열리면 Agent를 설치한 원격 PC의 주소만 입력합니다. HTTPS/18443은 자동입니다.</w:t>
       </w:r>
     </w:p>
     <w:p>
@@ -1289,7 +1289,7 @@
           <w:color w:val="16324F"/>
           <w:sz w:val="21"/>
         </w:rPr>
-        <w:t>관리자 설치 창에 Agent installation failed가 표시되면 Cause 줄을 먼저 확인하세요. 설치가 완료되지 않은 동안 SamsungSwitchWatchAgent 서비스와 TCP/18443 listener가 없으므로 Viewer에는 AGENT_CONNECTION_REFUSED가 표시됩니다. 이전 Agent 설치기를 반복 실행하거나 서비스를 수동 등록하지 말고 0.9.14-poc Agent 설치기를 사용하세요.</w:t>
+        <w:t>관리자 설치 창에 Agent installation failed가 표시되면 Cause 줄을 먼저 확인하세요. 설치 성공 뒤 AGENT_CONNECTION_REFUSED가 보이면 Viewer에 스위치 IP, Viewer PC 주소 또는 localhost가 아니라 Agent를 설치한 PC 주소를 입력했는지 먼저 확인하세요. 그 다음 SamsungSwitchWatchAgent 서비스와 TCP/18443을 점검합니다. 서비스를 수동 등록하지 말고 0.9.15-poc Agent 설치기를 사용하세요.</w:t>
       </w:r>
     </w:p>
     <w:p>
@@ -1459,7 +1459,21 @@
         <w:rPr>
           <w:rFonts w:ascii="맑은 고딕" w:hAnsi="맑은 고딕" w:eastAsia="맑은 고딕" w:cs="맑은 고딕"/>
         </w:rPr>
-        <w:t>Agent PC의 IPv4 또는 사내 DNS 이름만 입력합니다.</w:t>
+        <w:t>Agent를 설치한 원격 PC의 IPv4 또는 사내 DNS 이름만 입력합니다.</w:t>
+      </w:r>
+    </w:p>
+    <w:p>
+      <w:pPr>
+        <w:numPr>
+          <w:ilvl w:val="0"/>
+          <w:numId w:val="10"/>
+        </w:numPr>
+      </w:pPr>
+      <w:r>
+        <w:rPr>
+          <w:rFonts w:ascii="맑은 고딕" w:hAnsi="맑은 고딕" w:eastAsia="맑은 고딕" w:cs="맑은 고딕"/>
+        </w:rPr>
+        <w:t>스위치 IP, Viewer PC 주소와 localhost는 Agent와 Viewer가 같은 PC가 아닌 한 입력하지 않습니다.</w:t>
       </w:r>
     </w:p>
     <w:p>
@@ -4429,7 +4443,9 @@
                 <w:rFonts w:ascii="맑은 고딕" w:hAnsi="맑은 고딕" w:eastAsia="맑은 고딕" w:cs="맑은 고딕"/>
                 <w:sz w:val="18"/>
               </w:rPr>
-              <w:t>%ProgramData%\SamsungSwitchWatch</w:t>
+              <w:t>%ProgramData%\</w:t>
+              <w:br/>
+              <w:t>SamsungSwitchWatch</w:t>
             </w:r>
           </w:p>
         </w:tc>
@@ -4508,7 +4524,9 @@
                 <w:rFonts w:ascii="맑은 고딕" w:hAnsi="맑은 고딕" w:eastAsia="맑은 고딕" w:cs="맑은 고딕"/>
                 <w:sz w:val="18"/>
               </w:rPr>
-              <w:t>%ProgramData%\SamsungSwitchWatch</w:t>
+              <w:t>%ProgramData%\</w:t>
+              <w:br/>
+              <w:t>SamsungSwitchWatch</w:t>
             </w:r>
           </w:p>
         </w:tc>
@@ -5357,7 +5375,7 @@
                 <w:rFonts w:ascii="맑은 고딕" w:hAnsi="맑은 고딕" w:eastAsia="맑은 고딕" w:cs="맑은 고딕"/>
                 <w:sz w:val="16"/>
               </w:rPr>
-              <w:t>Agent 설치 완료 여부 → SamsungSwitchWatchAgent 서비스 → TCP/18443 수신 상태</w:t>
+              <w:t>입력 주소가 실제 Agent PC인지 → 서비스 → 로컬 진단 → Viewer PC의 원격 TCP/18443</w:t>
             </w:r>
           </w:p>
         </w:tc>
@@ -6309,8 +6327,252 @@
           <w:color w:val="243447"/>
           <w:sz w:val="17"/>
         </w:rPr>
-        <w:t>.\diagnose-agent.ps1 -OutputPath C:\Temp\ssw-diagnostic.json</w:t>
+        <w:t>.\diagnose-agent.ps1 -OutputPath "$env:TEMP\ssw-diagnostic.json"</w:t>
       </w:r>
+    </w:p>
+    <w:tbl>
+      <w:tblPr>
+        <w:tblW w:type="dxa" w:w="9360"/>
+        <w:tblLayout w:type="fixed"/>
+        <w:tblLook w:firstColumn="1" w:firstRow="1" w:lastColumn="0" w:lastRow="0" w:noHBand="0" w:noVBand="1" w:val="04A0"/>
+        <w:tblInd w:w="120" w:type="dxa"/>
+        <w:tblBorders>
+          <w:top w:val="single" w:sz="6" w:space="0" w:color="CBD5E1"/>
+          <w:left w:val="single" w:sz="6" w:space="0" w:color="CBD5E1"/>
+          <w:bottom w:val="single" w:sz="6" w:space="0" w:color="CBD5E1"/>
+          <w:right w:val="single" w:sz="6" w:space="0" w:color="CBD5E1"/>
+          <w:insideH w:val="single" w:sz="6" w:space="0" w:color="CBD5E1"/>
+          <w:insideV w:val="single" w:sz="6" w:space="0" w:color="CBD5E1"/>
+        </w:tblBorders>
+      </w:tblPr>
+      <w:tblGrid>
+        <w:gridCol w:w="1900"/>
+        <w:gridCol w:w="7460"/>
+      </w:tblGrid>
+      <w:tr>
+        <w:trPr>
+          <w:tblHeader w:val="true"/>
+        </w:trPr>
+        <w:tc>
+          <w:tcPr>
+            <w:tcW w:type="dxa" w:w="1900"/>
+            <w:tcMar>
+              <w:top w:w="80" w:type="dxa"/>
+              <w:start w:w="120" w:type="dxa"/>
+              <w:bottom w:w="80" w:type="dxa"/>
+              <w:end w:w="120" w:type="dxa"/>
+            </w:tcMar>
+            <w:vAlign w:val="center"/>
+            <w:shd w:fill="E8EEF5"/>
+          </w:tcPr>
+          <w:p>
+            <w:pPr>
+              <w:spacing w:before="0" w:after="0" w:line="264" w:lineRule="auto"/>
+              <w:jc w:val="center"/>
+            </w:pPr>
+            <w:r>
+              <w:rPr>
+                <w:rFonts w:ascii="맑은 고딕" w:hAnsi="맑은 고딕" w:eastAsia="맑은 고딕" w:cs="맑은 고딕"/>
+                <w:b/>
+                <w:color w:val="16324F"/>
+                <w:sz w:val="17"/>
+              </w:rPr>
+              <w:t>확인 위치</w:t>
+            </w:r>
+          </w:p>
+        </w:tc>
+        <w:tc>
+          <w:tcPr>
+            <w:tcW w:type="dxa" w:w="7460"/>
+            <w:tcMar>
+              <w:top w:w="80" w:type="dxa"/>
+              <w:start w:w="120" w:type="dxa"/>
+              <w:bottom w:w="80" w:type="dxa"/>
+              <w:end w:w="120" w:type="dxa"/>
+            </w:tcMar>
+            <w:vAlign w:val="center"/>
+            <w:shd w:fill="E8EEF5"/>
+          </w:tcPr>
+          <w:p>
+            <w:pPr>
+              <w:spacing w:before="0" w:after="0" w:line="264" w:lineRule="auto"/>
+              <w:jc w:val="center"/>
+            </w:pPr>
+            <w:r>
+              <w:rPr>
+                <w:rFonts w:ascii="맑은 고딕" w:hAnsi="맑은 고딕" w:eastAsia="맑은 고딕" w:cs="맑은 고딕"/>
+                <w:b/>
+                <w:color w:val="16324F"/>
+                <w:sz w:val="17"/>
+              </w:rPr>
+              <w:t>정상 기준/조치</w:t>
+            </w:r>
+          </w:p>
+        </w:tc>
+      </w:tr>
+      <w:tr>
+        <w:tc>
+          <w:tcPr>
+            <w:tcW w:type="dxa" w:w="1900"/>
+            <w:tcMar>
+              <w:top w:w="80" w:type="dxa"/>
+              <w:start w:w="120" w:type="dxa"/>
+              <w:bottom w:w="80" w:type="dxa"/>
+              <w:end w:w="120" w:type="dxa"/>
+            </w:tcMar>
+            <w:vAlign w:val="center"/>
+          </w:tcPr>
+          <w:p>
+            <w:pPr>
+              <w:spacing w:before="0" w:after="0" w:line="240" w:lineRule="auto"/>
+              <w:jc w:val="left"/>
+            </w:pPr>
+            <w:r>
+              <w:rPr>
+                <w:rFonts w:ascii="맑은 고딕" w:hAnsi="맑은 고딕" w:eastAsia="맑은 고딕" w:cs="맑은 고딕"/>
+                <w:sz w:val="16"/>
+              </w:rPr>
+              <w:t>Viewer</w:t>
+            </w:r>
+          </w:p>
+        </w:tc>
+        <w:tc>
+          <w:tcPr>
+            <w:tcW w:type="dxa" w:w="7460"/>
+            <w:tcMar>
+              <w:top w:w="80" w:type="dxa"/>
+              <w:start w:w="120" w:type="dxa"/>
+              <w:bottom w:w="80" w:type="dxa"/>
+              <w:end w:w="120" w:type="dxa"/>
+            </w:tcMar>
+            <w:vAlign w:val="center"/>
+          </w:tcPr>
+          <w:p>
+            <w:pPr>
+              <w:spacing w:before="0" w:after="0" w:line="240" w:lineRule="auto"/>
+              <w:jc w:val="left"/>
+            </w:pPr>
+            <w:r>
+              <w:rPr>
+                <w:rFonts w:ascii="맑은 고딕" w:hAnsi="맑은 고딕" w:eastAsia="맑은 고딕" w:cs="맑은 고딕"/>
+                <w:sz w:val="16"/>
+              </w:rPr>
+              <w:t>Agent 연결에 실제 Agent PC 주소를 입력합니다. 원격 구성에서는 localhost나 스위치 IP를 사용하지 않습니다.</w:t>
+            </w:r>
+          </w:p>
+        </w:tc>
+      </w:tr>
+      <w:tr>
+        <w:tc>
+          <w:tcPr>
+            <w:tcW w:type="dxa" w:w="1900"/>
+            <w:shd w:fill="FAFBFC"/>
+            <w:tcMar>
+              <w:top w:w="80" w:type="dxa"/>
+              <w:start w:w="120" w:type="dxa"/>
+              <w:bottom w:w="80" w:type="dxa"/>
+              <w:end w:w="120" w:type="dxa"/>
+            </w:tcMar>
+            <w:vAlign w:val="center"/>
+          </w:tcPr>
+          <w:p>
+            <w:pPr>
+              <w:spacing w:before="0" w:after="0" w:line="240" w:lineRule="auto"/>
+              <w:jc w:val="left"/>
+            </w:pPr>
+            <w:r>
+              <w:rPr>
+                <w:rFonts w:ascii="맑은 고딕" w:hAnsi="맑은 고딕" w:eastAsia="맑은 고딕" w:cs="맑은 고딕"/>
+                <w:sz w:val="16"/>
+              </w:rPr>
+              <w:t>Agent PC</w:t>
+            </w:r>
+          </w:p>
+        </w:tc>
+        <w:tc>
+          <w:tcPr>
+            <w:tcW w:type="dxa" w:w="7460"/>
+            <w:shd w:fill="FAFBFC"/>
+            <w:tcMar>
+              <w:top w:w="80" w:type="dxa"/>
+              <w:start w:w="120" w:type="dxa"/>
+              <w:bottom w:w="80" w:type="dxa"/>
+              <w:end w:w="120" w:type="dxa"/>
+            </w:tcMar>
+            <w:vAlign w:val="center"/>
+          </w:tcPr>
+          <w:p>
+            <w:pPr>
+              <w:spacing w:before="0" w:after="0" w:line="240" w:lineRule="auto"/>
+              <w:jc w:val="left"/>
+            </w:pPr>
+            <w:r>
+              <w:rPr>
+                <w:rFonts w:ascii="맑은 고딕" w:hAnsi="맑은 고딕" w:eastAsia="맑은 고딕" w:cs="맑은 고딕"/>
+                <w:sz w:val="16"/>
+              </w:rPr>
+              <w:t>진단 결과의 service, agentLive, agentReady가 각각 OK, LIVE, READY인지 확인합니다.</w:t>
+            </w:r>
+          </w:p>
+        </w:tc>
+      </w:tr>
+      <w:tr>
+        <w:tc>
+          <w:tcPr>
+            <w:tcW w:type="dxa" w:w="1900"/>
+            <w:tcMar>
+              <w:top w:w="80" w:type="dxa"/>
+              <w:start w:w="120" w:type="dxa"/>
+              <w:bottom w:w="80" w:type="dxa"/>
+              <w:end w:w="120" w:type="dxa"/>
+            </w:tcMar>
+            <w:vAlign w:val="center"/>
+          </w:tcPr>
+          <w:p>
+            <w:pPr>
+              <w:spacing w:before="0" w:after="0" w:line="240" w:lineRule="auto"/>
+              <w:jc w:val="left"/>
+            </w:pPr>
+            <w:r>
+              <w:rPr>
+                <w:rFonts w:ascii="맑은 고딕" w:hAnsi="맑은 고딕" w:eastAsia="맑은 고딕" w:cs="맑은 고딕"/>
+                <w:sz w:val="16"/>
+              </w:rPr>
+              <w:t>Viewer PC</w:t>
+            </w:r>
+          </w:p>
+        </w:tc>
+        <w:tc>
+          <w:tcPr>
+            <w:tcW w:type="dxa" w:w="7460"/>
+            <w:tcMar>
+              <w:top w:w="80" w:type="dxa"/>
+              <w:start w:w="120" w:type="dxa"/>
+              <w:bottom w:w="80" w:type="dxa"/>
+              <w:end w:w="120" w:type="dxa"/>
+            </w:tcMar>
+            <w:vAlign w:val="center"/>
+          </w:tcPr>
+          <w:p>
+            <w:pPr>
+              <w:spacing w:before="0" w:after="0" w:line="240" w:lineRule="auto"/>
+              <w:jc w:val="left"/>
+            </w:pPr>
+            <w:r>
+              <w:rPr>
+                <w:rFonts w:ascii="맑은 고딕" w:hAnsi="맑은 고딕" w:eastAsia="맑은 고딕" w:cs="맑은 고딕"/>
+                <w:sz w:val="16"/>
+              </w:rPr>
+              <w:t>Test-NetConnection &lt;Agent-PC-주소&gt; -Port 18443을 실행합니다. 실패하면 Viewer 관리 CIDR, Domain/Private 방화벽, 라우팅과 EDR을 확인합니다.</w:t>
+            </w:r>
+          </w:p>
+        </w:tc>
+      </w:tr>
+    </w:tbl>
+    <w:p>
+      <w:pPr>
+        <w:spacing w:after="60"/>
+      </w:pPr>
     </w:p>
     <w:p>
       <w:pPr>
@@ -6532,7 +6794,7 @@
     <w:p>
       <w:pPr>
         <w:pStyle w:val="Heading2"/>
-        <w:pageBreakBefore w:val="0"/>
+        <w:pageBreakBefore/>
         <w:numPr>
           <w:ilvl w:val="1"/>
           <w:numId w:val="11"/>
@@ -6660,7 +6922,7 @@
         <w:color w:val="64748B"/>
         <w:sz w:val="17"/>
       </w:rPr>
-      <w:t xml:space="preserve">v0.9.14-poc  |  </w:t>
+      <w:t xml:space="preserve">v0.9.15-poc  |  </w:t>
     </w:r>
     <w:r>
       <w:rPr>
@@ -6691,7 +6953,7 @@
         <w:color w:val="64748B"/>
         <w:sz w:val="17"/>
       </w:rPr>
-      <w:t>v0.9.14-poc  |  2026-07-26</w:t>
+      <w:t>v0.9.15-poc  |  2026-07-27</w:t>
     </w:r>
   </w:p>
 </w:ftr>

</xml_diff>

<commit_message>
Fix Viewer shortcut installation rollback
</commit_message>
<xml_diff>
--- a/docs/SamsungSwitchWatch_User_Manual_KO.docx
+++ b/docs/SamsungSwitchWatch_User_Manual_KO.docx
@@ -1289,7 +1289,12 @@
           <w:color w:val="16324F"/>
           <w:sz w:val="21"/>
         </w:rPr>
-        <w:t>관리자 설치 창에 Agent installation failed가 표시되면 Cause 줄을 먼저 확인하세요. 설치 성공 뒤 AGENT_CONNECTION_REFUSED가 보이면 Viewer에 스위치 IP, Viewer PC 주소 또는 localhost가 아니라 Agent를 설치한 PC 주소를 입력했는지 먼저 확인하세요. 그 다음 SamsungSwitchWatchAgent 서비스와 TCP/18443을 점검합니다. 서비스를 수동 등록하지 말고 0.9.15-poc Agent 설치기를 사용하세요.</w:t>
+        <w:t>관리자 설치 창에 Agent installation failed가 표시되면 Cause 줄을 먼저 확인하세요. 설치 성공 뒤 AGENT_CONNECTION_REFUSED가 보이면 Viewer에 스위치 IP, Viewer PC 주소 또는 localhost가 아니라 Agent를 설치한 PC 주소를 입력했는지 먼저 확인하세요. 그 다음 SamsungSwitchWatchAgent 서비스와 TCP/18443을 점검합니다. 서비스를 수동 등록하지 말고 0.9.16-poc Agent 설치기를 사용하세요.</w:t>
+      </w:r>
+    </w:p>
+    <w:p>
+      <w:r>
+        <w:br w:type="page"/>
       </w:r>
     </w:p>
     <w:p>
@@ -1357,6 +1362,33 @@
       <w:pPr>
         <w:spacing w:before="80" w:after="160" w:line="283" w:lineRule="auto"/>
         <w:ind w:left="115" w:right="58"/>
+        <w:shd w:fill="FEF2F2"/>
+        <w:pBdr>
+          <w:left w:val="single" w:sz="16" w:space="8" w:color="B42318"/>
+        </w:pBdr>
+      </w:pPr>
+      <w:r>
+        <w:rPr>
+          <w:rFonts w:ascii="맑은 고딕" w:hAnsi="맑은 고딕" w:eastAsia="맑은 고딕" w:cs="맑은 고딕"/>
+          <w:b/>
+          <w:color w:val="B42318"/>
+          <w:sz w:val="21"/>
+        </w:rPr>
+        <w:t xml:space="preserve">Viewer 설치가 복구된 경우  </w:t>
+      </w:r>
+      <w:r>
+        <w:rPr>
+          <w:rFonts w:ascii="맑은 고딕" w:hAnsi="맑은 고딕" w:eastAsia="맑은 고딕" w:cs="맑은 고딕"/>
+          <w:color w:val="16324F"/>
+          <w:sz w:val="21"/>
+        </w:rPr>
+        <w:t>설치 창의 Cause, Recovery, Diagnostic를 확인하세요. PREVIOUS_VIEWER_RESTORED이면 시작 메뉴에서 Viewer를 다시 실행합니다. ROLLBACK_INCOMPLETE이면 백업과 진단 파일을 보존하고 Windows 관리자에게 전달하세요. 자세한 코드는 INSTALL_KO.md를 확인하세요.</w:t>
+      </w:r>
+    </w:p>
+    <w:p>
+      <w:pPr>
+        <w:spacing w:before="80" w:after="160" w:line="283" w:lineRule="auto"/>
+        <w:ind w:left="115" w:right="58"/>
         <w:shd w:fill="E8EEF5"/>
         <w:pBdr>
           <w:left w:val="single" w:sz="16" w:space="8" w:color="2E74B5"/>
@@ -1408,7 +1440,7 @@
       <w:r>
         <w:drawing>
           <wp:inline xmlns:a="http://schemas.openxmlformats.org/drawingml/2006/main" xmlns:pic="http://schemas.openxmlformats.org/drawingml/2006/picture">
-            <wp:extent cx="3840480" cy="3097161"/>
+            <wp:extent cx="2560320" cy="2064774"/>
             <wp:docPr id="1" name="Picture 1" title="Agent 연결 창" descr="Agent 주소만 입력하고 HTTPS 포트 18443을 자동 사용하는 연결 설정 창"/>
             <wp:cNvGraphicFramePr>
               <a:graphicFrameLocks noChangeAspect="1"/>
@@ -1429,7 +1461,7 @@
                   <pic:spPr>
                     <a:xfrm>
                       <a:off x="0" y="0"/>
-                      <a:ext cx="3840480" cy="3097161"/>
+                      <a:ext cx="2560320" cy="2064774"/>
                     </a:xfrm>
                     <a:prstGeom prst="rect"/>
                   </pic:spPr>
@@ -5455,6 +5487,165 @@
                 <w:rFonts w:ascii="맑은 고딕" w:hAnsi="맑은 고딕" w:eastAsia="맑은 고딕" w:cs="맑은 고딕"/>
                 <w:sz w:val="16"/>
               </w:rPr>
+              <w:t>VIEWER_SHORTCUT_DIRECTORY_UNAVAILABLE</w:t>
+            </w:r>
+          </w:p>
+        </w:tc>
+        <w:tc>
+          <w:tcPr>
+            <w:tcW w:type="dxa" w:w="5360"/>
+            <w:shd w:fill="FAFBFC"/>
+            <w:tcMar>
+              <w:top w:w="80" w:type="dxa"/>
+              <w:start w:w="120" w:type="dxa"/>
+              <w:bottom w:w="80" w:type="dxa"/>
+              <w:end w:w="120" w:type="dxa"/>
+            </w:tcMar>
+            <w:vAlign w:val="center"/>
+          </w:tcPr>
+          <w:p>
+            <w:pPr>
+              <w:spacing w:before="0" w:after="0" w:line="240" w:lineRule="auto"/>
+              <w:jc w:val="left"/>
+            </w:pPr>
+            <w:r>
+              <w:rPr>
+                <w:rFonts w:ascii="맑은 고딕" w:hAnsi="맑은 고딕" w:eastAsia="맑은 고딕" w:cs="맑은 고딕"/>
+                <w:sz w:val="16"/>
+              </w:rPr>
+              <w:t>Viewer를 설치할 동일 Windows 사용자 → 시작 메뉴·시작프로그램 폴더 쓰기 권한 → 보안 정책</w:t>
+            </w:r>
+          </w:p>
+        </w:tc>
+      </w:tr>
+      <w:tr>
+        <w:tc>
+          <w:tcPr>
+            <w:tcW w:type="dxa" w:w="4000"/>
+            <w:tcMar>
+              <w:top w:w="80" w:type="dxa"/>
+              <w:start w:w="120" w:type="dxa"/>
+              <w:bottom w:w="80" w:type="dxa"/>
+              <w:end w:w="120" w:type="dxa"/>
+            </w:tcMar>
+            <w:vAlign w:val="center"/>
+          </w:tcPr>
+          <w:p>
+            <w:pPr>
+              <w:spacing w:before="0" w:after="0" w:line="240" w:lineRule="auto"/>
+              <w:jc w:val="left"/>
+            </w:pPr>
+            <w:r>
+              <w:rPr>
+                <w:rFonts w:ascii="맑은 고딕" w:hAnsi="맑은 고딕" w:eastAsia="맑은 고딕" w:cs="맑은 고딕"/>
+                <w:sz w:val="16"/>
+              </w:rPr>
+              <w:t>VIEWER_SHORTCUT_SETUP_FAILED</w:t>
+            </w:r>
+          </w:p>
+        </w:tc>
+        <w:tc>
+          <w:tcPr>
+            <w:tcW w:type="dxa" w:w="5360"/>
+            <w:tcMar>
+              <w:top w:w="80" w:type="dxa"/>
+              <w:start w:w="120" w:type="dxa"/>
+              <w:bottom w:w="80" w:type="dxa"/>
+              <w:end w:w="120" w:type="dxa"/>
+            </w:tcMar>
+            <w:vAlign w:val="center"/>
+          </w:tcPr>
+          <w:p>
+            <w:pPr>
+              <w:spacing w:before="0" w:after="0" w:line="240" w:lineRule="auto"/>
+              <w:jc w:val="left"/>
+            </w:pPr>
+            <w:r>
+              <w:rPr>
+                <w:rFonts w:ascii="맑은 고딕" w:hAnsi="맑은 고딕" w:eastAsia="맑은 고딕" w:cs="맑은 고딕"/>
+                <w:sz w:val="16"/>
+              </w:rPr>
+              <w:t>Recovery 결과 → 바로 가기 생성 권한 → 보안 프로그램 차단</w:t>
+            </w:r>
+          </w:p>
+        </w:tc>
+      </w:tr>
+      <w:tr>
+        <w:tc>
+          <w:tcPr>
+            <w:tcW w:type="dxa" w:w="4000"/>
+            <w:shd w:fill="FAFBFC"/>
+            <w:tcMar>
+              <w:top w:w="80" w:type="dxa"/>
+              <w:start w:w="120" w:type="dxa"/>
+              <w:bottom w:w="80" w:type="dxa"/>
+              <w:end w:w="120" w:type="dxa"/>
+            </w:tcMar>
+            <w:vAlign w:val="center"/>
+          </w:tcPr>
+          <w:p>
+            <w:pPr>
+              <w:spacing w:before="0" w:after="0" w:line="240" w:lineRule="auto"/>
+              <w:jc w:val="left"/>
+            </w:pPr>
+            <w:r>
+              <w:rPr>
+                <w:rFonts w:ascii="맑은 고딕" w:hAnsi="맑은 고딕" w:eastAsia="맑은 고딕" w:cs="맑은 고딕"/>
+                <w:sz w:val="16"/>
+              </w:rPr>
+              <w:t>VIEWER_SMOKE_CHECK_FAILED</w:t>
+            </w:r>
+          </w:p>
+        </w:tc>
+        <w:tc>
+          <w:tcPr>
+            <w:tcW w:type="dxa" w:w="5360"/>
+            <w:shd w:fill="FAFBFC"/>
+            <w:tcMar>
+              <w:top w:w="80" w:type="dxa"/>
+              <w:start w:w="120" w:type="dxa"/>
+              <w:bottom w:w="80" w:type="dxa"/>
+              <w:end w:w="120" w:type="dxa"/>
+            </w:tcMar>
+            <w:vAlign w:val="center"/>
+          </w:tcPr>
+          <w:p>
+            <w:pPr>
+              <w:spacing w:before="0" w:after="0" w:line="240" w:lineRule="auto"/>
+              <w:jc w:val="left"/>
+            </w:pPr>
+            <w:r>
+              <w:rPr>
+                <w:rFonts w:ascii="맑은 고딕" w:hAnsi="맑은 고딕" w:eastAsia="맑은 고딕" w:cs="맑은 고딕"/>
+                <w:sz w:val="16"/>
+              </w:rPr>
+              <w:t>기존 Viewer 복구 여부 → 패키지 무결성 → 보안 프로그램 차단</w:t>
+            </w:r>
+          </w:p>
+        </w:tc>
+      </w:tr>
+      <w:tr>
+        <w:tc>
+          <w:tcPr>
+            <w:tcW w:type="dxa" w:w="4000"/>
+            <w:tcMar>
+              <w:top w:w="80" w:type="dxa"/>
+              <w:start w:w="120" w:type="dxa"/>
+              <w:bottom w:w="80" w:type="dxa"/>
+              <w:end w:w="120" w:type="dxa"/>
+            </w:tcMar>
+            <w:vAlign w:val="center"/>
+          </w:tcPr>
+          <w:p>
+            <w:pPr>
+              <w:spacing w:before="0" w:after="0" w:line="240" w:lineRule="auto"/>
+              <w:jc w:val="left"/>
+            </w:pPr>
+            <w:r>
+              <w:rPr>
+                <w:rFonts w:ascii="맑은 고딕" w:hAnsi="맑은 고딕" w:eastAsia="맑은 고딕" w:cs="맑은 고딕"/>
+                <w:sz w:val="16"/>
+              </w:rPr>
               <w:t>TARGET_NOT_ALLOWED</w:t>
             </w:r>
           </w:p>
@@ -5462,7 +5653,6 @@
         <w:tc>
           <w:tcPr>
             <w:tcW w:type="dxa" w:w="5360"/>
-            <w:shd w:fill="FAFBFC"/>
             <w:tcMar>
               <w:top w:w="80" w:type="dxa"/>
               <w:start w:w="120" w:type="dxa"/>
@@ -5490,6 +5680,7 @@
         <w:tc>
           <w:tcPr>
             <w:tcW w:type="dxa" w:w="4000"/>
+            <w:shd w:fill="FAFBFC"/>
             <w:tcMar>
               <w:top w:w="80" w:type="dxa"/>
               <w:start w:w="120" w:type="dxa"/>
@@ -5515,6 +5706,7 @@
         <w:tc>
           <w:tcPr>
             <w:tcW w:type="dxa" w:w="5360"/>
+            <w:shd w:fill="FAFBFC"/>
             <w:tcMar>
               <w:top w:w="80" w:type="dxa"/>
               <w:start w:w="120" w:type="dxa"/>
@@ -5542,7 +5734,6 @@
         <w:tc>
           <w:tcPr>
             <w:tcW w:type="dxa" w:w="4000"/>
-            <w:shd w:fill="FAFBFC"/>
             <w:tcMar>
               <w:top w:w="80" w:type="dxa"/>
               <w:start w:w="120" w:type="dxa"/>
@@ -5568,7 +5759,6 @@
         <w:tc>
           <w:tcPr>
             <w:tcW w:type="dxa" w:w="5360"/>
-            <w:shd w:fill="FAFBFC"/>
             <w:tcMar>
               <w:top w:w="80" w:type="dxa"/>
               <w:start w:w="120" w:type="dxa"/>
@@ -5596,6 +5786,7 @@
         <w:tc>
           <w:tcPr>
             <w:tcW w:type="dxa" w:w="4000"/>
+            <w:shd w:fill="FAFBFC"/>
             <w:tcMar>
               <w:top w:w="80" w:type="dxa"/>
               <w:start w:w="120" w:type="dxa"/>
@@ -5621,6 +5812,7 @@
         <w:tc>
           <w:tcPr>
             <w:tcW w:type="dxa" w:w="5360"/>
+            <w:shd w:fill="FAFBFC"/>
             <w:tcMar>
               <w:top w:w="80" w:type="dxa"/>
               <w:start w:w="120" w:type="dxa"/>
@@ -5648,7 +5840,6 @@
         <w:tc>
           <w:tcPr>
             <w:tcW w:type="dxa" w:w="4000"/>
-            <w:shd w:fill="FAFBFC"/>
             <w:tcMar>
               <w:top w:w="80" w:type="dxa"/>
               <w:start w:w="120" w:type="dxa"/>
@@ -5674,7 +5865,6 @@
         <w:tc>
           <w:tcPr>
             <w:tcW w:type="dxa" w:w="5360"/>
-            <w:shd w:fill="FAFBFC"/>
             <w:tcMar>
               <w:top w:w="80" w:type="dxa"/>
               <w:start w:w="120" w:type="dxa"/>
@@ -5702,6 +5892,7 @@
         <w:tc>
           <w:tcPr>
             <w:tcW w:type="dxa" w:w="4000"/>
+            <w:shd w:fill="FAFBFC"/>
             <w:tcMar>
               <w:top w:w="80" w:type="dxa"/>
               <w:start w:w="120" w:type="dxa"/>
@@ -5727,6 +5918,7 @@
         <w:tc>
           <w:tcPr>
             <w:tcW w:type="dxa" w:w="5360"/>
+            <w:shd w:fill="FAFBFC"/>
             <w:tcMar>
               <w:top w:w="80" w:type="dxa"/>
               <w:start w:w="120" w:type="dxa"/>
@@ -5754,7 +5946,6 @@
         <w:tc>
           <w:tcPr>
             <w:tcW w:type="dxa" w:w="4000"/>
-            <w:shd w:fill="FAFBFC"/>
             <w:tcMar>
               <w:top w:w="80" w:type="dxa"/>
               <w:start w:w="120" w:type="dxa"/>
@@ -5780,7 +5971,6 @@
         <w:tc>
           <w:tcPr>
             <w:tcW w:type="dxa" w:w="5360"/>
-            <w:shd w:fill="FAFBFC"/>
             <w:tcMar>
               <w:top w:w="80" w:type="dxa"/>
               <w:start w:w="120" w:type="dxa"/>
@@ -5808,6 +5998,7 @@
         <w:tc>
           <w:tcPr>
             <w:tcW w:type="dxa" w:w="4000"/>
+            <w:shd w:fill="FAFBFC"/>
             <w:tcMar>
               <w:top w:w="80" w:type="dxa"/>
               <w:start w:w="120" w:type="dxa"/>
@@ -5833,6 +6024,7 @@
         <w:tc>
           <w:tcPr>
             <w:tcW w:type="dxa" w:w="5360"/>
+            <w:shd w:fill="FAFBFC"/>
             <w:tcMar>
               <w:top w:w="80" w:type="dxa"/>
               <w:start w:w="120" w:type="dxa"/>
@@ -5860,7 +6052,6 @@
         <w:tc>
           <w:tcPr>
             <w:tcW w:type="dxa" w:w="4000"/>
-            <w:shd w:fill="FAFBFC"/>
             <w:tcMar>
               <w:top w:w="80" w:type="dxa"/>
               <w:start w:w="120" w:type="dxa"/>
@@ -5886,7 +6077,6 @@
         <w:tc>
           <w:tcPr>
             <w:tcW w:type="dxa" w:w="5360"/>
-            <w:shd w:fill="FAFBFC"/>
             <w:tcMar>
               <w:top w:w="80" w:type="dxa"/>
               <w:start w:w="120" w:type="dxa"/>
@@ -5914,6 +6104,7 @@
         <w:tc>
           <w:tcPr>
             <w:tcW w:type="dxa" w:w="4000"/>
+            <w:shd w:fill="FAFBFC"/>
             <w:tcMar>
               <w:top w:w="80" w:type="dxa"/>
               <w:start w:w="120" w:type="dxa"/>
@@ -5939,6 +6130,7 @@
         <w:tc>
           <w:tcPr>
             <w:tcW w:type="dxa" w:w="5360"/>
+            <w:shd w:fill="FAFBFC"/>
             <w:tcMar>
               <w:top w:w="80" w:type="dxa"/>
               <w:start w:w="120" w:type="dxa"/>
@@ -5966,7 +6158,6 @@
         <w:tc>
           <w:tcPr>
             <w:tcW w:type="dxa" w:w="4000"/>
-            <w:shd w:fill="FAFBFC"/>
             <w:tcMar>
               <w:top w:w="80" w:type="dxa"/>
               <w:start w:w="120" w:type="dxa"/>
@@ -5992,7 +6183,6 @@
         <w:tc>
           <w:tcPr>
             <w:tcW w:type="dxa" w:w="5360"/>
-            <w:shd w:fill="FAFBFC"/>
             <w:tcMar>
               <w:top w:w="80" w:type="dxa"/>
               <w:start w:w="120" w:type="dxa"/>
@@ -6020,6 +6210,7 @@
         <w:tc>
           <w:tcPr>
             <w:tcW w:type="dxa" w:w="4000"/>
+            <w:shd w:fill="FAFBFC"/>
             <w:tcMar>
               <w:top w:w="80" w:type="dxa"/>
               <w:start w:w="120" w:type="dxa"/>
@@ -6045,6 +6236,7 @@
         <w:tc>
           <w:tcPr>
             <w:tcW w:type="dxa" w:w="5360"/>
+            <w:shd w:fill="FAFBFC"/>
             <w:tcMar>
               <w:top w:w="80" w:type="dxa"/>
               <w:start w:w="120" w:type="dxa"/>
@@ -6072,7 +6264,6 @@
         <w:tc>
           <w:tcPr>
             <w:tcW w:type="dxa" w:w="4000"/>
-            <w:shd w:fill="FAFBFC"/>
             <w:tcMar>
               <w:top w:w="80" w:type="dxa"/>
               <w:start w:w="120" w:type="dxa"/>
@@ -6098,7 +6289,6 @@
         <w:tc>
           <w:tcPr>
             <w:tcW w:type="dxa" w:w="5360"/>
-            <w:shd w:fill="FAFBFC"/>
             <w:tcMar>
               <w:top w:w="80" w:type="dxa"/>
               <w:start w:w="120" w:type="dxa"/>
@@ -6126,6 +6316,7 @@
         <w:tc>
           <w:tcPr>
             <w:tcW w:type="dxa" w:w="4000"/>
+            <w:shd w:fill="FAFBFC"/>
             <w:tcMar>
               <w:top w:w="80" w:type="dxa"/>
               <w:start w:w="120" w:type="dxa"/>
@@ -6151,6 +6342,7 @@
         <w:tc>
           <w:tcPr>
             <w:tcW w:type="dxa" w:w="5360"/>
+            <w:shd w:fill="FAFBFC"/>
             <w:tcMar>
               <w:top w:w="80" w:type="dxa"/>
               <w:start w:w="120" w:type="dxa"/>
@@ -6178,7 +6370,6 @@
         <w:tc>
           <w:tcPr>
             <w:tcW w:type="dxa" w:w="4000"/>
-            <w:shd w:fill="FAFBFC"/>
             <w:tcMar>
               <w:top w:w="80" w:type="dxa"/>
               <w:start w:w="120" w:type="dxa"/>
@@ -6204,7 +6395,6 @@
         <w:tc>
           <w:tcPr>
             <w:tcW w:type="dxa" w:w="5360"/>
-            <w:shd w:fill="FAFBFC"/>
             <w:tcMar>
               <w:top w:w="80" w:type="dxa"/>
               <w:start w:w="120" w:type="dxa"/>
@@ -6922,7 +7112,7 @@
         <w:color w:val="64748B"/>
         <w:sz w:val="17"/>
       </w:rPr>
-      <w:t xml:space="preserve">v0.9.15-poc  |  </w:t>
+      <w:t xml:space="preserve">v0.9.16-poc  |  </w:t>
     </w:r>
     <w:r>
       <w:rPr>
@@ -6953,7 +7143,7 @@
         <w:color w:val="64748B"/>
         <w:sz w:val="17"/>
       </w:rPr>
-      <w:t>v0.9.15-poc  |  2026-07-27</w:t>
+      <w:t>v0.9.16-poc  |  2026-07-27</w:t>
     </w:r>
   </w:p>
 </w:ftr>

</xml_diff>

<commit_message>
feat: simplify agent IP setup and harden viewer install
</commit_message>
<xml_diff>
--- a/docs/SamsungSwitchWatch_User_Manual_KO.docx
+++ b/docs/SamsungSwitchWatch_User_Manual_KO.docx
@@ -118,6 +118,7 @@
     </w:p>
     <w:p>
       <w:pPr>
+        <w:keepLines/>
         <w:spacing w:before="80" w:after="160" w:line="283" w:lineRule="auto"/>
         <w:ind w:left="115" w:right="58"/>
         <w:shd w:fill="E8EEF5"/>
@@ -593,6 +594,7 @@
     </w:p>
     <w:p>
       <w:pPr>
+        <w:keepLines/>
         <w:spacing w:before="80" w:after="160" w:line="283" w:lineRule="auto"/>
         <w:ind w:left="115" w:right="58"/>
         <w:shd w:fill="FFF8E8"/>
@@ -870,7 +872,7 @@
                 <w:rFonts w:ascii="맑은 고딕" w:hAnsi="맑은 고딕" w:eastAsia="맑은 고딕" w:cs="맑은 고딕"/>
                 <w:sz w:val="18"/>
               </w:rPr>
-              <w:t>설치 시 지정한 Viewer 관리 CIDR만 허용</w:t>
+              <w:t>설치 시 지정한 Viewer PC IPv4만 기본 허용</w:t>
             </w:r>
           </w:p>
         </w:tc>
@@ -950,7 +952,7 @@
                 <w:rFonts w:ascii="맑은 고딕" w:hAnsi="맑은 고딕" w:eastAsia="맑은 고딕" w:cs="맑은 고딕"/>
                 <w:sz w:val="18"/>
               </w:rPr>
-              <w:t>설치 시 지정한 스위치 대상 CIDR만 허용</w:t>
+              <w:t>설치 시 지정한 스위치 관리 IPv4만 기본 허용</w:t>
             </w:r>
           </w:p>
         </w:tc>
@@ -1019,6 +1021,7 @@
     </w:p>
     <w:p>
       <w:pPr>
+        <w:keepLines/>
         <w:spacing w:before="80" w:after="160" w:line="283" w:lineRule="auto"/>
         <w:ind w:left="115" w:right="58"/>
         <w:shd w:fill="FEF2F2"/>
@@ -1121,7 +1124,7 @@
         <w:rPr>
           <w:rFonts w:ascii="맑은 고딕" w:hAnsi="맑은 고딕" w:eastAsia="맑은 고딕" w:cs="맑은 고딕"/>
         </w:rPr>
-        <w:t>신규 설치에서는 Viewer 관리망 CIDR과 스위치 대상망 CIDR을 입력합니다.</w:t>
+        <w:t>신규 설치에서는 Viewer PC IPv4와 스위치 관리 IPv4를 입력합니다. CIDR 계산은 필요하지 않습니다.</w:t>
       </w:r>
     </w:p>
     <w:p>
@@ -1153,7 +1156,7 @@
           <w:color w:val="243447"/>
           <w:sz w:val="17"/>
         </w:rPr>
-        <w:t>Viewer 관리망 CIDR 예: 192.0.2.0/24</w:t>
+        <w:t>Viewer PC IPv4 예     : 192.0.2.25</w:t>
       </w:r>
       <w:r>
         <w:br/>
@@ -1164,7 +1167,7 @@
           <w:color w:val="243447"/>
           <w:sz w:val="17"/>
         </w:rPr>
-        <w:t>스위치 대상망 CIDR 예: 198.51.100.0/24</w:t>
+        <w:t>스위치 관리 IPv4 예  : 198.51.100.11,198.51.100.12</w:t>
       </w:r>
       <w:r>
         <w:br/>
@@ -1213,6 +1216,7 @@
     </w:p>
     <w:p>
       <w:pPr>
+        <w:keepLines/>
         <w:spacing w:before="80" w:after="160" w:line="283" w:lineRule="auto"/>
         <w:ind w:left="115" w:right="58"/>
         <w:shd w:fill="FEF2F2"/>
@@ -1240,6 +1244,7 @@
     </w:p>
     <w:p>
       <w:pPr>
+        <w:keepLines/>
         <w:spacing w:before="80" w:after="160" w:line="283" w:lineRule="auto"/>
         <w:ind w:left="115" w:right="58"/>
         <w:shd w:fill="E8EEF5"/>
@@ -1262,11 +1267,45 @@
           <w:color w:val="16324F"/>
           <w:sz w:val="21"/>
         </w:rPr>
-        <w:t>패키지는 SYSTEM·Administrators 전용 staging으로 복사한 뒤 SHA-256을 다시 확인합니다. install receipt는 관리자 전용 설치 증거이고, CIDR은 검증된 설정과 제품 소유 방화벽에서 가져옵니다. rollback 선행 단계가 실패하면 후속 파일 변경을 멈추고 snapshot·archive·journal을 보존합니다.</w:t>
+        <w:t>패키지는 SYSTEM·Administrators 전용 staging으로 복사한 뒤 SHA-256을 다시 확인합니다. install receipt는 관리자 전용 설치 증거이고, 허용 정책은 검증된 설정과 제품 소유 방화벽에서 가져옵니다. rollback 선행 단계가 실패하면 후속 파일 변경을 멈추고 snapshot·archive·journal을 보존합니다.</w:t>
       </w:r>
     </w:p>
     <w:p>
       <w:pPr>
+        <w:keepLines/>
+        <w:spacing w:before="80" w:after="160" w:line="283" w:lineRule="auto"/>
+        <w:ind w:left="115" w:right="58"/>
+        <w:shd w:fill="E8EEF5"/>
+        <w:pBdr>
+          <w:left w:val="single" w:sz="16" w:space="8" w:color="2E74B5"/>
+        </w:pBdr>
+      </w:pPr>
+      <w:r>
+        <w:rPr>
+          <w:rFonts w:ascii="맑은 고딕" w:hAnsi="맑은 고딕" w:eastAsia="맑은 고딕" w:cs="맑은 고딕"/>
+          <w:b/>
+          <w:color w:val="2E74B5"/>
+          <w:sz w:val="21"/>
+        </w:rPr>
+        <w:t xml:space="preserve">허용 IP 변경  </w:t>
+      </w:r>
+      <w:r>
+        <w:rPr>
+          <w:rFonts w:ascii="맑은 고딕" w:hAnsi="맑은 고딕" w:eastAsia="맑은 고딕" w:cs="맑은 고딕"/>
+          <w:color w:val="16324F"/>
+          <w:sz w:val="21"/>
+        </w:rPr>
+        <w:t>Viewer PC 또는 스위치 주소가 바뀌면 현재 Agent와 같은 버전 ZIP의 Configure-Agent-Allowed-IPs.cmd를 실행합니다. 일반 IPv4만 입력하며 내부에서 정확한 /32 정책으로 변환합니다. DHCP 또는 32대를 넘는 장비는 INSTALL_KO.md의 고급 CIDR 절차를 사용하세요.</w:t>
+      </w:r>
+    </w:p>
+    <w:p>
+      <w:r>
+        <w:br w:type="page"/>
+      </w:r>
+    </w:p>
+    <w:p>
+      <w:pPr>
+        <w:keepLines/>
         <w:spacing w:before="80" w:after="160" w:line="283" w:lineRule="auto"/>
         <w:ind w:left="115" w:right="58"/>
         <w:shd w:fill="FEF2F2"/>
@@ -1289,12 +1328,7 @@
           <w:color w:val="16324F"/>
           <w:sz w:val="21"/>
         </w:rPr>
-        <w:t>관리자 설치 창에 Agent installation failed가 표시되면 Cause 줄을 먼저 확인하세요. 설치 성공 뒤 AGENT_CONNECTION_REFUSED가 보이면 Viewer에 스위치 IP, Viewer PC 주소 또는 localhost가 아니라 Agent를 설치한 PC 주소를 입력했는지 먼저 확인하세요. 그 다음 SamsungSwitchWatchAgent 서비스와 TCP/18443을 점검합니다. 서비스를 수동 등록하지 말고 0.9.16-poc Agent 설치기를 사용하세요.</w:t>
-      </w:r>
-    </w:p>
-    <w:p>
-      <w:r>
-        <w:br w:type="page"/>
+        <w:t>관리자 설치 창에 Agent installation failed가 표시되면 Cause 줄을 먼저 확인하세요. 설치 성공 뒤 AGENT_CONNECTION_REFUSED가 보이면 Viewer에 스위치 IP, Viewer PC 주소 또는 localhost가 아니라 Agent를 설치한 PC 주소를 입력했는지 먼저 확인하세요. 그 다음 SamsungSwitchWatchAgent 서비스와 TCP/18443을 점검합니다. 서비스를 수동 등록하지 말고 0.9.17-poc Agent 설치기를 사용하세요.</w:t>
       </w:r>
     </w:p>
     <w:p>
@@ -1360,6 +1394,7 @@
     </w:p>
     <w:p>
       <w:pPr>
+        <w:keepLines/>
         <w:spacing w:before="80" w:after="160" w:line="283" w:lineRule="auto"/>
         <w:ind w:left="115" w:right="58"/>
         <w:shd w:fill="FEF2F2"/>
@@ -1382,11 +1417,12 @@
           <w:color w:val="16324F"/>
           <w:sz w:val="21"/>
         </w:rPr>
-        <w:t>설치 창의 Cause, Recovery, Diagnostic를 확인하세요. PREVIOUS_VIEWER_RESTORED이면 시작 메뉴에서 Viewer를 다시 실행합니다. ROLLBACK_INCOMPLETE이면 백업과 진단 파일을 보존하고 Windows 관리자에게 전달하세요. 자세한 코드는 INSTALL_KO.md를 확인하세요.</w:t>
+        <w:t>설치 창의 Cause, Detail, 선택적 ExitCode, Recovery와 두 진단 경로를 확인하세요. PREVIOUS_VIEWER_RESTORED이면 시작 메뉴에서 Viewer를 다시 실행합니다. ROLLBACK_INCOMPLETE이면 백업과 진단 파일을 보존하고 Windows 관리자에게 전달하세요. 자세한 코드는 INSTALL_KO.md를 확인하세요.</w:t>
       </w:r>
     </w:p>
     <w:p>
       <w:pPr>
+        <w:keepLines/>
         <w:spacing w:before="80" w:after="160" w:line="283" w:lineRule="auto"/>
         <w:ind w:left="115" w:right="58"/>
         <w:shd w:fill="E8EEF5"/>
@@ -1410,6 +1446,11 @@
           <w:sz w:val="21"/>
         </w:rPr>
         <w:t>설치 전 검사, 설치 위치 또는 자동 시작 상태를 직접 지정할 때만 INSTALL_KO.md의 install-viewer.ps1 옵션을 사용하세요.</w:t>
+      </w:r>
+    </w:p>
+    <w:p>
+      <w:r>
+        <w:br w:type="page"/>
       </w:r>
     </w:p>
     <w:p>
@@ -1942,7 +1983,7 @@
                 <w:rFonts w:ascii="맑은 고딕" w:hAnsi="맑은 고딕" w:eastAsia="맑은 고딕" w:cs="맑은 고딕"/>
                 <w:sz w:val="18"/>
               </w:rPr>
-              <w:t>Agent 설치 시 허용한 대상 CIDR 안의 관리 IP</w:t>
+              <w:t>Agent 설치 또는 허용 IP 설정 도구에 등록한 관리 IP</w:t>
             </w:r>
           </w:p>
         </w:tc>
@@ -2269,6 +2310,7 @@
     </w:p>
     <w:p>
       <w:pPr>
+        <w:keepLines/>
         <w:spacing w:before="80" w:after="160" w:line="283" w:lineRule="auto"/>
         <w:ind w:left="115" w:right="58"/>
         <w:shd w:fill="FFF8E8"/>
@@ -2291,7 +2333,7 @@
           <w:color w:val="16324F"/>
           <w:sz w:val="21"/>
         </w:rPr>
-        <w:t>실패한 장비도 저장할 수 있지만 '접속 미확인'으로 표시되고 주기 감시는 강제로 꺼집니다. 주소, CIDR, ID/PW와 enable 필요 여부를 바로잡은 뒤 다시 시험하세요.</w:t>
+        <w:t>실패한 장비도 저장할 수 있지만 '접속 미확인'으로 표시되고 주기 감시는 강제로 꺼집니다. 주소, Agent 허용 IP, ID/PW와 enable 필요 여부를 바로잡은 뒤 다시 시험하세요.</w:t>
       </w:r>
     </w:p>
     <w:p>
@@ -2767,6 +2809,7 @@
     </w:p>
     <w:p>
       <w:pPr>
+        <w:keepLines/>
         <w:spacing w:before="80" w:after="160" w:line="283" w:lineRule="auto"/>
         <w:ind w:left="115" w:right="58"/>
         <w:shd w:fill="FEF2F2"/>
@@ -3181,6 +3224,7 @@
     </w:p>
     <w:p>
       <w:pPr>
+        <w:keepLines/>
         <w:spacing w:before="80" w:after="160" w:line="283" w:lineRule="auto"/>
         <w:ind w:left="115" w:right="58"/>
         <w:shd w:fill="FFF8E8"/>
@@ -4725,7 +4769,7 @@
         <w:rPr>
           <w:rFonts w:ascii="맑은 고딕" w:hAnsi="맑은 고딕" w:eastAsia="맑은 고딕" w:cs="맑은 고딕"/>
         </w:rPr>
-        <w:t>대상 CIDR은 설치 설정, Viewer 관리 CIDR은 제품 소유 방화벽 규칙이 권한원이며 설치 영수증에서 복원하지 않습니다.</w:t>
+        <w:t>대상 정책은 설치 설정, Viewer 접근 정책은 제품 소유 방화벽 규칙이 권한원이며 설치 영수증에서 복원하지 않습니다.</w:t>
       </w:r>
     </w:p>
     <w:p>
@@ -4739,7 +4783,7 @@
         <w:rPr>
           <w:rFonts w:ascii="맑은 고딕" w:hAnsi="맑은 고딕" w:eastAsia="맑은 고딕" w:cs="맑은 고딕"/>
         </w:rPr>
-        <w:t>Agent 방화벽은 Viewer 관리 CIDR만 HTTPS/18443에 접근하도록 제한합니다.</w:t>
+        <w:t>Agent 방화벽은 등록한 Viewer PC IPv4 또는 고급 관리 CIDR만 HTTPS/18443에 접근하도록 제한합니다.</w:t>
       </w:r>
     </w:p>
     <w:p>
@@ -4753,11 +4797,31 @@
         <w:rPr>
           <w:rFonts w:ascii="맑은 고딕" w:hAnsi="맑은 고딕" w:eastAsia="맑은 고딕" w:cs="맑은 고딕"/>
         </w:rPr>
-        <w:t>Agent는 지정된 스위치 대상 CIDR과 고정 Telnet/23만 허용합니다.</w:t>
+        <w:t>Agent는 등록한 스위치 IPv4 또는 고급 대상 CIDR과 고정 Telnet/23만 허용합니다.</w:t>
       </w:r>
     </w:p>
     <w:p>
       <w:pPr>
+        <w:pStyle w:val="Heading1"/>
+        <w:pageBreakBefore/>
+        <w:numPr>
+          <w:ilvl w:val="0"/>
+          <w:numId w:val="11"/>
+        </w:numPr>
+      </w:pPr>
+      <w:r>
+        <w:rPr>
+          <w:rFonts w:ascii="맑은 고딕" w:hAnsi="맑은 고딕" w:eastAsia="맑은 고딕" w:cs="맑은 고딕"/>
+          <w:b/>
+          <w:color w:val="2E74B5"/>
+          <w:sz w:val="32"/>
+        </w:rPr>
+        <w:t>문제 해결</w:t>
+      </w:r>
+    </w:p>
+    <w:p>
+      <w:pPr>
+        <w:keepLines/>
         <w:spacing w:before="80" w:after="160" w:line="283" w:lineRule="auto"/>
         <w:ind w:left="115" w:right="58"/>
         <w:shd w:fill="FEF2F2"/>
@@ -4781,25 +4845,6 @@
           <w:sz w:val="21"/>
         </w:rPr>
         <w:t>Viewer PC와 Agent PC는 관리망에서만 사용하고, 일반 사용자 VLAN이나 인터넷을 거쳐 Telnet을 사용하지 마세요.</w:t>
-      </w:r>
-    </w:p>
-    <w:p>
-      <w:pPr>
-        <w:pStyle w:val="Heading1"/>
-        <w:pageBreakBefore/>
-        <w:numPr>
-          <w:ilvl w:val="0"/>
-          <w:numId w:val="11"/>
-        </w:numPr>
-      </w:pPr>
-      <w:r>
-        <w:rPr>
-          <w:rFonts w:ascii="맑은 고딕" w:hAnsi="맑은 고딕" w:eastAsia="맑은 고딕" w:cs="맑은 고딕"/>
-          <w:b/>
-          <w:color w:val="2E74B5"/>
-          <w:sz w:val="32"/>
-        </w:rPr>
-        <w:t>문제 해결</w:t>
       </w:r>
     </w:p>
     <w:tbl>
@@ -5353,7 +5398,7 @@
                 <w:rFonts w:ascii="맑은 고딕" w:hAnsi="맑은 고딕" w:eastAsia="맑은 고딕" w:cs="맑은 고딕"/>
                 <w:sz w:val="16"/>
               </w:rPr>
-              <w:t>Agent 서비스 → TCP/18443 경로 → Viewer 관리 CIDR 방화벽</w:t>
+              <w:t>Agent 서비스 → TCP/18443 경로 → Viewer PC 허용 IP 방화벽</w:t>
             </w:r>
           </w:p>
         </w:tc>
@@ -5407,7 +5452,7 @@
                 <w:rFonts w:ascii="맑은 고딕" w:hAnsi="맑은 고딕" w:eastAsia="맑은 고딕" w:cs="맑은 고딕"/>
                 <w:sz w:val="16"/>
               </w:rPr>
-              <w:t>입력 주소가 실제 Agent PC인지 → 서비스 → 로컬 진단 → Viewer PC의 원격 TCP/18443</w:t>
+              <w:t>실제 Agent PC 주소 → 서비스 → 허용 IP 설정 도구 → Viewer PC의 원격 TCP/18443</w:t>
             </w:r>
           </w:p>
         </w:tc>
@@ -5619,7 +5664,7 @@
                 <w:rFonts w:ascii="맑은 고딕" w:hAnsi="맑은 고딕" w:eastAsia="맑은 고딕" w:cs="맑은 고딕"/>
                 <w:sz w:val="16"/>
               </w:rPr>
-              <w:t>기존 Viewer 복구 여부 → 패키지 무결성 → 보안 프로그램 차단</w:t>
+              <w:t>Detail·ExitCode → 기존 Viewer 복구 → 설치 journal·Viewer 진단 로그 → 보안 프로그램</w:t>
             </w:r>
           </w:p>
         </w:tc>
@@ -5646,7 +5691,7 @@
                 <w:rFonts w:ascii="맑은 고딕" w:hAnsi="맑은 고딕" w:eastAsia="맑은 고딕" w:cs="맑은 고딕"/>
                 <w:sz w:val="16"/>
               </w:rPr>
-              <w:t>TARGET_NOT_ALLOWED</w:t>
+              <w:t>VIEWER_PACKAGE_FILE_MISSING</w:t>
             </w:r>
           </w:p>
         </w:tc>
@@ -5671,7 +5716,7 @@
                 <w:rFonts w:ascii="맑은 고딕" w:hAnsi="맑은 고딕" w:eastAsia="맑은 고딕" w:cs="맑은 고딕"/>
                 <w:sz w:val="16"/>
               </w:rPr>
-              <w:t>장비 IPv4가 Agent 설치 시 지정한 대상 CIDR 안인지 확인</w:t>
+              <w:t>공식 ZIP을 새 폴더에 다시 압축 해제 → EDR 격리 기록 확인</w:t>
             </w:r>
           </w:p>
         </w:tc>
@@ -5699,6 +5744,377 @@
                 <w:rFonts w:ascii="맑은 고딕" w:hAnsi="맑은 고딕" w:eastAsia="맑은 고딕" w:cs="맑은 고딕"/>
                 <w:sz w:val="16"/>
               </w:rPr>
+              <w:t>VIEWER_PACKAGE_HASH_MISMATCH</w:t>
+            </w:r>
+          </w:p>
+        </w:tc>
+        <w:tc>
+          <w:tcPr>
+            <w:tcW w:type="dxa" w:w="5360"/>
+            <w:shd w:fill="FAFBFC"/>
+            <w:tcMar>
+              <w:top w:w="80" w:type="dxa"/>
+              <w:start w:w="120" w:type="dxa"/>
+              <w:bottom w:w="80" w:type="dxa"/>
+              <w:end w:w="120" w:type="dxa"/>
+            </w:tcMar>
+            <w:vAlign w:val="center"/>
+          </w:tcPr>
+          <w:p>
+            <w:pPr>
+              <w:spacing w:before="0" w:after="0" w:line="240" w:lineRule="auto"/>
+              <w:jc w:val="left"/>
+            </w:pPr>
+            <w:r>
+              <w:rPr>
+                <w:rFonts w:ascii="맑은 고딕" w:hAnsi="맑은 고딕" w:eastAsia="맑은 고딕" w:cs="맑은 고딕"/>
+                <w:sz w:val="16"/>
+              </w:rPr>
+              <w:t>변조 파일 실행 중지 → 공식 ZIP·매니페스트와 보안 프로그램 기록 확인</w:t>
+            </w:r>
+          </w:p>
+        </w:tc>
+      </w:tr>
+      <w:tr>
+        <w:tc>
+          <w:tcPr>
+            <w:tcW w:type="dxa" w:w="4000"/>
+            <w:tcMar>
+              <w:top w:w="80" w:type="dxa"/>
+              <w:start w:w="120" w:type="dxa"/>
+              <w:bottom w:w="80" w:type="dxa"/>
+              <w:end w:w="120" w:type="dxa"/>
+            </w:tcMar>
+            <w:vAlign w:val="center"/>
+          </w:tcPr>
+          <w:p>
+            <w:pPr>
+              <w:spacing w:before="0" w:after="0" w:line="240" w:lineRule="auto"/>
+              <w:jc w:val="left"/>
+            </w:pPr>
+            <w:r>
+              <w:rPr>
+                <w:rFonts w:ascii="맑은 고딕" w:hAnsi="맑은 고딕" w:eastAsia="맑은 고딕" w:cs="맑은 고딕"/>
+                <w:sz w:val="16"/>
+              </w:rPr>
+              <w:t>VIEWER_UNSUPPORTED_ARCHITECTURE</w:t>
+            </w:r>
+          </w:p>
+        </w:tc>
+        <w:tc>
+          <w:tcPr>
+            <w:tcW w:type="dxa" w:w="5360"/>
+            <w:tcMar>
+              <w:top w:w="80" w:type="dxa"/>
+              <w:start w:w="120" w:type="dxa"/>
+              <w:bottom w:w="80" w:type="dxa"/>
+              <w:end w:w="120" w:type="dxa"/>
+            </w:tcMar>
+            <w:vAlign w:val="center"/>
+          </w:tcPr>
+          <w:p>
+            <w:pPr>
+              <w:spacing w:before="0" w:after="0" w:line="240" w:lineRule="auto"/>
+              <w:jc w:val="left"/>
+            </w:pPr>
+            <w:r>
+              <w:rPr>
+                <w:rFonts w:ascii="맑은 고딕" w:hAnsi="맑은 고딕" w:eastAsia="맑은 고딕" w:cs="맑은 고딕"/>
+                <w:sz w:val="16"/>
+              </w:rPr>
+              <w:t>64비트 Windows PC에서 win-x64 Viewer 설치</w:t>
+            </w:r>
+          </w:p>
+        </w:tc>
+      </w:tr>
+      <w:tr>
+        <w:tc>
+          <w:tcPr>
+            <w:tcW w:type="dxa" w:w="4000"/>
+            <w:shd w:fill="FAFBFC"/>
+            <w:tcMar>
+              <w:top w:w="80" w:type="dxa"/>
+              <w:start w:w="120" w:type="dxa"/>
+              <w:bottom w:w="80" w:type="dxa"/>
+              <w:end w:w="120" w:type="dxa"/>
+            </w:tcMar>
+            <w:vAlign w:val="center"/>
+          </w:tcPr>
+          <w:p>
+            <w:pPr>
+              <w:spacing w:before="0" w:after="0" w:line="240" w:lineRule="auto"/>
+              <w:jc w:val="left"/>
+            </w:pPr>
+            <w:r>
+              <w:rPr>
+                <w:rFonts w:ascii="맑은 고딕" w:hAnsi="맑은 고딕" w:eastAsia="맑은 고딕" w:cs="맑은 고딕"/>
+                <w:sz w:val="16"/>
+              </w:rPr>
+              <w:t>VIEWER_SELF_CHECK_START_FAILED</w:t>
+            </w:r>
+          </w:p>
+        </w:tc>
+        <w:tc>
+          <w:tcPr>
+            <w:tcW w:type="dxa" w:w="5360"/>
+            <w:shd w:fill="FAFBFC"/>
+            <w:tcMar>
+              <w:top w:w="80" w:type="dxa"/>
+              <w:start w:w="120" w:type="dxa"/>
+              <w:bottom w:w="80" w:type="dxa"/>
+              <w:end w:w="120" w:type="dxa"/>
+            </w:tcMar>
+            <w:vAlign w:val="center"/>
+          </w:tcPr>
+          <w:p>
+            <w:pPr>
+              <w:spacing w:before="0" w:after="0" w:line="240" w:lineRule="auto"/>
+              <w:jc w:val="left"/>
+            </w:pPr>
+            <w:r>
+              <w:rPr>
+                <w:rFonts w:ascii="맑은 고딕" w:hAnsi="맑은 고딕" w:eastAsia="맑은 고딕" w:cs="맑은 고딕"/>
+                <w:sz w:val="16"/>
+              </w:rPr>
+              <w:t>Windows x64 → AppLocker·WDAC·EDR 실행 차단 확인</w:t>
+            </w:r>
+          </w:p>
+        </w:tc>
+      </w:tr>
+      <w:tr>
+        <w:tc>
+          <w:tcPr>
+            <w:tcW w:type="dxa" w:w="4000"/>
+            <w:tcMar>
+              <w:top w:w="80" w:type="dxa"/>
+              <w:start w:w="120" w:type="dxa"/>
+              <w:bottom w:w="80" w:type="dxa"/>
+              <w:end w:w="120" w:type="dxa"/>
+            </w:tcMar>
+            <w:vAlign w:val="center"/>
+          </w:tcPr>
+          <w:p>
+            <w:pPr>
+              <w:spacing w:before="0" w:after="0" w:line="240" w:lineRule="auto"/>
+              <w:jc w:val="left"/>
+            </w:pPr>
+            <w:r>
+              <w:rPr>
+                <w:rFonts w:ascii="맑은 고딕" w:hAnsi="맑은 고딕" w:eastAsia="맑은 고딕" w:cs="맑은 고딕"/>
+                <w:sz w:val="16"/>
+              </w:rPr>
+              <w:t>VIEWER_SELF_CHECK_WAIT_FAILED</w:t>
+            </w:r>
+          </w:p>
+        </w:tc>
+        <w:tc>
+          <w:tcPr>
+            <w:tcW w:type="dxa" w:w="5360"/>
+            <w:tcMar>
+              <w:top w:w="80" w:type="dxa"/>
+              <w:start w:w="120" w:type="dxa"/>
+              <w:bottom w:w="80" w:type="dxa"/>
+              <w:end w:w="120" w:type="dxa"/>
+            </w:tcMar>
+            <w:vAlign w:val="center"/>
+          </w:tcPr>
+          <w:p>
+            <w:pPr>
+              <w:spacing w:before="0" w:after="0" w:line="240" w:lineRule="auto"/>
+              <w:jc w:val="left"/>
+            </w:pPr>
+            <w:r>
+              <w:rPr>
+                <w:rFonts w:ascii="맑은 고딕" w:hAnsi="맑은 고딕" w:eastAsia="맑은 고딕" w:cs="맑은 고딕"/>
+                <w:sz w:val="16"/>
+              </w:rPr>
+              <w:t>설치 journal → Windows Application 로그 → 다시 설치</w:t>
+            </w:r>
+          </w:p>
+        </w:tc>
+      </w:tr>
+      <w:tr>
+        <w:tc>
+          <w:tcPr>
+            <w:tcW w:type="dxa" w:w="4000"/>
+            <w:shd w:fill="FAFBFC"/>
+            <w:tcMar>
+              <w:top w:w="80" w:type="dxa"/>
+              <w:start w:w="120" w:type="dxa"/>
+              <w:bottom w:w="80" w:type="dxa"/>
+              <w:end w:w="120" w:type="dxa"/>
+            </w:tcMar>
+            <w:vAlign w:val="center"/>
+          </w:tcPr>
+          <w:p>
+            <w:pPr>
+              <w:spacing w:before="0" w:after="0" w:line="240" w:lineRule="auto"/>
+              <w:jc w:val="left"/>
+            </w:pPr>
+            <w:r>
+              <w:rPr>
+                <w:rFonts w:ascii="맑은 고딕" w:hAnsi="맑은 고딕" w:eastAsia="맑은 고딕" w:cs="맑은 고딕"/>
+                <w:sz w:val="16"/>
+              </w:rPr>
+              <w:t>VIEWER_SELF_CHECK_TIMEOUT</w:t>
+            </w:r>
+          </w:p>
+        </w:tc>
+        <w:tc>
+          <w:tcPr>
+            <w:tcW w:type="dxa" w:w="5360"/>
+            <w:shd w:fill="FAFBFC"/>
+            <w:tcMar>
+              <w:top w:w="80" w:type="dxa"/>
+              <w:start w:w="120" w:type="dxa"/>
+              <w:bottom w:w="80" w:type="dxa"/>
+              <w:end w:w="120" w:type="dxa"/>
+            </w:tcMar>
+            <w:vAlign w:val="center"/>
+          </w:tcPr>
+          <w:p>
+            <w:pPr>
+              <w:spacing w:before="0" w:after="0" w:line="240" w:lineRule="auto"/>
+              <w:jc w:val="left"/>
+            </w:pPr>
+            <w:r>
+              <w:rPr>
+                <w:rFonts w:ascii="맑은 고딕" w:hAnsi="맑은 고딕" w:eastAsia="맑은 고딕" w:cs="맑은 고딕"/>
+                <w:sz w:val="16"/>
+              </w:rPr>
+              <w:t>20초 자체점검 제한 → 남은 프로세스·보안 프로그램 지연 확인</w:t>
+            </w:r>
+          </w:p>
+        </w:tc>
+      </w:tr>
+      <w:tr>
+        <w:tc>
+          <w:tcPr>
+            <w:tcW w:type="dxa" w:w="4000"/>
+            <w:tcMar>
+              <w:top w:w="80" w:type="dxa"/>
+              <w:start w:w="120" w:type="dxa"/>
+              <w:bottom w:w="80" w:type="dxa"/>
+              <w:end w:w="120" w:type="dxa"/>
+            </w:tcMar>
+            <w:vAlign w:val="center"/>
+          </w:tcPr>
+          <w:p>
+            <w:pPr>
+              <w:spacing w:before="0" w:after="0" w:line="240" w:lineRule="auto"/>
+              <w:jc w:val="left"/>
+            </w:pPr>
+            <w:r>
+              <w:rPr>
+                <w:rFonts w:ascii="맑은 고딕" w:hAnsi="맑은 고딕" w:eastAsia="맑은 고딕" w:cs="맑은 고딕"/>
+                <w:sz w:val="16"/>
+              </w:rPr>
+              <w:t>VIEWER_SELF_CHECK_EXITED_NONZERO</w:t>
+            </w:r>
+          </w:p>
+        </w:tc>
+        <w:tc>
+          <w:tcPr>
+            <w:tcW w:type="dxa" w:w="5360"/>
+            <w:tcMar>
+              <w:top w:w="80" w:type="dxa"/>
+              <w:start w:w="120" w:type="dxa"/>
+              <w:bottom w:w="80" w:type="dxa"/>
+              <w:end w:w="120" w:type="dxa"/>
+            </w:tcMar>
+            <w:vAlign w:val="center"/>
+          </w:tcPr>
+          <w:p>
+            <w:pPr>
+              <w:spacing w:before="0" w:after="0" w:line="240" w:lineRule="auto"/>
+              <w:jc w:val="left"/>
+            </w:pPr>
+            <w:r>
+              <w:rPr>
+                <w:rFonts w:ascii="맑은 고딕" w:hAnsi="맑은 고딕" w:eastAsia="맑은 고딕" w:cs="맑은 고딕"/>
+                <w:sz w:val="16"/>
+              </w:rPr>
+              <w:t>표시된 ExitCode → Windows Application 로그·EDR 기록 확인</w:t>
+            </w:r>
+          </w:p>
+        </w:tc>
+      </w:tr>
+      <w:tr>
+        <w:tc>
+          <w:tcPr>
+            <w:tcW w:type="dxa" w:w="4000"/>
+            <w:shd w:fill="FAFBFC"/>
+            <w:tcMar>
+              <w:top w:w="80" w:type="dxa"/>
+              <w:start w:w="120" w:type="dxa"/>
+              <w:bottom w:w="80" w:type="dxa"/>
+              <w:end w:w="120" w:type="dxa"/>
+            </w:tcMar>
+            <w:vAlign w:val="center"/>
+          </w:tcPr>
+          <w:p>
+            <w:pPr>
+              <w:spacing w:before="0" w:after="0" w:line="240" w:lineRule="auto"/>
+              <w:jc w:val="left"/>
+            </w:pPr>
+            <w:r>
+              <w:rPr>
+                <w:rFonts w:ascii="맑은 고딕" w:hAnsi="맑은 고딕" w:eastAsia="맑은 고딕" w:cs="맑은 고딕"/>
+                <w:sz w:val="16"/>
+              </w:rPr>
+              <w:t>TARGET_NOT_ALLOWED</w:t>
+            </w:r>
+          </w:p>
+        </w:tc>
+        <w:tc>
+          <w:tcPr>
+            <w:tcW w:type="dxa" w:w="5360"/>
+            <w:shd w:fill="FAFBFC"/>
+            <w:tcMar>
+              <w:top w:w="80" w:type="dxa"/>
+              <w:start w:w="120" w:type="dxa"/>
+              <w:bottom w:w="80" w:type="dxa"/>
+              <w:end w:w="120" w:type="dxa"/>
+            </w:tcMar>
+            <w:vAlign w:val="center"/>
+          </w:tcPr>
+          <w:p>
+            <w:pPr>
+              <w:spacing w:before="0" w:after="0" w:line="240" w:lineRule="auto"/>
+              <w:jc w:val="left"/>
+            </w:pPr>
+            <w:r>
+              <w:rPr>
+                <w:rFonts w:ascii="맑은 고딕" w:hAnsi="맑은 고딕" w:eastAsia="맑은 고딕" w:cs="맑은 고딕"/>
+                <w:sz w:val="16"/>
+              </w:rPr>
+              <w:t>장비 IPv4가 등록된 허용 IP인지 → Agent 허용 IP 설정 도구</w:t>
+            </w:r>
+          </w:p>
+        </w:tc>
+      </w:tr>
+      <w:tr>
+        <w:tc>
+          <w:tcPr>
+            <w:tcW w:type="dxa" w:w="4000"/>
+            <w:tcMar>
+              <w:top w:w="80" w:type="dxa"/>
+              <w:start w:w="120" w:type="dxa"/>
+              <w:bottom w:w="80" w:type="dxa"/>
+              <w:end w:w="120" w:type="dxa"/>
+            </w:tcMar>
+            <w:vAlign w:val="center"/>
+          </w:tcPr>
+          <w:p>
+            <w:pPr>
+              <w:spacing w:before="0" w:after="0" w:line="240" w:lineRule="auto"/>
+              <w:jc w:val="left"/>
+            </w:pPr>
+            <w:r>
+              <w:rPr>
+                <w:rFonts w:ascii="맑은 고딕" w:hAnsi="맑은 고딕" w:eastAsia="맑은 고딕" w:cs="맑은 고딕"/>
+                <w:sz w:val="16"/>
+              </w:rPr>
               <w:t>TCP_TIMEOUT</w:t>
             </w:r>
           </w:p>
@@ -5706,7 +6122,6 @@
         <w:tc>
           <w:tcPr>
             <w:tcW w:type="dxa" w:w="5360"/>
-            <w:shd w:fill="FAFBFC"/>
             <w:tcMar>
               <w:top w:w="80" w:type="dxa"/>
               <w:start w:w="120" w:type="dxa"/>
@@ -5734,6 +6149,7 @@
         <w:tc>
           <w:tcPr>
             <w:tcW w:type="dxa" w:w="4000"/>
+            <w:shd w:fill="FAFBFC"/>
             <w:tcMar>
               <w:top w:w="80" w:type="dxa"/>
               <w:start w:w="120" w:type="dxa"/>
@@ -5759,6 +6175,7 @@
         <w:tc>
           <w:tcPr>
             <w:tcW w:type="dxa" w:w="5360"/>
+            <w:shd w:fill="FAFBFC"/>
             <w:tcMar>
               <w:top w:w="80" w:type="dxa"/>
               <w:start w:w="120" w:type="dxa"/>
@@ -5786,7 +6203,6 @@
         <w:tc>
           <w:tcPr>
             <w:tcW w:type="dxa" w:w="4000"/>
-            <w:shd w:fill="FAFBFC"/>
             <w:tcMar>
               <w:top w:w="80" w:type="dxa"/>
               <w:start w:w="120" w:type="dxa"/>
@@ -5812,7 +6228,6 @@
         <w:tc>
           <w:tcPr>
             <w:tcW w:type="dxa" w:w="5360"/>
-            <w:shd w:fill="FAFBFC"/>
             <w:tcMar>
               <w:top w:w="80" w:type="dxa"/>
               <w:start w:w="120" w:type="dxa"/>
@@ -5840,6 +6255,7 @@
         <w:tc>
           <w:tcPr>
             <w:tcW w:type="dxa" w:w="4000"/>
+            <w:shd w:fill="FAFBFC"/>
             <w:tcMar>
               <w:top w:w="80" w:type="dxa"/>
               <w:start w:w="120" w:type="dxa"/>
@@ -5865,6 +6281,7 @@
         <w:tc>
           <w:tcPr>
             <w:tcW w:type="dxa" w:w="5360"/>
+            <w:shd w:fill="FAFBFC"/>
             <w:tcMar>
               <w:top w:w="80" w:type="dxa"/>
               <w:start w:w="120" w:type="dxa"/>
@@ -5892,7 +6309,6 @@
         <w:tc>
           <w:tcPr>
             <w:tcW w:type="dxa" w:w="4000"/>
-            <w:shd w:fill="FAFBFC"/>
             <w:tcMar>
               <w:top w:w="80" w:type="dxa"/>
               <w:start w:w="120" w:type="dxa"/>
@@ -5918,7 +6334,6 @@
         <w:tc>
           <w:tcPr>
             <w:tcW w:type="dxa" w:w="5360"/>
-            <w:shd w:fill="FAFBFC"/>
             <w:tcMar>
               <w:top w:w="80" w:type="dxa"/>
               <w:start w:w="120" w:type="dxa"/>
@@ -5946,6 +6361,7 @@
         <w:tc>
           <w:tcPr>
             <w:tcW w:type="dxa" w:w="4000"/>
+            <w:shd w:fill="FAFBFC"/>
             <w:tcMar>
               <w:top w:w="80" w:type="dxa"/>
               <w:start w:w="120" w:type="dxa"/>
@@ -5971,6 +6387,7 @@
         <w:tc>
           <w:tcPr>
             <w:tcW w:type="dxa" w:w="5360"/>
+            <w:shd w:fill="FAFBFC"/>
             <w:tcMar>
               <w:top w:w="80" w:type="dxa"/>
               <w:start w:w="120" w:type="dxa"/>
@@ -5998,7 +6415,6 @@
         <w:tc>
           <w:tcPr>
             <w:tcW w:type="dxa" w:w="4000"/>
-            <w:shd w:fill="FAFBFC"/>
             <w:tcMar>
               <w:top w:w="80" w:type="dxa"/>
               <w:start w:w="120" w:type="dxa"/>
@@ -6024,7 +6440,6 @@
         <w:tc>
           <w:tcPr>
             <w:tcW w:type="dxa" w:w="5360"/>
-            <w:shd w:fill="FAFBFC"/>
             <w:tcMar>
               <w:top w:w="80" w:type="dxa"/>
               <w:start w:w="120" w:type="dxa"/>
@@ -6052,6 +6467,7 @@
         <w:tc>
           <w:tcPr>
             <w:tcW w:type="dxa" w:w="4000"/>
+            <w:shd w:fill="FAFBFC"/>
             <w:tcMar>
               <w:top w:w="80" w:type="dxa"/>
               <w:start w:w="120" w:type="dxa"/>
@@ -6077,6 +6493,7 @@
         <w:tc>
           <w:tcPr>
             <w:tcW w:type="dxa" w:w="5360"/>
+            <w:shd w:fill="FAFBFC"/>
             <w:tcMar>
               <w:top w:w="80" w:type="dxa"/>
               <w:start w:w="120" w:type="dxa"/>
@@ -6104,7 +6521,6 @@
         <w:tc>
           <w:tcPr>
             <w:tcW w:type="dxa" w:w="4000"/>
-            <w:shd w:fill="FAFBFC"/>
             <w:tcMar>
               <w:top w:w="80" w:type="dxa"/>
               <w:start w:w="120" w:type="dxa"/>
@@ -6130,7 +6546,6 @@
         <w:tc>
           <w:tcPr>
             <w:tcW w:type="dxa" w:w="5360"/>
-            <w:shd w:fill="FAFBFC"/>
             <w:tcMar>
               <w:top w:w="80" w:type="dxa"/>
               <w:start w:w="120" w:type="dxa"/>
@@ -6158,6 +6573,7 @@
         <w:tc>
           <w:tcPr>
             <w:tcW w:type="dxa" w:w="4000"/>
+            <w:shd w:fill="FAFBFC"/>
             <w:tcMar>
               <w:top w:w="80" w:type="dxa"/>
               <w:start w:w="120" w:type="dxa"/>
@@ -6183,6 +6599,7 @@
         <w:tc>
           <w:tcPr>
             <w:tcW w:type="dxa" w:w="5360"/>
+            <w:shd w:fill="FAFBFC"/>
             <w:tcMar>
               <w:top w:w="80" w:type="dxa"/>
               <w:start w:w="120" w:type="dxa"/>
@@ -6210,7 +6627,6 @@
         <w:tc>
           <w:tcPr>
             <w:tcW w:type="dxa" w:w="4000"/>
-            <w:shd w:fill="FAFBFC"/>
             <w:tcMar>
               <w:top w:w="80" w:type="dxa"/>
               <w:start w:w="120" w:type="dxa"/>
@@ -6236,7 +6652,6 @@
         <w:tc>
           <w:tcPr>
             <w:tcW w:type="dxa" w:w="5360"/>
-            <w:shd w:fill="FAFBFC"/>
             <w:tcMar>
               <w:top w:w="80" w:type="dxa"/>
               <w:start w:w="120" w:type="dxa"/>
@@ -6264,6 +6679,7 @@
         <w:tc>
           <w:tcPr>
             <w:tcW w:type="dxa" w:w="4000"/>
+            <w:shd w:fill="FAFBFC"/>
             <w:tcMar>
               <w:top w:w="80" w:type="dxa"/>
               <w:start w:w="120" w:type="dxa"/>
@@ -6289,6 +6705,7 @@
         <w:tc>
           <w:tcPr>
             <w:tcW w:type="dxa" w:w="5360"/>
+            <w:shd w:fill="FAFBFC"/>
             <w:tcMar>
               <w:top w:w="80" w:type="dxa"/>
               <w:start w:w="120" w:type="dxa"/>
@@ -6316,7 +6733,6 @@
         <w:tc>
           <w:tcPr>
             <w:tcW w:type="dxa" w:w="4000"/>
-            <w:shd w:fill="FAFBFC"/>
             <w:tcMar>
               <w:top w:w="80" w:type="dxa"/>
               <w:start w:w="120" w:type="dxa"/>
@@ -6342,7 +6758,6 @@
         <w:tc>
           <w:tcPr>
             <w:tcW w:type="dxa" w:w="5360"/>
-            <w:shd w:fill="FAFBFC"/>
             <w:tcMar>
               <w:top w:w="80" w:type="dxa"/>
               <w:start w:w="120" w:type="dxa"/>
@@ -6370,6 +6785,7 @@
         <w:tc>
           <w:tcPr>
             <w:tcW w:type="dxa" w:w="4000"/>
+            <w:shd w:fill="FAFBFC"/>
             <w:tcMar>
               <w:top w:w="80" w:type="dxa"/>
               <w:start w:w="120" w:type="dxa"/>
@@ -6395,6 +6811,7 @@
         <w:tc>
           <w:tcPr>
             <w:tcW w:type="dxa" w:w="5360"/>
+            <w:shd w:fill="FAFBFC"/>
             <w:tcMar>
               <w:top w:w="80" w:type="dxa"/>
               <w:start w:w="120" w:type="dxa"/>
@@ -6426,6 +6843,7 @@
     </w:p>
     <w:p>
       <w:pPr>
+        <w:keepLines/>
         <w:spacing w:before="80" w:after="160" w:line="283" w:lineRule="auto"/>
         <w:ind w:left="115" w:right="58"/>
         <w:shd w:fill="FEF2F2"/>
@@ -6458,6 +6876,7 @@
     </w:p>
     <w:p>
       <w:pPr>
+        <w:keepLines/>
         <w:spacing w:before="80" w:after="160" w:line="283" w:lineRule="auto"/>
         <w:ind w:left="115" w:right="58"/>
         <w:shd w:fill="FEF2F2"/>
@@ -6753,7 +7172,7 @@
                 <w:rFonts w:ascii="맑은 고딕" w:hAnsi="맑은 고딕" w:eastAsia="맑은 고딕" w:cs="맑은 고딕"/>
                 <w:sz w:val="16"/>
               </w:rPr>
-              <w:t>Test-NetConnection &lt;Agent-PC-주소&gt; -Port 18443을 실행합니다. 실패하면 Viewer 관리 CIDR, Domain/Private 방화벽, 라우팅과 EDR을 확인합니다.</w:t>
+              <w:t>Test-NetConnection &lt;Agent-PC-주소&gt; -Port 18443을 실행합니다. 실패하면 Viewer PC 허용 IP, Domain/Private 방화벽, 라우팅과 EDR을 확인합니다.</w:t>
             </w:r>
           </w:p>
         </w:tc>
@@ -6766,6 +7185,7 @@
     </w:p>
     <w:p>
       <w:pPr>
+        <w:keepLines/>
         <w:spacing w:before="80" w:after="160" w:line="283" w:lineRule="auto"/>
         <w:ind w:left="115" w:right="58"/>
         <w:shd w:fill="FFF8E8"/>
@@ -6854,7 +7274,7 @@
         <w:rPr>
           <w:rFonts w:ascii="맑은 고딕" w:hAnsi="맑은 고딕" w:eastAsia="맑은 고딕" w:cs="맑은 고딕"/>
         </w:rPr>
-        <w:t>Agent PC에서 Install-or-Update-Agent.cmd를 실행합니다. 기존 CIDR 설정은 기본적으로 보존됩니다.</w:t>
+        <w:t>Agent PC에서 Install-or-Update-Agent.cmd를 실행합니다. 기존 허용 정책은 기본적으로 보존됩니다.</w:t>
       </w:r>
     </w:p>
     <w:p>
@@ -6956,6 +7376,7 @@
     </w:p>
     <w:p>
       <w:pPr>
+        <w:keepLines/>
         <w:spacing w:before="80" w:after="160" w:line="283" w:lineRule="auto"/>
         <w:ind w:left="115" w:right="58"/>
         <w:shd w:fill="FEF2F2"/>
@@ -6984,7 +7405,7 @@
     <w:p>
       <w:pPr>
         <w:pStyle w:val="Heading2"/>
-        <w:pageBreakBefore/>
+        <w:pageBreakBefore w:val="0"/>
         <w:numPr>
           <w:ilvl w:val="1"/>
           <w:numId w:val="11"/>
@@ -7112,7 +7533,7 @@
         <w:color w:val="64748B"/>
         <w:sz w:val="17"/>
       </w:rPr>
-      <w:t xml:space="preserve">v0.9.16-poc  |  </w:t>
+      <w:t xml:space="preserve">v0.9.17-poc  |  </w:t>
     </w:r>
     <w:r>
       <w:rPr>
@@ -7143,7 +7564,7 @@
         <w:color w:val="64748B"/>
         <w:sz w:val="17"/>
       </w:rPr>
-      <w:t>v0.9.16-poc  |  2026-07-27</w:t>
+      <w:t>v0.9.17-poc  |  2026-07-27</w:t>
     </w:r>
   </w:p>
 </w:ftr>

</xml_diff>

<commit_message>
fix: harden deployment recovery and diagnostics
</commit_message>
<xml_diff>
--- a/docs/SamsungSwitchWatch_User_Manual_KO.docx
+++ b/docs/SamsungSwitchWatch_User_Manual_KO.docx
@@ -533,7 +533,7 @@
         <w:rPr>
           <w:rFonts w:ascii="맑은 고딕" w:hAnsi="맑은 고딕" w:eastAsia="맑은 고딕" w:cs="맑은 고딕"/>
         </w:rPr>
-        <w:t>Viewer PC에서 Viewer ZIP을 풀고 Install-or-Update-Viewer.cmd를 실행합니다.</w:t>
+        <w:t>Viewer PC에서 Viewer ZIP을 풀고 Install-or-Update-Viewer.cmd를 실행한 뒤 UAC를 승인합니다.</w:t>
       </w:r>
     </w:p>
     <w:p>
@@ -969,10 +969,12 @@
           <w:ilvl w:val="0"/>
           <w:numId w:val="10"/>
         </w:numPr>
+        <w:spacing w:before="0" w:after="120" w:line="300" w:lineRule="auto"/>
       </w:pPr>
       <w:r>
         <w:rPr>
           <w:rFonts w:ascii="맑은 고딕" w:hAnsi="맑은 고딕" w:eastAsia="맑은 고딕" w:cs="맑은 고딕"/>
+          <w:sz w:val="22"/>
         </w:rPr>
         <w:t>Agent는 Windows 서비스로 실행되어 RDP 종료나 사용자 로그오프 뒤에도 계속 대기합니다.</w:t>
       </w:r>
@@ -983,10 +985,12 @@
           <w:ilvl w:val="0"/>
           <w:numId w:val="10"/>
         </w:numPr>
+        <w:spacing w:before="0" w:after="120" w:line="300" w:lineRule="auto"/>
       </w:pPr>
       <w:r>
         <w:rPr>
           <w:rFonts w:ascii="맑은 고딕" w:hAnsi="맑은 고딕" w:eastAsia="맑은 고딕" w:cs="맑은 고딕"/>
+          <w:sz w:val="22"/>
         </w:rPr>
         <w:t>Agent는 장비 목록, Telnet 계정, 수동 명령 원문, 스위치 출력 원문을 보관하지 않습니다.</w:t>
       </w:r>
@@ -997,10 +1001,12 @@
           <w:ilvl w:val="0"/>
           <w:numId w:val="10"/>
         </w:numPr>
+        <w:spacing w:before="0" w:after="120" w:line="300" w:lineRule="auto"/>
       </w:pPr>
       <w:r>
         <w:rPr>
           <w:rFonts w:ascii="맑은 고딕" w:hAnsi="맑은 고딕" w:eastAsia="맑은 고딕" w:cs="맑은 고딕"/>
+          <w:sz w:val="22"/>
         </w:rPr>
         <w:t>일반 사용자가 볼 수 있는 Agent 창이나 트레이 아이콘은 없습니다.</w:t>
       </w:r>
@@ -1011,12 +1017,14 @@
           <w:ilvl w:val="0"/>
           <w:numId w:val="10"/>
         </w:numPr>
+        <w:spacing w:before="0" w:after="120" w:line="300" w:lineRule="auto"/>
       </w:pPr>
       <w:r>
         <w:rPr>
           <w:rFonts w:ascii="맑은 고딕" w:hAnsi="맑은 고딕" w:eastAsia="맑은 고딕" w:cs="맑은 고딕"/>
+          <w:sz w:val="22"/>
         </w:rPr>
-        <w:t>Viewer는 일반 사용자 권한으로 실행하며, 현재 Windows 사용자 범위에서만 계정을 복호화합니다.</w:t>
+        <w:t>Viewer 프로그램은 Program Files에 설치되지만 일반 사용자 권한으로 실행하며, 현재 Windows 사용자 범위에서만 계정을 복호화합니다.</w:t>
       </w:r>
     </w:p>
     <w:p>
@@ -1295,7 +1303,7 @@
           <w:color w:val="16324F"/>
           <w:sz w:val="21"/>
         </w:rPr>
-        <w:t>Viewer PC 또는 스위치 주소가 바뀌면 현재 Agent와 같은 버전 ZIP의 Configure-Agent-Allowed-IPs.cmd를 실행합니다. 일반 IPv4만 입력하며 내부에서 정확한 /32 정책으로 변환합니다. DHCP 또는 32대를 넘는 장비는 INSTALL_KO.md의 고급 CIDR 절차를 사용하세요.</w:t>
+        <w:t>Viewer PC 또는 스위치 주소가 바뀌면 현재 Agent와 같은 버전 ZIP의 Configure-Agent-Allowed-IPs.cmd를 실행합니다. 일반 IPv4만 입력하며 내부에서 정확한 /32 정책으로 변환합니다. DHCP 또는 32대를 넘는 장비는 INSTALL_KO.md의 고급 CIDR 절차를 사용하세요. 기존 값과 같아도 서비스, TCP/18443 listener, 방화벽, 활성 프로필과 live/ready를 확인해 정상일 때만 변경 없음으로 끝납니다.</w:t>
       </w:r>
     </w:p>
     <w:p>
@@ -1328,7 +1336,7 @@
           <w:color w:val="16324F"/>
           <w:sz w:val="21"/>
         </w:rPr>
-        <w:t>관리자 설치 창에 Agent installation failed가 표시되면 Cause 줄을 먼저 확인하세요. 설치 성공 뒤 AGENT_CONNECTION_REFUSED가 보이면 Viewer에 스위치 IP, Viewer PC 주소 또는 localhost가 아니라 Agent를 설치한 PC 주소를 입력했는지 먼저 확인하세요. 그 다음 SamsungSwitchWatchAgent 서비스와 TCP/18443을 점검합니다. 서비스를 수동 등록하지 말고 0.9.17-poc Agent 설치기를 사용하세요.</w:t>
+        <w:t>관리자 설치 창에 Agent installation failed가 표시되면 Cause 줄을 먼저 확인하세요. 설치 성공 뒤 AGENT_CONNECTION_REFUSED가 보이면 Viewer에 스위치 IP, Viewer PC 주소 또는 localhost가 아니라 Agent를 설치한 PC 주소를 입력했는지 먼저 확인하세요. 그 다음 SamsungSwitchWatchAgent 서비스와 TCP/18443을 점검합니다. 서비스를 수동 등록하지 말고 0.9.18-poc Agent 설치기를 사용하세요.</w:t>
       </w:r>
     </w:p>
     <w:p>
@@ -1375,7 +1383,7 @@
         <w:rPr>
           <w:rFonts w:ascii="맑은 고딕" w:hAnsi="맑은 고딕" w:eastAsia="맑은 고딕" w:cs="맑은 고딕"/>
         </w:rPr>
-        <w:t>Install-or-Update-Viewer.cmd를 더블클릭합니다. 관리자 권한은 필요하지 않습니다.</w:t>
+        <w:t>Install-or-Update-Viewer.cmd를 더블클릭하고 Program Files 설치를 위한 UAC를 승인합니다.</w:t>
       </w:r>
     </w:p>
     <w:p>
@@ -1389,7 +1397,35 @@
         <w:rPr>
           <w:rFonts w:ascii="맑은 고딕" w:hAnsi="맑은 고딕" w:eastAsia="맑은 고딕" w:cs="맑은 고딕"/>
         </w:rPr>
-        <w:t>설치 완료 뒤 Viewer가 실행되고 다음 Windows 로그인부터 자동 시작되는지 확인합니다.</w:t>
+        <w:t>설치 완료 뒤 Viewer가 일반 사용자 권한으로 실행되고 다음 Windows 로그인부터 자동 시작되는지 확인합니다.</w:t>
+      </w:r>
+    </w:p>
+    <w:p>
+      <w:pPr>
+        <w:keepLines/>
+        <w:spacing w:before="80" w:after="160" w:line="283" w:lineRule="auto"/>
+        <w:ind w:left="115" w:right="58"/>
+        <w:shd w:fill="E8EEF5"/>
+        <w:pBdr>
+          <w:left w:val="single" w:sz="16" w:space="8" w:color="2E74B5"/>
+        </w:pBdr>
+      </w:pPr>
+      <w:r>
+        <w:rPr>
+          <w:rFonts w:ascii="맑은 고딕" w:hAnsi="맑은 고딕" w:eastAsia="맑은 고딕" w:cs="맑은 고딕"/>
+          <w:b/>
+          <w:color w:val="2E74B5"/>
+          <w:sz w:val="21"/>
+        </w:rPr>
+        <w:t xml:space="preserve">프로그램과 사용자 데이터 분리  </w:t>
+      </w:r>
+      <w:r>
+        <w:rPr>
+          <w:rFonts w:ascii="맑은 고딕" w:hAnsi="맑은 고딕" w:eastAsia="맑은 고딕" w:cs="맑은 고딕"/>
+          <w:color w:val="16324F"/>
+          <w:sz w:val="21"/>
+        </w:rPr>
+        <w:t>프로그램은 C:\Program Files\SamsungSwitchWatch\Viewer에 설치합니다. 장비 목록, DPAPI 자격 증명, 감시 이력과 화면 설정은 설치를 시작한 원래 사용자의 %LOCALAPPDATA%\SamsungSwitchWatch에 그대로 보존합니다. 관리자 단계가 성공한 뒤에만 원래 사용자 단계에서 바로 가기와 자동 시작을 반영합니다. 이전 Program Files 버전과 기존 사용자별 프로그램 폴더는 자동 삭제하지 않습니다.</w:t>
       </w:r>
     </w:p>
     <w:p>
@@ -1417,7 +1453,7 @@
           <w:color w:val="16324F"/>
           <w:sz w:val="21"/>
         </w:rPr>
-        <w:t>설치 창의 Cause, Detail, 선택적 ExitCode, Recovery와 두 진단 경로를 확인하세요. PREVIOUS_VIEWER_RESTORED이면 시작 메뉴에서 Viewer를 다시 실행합니다. ROLLBACK_INCOMPLETE이면 백업과 진단 파일을 보존하고 Windows 관리자에게 전달하세요. 자세한 코드는 INSTALL_KO.md를 확인하세요.</w:t>
+        <w:t>설치 창의 Cause, Detail, 선택적 ExitCode, Recovery와 두 진단 경로를 확인하세요. PREVIOUS_VIEWER_RESTORED이면 시작 메뉴에서 Viewer를 다시 실행합니다. ROLLBACK_INCOMPLETE이면 백업과 진단 파일을 보존하고 Windows 관리자에게 전달하세요. Program Files 실행이 차단되면 보안 정책을 우회하거나 파일 차단을 해제하지 말고 해당 코드를 EDR·AppLocker·WDAC 담당자에게 전달하세요. 사용자 단계 실패 뒤에는 이전 Program Files 버전 복구 UAC가 한 번 더 표시될 수 있습니다. 취소하거나 실패하면 Viewer.__rollback을 삭제하지 마세요. 새 설치 파일이나 매니페스트가 EDR에 의해 격리 또는 손상돼도 보호된 현재 설치를 격리한 뒤 검증된 rollback 슬롯을 먼저 복원합니다. 제거 중 Viewer 프로세스나 활성 프로그램 폴더가 남으면 rollback 슬롯을 삭제하지 않습니다. 자세한 코드는 INSTALL_KO.md를 확인하세요.</w:t>
       </w:r>
     </w:p>
     <w:p>
@@ -1445,12 +1481,7 @@
           <w:color w:val="16324F"/>
           <w:sz w:val="21"/>
         </w:rPr>
-        <w:t>설치 전 검사, 설치 위치 또는 자동 시작 상태를 직접 지정할 때만 INSTALL_KO.md의 install-viewer.ps1 옵션을 사용하세요.</w:t>
-      </w:r>
-    </w:p>
-    <w:p>
-      <w:r>
-        <w:br w:type="page"/>
+        <w:t>설치 전 검사, 설치 위치 또는 자동 시작 상태를 직접 지정할 때만 INSTALL_KO.md의 install-viewer.ps1 옵션을 사용하세요. 기존 사용자별 설치는 -PerUser를 명시하는 호환 경로이며 기본 설치가 아닙니다.</w:t>
       </w:r>
     </w:p>
     <w:p>
@@ -1527,10 +1558,12 @@
           <w:ilvl w:val="0"/>
           <w:numId w:val="10"/>
         </w:numPr>
+        <w:spacing w:before="0" w:after="120" w:line="300" w:lineRule="auto"/>
       </w:pPr>
       <w:r>
         <w:rPr>
           <w:rFonts w:ascii="맑은 고딕" w:hAnsi="맑은 고딕" w:eastAsia="맑은 고딕" w:cs="맑은 고딕"/>
+          <w:sz w:val="22"/>
         </w:rPr>
         <w:t>Agent를 설치한 원격 PC의 IPv4 또는 사내 DNS 이름만 입력합니다.</w:t>
       </w:r>
@@ -1541,10 +1574,12 @@
           <w:ilvl w:val="0"/>
           <w:numId w:val="10"/>
         </w:numPr>
+        <w:spacing w:before="0" w:after="120" w:line="300" w:lineRule="auto"/>
       </w:pPr>
       <w:r>
         <w:rPr>
           <w:rFonts w:ascii="맑은 고딕" w:hAnsi="맑은 고딕" w:eastAsia="맑은 고딕" w:cs="맑은 고딕"/>
+          <w:sz w:val="22"/>
         </w:rPr>
         <w:t>스위치 IP, Viewer PC 주소와 localhost는 Agent와 Viewer가 같은 PC가 아닌 한 입력하지 않습니다.</w:t>
       </w:r>
@@ -1555,10 +1590,12 @@
           <w:ilvl w:val="0"/>
           <w:numId w:val="10"/>
         </w:numPr>
+        <w:spacing w:before="0" w:after="120" w:line="300" w:lineRule="auto"/>
       </w:pPr>
       <w:r>
         <w:rPr>
           <w:rFonts w:ascii="맑은 고딕" w:hAnsi="맑은 고딕" w:eastAsia="맑은 고딕" w:cs="맑은 고딕"/>
+          <w:sz w:val="22"/>
         </w:rPr>
         <w:t>https://, 포트, 인증서 SHA-256 지문, 페어링 토큰은 입력하지 않습니다.</w:t>
       </w:r>
@@ -1569,10 +1606,12 @@
           <w:ilvl w:val="0"/>
           <w:numId w:val="10"/>
         </w:numPr>
+        <w:spacing w:before="0" w:after="120" w:line="300" w:lineRule="auto"/>
       </w:pPr>
       <w:r>
         <w:rPr>
           <w:rFonts w:ascii="맑은 고딕" w:hAnsi="맑은 고딕" w:eastAsia="맑은 고딕" w:cs="맑은 고딕"/>
+          <w:sz w:val="22"/>
         </w:rPr>
         <w:t>정상 Agent 교체나 재설치가 확실할 때만 '이 Agent로 다시 연결'을 사용합니다.</w:t>
       </w:r>
@@ -2771,10 +2810,12 @@
           <w:ilvl w:val="0"/>
           <w:numId w:val="10"/>
         </w:numPr>
+        <w:spacing w:before="0" w:after="120" w:line="300" w:lineRule="auto"/>
       </w:pPr>
       <w:r>
         <w:rPr>
           <w:rFonts w:ascii="맑은 고딕" w:hAnsi="맑은 고딕" w:eastAsia="맑은 고딕" w:cs="맑은 고딕"/>
+          <w:sz w:val="22"/>
         </w:rPr>
         <w:t>Enter: 실행, Esc: 취소. 출력 상한은 64KiB이며 복사 버튼은 Windows 클립보드만 사용합니다.</w:t>
       </w:r>
@@ -2785,10 +2826,12 @@
           <w:ilvl w:val="0"/>
           <w:numId w:val="10"/>
         </w:numPr>
+        <w:spacing w:before="0" w:after="120" w:line="300" w:lineRule="auto"/>
       </w:pPr>
       <w:r>
         <w:rPr>
           <w:rFonts w:ascii="맑은 고딕" w:hAnsi="맑은 고딕" w:eastAsia="맑은 고딕" w:cs="맑은 고딕"/>
+          <w:sz w:val="22"/>
         </w:rPr>
         <w:t>완료 줄에는 처리 시간과 세션 횟수, 재연결이 있었다면 재연결 횟수도 표시됩니다.</w:t>
       </w:r>
@@ -2799,10 +2842,12 @@
           <w:ilvl w:val="0"/>
           <w:numId w:val="10"/>
         </w:numPr>
+        <w:spacing w:before="0" w:after="120" w:line="300" w:lineRule="auto"/>
       </w:pPr>
       <w:r>
         <w:rPr>
           <w:rFonts w:ascii="맑은 고딕" w:hAnsi="맑은 고딕" w:eastAsia="맑은 고딕" w:cs="맑은 고딕"/>
+          <w:sz w:val="22"/>
         </w:rPr>
         <w:t>수동 명령 원문과 출력은 Viewer 프로세스가 종료되면 사라지며 파일이나 Agent에 저장되지 않습니다.</w:t>
       </w:r>
@@ -3144,10 +3189,12 @@
           <w:ilvl w:val="0"/>
           <w:numId w:val="10"/>
         </w:numPr>
+        <w:spacing w:before="0" w:after="120" w:line="300" w:lineRule="auto"/>
       </w:pPr>
       <w:r>
         <w:rPr>
           <w:rFonts w:ascii="맑은 고딕" w:hAnsi="맑은 고딕" w:eastAsia="맑은 고딕" w:cs="맑은 고딕"/>
+          <w:sz w:val="22"/>
         </w:rPr>
         <w:t>최초 정상 결과는 기준선으로만 저장하며 기존 로그를 새 이벤트로 알리지 않습니다.</w:t>
       </w:r>
@@ -3158,10 +3205,12 @@
           <w:ilvl w:val="0"/>
           <w:numId w:val="10"/>
         </w:numPr>
+        <w:spacing w:before="0" w:after="120" w:line="300" w:lineRule="auto"/>
       </w:pPr>
       <w:r>
         <w:rPr>
           <w:rFonts w:ascii="맑은 고딕" w:hAnsi="맑은 고딕" w:eastAsia="맑은 고딕" w:cs="맑은 고딕"/>
+          <w:sz w:val="22"/>
         </w:rPr>
         <w:t>포트 상태는 의미 있는 필드로 비교합니다. 최초 Down은 기존 상태로 보고, 이후 Up → Down과 Down → Up만 표시합니다.</w:t>
       </w:r>
@@ -3172,10 +3221,12 @@
           <w:ilvl w:val="0"/>
           <w:numId w:val="10"/>
         </w:numPr>
+        <w:spacing w:before="0" w:after="120" w:line="300" w:lineRule="auto"/>
       </w:pPr>
       <w:r>
         <w:rPr>
           <w:rFonts w:ascii="맑은 고딕" w:hAnsi="맑은 고딕" w:eastAsia="맑은 고딕" w:cs="맑은 고딕"/>
+          <w:sz w:val="22"/>
         </w:rPr>
         <w:t>중요 업링크로 지정되지 않은 일반 포트 변화는 장애가 아닌 경고로 표시하며, 케이블·상대 장비와 실제 사용 여부를 확인합니다.</w:t>
       </w:r>
@@ -3186,10 +3237,12 @@
           <w:ilvl w:val="0"/>
           <w:numId w:val="10"/>
         </w:numPr>
+        <w:spacing w:before="0" w:after="120" w:line="300" w:lineRule="auto"/>
       </w:pPr>
       <w:r>
         <w:rPr>
           <w:rFonts w:ascii="맑은 고딕" w:hAnsi="맑은 고딕" w:eastAsia="맑은 고딕" w:cs="맑은 고딕"/>
+          <w:sz w:val="22"/>
         </w:rPr>
         <w:t>로그는 저장된 식별 해시와 비교해 새 항목만 이벤트로 만듭니다.</w:t>
       </w:r>
@@ -3200,10 +3253,12 @@
           <w:ilvl w:val="0"/>
           <w:numId w:val="10"/>
         </w:numPr>
+        <w:spacing w:before="0" w:after="120" w:line="300" w:lineRule="auto"/>
       </w:pPr>
       <w:r>
         <w:rPr>
           <w:rFonts w:ascii="맑은 고딕" w:hAnsi="맑은 고딕" w:eastAsia="맑은 고딕" w:cs="맑은 고딕"/>
+          <w:sz w:val="22"/>
         </w:rPr>
         <w:t>주기 감시 저장소에는 기준 해시, 이벤트와 상태만 남고 Telnet 원문은 남지 않습니다.</w:t>
       </w:r>
@@ -3214,10 +3269,12 @@
           <w:ilvl w:val="0"/>
           <w:numId w:val="10"/>
         </w:numPr>
+        <w:spacing w:before="0" w:after="120" w:line="300" w:lineRule="auto"/>
       </w:pPr>
       <w:r>
         <w:rPr>
           <w:rFonts w:ascii="맑은 고딕" w:hAnsi="맑은 고딕" w:eastAsia="맑은 고딕" w:cs="맑은 고딕"/>
+          <w:sz w:val="22"/>
         </w:rPr>
         <w:t>같은 장애가 계속되면 반복 팝업 대신 지속 상태를 유지하고, 정상화되면 복구 이벤트를 만듭니다.</w:t>
       </w:r>
@@ -3809,10 +3866,12 @@
           <w:ilvl w:val="0"/>
           <w:numId w:val="10"/>
         </w:numPr>
+        <w:spacing w:before="0" w:after="120" w:line="300" w:lineRule="auto"/>
       </w:pPr>
       <w:r>
         <w:rPr>
           <w:rFonts w:ascii="맑은 고딕" w:hAnsi="맑은 고딕" w:eastAsia="맑은 고딕" w:cs="맑은 고딕"/>
+          <w:sz w:val="22"/>
         </w:rPr>
         <w:t>Agent 연결이 끊겼다고 모든 스위치를 Down으로 바꾸지 않습니다. 마지막 상태를 유지하고 '미확인'으로 표시합니다.</w:t>
       </w:r>
@@ -3823,10 +3882,12 @@
           <w:ilvl w:val="0"/>
           <w:numId w:val="10"/>
         </w:numPr>
+        <w:spacing w:before="0" w:after="120" w:line="300" w:lineRule="auto"/>
       </w:pPr>
       <w:r>
         <w:rPr>
           <w:rFonts w:ascii="맑은 고딕" w:hAnsi="맑은 고딕" w:eastAsia="맑은 고딕" w:cs="맑은 고딕"/>
+          <w:sz w:val="22"/>
         </w:rPr>
         <w:t>이벤트 확인은 복구가 아니며, CSV/JSON 내보내기는 이벤트만 익명화하고 수동 명령 출력은 제외합니다.</w:t>
       </w:r>
@@ -3966,10 +4027,12 @@
           <w:ilvl w:val="0"/>
           <w:numId w:val="10"/>
         </w:numPr>
+        <w:spacing w:before="0" w:after="120" w:line="300" w:lineRule="auto"/>
       </w:pPr>
       <w:r>
         <w:rPr>
           <w:rFonts w:ascii="맑은 고딕" w:hAnsi="맑은 고딕" w:eastAsia="맑은 고딕" w:cs="맑은 고딕"/>
+          <w:sz w:val="22"/>
         </w:rPr>
         <w:t>핀 버튼: 다른 일반 창보다 위에 표시</w:t>
       </w:r>
@@ -3980,10 +4043,12 @@
           <w:ilvl w:val="0"/>
           <w:numId w:val="10"/>
         </w:numPr>
+        <w:spacing w:before="0" w:after="120" w:line="300" w:lineRule="auto"/>
       </w:pPr>
       <w:r>
         <w:rPr>
           <w:rFonts w:ascii="맑은 고딕" w:hAnsi="맑은 고딕" w:eastAsia="맑은 고딕" w:cs="맑은 고딕"/>
+          <w:sz w:val="22"/>
         </w:rPr>
         <w:t>대시보드 열기: 전체 상태와 변경 이력 확인</w:t>
       </w:r>
@@ -3994,10 +4059,12 @@
           <w:ilvl w:val="0"/>
           <w:numId w:val="10"/>
         </w:numPr>
+        <w:spacing w:before="0" w:after="120" w:line="300" w:lineRule="auto"/>
       </w:pPr>
       <w:r>
         <w:rPr>
           <w:rFonts w:ascii="맑은 고딕" w:hAnsi="맑은 고딕" w:eastAsia="맑은 고딕" w:cs="맑은 고딕"/>
+          <w:sz w:val="22"/>
         </w:rPr>
         <w:t>새로고침: Viewer에서 즉시 상태 요청</w:t>
       </w:r>
@@ -4008,10 +4075,12 @@
           <w:ilvl w:val="0"/>
           <w:numId w:val="10"/>
         </w:numPr>
+        <w:spacing w:before="0" w:after="120" w:line="300" w:lineRule="auto"/>
       </w:pPr>
       <w:r>
         <w:rPr>
           <w:rFonts w:ascii="맑은 고딕" w:hAnsi="맑은 고딕" w:eastAsia="맑은 고딕" w:cs="맑은 고딕"/>
+          <w:sz w:val="22"/>
         </w:rPr>
         <w:t>같은 장애 지속 중에는 팝업을 반복하지 않고 복구 시 별도 알림</w:t>
       </w:r>
@@ -4022,10 +4091,12 @@
           <w:ilvl w:val="0"/>
           <w:numId w:val="10"/>
         </w:numPr>
+        <w:spacing w:before="0" w:after="120" w:line="300" w:lineRule="auto"/>
       </w:pPr>
       <w:r>
         <w:rPr>
           <w:rFonts w:ascii="맑은 고딕" w:hAnsi="맑은 고딕" w:eastAsia="맑은 고딕" w:cs="맑은 고딕"/>
+          <w:sz w:val="22"/>
         </w:rPr>
         <w:t>팝업 위에 마우스를 두거나 키보드 포커스가 있으면 읽는 동안 자동으로 닫히지 않음</w:t>
       </w:r>
@@ -4180,7 +4251,7 @@
                 <w:rFonts w:ascii="맑은 고딕" w:hAnsi="맑은 고딕" w:eastAsia="맑은 고딕" w:cs="맑은 고딕"/>
                 <w:sz w:val="18"/>
               </w:rPr>
-              <w:t>장비명·모델·IPv4</w:t>
+              <w:t>Viewer 프로그램</w:t>
             </w:r>
           </w:p>
         </w:tc>
@@ -4205,7 +4276,9 @@
                 <w:rFonts w:ascii="맑은 고딕" w:hAnsi="맑은 고딕" w:eastAsia="맑은 고딕" w:cs="맑은 고딕"/>
                 <w:sz w:val="18"/>
               </w:rPr>
-              <w:t>Viewer 사용자 프로필</w:t>
+              <w:t>C:\Program Files\</w:t>
+              <w:br/>
+              <w:t>SamsungSwitchWatch\Viewer</w:t>
             </w:r>
           </w:p>
         </w:tc>
@@ -4230,7 +4303,7 @@
                 <w:rFonts w:ascii="맑은 고딕" w:hAnsi="맑은 고딕" w:eastAsia="맑은 고딕" w:cs="맑은 고딕"/>
                 <w:sz w:val="18"/>
               </w:rPr>
-              <w:t>현재 Windows 사용자 범위</w:t>
+              <w:t>UAC 설치, 일반 사용자 권한으로 실행</w:t>
             </w:r>
           </w:p>
         </w:tc>
@@ -4258,7 +4331,7 @@
                 <w:rFonts w:ascii="맑은 고딕" w:hAnsi="맑은 고딕" w:eastAsia="맑은 고딕" w:cs="맑은 고딕"/>
                 <w:sz w:val="18"/>
               </w:rPr>
-              <w:t>ID·로그인 PW·enable PW</w:t>
+              <w:t>장비명·모델·IPv4</w:t>
             </w:r>
           </w:p>
         </w:tc>
@@ -4310,7 +4383,7 @@
                 <w:rFonts w:ascii="맑은 고딕" w:hAnsi="맑은 고딕" w:eastAsia="맑은 고딕" w:cs="맑은 고딕"/>
                 <w:sz w:val="18"/>
               </w:rPr>
-              <w:t>DPAPI CurrentUser 암호화</w:t>
+              <w:t>현재 Windows 사용자 범위</w:t>
             </w:r>
           </w:p>
         </w:tc>
@@ -4337,7 +4410,7 @@
                 <w:rFonts w:ascii="맑은 고딕" w:hAnsi="맑은 고딕" w:eastAsia="맑은 고딕" w:cs="맑은 고딕"/>
                 <w:sz w:val="18"/>
               </w:rPr>
-              <w:t>주기 감시 기준 해시·이벤트</w:t>
+              <w:t>ID·로그인 PW·enable PW</w:t>
             </w:r>
           </w:p>
         </w:tc>
@@ -4387,7 +4460,7 @@
                 <w:rFonts w:ascii="맑은 고딕" w:hAnsi="맑은 고딕" w:eastAsia="맑은 고딕" w:cs="맑은 고딕"/>
                 <w:sz w:val="18"/>
               </w:rPr>
-              <w:t>원문 없이 로컬 저장</w:t>
+              <w:t>DPAPI CurrentUser 암호화</w:t>
             </w:r>
           </w:p>
         </w:tc>
@@ -4415,7 +4488,7 @@
                 <w:rFonts w:ascii="맑은 고딕" w:hAnsi="맑은 고딕" w:eastAsia="맑은 고딕" w:cs="맑은 고딕"/>
                 <w:sz w:val="18"/>
               </w:rPr>
-              <w:t>수동 show 입력·출력</w:t>
+              <w:t>주기 감시 기준 해시·이벤트</w:t>
             </w:r>
           </w:p>
         </w:tc>
@@ -4441,6 +4514,84 @@
                 <w:rFonts w:ascii="맑은 고딕" w:hAnsi="맑은 고딕" w:eastAsia="맑은 고딕" w:cs="맑은 고딕"/>
                 <w:sz w:val="18"/>
               </w:rPr>
+              <w:t>Viewer 사용자 프로필</w:t>
+            </w:r>
+          </w:p>
+        </w:tc>
+        <w:tc>
+          <w:tcPr>
+            <w:tcW w:type="dxa" w:w="4160"/>
+            <w:shd w:fill="FAFBFC"/>
+            <w:tcMar>
+              <w:top w:w="80" w:type="dxa"/>
+              <w:start w:w="120" w:type="dxa"/>
+              <w:bottom w:w="80" w:type="dxa"/>
+              <w:end w:w="120" w:type="dxa"/>
+            </w:tcMar>
+            <w:vAlign w:val="center"/>
+          </w:tcPr>
+          <w:p>
+            <w:pPr>
+              <w:spacing w:before="0" w:after="0" w:line="269" w:lineRule="auto"/>
+              <w:jc w:val="left"/>
+            </w:pPr>
+            <w:r>
+              <w:rPr>
+                <w:rFonts w:ascii="맑은 고딕" w:hAnsi="맑은 고딕" w:eastAsia="맑은 고딕" w:cs="맑은 고딕"/>
+                <w:sz w:val="18"/>
+              </w:rPr>
+              <w:t>원문 없이 로컬 저장</w:t>
+            </w:r>
+          </w:p>
+        </w:tc>
+      </w:tr>
+      <w:tr>
+        <w:tc>
+          <w:tcPr>
+            <w:tcW w:type="dxa" w:w="2200"/>
+            <w:tcMar>
+              <w:top w:w="80" w:type="dxa"/>
+              <w:start w:w="120" w:type="dxa"/>
+              <w:bottom w:w="80" w:type="dxa"/>
+              <w:end w:w="120" w:type="dxa"/>
+            </w:tcMar>
+            <w:vAlign w:val="center"/>
+          </w:tcPr>
+          <w:p>
+            <w:pPr>
+              <w:spacing w:before="0" w:after="0" w:line="269" w:lineRule="auto"/>
+              <w:jc w:val="center"/>
+            </w:pPr>
+            <w:r>
+              <w:rPr>
+                <w:rFonts w:ascii="맑은 고딕" w:hAnsi="맑은 고딕" w:eastAsia="맑은 고딕" w:cs="맑은 고딕"/>
+                <w:sz w:val="18"/>
+              </w:rPr>
+              <w:t>수동 show 입력·출력</w:t>
+            </w:r>
+          </w:p>
+        </w:tc>
+        <w:tc>
+          <w:tcPr>
+            <w:tcW w:type="dxa" w:w="3000"/>
+            <w:tcMar>
+              <w:top w:w="80" w:type="dxa"/>
+              <w:start w:w="120" w:type="dxa"/>
+              <w:bottom w:w="80" w:type="dxa"/>
+              <w:end w:w="120" w:type="dxa"/>
+            </w:tcMar>
+            <w:vAlign w:val="center"/>
+          </w:tcPr>
+          <w:p>
+            <w:pPr>
+              <w:spacing w:before="0" w:after="0" w:line="269" w:lineRule="auto"/>
+              <w:jc w:val="left"/>
+            </w:pPr>
+            <w:r>
+              <w:rPr>
+                <w:rFonts w:ascii="맑은 고딕" w:hAnsi="맑은 고딕" w:eastAsia="맑은 고딕" w:cs="맑은 고딕"/>
+                <w:sz w:val="18"/>
+              </w:rPr>
               <w:t>Viewer 프로세스 메모리</w:t>
             </w:r>
           </w:p>
@@ -4448,7 +4599,6 @@
         <w:tc>
           <w:tcPr>
             <w:tcW w:type="dxa" w:w="4160"/>
-            <w:shd w:fill="FAFBFC"/>
             <w:tcMar>
               <w:top w:w="80" w:type="dxa"/>
               <w:start w:w="120" w:type="dxa"/>
@@ -4476,6 +4626,7 @@
         <w:tc>
           <w:tcPr>
             <w:tcW w:type="dxa" w:w="2200"/>
+            <w:shd w:fill="FAFBFC"/>
             <w:tcMar>
               <w:top w:w="80" w:type="dxa"/>
               <w:start w:w="120" w:type="dxa"/>
@@ -4495,86 +4646,6 @@
                 <w:sz w:val="18"/>
               </w:rPr>
               <w:t>Agent HTTPS 신원</w:t>
-            </w:r>
-          </w:p>
-        </w:tc>
-        <w:tc>
-          <w:tcPr>
-            <w:tcW w:type="dxa" w:w="3000"/>
-            <w:tcMar>
-              <w:top w:w="80" w:type="dxa"/>
-              <w:start w:w="120" w:type="dxa"/>
-              <w:bottom w:w="80" w:type="dxa"/>
-              <w:end w:w="120" w:type="dxa"/>
-            </w:tcMar>
-            <w:vAlign w:val="center"/>
-          </w:tcPr>
-          <w:p>
-            <w:pPr>
-              <w:spacing w:before="0" w:after="0" w:line="269" w:lineRule="auto"/>
-              <w:jc w:val="left"/>
-            </w:pPr>
-            <w:r>
-              <w:rPr>
-                <w:rFonts w:ascii="맑은 고딕" w:hAnsi="맑은 고딕" w:eastAsia="맑은 고딕" w:cs="맑은 고딕"/>
-                <w:sz w:val="18"/>
-              </w:rPr>
-              <w:t>%ProgramData%\</w:t>
-              <w:br/>
-              <w:t>SamsungSwitchWatch</w:t>
-            </w:r>
-          </w:p>
-        </w:tc>
-        <w:tc>
-          <w:tcPr>
-            <w:tcW w:type="dxa" w:w="4160"/>
-            <w:tcMar>
-              <w:top w:w="80" w:type="dxa"/>
-              <w:start w:w="120" w:type="dxa"/>
-              <w:bottom w:w="80" w:type="dxa"/>
-              <w:end w:w="120" w:type="dxa"/>
-            </w:tcMar>
-            <w:vAlign w:val="center"/>
-          </w:tcPr>
-          <w:p>
-            <w:pPr>
-              <w:spacing w:before="0" w:after="0" w:line="269" w:lineRule="auto"/>
-              <w:jc w:val="left"/>
-            </w:pPr>
-            <w:r>
-              <w:rPr>
-                <w:rFonts w:ascii="맑은 고딕" w:hAnsi="맑은 고딕" w:eastAsia="맑은 고딕" w:cs="맑은 고딕"/>
-                <w:sz w:val="18"/>
-              </w:rPr>
-              <w:t>DPAPI LocalMachine + SYSTEM/Administrators/서비스 SID ACL</w:t>
-            </w:r>
-          </w:p>
-        </w:tc>
-      </w:tr>
-      <w:tr>
-        <w:tc>
-          <w:tcPr>
-            <w:tcW w:type="dxa" w:w="2200"/>
-            <w:shd w:fill="FAFBFC"/>
-            <w:tcMar>
-              <w:top w:w="80" w:type="dxa"/>
-              <w:start w:w="120" w:type="dxa"/>
-              <w:bottom w:w="80" w:type="dxa"/>
-              <w:end w:w="120" w:type="dxa"/>
-            </w:tcMar>
-            <w:vAlign w:val="center"/>
-          </w:tcPr>
-          <w:p>
-            <w:pPr>
-              <w:spacing w:before="0" w:after="0" w:line="269" w:lineRule="auto"/>
-              <w:jc w:val="center"/>
-            </w:pPr>
-            <w:r>
-              <w:rPr>
-                <w:rFonts w:ascii="맑은 고딕" w:hAnsi="맑은 고딕" w:eastAsia="맑은 고딕" w:cs="맑은 고딕"/>
-                <w:sz w:val="18"/>
-              </w:rPr>
-              <w:t>Agent 설치 영수증</w:t>
             </w:r>
           </w:p>
         </w:tc>
@@ -4628,7 +4699,7 @@
                 <w:rFonts w:ascii="맑은 고딕" w:hAnsi="맑은 고딕" w:eastAsia="맑은 고딕" w:cs="맑은 고딕"/>
                 <w:sz w:val="18"/>
               </w:rPr>
-              <w:t>Administrators owner + SYSTEM/Administrators 전용 ACL</w:t>
+              <w:t>DPAPI LocalMachine + SYSTEM/Administrators/서비스 SID ACL</w:t>
             </w:r>
           </w:p>
         </w:tc>
@@ -4655,6 +4726,86 @@
                 <w:rFonts w:ascii="맑은 고딕" w:hAnsi="맑은 고딕" w:eastAsia="맑은 고딕" w:cs="맑은 고딕"/>
                 <w:sz w:val="18"/>
               </w:rPr>
+              <w:t>Agent 설치 영수증</w:t>
+            </w:r>
+          </w:p>
+        </w:tc>
+        <w:tc>
+          <w:tcPr>
+            <w:tcW w:type="dxa" w:w="3000"/>
+            <w:tcMar>
+              <w:top w:w="80" w:type="dxa"/>
+              <w:start w:w="120" w:type="dxa"/>
+              <w:bottom w:w="80" w:type="dxa"/>
+              <w:end w:w="120" w:type="dxa"/>
+            </w:tcMar>
+            <w:vAlign w:val="center"/>
+          </w:tcPr>
+          <w:p>
+            <w:pPr>
+              <w:spacing w:before="0" w:after="0" w:line="269" w:lineRule="auto"/>
+              <w:jc w:val="left"/>
+            </w:pPr>
+            <w:r>
+              <w:rPr>
+                <w:rFonts w:ascii="맑은 고딕" w:hAnsi="맑은 고딕" w:eastAsia="맑은 고딕" w:cs="맑은 고딕"/>
+                <w:sz w:val="18"/>
+              </w:rPr>
+              <w:t>%ProgramData%\</w:t>
+              <w:br/>
+              <w:t>SamsungSwitchWatch</w:t>
+            </w:r>
+          </w:p>
+        </w:tc>
+        <w:tc>
+          <w:tcPr>
+            <w:tcW w:type="dxa" w:w="4160"/>
+            <w:tcMar>
+              <w:top w:w="80" w:type="dxa"/>
+              <w:start w:w="120" w:type="dxa"/>
+              <w:bottom w:w="80" w:type="dxa"/>
+              <w:end w:w="120" w:type="dxa"/>
+            </w:tcMar>
+            <w:vAlign w:val="center"/>
+          </w:tcPr>
+          <w:p>
+            <w:pPr>
+              <w:spacing w:before="0" w:after="0" w:line="269" w:lineRule="auto"/>
+              <w:jc w:val="left"/>
+            </w:pPr>
+            <w:r>
+              <w:rPr>
+                <w:rFonts w:ascii="맑은 고딕" w:hAnsi="맑은 고딕" w:eastAsia="맑은 고딕" w:cs="맑은 고딕"/>
+                <w:sz w:val="18"/>
+              </w:rPr>
+              <w:t>Administrators owner + SYSTEM/Administrators 전용 ACL</w:t>
+            </w:r>
+          </w:p>
+        </w:tc>
+      </w:tr>
+      <w:tr>
+        <w:tc>
+          <w:tcPr>
+            <w:tcW w:type="dxa" w:w="2200"/>
+            <w:shd w:fill="FAFBFC"/>
+            <w:tcMar>
+              <w:top w:w="80" w:type="dxa"/>
+              <w:start w:w="120" w:type="dxa"/>
+              <w:bottom w:w="80" w:type="dxa"/>
+              <w:end w:w="120" w:type="dxa"/>
+            </w:tcMar>
+            <w:vAlign w:val="center"/>
+          </w:tcPr>
+          <w:p>
+            <w:pPr>
+              <w:spacing w:before="0" w:after="0" w:line="269" w:lineRule="auto"/>
+              <w:jc w:val="center"/>
+            </w:pPr>
+            <w:r>
+              <w:rPr>
+                <w:rFonts w:ascii="맑은 고딕" w:hAnsi="맑은 고딕" w:eastAsia="맑은 고딕" w:cs="맑은 고딕"/>
+                <w:sz w:val="18"/>
+              </w:rPr>
               <w:t>장비 계정·스위치 출력</w:t>
             </w:r>
           </w:p>
@@ -4662,6 +4813,7 @@
         <w:tc>
           <w:tcPr>
             <w:tcW w:type="dxa" w:w="3000"/>
+            <w:shd w:fill="FAFBFC"/>
             <w:tcMar>
               <w:top w:w="80" w:type="dxa"/>
               <w:start w:w="120" w:type="dxa"/>
@@ -4687,6 +4839,7 @@
         <w:tc>
           <w:tcPr>
             <w:tcW w:type="dxa" w:w="4160"/>
+            <w:shd w:fill="FAFBFC"/>
             <w:tcMar>
               <w:top w:w="80" w:type="dxa"/>
               <w:start w:w="120" w:type="dxa"/>
@@ -4722,10 +4875,12 @@
           <w:ilvl w:val="0"/>
           <w:numId w:val="10"/>
         </w:numPr>
+        <w:spacing w:before="0" w:after="120" w:line="300" w:lineRule="auto"/>
       </w:pPr>
       <w:r>
         <w:rPr>
           <w:rFonts w:ascii="맑은 고딕" w:hAnsi="맑은 고딕" w:eastAsia="맑은 고딕" w:cs="맑은 고딕"/>
+          <w:sz w:val="22"/>
         </w:rPr>
         <w:t>Viewer 설정 파일을 다른 PC나 다른 Windows 사용자에게 복사해도 계정은 복호화되지 않습니다.</w:t>
       </w:r>
@@ -4736,10 +4891,12 @@
           <w:ilvl w:val="0"/>
           <w:numId w:val="10"/>
         </w:numPr>
+        <w:spacing w:before="0" w:after="120" w:line="300" w:lineRule="auto"/>
       </w:pPr>
       <w:r>
         <w:rPr>
           <w:rFonts w:ascii="맑은 고딕" w:hAnsi="맑은 고딕" w:eastAsia="맑은 고딕" w:cs="맑은 고딕"/>
+          <w:sz w:val="22"/>
         </w:rPr>
         <w:t>진단 파일에는 IP, ID, 비밀번호, 호스트명과 수동 명령 원문을 넣지 않습니다.</w:t>
       </w:r>
@@ -4750,10 +4907,12 @@
           <w:ilvl w:val="0"/>
           <w:numId w:val="10"/>
         </w:numPr>
+        <w:spacing w:before="0" w:after="120" w:line="300" w:lineRule="auto"/>
       </w:pPr>
       <w:r>
         <w:rPr>
           <w:rFonts w:ascii="맑은 고딕" w:hAnsi="맑은 고딕" w:eastAsia="맑은 고딕" w:cs="맑은 고딕"/>
+          <w:sz w:val="22"/>
         </w:rPr>
         <w:t>레거시 백업은 SYSTEM과 로컬 Administrators만 접근할 수 있으며 Agent 서비스 SID에는 권한을 주지 않습니다.</w:t>
       </w:r>
@@ -4764,10 +4923,12 @@
           <w:ilvl w:val="0"/>
           <w:numId w:val="10"/>
         </w:numPr>
+        <w:spacing w:before="0" w:after="120" w:line="300" w:lineRule="auto"/>
       </w:pPr>
       <w:r>
         <w:rPr>
           <w:rFonts w:ascii="맑은 고딕" w:hAnsi="맑은 고딕" w:eastAsia="맑은 고딕" w:cs="맑은 고딕"/>
+          <w:sz w:val="22"/>
         </w:rPr>
         <w:t>대상 정책은 설치 설정, Viewer 접근 정책은 제품 소유 방화벽 규칙이 권한원이며 설치 영수증에서 복원하지 않습니다.</w:t>
       </w:r>
@@ -4778,10 +4939,12 @@
           <w:ilvl w:val="0"/>
           <w:numId w:val="10"/>
         </w:numPr>
+        <w:spacing w:before="0" w:after="120" w:line="300" w:lineRule="auto"/>
       </w:pPr>
       <w:r>
         <w:rPr>
           <w:rFonts w:ascii="맑은 고딕" w:hAnsi="맑은 고딕" w:eastAsia="맑은 고딕" w:cs="맑은 고딕"/>
+          <w:sz w:val="22"/>
         </w:rPr>
         <w:t>Agent 방화벽은 등록한 Viewer PC IPv4 또는 고급 관리 CIDR만 HTTPS/18443에 접근하도록 제한합니다.</w:t>
       </w:r>
@@ -4792,10 +4955,12 @@
           <w:ilvl w:val="0"/>
           <w:numId w:val="10"/>
         </w:numPr>
+        <w:spacing w:before="0" w:after="120" w:line="300" w:lineRule="auto"/>
       </w:pPr>
       <w:r>
         <w:rPr>
           <w:rFonts w:ascii="맑은 고딕" w:hAnsi="맑은 고딕" w:eastAsia="맑은 고딕" w:cs="맑은 고딕"/>
+          <w:sz w:val="22"/>
         </w:rPr>
         <w:t>Agent는 등록한 스위치 IPv4 또는 고급 대상 CIDR과 고정 Telnet/23만 허용합니다.</w:t>
       </w:r>
@@ -4803,7 +4968,7 @@
     <w:p>
       <w:pPr>
         <w:pStyle w:val="Heading1"/>
-        <w:pageBreakBefore/>
+        <w:pageBreakBefore w:val="0"/>
         <w:numPr>
           <w:ilvl w:val="0"/>
           <w:numId w:val="11"/>
@@ -5532,6 +5697,271 @@
                 <w:rFonts w:ascii="맑은 고딕" w:hAnsi="맑은 고딕" w:eastAsia="맑은 고딕" w:cs="맑은 고딕"/>
                 <w:sz w:val="16"/>
               </w:rPr>
+              <w:t>VIEWER_SOURCE_ACCESS_DENIED</w:t>
+            </w:r>
+          </w:p>
+        </w:tc>
+        <w:tc>
+          <w:tcPr>
+            <w:tcW w:type="dxa" w:w="5360"/>
+            <w:shd w:fill="FAFBFC"/>
+            <w:tcMar>
+              <w:top w:w="80" w:type="dxa"/>
+              <w:start w:w="120" w:type="dxa"/>
+              <w:bottom w:w="80" w:type="dxa"/>
+              <w:end w:w="120" w:type="dxa"/>
+            </w:tcMar>
+            <w:vAlign w:val="center"/>
+          </w:tcPr>
+          <w:p>
+            <w:pPr>
+              <w:spacing w:before="0" w:after="0" w:line="240" w:lineRule="auto"/>
+              <w:jc w:val="left"/>
+            </w:pPr>
+            <w:r>
+              <w:rPr>
+                <w:rFonts w:ascii="맑은 고딕" w:hAnsi="맑은 고딕" w:eastAsia="맑은 고딕" w:cs="맑은 고딕"/>
+                <w:sz w:val="16"/>
+              </w:rPr>
+              <w:t>UAC 관리자도 읽을 수 있는 승인된 임시 폴더에 공식 ZIP 다시 압축 해제</w:t>
+            </w:r>
+          </w:p>
+        </w:tc>
+      </w:tr>
+      <w:tr>
+        <w:tc>
+          <w:tcPr>
+            <w:tcW w:type="dxa" w:w="4000"/>
+            <w:tcMar>
+              <w:top w:w="80" w:type="dxa"/>
+              <w:start w:w="120" w:type="dxa"/>
+              <w:bottom w:w="80" w:type="dxa"/>
+              <w:end w:w="120" w:type="dxa"/>
+            </w:tcMar>
+            <w:vAlign w:val="center"/>
+          </w:tcPr>
+          <w:p>
+            <w:pPr>
+              <w:spacing w:before="0" w:after="0" w:line="240" w:lineRule="auto"/>
+              <w:jc w:val="left"/>
+            </w:pPr>
+            <w:r>
+              <w:rPr>
+                <w:rFonts w:ascii="맑은 고딕" w:hAnsi="맑은 고딕" w:eastAsia="맑은 고딕" w:cs="맑은 고딕"/>
+                <w:sz w:val="16"/>
+              </w:rPr>
+              <w:t>VIEWER_INSTALL_PATH_EXECUTION_BLOCKED</w:t>
+            </w:r>
+          </w:p>
+        </w:tc>
+        <w:tc>
+          <w:tcPr>
+            <w:tcW w:type="dxa" w:w="5360"/>
+            <w:tcMar>
+              <w:top w:w="80" w:type="dxa"/>
+              <w:start w:w="120" w:type="dxa"/>
+              <w:bottom w:w="80" w:type="dxa"/>
+              <w:end w:w="120" w:type="dxa"/>
+            </w:tcMar>
+            <w:vAlign w:val="center"/>
+          </w:tcPr>
+          <w:p>
+            <w:pPr>
+              <w:spacing w:before="0" w:after="0" w:line="240" w:lineRule="auto"/>
+              <w:jc w:val="left"/>
+            </w:pPr>
+            <w:r>
+              <w:rPr>
+                <w:rFonts w:ascii="맑은 고딕" w:hAnsi="맑은 고딕" w:eastAsia="맑은 고딕" w:cs="맑은 고딕"/>
+                <w:sz w:val="16"/>
+              </w:rPr>
+              <w:t>Program Files 실행 정책 → AppLocker·WDAC·EDR 기록 → 보안 담당자</w:t>
+            </w:r>
+          </w:p>
+        </w:tc>
+      </w:tr>
+      <w:tr>
+        <w:tc>
+          <w:tcPr>
+            <w:tcW w:type="dxa" w:w="4000"/>
+            <w:shd w:fill="FAFBFC"/>
+            <w:tcMar>
+              <w:top w:w="80" w:type="dxa"/>
+              <w:start w:w="120" w:type="dxa"/>
+              <w:bottom w:w="80" w:type="dxa"/>
+              <w:end w:w="120" w:type="dxa"/>
+            </w:tcMar>
+            <w:vAlign w:val="center"/>
+          </w:tcPr>
+          <w:p>
+            <w:pPr>
+              <w:spacing w:before="0" w:after="0" w:line="240" w:lineRule="auto"/>
+              <w:jc w:val="left"/>
+            </w:pPr>
+            <w:r>
+              <w:rPr>
+                <w:rFonts w:ascii="맑은 고딕" w:hAnsi="맑은 고딕" w:eastAsia="맑은 고딕" w:cs="맑은 고딕"/>
+                <w:sz w:val="16"/>
+              </w:rPr>
+              <w:t>VIEWER_USER_PHASE_FAILED</w:t>
+            </w:r>
+          </w:p>
+        </w:tc>
+        <w:tc>
+          <w:tcPr>
+            <w:tcW w:type="dxa" w:w="5360"/>
+            <w:shd w:fill="FAFBFC"/>
+            <w:tcMar>
+              <w:top w:w="80" w:type="dxa"/>
+              <w:start w:w="120" w:type="dxa"/>
+              <w:bottom w:w="80" w:type="dxa"/>
+              <w:end w:w="120" w:type="dxa"/>
+            </w:tcMar>
+            <w:vAlign w:val="center"/>
+          </w:tcPr>
+          <w:p>
+            <w:pPr>
+              <w:spacing w:before="0" w:after="0" w:line="240" w:lineRule="auto"/>
+              <w:jc w:val="left"/>
+            </w:pPr>
+            <w:r>
+              <w:rPr>
+                <w:rFonts w:ascii="맑은 고딕" w:hAnsi="맑은 고딕" w:eastAsia="맑은 고딕" w:cs="맑은 고딕"/>
+                <w:sz w:val="16"/>
+              </w:rPr>
+              <w:t>원래 사용자 실행 검사·바로 가기 → 복구 UAC → Recovery 결과</w:t>
+            </w:r>
+          </w:p>
+        </w:tc>
+      </w:tr>
+      <w:tr>
+        <w:tc>
+          <w:tcPr>
+            <w:tcW w:type="dxa" w:w="4000"/>
+            <w:tcMar>
+              <w:top w:w="80" w:type="dxa"/>
+              <w:start w:w="120" w:type="dxa"/>
+              <w:bottom w:w="80" w:type="dxa"/>
+              <w:end w:w="120" w:type="dxa"/>
+            </w:tcMar>
+            <w:vAlign w:val="center"/>
+          </w:tcPr>
+          <w:p>
+            <w:pPr>
+              <w:spacing w:before="0" w:after="0" w:line="240" w:lineRule="auto"/>
+              <w:jc w:val="left"/>
+            </w:pPr>
+            <w:r>
+              <w:rPr>
+                <w:rFonts w:ascii="맑은 고딕" w:hAnsi="맑은 고딕" w:eastAsia="맑은 고딕" w:cs="맑은 고딕"/>
+                <w:sz w:val="16"/>
+              </w:rPr>
+              <w:t>VIEWER_MACHINE_ROLLBACK_INCOMPLETE</w:t>
+            </w:r>
+          </w:p>
+        </w:tc>
+        <w:tc>
+          <w:tcPr>
+            <w:tcW w:type="dxa" w:w="5360"/>
+            <w:tcMar>
+              <w:top w:w="80" w:type="dxa"/>
+              <w:start w:w="120" w:type="dxa"/>
+              <w:bottom w:w="80" w:type="dxa"/>
+              <w:end w:w="120" w:type="dxa"/>
+            </w:tcMar>
+            <w:vAlign w:val="center"/>
+          </w:tcPr>
+          <w:p>
+            <w:pPr>
+              <w:spacing w:before="0" w:after="0" w:line="240" w:lineRule="auto"/>
+              <w:jc w:val="left"/>
+            </w:pPr>
+            <w:r>
+              <w:rPr>
+                <w:rFonts w:ascii="맑은 고딕" w:hAnsi="맑은 고딕" w:eastAsia="맑은 고딕" w:cs="맑은 고딕"/>
+                <w:sz w:val="16"/>
+              </w:rPr>
+              <w:t>현재 설치와 Viewer.__rollback 보존 → Windows 관리자 확인</w:t>
+            </w:r>
+          </w:p>
+        </w:tc>
+      </w:tr>
+      <w:tr>
+        <w:tc>
+          <w:tcPr>
+            <w:tcW w:type="dxa" w:w="4000"/>
+            <w:shd w:fill="FAFBFC"/>
+            <w:tcMar>
+              <w:top w:w="80" w:type="dxa"/>
+              <w:start w:w="120" w:type="dxa"/>
+              <w:bottom w:w="80" w:type="dxa"/>
+              <w:end w:w="120" w:type="dxa"/>
+            </w:tcMar>
+            <w:vAlign w:val="center"/>
+          </w:tcPr>
+          <w:p>
+            <w:pPr>
+              <w:spacing w:before="0" w:after="0" w:line="240" w:lineRule="auto"/>
+              <w:jc w:val="left"/>
+            </w:pPr>
+            <w:r>
+              <w:rPr>
+                <w:rFonts w:ascii="맑은 고딕" w:hAnsi="맑은 고딕" w:eastAsia="맑은 고딕" w:cs="맑은 고딕"/>
+                <w:sz w:val="16"/>
+              </w:rPr>
+              <w:t>VIEWER_ROLLBACK_ELEVATION_NOT_GRANTED</w:t>
+            </w:r>
+          </w:p>
+        </w:tc>
+        <w:tc>
+          <w:tcPr>
+            <w:tcW w:type="dxa" w:w="5360"/>
+            <w:shd w:fill="FAFBFC"/>
+            <w:tcMar>
+              <w:top w:w="80" w:type="dxa"/>
+              <w:start w:w="120" w:type="dxa"/>
+              <w:bottom w:w="80" w:type="dxa"/>
+              <w:end w:w="120" w:type="dxa"/>
+            </w:tcMar>
+            <w:vAlign w:val="center"/>
+          </w:tcPr>
+          <w:p>
+            <w:pPr>
+              <w:spacing w:before="0" w:after="0" w:line="240" w:lineRule="auto"/>
+              <w:jc w:val="left"/>
+            </w:pPr>
+            <w:r>
+              <w:rPr>
+                <w:rFonts w:ascii="맑은 고딕" w:hAnsi="맑은 고딕" w:eastAsia="맑은 고딕" w:cs="맑은 고딕"/>
+                <w:sz w:val="16"/>
+              </w:rPr>
+              <w:t>복구 UAC 취소 여부 → rollback 슬롯 보존 → 관리자 재시도</w:t>
+            </w:r>
+          </w:p>
+        </w:tc>
+      </w:tr>
+      <w:tr>
+        <w:tc>
+          <w:tcPr>
+            <w:tcW w:type="dxa" w:w="4000"/>
+            <w:tcMar>
+              <w:top w:w="80" w:type="dxa"/>
+              <w:start w:w="120" w:type="dxa"/>
+              <w:bottom w:w="80" w:type="dxa"/>
+              <w:end w:w="120" w:type="dxa"/>
+            </w:tcMar>
+            <w:vAlign w:val="center"/>
+          </w:tcPr>
+          <w:p>
+            <w:pPr>
+              <w:spacing w:before="0" w:after="0" w:line="240" w:lineRule="auto"/>
+              <w:jc w:val="left"/>
+            </w:pPr>
+            <w:r>
+              <w:rPr>
+                <w:rFonts w:ascii="맑은 고딕" w:hAnsi="맑은 고딕" w:eastAsia="맑은 고딕" w:cs="맑은 고딕"/>
+                <w:sz w:val="16"/>
+              </w:rPr>
               <w:t>VIEWER_SHORTCUT_DIRECTORY_UNAVAILABLE</w:t>
             </w:r>
           </w:p>
@@ -5539,7 +5969,6 @@
         <w:tc>
           <w:tcPr>
             <w:tcW w:type="dxa" w:w="5360"/>
-            <w:shd w:fill="FAFBFC"/>
             <w:tcMar>
               <w:top w:w="80" w:type="dxa"/>
               <w:start w:w="120" w:type="dxa"/>
@@ -5567,6 +5996,7 @@
         <w:tc>
           <w:tcPr>
             <w:tcW w:type="dxa" w:w="4000"/>
+            <w:shd w:fill="FAFBFC"/>
             <w:tcMar>
               <w:top w:w="80" w:type="dxa"/>
               <w:start w:w="120" w:type="dxa"/>
@@ -5592,6 +6022,7 @@
         <w:tc>
           <w:tcPr>
             <w:tcW w:type="dxa" w:w="5360"/>
+            <w:shd w:fill="FAFBFC"/>
             <w:tcMar>
               <w:top w:w="80" w:type="dxa"/>
               <w:start w:w="120" w:type="dxa"/>
@@ -5619,7 +6050,6 @@
         <w:tc>
           <w:tcPr>
             <w:tcW w:type="dxa" w:w="4000"/>
-            <w:shd w:fill="FAFBFC"/>
             <w:tcMar>
               <w:top w:w="80" w:type="dxa"/>
               <w:start w:w="120" w:type="dxa"/>
@@ -5645,7 +6075,6 @@
         <w:tc>
           <w:tcPr>
             <w:tcW w:type="dxa" w:w="5360"/>
-            <w:shd w:fill="FAFBFC"/>
             <w:tcMar>
               <w:top w:w="80" w:type="dxa"/>
               <w:start w:w="120" w:type="dxa"/>
@@ -5673,6 +6102,7 @@
         <w:tc>
           <w:tcPr>
             <w:tcW w:type="dxa" w:w="4000"/>
+            <w:shd w:fill="FAFBFC"/>
             <w:tcMar>
               <w:top w:w="80" w:type="dxa"/>
               <w:start w:w="120" w:type="dxa"/>
@@ -5698,6 +6128,7 @@
         <w:tc>
           <w:tcPr>
             <w:tcW w:type="dxa" w:w="5360"/>
+            <w:shd w:fill="FAFBFC"/>
             <w:tcMar>
               <w:top w:w="80" w:type="dxa"/>
               <w:start w:w="120" w:type="dxa"/>
@@ -5725,7 +6156,6 @@
         <w:tc>
           <w:tcPr>
             <w:tcW w:type="dxa" w:w="4000"/>
-            <w:shd w:fill="FAFBFC"/>
             <w:tcMar>
               <w:top w:w="80" w:type="dxa"/>
               <w:start w:w="120" w:type="dxa"/>
@@ -5751,7 +6181,6 @@
         <w:tc>
           <w:tcPr>
             <w:tcW w:type="dxa" w:w="5360"/>
-            <w:shd w:fill="FAFBFC"/>
             <w:tcMar>
               <w:top w:w="80" w:type="dxa"/>
               <w:start w:w="120" w:type="dxa"/>
@@ -5779,6 +6208,7 @@
         <w:tc>
           <w:tcPr>
             <w:tcW w:type="dxa" w:w="4000"/>
+            <w:shd w:fill="FAFBFC"/>
             <w:tcMar>
               <w:top w:w="80" w:type="dxa"/>
               <w:start w:w="120" w:type="dxa"/>
@@ -5804,6 +6234,7 @@
         <w:tc>
           <w:tcPr>
             <w:tcW w:type="dxa" w:w="5360"/>
+            <w:shd w:fill="FAFBFC"/>
             <w:tcMar>
               <w:top w:w="80" w:type="dxa"/>
               <w:start w:w="120" w:type="dxa"/>
@@ -5831,7 +6262,6 @@
         <w:tc>
           <w:tcPr>
             <w:tcW w:type="dxa" w:w="4000"/>
-            <w:shd w:fill="FAFBFC"/>
             <w:tcMar>
               <w:top w:w="80" w:type="dxa"/>
               <w:start w:w="120" w:type="dxa"/>
@@ -5857,7 +6287,6 @@
         <w:tc>
           <w:tcPr>
             <w:tcW w:type="dxa" w:w="5360"/>
-            <w:shd w:fill="FAFBFC"/>
             <w:tcMar>
               <w:top w:w="80" w:type="dxa"/>
               <w:start w:w="120" w:type="dxa"/>
@@ -5885,6 +6314,7 @@
         <w:tc>
           <w:tcPr>
             <w:tcW w:type="dxa" w:w="4000"/>
+            <w:shd w:fill="FAFBFC"/>
             <w:tcMar>
               <w:top w:w="80" w:type="dxa"/>
               <w:start w:w="120" w:type="dxa"/>
@@ -5910,6 +6340,7 @@
         <w:tc>
           <w:tcPr>
             <w:tcW w:type="dxa" w:w="5360"/>
+            <w:shd w:fill="FAFBFC"/>
             <w:tcMar>
               <w:top w:w="80" w:type="dxa"/>
               <w:start w:w="120" w:type="dxa"/>
@@ -5929,60 +6360,6 @@
                 <w:sz w:val="16"/>
               </w:rPr>
               <w:t>설치 journal → Windows Application 로그 → 다시 설치</w:t>
-            </w:r>
-          </w:p>
-        </w:tc>
-      </w:tr>
-      <w:tr>
-        <w:tc>
-          <w:tcPr>
-            <w:tcW w:type="dxa" w:w="4000"/>
-            <w:shd w:fill="FAFBFC"/>
-            <w:tcMar>
-              <w:top w:w="80" w:type="dxa"/>
-              <w:start w:w="120" w:type="dxa"/>
-              <w:bottom w:w="80" w:type="dxa"/>
-              <w:end w:w="120" w:type="dxa"/>
-            </w:tcMar>
-            <w:vAlign w:val="center"/>
-          </w:tcPr>
-          <w:p>
-            <w:pPr>
-              <w:spacing w:before="0" w:after="0" w:line="240" w:lineRule="auto"/>
-              <w:jc w:val="left"/>
-            </w:pPr>
-            <w:r>
-              <w:rPr>
-                <w:rFonts w:ascii="맑은 고딕" w:hAnsi="맑은 고딕" w:eastAsia="맑은 고딕" w:cs="맑은 고딕"/>
-                <w:sz w:val="16"/>
-              </w:rPr>
-              <w:t>VIEWER_SELF_CHECK_TIMEOUT</w:t>
-            </w:r>
-          </w:p>
-        </w:tc>
-        <w:tc>
-          <w:tcPr>
-            <w:tcW w:type="dxa" w:w="5360"/>
-            <w:shd w:fill="FAFBFC"/>
-            <w:tcMar>
-              <w:top w:w="80" w:type="dxa"/>
-              <w:start w:w="120" w:type="dxa"/>
-              <w:bottom w:w="80" w:type="dxa"/>
-              <w:end w:w="120" w:type="dxa"/>
-            </w:tcMar>
-            <w:vAlign w:val="center"/>
-          </w:tcPr>
-          <w:p>
-            <w:pPr>
-              <w:spacing w:before="0" w:after="0" w:line="240" w:lineRule="auto"/>
-              <w:jc w:val="left"/>
-            </w:pPr>
-            <w:r>
-              <w:rPr>
-                <w:rFonts w:ascii="맑은 고딕" w:hAnsi="맑은 고딕" w:eastAsia="맑은 고딕" w:cs="맑은 고딕"/>
-                <w:sz w:val="16"/>
-              </w:rPr>
-              <w:t>20초 자체점검 제한 → 남은 프로세스·보안 프로그램 지연 확인</w:t>
             </w:r>
           </w:p>
         </w:tc>
@@ -6062,6 +6439,271 @@
                 <w:rFonts w:ascii="맑은 고딕" w:hAnsi="맑은 고딕" w:eastAsia="맑은 고딕" w:cs="맑은 고딕"/>
                 <w:sz w:val="16"/>
               </w:rPr>
+              <w:t>VIEWER_SELF_CHECK_ACCESS_DENIED</w:t>
+            </w:r>
+          </w:p>
+        </w:tc>
+        <w:tc>
+          <w:tcPr>
+            <w:tcW w:type="dxa" w:w="5360"/>
+            <w:shd w:fill="FAFBFC"/>
+            <w:tcMar>
+              <w:top w:w="80" w:type="dxa"/>
+              <w:start w:w="120" w:type="dxa"/>
+              <w:bottom w:w="80" w:type="dxa"/>
+              <w:end w:w="120" w:type="dxa"/>
+            </w:tcMar>
+            <w:vAlign w:val="center"/>
+          </w:tcPr>
+          <w:p>
+            <w:pPr>
+              <w:spacing w:before="0" w:after="0" w:line="240" w:lineRule="auto"/>
+              <w:jc w:val="left"/>
+            </w:pPr>
+            <w:r>
+              <w:rPr>
+                <w:rFonts w:ascii="맑은 고딕" w:hAnsi="맑은 고딕" w:eastAsia="맑은 고딕" w:cs="맑은 고딕"/>
+                <w:sz w:val="16"/>
+              </w:rPr>
+              <w:t>Program Files 실행 권한 → EDR·AppLocker·WDAC 기록 확인</w:t>
+            </w:r>
+          </w:p>
+        </w:tc>
+      </w:tr>
+      <w:tr>
+        <w:tc>
+          <w:tcPr>
+            <w:tcW w:type="dxa" w:w="4000"/>
+            <w:tcMar>
+              <w:top w:w="80" w:type="dxa"/>
+              <w:start w:w="120" w:type="dxa"/>
+              <w:bottom w:w="80" w:type="dxa"/>
+              <w:end w:w="120" w:type="dxa"/>
+            </w:tcMar>
+            <w:vAlign w:val="center"/>
+          </w:tcPr>
+          <w:p>
+            <w:pPr>
+              <w:spacing w:before="0" w:after="0" w:line="240" w:lineRule="auto"/>
+              <w:jc w:val="left"/>
+            </w:pPr>
+            <w:r>
+              <w:rPr>
+                <w:rFonts w:ascii="맑은 고딕" w:hAnsi="맑은 고딕" w:eastAsia="맑은 고딕" w:cs="맑은 고딕"/>
+                <w:sz w:val="16"/>
+              </w:rPr>
+              <w:t>FILE_MISSING</w:t>
+            </w:r>
+          </w:p>
+        </w:tc>
+        <w:tc>
+          <w:tcPr>
+            <w:tcW w:type="dxa" w:w="5360"/>
+            <w:tcMar>
+              <w:top w:w="80" w:type="dxa"/>
+              <w:start w:w="120" w:type="dxa"/>
+              <w:bottom w:w="80" w:type="dxa"/>
+              <w:end w:w="120" w:type="dxa"/>
+            </w:tcMar>
+            <w:vAlign w:val="center"/>
+          </w:tcPr>
+          <w:p>
+            <w:pPr>
+              <w:spacing w:before="0" w:after="0" w:line="240" w:lineRule="auto"/>
+              <w:jc w:val="left"/>
+            </w:pPr>
+            <w:r>
+              <w:rPr>
+                <w:rFonts w:ascii="맑은 고딕" w:hAnsi="맑은 고딕" w:eastAsia="맑은 고딕" w:cs="맑은 고딕"/>
+                <w:sz w:val="16"/>
+              </w:rPr>
+              <w:t>설치 파일 누락 또는 EDR 격리 기록 확인</w:t>
+            </w:r>
+          </w:p>
+        </w:tc>
+      </w:tr>
+      <w:tr>
+        <w:tc>
+          <w:tcPr>
+            <w:tcW w:type="dxa" w:w="4000"/>
+            <w:shd w:fill="FAFBFC"/>
+            <w:tcMar>
+              <w:top w:w="80" w:type="dxa"/>
+              <w:start w:w="120" w:type="dxa"/>
+              <w:bottom w:w="80" w:type="dxa"/>
+              <w:end w:w="120" w:type="dxa"/>
+            </w:tcMar>
+            <w:vAlign w:val="center"/>
+          </w:tcPr>
+          <w:p>
+            <w:pPr>
+              <w:spacing w:before="0" w:after="0" w:line="240" w:lineRule="auto"/>
+              <w:jc w:val="left"/>
+            </w:pPr>
+            <w:r>
+              <w:rPr>
+                <w:rFonts w:ascii="맑은 고딕" w:hAnsi="맑은 고딕" w:eastAsia="맑은 고딕" w:cs="맑은 고딕"/>
+                <w:sz w:val="16"/>
+              </w:rPr>
+              <w:t>BAD_IMAGE</w:t>
+            </w:r>
+          </w:p>
+        </w:tc>
+        <w:tc>
+          <w:tcPr>
+            <w:tcW w:type="dxa" w:w="5360"/>
+            <w:shd w:fill="FAFBFC"/>
+            <w:tcMar>
+              <w:top w:w="80" w:type="dxa"/>
+              <w:start w:w="120" w:type="dxa"/>
+              <w:bottom w:w="80" w:type="dxa"/>
+              <w:end w:w="120" w:type="dxa"/>
+            </w:tcMar>
+            <w:vAlign w:val="center"/>
+          </w:tcPr>
+          <w:p>
+            <w:pPr>
+              <w:spacing w:before="0" w:after="0" w:line="240" w:lineRule="auto"/>
+              <w:jc w:val="left"/>
+            </w:pPr>
+            <w:r>
+              <w:rPr>
+                <w:rFonts w:ascii="맑은 고딕" w:hAnsi="맑은 고딕" w:eastAsia="맑은 고딕" w:cs="맑은 고딕"/>
+                <w:sz w:val="16"/>
+              </w:rPr>
+              <w:t>Windows x64 → 파일 손상·격리와 실행 파일 형식 확인</w:t>
+            </w:r>
+          </w:p>
+        </w:tc>
+      </w:tr>
+      <w:tr>
+        <w:tc>
+          <w:tcPr>
+            <w:tcW w:type="dxa" w:w="4000"/>
+            <w:tcMar>
+              <w:top w:w="80" w:type="dxa"/>
+              <w:start w:w="120" w:type="dxa"/>
+              <w:bottom w:w="80" w:type="dxa"/>
+              <w:end w:w="120" w:type="dxa"/>
+            </w:tcMar>
+            <w:vAlign w:val="center"/>
+          </w:tcPr>
+          <w:p>
+            <w:pPr>
+              <w:spacing w:before="0" w:after="0" w:line="240" w:lineRule="auto"/>
+              <w:jc w:val="left"/>
+            </w:pPr>
+            <w:r>
+              <w:rPr>
+                <w:rFonts w:ascii="맑은 고딕" w:hAnsi="맑은 고딕" w:eastAsia="맑은 고딕" w:cs="맑은 고딕"/>
+                <w:sz w:val="16"/>
+              </w:rPr>
+              <w:t>TIMEOUT</w:t>
+            </w:r>
+          </w:p>
+        </w:tc>
+        <w:tc>
+          <w:tcPr>
+            <w:tcW w:type="dxa" w:w="5360"/>
+            <w:tcMar>
+              <w:top w:w="80" w:type="dxa"/>
+              <w:start w:w="120" w:type="dxa"/>
+              <w:bottom w:w="80" w:type="dxa"/>
+              <w:end w:w="120" w:type="dxa"/>
+            </w:tcMar>
+            <w:vAlign w:val="center"/>
+          </w:tcPr>
+          <w:p>
+            <w:pPr>
+              <w:spacing w:before="0" w:after="0" w:line="240" w:lineRule="auto"/>
+              <w:jc w:val="left"/>
+            </w:pPr>
+            <w:r>
+              <w:rPr>
+                <w:rFonts w:ascii="맑은 고딕" w:hAnsi="맑은 고딕" w:eastAsia="맑은 고딕" w:cs="맑은 고딕"/>
+                <w:sz w:val="16"/>
+              </w:rPr>
+              <w:t>20초 자체점검 제한 → 남은 프로세스·보안 프로그램 지연 확인</w:t>
+            </w:r>
+          </w:p>
+        </w:tc>
+      </w:tr>
+      <w:tr>
+        <w:tc>
+          <w:tcPr>
+            <w:tcW w:type="dxa" w:w="4000"/>
+            <w:shd w:fill="FAFBFC"/>
+            <w:tcMar>
+              <w:top w:w="80" w:type="dxa"/>
+              <w:start w:w="120" w:type="dxa"/>
+              <w:bottom w:w="80" w:type="dxa"/>
+              <w:end w:w="120" w:type="dxa"/>
+            </w:tcMar>
+            <w:vAlign w:val="center"/>
+          </w:tcPr>
+          <w:p>
+            <w:pPr>
+              <w:spacing w:before="0" w:after="0" w:line="240" w:lineRule="auto"/>
+              <w:jc w:val="left"/>
+            </w:pPr>
+            <w:r>
+              <w:rPr>
+                <w:rFonts w:ascii="맑은 고딕" w:hAnsi="맑은 고딕" w:eastAsia="맑은 고딕" w:cs="맑은 고딕"/>
+                <w:sz w:val="16"/>
+              </w:rPr>
+              <w:t>VIEWER_UNINSTALL_ROLLBACK_PRESERVED</w:t>
+            </w:r>
+          </w:p>
+        </w:tc>
+        <w:tc>
+          <w:tcPr>
+            <w:tcW w:type="dxa" w:w="5360"/>
+            <w:shd w:fill="FAFBFC"/>
+            <w:tcMar>
+              <w:top w:w="80" w:type="dxa"/>
+              <w:start w:w="120" w:type="dxa"/>
+              <w:bottom w:w="80" w:type="dxa"/>
+              <w:end w:w="120" w:type="dxa"/>
+            </w:tcMar>
+            <w:vAlign w:val="center"/>
+          </w:tcPr>
+          <w:p>
+            <w:pPr>
+              <w:spacing w:before="0" w:after="0" w:line="240" w:lineRule="auto"/>
+              <w:jc w:val="left"/>
+            </w:pPr>
+            <w:r>
+              <w:rPr>
+                <w:rFonts w:ascii="맑은 고딕" w:hAnsi="맑은 고딕" w:eastAsia="맑은 고딕" w:cs="맑은 고딕"/>
+                <w:sz w:val="16"/>
+              </w:rPr>
+              <w:t>Viewer 프로세스·활성 프로그램 폴더 정리 → 관리자 제거 재실행</w:t>
+            </w:r>
+          </w:p>
+        </w:tc>
+      </w:tr>
+      <w:tr>
+        <w:tc>
+          <w:tcPr>
+            <w:tcW w:type="dxa" w:w="4000"/>
+            <w:tcMar>
+              <w:top w:w="80" w:type="dxa"/>
+              <w:start w:w="120" w:type="dxa"/>
+              <w:bottom w:w="80" w:type="dxa"/>
+              <w:end w:w="120" w:type="dxa"/>
+            </w:tcMar>
+            <w:vAlign w:val="center"/>
+          </w:tcPr>
+          <w:p>
+            <w:pPr>
+              <w:spacing w:before="0" w:after="0" w:line="240" w:lineRule="auto"/>
+              <w:jc w:val="left"/>
+            </w:pPr>
+            <w:r>
+              <w:rPr>
+                <w:rFonts w:ascii="맑은 고딕" w:hAnsi="맑은 고딕" w:eastAsia="맑은 고딕" w:cs="맑은 고딕"/>
+                <w:sz w:val="16"/>
+              </w:rPr>
               <w:t>TARGET_NOT_ALLOWED</w:t>
             </w:r>
           </w:p>
@@ -6069,7 +6711,6 @@
         <w:tc>
           <w:tcPr>
             <w:tcW w:type="dxa" w:w="5360"/>
-            <w:shd w:fill="FAFBFC"/>
             <w:tcMar>
               <w:top w:w="80" w:type="dxa"/>
               <w:start w:w="120" w:type="dxa"/>
@@ -6097,6 +6738,7 @@
         <w:tc>
           <w:tcPr>
             <w:tcW w:type="dxa" w:w="4000"/>
+            <w:shd w:fill="FAFBFC"/>
             <w:tcMar>
               <w:top w:w="80" w:type="dxa"/>
               <w:start w:w="120" w:type="dxa"/>
@@ -6122,6 +6764,7 @@
         <w:tc>
           <w:tcPr>
             <w:tcW w:type="dxa" w:w="5360"/>
+            <w:shd w:fill="FAFBFC"/>
             <w:tcMar>
               <w:top w:w="80" w:type="dxa"/>
               <w:start w:w="120" w:type="dxa"/>
@@ -6149,7 +6792,6 @@
         <w:tc>
           <w:tcPr>
             <w:tcW w:type="dxa" w:w="4000"/>
-            <w:shd w:fill="FAFBFC"/>
             <w:tcMar>
               <w:top w:w="80" w:type="dxa"/>
               <w:start w:w="120" w:type="dxa"/>
@@ -6175,7 +6817,6 @@
         <w:tc>
           <w:tcPr>
             <w:tcW w:type="dxa" w:w="5360"/>
-            <w:shd w:fill="FAFBFC"/>
             <w:tcMar>
               <w:top w:w="80" w:type="dxa"/>
               <w:start w:w="120" w:type="dxa"/>
@@ -6203,6 +6844,7 @@
         <w:tc>
           <w:tcPr>
             <w:tcW w:type="dxa" w:w="4000"/>
+            <w:shd w:fill="FAFBFC"/>
             <w:tcMar>
               <w:top w:w="80" w:type="dxa"/>
               <w:start w:w="120" w:type="dxa"/>
@@ -6228,6 +6870,7 @@
         <w:tc>
           <w:tcPr>
             <w:tcW w:type="dxa" w:w="5360"/>
+            <w:shd w:fill="FAFBFC"/>
             <w:tcMar>
               <w:top w:w="80" w:type="dxa"/>
               <w:start w:w="120" w:type="dxa"/>
@@ -6255,7 +6898,6 @@
         <w:tc>
           <w:tcPr>
             <w:tcW w:type="dxa" w:w="4000"/>
-            <w:shd w:fill="FAFBFC"/>
             <w:tcMar>
               <w:top w:w="80" w:type="dxa"/>
               <w:start w:w="120" w:type="dxa"/>
@@ -6281,7 +6923,6 @@
         <w:tc>
           <w:tcPr>
             <w:tcW w:type="dxa" w:w="5360"/>
-            <w:shd w:fill="FAFBFC"/>
             <w:tcMar>
               <w:top w:w="80" w:type="dxa"/>
               <w:start w:w="120" w:type="dxa"/>
@@ -6309,6 +6950,7 @@
         <w:tc>
           <w:tcPr>
             <w:tcW w:type="dxa" w:w="4000"/>
+            <w:shd w:fill="FAFBFC"/>
             <w:tcMar>
               <w:top w:w="80" w:type="dxa"/>
               <w:start w:w="120" w:type="dxa"/>
@@ -6334,6 +6976,7 @@
         <w:tc>
           <w:tcPr>
             <w:tcW w:type="dxa" w:w="5360"/>
+            <w:shd w:fill="FAFBFC"/>
             <w:tcMar>
               <w:top w:w="80" w:type="dxa"/>
               <w:start w:w="120" w:type="dxa"/>
@@ -6361,7 +7004,6 @@
         <w:tc>
           <w:tcPr>
             <w:tcW w:type="dxa" w:w="4000"/>
-            <w:shd w:fill="FAFBFC"/>
             <w:tcMar>
               <w:top w:w="80" w:type="dxa"/>
               <w:start w:w="120" w:type="dxa"/>
@@ -6387,7 +7029,6 @@
         <w:tc>
           <w:tcPr>
             <w:tcW w:type="dxa" w:w="5360"/>
-            <w:shd w:fill="FAFBFC"/>
             <w:tcMar>
               <w:top w:w="80" w:type="dxa"/>
               <w:start w:w="120" w:type="dxa"/>
@@ -6415,6 +7056,7 @@
         <w:tc>
           <w:tcPr>
             <w:tcW w:type="dxa" w:w="4000"/>
+            <w:shd w:fill="FAFBFC"/>
             <w:tcMar>
               <w:top w:w="80" w:type="dxa"/>
               <w:start w:w="120" w:type="dxa"/>
@@ -6440,6 +7082,7 @@
         <w:tc>
           <w:tcPr>
             <w:tcW w:type="dxa" w:w="5360"/>
+            <w:shd w:fill="FAFBFC"/>
             <w:tcMar>
               <w:top w:w="80" w:type="dxa"/>
               <w:start w:w="120" w:type="dxa"/>
@@ -6467,7 +7110,6 @@
         <w:tc>
           <w:tcPr>
             <w:tcW w:type="dxa" w:w="4000"/>
-            <w:shd w:fill="FAFBFC"/>
             <w:tcMar>
               <w:top w:w="80" w:type="dxa"/>
               <w:start w:w="120" w:type="dxa"/>
@@ -6493,7 +7135,6 @@
         <w:tc>
           <w:tcPr>
             <w:tcW w:type="dxa" w:w="5360"/>
-            <w:shd w:fill="FAFBFC"/>
             <w:tcMar>
               <w:top w:w="80" w:type="dxa"/>
               <w:start w:w="120" w:type="dxa"/>
@@ -6521,6 +7162,7 @@
         <w:tc>
           <w:tcPr>
             <w:tcW w:type="dxa" w:w="4000"/>
+            <w:shd w:fill="FAFBFC"/>
             <w:tcMar>
               <w:top w:w="80" w:type="dxa"/>
               <w:start w:w="120" w:type="dxa"/>
@@ -6546,6 +7188,7 @@
         <w:tc>
           <w:tcPr>
             <w:tcW w:type="dxa" w:w="5360"/>
+            <w:shd w:fill="FAFBFC"/>
             <w:tcMar>
               <w:top w:w="80" w:type="dxa"/>
               <w:start w:w="120" w:type="dxa"/>
@@ -6573,7 +7216,6 @@
         <w:tc>
           <w:tcPr>
             <w:tcW w:type="dxa" w:w="4000"/>
-            <w:shd w:fill="FAFBFC"/>
             <w:tcMar>
               <w:top w:w="80" w:type="dxa"/>
               <w:start w:w="120" w:type="dxa"/>
@@ -6599,7 +7241,6 @@
         <w:tc>
           <w:tcPr>
             <w:tcW w:type="dxa" w:w="5360"/>
-            <w:shd w:fill="FAFBFC"/>
             <w:tcMar>
               <w:top w:w="80" w:type="dxa"/>
               <w:start w:w="120" w:type="dxa"/>
@@ -6627,6 +7268,7 @@
         <w:tc>
           <w:tcPr>
             <w:tcW w:type="dxa" w:w="4000"/>
+            <w:shd w:fill="FAFBFC"/>
             <w:tcMar>
               <w:top w:w="80" w:type="dxa"/>
               <w:start w:w="120" w:type="dxa"/>
@@ -6652,6 +7294,7 @@
         <w:tc>
           <w:tcPr>
             <w:tcW w:type="dxa" w:w="5360"/>
+            <w:shd w:fill="FAFBFC"/>
             <w:tcMar>
               <w:top w:w="80" w:type="dxa"/>
               <w:start w:w="120" w:type="dxa"/>
@@ -6679,7 +7322,6 @@
         <w:tc>
           <w:tcPr>
             <w:tcW w:type="dxa" w:w="4000"/>
-            <w:shd w:fill="FAFBFC"/>
             <w:tcMar>
               <w:top w:w="80" w:type="dxa"/>
               <w:start w:w="120" w:type="dxa"/>
@@ -6705,7 +7347,6 @@
         <w:tc>
           <w:tcPr>
             <w:tcW w:type="dxa" w:w="5360"/>
-            <w:shd w:fill="FAFBFC"/>
             <w:tcMar>
               <w:top w:w="80" w:type="dxa"/>
               <w:start w:w="120" w:type="dxa"/>
@@ -6733,6 +7374,7 @@
         <w:tc>
           <w:tcPr>
             <w:tcW w:type="dxa" w:w="4000"/>
+            <w:shd w:fill="FAFBFC"/>
             <w:tcMar>
               <w:top w:w="80" w:type="dxa"/>
               <w:start w:w="120" w:type="dxa"/>
@@ -6758,6 +7400,7 @@
         <w:tc>
           <w:tcPr>
             <w:tcW w:type="dxa" w:w="5360"/>
+            <w:shd w:fill="FAFBFC"/>
             <w:tcMar>
               <w:top w:w="80" w:type="dxa"/>
               <w:start w:w="120" w:type="dxa"/>
@@ -6785,7 +7428,6 @@
         <w:tc>
           <w:tcPr>
             <w:tcW w:type="dxa" w:w="4000"/>
-            <w:shd w:fill="FAFBFC"/>
             <w:tcMar>
               <w:top w:w="80" w:type="dxa"/>
               <w:start w:w="120" w:type="dxa"/>
@@ -6811,7 +7453,6 @@
         <w:tc>
           <w:tcPr>
             <w:tcW w:type="dxa" w:w="5360"/>
-            <w:shd w:fill="FAFBFC"/>
             <w:tcMar>
               <w:top w:w="80" w:type="dxa"/>
               <w:start w:w="120" w:type="dxa"/>
@@ -7120,7 +7761,7 @@
                 <w:rFonts w:ascii="맑은 고딕" w:hAnsi="맑은 고딕" w:eastAsia="맑은 고딕" w:cs="맑은 고딕"/>
                 <w:sz w:val="16"/>
               </w:rPr>
-              <w:t>진단 결과의 service, agentLive, agentReady가 각각 OK, LIVE, READY인지 확인합니다.</w:t>
+              <w:t>service.status=Running, listener.status=Listening, firewall.enabled/exact=true, 지원 프로필 포함, health.live=LIVE, health.ready=READY인지 확인합니다.</w:t>
             </w:r>
           </w:p>
         </w:tc>
@@ -7427,10 +8068,12 @@
           <w:ilvl w:val="0"/>
           <w:numId w:val="10"/>
         </w:numPr>
+        <w:spacing w:before="0" w:after="40" w:line="252" w:lineRule="auto"/>
       </w:pPr>
       <w:r>
         <w:rPr>
           <w:rFonts w:ascii="맑은 고딕" w:hAnsi="맑은 고딕" w:eastAsia="맑은 고딕" w:cs="맑은 고딕"/>
+          <w:sz w:val="20"/>
         </w:rPr>
         <w:t>Agent 서비스가 창 없이 Running이고 Viewer가 주소만으로 HTTPS 연결되는지 확인</w:t>
       </w:r>
@@ -7441,10 +8084,12 @@
           <w:ilvl w:val="0"/>
           <w:numId w:val="10"/>
         </w:numPr>
+        <w:spacing w:before="0" w:after="40" w:line="252" w:lineRule="auto"/>
       </w:pPr>
       <w:r>
         <w:rPr>
           <w:rFonts w:ascii="맑은 고딕" w:hAnsi="맑은 고딕" w:eastAsia="맑은 고딕" w:cs="맑은 고딕"/>
+          <w:sz w:val="20"/>
         </w:rPr>
         <w:t>계정은 Viewer에만 저장되고 접속 시험 실패 장비의 주기 감시는 꺼지는지 확인</w:t>
       </w:r>
@@ -7455,10 +8100,12 @@
           <w:ilvl w:val="0"/>
           <w:numId w:val="10"/>
         </w:numPr>
+        <w:spacing w:before="0" w:after="40" w:line="252" w:lineRule="auto"/>
       </w:pPr>
       <w:r>
         <w:rPr>
           <w:rFonts w:ascii="맑은 고딕" w:hAnsi="맑은 고딕" w:eastAsia="맑은 고딕" w:cs="맑은 고딕"/>
+          <w:sz w:val="20"/>
         </w:rPr>
         <w:t>show port status와 syslog 명령이 모델별로 동작하는지 확인</w:t>
       </w:r>
@@ -7469,40 +8116,14 @@
           <w:ilvl w:val="0"/>
           <w:numId w:val="10"/>
         </w:numPr>
+        <w:spacing w:before="0" w:after="40" w:line="252" w:lineRule="auto"/>
       </w:pPr>
       <w:r>
         <w:rPr>
           <w:rFonts w:ascii="맑은 고딕" w:hAnsi="맑은 고딕" w:eastAsia="맑은 고딕" w:cs="맑은 고딕"/>
+          <w:sz w:val="20"/>
         </w:rPr>
-        <w:t>show running-config 결과가 파일/이벤트 내보내기에 남지 않는지 확인</w:t>
-      </w:r>
-    </w:p>
-    <w:p>
-      <w:pPr>
-        <w:numPr>
-          <w:ilvl w:val="0"/>
-          <w:numId w:val="10"/>
-        </w:numPr>
-      </w:pPr>
-      <w:r>
-        <w:rPr>
-          <w:rFonts w:ascii="맑은 고딕" w:hAnsi="맑은 고딕" w:eastAsia="맑은 고딕" w:cs="맑은 고딕"/>
-        </w:rPr>
-        <w:t>Viewer 종료 후 재실행 시 감시 공백이 표시되는지 확인</w:t>
-      </w:r>
-    </w:p>
-    <w:p>
-      <w:pPr>
-        <w:numPr>
-          <w:ilvl w:val="0"/>
-          <w:numId w:val="10"/>
-        </w:numPr>
-      </w:pPr>
-      <w:r>
-        <w:rPr>
-          <w:rFonts w:ascii="맑은 고딕" w:hAnsi="맑은 고딕" w:eastAsia="맑은 고딕" w:cs="맑은 고딕"/>
-        </w:rPr>
-        <w:t>익명 모의 출력으로 업링크 Down·복구·중복 팝업 억제를 확인하고 실제 모델은 사내 관리망에서 읽기 전용 검증</w:t>
+        <w:t>민감 출력 비저장·Viewer 재실행·장애/복구·중복 억제는 모의 검증 후 사내 장비로 확인</w:t>
       </w:r>
     </w:p>
     <w:sectPr>
@@ -7533,7 +8154,7 @@
         <w:color w:val="64748B"/>
         <w:sz w:val="17"/>
       </w:rPr>
-      <w:t xml:space="preserve">v0.9.17-poc  |  </w:t>
+      <w:t xml:space="preserve">v0.9.18-poc  |  </w:t>
     </w:r>
     <w:r>
       <w:rPr>
@@ -7564,7 +8185,7 @@
         <w:color w:val="64748B"/>
         <w:sz w:val="17"/>
       </w:rPr>
-      <w:t>v0.9.17-poc  |  2026-07-27</w:t>
+      <w:t>v0.9.18-poc  |  2026-07-28</w:t>
     </w:r>
   </w:p>
 </w:ftr>

</xml_diff>

<commit_message>
fix: harden deployment recovery and diagnostics (#28)
</commit_message>
<xml_diff>
--- a/docs/SamsungSwitchWatch_User_Manual_KO.docx
+++ b/docs/SamsungSwitchWatch_User_Manual_KO.docx
@@ -533,7 +533,7 @@
         <w:rPr>
           <w:rFonts w:ascii="맑은 고딕" w:hAnsi="맑은 고딕" w:eastAsia="맑은 고딕" w:cs="맑은 고딕"/>
         </w:rPr>
-        <w:t>Viewer PC에서 Viewer ZIP을 풀고 Install-or-Update-Viewer.cmd를 실행합니다.</w:t>
+        <w:t>Viewer PC에서 Viewer ZIP을 풀고 Install-or-Update-Viewer.cmd를 실행한 뒤 UAC를 승인합니다.</w:t>
       </w:r>
     </w:p>
     <w:p>
@@ -969,10 +969,12 @@
           <w:ilvl w:val="0"/>
           <w:numId w:val="10"/>
         </w:numPr>
+        <w:spacing w:before="0" w:after="120" w:line="300" w:lineRule="auto"/>
       </w:pPr>
       <w:r>
         <w:rPr>
           <w:rFonts w:ascii="맑은 고딕" w:hAnsi="맑은 고딕" w:eastAsia="맑은 고딕" w:cs="맑은 고딕"/>
+          <w:sz w:val="22"/>
         </w:rPr>
         <w:t>Agent는 Windows 서비스로 실행되어 RDP 종료나 사용자 로그오프 뒤에도 계속 대기합니다.</w:t>
       </w:r>
@@ -983,10 +985,12 @@
           <w:ilvl w:val="0"/>
           <w:numId w:val="10"/>
         </w:numPr>
+        <w:spacing w:before="0" w:after="120" w:line="300" w:lineRule="auto"/>
       </w:pPr>
       <w:r>
         <w:rPr>
           <w:rFonts w:ascii="맑은 고딕" w:hAnsi="맑은 고딕" w:eastAsia="맑은 고딕" w:cs="맑은 고딕"/>
+          <w:sz w:val="22"/>
         </w:rPr>
         <w:t>Agent는 장비 목록, Telnet 계정, 수동 명령 원문, 스위치 출력 원문을 보관하지 않습니다.</w:t>
       </w:r>
@@ -997,10 +1001,12 @@
           <w:ilvl w:val="0"/>
           <w:numId w:val="10"/>
         </w:numPr>
+        <w:spacing w:before="0" w:after="120" w:line="300" w:lineRule="auto"/>
       </w:pPr>
       <w:r>
         <w:rPr>
           <w:rFonts w:ascii="맑은 고딕" w:hAnsi="맑은 고딕" w:eastAsia="맑은 고딕" w:cs="맑은 고딕"/>
+          <w:sz w:val="22"/>
         </w:rPr>
         <w:t>일반 사용자가 볼 수 있는 Agent 창이나 트레이 아이콘은 없습니다.</w:t>
       </w:r>
@@ -1011,12 +1017,14 @@
           <w:ilvl w:val="0"/>
           <w:numId w:val="10"/>
         </w:numPr>
+        <w:spacing w:before="0" w:after="120" w:line="300" w:lineRule="auto"/>
       </w:pPr>
       <w:r>
         <w:rPr>
           <w:rFonts w:ascii="맑은 고딕" w:hAnsi="맑은 고딕" w:eastAsia="맑은 고딕" w:cs="맑은 고딕"/>
+          <w:sz w:val="22"/>
         </w:rPr>
-        <w:t>Viewer는 일반 사용자 권한으로 실행하며, 현재 Windows 사용자 범위에서만 계정을 복호화합니다.</w:t>
+        <w:t>Viewer 프로그램은 Program Files에 설치되지만 일반 사용자 권한으로 실행하며, 현재 Windows 사용자 범위에서만 계정을 복호화합니다.</w:t>
       </w:r>
     </w:p>
     <w:p>
@@ -1295,7 +1303,7 @@
           <w:color w:val="16324F"/>
           <w:sz w:val="21"/>
         </w:rPr>
-        <w:t>Viewer PC 또는 스위치 주소가 바뀌면 현재 Agent와 같은 버전 ZIP의 Configure-Agent-Allowed-IPs.cmd를 실행합니다. 일반 IPv4만 입력하며 내부에서 정확한 /32 정책으로 변환합니다. DHCP 또는 32대를 넘는 장비는 INSTALL_KO.md의 고급 CIDR 절차를 사용하세요.</w:t>
+        <w:t>Viewer PC 또는 스위치 주소가 바뀌면 현재 Agent와 같은 버전 ZIP의 Configure-Agent-Allowed-IPs.cmd를 실행합니다. 일반 IPv4만 입력하며 내부에서 정확한 /32 정책으로 변환합니다. DHCP 또는 32대를 넘는 장비는 INSTALL_KO.md의 고급 CIDR 절차를 사용하세요. 기존 값과 같아도 서비스, TCP/18443 listener, 방화벽, 활성 프로필과 live/ready를 확인해 정상일 때만 변경 없음으로 끝납니다.</w:t>
       </w:r>
     </w:p>
     <w:p>
@@ -1328,7 +1336,7 @@
           <w:color w:val="16324F"/>
           <w:sz w:val="21"/>
         </w:rPr>
-        <w:t>관리자 설치 창에 Agent installation failed가 표시되면 Cause 줄을 먼저 확인하세요. 설치 성공 뒤 AGENT_CONNECTION_REFUSED가 보이면 Viewer에 스위치 IP, Viewer PC 주소 또는 localhost가 아니라 Agent를 설치한 PC 주소를 입력했는지 먼저 확인하세요. 그 다음 SamsungSwitchWatchAgent 서비스와 TCP/18443을 점검합니다. 서비스를 수동 등록하지 말고 0.9.17-poc Agent 설치기를 사용하세요.</w:t>
+        <w:t>관리자 설치 창에 Agent installation failed가 표시되면 Cause 줄을 먼저 확인하세요. 설치 성공 뒤 AGENT_CONNECTION_REFUSED가 보이면 Viewer에 스위치 IP, Viewer PC 주소 또는 localhost가 아니라 Agent를 설치한 PC 주소를 입력했는지 먼저 확인하세요. 그 다음 SamsungSwitchWatchAgent 서비스와 TCP/18443을 점검합니다. 서비스를 수동 등록하지 말고 0.9.18-poc Agent 설치기를 사용하세요.</w:t>
       </w:r>
     </w:p>
     <w:p>
@@ -1375,7 +1383,7 @@
         <w:rPr>
           <w:rFonts w:ascii="맑은 고딕" w:hAnsi="맑은 고딕" w:eastAsia="맑은 고딕" w:cs="맑은 고딕"/>
         </w:rPr>
-        <w:t>Install-or-Update-Viewer.cmd를 더블클릭합니다. 관리자 권한은 필요하지 않습니다.</w:t>
+        <w:t>Install-or-Update-Viewer.cmd를 더블클릭하고 Program Files 설치를 위한 UAC를 승인합니다.</w:t>
       </w:r>
     </w:p>
     <w:p>
@@ -1389,7 +1397,35 @@
         <w:rPr>
           <w:rFonts w:ascii="맑은 고딕" w:hAnsi="맑은 고딕" w:eastAsia="맑은 고딕" w:cs="맑은 고딕"/>
         </w:rPr>
-        <w:t>설치 완료 뒤 Viewer가 실행되고 다음 Windows 로그인부터 자동 시작되는지 확인합니다.</w:t>
+        <w:t>설치 완료 뒤 Viewer가 일반 사용자 권한으로 실행되고 다음 Windows 로그인부터 자동 시작되는지 확인합니다.</w:t>
+      </w:r>
+    </w:p>
+    <w:p>
+      <w:pPr>
+        <w:keepLines/>
+        <w:spacing w:before="80" w:after="160" w:line="283" w:lineRule="auto"/>
+        <w:ind w:left="115" w:right="58"/>
+        <w:shd w:fill="E8EEF5"/>
+        <w:pBdr>
+          <w:left w:val="single" w:sz="16" w:space="8" w:color="2E74B5"/>
+        </w:pBdr>
+      </w:pPr>
+      <w:r>
+        <w:rPr>
+          <w:rFonts w:ascii="맑은 고딕" w:hAnsi="맑은 고딕" w:eastAsia="맑은 고딕" w:cs="맑은 고딕"/>
+          <w:b/>
+          <w:color w:val="2E74B5"/>
+          <w:sz w:val="21"/>
+        </w:rPr>
+        <w:t xml:space="preserve">프로그램과 사용자 데이터 분리  </w:t>
+      </w:r>
+      <w:r>
+        <w:rPr>
+          <w:rFonts w:ascii="맑은 고딕" w:hAnsi="맑은 고딕" w:eastAsia="맑은 고딕" w:cs="맑은 고딕"/>
+          <w:color w:val="16324F"/>
+          <w:sz w:val="21"/>
+        </w:rPr>
+        <w:t>프로그램은 C:\Program Files\SamsungSwitchWatch\Viewer에 설치합니다. 장비 목록, DPAPI 자격 증명, 감시 이력과 화면 설정은 설치를 시작한 원래 사용자의 %LOCALAPPDATA%\SamsungSwitchWatch에 그대로 보존합니다. 관리자 단계가 성공한 뒤에만 원래 사용자 단계에서 바로 가기와 자동 시작을 반영합니다. 이전 Program Files 버전과 기존 사용자별 프로그램 폴더는 자동 삭제하지 않습니다.</w:t>
       </w:r>
     </w:p>
     <w:p>
@@ -1417,7 +1453,7 @@
           <w:color w:val="16324F"/>
           <w:sz w:val="21"/>
         </w:rPr>
-        <w:t>설치 창의 Cause, Detail, 선택적 ExitCode, Recovery와 두 진단 경로를 확인하세요. PREVIOUS_VIEWER_RESTORED이면 시작 메뉴에서 Viewer를 다시 실행합니다. ROLLBACK_INCOMPLETE이면 백업과 진단 파일을 보존하고 Windows 관리자에게 전달하세요. 자세한 코드는 INSTALL_KO.md를 확인하세요.</w:t>
+        <w:t>설치 창의 Cause, Detail, 선택적 ExitCode, Recovery와 두 진단 경로를 확인하세요. PREVIOUS_VIEWER_RESTORED이면 시작 메뉴에서 Viewer를 다시 실행합니다. ROLLBACK_INCOMPLETE이면 백업과 진단 파일을 보존하고 Windows 관리자에게 전달하세요. Program Files 실행이 차단되면 보안 정책을 우회하거나 파일 차단을 해제하지 말고 해당 코드를 EDR·AppLocker·WDAC 담당자에게 전달하세요. 사용자 단계 실패 뒤에는 이전 Program Files 버전 복구 UAC가 한 번 더 표시될 수 있습니다. 취소하거나 실패하면 Viewer.__rollback을 삭제하지 마세요. 새 설치 파일이나 매니페스트가 EDR에 의해 격리 또는 손상돼도 보호된 현재 설치를 격리한 뒤 검증된 rollback 슬롯을 먼저 복원합니다. 제거 중 Viewer 프로세스나 활성 프로그램 폴더가 남으면 rollback 슬롯을 삭제하지 않습니다. 자세한 코드는 INSTALL_KO.md를 확인하세요.</w:t>
       </w:r>
     </w:p>
     <w:p>
@@ -1445,12 +1481,7 @@
           <w:color w:val="16324F"/>
           <w:sz w:val="21"/>
         </w:rPr>
-        <w:t>설치 전 검사, 설치 위치 또는 자동 시작 상태를 직접 지정할 때만 INSTALL_KO.md의 install-viewer.ps1 옵션을 사용하세요.</w:t>
-      </w:r>
-    </w:p>
-    <w:p>
-      <w:r>
-        <w:br w:type="page"/>
+        <w:t>설치 전 검사, 설치 위치 또는 자동 시작 상태를 직접 지정할 때만 INSTALL_KO.md의 install-viewer.ps1 옵션을 사용하세요. 기존 사용자별 설치는 -PerUser를 명시하는 호환 경로이며 기본 설치가 아닙니다.</w:t>
       </w:r>
     </w:p>
     <w:p>
@@ -1527,10 +1558,12 @@
           <w:ilvl w:val="0"/>
           <w:numId w:val="10"/>
         </w:numPr>
+        <w:spacing w:before="0" w:after="120" w:line="300" w:lineRule="auto"/>
       </w:pPr>
       <w:r>
         <w:rPr>
           <w:rFonts w:ascii="맑은 고딕" w:hAnsi="맑은 고딕" w:eastAsia="맑은 고딕" w:cs="맑은 고딕"/>
+          <w:sz w:val="22"/>
         </w:rPr>
         <w:t>Agent를 설치한 원격 PC의 IPv4 또는 사내 DNS 이름만 입력합니다.</w:t>
       </w:r>
@@ -1541,10 +1574,12 @@
           <w:ilvl w:val="0"/>
           <w:numId w:val="10"/>
         </w:numPr>
+        <w:spacing w:before="0" w:after="120" w:line="300" w:lineRule="auto"/>
       </w:pPr>
       <w:r>
         <w:rPr>
           <w:rFonts w:ascii="맑은 고딕" w:hAnsi="맑은 고딕" w:eastAsia="맑은 고딕" w:cs="맑은 고딕"/>
+          <w:sz w:val="22"/>
         </w:rPr>
         <w:t>스위치 IP, Viewer PC 주소와 localhost는 Agent와 Viewer가 같은 PC가 아닌 한 입력하지 않습니다.</w:t>
       </w:r>
@@ -1555,10 +1590,12 @@
           <w:ilvl w:val="0"/>
           <w:numId w:val="10"/>
         </w:numPr>
+        <w:spacing w:before="0" w:after="120" w:line="300" w:lineRule="auto"/>
       </w:pPr>
       <w:r>
         <w:rPr>
           <w:rFonts w:ascii="맑은 고딕" w:hAnsi="맑은 고딕" w:eastAsia="맑은 고딕" w:cs="맑은 고딕"/>
+          <w:sz w:val="22"/>
         </w:rPr>
         <w:t>https://, 포트, 인증서 SHA-256 지문, 페어링 토큰은 입력하지 않습니다.</w:t>
       </w:r>
@@ -1569,10 +1606,12 @@
           <w:ilvl w:val="0"/>
           <w:numId w:val="10"/>
         </w:numPr>
+        <w:spacing w:before="0" w:after="120" w:line="300" w:lineRule="auto"/>
       </w:pPr>
       <w:r>
         <w:rPr>
           <w:rFonts w:ascii="맑은 고딕" w:hAnsi="맑은 고딕" w:eastAsia="맑은 고딕" w:cs="맑은 고딕"/>
+          <w:sz w:val="22"/>
         </w:rPr>
         <w:t>정상 Agent 교체나 재설치가 확실할 때만 '이 Agent로 다시 연결'을 사용합니다.</w:t>
       </w:r>
@@ -2771,10 +2810,12 @@
           <w:ilvl w:val="0"/>
           <w:numId w:val="10"/>
         </w:numPr>
+        <w:spacing w:before="0" w:after="120" w:line="300" w:lineRule="auto"/>
       </w:pPr>
       <w:r>
         <w:rPr>
           <w:rFonts w:ascii="맑은 고딕" w:hAnsi="맑은 고딕" w:eastAsia="맑은 고딕" w:cs="맑은 고딕"/>
+          <w:sz w:val="22"/>
         </w:rPr>
         <w:t>Enter: 실행, Esc: 취소. 출력 상한은 64KiB이며 복사 버튼은 Windows 클립보드만 사용합니다.</w:t>
       </w:r>
@@ -2785,10 +2826,12 @@
           <w:ilvl w:val="0"/>
           <w:numId w:val="10"/>
         </w:numPr>
+        <w:spacing w:before="0" w:after="120" w:line="300" w:lineRule="auto"/>
       </w:pPr>
       <w:r>
         <w:rPr>
           <w:rFonts w:ascii="맑은 고딕" w:hAnsi="맑은 고딕" w:eastAsia="맑은 고딕" w:cs="맑은 고딕"/>
+          <w:sz w:val="22"/>
         </w:rPr>
         <w:t>완료 줄에는 처리 시간과 세션 횟수, 재연결이 있었다면 재연결 횟수도 표시됩니다.</w:t>
       </w:r>
@@ -2799,10 +2842,12 @@
           <w:ilvl w:val="0"/>
           <w:numId w:val="10"/>
         </w:numPr>
+        <w:spacing w:before="0" w:after="120" w:line="300" w:lineRule="auto"/>
       </w:pPr>
       <w:r>
         <w:rPr>
           <w:rFonts w:ascii="맑은 고딕" w:hAnsi="맑은 고딕" w:eastAsia="맑은 고딕" w:cs="맑은 고딕"/>
+          <w:sz w:val="22"/>
         </w:rPr>
         <w:t>수동 명령 원문과 출력은 Viewer 프로세스가 종료되면 사라지며 파일이나 Agent에 저장되지 않습니다.</w:t>
       </w:r>
@@ -3144,10 +3189,12 @@
           <w:ilvl w:val="0"/>
           <w:numId w:val="10"/>
         </w:numPr>
+        <w:spacing w:before="0" w:after="120" w:line="300" w:lineRule="auto"/>
       </w:pPr>
       <w:r>
         <w:rPr>
           <w:rFonts w:ascii="맑은 고딕" w:hAnsi="맑은 고딕" w:eastAsia="맑은 고딕" w:cs="맑은 고딕"/>
+          <w:sz w:val="22"/>
         </w:rPr>
         <w:t>최초 정상 결과는 기준선으로만 저장하며 기존 로그를 새 이벤트로 알리지 않습니다.</w:t>
       </w:r>
@@ -3158,10 +3205,12 @@
           <w:ilvl w:val="0"/>
           <w:numId w:val="10"/>
         </w:numPr>
+        <w:spacing w:before="0" w:after="120" w:line="300" w:lineRule="auto"/>
       </w:pPr>
       <w:r>
         <w:rPr>
           <w:rFonts w:ascii="맑은 고딕" w:hAnsi="맑은 고딕" w:eastAsia="맑은 고딕" w:cs="맑은 고딕"/>
+          <w:sz w:val="22"/>
         </w:rPr>
         <w:t>포트 상태는 의미 있는 필드로 비교합니다. 최초 Down은 기존 상태로 보고, 이후 Up → Down과 Down → Up만 표시합니다.</w:t>
       </w:r>
@@ -3172,10 +3221,12 @@
           <w:ilvl w:val="0"/>
           <w:numId w:val="10"/>
         </w:numPr>
+        <w:spacing w:before="0" w:after="120" w:line="300" w:lineRule="auto"/>
       </w:pPr>
       <w:r>
         <w:rPr>
           <w:rFonts w:ascii="맑은 고딕" w:hAnsi="맑은 고딕" w:eastAsia="맑은 고딕" w:cs="맑은 고딕"/>
+          <w:sz w:val="22"/>
         </w:rPr>
         <w:t>중요 업링크로 지정되지 않은 일반 포트 변화는 장애가 아닌 경고로 표시하며, 케이블·상대 장비와 실제 사용 여부를 확인합니다.</w:t>
       </w:r>
@@ -3186,10 +3237,12 @@
           <w:ilvl w:val="0"/>
           <w:numId w:val="10"/>
         </w:numPr>
+        <w:spacing w:before="0" w:after="120" w:line="300" w:lineRule="auto"/>
       </w:pPr>
       <w:r>
         <w:rPr>
           <w:rFonts w:ascii="맑은 고딕" w:hAnsi="맑은 고딕" w:eastAsia="맑은 고딕" w:cs="맑은 고딕"/>
+          <w:sz w:val="22"/>
         </w:rPr>
         <w:t>로그는 저장된 식별 해시와 비교해 새 항목만 이벤트로 만듭니다.</w:t>
       </w:r>
@@ -3200,10 +3253,12 @@
           <w:ilvl w:val="0"/>
           <w:numId w:val="10"/>
         </w:numPr>
+        <w:spacing w:before="0" w:after="120" w:line="300" w:lineRule="auto"/>
       </w:pPr>
       <w:r>
         <w:rPr>
           <w:rFonts w:ascii="맑은 고딕" w:hAnsi="맑은 고딕" w:eastAsia="맑은 고딕" w:cs="맑은 고딕"/>
+          <w:sz w:val="22"/>
         </w:rPr>
         <w:t>주기 감시 저장소에는 기준 해시, 이벤트와 상태만 남고 Telnet 원문은 남지 않습니다.</w:t>
       </w:r>
@@ -3214,10 +3269,12 @@
           <w:ilvl w:val="0"/>
           <w:numId w:val="10"/>
         </w:numPr>
+        <w:spacing w:before="0" w:after="120" w:line="300" w:lineRule="auto"/>
       </w:pPr>
       <w:r>
         <w:rPr>
           <w:rFonts w:ascii="맑은 고딕" w:hAnsi="맑은 고딕" w:eastAsia="맑은 고딕" w:cs="맑은 고딕"/>
+          <w:sz w:val="22"/>
         </w:rPr>
         <w:t>같은 장애가 계속되면 반복 팝업 대신 지속 상태를 유지하고, 정상화되면 복구 이벤트를 만듭니다.</w:t>
       </w:r>
@@ -3809,10 +3866,12 @@
           <w:ilvl w:val="0"/>
           <w:numId w:val="10"/>
         </w:numPr>
+        <w:spacing w:before="0" w:after="120" w:line="300" w:lineRule="auto"/>
       </w:pPr>
       <w:r>
         <w:rPr>
           <w:rFonts w:ascii="맑은 고딕" w:hAnsi="맑은 고딕" w:eastAsia="맑은 고딕" w:cs="맑은 고딕"/>
+          <w:sz w:val="22"/>
         </w:rPr>
         <w:t>Agent 연결이 끊겼다고 모든 스위치를 Down으로 바꾸지 않습니다. 마지막 상태를 유지하고 '미확인'으로 표시합니다.</w:t>
       </w:r>
@@ -3823,10 +3882,12 @@
           <w:ilvl w:val="0"/>
           <w:numId w:val="10"/>
         </w:numPr>
+        <w:spacing w:before="0" w:after="120" w:line="300" w:lineRule="auto"/>
       </w:pPr>
       <w:r>
         <w:rPr>
           <w:rFonts w:ascii="맑은 고딕" w:hAnsi="맑은 고딕" w:eastAsia="맑은 고딕" w:cs="맑은 고딕"/>
+          <w:sz w:val="22"/>
         </w:rPr>
         <w:t>이벤트 확인은 복구가 아니며, CSV/JSON 내보내기는 이벤트만 익명화하고 수동 명령 출력은 제외합니다.</w:t>
       </w:r>
@@ -3966,10 +4027,12 @@
           <w:ilvl w:val="0"/>
           <w:numId w:val="10"/>
         </w:numPr>
+        <w:spacing w:before="0" w:after="120" w:line="300" w:lineRule="auto"/>
       </w:pPr>
       <w:r>
         <w:rPr>
           <w:rFonts w:ascii="맑은 고딕" w:hAnsi="맑은 고딕" w:eastAsia="맑은 고딕" w:cs="맑은 고딕"/>
+          <w:sz w:val="22"/>
         </w:rPr>
         <w:t>핀 버튼: 다른 일반 창보다 위에 표시</w:t>
       </w:r>
@@ -3980,10 +4043,12 @@
           <w:ilvl w:val="0"/>
           <w:numId w:val="10"/>
         </w:numPr>
+        <w:spacing w:before="0" w:after="120" w:line="300" w:lineRule="auto"/>
       </w:pPr>
       <w:r>
         <w:rPr>
           <w:rFonts w:ascii="맑은 고딕" w:hAnsi="맑은 고딕" w:eastAsia="맑은 고딕" w:cs="맑은 고딕"/>
+          <w:sz w:val="22"/>
         </w:rPr>
         <w:t>대시보드 열기: 전체 상태와 변경 이력 확인</w:t>
       </w:r>
@@ -3994,10 +4059,12 @@
           <w:ilvl w:val="0"/>
           <w:numId w:val="10"/>
         </w:numPr>
+        <w:spacing w:before="0" w:after="120" w:line="300" w:lineRule="auto"/>
       </w:pPr>
       <w:r>
         <w:rPr>
           <w:rFonts w:ascii="맑은 고딕" w:hAnsi="맑은 고딕" w:eastAsia="맑은 고딕" w:cs="맑은 고딕"/>
+          <w:sz w:val="22"/>
         </w:rPr>
         <w:t>새로고침: Viewer에서 즉시 상태 요청</w:t>
       </w:r>
@@ -4008,10 +4075,12 @@
           <w:ilvl w:val="0"/>
           <w:numId w:val="10"/>
         </w:numPr>
+        <w:spacing w:before="0" w:after="120" w:line="300" w:lineRule="auto"/>
       </w:pPr>
       <w:r>
         <w:rPr>
           <w:rFonts w:ascii="맑은 고딕" w:hAnsi="맑은 고딕" w:eastAsia="맑은 고딕" w:cs="맑은 고딕"/>
+          <w:sz w:val="22"/>
         </w:rPr>
         <w:t>같은 장애 지속 중에는 팝업을 반복하지 않고 복구 시 별도 알림</w:t>
       </w:r>
@@ -4022,10 +4091,12 @@
           <w:ilvl w:val="0"/>
           <w:numId w:val="10"/>
         </w:numPr>
+        <w:spacing w:before="0" w:after="120" w:line="300" w:lineRule="auto"/>
       </w:pPr>
       <w:r>
         <w:rPr>
           <w:rFonts w:ascii="맑은 고딕" w:hAnsi="맑은 고딕" w:eastAsia="맑은 고딕" w:cs="맑은 고딕"/>
+          <w:sz w:val="22"/>
         </w:rPr>
         <w:t>팝업 위에 마우스를 두거나 키보드 포커스가 있으면 읽는 동안 자동으로 닫히지 않음</w:t>
       </w:r>
@@ -4180,7 +4251,7 @@
                 <w:rFonts w:ascii="맑은 고딕" w:hAnsi="맑은 고딕" w:eastAsia="맑은 고딕" w:cs="맑은 고딕"/>
                 <w:sz w:val="18"/>
               </w:rPr>
-              <w:t>장비명·모델·IPv4</w:t>
+              <w:t>Viewer 프로그램</w:t>
             </w:r>
           </w:p>
         </w:tc>
@@ -4205,7 +4276,9 @@
                 <w:rFonts w:ascii="맑은 고딕" w:hAnsi="맑은 고딕" w:eastAsia="맑은 고딕" w:cs="맑은 고딕"/>
                 <w:sz w:val="18"/>
               </w:rPr>
-              <w:t>Viewer 사용자 프로필</w:t>
+              <w:t>C:\Program Files\</w:t>
+              <w:br/>
+              <w:t>SamsungSwitchWatch\Viewer</w:t>
             </w:r>
           </w:p>
         </w:tc>
@@ -4230,7 +4303,7 @@
                 <w:rFonts w:ascii="맑은 고딕" w:hAnsi="맑은 고딕" w:eastAsia="맑은 고딕" w:cs="맑은 고딕"/>
                 <w:sz w:val="18"/>
               </w:rPr>
-              <w:t>현재 Windows 사용자 범위</w:t>
+              <w:t>UAC 설치, 일반 사용자 권한으로 실행</w:t>
             </w:r>
           </w:p>
         </w:tc>
@@ -4258,7 +4331,7 @@
                 <w:rFonts w:ascii="맑은 고딕" w:hAnsi="맑은 고딕" w:eastAsia="맑은 고딕" w:cs="맑은 고딕"/>
                 <w:sz w:val="18"/>
               </w:rPr>
-              <w:t>ID·로그인 PW·enable PW</w:t>
+              <w:t>장비명·모델·IPv4</w:t>
             </w:r>
           </w:p>
         </w:tc>
@@ -4310,7 +4383,7 @@
                 <w:rFonts w:ascii="맑은 고딕" w:hAnsi="맑은 고딕" w:eastAsia="맑은 고딕" w:cs="맑은 고딕"/>
                 <w:sz w:val="18"/>
               </w:rPr>
-              <w:t>DPAPI CurrentUser 암호화</w:t>
+              <w:t>현재 Windows 사용자 범위</w:t>
             </w:r>
           </w:p>
         </w:tc>
@@ -4337,7 +4410,7 @@
                 <w:rFonts w:ascii="맑은 고딕" w:hAnsi="맑은 고딕" w:eastAsia="맑은 고딕" w:cs="맑은 고딕"/>
                 <w:sz w:val="18"/>
               </w:rPr>
-              <w:t>주기 감시 기준 해시·이벤트</w:t>
+              <w:t>ID·로그인 PW·enable PW</w:t>
             </w:r>
           </w:p>
         </w:tc>
@@ -4387,7 +4460,7 @@
                 <w:rFonts w:ascii="맑은 고딕" w:hAnsi="맑은 고딕" w:eastAsia="맑은 고딕" w:cs="맑은 고딕"/>
                 <w:sz w:val="18"/>
               </w:rPr>
-              <w:t>원문 없이 로컬 저장</w:t>
+              <w:t>DPAPI CurrentUser 암호화</w:t>
             </w:r>
           </w:p>
         </w:tc>
@@ -4415,7 +4488,7 @@
                 <w:rFonts w:ascii="맑은 고딕" w:hAnsi="맑은 고딕" w:eastAsia="맑은 고딕" w:cs="맑은 고딕"/>
                 <w:sz w:val="18"/>
               </w:rPr>
-              <w:t>수동 show 입력·출력</w:t>
+              <w:t>주기 감시 기준 해시·이벤트</w:t>
             </w:r>
           </w:p>
         </w:tc>
@@ -4441,6 +4514,84 @@
                 <w:rFonts w:ascii="맑은 고딕" w:hAnsi="맑은 고딕" w:eastAsia="맑은 고딕" w:cs="맑은 고딕"/>
                 <w:sz w:val="18"/>
               </w:rPr>
+              <w:t>Viewer 사용자 프로필</w:t>
+            </w:r>
+          </w:p>
+        </w:tc>
+        <w:tc>
+          <w:tcPr>
+            <w:tcW w:type="dxa" w:w="4160"/>
+            <w:shd w:fill="FAFBFC"/>
+            <w:tcMar>
+              <w:top w:w="80" w:type="dxa"/>
+              <w:start w:w="120" w:type="dxa"/>
+              <w:bottom w:w="80" w:type="dxa"/>
+              <w:end w:w="120" w:type="dxa"/>
+            </w:tcMar>
+            <w:vAlign w:val="center"/>
+          </w:tcPr>
+          <w:p>
+            <w:pPr>
+              <w:spacing w:before="0" w:after="0" w:line="269" w:lineRule="auto"/>
+              <w:jc w:val="left"/>
+            </w:pPr>
+            <w:r>
+              <w:rPr>
+                <w:rFonts w:ascii="맑은 고딕" w:hAnsi="맑은 고딕" w:eastAsia="맑은 고딕" w:cs="맑은 고딕"/>
+                <w:sz w:val="18"/>
+              </w:rPr>
+              <w:t>원문 없이 로컬 저장</w:t>
+            </w:r>
+          </w:p>
+        </w:tc>
+      </w:tr>
+      <w:tr>
+        <w:tc>
+          <w:tcPr>
+            <w:tcW w:type="dxa" w:w="2200"/>
+            <w:tcMar>
+              <w:top w:w="80" w:type="dxa"/>
+              <w:start w:w="120" w:type="dxa"/>
+              <w:bottom w:w="80" w:type="dxa"/>
+              <w:end w:w="120" w:type="dxa"/>
+            </w:tcMar>
+            <w:vAlign w:val="center"/>
+          </w:tcPr>
+          <w:p>
+            <w:pPr>
+              <w:spacing w:before="0" w:after="0" w:line="269" w:lineRule="auto"/>
+              <w:jc w:val="center"/>
+            </w:pPr>
+            <w:r>
+              <w:rPr>
+                <w:rFonts w:ascii="맑은 고딕" w:hAnsi="맑은 고딕" w:eastAsia="맑은 고딕" w:cs="맑은 고딕"/>
+                <w:sz w:val="18"/>
+              </w:rPr>
+              <w:t>수동 show 입력·출력</w:t>
+            </w:r>
+          </w:p>
+        </w:tc>
+        <w:tc>
+          <w:tcPr>
+            <w:tcW w:type="dxa" w:w="3000"/>
+            <w:tcMar>
+              <w:top w:w="80" w:type="dxa"/>
+              <w:start w:w="120" w:type="dxa"/>
+              <w:bottom w:w="80" w:type="dxa"/>
+              <w:end w:w="120" w:type="dxa"/>
+            </w:tcMar>
+            <w:vAlign w:val="center"/>
+          </w:tcPr>
+          <w:p>
+            <w:pPr>
+              <w:spacing w:before="0" w:after="0" w:line="269" w:lineRule="auto"/>
+              <w:jc w:val="left"/>
+            </w:pPr>
+            <w:r>
+              <w:rPr>
+                <w:rFonts w:ascii="맑은 고딕" w:hAnsi="맑은 고딕" w:eastAsia="맑은 고딕" w:cs="맑은 고딕"/>
+                <w:sz w:val="18"/>
+              </w:rPr>
               <w:t>Viewer 프로세스 메모리</w:t>
             </w:r>
           </w:p>
@@ -4448,7 +4599,6 @@
         <w:tc>
           <w:tcPr>
             <w:tcW w:type="dxa" w:w="4160"/>
-            <w:shd w:fill="FAFBFC"/>
             <w:tcMar>
               <w:top w:w="80" w:type="dxa"/>
               <w:start w:w="120" w:type="dxa"/>
@@ -4476,6 +4626,7 @@
         <w:tc>
           <w:tcPr>
             <w:tcW w:type="dxa" w:w="2200"/>
+            <w:shd w:fill="FAFBFC"/>
             <w:tcMar>
               <w:top w:w="80" w:type="dxa"/>
               <w:start w:w="120" w:type="dxa"/>
@@ -4495,86 +4646,6 @@
                 <w:sz w:val="18"/>
               </w:rPr>
               <w:t>Agent HTTPS 신원</w:t>
-            </w:r>
-          </w:p>
-        </w:tc>
-        <w:tc>
-          <w:tcPr>
-            <w:tcW w:type="dxa" w:w="3000"/>
-            <w:tcMar>
-              <w:top w:w="80" w:type="dxa"/>
-              <w:start w:w="120" w:type="dxa"/>
-              <w:bottom w:w="80" w:type="dxa"/>
-              <w:end w:w="120" w:type="dxa"/>
-            </w:tcMar>
-            <w:vAlign w:val="center"/>
-          </w:tcPr>
-          <w:p>
-            <w:pPr>
-              <w:spacing w:before="0" w:after="0" w:line="269" w:lineRule="auto"/>
-              <w:jc w:val="left"/>
-            </w:pPr>
-            <w:r>
-              <w:rPr>
-                <w:rFonts w:ascii="맑은 고딕" w:hAnsi="맑은 고딕" w:eastAsia="맑은 고딕" w:cs="맑은 고딕"/>
-                <w:sz w:val="18"/>
-              </w:rPr>
-              <w:t>%ProgramData%\</w:t>
-              <w:br/>
-              <w:t>SamsungSwitchWatch</w:t>
-            </w:r>
-          </w:p>
-        </w:tc>
-        <w:tc>
-          <w:tcPr>
-            <w:tcW w:type="dxa" w:w="4160"/>
-            <w:tcMar>
-              <w:top w:w="80" w:type="dxa"/>
-              <w:start w:w="120" w:type="dxa"/>
-              <w:bottom w:w="80" w:type="dxa"/>
-              <w:end w:w="120" w:type="dxa"/>
-            </w:tcMar>
-            <w:vAlign w:val="center"/>
-          </w:tcPr>
-          <w:p>
-            <w:pPr>
-              <w:spacing w:before="0" w:after="0" w:line="269" w:lineRule="auto"/>
-              <w:jc w:val="left"/>
-            </w:pPr>
-            <w:r>
-              <w:rPr>
-                <w:rFonts w:ascii="맑은 고딕" w:hAnsi="맑은 고딕" w:eastAsia="맑은 고딕" w:cs="맑은 고딕"/>
-                <w:sz w:val="18"/>
-              </w:rPr>
-              <w:t>DPAPI LocalMachine + SYSTEM/Administrators/서비스 SID ACL</w:t>
-            </w:r>
-          </w:p>
-        </w:tc>
-      </w:tr>
-      <w:tr>
-        <w:tc>
-          <w:tcPr>
-            <w:tcW w:type="dxa" w:w="2200"/>
-            <w:shd w:fill="FAFBFC"/>
-            <w:tcMar>
-              <w:top w:w="80" w:type="dxa"/>
-              <w:start w:w="120" w:type="dxa"/>
-              <w:bottom w:w="80" w:type="dxa"/>
-              <w:end w:w="120" w:type="dxa"/>
-            </w:tcMar>
-            <w:vAlign w:val="center"/>
-          </w:tcPr>
-          <w:p>
-            <w:pPr>
-              <w:spacing w:before="0" w:after="0" w:line="269" w:lineRule="auto"/>
-              <w:jc w:val="center"/>
-            </w:pPr>
-            <w:r>
-              <w:rPr>
-                <w:rFonts w:ascii="맑은 고딕" w:hAnsi="맑은 고딕" w:eastAsia="맑은 고딕" w:cs="맑은 고딕"/>
-                <w:sz w:val="18"/>
-              </w:rPr>
-              <w:t>Agent 설치 영수증</w:t>
             </w:r>
           </w:p>
         </w:tc>
@@ -4628,7 +4699,7 @@
                 <w:rFonts w:ascii="맑은 고딕" w:hAnsi="맑은 고딕" w:eastAsia="맑은 고딕" w:cs="맑은 고딕"/>
                 <w:sz w:val="18"/>
               </w:rPr>
-              <w:t>Administrators owner + SYSTEM/Administrators 전용 ACL</w:t>
+              <w:t>DPAPI LocalMachine + SYSTEM/Administrators/서비스 SID ACL</w:t>
             </w:r>
           </w:p>
         </w:tc>
@@ -4655,6 +4726,86 @@
                 <w:rFonts w:ascii="맑은 고딕" w:hAnsi="맑은 고딕" w:eastAsia="맑은 고딕" w:cs="맑은 고딕"/>
                 <w:sz w:val="18"/>
               </w:rPr>
+              <w:t>Agent 설치 영수증</w:t>
+            </w:r>
+          </w:p>
+        </w:tc>
+        <w:tc>
+          <w:tcPr>
+            <w:tcW w:type="dxa" w:w="3000"/>
+            <w:tcMar>
+              <w:top w:w="80" w:type="dxa"/>
+              <w:start w:w="120" w:type="dxa"/>
+              <w:bottom w:w="80" w:type="dxa"/>
+              <w:end w:w="120" w:type="dxa"/>
+            </w:tcMar>
+            <w:vAlign w:val="center"/>
+          </w:tcPr>
+          <w:p>
+            <w:pPr>
+              <w:spacing w:before="0" w:after="0" w:line="269" w:lineRule="auto"/>
+              <w:jc w:val="left"/>
+            </w:pPr>
+            <w:r>
+              <w:rPr>
+                <w:rFonts w:ascii="맑은 고딕" w:hAnsi="맑은 고딕" w:eastAsia="맑은 고딕" w:cs="맑은 고딕"/>
+                <w:sz w:val="18"/>
+              </w:rPr>
+              <w:t>%ProgramData%\</w:t>
+              <w:br/>
+              <w:t>SamsungSwitchWatch</w:t>
+            </w:r>
+          </w:p>
+        </w:tc>
+        <w:tc>
+          <w:tcPr>
+            <w:tcW w:type="dxa" w:w="4160"/>
+            <w:tcMar>
+              <w:top w:w="80" w:type="dxa"/>
+              <w:start w:w="120" w:type="dxa"/>
+              <w:bottom w:w="80" w:type="dxa"/>
+              <w:end w:w="120" w:type="dxa"/>
+            </w:tcMar>
+            <w:vAlign w:val="center"/>
+          </w:tcPr>
+          <w:p>
+            <w:pPr>
+              <w:spacing w:before="0" w:after="0" w:line="269" w:lineRule="auto"/>
+              <w:jc w:val="left"/>
+            </w:pPr>
+            <w:r>
+              <w:rPr>
+                <w:rFonts w:ascii="맑은 고딕" w:hAnsi="맑은 고딕" w:eastAsia="맑은 고딕" w:cs="맑은 고딕"/>
+                <w:sz w:val="18"/>
+              </w:rPr>
+              <w:t>Administrators owner + SYSTEM/Administrators 전용 ACL</w:t>
+            </w:r>
+          </w:p>
+        </w:tc>
+      </w:tr>
+      <w:tr>
+        <w:tc>
+          <w:tcPr>
+            <w:tcW w:type="dxa" w:w="2200"/>
+            <w:shd w:fill="FAFBFC"/>
+            <w:tcMar>
+              <w:top w:w="80" w:type="dxa"/>
+              <w:start w:w="120" w:type="dxa"/>
+              <w:bottom w:w="80" w:type="dxa"/>
+              <w:end w:w="120" w:type="dxa"/>
+            </w:tcMar>
+            <w:vAlign w:val="center"/>
+          </w:tcPr>
+          <w:p>
+            <w:pPr>
+              <w:spacing w:before="0" w:after="0" w:line="269" w:lineRule="auto"/>
+              <w:jc w:val="center"/>
+            </w:pPr>
+            <w:r>
+              <w:rPr>
+                <w:rFonts w:ascii="맑은 고딕" w:hAnsi="맑은 고딕" w:eastAsia="맑은 고딕" w:cs="맑은 고딕"/>
+                <w:sz w:val="18"/>
+              </w:rPr>
               <w:t>장비 계정·스위치 출력</w:t>
             </w:r>
           </w:p>
@@ -4662,6 +4813,7 @@
         <w:tc>
           <w:tcPr>
             <w:tcW w:type="dxa" w:w="3000"/>
+            <w:shd w:fill="FAFBFC"/>
             <w:tcMar>
               <w:top w:w="80" w:type="dxa"/>
               <w:start w:w="120" w:type="dxa"/>
@@ -4687,6 +4839,7 @@
         <w:tc>
           <w:tcPr>
             <w:tcW w:type="dxa" w:w="4160"/>
+            <w:shd w:fill="FAFBFC"/>
             <w:tcMar>
               <w:top w:w="80" w:type="dxa"/>
               <w:start w:w="120" w:type="dxa"/>
@@ -4722,10 +4875,12 @@
           <w:ilvl w:val="0"/>
           <w:numId w:val="10"/>
         </w:numPr>
+        <w:spacing w:before="0" w:after="120" w:line="300" w:lineRule="auto"/>
       </w:pPr>
       <w:r>
         <w:rPr>
           <w:rFonts w:ascii="맑은 고딕" w:hAnsi="맑은 고딕" w:eastAsia="맑은 고딕" w:cs="맑은 고딕"/>
+          <w:sz w:val="22"/>
         </w:rPr>
         <w:t>Viewer 설정 파일을 다른 PC나 다른 Windows 사용자에게 복사해도 계정은 복호화되지 않습니다.</w:t>
       </w:r>
@@ -4736,10 +4891,12 @@
           <w:ilvl w:val="0"/>
           <w:numId w:val="10"/>
         </w:numPr>
+        <w:spacing w:before="0" w:after="120" w:line="300" w:lineRule="auto"/>
       </w:pPr>
       <w:r>
         <w:rPr>
           <w:rFonts w:ascii="맑은 고딕" w:hAnsi="맑은 고딕" w:eastAsia="맑은 고딕" w:cs="맑은 고딕"/>
+          <w:sz w:val="22"/>
         </w:rPr>
         <w:t>진단 파일에는 IP, ID, 비밀번호, 호스트명과 수동 명령 원문을 넣지 않습니다.</w:t>
       </w:r>
@@ -4750,10 +4907,12 @@
           <w:ilvl w:val="0"/>
           <w:numId w:val="10"/>
         </w:numPr>
+        <w:spacing w:before="0" w:after="120" w:line="300" w:lineRule="auto"/>
       </w:pPr>
       <w:r>
         <w:rPr>
           <w:rFonts w:ascii="맑은 고딕" w:hAnsi="맑은 고딕" w:eastAsia="맑은 고딕" w:cs="맑은 고딕"/>
+          <w:sz w:val="22"/>
         </w:rPr>
         <w:t>레거시 백업은 SYSTEM과 로컬 Administrators만 접근할 수 있으며 Agent 서비스 SID에는 권한을 주지 않습니다.</w:t>
       </w:r>
@@ -4764,10 +4923,12 @@
           <w:ilvl w:val="0"/>
           <w:numId w:val="10"/>
         </w:numPr>
+        <w:spacing w:before="0" w:after="120" w:line="300" w:lineRule="auto"/>
       </w:pPr>
       <w:r>
         <w:rPr>
           <w:rFonts w:ascii="맑은 고딕" w:hAnsi="맑은 고딕" w:eastAsia="맑은 고딕" w:cs="맑은 고딕"/>
+          <w:sz w:val="22"/>
         </w:rPr>
         <w:t>대상 정책은 설치 설정, Viewer 접근 정책은 제품 소유 방화벽 규칙이 권한원이며 설치 영수증에서 복원하지 않습니다.</w:t>
       </w:r>
@@ -4778,10 +4939,12 @@
           <w:ilvl w:val="0"/>
           <w:numId w:val="10"/>
         </w:numPr>
+        <w:spacing w:before="0" w:after="120" w:line="300" w:lineRule="auto"/>
       </w:pPr>
       <w:r>
         <w:rPr>
           <w:rFonts w:ascii="맑은 고딕" w:hAnsi="맑은 고딕" w:eastAsia="맑은 고딕" w:cs="맑은 고딕"/>
+          <w:sz w:val="22"/>
         </w:rPr>
         <w:t>Agent 방화벽은 등록한 Viewer PC IPv4 또는 고급 관리 CIDR만 HTTPS/18443에 접근하도록 제한합니다.</w:t>
       </w:r>
@@ -4792,10 +4955,12 @@
           <w:ilvl w:val="0"/>
           <w:numId w:val="10"/>
         </w:numPr>
+        <w:spacing w:before="0" w:after="120" w:line="300" w:lineRule="auto"/>
       </w:pPr>
       <w:r>
         <w:rPr>
           <w:rFonts w:ascii="맑은 고딕" w:hAnsi="맑은 고딕" w:eastAsia="맑은 고딕" w:cs="맑은 고딕"/>
+          <w:sz w:val="22"/>
         </w:rPr>
         <w:t>Agent는 등록한 스위치 IPv4 또는 고급 대상 CIDR과 고정 Telnet/23만 허용합니다.</w:t>
       </w:r>
@@ -4803,7 +4968,7 @@
     <w:p>
       <w:pPr>
         <w:pStyle w:val="Heading1"/>
-        <w:pageBreakBefore/>
+        <w:pageBreakBefore w:val="0"/>
         <w:numPr>
           <w:ilvl w:val="0"/>
           <w:numId w:val="11"/>
@@ -5532,6 +5697,271 @@
                 <w:rFonts w:ascii="맑은 고딕" w:hAnsi="맑은 고딕" w:eastAsia="맑은 고딕" w:cs="맑은 고딕"/>
                 <w:sz w:val="16"/>
               </w:rPr>
+              <w:t>VIEWER_SOURCE_ACCESS_DENIED</w:t>
+            </w:r>
+          </w:p>
+        </w:tc>
+        <w:tc>
+          <w:tcPr>
+            <w:tcW w:type="dxa" w:w="5360"/>
+            <w:shd w:fill="FAFBFC"/>
+            <w:tcMar>
+              <w:top w:w="80" w:type="dxa"/>
+              <w:start w:w="120" w:type="dxa"/>
+              <w:bottom w:w="80" w:type="dxa"/>
+              <w:end w:w="120" w:type="dxa"/>
+            </w:tcMar>
+            <w:vAlign w:val="center"/>
+          </w:tcPr>
+          <w:p>
+            <w:pPr>
+              <w:spacing w:before="0" w:after="0" w:line="240" w:lineRule="auto"/>
+              <w:jc w:val="left"/>
+            </w:pPr>
+            <w:r>
+              <w:rPr>
+                <w:rFonts w:ascii="맑은 고딕" w:hAnsi="맑은 고딕" w:eastAsia="맑은 고딕" w:cs="맑은 고딕"/>
+                <w:sz w:val="16"/>
+              </w:rPr>
+              <w:t>UAC 관리자도 읽을 수 있는 승인된 임시 폴더에 공식 ZIP 다시 압축 해제</w:t>
+            </w:r>
+          </w:p>
+        </w:tc>
+      </w:tr>
+      <w:tr>
+        <w:tc>
+          <w:tcPr>
+            <w:tcW w:type="dxa" w:w="4000"/>
+            <w:tcMar>
+              <w:top w:w="80" w:type="dxa"/>
+              <w:start w:w="120" w:type="dxa"/>
+              <w:bottom w:w="80" w:type="dxa"/>
+              <w:end w:w="120" w:type="dxa"/>
+            </w:tcMar>
+            <w:vAlign w:val="center"/>
+          </w:tcPr>
+          <w:p>
+            <w:pPr>
+              <w:spacing w:before="0" w:after="0" w:line="240" w:lineRule="auto"/>
+              <w:jc w:val="left"/>
+            </w:pPr>
+            <w:r>
+              <w:rPr>
+                <w:rFonts w:ascii="맑은 고딕" w:hAnsi="맑은 고딕" w:eastAsia="맑은 고딕" w:cs="맑은 고딕"/>
+                <w:sz w:val="16"/>
+              </w:rPr>
+              <w:t>VIEWER_INSTALL_PATH_EXECUTION_BLOCKED</w:t>
+            </w:r>
+          </w:p>
+        </w:tc>
+        <w:tc>
+          <w:tcPr>
+            <w:tcW w:type="dxa" w:w="5360"/>
+            <w:tcMar>
+              <w:top w:w="80" w:type="dxa"/>
+              <w:start w:w="120" w:type="dxa"/>
+              <w:bottom w:w="80" w:type="dxa"/>
+              <w:end w:w="120" w:type="dxa"/>
+            </w:tcMar>
+            <w:vAlign w:val="center"/>
+          </w:tcPr>
+          <w:p>
+            <w:pPr>
+              <w:spacing w:before="0" w:after="0" w:line="240" w:lineRule="auto"/>
+              <w:jc w:val="left"/>
+            </w:pPr>
+            <w:r>
+              <w:rPr>
+                <w:rFonts w:ascii="맑은 고딕" w:hAnsi="맑은 고딕" w:eastAsia="맑은 고딕" w:cs="맑은 고딕"/>
+                <w:sz w:val="16"/>
+              </w:rPr>
+              <w:t>Program Files 실행 정책 → AppLocker·WDAC·EDR 기록 → 보안 담당자</w:t>
+            </w:r>
+          </w:p>
+        </w:tc>
+      </w:tr>
+      <w:tr>
+        <w:tc>
+          <w:tcPr>
+            <w:tcW w:type="dxa" w:w="4000"/>
+            <w:shd w:fill="FAFBFC"/>
+            <w:tcMar>
+              <w:top w:w="80" w:type="dxa"/>
+              <w:start w:w="120" w:type="dxa"/>
+              <w:bottom w:w="80" w:type="dxa"/>
+              <w:end w:w="120" w:type="dxa"/>
+            </w:tcMar>
+            <w:vAlign w:val="center"/>
+          </w:tcPr>
+          <w:p>
+            <w:pPr>
+              <w:spacing w:before="0" w:after="0" w:line="240" w:lineRule="auto"/>
+              <w:jc w:val="left"/>
+            </w:pPr>
+            <w:r>
+              <w:rPr>
+                <w:rFonts w:ascii="맑은 고딕" w:hAnsi="맑은 고딕" w:eastAsia="맑은 고딕" w:cs="맑은 고딕"/>
+                <w:sz w:val="16"/>
+              </w:rPr>
+              <w:t>VIEWER_USER_PHASE_FAILED</w:t>
+            </w:r>
+          </w:p>
+        </w:tc>
+        <w:tc>
+          <w:tcPr>
+            <w:tcW w:type="dxa" w:w="5360"/>
+            <w:shd w:fill="FAFBFC"/>
+            <w:tcMar>
+              <w:top w:w="80" w:type="dxa"/>
+              <w:start w:w="120" w:type="dxa"/>
+              <w:bottom w:w="80" w:type="dxa"/>
+              <w:end w:w="120" w:type="dxa"/>
+            </w:tcMar>
+            <w:vAlign w:val="center"/>
+          </w:tcPr>
+          <w:p>
+            <w:pPr>
+              <w:spacing w:before="0" w:after="0" w:line="240" w:lineRule="auto"/>
+              <w:jc w:val="left"/>
+            </w:pPr>
+            <w:r>
+              <w:rPr>
+                <w:rFonts w:ascii="맑은 고딕" w:hAnsi="맑은 고딕" w:eastAsia="맑은 고딕" w:cs="맑은 고딕"/>
+                <w:sz w:val="16"/>
+              </w:rPr>
+              <w:t>원래 사용자 실행 검사·바로 가기 → 복구 UAC → Recovery 결과</w:t>
+            </w:r>
+          </w:p>
+        </w:tc>
+      </w:tr>
+      <w:tr>
+        <w:tc>
+          <w:tcPr>
+            <w:tcW w:type="dxa" w:w="4000"/>
+            <w:tcMar>
+              <w:top w:w="80" w:type="dxa"/>
+              <w:start w:w="120" w:type="dxa"/>
+              <w:bottom w:w="80" w:type="dxa"/>
+              <w:end w:w="120" w:type="dxa"/>
+            </w:tcMar>
+            <w:vAlign w:val="center"/>
+          </w:tcPr>
+          <w:p>
+            <w:pPr>
+              <w:spacing w:before="0" w:after="0" w:line="240" w:lineRule="auto"/>
+              <w:jc w:val="left"/>
+            </w:pPr>
+            <w:r>
+              <w:rPr>
+                <w:rFonts w:ascii="맑은 고딕" w:hAnsi="맑은 고딕" w:eastAsia="맑은 고딕" w:cs="맑은 고딕"/>
+                <w:sz w:val="16"/>
+              </w:rPr>
+              <w:t>VIEWER_MACHINE_ROLLBACK_INCOMPLETE</w:t>
+            </w:r>
+          </w:p>
+        </w:tc>
+        <w:tc>
+          <w:tcPr>
+            <w:tcW w:type="dxa" w:w="5360"/>
+            <w:tcMar>
+              <w:top w:w="80" w:type="dxa"/>
+              <w:start w:w="120" w:type="dxa"/>
+              <w:bottom w:w="80" w:type="dxa"/>
+              <w:end w:w="120" w:type="dxa"/>
+            </w:tcMar>
+            <w:vAlign w:val="center"/>
+          </w:tcPr>
+          <w:p>
+            <w:pPr>
+              <w:spacing w:before="0" w:after="0" w:line="240" w:lineRule="auto"/>
+              <w:jc w:val="left"/>
+            </w:pPr>
+            <w:r>
+              <w:rPr>
+                <w:rFonts w:ascii="맑은 고딕" w:hAnsi="맑은 고딕" w:eastAsia="맑은 고딕" w:cs="맑은 고딕"/>
+                <w:sz w:val="16"/>
+              </w:rPr>
+              <w:t>현재 설치와 Viewer.__rollback 보존 → Windows 관리자 확인</w:t>
+            </w:r>
+          </w:p>
+        </w:tc>
+      </w:tr>
+      <w:tr>
+        <w:tc>
+          <w:tcPr>
+            <w:tcW w:type="dxa" w:w="4000"/>
+            <w:shd w:fill="FAFBFC"/>
+            <w:tcMar>
+              <w:top w:w="80" w:type="dxa"/>
+              <w:start w:w="120" w:type="dxa"/>
+              <w:bottom w:w="80" w:type="dxa"/>
+              <w:end w:w="120" w:type="dxa"/>
+            </w:tcMar>
+            <w:vAlign w:val="center"/>
+          </w:tcPr>
+          <w:p>
+            <w:pPr>
+              <w:spacing w:before="0" w:after="0" w:line="240" w:lineRule="auto"/>
+              <w:jc w:val="left"/>
+            </w:pPr>
+            <w:r>
+              <w:rPr>
+                <w:rFonts w:ascii="맑은 고딕" w:hAnsi="맑은 고딕" w:eastAsia="맑은 고딕" w:cs="맑은 고딕"/>
+                <w:sz w:val="16"/>
+              </w:rPr>
+              <w:t>VIEWER_ROLLBACK_ELEVATION_NOT_GRANTED</w:t>
+            </w:r>
+          </w:p>
+        </w:tc>
+        <w:tc>
+          <w:tcPr>
+            <w:tcW w:type="dxa" w:w="5360"/>
+            <w:shd w:fill="FAFBFC"/>
+            <w:tcMar>
+              <w:top w:w="80" w:type="dxa"/>
+              <w:start w:w="120" w:type="dxa"/>
+              <w:bottom w:w="80" w:type="dxa"/>
+              <w:end w:w="120" w:type="dxa"/>
+            </w:tcMar>
+            <w:vAlign w:val="center"/>
+          </w:tcPr>
+          <w:p>
+            <w:pPr>
+              <w:spacing w:before="0" w:after="0" w:line="240" w:lineRule="auto"/>
+              <w:jc w:val="left"/>
+            </w:pPr>
+            <w:r>
+              <w:rPr>
+                <w:rFonts w:ascii="맑은 고딕" w:hAnsi="맑은 고딕" w:eastAsia="맑은 고딕" w:cs="맑은 고딕"/>
+                <w:sz w:val="16"/>
+              </w:rPr>
+              <w:t>복구 UAC 취소 여부 → rollback 슬롯 보존 → 관리자 재시도</w:t>
+            </w:r>
+          </w:p>
+        </w:tc>
+      </w:tr>
+      <w:tr>
+        <w:tc>
+          <w:tcPr>
+            <w:tcW w:type="dxa" w:w="4000"/>
+            <w:tcMar>
+              <w:top w:w="80" w:type="dxa"/>
+              <w:start w:w="120" w:type="dxa"/>
+              <w:bottom w:w="80" w:type="dxa"/>
+              <w:end w:w="120" w:type="dxa"/>
+            </w:tcMar>
+            <w:vAlign w:val="center"/>
+          </w:tcPr>
+          <w:p>
+            <w:pPr>
+              <w:spacing w:before="0" w:after="0" w:line="240" w:lineRule="auto"/>
+              <w:jc w:val="left"/>
+            </w:pPr>
+            <w:r>
+              <w:rPr>
+                <w:rFonts w:ascii="맑은 고딕" w:hAnsi="맑은 고딕" w:eastAsia="맑은 고딕" w:cs="맑은 고딕"/>
+                <w:sz w:val="16"/>
+              </w:rPr>
               <w:t>VIEWER_SHORTCUT_DIRECTORY_UNAVAILABLE</w:t>
             </w:r>
           </w:p>
@@ -5539,7 +5969,6 @@
         <w:tc>
           <w:tcPr>
             <w:tcW w:type="dxa" w:w="5360"/>
-            <w:shd w:fill="FAFBFC"/>
             <w:tcMar>
               <w:top w:w="80" w:type="dxa"/>
               <w:start w:w="120" w:type="dxa"/>
@@ -5567,6 +5996,7 @@
         <w:tc>
           <w:tcPr>
             <w:tcW w:type="dxa" w:w="4000"/>
+            <w:shd w:fill="FAFBFC"/>
             <w:tcMar>
               <w:top w:w="80" w:type="dxa"/>
               <w:start w:w="120" w:type="dxa"/>
@@ -5592,6 +6022,7 @@
         <w:tc>
           <w:tcPr>
             <w:tcW w:type="dxa" w:w="5360"/>
+            <w:shd w:fill="FAFBFC"/>
             <w:tcMar>
               <w:top w:w="80" w:type="dxa"/>
               <w:start w:w="120" w:type="dxa"/>
@@ -5619,7 +6050,6 @@
         <w:tc>
           <w:tcPr>
             <w:tcW w:type="dxa" w:w="4000"/>
-            <w:shd w:fill="FAFBFC"/>
             <w:tcMar>
               <w:top w:w="80" w:type="dxa"/>
               <w:start w:w="120" w:type="dxa"/>
@@ -5645,7 +6075,6 @@
         <w:tc>
           <w:tcPr>
             <w:tcW w:type="dxa" w:w="5360"/>
-            <w:shd w:fill="FAFBFC"/>
             <w:tcMar>
               <w:top w:w="80" w:type="dxa"/>
               <w:start w:w="120" w:type="dxa"/>
@@ -5673,6 +6102,7 @@
         <w:tc>
           <w:tcPr>
             <w:tcW w:type="dxa" w:w="4000"/>
+            <w:shd w:fill="FAFBFC"/>
             <w:tcMar>
               <w:top w:w="80" w:type="dxa"/>
               <w:start w:w="120" w:type="dxa"/>
@@ -5698,6 +6128,7 @@
         <w:tc>
           <w:tcPr>
             <w:tcW w:type="dxa" w:w="5360"/>
+            <w:shd w:fill="FAFBFC"/>
             <w:tcMar>
               <w:top w:w="80" w:type="dxa"/>
               <w:start w:w="120" w:type="dxa"/>
@@ -5725,7 +6156,6 @@
         <w:tc>
           <w:tcPr>
             <w:tcW w:type="dxa" w:w="4000"/>
-            <w:shd w:fill="FAFBFC"/>
             <w:tcMar>
               <w:top w:w="80" w:type="dxa"/>
               <w:start w:w="120" w:type="dxa"/>
@@ -5751,7 +6181,6 @@
         <w:tc>
           <w:tcPr>
             <w:tcW w:type="dxa" w:w="5360"/>
-            <w:shd w:fill="FAFBFC"/>
             <w:tcMar>
               <w:top w:w="80" w:type="dxa"/>
               <w:start w:w="120" w:type="dxa"/>
@@ -5779,6 +6208,7 @@
         <w:tc>
           <w:tcPr>
             <w:tcW w:type="dxa" w:w="4000"/>
+            <w:shd w:fill="FAFBFC"/>
             <w:tcMar>
               <w:top w:w="80" w:type="dxa"/>
               <w:start w:w="120" w:type="dxa"/>
@@ -5804,6 +6234,7 @@
         <w:tc>
           <w:tcPr>
             <w:tcW w:type="dxa" w:w="5360"/>
+            <w:shd w:fill="FAFBFC"/>
             <w:tcMar>
               <w:top w:w="80" w:type="dxa"/>
               <w:start w:w="120" w:type="dxa"/>
@@ -5831,7 +6262,6 @@
         <w:tc>
           <w:tcPr>
             <w:tcW w:type="dxa" w:w="4000"/>
-            <w:shd w:fill="FAFBFC"/>
             <w:tcMar>
               <w:top w:w="80" w:type="dxa"/>
               <w:start w:w="120" w:type="dxa"/>
@@ -5857,7 +6287,6 @@
         <w:tc>
           <w:tcPr>
             <w:tcW w:type="dxa" w:w="5360"/>
-            <w:shd w:fill="FAFBFC"/>
             <w:tcMar>
               <w:top w:w="80" w:type="dxa"/>
               <w:start w:w="120" w:type="dxa"/>
@@ -5885,6 +6314,7 @@
         <w:tc>
           <w:tcPr>
             <w:tcW w:type="dxa" w:w="4000"/>
+            <w:shd w:fill="FAFBFC"/>
             <w:tcMar>
               <w:top w:w="80" w:type="dxa"/>
               <w:start w:w="120" w:type="dxa"/>
@@ -5910,6 +6340,7 @@
         <w:tc>
           <w:tcPr>
             <w:tcW w:type="dxa" w:w="5360"/>
+            <w:shd w:fill="FAFBFC"/>
             <w:tcMar>
               <w:top w:w="80" w:type="dxa"/>
               <w:start w:w="120" w:type="dxa"/>
@@ -5929,60 +6360,6 @@
                 <w:sz w:val="16"/>
               </w:rPr>
               <w:t>설치 journal → Windows Application 로그 → 다시 설치</w:t>
-            </w:r>
-          </w:p>
-        </w:tc>
-      </w:tr>
-      <w:tr>
-        <w:tc>
-          <w:tcPr>
-            <w:tcW w:type="dxa" w:w="4000"/>
-            <w:shd w:fill="FAFBFC"/>
-            <w:tcMar>
-              <w:top w:w="80" w:type="dxa"/>
-              <w:start w:w="120" w:type="dxa"/>
-              <w:bottom w:w="80" w:type="dxa"/>
-              <w:end w:w="120" w:type="dxa"/>
-            </w:tcMar>
-            <w:vAlign w:val="center"/>
-          </w:tcPr>
-          <w:p>
-            <w:pPr>
-              <w:spacing w:before="0" w:after="0" w:line="240" w:lineRule="auto"/>
-              <w:jc w:val="left"/>
-            </w:pPr>
-            <w:r>
-              <w:rPr>
-                <w:rFonts w:ascii="맑은 고딕" w:hAnsi="맑은 고딕" w:eastAsia="맑은 고딕" w:cs="맑은 고딕"/>
-                <w:sz w:val="16"/>
-              </w:rPr>
-              <w:t>VIEWER_SELF_CHECK_TIMEOUT</w:t>
-            </w:r>
-          </w:p>
-        </w:tc>
-        <w:tc>
-          <w:tcPr>
-            <w:tcW w:type="dxa" w:w="5360"/>
-            <w:shd w:fill="FAFBFC"/>
-            <w:tcMar>
-              <w:top w:w="80" w:type="dxa"/>
-              <w:start w:w="120" w:type="dxa"/>
-              <w:bottom w:w="80" w:type="dxa"/>
-              <w:end w:w="120" w:type="dxa"/>
-            </w:tcMar>
-            <w:vAlign w:val="center"/>
-          </w:tcPr>
-          <w:p>
-            <w:pPr>
-              <w:spacing w:before="0" w:after="0" w:line="240" w:lineRule="auto"/>
-              <w:jc w:val="left"/>
-            </w:pPr>
-            <w:r>
-              <w:rPr>
-                <w:rFonts w:ascii="맑은 고딕" w:hAnsi="맑은 고딕" w:eastAsia="맑은 고딕" w:cs="맑은 고딕"/>
-                <w:sz w:val="16"/>
-              </w:rPr>
-              <w:t>20초 자체점검 제한 → 남은 프로세스·보안 프로그램 지연 확인</w:t>
             </w:r>
           </w:p>
         </w:tc>
@@ -6062,6 +6439,271 @@
                 <w:rFonts w:ascii="맑은 고딕" w:hAnsi="맑은 고딕" w:eastAsia="맑은 고딕" w:cs="맑은 고딕"/>
                 <w:sz w:val="16"/>
               </w:rPr>
+              <w:t>VIEWER_SELF_CHECK_ACCESS_DENIED</w:t>
+            </w:r>
+          </w:p>
+        </w:tc>
+        <w:tc>
+          <w:tcPr>
+            <w:tcW w:type="dxa" w:w="5360"/>
+            <w:shd w:fill="FAFBFC"/>
+            <w:tcMar>
+              <w:top w:w="80" w:type="dxa"/>
+              <w:start w:w="120" w:type="dxa"/>
+              <w:bottom w:w="80" w:type="dxa"/>
+              <w:end w:w="120" w:type="dxa"/>
+            </w:tcMar>
+            <w:vAlign w:val="center"/>
+          </w:tcPr>
+          <w:p>
+            <w:pPr>
+              <w:spacing w:before="0" w:after="0" w:line="240" w:lineRule="auto"/>
+              <w:jc w:val="left"/>
+            </w:pPr>
+            <w:r>
+              <w:rPr>
+                <w:rFonts w:ascii="맑은 고딕" w:hAnsi="맑은 고딕" w:eastAsia="맑은 고딕" w:cs="맑은 고딕"/>
+                <w:sz w:val="16"/>
+              </w:rPr>
+              <w:t>Program Files 실행 권한 → EDR·AppLocker·WDAC 기록 확인</w:t>
+            </w:r>
+          </w:p>
+        </w:tc>
+      </w:tr>
+      <w:tr>
+        <w:tc>
+          <w:tcPr>
+            <w:tcW w:type="dxa" w:w="4000"/>
+            <w:tcMar>
+              <w:top w:w="80" w:type="dxa"/>
+              <w:start w:w="120" w:type="dxa"/>
+              <w:bottom w:w="80" w:type="dxa"/>
+              <w:end w:w="120" w:type="dxa"/>
+            </w:tcMar>
+            <w:vAlign w:val="center"/>
+          </w:tcPr>
+          <w:p>
+            <w:pPr>
+              <w:spacing w:before="0" w:after="0" w:line="240" w:lineRule="auto"/>
+              <w:jc w:val="left"/>
+            </w:pPr>
+            <w:r>
+              <w:rPr>
+                <w:rFonts w:ascii="맑은 고딕" w:hAnsi="맑은 고딕" w:eastAsia="맑은 고딕" w:cs="맑은 고딕"/>
+                <w:sz w:val="16"/>
+              </w:rPr>
+              <w:t>FILE_MISSING</w:t>
+            </w:r>
+          </w:p>
+        </w:tc>
+        <w:tc>
+          <w:tcPr>
+            <w:tcW w:type="dxa" w:w="5360"/>
+            <w:tcMar>
+              <w:top w:w="80" w:type="dxa"/>
+              <w:start w:w="120" w:type="dxa"/>
+              <w:bottom w:w="80" w:type="dxa"/>
+              <w:end w:w="120" w:type="dxa"/>
+            </w:tcMar>
+            <w:vAlign w:val="center"/>
+          </w:tcPr>
+          <w:p>
+            <w:pPr>
+              <w:spacing w:before="0" w:after="0" w:line="240" w:lineRule="auto"/>
+              <w:jc w:val="left"/>
+            </w:pPr>
+            <w:r>
+              <w:rPr>
+                <w:rFonts w:ascii="맑은 고딕" w:hAnsi="맑은 고딕" w:eastAsia="맑은 고딕" w:cs="맑은 고딕"/>
+                <w:sz w:val="16"/>
+              </w:rPr>
+              <w:t>설치 파일 누락 또는 EDR 격리 기록 확인</w:t>
+            </w:r>
+          </w:p>
+        </w:tc>
+      </w:tr>
+      <w:tr>
+        <w:tc>
+          <w:tcPr>
+            <w:tcW w:type="dxa" w:w="4000"/>
+            <w:shd w:fill="FAFBFC"/>
+            <w:tcMar>
+              <w:top w:w="80" w:type="dxa"/>
+              <w:start w:w="120" w:type="dxa"/>
+              <w:bottom w:w="80" w:type="dxa"/>
+              <w:end w:w="120" w:type="dxa"/>
+            </w:tcMar>
+            <w:vAlign w:val="center"/>
+          </w:tcPr>
+          <w:p>
+            <w:pPr>
+              <w:spacing w:before="0" w:after="0" w:line="240" w:lineRule="auto"/>
+              <w:jc w:val="left"/>
+            </w:pPr>
+            <w:r>
+              <w:rPr>
+                <w:rFonts w:ascii="맑은 고딕" w:hAnsi="맑은 고딕" w:eastAsia="맑은 고딕" w:cs="맑은 고딕"/>
+                <w:sz w:val="16"/>
+              </w:rPr>
+              <w:t>BAD_IMAGE</w:t>
+            </w:r>
+          </w:p>
+        </w:tc>
+        <w:tc>
+          <w:tcPr>
+            <w:tcW w:type="dxa" w:w="5360"/>
+            <w:shd w:fill="FAFBFC"/>
+            <w:tcMar>
+              <w:top w:w="80" w:type="dxa"/>
+              <w:start w:w="120" w:type="dxa"/>
+              <w:bottom w:w="80" w:type="dxa"/>
+              <w:end w:w="120" w:type="dxa"/>
+            </w:tcMar>
+            <w:vAlign w:val="center"/>
+          </w:tcPr>
+          <w:p>
+            <w:pPr>
+              <w:spacing w:before="0" w:after="0" w:line="240" w:lineRule="auto"/>
+              <w:jc w:val="left"/>
+            </w:pPr>
+            <w:r>
+              <w:rPr>
+                <w:rFonts w:ascii="맑은 고딕" w:hAnsi="맑은 고딕" w:eastAsia="맑은 고딕" w:cs="맑은 고딕"/>
+                <w:sz w:val="16"/>
+              </w:rPr>
+              <w:t>Windows x64 → 파일 손상·격리와 실행 파일 형식 확인</w:t>
+            </w:r>
+          </w:p>
+        </w:tc>
+      </w:tr>
+      <w:tr>
+        <w:tc>
+          <w:tcPr>
+            <w:tcW w:type="dxa" w:w="4000"/>
+            <w:tcMar>
+              <w:top w:w="80" w:type="dxa"/>
+              <w:start w:w="120" w:type="dxa"/>
+              <w:bottom w:w="80" w:type="dxa"/>
+              <w:end w:w="120" w:type="dxa"/>
+            </w:tcMar>
+            <w:vAlign w:val="center"/>
+          </w:tcPr>
+          <w:p>
+            <w:pPr>
+              <w:spacing w:before="0" w:after="0" w:line="240" w:lineRule="auto"/>
+              <w:jc w:val="left"/>
+            </w:pPr>
+            <w:r>
+              <w:rPr>
+                <w:rFonts w:ascii="맑은 고딕" w:hAnsi="맑은 고딕" w:eastAsia="맑은 고딕" w:cs="맑은 고딕"/>
+                <w:sz w:val="16"/>
+              </w:rPr>
+              <w:t>TIMEOUT</w:t>
+            </w:r>
+          </w:p>
+        </w:tc>
+        <w:tc>
+          <w:tcPr>
+            <w:tcW w:type="dxa" w:w="5360"/>
+            <w:tcMar>
+              <w:top w:w="80" w:type="dxa"/>
+              <w:start w:w="120" w:type="dxa"/>
+              <w:bottom w:w="80" w:type="dxa"/>
+              <w:end w:w="120" w:type="dxa"/>
+            </w:tcMar>
+            <w:vAlign w:val="center"/>
+          </w:tcPr>
+          <w:p>
+            <w:pPr>
+              <w:spacing w:before="0" w:after="0" w:line="240" w:lineRule="auto"/>
+              <w:jc w:val="left"/>
+            </w:pPr>
+            <w:r>
+              <w:rPr>
+                <w:rFonts w:ascii="맑은 고딕" w:hAnsi="맑은 고딕" w:eastAsia="맑은 고딕" w:cs="맑은 고딕"/>
+                <w:sz w:val="16"/>
+              </w:rPr>
+              <w:t>20초 자체점검 제한 → 남은 프로세스·보안 프로그램 지연 확인</w:t>
+            </w:r>
+          </w:p>
+        </w:tc>
+      </w:tr>
+      <w:tr>
+        <w:tc>
+          <w:tcPr>
+            <w:tcW w:type="dxa" w:w="4000"/>
+            <w:shd w:fill="FAFBFC"/>
+            <w:tcMar>
+              <w:top w:w="80" w:type="dxa"/>
+              <w:start w:w="120" w:type="dxa"/>
+              <w:bottom w:w="80" w:type="dxa"/>
+              <w:end w:w="120" w:type="dxa"/>
+            </w:tcMar>
+            <w:vAlign w:val="center"/>
+          </w:tcPr>
+          <w:p>
+            <w:pPr>
+              <w:spacing w:before="0" w:after="0" w:line="240" w:lineRule="auto"/>
+              <w:jc w:val="left"/>
+            </w:pPr>
+            <w:r>
+              <w:rPr>
+                <w:rFonts w:ascii="맑은 고딕" w:hAnsi="맑은 고딕" w:eastAsia="맑은 고딕" w:cs="맑은 고딕"/>
+                <w:sz w:val="16"/>
+              </w:rPr>
+              <w:t>VIEWER_UNINSTALL_ROLLBACK_PRESERVED</w:t>
+            </w:r>
+          </w:p>
+        </w:tc>
+        <w:tc>
+          <w:tcPr>
+            <w:tcW w:type="dxa" w:w="5360"/>
+            <w:shd w:fill="FAFBFC"/>
+            <w:tcMar>
+              <w:top w:w="80" w:type="dxa"/>
+              <w:start w:w="120" w:type="dxa"/>
+              <w:bottom w:w="80" w:type="dxa"/>
+              <w:end w:w="120" w:type="dxa"/>
+            </w:tcMar>
+            <w:vAlign w:val="center"/>
+          </w:tcPr>
+          <w:p>
+            <w:pPr>
+              <w:spacing w:before="0" w:after="0" w:line="240" w:lineRule="auto"/>
+              <w:jc w:val="left"/>
+            </w:pPr>
+            <w:r>
+              <w:rPr>
+                <w:rFonts w:ascii="맑은 고딕" w:hAnsi="맑은 고딕" w:eastAsia="맑은 고딕" w:cs="맑은 고딕"/>
+                <w:sz w:val="16"/>
+              </w:rPr>
+              <w:t>Viewer 프로세스·활성 프로그램 폴더 정리 → 관리자 제거 재실행</w:t>
+            </w:r>
+          </w:p>
+        </w:tc>
+      </w:tr>
+      <w:tr>
+        <w:tc>
+          <w:tcPr>
+            <w:tcW w:type="dxa" w:w="4000"/>
+            <w:tcMar>
+              <w:top w:w="80" w:type="dxa"/>
+              <w:start w:w="120" w:type="dxa"/>
+              <w:bottom w:w="80" w:type="dxa"/>
+              <w:end w:w="120" w:type="dxa"/>
+            </w:tcMar>
+            <w:vAlign w:val="center"/>
+          </w:tcPr>
+          <w:p>
+            <w:pPr>
+              <w:spacing w:before="0" w:after="0" w:line="240" w:lineRule="auto"/>
+              <w:jc w:val="left"/>
+            </w:pPr>
+            <w:r>
+              <w:rPr>
+                <w:rFonts w:ascii="맑은 고딕" w:hAnsi="맑은 고딕" w:eastAsia="맑은 고딕" w:cs="맑은 고딕"/>
+                <w:sz w:val="16"/>
+              </w:rPr>
               <w:t>TARGET_NOT_ALLOWED</w:t>
             </w:r>
           </w:p>
@@ -6069,7 +6711,6 @@
         <w:tc>
           <w:tcPr>
             <w:tcW w:type="dxa" w:w="5360"/>
-            <w:shd w:fill="FAFBFC"/>
             <w:tcMar>
               <w:top w:w="80" w:type="dxa"/>
               <w:start w:w="120" w:type="dxa"/>
@@ -6097,6 +6738,7 @@
         <w:tc>
           <w:tcPr>
             <w:tcW w:type="dxa" w:w="4000"/>
+            <w:shd w:fill="FAFBFC"/>
             <w:tcMar>
               <w:top w:w="80" w:type="dxa"/>
               <w:start w:w="120" w:type="dxa"/>
@@ -6122,6 +6764,7 @@
         <w:tc>
           <w:tcPr>
             <w:tcW w:type="dxa" w:w="5360"/>
+            <w:shd w:fill="FAFBFC"/>
             <w:tcMar>
               <w:top w:w="80" w:type="dxa"/>
               <w:start w:w="120" w:type="dxa"/>
@@ -6149,7 +6792,6 @@
         <w:tc>
           <w:tcPr>
             <w:tcW w:type="dxa" w:w="4000"/>
-            <w:shd w:fill="FAFBFC"/>
             <w:tcMar>
               <w:top w:w="80" w:type="dxa"/>
               <w:start w:w="120" w:type="dxa"/>
@@ -6175,7 +6817,6 @@
         <w:tc>
           <w:tcPr>
             <w:tcW w:type="dxa" w:w="5360"/>
-            <w:shd w:fill="FAFBFC"/>
             <w:tcMar>
               <w:top w:w="80" w:type="dxa"/>
               <w:start w:w="120" w:type="dxa"/>
@@ -6203,6 +6844,7 @@
         <w:tc>
           <w:tcPr>
             <w:tcW w:type="dxa" w:w="4000"/>
+            <w:shd w:fill="FAFBFC"/>
             <w:tcMar>
               <w:top w:w="80" w:type="dxa"/>
               <w:start w:w="120" w:type="dxa"/>
@@ -6228,6 +6870,7 @@
         <w:tc>
           <w:tcPr>
             <w:tcW w:type="dxa" w:w="5360"/>
+            <w:shd w:fill="FAFBFC"/>
             <w:tcMar>
               <w:top w:w="80" w:type="dxa"/>
               <w:start w:w="120" w:type="dxa"/>
@@ -6255,7 +6898,6 @@
         <w:tc>
           <w:tcPr>
             <w:tcW w:type="dxa" w:w="4000"/>
-            <w:shd w:fill="FAFBFC"/>
             <w:tcMar>
               <w:top w:w="80" w:type="dxa"/>
               <w:start w:w="120" w:type="dxa"/>
@@ -6281,7 +6923,6 @@
         <w:tc>
           <w:tcPr>
             <w:tcW w:type="dxa" w:w="5360"/>
-            <w:shd w:fill="FAFBFC"/>
             <w:tcMar>
               <w:top w:w="80" w:type="dxa"/>
               <w:start w:w="120" w:type="dxa"/>
@@ -6309,6 +6950,7 @@
         <w:tc>
           <w:tcPr>
             <w:tcW w:type="dxa" w:w="4000"/>
+            <w:shd w:fill="FAFBFC"/>
             <w:tcMar>
               <w:top w:w="80" w:type="dxa"/>
               <w:start w:w="120" w:type="dxa"/>
@@ -6334,6 +6976,7 @@
         <w:tc>
           <w:tcPr>
             <w:tcW w:type="dxa" w:w="5360"/>
+            <w:shd w:fill="FAFBFC"/>
             <w:tcMar>
               <w:top w:w="80" w:type="dxa"/>
               <w:start w:w="120" w:type="dxa"/>
@@ -6361,7 +7004,6 @@
         <w:tc>
           <w:tcPr>
             <w:tcW w:type="dxa" w:w="4000"/>
-            <w:shd w:fill="FAFBFC"/>
             <w:tcMar>
               <w:top w:w="80" w:type="dxa"/>
               <w:start w:w="120" w:type="dxa"/>
@@ -6387,7 +7029,6 @@
         <w:tc>
           <w:tcPr>
             <w:tcW w:type="dxa" w:w="5360"/>
-            <w:shd w:fill="FAFBFC"/>
             <w:tcMar>
               <w:top w:w="80" w:type="dxa"/>
               <w:start w:w="120" w:type="dxa"/>
@@ -6415,6 +7056,7 @@
         <w:tc>
           <w:tcPr>
             <w:tcW w:type="dxa" w:w="4000"/>
+            <w:shd w:fill="FAFBFC"/>
             <w:tcMar>
               <w:top w:w="80" w:type="dxa"/>
               <w:start w:w="120" w:type="dxa"/>
@@ -6440,6 +7082,7 @@
         <w:tc>
           <w:tcPr>
             <w:tcW w:type="dxa" w:w="5360"/>
+            <w:shd w:fill="FAFBFC"/>
             <w:tcMar>
               <w:top w:w="80" w:type="dxa"/>
               <w:start w:w="120" w:type="dxa"/>
@@ -6467,7 +7110,6 @@
         <w:tc>
           <w:tcPr>
             <w:tcW w:type="dxa" w:w="4000"/>
-            <w:shd w:fill="FAFBFC"/>
             <w:tcMar>
               <w:top w:w="80" w:type="dxa"/>
               <w:start w:w="120" w:type="dxa"/>
@@ -6493,7 +7135,6 @@
         <w:tc>
           <w:tcPr>
             <w:tcW w:type="dxa" w:w="5360"/>
-            <w:shd w:fill="FAFBFC"/>
             <w:tcMar>
               <w:top w:w="80" w:type="dxa"/>
               <w:start w:w="120" w:type="dxa"/>
@@ -6521,6 +7162,7 @@
         <w:tc>
           <w:tcPr>
             <w:tcW w:type="dxa" w:w="4000"/>
+            <w:shd w:fill="FAFBFC"/>
             <w:tcMar>
               <w:top w:w="80" w:type="dxa"/>
               <w:start w:w="120" w:type="dxa"/>
@@ -6546,6 +7188,7 @@
         <w:tc>
           <w:tcPr>
             <w:tcW w:type="dxa" w:w="5360"/>
+            <w:shd w:fill="FAFBFC"/>
             <w:tcMar>
               <w:top w:w="80" w:type="dxa"/>
               <w:start w:w="120" w:type="dxa"/>
@@ -6573,7 +7216,6 @@
         <w:tc>
           <w:tcPr>
             <w:tcW w:type="dxa" w:w="4000"/>
-            <w:shd w:fill="FAFBFC"/>
             <w:tcMar>
               <w:top w:w="80" w:type="dxa"/>
               <w:start w:w="120" w:type="dxa"/>
@@ -6599,7 +7241,6 @@
         <w:tc>
           <w:tcPr>
             <w:tcW w:type="dxa" w:w="5360"/>
-            <w:shd w:fill="FAFBFC"/>
             <w:tcMar>
               <w:top w:w="80" w:type="dxa"/>
               <w:start w:w="120" w:type="dxa"/>
@@ -6627,6 +7268,7 @@
         <w:tc>
           <w:tcPr>
             <w:tcW w:type="dxa" w:w="4000"/>
+            <w:shd w:fill="FAFBFC"/>
             <w:tcMar>
               <w:top w:w="80" w:type="dxa"/>
               <w:start w:w="120" w:type="dxa"/>
@@ -6652,6 +7294,7 @@
         <w:tc>
           <w:tcPr>
             <w:tcW w:type="dxa" w:w="5360"/>
+            <w:shd w:fill="FAFBFC"/>
             <w:tcMar>
               <w:top w:w="80" w:type="dxa"/>
               <w:start w:w="120" w:type="dxa"/>
@@ -6679,7 +7322,6 @@
         <w:tc>
           <w:tcPr>
             <w:tcW w:type="dxa" w:w="4000"/>
-            <w:shd w:fill="FAFBFC"/>
             <w:tcMar>
               <w:top w:w="80" w:type="dxa"/>
               <w:start w:w="120" w:type="dxa"/>
@@ -6705,7 +7347,6 @@
         <w:tc>
           <w:tcPr>
             <w:tcW w:type="dxa" w:w="5360"/>
-            <w:shd w:fill="FAFBFC"/>
             <w:tcMar>
               <w:top w:w="80" w:type="dxa"/>
               <w:start w:w="120" w:type="dxa"/>
@@ -6733,6 +7374,7 @@
         <w:tc>
           <w:tcPr>
             <w:tcW w:type="dxa" w:w="4000"/>
+            <w:shd w:fill="FAFBFC"/>
             <w:tcMar>
               <w:top w:w="80" w:type="dxa"/>
               <w:start w:w="120" w:type="dxa"/>
@@ -6758,6 +7400,7 @@
         <w:tc>
           <w:tcPr>
             <w:tcW w:type="dxa" w:w="5360"/>
+            <w:shd w:fill="FAFBFC"/>
             <w:tcMar>
               <w:top w:w="80" w:type="dxa"/>
               <w:start w:w="120" w:type="dxa"/>
@@ -6785,7 +7428,6 @@
         <w:tc>
           <w:tcPr>
             <w:tcW w:type="dxa" w:w="4000"/>
-            <w:shd w:fill="FAFBFC"/>
             <w:tcMar>
               <w:top w:w="80" w:type="dxa"/>
               <w:start w:w="120" w:type="dxa"/>
@@ -6811,7 +7453,6 @@
         <w:tc>
           <w:tcPr>
             <w:tcW w:type="dxa" w:w="5360"/>
-            <w:shd w:fill="FAFBFC"/>
             <w:tcMar>
               <w:top w:w="80" w:type="dxa"/>
               <w:start w:w="120" w:type="dxa"/>
@@ -7120,7 +7761,7 @@
                 <w:rFonts w:ascii="맑은 고딕" w:hAnsi="맑은 고딕" w:eastAsia="맑은 고딕" w:cs="맑은 고딕"/>
                 <w:sz w:val="16"/>
               </w:rPr>
-              <w:t>진단 결과의 service, agentLive, agentReady가 각각 OK, LIVE, READY인지 확인합니다.</w:t>
+              <w:t>service.status=Running, listener.status=Listening, firewall.enabled/exact=true, 지원 프로필 포함, health.live=LIVE, health.ready=READY인지 확인합니다.</w:t>
             </w:r>
           </w:p>
         </w:tc>
@@ -7427,10 +8068,12 @@
           <w:ilvl w:val="0"/>
           <w:numId w:val="10"/>
         </w:numPr>
+        <w:spacing w:before="0" w:after="40" w:line="252" w:lineRule="auto"/>
       </w:pPr>
       <w:r>
         <w:rPr>
           <w:rFonts w:ascii="맑은 고딕" w:hAnsi="맑은 고딕" w:eastAsia="맑은 고딕" w:cs="맑은 고딕"/>
+          <w:sz w:val="20"/>
         </w:rPr>
         <w:t>Agent 서비스가 창 없이 Running이고 Viewer가 주소만으로 HTTPS 연결되는지 확인</w:t>
       </w:r>
@@ -7441,10 +8084,12 @@
           <w:ilvl w:val="0"/>
           <w:numId w:val="10"/>
         </w:numPr>
+        <w:spacing w:before="0" w:after="40" w:line="252" w:lineRule="auto"/>
       </w:pPr>
       <w:r>
         <w:rPr>
           <w:rFonts w:ascii="맑은 고딕" w:hAnsi="맑은 고딕" w:eastAsia="맑은 고딕" w:cs="맑은 고딕"/>
+          <w:sz w:val="20"/>
         </w:rPr>
         <w:t>계정은 Viewer에만 저장되고 접속 시험 실패 장비의 주기 감시는 꺼지는지 확인</w:t>
       </w:r>
@@ -7455,10 +8100,12 @@
           <w:ilvl w:val="0"/>
           <w:numId w:val="10"/>
         </w:numPr>
+        <w:spacing w:before="0" w:after="40" w:line="252" w:lineRule="auto"/>
       </w:pPr>
       <w:r>
         <w:rPr>
           <w:rFonts w:ascii="맑은 고딕" w:hAnsi="맑은 고딕" w:eastAsia="맑은 고딕" w:cs="맑은 고딕"/>
+          <w:sz w:val="20"/>
         </w:rPr>
         <w:t>show port status와 syslog 명령이 모델별로 동작하는지 확인</w:t>
       </w:r>
@@ -7469,40 +8116,14 @@
           <w:ilvl w:val="0"/>
           <w:numId w:val="10"/>
         </w:numPr>
+        <w:spacing w:before="0" w:after="40" w:line="252" w:lineRule="auto"/>
       </w:pPr>
       <w:r>
         <w:rPr>
           <w:rFonts w:ascii="맑은 고딕" w:hAnsi="맑은 고딕" w:eastAsia="맑은 고딕" w:cs="맑은 고딕"/>
+          <w:sz w:val="20"/>
         </w:rPr>
-        <w:t>show running-config 결과가 파일/이벤트 내보내기에 남지 않는지 확인</w:t>
-      </w:r>
-    </w:p>
-    <w:p>
-      <w:pPr>
-        <w:numPr>
-          <w:ilvl w:val="0"/>
-          <w:numId w:val="10"/>
-        </w:numPr>
-      </w:pPr>
-      <w:r>
-        <w:rPr>
-          <w:rFonts w:ascii="맑은 고딕" w:hAnsi="맑은 고딕" w:eastAsia="맑은 고딕" w:cs="맑은 고딕"/>
-        </w:rPr>
-        <w:t>Viewer 종료 후 재실행 시 감시 공백이 표시되는지 확인</w:t>
-      </w:r>
-    </w:p>
-    <w:p>
-      <w:pPr>
-        <w:numPr>
-          <w:ilvl w:val="0"/>
-          <w:numId w:val="10"/>
-        </w:numPr>
-      </w:pPr>
-      <w:r>
-        <w:rPr>
-          <w:rFonts w:ascii="맑은 고딕" w:hAnsi="맑은 고딕" w:eastAsia="맑은 고딕" w:cs="맑은 고딕"/>
-        </w:rPr>
-        <w:t>익명 모의 출력으로 업링크 Down·복구·중복 팝업 억제를 확인하고 실제 모델은 사내 관리망에서 읽기 전용 검증</w:t>
+        <w:t>민감 출력 비저장·Viewer 재실행·장애/복구·중복 억제는 모의 검증 후 사내 장비로 확인</w:t>
       </w:r>
     </w:p>
     <w:sectPr>
@@ -7533,7 +8154,7 @@
         <w:color w:val="64748B"/>
         <w:sz w:val="17"/>
       </w:rPr>
-      <w:t xml:space="preserve">v0.9.17-poc  |  </w:t>
+      <w:t xml:space="preserve">v0.9.18-poc  |  </w:t>
     </w:r>
     <w:r>
       <w:rPr>
@@ -7564,7 +8185,7 @@
         <w:color w:val="64748B"/>
         <w:sz w:val="17"/>
       </w:rPr>
-      <w:t>v0.9.17-poc  |  2026-07-27</w:t>
+      <w:t>v0.9.18-poc  |  2026-07-28</w:t>
     </w:r>
   </w:p>
 </w:ftr>

</xml_diff>

<commit_message>
fix: isolate monitoring requests across agent switches
</commit_message>
<xml_diff>
--- a/docs/SamsungSwitchWatch_User_Manual_KO.docx
+++ b/docs/SamsungSwitchWatch_User_Manual_KO.docx
@@ -1336,7 +1336,7 @@
           <w:color w:val="16324F"/>
           <w:sz w:val="21"/>
         </w:rPr>
-        <w:t>관리자 설치 창에 Agent installation failed가 표시되면 Cause 줄을 먼저 확인하세요. 설치 성공 뒤 AGENT_CONNECTION_REFUSED가 보이면 Viewer에 스위치 IP, Viewer PC 주소 또는 localhost가 아니라 Agent를 설치한 PC 주소를 입력했는지 먼저 확인하세요. 그 다음 SamsungSwitchWatchAgent 서비스와 TCP/18443을 점검합니다. 서비스를 수동 등록하지 말고 0.9.18-poc Agent 설치기를 사용하세요.</w:t>
+        <w:t>관리자 설치 창에 Agent installation failed가 표시되면 Cause 줄을 먼저 확인하세요. 설치 성공 뒤 AGENT_CONNECTION_REFUSED가 보이면 Viewer에 스위치 IP, Viewer PC 주소 또는 localhost가 아니라 Agent를 설치한 PC 주소를 입력했는지 먼저 확인하세요. 그 다음 SamsungSwitchWatchAgent 서비스와 TCP/18443을 점검합니다. 서비스를 수동 등록하지 말고 0.9.19-poc Agent 설치기를 사용하세요.</w:t>
       </w:r>
     </w:p>
     <w:p>
@@ -8154,7 +8154,7 @@
         <w:color w:val="64748B"/>
         <w:sz w:val="17"/>
       </w:rPr>
-      <w:t xml:space="preserve">v0.9.18-poc  |  </w:t>
+      <w:t xml:space="preserve">v0.9.19-poc  |  </w:t>
     </w:r>
     <w:r>
       <w:rPr>
@@ -8185,7 +8185,7 @@
         <w:color w:val="64748B"/>
         <w:sz w:val="17"/>
       </w:rPr>
-      <w:t>v0.9.18-poc  |  2026-07-28</w:t>
+      <w:t>v0.9.19-poc  |  2026-07-28</w:t>
     </w:r>
   </w:p>
 </w:ftr>

</xml_diff>

<commit_message>
fix: isolate monitoring requests across Agent switches (#29)
Prevent capability fallback from crossing an Agent client swap, add a deterministic regression test, and prepare the immutable v0.9.19-poc release.
</commit_message>
<xml_diff>
--- a/docs/SamsungSwitchWatch_User_Manual_KO.docx
+++ b/docs/SamsungSwitchWatch_User_Manual_KO.docx
@@ -1336,7 +1336,7 @@
           <w:color w:val="16324F"/>
           <w:sz w:val="21"/>
         </w:rPr>
-        <w:t>관리자 설치 창에 Agent installation failed가 표시되면 Cause 줄을 먼저 확인하세요. 설치 성공 뒤 AGENT_CONNECTION_REFUSED가 보이면 Viewer에 스위치 IP, Viewer PC 주소 또는 localhost가 아니라 Agent를 설치한 PC 주소를 입력했는지 먼저 확인하세요. 그 다음 SamsungSwitchWatchAgent 서비스와 TCP/18443을 점검합니다. 서비스를 수동 등록하지 말고 0.9.18-poc Agent 설치기를 사용하세요.</w:t>
+        <w:t>관리자 설치 창에 Agent installation failed가 표시되면 Cause 줄을 먼저 확인하세요. 설치 성공 뒤 AGENT_CONNECTION_REFUSED가 보이면 Viewer에 스위치 IP, Viewer PC 주소 또는 localhost가 아니라 Agent를 설치한 PC 주소를 입력했는지 먼저 확인하세요. 그 다음 SamsungSwitchWatchAgent 서비스와 TCP/18443을 점검합니다. 서비스를 수동 등록하지 말고 0.9.19-poc Agent 설치기를 사용하세요.</w:t>
       </w:r>
     </w:p>
     <w:p>
@@ -8154,7 +8154,7 @@
         <w:color w:val="64748B"/>
         <w:sz w:val="17"/>
       </w:rPr>
-      <w:t xml:space="preserve">v0.9.18-poc  |  </w:t>
+      <w:t xml:space="preserve">v0.9.19-poc  |  </w:t>
     </w:r>
     <w:r>
       <w:rPr>
@@ -8185,7 +8185,7 @@
         <w:color w:val="64748B"/>
         <w:sz w:val="17"/>
       </w:rPr>
-      <w:t>v0.9.18-poc  |  2026-07-28</w:t>
+      <w:t>v0.9.19-poc  |  2026-07-28</w:t>
     </w:r>
   </w:p>
 </w:ftr>

</xml_diff>

<commit_message>
fix: discard stale device monitoring results
</commit_message>
<xml_diff>
--- a/docs/SamsungSwitchWatch_User_Manual_KO.docx
+++ b/docs/SamsungSwitchWatch_User_Manual_KO.docx
@@ -1336,7 +1336,7 @@
           <w:color w:val="16324F"/>
           <w:sz w:val="21"/>
         </w:rPr>
-        <w:t>관리자 설치 창에 Agent installation failed가 표시되면 Cause 줄을 먼저 확인하세요. 설치 성공 뒤 AGENT_CONNECTION_REFUSED가 보이면 Viewer에 스위치 IP, Viewer PC 주소 또는 localhost가 아니라 Agent를 설치한 PC 주소를 입력했는지 먼저 확인하세요. 그 다음 SamsungSwitchWatchAgent 서비스와 TCP/18443을 점검합니다. 서비스를 수동 등록하지 말고 0.9.19-poc Agent 설치기를 사용하세요.</w:t>
+        <w:t>관리자 설치 창에 Agent installation failed가 표시되면 Cause 줄을 먼저 확인하세요. 설치 성공 뒤 AGENT_CONNECTION_REFUSED가 보이면 Viewer에 스위치 IP, Viewer PC 주소 또는 localhost가 아니라 Agent를 설치한 PC 주소를 입력했는지 먼저 확인하세요. 그 다음 SamsungSwitchWatchAgent 서비스와 TCP/18443을 점검합니다. 서비스를 수동 등록하지 말고 0.9.20-poc Agent 설치기를 사용하세요.</w:t>
       </w:r>
     </w:p>
     <w:p>
@@ -8154,7 +8154,7 @@
         <w:color w:val="64748B"/>
         <w:sz w:val="17"/>
       </w:rPr>
-      <w:t xml:space="preserve">v0.9.19-poc  |  </w:t>
+      <w:t xml:space="preserve">v0.9.20-poc  |  </w:t>
     </w:r>
     <w:r>
       <w:rPr>
@@ -8185,7 +8185,7 @@
         <w:color w:val="64748B"/>
         <w:sz w:val="17"/>
       </w:rPr>
-      <w:t>v0.9.19-poc  |  2026-07-28</w:t>
+      <w:t>v0.9.20-poc  |  2026-07-28</w:t>
     </w:r>
   </w:p>
 </w:ftr>

</xml_diff>

<commit_message>
fix: discard stale device monitoring results (#30)
Discard late per-device monitoring results after device lifecycle changes, reset stale collection baselines atomically, and publish the v0.9.20-poc documentation baseline.
</commit_message>
<xml_diff>
--- a/docs/SamsungSwitchWatch_User_Manual_KO.docx
+++ b/docs/SamsungSwitchWatch_User_Manual_KO.docx
@@ -1336,7 +1336,7 @@
           <w:color w:val="16324F"/>
           <w:sz w:val="21"/>
         </w:rPr>
-        <w:t>관리자 설치 창에 Agent installation failed가 표시되면 Cause 줄을 먼저 확인하세요. 설치 성공 뒤 AGENT_CONNECTION_REFUSED가 보이면 Viewer에 스위치 IP, Viewer PC 주소 또는 localhost가 아니라 Agent를 설치한 PC 주소를 입력했는지 먼저 확인하세요. 그 다음 SamsungSwitchWatchAgent 서비스와 TCP/18443을 점검합니다. 서비스를 수동 등록하지 말고 0.9.19-poc Agent 설치기를 사용하세요.</w:t>
+        <w:t>관리자 설치 창에 Agent installation failed가 표시되면 Cause 줄을 먼저 확인하세요. 설치 성공 뒤 AGENT_CONNECTION_REFUSED가 보이면 Viewer에 스위치 IP, Viewer PC 주소 또는 localhost가 아니라 Agent를 설치한 PC 주소를 입력했는지 먼저 확인하세요. 그 다음 SamsungSwitchWatchAgent 서비스와 TCP/18443을 점검합니다. 서비스를 수동 등록하지 말고 0.9.20-poc Agent 설치기를 사용하세요.</w:t>
       </w:r>
     </w:p>
     <w:p>
@@ -8154,7 +8154,7 @@
         <w:color w:val="64748B"/>
         <w:sz w:val="17"/>
       </w:rPr>
-      <w:t xml:space="preserve">v0.9.19-poc  |  </w:t>
+      <w:t xml:space="preserve">v0.9.20-poc  |  </w:t>
     </w:r>
     <w:r>
       <w:rPr>
@@ -8185,7 +8185,7 @@
         <w:color w:val="64748B"/>
         <w:sz w:val="17"/>
       </w:rPr>
-      <w:t>v0.9.19-poc  |  2026-07-28</w:t>
+      <w:t>v0.9.20-poc  |  2026-07-28</w:t>
     </w:r>
   </w:p>
 </w:ftr>

</xml_diff>

<commit_message>
fix: fail closed on invalid monitoring state
</commit_message>
<xml_diff>
--- a/docs/SamsungSwitchWatch_User_Manual_KO.docx
+++ b/docs/SamsungSwitchWatch_User_Manual_KO.docx
@@ -1336,7 +1336,7 @@
           <w:color w:val="16324F"/>
           <w:sz w:val="21"/>
         </w:rPr>
-        <w:t>관리자 설치 창에 Agent installation failed가 표시되면 Cause 줄을 먼저 확인하세요. 설치 성공 뒤 AGENT_CONNECTION_REFUSED가 보이면 Viewer에 스위치 IP, Viewer PC 주소 또는 localhost가 아니라 Agent를 설치한 PC 주소를 입력했는지 먼저 확인하세요. 그 다음 SamsungSwitchWatchAgent 서비스와 TCP/18443을 점검합니다. 서비스를 수동 등록하지 말고 0.9.20-poc Agent 설치기를 사용하세요.</w:t>
+        <w:t>관리자 설치 창에 Agent installation failed가 표시되면 Cause 줄을 먼저 확인하세요. 설치 성공 뒤 AGENT_CONNECTION_REFUSED가 보이면 Viewer에 스위치 IP, Viewer PC 주소 또는 localhost가 아니라 Agent를 설치한 PC 주소를 입력했는지 먼저 확인하세요. 그 다음 SamsungSwitchWatchAgent 서비스와 TCP/18443을 점검합니다. 서비스를 수동 등록하지 말고 0.9.21-poc Agent 설치기를 사용하세요.</w:t>
       </w:r>
     </w:p>
     <w:p>
@@ -3309,6 +3309,34 @@
     </w:p>
     <w:p>
       <w:pPr>
+        <w:keepLines/>
+        <w:spacing w:before="80" w:after="160" w:line="283" w:lineRule="auto"/>
+        <w:ind w:left="115" w:right="58"/>
+        <w:shd w:fill="FFF8E8"/>
+        <w:pBdr>
+          <w:left w:val="single" w:sz="16" w:space="8" w:color="8A5A00"/>
+        </w:pBdr>
+      </w:pPr>
+      <w:r>
+        <w:rPr>
+          <w:rFonts w:ascii="맑은 고딕" w:hAnsi="맑은 고딕" w:eastAsia="맑은 고딕" w:cs="맑은 고딕"/>
+          <w:b/>
+          <w:color w:val="8A5A00"/>
+          <w:sz w:val="21"/>
+        </w:rPr>
+        <w:t xml:space="preserve">감시 이력 파일 오류  </w:t>
+      </w:r>
+      <w:r>
+        <w:rPr>
+          <w:rFonts w:ascii="맑은 고딕" w:hAnsi="맑은 고딕" w:eastAsia="맑은 고딕" w:cs="맑은 고딕"/>
+          <w:color w:val="16324F"/>
+          <w:sz w:val="21"/>
+        </w:rPr>
+        <w:t>감시 이력 파일이 손상됐거나 현재 Viewer보다 새로운 형식이거나 읽기·쓰기가 불가능하면 Viewer는 이전 장애를 정상으로 오판하지 않도록 자동 감시와 이력 저장을 중지합니다. 장비의 수동 show 조회는 계속 사용할 수 있습니다. 화면의 오류 코드와 조치 안내에 따라 격리 파일, Viewer 버전, 사용자 폴더 권한·파일 잠금을 확인한 뒤 Viewer를 다시 시작하세요.</w:t>
+      </w:r>
+    </w:p>
+    <w:p>
+      <w:pPr>
         <w:pStyle w:val="Heading2"/>
         <w:pageBreakBefore w:val="0"/>
         <w:numPr>
@@ -5028,8 +5056,8 @@
         </w:tblBorders>
       </w:tblPr>
       <w:tblGrid>
-        <w:gridCol w:w="4000"/>
-        <w:gridCol w:w="5360"/>
+        <w:gridCol w:w="4300"/>
+        <w:gridCol w:w="5060"/>
       </w:tblGrid>
       <w:tr>
         <w:trPr>
@@ -5037,7 +5065,7 @@
         </w:trPr>
         <w:tc>
           <w:tcPr>
-            <w:tcW w:type="dxa" w:w="4000"/>
+            <w:tcW w:type="dxa" w:w="4300"/>
             <w:tcMar>
               <w:top w:w="80" w:type="dxa"/>
               <w:start w:w="120" w:type="dxa"/>
@@ -5065,7 +5093,7 @@
         </w:tc>
         <w:tc>
           <w:tcPr>
-            <w:tcW w:type="dxa" w:w="5360"/>
+            <w:tcW w:type="dxa" w:w="5060"/>
             <w:tcMar>
               <w:top w:w="80" w:type="dxa"/>
               <w:start w:w="120" w:type="dxa"/>
@@ -5095,7 +5123,7 @@
       <w:tr>
         <w:tc>
           <w:tcPr>
-            <w:tcW w:type="dxa" w:w="4000"/>
+            <w:tcW w:type="dxa" w:w="4300"/>
             <w:tcMar>
               <w:top w:w="80" w:type="dxa"/>
               <w:start w:w="120" w:type="dxa"/>
@@ -5120,7 +5148,7 @@
         </w:tc>
         <w:tc>
           <w:tcPr>
-            <w:tcW w:type="dxa" w:w="5360"/>
+            <w:tcW w:type="dxa" w:w="5060"/>
             <w:tcMar>
               <w:top w:w="80" w:type="dxa"/>
               <w:start w:w="120" w:type="dxa"/>
@@ -5147,7 +5175,7 @@
       <w:tr>
         <w:tc>
           <w:tcPr>
-            <w:tcW w:type="dxa" w:w="4000"/>
+            <w:tcW w:type="dxa" w:w="4300"/>
             <w:shd w:fill="FAFBFC"/>
             <w:tcMar>
               <w:top w:w="80" w:type="dxa"/>
@@ -5173,7 +5201,7 @@
         </w:tc>
         <w:tc>
           <w:tcPr>
-            <w:tcW w:type="dxa" w:w="5360"/>
+            <w:tcW w:type="dxa" w:w="5060"/>
             <w:shd w:fill="FAFBFC"/>
             <w:tcMar>
               <w:top w:w="80" w:type="dxa"/>
@@ -5201,7 +5229,7 @@
       <w:tr>
         <w:tc>
           <w:tcPr>
-            <w:tcW w:type="dxa" w:w="4000"/>
+            <w:tcW w:type="dxa" w:w="4300"/>
             <w:tcMar>
               <w:top w:w="80" w:type="dxa"/>
               <w:start w:w="120" w:type="dxa"/>
@@ -5226,7 +5254,7 @@
         </w:tc>
         <w:tc>
           <w:tcPr>
-            <w:tcW w:type="dxa" w:w="5360"/>
+            <w:tcW w:type="dxa" w:w="5060"/>
             <w:tcMar>
               <w:top w:w="80" w:type="dxa"/>
               <w:start w:w="120" w:type="dxa"/>
@@ -5253,7 +5281,7 @@
       <w:tr>
         <w:tc>
           <w:tcPr>
-            <w:tcW w:type="dxa" w:w="4000"/>
+            <w:tcW w:type="dxa" w:w="4300"/>
             <w:shd w:fill="FAFBFC"/>
             <w:tcMar>
               <w:top w:w="80" w:type="dxa"/>
@@ -5279,7 +5307,7 @@
         </w:tc>
         <w:tc>
           <w:tcPr>
-            <w:tcW w:type="dxa" w:w="5360"/>
+            <w:tcW w:type="dxa" w:w="5060"/>
             <w:shd w:fill="FAFBFC"/>
             <w:tcMar>
               <w:top w:w="80" w:type="dxa"/>
@@ -5307,7 +5335,7 @@
       <w:tr>
         <w:tc>
           <w:tcPr>
-            <w:tcW w:type="dxa" w:w="4000"/>
+            <w:tcW w:type="dxa" w:w="4300"/>
             <w:tcMar>
               <w:top w:w="80" w:type="dxa"/>
               <w:start w:w="120" w:type="dxa"/>
@@ -5332,7 +5360,7 @@
         </w:tc>
         <w:tc>
           <w:tcPr>
-            <w:tcW w:type="dxa" w:w="5360"/>
+            <w:tcW w:type="dxa" w:w="5060"/>
             <w:tcMar>
               <w:top w:w="80" w:type="dxa"/>
               <w:start w:w="120" w:type="dxa"/>
@@ -5359,7 +5387,7 @@
       <w:tr>
         <w:tc>
           <w:tcPr>
-            <w:tcW w:type="dxa" w:w="4000"/>
+            <w:tcW w:type="dxa" w:w="4300"/>
             <w:shd w:fill="FAFBFC"/>
             <w:tcMar>
               <w:top w:w="80" w:type="dxa"/>
@@ -5385,7 +5413,7 @@
         </w:tc>
         <w:tc>
           <w:tcPr>
-            <w:tcW w:type="dxa" w:w="5360"/>
+            <w:tcW w:type="dxa" w:w="5060"/>
             <w:shd w:fill="FAFBFC"/>
             <w:tcMar>
               <w:top w:w="80" w:type="dxa"/>
@@ -5413,7 +5441,7 @@
       <w:tr>
         <w:tc>
           <w:tcPr>
-            <w:tcW w:type="dxa" w:w="4000"/>
+            <w:tcW w:type="dxa" w:w="4300"/>
             <w:tcMar>
               <w:top w:w="80" w:type="dxa"/>
               <w:start w:w="120" w:type="dxa"/>
@@ -5438,7 +5466,7 @@
         </w:tc>
         <w:tc>
           <w:tcPr>
-            <w:tcW w:type="dxa" w:w="5360"/>
+            <w:tcW w:type="dxa" w:w="5060"/>
             <w:tcMar>
               <w:top w:w="80" w:type="dxa"/>
               <w:start w:w="120" w:type="dxa"/>
@@ -5465,7 +5493,7 @@
       <w:tr>
         <w:tc>
           <w:tcPr>
-            <w:tcW w:type="dxa" w:w="4000"/>
+            <w:tcW w:type="dxa" w:w="4300"/>
             <w:shd w:fill="FAFBFC"/>
             <w:tcMar>
               <w:top w:w="80" w:type="dxa"/>
@@ -5491,7 +5519,7 @@
         </w:tc>
         <w:tc>
           <w:tcPr>
-            <w:tcW w:type="dxa" w:w="5360"/>
+            <w:tcW w:type="dxa" w:w="5060"/>
             <w:shd w:fill="FAFBFC"/>
             <w:tcMar>
               <w:top w:w="80" w:type="dxa"/>
@@ -5519,7 +5547,7 @@
       <w:tr>
         <w:tc>
           <w:tcPr>
-            <w:tcW w:type="dxa" w:w="4000"/>
+            <w:tcW w:type="dxa" w:w="4300"/>
             <w:tcMar>
               <w:top w:w="80" w:type="dxa"/>
               <w:start w:w="120" w:type="dxa"/>
@@ -5544,7 +5572,7 @@
         </w:tc>
         <w:tc>
           <w:tcPr>
-            <w:tcW w:type="dxa" w:w="5360"/>
+            <w:tcW w:type="dxa" w:w="5060"/>
             <w:tcMar>
               <w:top w:w="80" w:type="dxa"/>
               <w:start w:w="120" w:type="dxa"/>
@@ -5571,7 +5599,7 @@
       <w:tr>
         <w:tc>
           <w:tcPr>
-            <w:tcW w:type="dxa" w:w="4000"/>
+            <w:tcW w:type="dxa" w:w="4300"/>
             <w:shd w:fill="FAFBFC"/>
             <w:tcMar>
               <w:top w:w="80" w:type="dxa"/>
@@ -5597,7 +5625,7 @@
         </w:tc>
         <w:tc>
           <w:tcPr>
-            <w:tcW w:type="dxa" w:w="5360"/>
+            <w:tcW w:type="dxa" w:w="5060"/>
             <w:shd w:fill="FAFBFC"/>
             <w:tcMar>
               <w:top w:w="80" w:type="dxa"/>
@@ -5625,7 +5653,7 @@
       <w:tr>
         <w:tc>
           <w:tcPr>
-            <w:tcW w:type="dxa" w:w="4000"/>
+            <w:tcW w:type="dxa" w:w="4300"/>
             <w:tcMar>
               <w:top w:w="80" w:type="dxa"/>
               <w:start w:w="120" w:type="dxa"/>
@@ -5650,7 +5678,7 @@
         </w:tc>
         <w:tc>
           <w:tcPr>
-            <w:tcW w:type="dxa" w:w="5360"/>
+            <w:tcW w:type="dxa" w:w="5060"/>
             <w:tcMar>
               <w:top w:w="80" w:type="dxa"/>
               <w:start w:w="120" w:type="dxa"/>
@@ -5677,7 +5705,7 @@
       <w:tr>
         <w:tc>
           <w:tcPr>
-            <w:tcW w:type="dxa" w:w="4000"/>
+            <w:tcW w:type="dxa" w:w="4300"/>
             <w:shd w:fill="FAFBFC"/>
             <w:tcMar>
               <w:top w:w="80" w:type="dxa"/>
@@ -5703,7 +5731,7 @@
         </w:tc>
         <w:tc>
           <w:tcPr>
-            <w:tcW w:type="dxa" w:w="5360"/>
+            <w:tcW w:type="dxa" w:w="5060"/>
             <w:shd w:fill="FAFBFC"/>
             <w:tcMar>
               <w:top w:w="80" w:type="dxa"/>
@@ -5731,7 +5759,7 @@
       <w:tr>
         <w:tc>
           <w:tcPr>
-            <w:tcW w:type="dxa" w:w="4000"/>
+            <w:tcW w:type="dxa" w:w="4300"/>
             <w:tcMar>
               <w:top w:w="80" w:type="dxa"/>
               <w:start w:w="120" w:type="dxa"/>
@@ -5756,7 +5784,7 @@
         </w:tc>
         <w:tc>
           <w:tcPr>
-            <w:tcW w:type="dxa" w:w="5360"/>
+            <w:tcW w:type="dxa" w:w="5060"/>
             <w:tcMar>
               <w:top w:w="80" w:type="dxa"/>
               <w:start w:w="120" w:type="dxa"/>
@@ -5783,7 +5811,7 @@
       <w:tr>
         <w:tc>
           <w:tcPr>
-            <w:tcW w:type="dxa" w:w="4000"/>
+            <w:tcW w:type="dxa" w:w="4300"/>
             <w:shd w:fill="FAFBFC"/>
             <w:tcMar>
               <w:top w:w="80" w:type="dxa"/>
@@ -5809,7 +5837,7 @@
         </w:tc>
         <w:tc>
           <w:tcPr>
-            <w:tcW w:type="dxa" w:w="5360"/>
+            <w:tcW w:type="dxa" w:w="5060"/>
             <w:shd w:fill="FAFBFC"/>
             <w:tcMar>
               <w:top w:w="80" w:type="dxa"/>
@@ -5837,7 +5865,7 @@
       <w:tr>
         <w:tc>
           <w:tcPr>
-            <w:tcW w:type="dxa" w:w="4000"/>
+            <w:tcW w:type="dxa" w:w="4300"/>
             <w:tcMar>
               <w:top w:w="80" w:type="dxa"/>
               <w:start w:w="120" w:type="dxa"/>
@@ -5862,7 +5890,7 @@
         </w:tc>
         <w:tc>
           <w:tcPr>
-            <w:tcW w:type="dxa" w:w="5360"/>
+            <w:tcW w:type="dxa" w:w="5060"/>
             <w:tcMar>
               <w:top w:w="80" w:type="dxa"/>
               <w:start w:w="120" w:type="dxa"/>
@@ -5889,7 +5917,7 @@
       <w:tr>
         <w:tc>
           <w:tcPr>
-            <w:tcW w:type="dxa" w:w="4000"/>
+            <w:tcW w:type="dxa" w:w="4300"/>
             <w:shd w:fill="FAFBFC"/>
             <w:tcMar>
               <w:top w:w="80" w:type="dxa"/>
@@ -5915,7 +5943,7 @@
         </w:tc>
         <w:tc>
           <w:tcPr>
-            <w:tcW w:type="dxa" w:w="5360"/>
+            <w:tcW w:type="dxa" w:w="5060"/>
             <w:shd w:fill="FAFBFC"/>
             <w:tcMar>
               <w:top w:w="80" w:type="dxa"/>
@@ -5943,7 +5971,7 @@
       <w:tr>
         <w:tc>
           <w:tcPr>
-            <w:tcW w:type="dxa" w:w="4000"/>
+            <w:tcW w:type="dxa" w:w="4300"/>
             <w:tcMar>
               <w:top w:w="80" w:type="dxa"/>
               <w:start w:w="120" w:type="dxa"/>
@@ -5968,7 +5996,7 @@
         </w:tc>
         <w:tc>
           <w:tcPr>
-            <w:tcW w:type="dxa" w:w="5360"/>
+            <w:tcW w:type="dxa" w:w="5060"/>
             <w:tcMar>
               <w:top w:w="80" w:type="dxa"/>
               <w:start w:w="120" w:type="dxa"/>
@@ -5995,7 +6023,7 @@
       <w:tr>
         <w:tc>
           <w:tcPr>
-            <w:tcW w:type="dxa" w:w="4000"/>
+            <w:tcW w:type="dxa" w:w="4300"/>
             <w:shd w:fill="FAFBFC"/>
             <w:tcMar>
               <w:top w:w="80" w:type="dxa"/>
@@ -6021,7 +6049,7 @@
         </w:tc>
         <w:tc>
           <w:tcPr>
-            <w:tcW w:type="dxa" w:w="5360"/>
+            <w:tcW w:type="dxa" w:w="5060"/>
             <w:shd w:fill="FAFBFC"/>
             <w:tcMar>
               <w:top w:w="80" w:type="dxa"/>
@@ -6049,7 +6077,7 @@
       <w:tr>
         <w:tc>
           <w:tcPr>
-            <w:tcW w:type="dxa" w:w="4000"/>
+            <w:tcW w:type="dxa" w:w="4300"/>
             <w:tcMar>
               <w:top w:w="80" w:type="dxa"/>
               <w:start w:w="120" w:type="dxa"/>
@@ -6074,7 +6102,7 @@
         </w:tc>
         <w:tc>
           <w:tcPr>
-            <w:tcW w:type="dxa" w:w="5360"/>
+            <w:tcW w:type="dxa" w:w="5060"/>
             <w:tcMar>
               <w:top w:w="80" w:type="dxa"/>
               <w:start w:w="120" w:type="dxa"/>
@@ -6101,7 +6129,7 @@
       <w:tr>
         <w:tc>
           <w:tcPr>
-            <w:tcW w:type="dxa" w:w="4000"/>
+            <w:tcW w:type="dxa" w:w="4300"/>
             <w:shd w:fill="FAFBFC"/>
             <w:tcMar>
               <w:top w:w="80" w:type="dxa"/>
@@ -6127,7 +6155,7 @@
         </w:tc>
         <w:tc>
           <w:tcPr>
-            <w:tcW w:type="dxa" w:w="5360"/>
+            <w:tcW w:type="dxa" w:w="5060"/>
             <w:shd w:fill="FAFBFC"/>
             <w:tcMar>
               <w:top w:w="80" w:type="dxa"/>
@@ -6155,7 +6183,7 @@
       <w:tr>
         <w:tc>
           <w:tcPr>
-            <w:tcW w:type="dxa" w:w="4000"/>
+            <w:tcW w:type="dxa" w:w="4300"/>
             <w:tcMar>
               <w:top w:w="80" w:type="dxa"/>
               <w:start w:w="120" w:type="dxa"/>
@@ -6180,7 +6208,7 @@
         </w:tc>
         <w:tc>
           <w:tcPr>
-            <w:tcW w:type="dxa" w:w="5360"/>
+            <w:tcW w:type="dxa" w:w="5060"/>
             <w:tcMar>
               <w:top w:w="80" w:type="dxa"/>
               <w:start w:w="120" w:type="dxa"/>
@@ -6207,7 +6235,7 @@
       <w:tr>
         <w:tc>
           <w:tcPr>
-            <w:tcW w:type="dxa" w:w="4000"/>
+            <w:tcW w:type="dxa" w:w="4300"/>
             <w:shd w:fill="FAFBFC"/>
             <w:tcMar>
               <w:top w:w="80" w:type="dxa"/>
@@ -6233,7 +6261,7 @@
         </w:tc>
         <w:tc>
           <w:tcPr>
-            <w:tcW w:type="dxa" w:w="5360"/>
+            <w:tcW w:type="dxa" w:w="5060"/>
             <w:shd w:fill="FAFBFC"/>
             <w:tcMar>
               <w:top w:w="80" w:type="dxa"/>
@@ -6261,7 +6289,7 @@
       <w:tr>
         <w:tc>
           <w:tcPr>
-            <w:tcW w:type="dxa" w:w="4000"/>
+            <w:tcW w:type="dxa" w:w="4300"/>
             <w:tcMar>
               <w:top w:w="80" w:type="dxa"/>
               <w:start w:w="120" w:type="dxa"/>
@@ -6286,7 +6314,7 @@
         </w:tc>
         <w:tc>
           <w:tcPr>
-            <w:tcW w:type="dxa" w:w="5360"/>
+            <w:tcW w:type="dxa" w:w="5060"/>
             <w:tcMar>
               <w:top w:w="80" w:type="dxa"/>
               <w:start w:w="120" w:type="dxa"/>
@@ -6313,7 +6341,7 @@
       <w:tr>
         <w:tc>
           <w:tcPr>
-            <w:tcW w:type="dxa" w:w="4000"/>
+            <w:tcW w:type="dxa" w:w="4300"/>
             <w:shd w:fill="FAFBFC"/>
             <w:tcMar>
               <w:top w:w="80" w:type="dxa"/>
@@ -6339,7 +6367,7 @@
         </w:tc>
         <w:tc>
           <w:tcPr>
-            <w:tcW w:type="dxa" w:w="5360"/>
+            <w:tcW w:type="dxa" w:w="5060"/>
             <w:shd w:fill="FAFBFC"/>
             <w:tcMar>
               <w:top w:w="80" w:type="dxa"/>
@@ -6367,7 +6395,7 @@
       <w:tr>
         <w:tc>
           <w:tcPr>
-            <w:tcW w:type="dxa" w:w="4000"/>
+            <w:tcW w:type="dxa" w:w="4300"/>
             <w:tcMar>
               <w:top w:w="80" w:type="dxa"/>
               <w:start w:w="120" w:type="dxa"/>
@@ -6392,7 +6420,7 @@
         </w:tc>
         <w:tc>
           <w:tcPr>
-            <w:tcW w:type="dxa" w:w="5360"/>
+            <w:tcW w:type="dxa" w:w="5060"/>
             <w:tcMar>
               <w:top w:w="80" w:type="dxa"/>
               <w:start w:w="120" w:type="dxa"/>
@@ -6419,7 +6447,7 @@
       <w:tr>
         <w:tc>
           <w:tcPr>
-            <w:tcW w:type="dxa" w:w="4000"/>
+            <w:tcW w:type="dxa" w:w="4300"/>
             <w:shd w:fill="FAFBFC"/>
             <w:tcMar>
               <w:top w:w="80" w:type="dxa"/>
@@ -6445,7 +6473,7 @@
         </w:tc>
         <w:tc>
           <w:tcPr>
-            <w:tcW w:type="dxa" w:w="5360"/>
+            <w:tcW w:type="dxa" w:w="5060"/>
             <w:shd w:fill="FAFBFC"/>
             <w:tcMar>
               <w:top w:w="80" w:type="dxa"/>
@@ -6473,7 +6501,7 @@
       <w:tr>
         <w:tc>
           <w:tcPr>
-            <w:tcW w:type="dxa" w:w="4000"/>
+            <w:tcW w:type="dxa" w:w="4300"/>
             <w:tcMar>
               <w:top w:w="80" w:type="dxa"/>
               <w:start w:w="120" w:type="dxa"/>
@@ -6498,7 +6526,7 @@
         </w:tc>
         <w:tc>
           <w:tcPr>
-            <w:tcW w:type="dxa" w:w="5360"/>
+            <w:tcW w:type="dxa" w:w="5060"/>
             <w:tcMar>
               <w:top w:w="80" w:type="dxa"/>
               <w:start w:w="120" w:type="dxa"/>
@@ -6525,7 +6553,7 @@
       <w:tr>
         <w:tc>
           <w:tcPr>
-            <w:tcW w:type="dxa" w:w="4000"/>
+            <w:tcW w:type="dxa" w:w="4300"/>
             <w:shd w:fill="FAFBFC"/>
             <w:tcMar>
               <w:top w:w="80" w:type="dxa"/>
@@ -6551,7 +6579,7 @@
         </w:tc>
         <w:tc>
           <w:tcPr>
-            <w:tcW w:type="dxa" w:w="5360"/>
+            <w:tcW w:type="dxa" w:w="5060"/>
             <w:shd w:fill="FAFBFC"/>
             <w:tcMar>
               <w:top w:w="80" w:type="dxa"/>
@@ -6579,7 +6607,7 @@
       <w:tr>
         <w:tc>
           <w:tcPr>
-            <w:tcW w:type="dxa" w:w="4000"/>
+            <w:tcW w:type="dxa" w:w="4300"/>
             <w:tcMar>
               <w:top w:w="80" w:type="dxa"/>
               <w:start w:w="120" w:type="dxa"/>
@@ -6604,7 +6632,7 @@
         </w:tc>
         <w:tc>
           <w:tcPr>
-            <w:tcW w:type="dxa" w:w="5360"/>
+            <w:tcW w:type="dxa" w:w="5060"/>
             <w:tcMar>
               <w:top w:w="80" w:type="dxa"/>
               <w:start w:w="120" w:type="dxa"/>
@@ -6631,7 +6659,7 @@
       <w:tr>
         <w:tc>
           <w:tcPr>
-            <w:tcW w:type="dxa" w:w="4000"/>
+            <w:tcW w:type="dxa" w:w="4300"/>
             <w:shd w:fill="FAFBFC"/>
             <w:tcMar>
               <w:top w:w="80" w:type="dxa"/>
@@ -6657,7 +6685,7 @@
         </w:tc>
         <w:tc>
           <w:tcPr>
-            <w:tcW w:type="dxa" w:w="5360"/>
+            <w:tcW w:type="dxa" w:w="5060"/>
             <w:shd w:fill="FAFBFC"/>
             <w:tcMar>
               <w:top w:w="80" w:type="dxa"/>
@@ -6685,7 +6713,7 @@
       <w:tr>
         <w:tc>
           <w:tcPr>
-            <w:tcW w:type="dxa" w:w="4000"/>
+            <w:tcW w:type="dxa" w:w="4300"/>
             <w:tcMar>
               <w:top w:w="80" w:type="dxa"/>
               <w:start w:w="120" w:type="dxa"/>
@@ -6710,7 +6738,7 @@
         </w:tc>
         <w:tc>
           <w:tcPr>
-            <w:tcW w:type="dxa" w:w="5360"/>
+            <w:tcW w:type="dxa" w:w="5060"/>
             <w:tcMar>
               <w:top w:w="80" w:type="dxa"/>
               <w:start w:w="120" w:type="dxa"/>
@@ -6737,7 +6765,7 @@
       <w:tr>
         <w:tc>
           <w:tcPr>
-            <w:tcW w:type="dxa" w:w="4000"/>
+            <w:tcW w:type="dxa" w:w="4300"/>
             <w:shd w:fill="FAFBFC"/>
             <w:tcMar>
               <w:top w:w="80" w:type="dxa"/>
@@ -6763,7 +6791,7 @@
         </w:tc>
         <w:tc>
           <w:tcPr>
-            <w:tcW w:type="dxa" w:w="5360"/>
+            <w:tcW w:type="dxa" w:w="5060"/>
             <w:shd w:fill="FAFBFC"/>
             <w:tcMar>
               <w:top w:w="80" w:type="dxa"/>
@@ -6791,7 +6819,7 @@
       <w:tr>
         <w:tc>
           <w:tcPr>
-            <w:tcW w:type="dxa" w:w="4000"/>
+            <w:tcW w:type="dxa" w:w="4300"/>
             <w:tcMar>
               <w:top w:w="80" w:type="dxa"/>
               <w:start w:w="120" w:type="dxa"/>
@@ -6816,7 +6844,7 @@
         </w:tc>
         <w:tc>
           <w:tcPr>
-            <w:tcW w:type="dxa" w:w="5360"/>
+            <w:tcW w:type="dxa" w:w="5060"/>
             <w:tcMar>
               <w:top w:w="80" w:type="dxa"/>
               <w:start w:w="120" w:type="dxa"/>
@@ -6843,7 +6871,7 @@
       <w:tr>
         <w:tc>
           <w:tcPr>
-            <w:tcW w:type="dxa" w:w="4000"/>
+            <w:tcW w:type="dxa" w:w="4300"/>
             <w:shd w:fill="FAFBFC"/>
             <w:tcMar>
               <w:top w:w="80" w:type="dxa"/>
@@ -6869,7 +6897,7 @@
         </w:tc>
         <w:tc>
           <w:tcPr>
-            <w:tcW w:type="dxa" w:w="5360"/>
+            <w:tcW w:type="dxa" w:w="5060"/>
             <w:shd w:fill="FAFBFC"/>
             <w:tcMar>
               <w:top w:w="80" w:type="dxa"/>
@@ -6897,7 +6925,7 @@
       <w:tr>
         <w:tc>
           <w:tcPr>
-            <w:tcW w:type="dxa" w:w="4000"/>
+            <w:tcW w:type="dxa" w:w="4300"/>
             <w:tcMar>
               <w:top w:w="80" w:type="dxa"/>
               <w:start w:w="120" w:type="dxa"/>
@@ -6922,7 +6950,7 @@
         </w:tc>
         <w:tc>
           <w:tcPr>
-            <w:tcW w:type="dxa" w:w="5360"/>
+            <w:tcW w:type="dxa" w:w="5060"/>
             <w:tcMar>
               <w:top w:w="80" w:type="dxa"/>
               <w:start w:w="120" w:type="dxa"/>
@@ -6949,7 +6977,7 @@
       <w:tr>
         <w:tc>
           <w:tcPr>
-            <w:tcW w:type="dxa" w:w="4000"/>
+            <w:tcW w:type="dxa" w:w="4300"/>
             <w:shd w:fill="FAFBFC"/>
             <w:tcMar>
               <w:top w:w="80" w:type="dxa"/>
@@ -6975,7 +7003,7 @@
         </w:tc>
         <w:tc>
           <w:tcPr>
-            <w:tcW w:type="dxa" w:w="5360"/>
+            <w:tcW w:type="dxa" w:w="5060"/>
             <w:shd w:fill="FAFBFC"/>
             <w:tcMar>
               <w:top w:w="80" w:type="dxa"/>
@@ -7003,7 +7031,7 @@
       <w:tr>
         <w:tc>
           <w:tcPr>
-            <w:tcW w:type="dxa" w:w="4000"/>
+            <w:tcW w:type="dxa" w:w="4300"/>
             <w:tcMar>
               <w:top w:w="80" w:type="dxa"/>
               <w:start w:w="120" w:type="dxa"/>
@@ -7028,7 +7056,7 @@
         </w:tc>
         <w:tc>
           <w:tcPr>
-            <w:tcW w:type="dxa" w:w="5360"/>
+            <w:tcW w:type="dxa" w:w="5060"/>
             <w:tcMar>
               <w:top w:w="80" w:type="dxa"/>
               <w:start w:w="120" w:type="dxa"/>
@@ -7055,7 +7083,7 @@
       <w:tr>
         <w:tc>
           <w:tcPr>
-            <w:tcW w:type="dxa" w:w="4000"/>
+            <w:tcW w:type="dxa" w:w="4300"/>
             <w:shd w:fill="FAFBFC"/>
             <w:tcMar>
               <w:top w:w="80" w:type="dxa"/>
@@ -7081,7 +7109,7 @@
         </w:tc>
         <w:tc>
           <w:tcPr>
-            <w:tcW w:type="dxa" w:w="5360"/>
+            <w:tcW w:type="dxa" w:w="5060"/>
             <w:shd w:fill="FAFBFC"/>
             <w:tcMar>
               <w:top w:w="80" w:type="dxa"/>
@@ -7109,7 +7137,7 @@
       <w:tr>
         <w:tc>
           <w:tcPr>
-            <w:tcW w:type="dxa" w:w="4000"/>
+            <w:tcW w:type="dxa" w:w="4300"/>
             <w:tcMar>
               <w:top w:w="80" w:type="dxa"/>
               <w:start w:w="120" w:type="dxa"/>
@@ -7134,7 +7162,7 @@
         </w:tc>
         <w:tc>
           <w:tcPr>
-            <w:tcW w:type="dxa" w:w="5360"/>
+            <w:tcW w:type="dxa" w:w="5060"/>
             <w:tcMar>
               <w:top w:w="80" w:type="dxa"/>
               <w:start w:w="120" w:type="dxa"/>
@@ -7161,7 +7189,7 @@
       <w:tr>
         <w:tc>
           <w:tcPr>
-            <w:tcW w:type="dxa" w:w="4000"/>
+            <w:tcW w:type="dxa" w:w="4300"/>
             <w:shd w:fill="FAFBFC"/>
             <w:tcMar>
               <w:top w:w="80" w:type="dxa"/>
@@ -7187,7 +7215,7 @@
         </w:tc>
         <w:tc>
           <w:tcPr>
-            <w:tcW w:type="dxa" w:w="5360"/>
+            <w:tcW w:type="dxa" w:w="5060"/>
             <w:shd w:fill="FAFBFC"/>
             <w:tcMar>
               <w:top w:w="80" w:type="dxa"/>
@@ -7215,7 +7243,7 @@
       <w:tr>
         <w:tc>
           <w:tcPr>
-            <w:tcW w:type="dxa" w:w="4000"/>
+            <w:tcW w:type="dxa" w:w="4300"/>
             <w:tcMar>
               <w:top w:w="80" w:type="dxa"/>
               <w:start w:w="120" w:type="dxa"/>
@@ -7240,7 +7268,7 @@
         </w:tc>
         <w:tc>
           <w:tcPr>
-            <w:tcW w:type="dxa" w:w="5360"/>
+            <w:tcW w:type="dxa" w:w="5060"/>
             <w:tcMar>
               <w:top w:w="80" w:type="dxa"/>
               <w:start w:w="120" w:type="dxa"/>
@@ -7267,7 +7295,7 @@
       <w:tr>
         <w:tc>
           <w:tcPr>
-            <w:tcW w:type="dxa" w:w="4000"/>
+            <w:tcW w:type="dxa" w:w="4300"/>
             <w:shd w:fill="FAFBFC"/>
             <w:tcMar>
               <w:top w:w="80" w:type="dxa"/>
@@ -7293,7 +7321,7 @@
         </w:tc>
         <w:tc>
           <w:tcPr>
-            <w:tcW w:type="dxa" w:w="5360"/>
+            <w:tcW w:type="dxa" w:w="5060"/>
             <w:shd w:fill="FAFBFC"/>
             <w:tcMar>
               <w:top w:w="80" w:type="dxa"/>
@@ -7321,7 +7349,7 @@
       <w:tr>
         <w:tc>
           <w:tcPr>
-            <w:tcW w:type="dxa" w:w="4000"/>
+            <w:tcW w:type="dxa" w:w="4300"/>
             <w:tcMar>
               <w:top w:w="80" w:type="dxa"/>
               <w:start w:w="120" w:type="dxa"/>
@@ -7346,7 +7374,7 @@
         </w:tc>
         <w:tc>
           <w:tcPr>
-            <w:tcW w:type="dxa" w:w="5360"/>
+            <w:tcW w:type="dxa" w:w="5060"/>
             <w:tcMar>
               <w:top w:w="80" w:type="dxa"/>
               <w:start w:w="120" w:type="dxa"/>
@@ -7373,8 +7401,167 @@
       <w:tr>
         <w:tc>
           <w:tcPr>
-            <w:tcW w:type="dxa" w:w="4000"/>
+            <w:tcW w:type="dxa" w:w="4300"/>
             <w:shd w:fill="FAFBFC"/>
+            <w:tcMar>
+              <w:top w:w="80" w:type="dxa"/>
+              <w:start w:w="120" w:type="dxa"/>
+              <w:bottom w:w="80" w:type="dxa"/>
+              <w:end w:w="120" w:type="dxa"/>
+            </w:tcMar>
+            <w:vAlign w:val="center"/>
+          </w:tcPr>
+          <w:p>
+            <w:pPr>
+              <w:spacing w:before="0" w:after="0" w:line="240" w:lineRule="auto"/>
+              <w:jc w:val="left"/>
+            </w:pPr>
+            <w:r>
+              <w:rPr>
+                <w:rFonts w:ascii="맑은 고딕" w:hAnsi="맑은 고딕" w:eastAsia="맑은 고딕" w:cs="맑은 고딕"/>
+                <w:sz w:val="16"/>
+              </w:rPr>
+              <w:t>VIEWER_MONITOR_STATE_CORRUPT</w:t>
+            </w:r>
+          </w:p>
+        </w:tc>
+        <w:tc>
+          <w:tcPr>
+            <w:tcW w:type="dxa" w:w="5060"/>
+            <w:shd w:fill="FAFBFC"/>
+            <w:tcMar>
+              <w:top w:w="80" w:type="dxa"/>
+              <w:start w:w="120" w:type="dxa"/>
+              <w:bottom w:w="80" w:type="dxa"/>
+              <w:end w:w="120" w:type="dxa"/>
+            </w:tcMar>
+            <w:vAlign w:val="center"/>
+          </w:tcPr>
+          <w:p>
+            <w:pPr>
+              <w:spacing w:before="0" w:after="0" w:line="240" w:lineRule="auto"/>
+              <w:jc w:val="left"/>
+            </w:pPr>
+            <w:r>
+              <w:rPr>
+                <w:rFonts w:ascii="맑은 고딕" w:hAnsi="맑은 고딕" w:eastAsia="맑은 고딕" w:cs="맑은 고딕"/>
+                <w:sz w:val="16"/>
+              </w:rPr>
+              <w:t>이번 실행의 자동 감시가 중지됨. 격리된 원본을 보존하고 Viewer를 다시 시작해 새 기준선 생성</w:t>
+            </w:r>
+          </w:p>
+        </w:tc>
+      </w:tr>
+      <w:tr>
+        <w:tc>
+          <w:tcPr>
+            <w:tcW w:type="dxa" w:w="4300"/>
+            <w:tcMar>
+              <w:top w:w="80" w:type="dxa"/>
+              <w:start w:w="120" w:type="dxa"/>
+              <w:bottom w:w="80" w:type="dxa"/>
+              <w:end w:w="120" w:type="dxa"/>
+            </w:tcMar>
+            <w:vAlign w:val="center"/>
+          </w:tcPr>
+          <w:p>
+            <w:pPr>
+              <w:spacing w:before="0" w:after="0" w:line="240" w:lineRule="auto"/>
+              <w:jc w:val="left"/>
+            </w:pPr>
+            <w:r>
+              <w:rPr>
+                <w:rFonts w:ascii="맑은 고딕" w:hAnsi="맑은 고딕" w:eastAsia="맑은 고딕" w:cs="맑은 고딕"/>
+                <w:sz w:val="16"/>
+              </w:rPr>
+              <w:t>VIEWER_MONITOR_STATE_VERSION_UNSUPPORTED</w:t>
+            </w:r>
+          </w:p>
+        </w:tc>
+        <w:tc>
+          <w:tcPr>
+            <w:tcW w:type="dxa" w:w="5060"/>
+            <w:tcMar>
+              <w:top w:w="80" w:type="dxa"/>
+              <w:start w:w="120" w:type="dxa"/>
+              <w:bottom w:w="80" w:type="dxa"/>
+              <w:end w:w="120" w:type="dxa"/>
+            </w:tcMar>
+            <w:vAlign w:val="center"/>
+          </w:tcPr>
+          <w:p>
+            <w:pPr>
+              <w:spacing w:before="0" w:after="0" w:line="240" w:lineRule="auto"/>
+              <w:jc w:val="left"/>
+            </w:pPr>
+            <w:r>
+              <w:rPr>
+                <w:rFonts w:ascii="맑은 고딕" w:hAnsi="맑은 고딕" w:eastAsia="맑은 고딕" w:cs="맑은 고딕"/>
+                <w:sz w:val="16"/>
+              </w:rPr>
+              <w:t>파일을 변경하지 말고 같거나 최신 버전의 Viewer로 실행</w:t>
+            </w:r>
+          </w:p>
+        </w:tc>
+      </w:tr>
+      <w:tr>
+        <w:tc>
+          <w:tcPr>
+            <w:tcW w:type="dxa" w:w="4300"/>
+            <w:shd w:fill="FAFBFC"/>
+            <w:tcMar>
+              <w:top w:w="80" w:type="dxa"/>
+              <w:start w:w="120" w:type="dxa"/>
+              <w:bottom w:w="80" w:type="dxa"/>
+              <w:end w:w="120" w:type="dxa"/>
+            </w:tcMar>
+            <w:vAlign w:val="center"/>
+          </w:tcPr>
+          <w:p>
+            <w:pPr>
+              <w:spacing w:before="0" w:after="0" w:line="240" w:lineRule="auto"/>
+              <w:jc w:val="left"/>
+            </w:pPr>
+            <w:r>
+              <w:rPr>
+                <w:rFonts w:ascii="맑은 고딕" w:hAnsi="맑은 고딕" w:eastAsia="맑은 고딕" w:cs="맑은 고딕"/>
+                <w:sz w:val="16"/>
+              </w:rPr>
+              <w:t>VIEWER_MONITOR_STATE_UNAVAILABLE</w:t>
+            </w:r>
+          </w:p>
+        </w:tc>
+        <w:tc>
+          <w:tcPr>
+            <w:tcW w:type="dxa" w:w="5060"/>
+            <w:shd w:fill="FAFBFC"/>
+            <w:tcMar>
+              <w:top w:w="80" w:type="dxa"/>
+              <w:start w:w="120" w:type="dxa"/>
+              <w:bottom w:w="80" w:type="dxa"/>
+              <w:end w:w="120" w:type="dxa"/>
+            </w:tcMar>
+            <w:vAlign w:val="center"/>
+          </w:tcPr>
+          <w:p>
+            <w:pPr>
+              <w:spacing w:before="0" w:after="0" w:line="240" w:lineRule="auto"/>
+              <w:jc w:val="left"/>
+            </w:pPr>
+            <w:r>
+              <w:rPr>
+                <w:rFonts w:ascii="맑은 고딕" w:hAnsi="맑은 고딕" w:eastAsia="맑은 고딕" w:cs="맑은 고딕"/>
+                <w:sz w:val="16"/>
+              </w:rPr>
+              <w:t>자동 감시가 중지됨. Viewer 사용자 폴더 권한·파일 잠금 확인 후 재시작</w:t>
+            </w:r>
+          </w:p>
+        </w:tc>
+      </w:tr>
+      <w:tr>
+        <w:tc>
+          <w:tcPr>
+            <w:tcW w:type="dxa" w:w="4300"/>
             <w:tcMar>
               <w:top w:w="80" w:type="dxa"/>
               <w:start w:w="120" w:type="dxa"/>
@@ -7399,8 +7586,7 @@
         </w:tc>
         <w:tc>
           <w:tcPr>
-            <w:tcW w:type="dxa" w:w="5360"/>
-            <w:shd w:fill="FAFBFC"/>
+            <w:tcW w:type="dxa" w:w="5060"/>
             <w:tcMar>
               <w:top w:w="80" w:type="dxa"/>
               <w:start w:w="120" w:type="dxa"/>
@@ -7427,7 +7613,8 @@
       <w:tr>
         <w:tc>
           <w:tcPr>
-            <w:tcW w:type="dxa" w:w="4000"/>
+            <w:tcW w:type="dxa" w:w="4300"/>
+            <w:shd w:fill="FAFBFC"/>
             <w:tcMar>
               <w:top w:w="80" w:type="dxa"/>
               <w:start w:w="120" w:type="dxa"/>
@@ -7452,7 +7639,8 @@
         </w:tc>
         <w:tc>
           <w:tcPr>
-            <w:tcW w:type="dxa" w:w="5360"/>
+            <w:tcW w:type="dxa" w:w="5060"/>
+            <w:shd w:fill="FAFBFC"/>
             <w:tcMar>
               <w:top w:w="80" w:type="dxa"/>
               <w:start w:w="120" w:type="dxa"/>
@@ -8154,7 +8342,7 @@
         <w:color w:val="64748B"/>
         <w:sz w:val="17"/>
       </w:rPr>
-      <w:t xml:space="preserve">v0.9.20-poc  |  </w:t>
+      <w:t xml:space="preserve">v0.9.21-poc  |  </w:t>
     </w:r>
     <w:r>
       <w:rPr>
@@ -8185,7 +8373,7 @@
         <w:color w:val="64748B"/>
         <w:sz w:val="17"/>
       </w:rPr>
-      <w:t>v0.9.20-poc  |  2026-07-28</w:t>
+      <w:t>v0.9.21-poc  |  2026-07-28</w:t>
     </w:r>
   </w:p>
 </w:ftr>

</xml_diff>

<commit_message>
fix: fail closed on invalid monitoring state (#31)
Validated with 459 automated tests and Windows package contracts. No live switch validation was performed.
</commit_message>
<xml_diff>
--- a/docs/SamsungSwitchWatch_User_Manual_KO.docx
+++ b/docs/SamsungSwitchWatch_User_Manual_KO.docx
@@ -1336,7 +1336,7 @@
           <w:color w:val="16324F"/>
           <w:sz w:val="21"/>
         </w:rPr>
-        <w:t>관리자 설치 창에 Agent installation failed가 표시되면 Cause 줄을 먼저 확인하세요. 설치 성공 뒤 AGENT_CONNECTION_REFUSED가 보이면 Viewer에 스위치 IP, Viewer PC 주소 또는 localhost가 아니라 Agent를 설치한 PC 주소를 입력했는지 먼저 확인하세요. 그 다음 SamsungSwitchWatchAgent 서비스와 TCP/18443을 점검합니다. 서비스를 수동 등록하지 말고 0.9.20-poc Agent 설치기를 사용하세요.</w:t>
+        <w:t>관리자 설치 창에 Agent installation failed가 표시되면 Cause 줄을 먼저 확인하세요. 설치 성공 뒤 AGENT_CONNECTION_REFUSED가 보이면 Viewer에 스위치 IP, Viewer PC 주소 또는 localhost가 아니라 Agent를 설치한 PC 주소를 입력했는지 먼저 확인하세요. 그 다음 SamsungSwitchWatchAgent 서비스와 TCP/18443을 점검합니다. 서비스를 수동 등록하지 말고 0.9.21-poc Agent 설치기를 사용하세요.</w:t>
       </w:r>
     </w:p>
     <w:p>
@@ -3309,6 +3309,34 @@
     </w:p>
     <w:p>
       <w:pPr>
+        <w:keepLines/>
+        <w:spacing w:before="80" w:after="160" w:line="283" w:lineRule="auto"/>
+        <w:ind w:left="115" w:right="58"/>
+        <w:shd w:fill="FFF8E8"/>
+        <w:pBdr>
+          <w:left w:val="single" w:sz="16" w:space="8" w:color="8A5A00"/>
+        </w:pBdr>
+      </w:pPr>
+      <w:r>
+        <w:rPr>
+          <w:rFonts w:ascii="맑은 고딕" w:hAnsi="맑은 고딕" w:eastAsia="맑은 고딕" w:cs="맑은 고딕"/>
+          <w:b/>
+          <w:color w:val="8A5A00"/>
+          <w:sz w:val="21"/>
+        </w:rPr>
+        <w:t xml:space="preserve">감시 이력 파일 오류  </w:t>
+      </w:r>
+      <w:r>
+        <w:rPr>
+          <w:rFonts w:ascii="맑은 고딕" w:hAnsi="맑은 고딕" w:eastAsia="맑은 고딕" w:cs="맑은 고딕"/>
+          <w:color w:val="16324F"/>
+          <w:sz w:val="21"/>
+        </w:rPr>
+        <w:t>감시 이력 파일이 손상됐거나 현재 Viewer보다 새로운 형식이거나 읽기·쓰기가 불가능하면 Viewer는 이전 장애를 정상으로 오판하지 않도록 자동 감시와 이력 저장을 중지합니다. 장비의 수동 show 조회는 계속 사용할 수 있습니다. 화면의 오류 코드와 조치 안내에 따라 격리 파일, Viewer 버전, 사용자 폴더 권한·파일 잠금을 확인한 뒤 Viewer를 다시 시작하세요.</w:t>
+      </w:r>
+    </w:p>
+    <w:p>
+      <w:pPr>
         <w:pStyle w:val="Heading2"/>
         <w:pageBreakBefore w:val="0"/>
         <w:numPr>
@@ -5028,8 +5056,8 @@
         </w:tblBorders>
       </w:tblPr>
       <w:tblGrid>
-        <w:gridCol w:w="4000"/>
-        <w:gridCol w:w="5360"/>
+        <w:gridCol w:w="4300"/>
+        <w:gridCol w:w="5060"/>
       </w:tblGrid>
       <w:tr>
         <w:trPr>
@@ -5037,7 +5065,7 @@
         </w:trPr>
         <w:tc>
           <w:tcPr>
-            <w:tcW w:type="dxa" w:w="4000"/>
+            <w:tcW w:type="dxa" w:w="4300"/>
             <w:tcMar>
               <w:top w:w="80" w:type="dxa"/>
               <w:start w:w="120" w:type="dxa"/>
@@ -5065,7 +5093,7 @@
         </w:tc>
         <w:tc>
           <w:tcPr>
-            <w:tcW w:type="dxa" w:w="5360"/>
+            <w:tcW w:type="dxa" w:w="5060"/>
             <w:tcMar>
               <w:top w:w="80" w:type="dxa"/>
               <w:start w:w="120" w:type="dxa"/>
@@ -5095,7 +5123,7 @@
       <w:tr>
         <w:tc>
           <w:tcPr>
-            <w:tcW w:type="dxa" w:w="4000"/>
+            <w:tcW w:type="dxa" w:w="4300"/>
             <w:tcMar>
               <w:top w:w="80" w:type="dxa"/>
               <w:start w:w="120" w:type="dxa"/>
@@ -5120,7 +5148,7 @@
         </w:tc>
         <w:tc>
           <w:tcPr>
-            <w:tcW w:type="dxa" w:w="5360"/>
+            <w:tcW w:type="dxa" w:w="5060"/>
             <w:tcMar>
               <w:top w:w="80" w:type="dxa"/>
               <w:start w:w="120" w:type="dxa"/>
@@ -5147,7 +5175,7 @@
       <w:tr>
         <w:tc>
           <w:tcPr>
-            <w:tcW w:type="dxa" w:w="4000"/>
+            <w:tcW w:type="dxa" w:w="4300"/>
             <w:shd w:fill="FAFBFC"/>
             <w:tcMar>
               <w:top w:w="80" w:type="dxa"/>
@@ -5173,7 +5201,7 @@
         </w:tc>
         <w:tc>
           <w:tcPr>
-            <w:tcW w:type="dxa" w:w="5360"/>
+            <w:tcW w:type="dxa" w:w="5060"/>
             <w:shd w:fill="FAFBFC"/>
             <w:tcMar>
               <w:top w:w="80" w:type="dxa"/>
@@ -5201,7 +5229,7 @@
       <w:tr>
         <w:tc>
           <w:tcPr>
-            <w:tcW w:type="dxa" w:w="4000"/>
+            <w:tcW w:type="dxa" w:w="4300"/>
             <w:tcMar>
               <w:top w:w="80" w:type="dxa"/>
               <w:start w:w="120" w:type="dxa"/>
@@ -5226,7 +5254,7 @@
         </w:tc>
         <w:tc>
           <w:tcPr>
-            <w:tcW w:type="dxa" w:w="5360"/>
+            <w:tcW w:type="dxa" w:w="5060"/>
             <w:tcMar>
               <w:top w:w="80" w:type="dxa"/>
               <w:start w:w="120" w:type="dxa"/>
@@ -5253,7 +5281,7 @@
       <w:tr>
         <w:tc>
           <w:tcPr>
-            <w:tcW w:type="dxa" w:w="4000"/>
+            <w:tcW w:type="dxa" w:w="4300"/>
             <w:shd w:fill="FAFBFC"/>
             <w:tcMar>
               <w:top w:w="80" w:type="dxa"/>
@@ -5279,7 +5307,7 @@
         </w:tc>
         <w:tc>
           <w:tcPr>
-            <w:tcW w:type="dxa" w:w="5360"/>
+            <w:tcW w:type="dxa" w:w="5060"/>
             <w:shd w:fill="FAFBFC"/>
             <w:tcMar>
               <w:top w:w="80" w:type="dxa"/>
@@ -5307,7 +5335,7 @@
       <w:tr>
         <w:tc>
           <w:tcPr>
-            <w:tcW w:type="dxa" w:w="4000"/>
+            <w:tcW w:type="dxa" w:w="4300"/>
             <w:tcMar>
               <w:top w:w="80" w:type="dxa"/>
               <w:start w:w="120" w:type="dxa"/>
@@ -5332,7 +5360,7 @@
         </w:tc>
         <w:tc>
           <w:tcPr>
-            <w:tcW w:type="dxa" w:w="5360"/>
+            <w:tcW w:type="dxa" w:w="5060"/>
             <w:tcMar>
               <w:top w:w="80" w:type="dxa"/>
               <w:start w:w="120" w:type="dxa"/>
@@ -5359,7 +5387,7 @@
       <w:tr>
         <w:tc>
           <w:tcPr>
-            <w:tcW w:type="dxa" w:w="4000"/>
+            <w:tcW w:type="dxa" w:w="4300"/>
             <w:shd w:fill="FAFBFC"/>
             <w:tcMar>
               <w:top w:w="80" w:type="dxa"/>
@@ -5385,7 +5413,7 @@
         </w:tc>
         <w:tc>
           <w:tcPr>
-            <w:tcW w:type="dxa" w:w="5360"/>
+            <w:tcW w:type="dxa" w:w="5060"/>
             <w:shd w:fill="FAFBFC"/>
             <w:tcMar>
               <w:top w:w="80" w:type="dxa"/>
@@ -5413,7 +5441,7 @@
       <w:tr>
         <w:tc>
           <w:tcPr>
-            <w:tcW w:type="dxa" w:w="4000"/>
+            <w:tcW w:type="dxa" w:w="4300"/>
             <w:tcMar>
               <w:top w:w="80" w:type="dxa"/>
               <w:start w:w="120" w:type="dxa"/>
@@ -5438,7 +5466,7 @@
         </w:tc>
         <w:tc>
           <w:tcPr>
-            <w:tcW w:type="dxa" w:w="5360"/>
+            <w:tcW w:type="dxa" w:w="5060"/>
             <w:tcMar>
               <w:top w:w="80" w:type="dxa"/>
               <w:start w:w="120" w:type="dxa"/>
@@ -5465,7 +5493,7 @@
       <w:tr>
         <w:tc>
           <w:tcPr>
-            <w:tcW w:type="dxa" w:w="4000"/>
+            <w:tcW w:type="dxa" w:w="4300"/>
             <w:shd w:fill="FAFBFC"/>
             <w:tcMar>
               <w:top w:w="80" w:type="dxa"/>
@@ -5491,7 +5519,7 @@
         </w:tc>
         <w:tc>
           <w:tcPr>
-            <w:tcW w:type="dxa" w:w="5360"/>
+            <w:tcW w:type="dxa" w:w="5060"/>
             <w:shd w:fill="FAFBFC"/>
             <w:tcMar>
               <w:top w:w="80" w:type="dxa"/>
@@ -5519,7 +5547,7 @@
       <w:tr>
         <w:tc>
           <w:tcPr>
-            <w:tcW w:type="dxa" w:w="4000"/>
+            <w:tcW w:type="dxa" w:w="4300"/>
             <w:tcMar>
               <w:top w:w="80" w:type="dxa"/>
               <w:start w:w="120" w:type="dxa"/>
@@ -5544,7 +5572,7 @@
         </w:tc>
         <w:tc>
           <w:tcPr>
-            <w:tcW w:type="dxa" w:w="5360"/>
+            <w:tcW w:type="dxa" w:w="5060"/>
             <w:tcMar>
               <w:top w:w="80" w:type="dxa"/>
               <w:start w:w="120" w:type="dxa"/>
@@ -5571,7 +5599,7 @@
       <w:tr>
         <w:tc>
           <w:tcPr>
-            <w:tcW w:type="dxa" w:w="4000"/>
+            <w:tcW w:type="dxa" w:w="4300"/>
             <w:shd w:fill="FAFBFC"/>
             <w:tcMar>
               <w:top w:w="80" w:type="dxa"/>
@@ -5597,7 +5625,7 @@
         </w:tc>
         <w:tc>
           <w:tcPr>
-            <w:tcW w:type="dxa" w:w="5360"/>
+            <w:tcW w:type="dxa" w:w="5060"/>
             <w:shd w:fill="FAFBFC"/>
             <w:tcMar>
               <w:top w:w="80" w:type="dxa"/>
@@ -5625,7 +5653,7 @@
       <w:tr>
         <w:tc>
           <w:tcPr>
-            <w:tcW w:type="dxa" w:w="4000"/>
+            <w:tcW w:type="dxa" w:w="4300"/>
             <w:tcMar>
               <w:top w:w="80" w:type="dxa"/>
               <w:start w:w="120" w:type="dxa"/>
@@ -5650,7 +5678,7 @@
         </w:tc>
         <w:tc>
           <w:tcPr>
-            <w:tcW w:type="dxa" w:w="5360"/>
+            <w:tcW w:type="dxa" w:w="5060"/>
             <w:tcMar>
               <w:top w:w="80" w:type="dxa"/>
               <w:start w:w="120" w:type="dxa"/>
@@ -5677,7 +5705,7 @@
       <w:tr>
         <w:tc>
           <w:tcPr>
-            <w:tcW w:type="dxa" w:w="4000"/>
+            <w:tcW w:type="dxa" w:w="4300"/>
             <w:shd w:fill="FAFBFC"/>
             <w:tcMar>
               <w:top w:w="80" w:type="dxa"/>
@@ -5703,7 +5731,7 @@
         </w:tc>
         <w:tc>
           <w:tcPr>
-            <w:tcW w:type="dxa" w:w="5360"/>
+            <w:tcW w:type="dxa" w:w="5060"/>
             <w:shd w:fill="FAFBFC"/>
             <w:tcMar>
               <w:top w:w="80" w:type="dxa"/>
@@ -5731,7 +5759,7 @@
       <w:tr>
         <w:tc>
           <w:tcPr>
-            <w:tcW w:type="dxa" w:w="4000"/>
+            <w:tcW w:type="dxa" w:w="4300"/>
             <w:tcMar>
               <w:top w:w="80" w:type="dxa"/>
               <w:start w:w="120" w:type="dxa"/>
@@ -5756,7 +5784,7 @@
         </w:tc>
         <w:tc>
           <w:tcPr>
-            <w:tcW w:type="dxa" w:w="5360"/>
+            <w:tcW w:type="dxa" w:w="5060"/>
             <w:tcMar>
               <w:top w:w="80" w:type="dxa"/>
               <w:start w:w="120" w:type="dxa"/>
@@ -5783,7 +5811,7 @@
       <w:tr>
         <w:tc>
           <w:tcPr>
-            <w:tcW w:type="dxa" w:w="4000"/>
+            <w:tcW w:type="dxa" w:w="4300"/>
             <w:shd w:fill="FAFBFC"/>
             <w:tcMar>
               <w:top w:w="80" w:type="dxa"/>
@@ -5809,7 +5837,7 @@
         </w:tc>
         <w:tc>
           <w:tcPr>
-            <w:tcW w:type="dxa" w:w="5360"/>
+            <w:tcW w:type="dxa" w:w="5060"/>
             <w:shd w:fill="FAFBFC"/>
             <w:tcMar>
               <w:top w:w="80" w:type="dxa"/>
@@ -5837,7 +5865,7 @@
       <w:tr>
         <w:tc>
           <w:tcPr>
-            <w:tcW w:type="dxa" w:w="4000"/>
+            <w:tcW w:type="dxa" w:w="4300"/>
             <w:tcMar>
               <w:top w:w="80" w:type="dxa"/>
               <w:start w:w="120" w:type="dxa"/>
@@ -5862,7 +5890,7 @@
         </w:tc>
         <w:tc>
           <w:tcPr>
-            <w:tcW w:type="dxa" w:w="5360"/>
+            <w:tcW w:type="dxa" w:w="5060"/>
             <w:tcMar>
               <w:top w:w="80" w:type="dxa"/>
               <w:start w:w="120" w:type="dxa"/>
@@ -5889,7 +5917,7 @@
       <w:tr>
         <w:tc>
           <w:tcPr>
-            <w:tcW w:type="dxa" w:w="4000"/>
+            <w:tcW w:type="dxa" w:w="4300"/>
             <w:shd w:fill="FAFBFC"/>
             <w:tcMar>
               <w:top w:w="80" w:type="dxa"/>
@@ -5915,7 +5943,7 @@
         </w:tc>
         <w:tc>
           <w:tcPr>
-            <w:tcW w:type="dxa" w:w="5360"/>
+            <w:tcW w:type="dxa" w:w="5060"/>
             <w:shd w:fill="FAFBFC"/>
             <w:tcMar>
               <w:top w:w="80" w:type="dxa"/>
@@ -5943,7 +5971,7 @@
       <w:tr>
         <w:tc>
           <w:tcPr>
-            <w:tcW w:type="dxa" w:w="4000"/>
+            <w:tcW w:type="dxa" w:w="4300"/>
             <w:tcMar>
               <w:top w:w="80" w:type="dxa"/>
               <w:start w:w="120" w:type="dxa"/>
@@ -5968,7 +5996,7 @@
         </w:tc>
         <w:tc>
           <w:tcPr>
-            <w:tcW w:type="dxa" w:w="5360"/>
+            <w:tcW w:type="dxa" w:w="5060"/>
             <w:tcMar>
               <w:top w:w="80" w:type="dxa"/>
               <w:start w:w="120" w:type="dxa"/>
@@ -5995,7 +6023,7 @@
       <w:tr>
         <w:tc>
           <w:tcPr>
-            <w:tcW w:type="dxa" w:w="4000"/>
+            <w:tcW w:type="dxa" w:w="4300"/>
             <w:shd w:fill="FAFBFC"/>
             <w:tcMar>
               <w:top w:w="80" w:type="dxa"/>
@@ -6021,7 +6049,7 @@
         </w:tc>
         <w:tc>
           <w:tcPr>
-            <w:tcW w:type="dxa" w:w="5360"/>
+            <w:tcW w:type="dxa" w:w="5060"/>
             <w:shd w:fill="FAFBFC"/>
             <w:tcMar>
               <w:top w:w="80" w:type="dxa"/>
@@ -6049,7 +6077,7 @@
       <w:tr>
         <w:tc>
           <w:tcPr>
-            <w:tcW w:type="dxa" w:w="4000"/>
+            <w:tcW w:type="dxa" w:w="4300"/>
             <w:tcMar>
               <w:top w:w="80" w:type="dxa"/>
               <w:start w:w="120" w:type="dxa"/>
@@ -6074,7 +6102,7 @@
         </w:tc>
         <w:tc>
           <w:tcPr>
-            <w:tcW w:type="dxa" w:w="5360"/>
+            <w:tcW w:type="dxa" w:w="5060"/>
             <w:tcMar>
               <w:top w:w="80" w:type="dxa"/>
               <w:start w:w="120" w:type="dxa"/>
@@ -6101,7 +6129,7 @@
       <w:tr>
         <w:tc>
           <w:tcPr>
-            <w:tcW w:type="dxa" w:w="4000"/>
+            <w:tcW w:type="dxa" w:w="4300"/>
             <w:shd w:fill="FAFBFC"/>
             <w:tcMar>
               <w:top w:w="80" w:type="dxa"/>
@@ -6127,7 +6155,7 @@
         </w:tc>
         <w:tc>
           <w:tcPr>
-            <w:tcW w:type="dxa" w:w="5360"/>
+            <w:tcW w:type="dxa" w:w="5060"/>
             <w:shd w:fill="FAFBFC"/>
             <w:tcMar>
               <w:top w:w="80" w:type="dxa"/>
@@ -6155,7 +6183,7 @@
       <w:tr>
         <w:tc>
           <w:tcPr>
-            <w:tcW w:type="dxa" w:w="4000"/>
+            <w:tcW w:type="dxa" w:w="4300"/>
             <w:tcMar>
               <w:top w:w="80" w:type="dxa"/>
               <w:start w:w="120" w:type="dxa"/>
@@ -6180,7 +6208,7 @@
         </w:tc>
         <w:tc>
           <w:tcPr>
-            <w:tcW w:type="dxa" w:w="5360"/>
+            <w:tcW w:type="dxa" w:w="5060"/>
             <w:tcMar>
               <w:top w:w="80" w:type="dxa"/>
               <w:start w:w="120" w:type="dxa"/>
@@ -6207,7 +6235,7 @@
       <w:tr>
         <w:tc>
           <w:tcPr>
-            <w:tcW w:type="dxa" w:w="4000"/>
+            <w:tcW w:type="dxa" w:w="4300"/>
             <w:shd w:fill="FAFBFC"/>
             <w:tcMar>
               <w:top w:w="80" w:type="dxa"/>
@@ -6233,7 +6261,7 @@
         </w:tc>
         <w:tc>
           <w:tcPr>
-            <w:tcW w:type="dxa" w:w="5360"/>
+            <w:tcW w:type="dxa" w:w="5060"/>
             <w:shd w:fill="FAFBFC"/>
             <w:tcMar>
               <w:top w:w="80" w:type="dxa"/>
@@ -6261,7 +6289,7 @@
       <w:tr>
         <w:tc>
           <w:tcPr>
-            <w:tcW w:type="dxa" w:w="4000"/>
+            <w:tcW w:type="dxa" w:w="4300"/>
             <w:tcMar>
               <w:top w:w="80" w:type="dxa"/>
               <w:start w:w="120" w:type="dxa"/>
@@ -6286,7 +6314,7 @@
         </w:tc>
         <w:tc>
           <w:tcPr>
-            <w:tcW w:type="dxa" w:w="5360"/>
+            <w:tcW w:type="dxa" w:w="5060"/>
             <w:tcMar>
               <w:top w:w="80" w:type="dxa"/>
               <w:start w:w="120" w:type="dxa"/>
@@ -6313,7 +6341,7 @@
       <w:tr>
         <w:tc>
           <w:tcPr>
-            <w:tcW w:type="dxa" w:w="4000"/>
+            <w:tcW w:type="dxa" w:w="4300"/>
             <w:shd w:fill="FAFBFC"/>
             <w:tcMar>
               <w:top w:w="80" w:type="dxa"/>
@@ -6339,7 +6367,7 @@
         </w:tc>
         <w:tc>
           <w:tcPr>
-            <w:tcW w:type="dxa" w:w="5360"/>
+            <w:tcW w:type="dxa" w:w="5060"/>
             <w:shd w:fill="FAFBFC"/>
             <w:tcMar>
               <w:top w:w="80" w:type="dxa"/>
@@ -6367,7 +6395,7 @@
       <w:tr>
         <w:tc>
           <w:tcPr>
-            <w:tcW w:type="dxa" w:w="4000"/>
+            <w:tcW w:type="dxa" w:w="4300"/>
             <w:tcMar>
               <w:top w:w="80" w:type="dxa"/>
               <w:start w:w="120" w:type="dxa"/>
@@ -6392,7 +6420,7 @@
         </w:tc>
         <w:tc>
           <w:tcPr>
-            <w:tcW w:type="dxa" w:w="5360"/>
+            <w:tcW w:type="dxa" w:w="5060"/>
             <w:tcMar>
               <w:top w:w="80" w:type="dxa"/>
               <w:start w:w="120" w:type="dxa"/>
@@ -6419,7 +6447,7 @@
       <w:tr>
         <w:tc>
           <w:tcPr>
-            <w:tcW w:type="dxa" w:w="4000"/>
+            <w:tcW w:type="dxa" w:w="4300"/>
             <w:shd w:fill="FAFBFC"/>
             <w:tcMar>
               <w:top w:w="80" w:type="dxa"/>
@@ -6445,7 +6473,7 @@
         </w:tc>
         <w:tc>
           <w:tcPr>
-            <w:tcW w:type="dxa" w:w="5360"/>
+            <w:tcW w:type="dxa" w:w="5060"/>
             <w:shd w:fill="FAFBFC"/>
             <w:tcMar>
               <w:top w:w="80" w:type="dxa"/>
@@ -6473,7 +6501,7 @@
       <w:tr>
         <w:tc>
           <w:tcPr>
-            <w:tcW w:type="dxa" w:w="4000"/>
+            <w:tcW w:type="dxa" w:w="4300"/>
             <w:tcMar>
               <w:top w:w="80" w:type="dxa"/>
               <w:start w:w="120" w:type="dxa"/>
@@ -6498,7 +6526,7 @@
         </w:tc>
         <w:tc>
           <w:tcPr>
-            <w:tcW w:type="dxa" w:w="5360"/>
+            <w:tcW w:type="dxa" w:w="5060"/>
             <w:tcMar>
               <w:top w:w="80" w:type="dxa"/>
               <w:start w:w="120" w:type="dxa"/>
@@ -6525,7 +6553,7 @@
       <w:tr>
         <w:tc>
           <w:tcPr>
-            <w:tcW w:type="dxa" w:w="4000"/>
+            <w:tcW w:type="dxa" w:w="4300"/>
             <w:shd w:fill="FAFBFC"/>
             <w:tcMar>
               <w:top w:w="80" w:type="dxa"/>
@@ -6551,7 +6579,7 @@
         </w:tc>
         <w:tc>
           <w:tcPr>
-            <w:tcW w:type="dxa" w:w="5360"/>
+            <w:tcW w:type="dxa" w:w="5060"/>
             <w:shd w:fill="FAFBFC"/>
             <w:tcMar>
               <w:top w:w="80" w:type="dxa"/>
@@ -6579,7 +6607,7 @@
       <w:tr>
         <w:tc>
           <w:tcPr>
-            <w:tcW w:type="dxa" w:w="4000"/>
+            <w:tcW w:type="dxa" w:w="4300"/>
             <w:tcMar>
               <w:top w:w="80" w:type="dxa"/>
               <w:start w:w="120" w:type="dxa"/>
@@ -6604,7 +6632,7 @@
         </w:tc>
         <w:tc>
           <w:tcPr>
-            <w:tcW w:type="dxa" w:w="5360"/>
+            <w:tcW w:type="dxa" w:w="5060"/>
             <w:tcMar>
               <w:top w:w="80" w:type="dxa"/>
               <w:start w:w="120" w:type="dxa"/>
@@ -6631,7 +6659,7 @@
       <w:tr>
         <w:tc>
           <w:tcPr>
-            <w:tcW w:type="dxa" w:w="4000"/>
+            <w:tcW w:type="dxa" w:w="4300"/>
             <w:shd w:fill="FAFBFC"/>
             <w:tcMar>
               <w:top w:w="80" w:type="dxa"/>
@@ -6657,7 +6685,7 @@
         </w:tc>
         <w:tc>
           <w:tcPr>
-            <w:tcW w:type="dxa" w:w="5360"/>
+            <w:tcW w:type="dxa" w:w="5060"/>
             <w:shd w:fill="FAFBFC"/>
             <w:tcMar>
               <w:top w:w="80" w:type="dxa"/>
@@ -6685,7 +6713,7 @@
       <w:tr>
         <w:tc>
           <w:tcPr>
-            <w:tcW w:type="dxa" w:w="4000"/>
+            <w:tcW w:type="dxa" w:w="4300"/>
             <w:tcMar>
               <w:top w:w="80" w:type="dxa"/>
               <w:start w:w="120" w:type="dxa"/>
@@ -6710,7 +6738,7 @@
         </w:tc>
         <w:tc>
           <w:tcPr>
-            <w:tcW w:type="dxa" w:w="5360"/>
+            <w:tcW w:type="dxa" w:w="5060"/>
             <w:tcMar>
               <w:top w:w="80" w:type="dxa"/>
               <w:start w:w="120" w:type="dxa"/>
@@ -6737,7 +6765,7 @@
       <w:tr>
         <w:tc>
           <w:tcPr>
-            <w:tcW w:type="dxa" w:w="4000"/>
+            <w:tcW w:type="dxa" w:w="4300"/>
             <w:shd w:fill="FAFBFC"/>
             <w:tcMar>
               <w:top w:w="80" w:type="dxa"/>
@@ -6763,7 +6791,7 @@
         </w:tc>
         <w:tc>
           <w:tcPr>
-            <w:tcW w:type="dxa" w:w="5360"/>
+            <w:tcW w:type="dxa" w:w="5060"/>
             <w:shd w:fill="FAFBFC"/>
             <w:tcMar>
               <w:top w:w="80" w:type="dxa"/>
@@ -6791,7 +6819,7 @@
       <w:tr>
         <w:tc>
           <w:tcPr>
-            <w:tcW w:type="dxa" w:w="4000"/>
+            <w:tcW w:type="dxa" w:w="4300"/>
             <w:tcMar>
               <w:top w:w="80" w:type="dxa"/>
               <w:start w:w="120" w:type="dxa"/>
@@ -6816,7 +6844,7 @@
         </w:tc>
         <w:tc>
           <w:tcPr>
-            <w:tcW w:type="dxa" w:w="5360"/>
+            <w:tcW w:type="dxa" w:w="5060"/>
             <w:tcMar>
               <w:top w:w="80" w:type="dxa"/>
               <w:start w:w="120" w:type="dxa"/>
@@ -6843,7 +6871,7 @@
       <w:tr>
         <w:tc>
           <w:tcPr>
-            <w:tcW w:type="dxa" w:w="4000"/>
+            <w:tcW w:type="dxa" w:w="4300"/>
             <w:shd w:fill="FAFBFC"/>
             <w:tcMar>
               <w:top w:w="80" w:type="dxa"/>
@@ -6869,7 +6897,7 @@
         </w:tc>
         <w:tc>
           <w:tcPr>
-            <w:tcW w:type="dxa" w:w="5360"/>
+            <w:tcW w:type="dxa" w:w="5060"/>
             <w:shd w:fill="FAFBFC"/>
             <w:tcMar>
               <w:top w:w="80" w:type="dxa"/>
@@ -6897,7 +6925,7 @@
       <w:tr>
         <w:tc>
           <w:tcPr>
-            <w:tcW w:type="dxa" w:w="4000"/>
+            <w:tcW w:type="dxa" w:w="4300"/>
             <w:tcMar>
               <w:top w:w="80" w:type="dxa"/>
               <w:start w:w="120" w:type="dxa"/>
@@ -6922,7 +6950,7 @@
         </w:tc>
         <w:tc>
           <w:tcPr>
-            <w:tcW w:type="dxa" w:w="5360"/>
+            <w:tcW w:type="dxa" w:w="5060"/>
             <w:tcMar>
               <w:top w:w="80" w:type="dxa"/>
               <w:start w:w="120" w:type="dxa"/>
@@ -6949,7 +6977,7 @@
       <w:tr>
         <w:tc>
           <w:tcPr>
-            <w:tcW w:type="dxa" w:w="4000"/>
+            <w:tcW w:type="dxa" w:w="4300"/>
             <w:shd w:fill="FAFBFC"/>
             <w:tcMar>
               <w:top w:w="80" w:type="dxa"/>
@@ -6975,7 +7003,7 @@
         </w:tc>
         <w:tc>
           <w:tcPr>
-            <w:tcW w:type="dxa" w:w="5360"/>
+            <w:tcW w:type="dxa" w:w="5060"/>
             <w:shd w:fill="FAFBFC"/>
             <w:tcMar>
               <w:top w:w="80" w:type="dxa"/>
@@ -7003,7 +7031,7 @@
       <w:tr>
         <w:tc>
           <w:tcPr>
-            <w:tcW w:type="dxa" w:w="4000"/>
+            <w:tcW w:type="dxa" w:w="4300"/>
             <w:tcMar>
               <w:top w:w="80" w:type="dxa"/>
               <w:start w:w="120" w:type="dxa"/>
@@ -7028,7 +7056,7 @@
         </w:tc>
         <w:tc>
           <w:tcPr>
-            <w:tcW w:type="dxa" w:w="5360"/>
+            <w:tcW w:type="dxa" w:w="5060"/>
             <w:tcMar>
               <w:top w:w="80" w:type="dxa"/>
               <w:start w:w="120" w:type="dxa"/>
@@ -7055,7 +7083,7 @@
       <w:tr>
         <w:tc>
           <w:tcPr>
-            <w:tcW w:type="dxa" w:w="4000"/>
+            <w:tcW w:type="dxa" w:w="4300"/>
             <w:shd w:fill="FAFBFC"/>
             <w:tcMar>
               <w:top w:w="80" w:type="dxa"/>
@@ -7081,7 +7109,7 @@
         </w:tc>
         <w:tc>
           <w:tcPr>
-            <w:tcW w:type="dxa" w:w="5360"/>
+            <w:tcW w:type="dxa" w:w="5060"/>
             <w:shd w:fill="FAFBFC"/>
             <w:tcMar>
               <w:top w:w="80" w:type="dxa"/>
@@ -7109,7 +7137,7 @@
       <w:tr>
         <w:tc>
           <w:tcPr>
-            <w:tcW w:type="dxa" w:w="4000"/>
+            <w:tcW w:type="dxa" w:w="4300"/>
             <w:tcMar>
               <w:top w:w="80" w:type="dxa"/>
               <w:start w:w="120" w:type="dxa"/>
@@ -7134,7 +7162,7 @@
         </w:tc>
         <w:tc>
           <w:tcPr>
-            <w:tcW w:type="dxa" w:w="5360"/>
+            <w:tcW w:type="dxa" w:w="5060"/>
             <w:tcMar>
               <w:top w:w="80" w:type="dxa"/>
               <w:start w:w="120" w:type="dxa"/>
@@ -7161,7 +7189,7 @@
       <w:tr>
         <w:tc>
           <w:tcPr>
-            <w:tcW w:type="dxa" w:w="4000"/>
+            <w:tcW w:type="dxa" w:w="4300"/>
             <w:shd w:fill="FAFBFC"/>
             <w:tcMar>
               <w:top w:w="80" w:type="dxa"/>
@@ -7187,7 +7215,7 @@
         </w:tc>
         <w:tc>
           <w:tcPr>
-            <w:tcW w:type="dxa" w:w="5360"/>
+            <w:tcW w:type="dxa" w:w="5060"/>
             <w:shd w:fill="FAFBFC"/>
             <w:tcMar>
               <w:top w:w="80" w:type="dxa"/>
@@ -7215,7 +7243,7 @@
       <w:tr>
         <w:tc>
           <w:tcPr>
-            <w:tcW w:type="dxa" w:w="4000"/>
+            <w:tcW w:type="dxa" w:w="4300"/>
             <w:tcMar>
               <w:top w:w="80" w:type="dxa"/>
               <w:start w:w="120" w:type="dxa"/>
@@ -7240,7 +7268,7 @@
         </w:tc>
         <w:tc>
           <w:tcPr>
-            <w:tcW w:type="dxa" w:w="5360"/>
+            <w:tcW w:type="dxa" w:w="5060"/>
             <w:tcMar>
               <w:top w:w="80" w:type="dxa"/>
               <w:start w:w="120" w:type="dxa"/>
@@ -7267,7 +7295,7 @@
       <w:tr>
         <w:tc>
           <w:tcPr>
-            <w:tcW w:type="dxa" w:w="4000"/>
+            <w:tcW w:type="dxa" w:w="4300"/>
             <w:shd w:fill="FAFBFC"/>
             <w:tcMar>
               <w:top w:w="80" w:type="dxa"/>
@@ -7293,7 +7321,7 @@
         </w:tc>
         <w:tc>
           <w:tcPr>
-            <w:tcW w:type="dxa" w:w="5360"/>
+            <w:tcW w:type="dxa" w:w="5060"/>
             <w:shd w:fill="FAFBFC"/>
             <w:tcMar>
               <w:top w:w="80" w:type="dxa"/>
@@ -7321,7 +7349,7 @@
       <w:tr>
         <w:tc>
           <w:tcPr>
-            <w:tcW w:type="dxa" w:w="4000"/>
+            <w:tcW w:type="dxa" w:w="4300"/>
             <w:tcMar>
               <w:top w:w="80" w:type="dxa"/>
               <w:start w:w="120" w:type="dxa"/>
@@ -7346,7 +7374,7 @@
         </w:tc>
         <w:tc>
           <w:tcPr>
-            <w:tcW w:type="dxa" w:w="5360"/>
+            <w:tcW w:type="dxa" w:w="5060"/>
             <w:tcMar>
               <w:top w:w="80" w:type="dxa"/>
               <w:start w:w="120" w:type="dxa"/>
@@ -7373,8 +7401,167 @@
       <w:tr>
         <w:tc>
           <w:tcPr>
-            <w:tcW w:type="dxa" w:w="4000"/>
+            <w:tcW w:type="dxa" w:w="4300"/>
             <w:shd w:fill="FAFBFC"/>
+            <w:tcMar>
+              <w:top w:w="80" w:type="dxa"/>
+              <w:start w:w="120" w:type="dxa"/>
+              <w:bottom w:w="80" w:type="dxa"/>
+              <w:end w:w="120" w:type="dxa"/>
+            </w:tcMar>
+            <w:vAlign w:val="center"/>
+          </w:tcPr>
+          <w:p>
+            <w:pPr>
+              <w:spacing w:before="0" w:after="0" w:line="240" w:lineRule="auto"/>
+              <w:jc w:val="left"/>
+            </w:pPr>
+            <w:r>
+              <w:rPr>
+                <w:rFonts w:ascii="맑은 고딕" w:hAnsi="맑은 고딕" w:eastAsia="맑은 고딕" w:cs="맑은 고딕"/>
+                <w:sz w:val="16"/>
+              </w:rPr>
+              <w:t>VIEWER_MONITOR_STATE_CORRUPT</w:t>
+            </w:r>
+          </w:p>
+        </w:tc>
+        <w:tc>
+          <w:tcPr>
+            <w:tcW w:type="dxa" w:w="5060"/>
+            <w:shd w:fill="FAFBFC"/>
+            <w:tcMar>
+              <w:top w:w="80" w:type="dxa"/>
+              <w:start w:w="120" w:type="dxa"/>
+              <w:bottom w:w="80" w:type="dxa"/>
+              <w:end w:w="120" w:type="dxa"/>
+            </w:tcMar>
+            <w:vAlign w:val="center"/>
+          </w:tcPr>
+          <w:p>
+            <w:pPr>
+              <w:spacing w:before="0" w:after="0" w:line="240" w:lineRule="auto"/>
+              <w:jc w:val="left"/>
+            </w:pPr>
+            <w:r>
+              <w:rPr>
+                <w:rFonts w:ascii="맑은 고딕" w:hAnsi="맑은 고딕" w:eastAsia="맑은 고딕" w:cs="맑은 고딕"/>
+                <w:sz w:val="16"/>
+              </w:rPr>
+              <w:t>이번 실행의 자동 감시가 중지됨. 격리된 원본을 보존하고 Viewer를 다시 시작해 새 기준선 생성</w:t>
+            </w:r>
+          </w:p>
+        </w:tc>
+      </w:tr>
+      <w:tr>
+        <w:tc>
+          <w:tcPr>
+            <w:tcW w:type="dxa" w:w="4300"/>
+            <w:tcMar>
+              <w:top w:w="80" w:type="dxa"/>
+              <w:start w:w="120" w:type="dxa"/>
+              <w:bottom w:w="80" w:type="dxa"/>
+              <w:end w:w="120" w:type="dxa"/>
+            </w:tcMar>
+            <w:vAlign w:val="center"/>
+          </w:tcPr>
+          <w:p>
+            <w:pPr>
+              <w:spacing w:before="0" w:after="0" w:line="240" w:lineRule="auto"/>
+              <w:jc w:val="left"/>
+            </w:pPr>
+            <w:r>
+              <w:rPr>
+                <w:rFonts w:ascii="맑은 고딕" w:hAnsi="맑은 고딕" w:eastAsia="맑은 고딕" w:cs="맑은 고딕"/>
+                <w:sz w:val="16"/>
+              </w:rPr>
+              <w:t>VIEWER_MONITOR_STATE_VERSION_UNSUPPORTED</w:t>
+            </w:r>
+          </w:p>
+        </w:tc>
+        <w:tc>
+          <w:tcPr>
+            <w:tcW w:type="dxa" w:w="5060"/>
+            <w:tcMar>
+              <w:top w:w="80" w:type="dxa"/>
+              <w:start w:w="120" w:type="dxa"/>
+              <w:bottom w:w="80" w:type="dxa"/>
+              <w:end w:w="120" w:type="dxa"/>
+            </w:tcMar>
+            <w:vAlign w:val="center"/>
+          </w:tcPr>
+          <w:p>
+            <w:pPr>
+              <w:spacing w:before="0" w:after="0" w:line="240" w:lineRule="auto"/>
+              <w:jc w:val="left"/>
+            </w:pPr>
+            <w:r>
+              <w:rPr>
+                <w:rFonts w:ascii="맑은 고딕" w:hAnsi="맑은 고딕" w:eastAsia="맑은 고딕" w:cs="맑은 고딕"/>
+                <w:sz w:val="16"/>
+              </w:rPr>
+              <w:t>파일을 변경하지 말고 같거나 최신 버전의 Viewer로 실행</w:t>
+            </w:r>
+          </w:p>
+        </w:tc>
+      </w:tr>
+      <w:tr>
+        <w:tc>
+          <w:tcPr>
+            <w:tcW w:type="dxa" w:w="4300"/>
+            <w:shd w:fill="FAFBFC"/>
+            <w:tcMar>
+              <w:top w:w="80" w:type="dxa"/>
+              <w:start w:w="120" w:type="dxa"/>
+              <w:bottom w:w="80" w:type="dxa"/>
+              <w:end w:w="120" w:type="dxa"/>
+            </w:tcMar>
+            <w:vAlign w:val="center"/>
+          </w:tcPr>
+          <w:p>
+            <w:pPr>
+              <w:spacing w:before="0" w:after="0" w:line="240" w:lineRule="auto"/>
+              <w:jc w:val="left"/>
+            </w:pPr>
+            <w:r>
+              <w:rPr>
+                <w:rFonts w:ascii="맑은 고딕" w:hAnsi="맑은 고딕" w:eastAsia="맑은 고딕" w:cs="맑은 고딕"/>
+                <w:sz w:val="16"/>
+              </w:rPr>
+              <w:t>VIEWER_MONITOR_STATE_UNAVAILABLE</w:t>
+            </w:r>
+          </w:p>
+        </w:tc>
+        <w:tc>
+          <w:tcPr>
+            <w:tcW w:type="dxa" w:w="5060"/>
+            <w:shd w:fill="FAFBFC"/>
+            <w:tcMar>
+              <w:top w:w="80" w:type="dxa"/>
+              <w:start w:w="120" w:type="dxa"/>
+              <w:bottom w:w="80" w:type="dxa"/>
+              <w:end w:w="120" w:type="dxa"/>
+            </w:tcMar>
+            <w:vAlign w:val="center"/>
+          </w:tcPr>
+          <w:p>
+            <w:pPr>
+              <w:spacing w:before="0" w:after="0" w:line="240" w:lineRule="auto"/>
+              <w:jc w:val="left"/>
+            </w:pPr>
+            <w:r>
+              <w:rPr>
+                <w:rFonts w:ascii="맑은 고딕" w:hAnsi="맑은 고딕" w:eastAsia="맑은 고딕" w:cs="맑은 고딕"/>
+                <w:sz w:val="16"/>
+              </w:rPr>
+              <w:t>자동 감시가 중지됨. Viewer 사용자 폴더 권한·파일 잠금 확인 후 재시작</w:t>
+            </w:r>
+          </w:p>
+        </w:tc>
+      </w:tr>
+      <w:tr>
+        <w:tc>
+          <w:tcPr>
+            <w:tcW w:type="dxa" w:w="4300"/>
             <w:tcMar>
               <w:top w:w="80" w:type="dxa"/>
               <w:start w:w="120" w:type="dxa"/>
@@ -7399,8 +7586,7 @@
         </w:tc>
         <w:tc>
           <w:tcPr>
-            <w:tcW w:type="dxa" w:w="5360"/>
-            <w:shd w:fill="FAFBFC"/>
+            <w:tcW w:type="dxa" w:w="5060"/>
             <w:tcMar>
               <w:top w:w="80" w:type="dxa"/>
               <w:start w:w="120" w:type="dxa"/>
@@ -7427,7 +7613,8 @@
       <w:tr>
         <w:tc>
           <w:tcPr>
-            <w:tcW w:type="dxa" w:w="4000"/>
+            <w:tcW w:type="dxa" w:w="4300"/>
+            <w:shd w:fill="FAFBFC"/>
             <w:tcMar>
               <w:top w:w="80" w:type="dxa"/>
               <w:start w:w="120" w:type="dxa"/>
@@ -7452,7 +7639,8 @@
         </w:tc>
         <w:tc>
           <w:tcPr>
-            <w:tcW w:type="dxa" w:w="5360"/>
+            <w:tcW w:type="dxa" w:w="5060"/>
+            <w:shd w:fill="FAFBFC"/>
             <w:tcMar>
               <w:top w:w="80" w:type="dxa"/>
               <w:start w:w="120" w:type="dxa"/>
@@ -8154,7 +8342,7 @@
         <w:color w:val="64748B"/>
         <w:sz w:val="17"/>
       </w:rPr>
-      <w:t xml:space="preserve">v0.9.20-poc  |  </w:t>
+      <w:t xml:space="preserve">v0.9.21-poc  |  </w:t>
     </w:r>
     <w:r>
       <w:rPr>
@@ -8185,7 +8373,7 @@
         <w:color w:val="64748B"/>
         <w:sz w:val="17"/>
       </w:rPr>
-      <w:t>v0.9.20-poc  |  2026-07-28</w:t>
+      <w:t>v0.9.21-poc  |  2026-07-28</w:t>
     </w:r>
   </w:p>
 </w:ftr>

</xml_diff>

<commit_message>
fix: fail closed on device store errors
</commit_message>
<xml_diff>
--- a/docs/SamsungSwitchWatch_User_Manual_KO.docx
+++ b/docs/SamsungSwitchWatch_User_Manual_KO.docx
@@ -1336,7 +1336,7 @@
           <w:color w:val="16324F"/>
           <w:sz w:val="21"/>
         </w:rPr>
-        <w:t>관리자 설치 창에 Agent installation failed가 표시되면 Cause 줄을 먼저 확인하세요. 설치 성공 뒤 AGENT_CONNECTION_REFUSED가 보이면 Viewer에 스위치 IP, Viewer PC 주소 또는 localhost가 아니라 Agent를 설치한 PC 주소를 입력했는지 먼저 확인하세요. 그 다음 SamsungSwitchWatchAgent 서비스와 TCP/18443을 점검합니다. 서비스를 수동 등록하지 말고 0.9.21-poc Agent 설치기를 사용하세요.</w:t>
+        <w:t>관리자 설치 창에 Agent installation failed가 표시되면 Cause 줄을 먼저 확인하세요. 설치 성공 뒤 AGENT_CONNECTION_REFUSED가 보이면 Viewer에 스위치 IP, Viewer PC 주소 또는 localhost가 아니라 Agent를 설치한 PC 주소를 입력했는지 먼저 확인하세요. 그 다음 SamsungSwitchWatchAgent 서비스와 TCP/18443을 점검합니다. 서비스를 수동 등록하지 말고 0.9.22-poc Agent 설치기를 사용하세요.</w:t>
       </w:r>
     </w:p>
     <w:p>
@@ -3305,6 +3305,34 @@
           <w:sz w:val="21"/>
         </w:rPr>
         <w:t>Viewer 종료, PC 절전 또는 네트워크 단절 중에는 감시하지 않습니다. 다시 실행하면 중단 시간을 감시 공백으로 표시하고 현재 결과를 새 기준으로 사용합니다. 그 사이 로그 버퍼에서 사라진 사건은 복원할 수 없습니다.</w:t>
+      </w:r>
+    </w:p>
+    <w:p>
+      <w:pPr>
+        <w:keepLines/>
+        <w:spacing w:before="80" w:after="160" w:line="283" w:lineRule="auto"/>
+        <w:ind w:left="115" w:right="58"/>
+        <w:shd w:fill="FEF2F2"/>
+        <w:pBdr>
+          <w:left w:val="single" w:sz="16" w:space="8" w:color="B42318"/>
+        </w:pBdr>
+      </w:pPr>
+      <w:r>
+        <w:rPr>
+          <w:rFonts w:ascii="맑은 고딕" w:hAnsi="맑은 고딕" w:eastAsia="맑은 고딕" w:cs="맑은 고딕"/>
+          <w:b/>
+          <w:color w:val="B42318"/>
+          <w:sz w:val="21"/>
+        </w:rPr>
+        <w:t xml:space="preserve">장비 목록 파일 오류  </w:t>
+      </w:r>
+      <w:r>
+        <w:rPr>
+          <w:rFonts w:ascii="맑은 고딕" w:hAnsi="맑은 고딕" w:eastAsia="맑은 고딕" w:cs="맑은 고딕"/>
+          <w:color w:val="16324F"/>
+          <w:sz w:val="21"/>
+        </w:rPr>
+        <w:t>장비 목록 파일이 손상됐거나 현재 Viewer보다 새로운 형식이거나 읽기·쓰기가 불가능하면 Viewer는 원본을 보존하고 해당 실행의 자동 감시와 장비 명령을 중지합니다. 기존 장비가 정상으로 보이거나 빈 목록으로 덮어써지지 않습니다. 화면의 오류 코드에 따라 격리 파일, Viewer 버전, 사용자 폴더 권한·파일 잠금과 Windows 사용자 프로필을 확인한 뒤 Viewer를 다시 시작하세요.</w:t>
       </w:r>
     </w:p>
     <w:p>
@@ -7235,7 +7263,7 @@
                 <w:rFonts w:ascii="맑은 고딕" w:hAnsi="맑은 고딕" w:eastAsia="맑은 고딕" w:cs="맑은 고딕"/>
                 <w:sz w:val="16"/>
               </w:rPr>
-              <w:t>손상 파일은 자동 격리됨. 장비 관리에서 장비를 다시 등록</w:t>
+              <w:t>원본은 .corrupt-*로 격리되고 이번 실행의 감시·명령이 중지됨. 격리 파일 보존 → Viewer 재시작 → 장비 재등록</w:t>
             </w:r>
           </w:p>
         </w:tc>
@@ -7262,7 +7290,7 @@
                 <w:rFonts w:ascii="맑은 고딕" w:hAnsi="맑은 고딕" w:eastAsia="맑은 고딕" w:cs="맑은 고딕"/>
                 <w:sz w:val="16"/>
               </w:rPr>
-              <w:t>VIEWER_DEVICE_STORE_UNAVAILABLE</w:t>
+              <w:t>VIEWER_DEVICE_STORE_VERSION_UNSUPPORTED</w:t>
             </w:r>
           </w:p>
         </w:tc>
@@ -7287,7 +7315,7 @@
                 <w:rFonts w:ascii="맑은 고딕" w:hAnsi="맑은 고딕" w:eastAsia="맑은 고딕" w:cs="맑은 고딕"/>
                 <w:sz w:val="16"/>
               </w:rPr>
-              <w:t>Viewer 사용자 폴더의 파일 권한과 다른 프로세스의 잠금 확인</w:t>
+              <w:t>원본을 변경하지 말고 같거나 최신 Viewer를 설치해 다시 시작</w:t>
             </w:r>
           </w:p>
         </w:tc>
@@ -7315,7 +7343,7 @@
                 <w:rFonts w:ascii="맑은 고딕" w:hAnsi="맑은 고딕" w:eastAsia="맑은 고딕" w:cs="맑은 고딕"/>
                 <w:sz w:val="16"/>
               </w:rPr>
-              <w:t>VIEWER_DEVICE_STORE_WRITE_FAILED</w:t>
+              <w:t>VIEWER_DEVICE_STORE_UNAVAILABLE</w:t>
             </w:r>
           </w:p>
         </w:tc>
@@ -7341,7 +7369,7 @@
                 <w:rFonts w:ascii="맑은 고딕" w:hAnsi="맑은 고딕" w:eastAsia="맑은 고딕" w:cs="맑은 고딕"/>
                 <w:sz w:val="16"/>
               </w:rPr>
-              <w:t>입력은 유지됨. Viewer 사용자 폴더 권한·잠금·디스크 확인 후 다시 저장</w:t>
+              <w:t>감시·명령 중지됨. 사용자 폴더 권한·잠금·Windows 사용자 프로필 확인 후 Viewer 재시작</w:t>
             </w:r>
           </w:p>
         </w:tc>
@@ -7368,6 +7396,59 @@
                 <w:rFonts w:ascii="맑은 고딕" w:hAnsi="맑은 고딕" w:eastAsia="맑은 고딕" w:cs="맑은 고딕"/>
                 <w:sz w:val="16"/>
               </w:rPr>
+              <w:t>VIEWER_DEVICE_STORE_WRITE_FAILED</w:t>
+            </w:r>
+          </w:p>
+        </w:tc>
+        <w:tc>
+          <w:tcPr>
+            <w:tcW w:type="dxa" w:w="5060"/>
+            <w:tcMar>
+              <w:top w:w="80" w:type="dxa"/>
+              <w:start w:w="120" w:type="dxa"/>
+              <w:bottom w:w="80" w:type="dxa"/>
+              <w:end w:w="120" w:type="dxa"/>
+            </w:tcMar>
+            <w:vAlign w:val="center"/>
+          </w:tcPr>
+          <w:p>
+            <w:pPr>
+              <w:spacing w:before="0" w:after="0" w:line="240" w:lineRule="auto"/>
+              <w:jc w:val="left"/>
+            </w:pPr>
+            <w:r>
+              <w:rPr>
+                <w:rFonts w:ascii="맑은 고딕" w:hAnsi="맑은 고딕" w:eastAsia="맑은 고딕" w:cs="맑은 고딕"/>
+                <w:sz w:val="16"/>
+              </w:rPr>
+              <w:t>입력·원본은 유지됨. 사용자 폴더 권한·잠금·디스크 확인 후 Viewer 재시작</w:t>
+            </w:r>
+          </w:p>
+        </w:tc>
+      </w:tr>
+      <w:tr>
+        <w:tc>
+          <w:tcPr>
+            <w:tcW w:type="dxa" w:w="4300"/>
+            <w:shd w:fill="FAFBFC"/>
+            <w:tcMar>
+              <w:top w:w="80" w:type="dxa"/>
+              <w:start w:w="120" w:type="dxa"/>
+              <w:bottom w:w="80" w:type="dxa"/>
+              <w:end w:w="120" w:type="dxa"/>
+            </w:tcMar>
+            <w:vAlign w:val="center"/>
+          </w:tcPr>
+          <w:p>
+            <w:pPr>
+              <w:spacing w:before="0" w:after="0" w:line="240" w:lineRule="auto"/>
+              <w:jc w:val="left"/>
+            </w:pPr>
+            <w:r>
+              <w:rPr>
+                <w:rFonts w:ascii="맑은 고딕" w:hAnsi="맑은 고딕" w:eastAsia="맑은 고딕" w:cs="맑은 고딕"/>
+                <w:sz w:val="16"/>
+              </w:rPr>
               <w:t>VIEWER_SETTINGS_WRITE_FAILED</w:t>
             </w:r>
           </w:p>
@@ -7375,6 +7456,7 @@
         <w:tc>
           <w:tcPr>
             <w:tcW w:type="dxa" w:w="5060"/>
+            <w:shd w:fill="FAFBFC"/>
             <w:tcMar>
               <w:top w:w="80" w:type="dxa"/>
               <w:start w:w="120" w:type="dxa"/>
@@ -7402,7 +7484,6 @@
         <w:tc>
           <w:tcPr>
             <w:tcW w:type="dxa" w:w="4300"/>
-            <w:shd w:fill="FAFBFC"/>
             <w:tcMar>
               <w:top w:w="80" w:type="dxa"/>
               <w:start w:w="120" w:type="dxa"/>
@@ -7428,7 +7509,6 @@
         <w:tc>
           <w:tcPr>
             <w:tcW w:type="dxa" w:w="5060"/>
-            <w:shd w:fill="FAFBFC"/>
             <w:tcMar>
               <w:top w:w="80" w:type="dxa"/>
               <w:start w:w="120" w:type="dxa"/>
@@ -7456,6 +7536,7 @@
         <w:tc>
           <w:tcPr>
             <w:tcW w:type="dxa" w:w="4300"/>
+            <w:shd w:fill="FAFBFC"/>
             <w:tcMar>
               <w:top w:w="80" w:type="dxa"/>
               <w:start w:w="120" w:type="dxa"/>
@@ -7481,6 +7562,7 @@
         <w:tc>
           <w:tcPr>
             <w:tcW w:type="dxa" w:w="5060"/>
+            <w:shd w:fill="FAFBFC"/>
             <w:tcMar>
               <w:top w:w="80" w:type="dxa"/>
               <w:start w:w="120" w:type="dxa"/>
@@ -7508,7 +7590,6 @@
         <w:tc>
           <w:tcPr>
             <w:tcW w:type="dxa" w:w="4300"/>
-            <w:shd w:fill="FAFBFC"/>
             <w:tcMar>
               <w:top w:w="80" w:type="dxa"/>
               <w:start w:w="120" w:type="dxa"/>
@@ -7534,7 +7615,6 @@
         <w:tc>
           <w:tcPr>
             <w:tcW w:type="dxa" w:w="5060"/>
-            <w:shd w:fill="FAFBFC"/>
             <w:tcMar>
               <w:top w:w="80" w:type="dxa"/>
               <w:start w:w="120" w:type="dxa"/>
@@ -7562,6 +7642,7 @@
         <w:tc>
           <w:tcPr>
             <w:tcW w:type="dxa" w:w="4300"/>
+            <w:shd w:fill="FAFBFC"/>
             <w:tcMar>
               <w:top w:w="80" w:type="dxa"/>
               <w:start w:w="120" w:type="dxa"/>
@@ -7587,6 +7668,7 @@
         <w:tc>
           <w:tcPr>
             <w:tcW w:type="dxa" w:w="5060"/>
+            <w:shd w:fill="FAFBFC"/>
             <w:tcMar>
               <w:top w:w="80" w:type="dxa"/>
               <w:start w:w="120" w:type="dxa"/>
@@ -7614,7 +7696,6 @@
         <w:tc>
           <w:tcPr>
             <w:tcW w:type="dxa" w:w="4300"/>
-            <w:shd w:fill="FAFBFC"/>
             <w:tcMar>
               <w:top w:w="80" w:type="dxa"/>
               <w:start w:w="120" w:type="dxa"/>
@@ -7640,7 +7721,6 @@
         <w:tc>
           <w:tcPr>
             <w:tcW w:type="dxa" w:w="5060"/>
-            <w:shd w:fill="FAFBFC"/>
             <w:tcMar>
               <w:top w:w="80" w:type="dxa"/>
               <w:start w:w="120" w:type="dxa"/>
@@ -8342,7 +8422,7 @@
         <w:color w:val="64748B"/>
         <w:sz w:val="17"/>
       </w:rPr>
-      <w:t xml:space="preserve">v0.9.21-poc  |  </w:t>
+      <w:t xml:space="preserve">v0.9.22-poc  |  </w:t>
     </w:r>
     <w:r>
       <w:rPr>
@@ -8373,7 +8453,7 @@
         <w:color w:val="64748B"/>
         <w:sz w:val="17"/>
       </w:rPr>
-      <w:t>v0.9.21-poc  |  2026-07-28</w:t>
+      <w:t>v0.9.22-poc  |  2026-07-28</w:t>
     </w:r>
   </w:p>
 </w:ftr>

</xml_diff>

<commit_message>
fix: fail closed on device store errors (#32)
</commit_message>
<xml_diff>
--- a/docs/SamsungSwitchWatch_User_Manual_KO.docx
+++ b/docs/SamsungSwitchWatch_User_Manual_KO.docx
@@ -1336,7 +1336,7 @@
           <w:color w:val="16324F"/>
           <w:sz w:val="21"/>
         </w:rPr>
-        <w:t>관리자 설치 창에 Agent installation failed가 표시되면 Cause 줄을 먼저 확인하세요. 설치 성공 뒤 AGENT_CONNECTION_REFUSED가 보이면 Viewer에 스위치 IP, Viewer PC 주소 또는 localhost가 아니라 Agent를 설치한 PC 주소를 입력했는지 먼저 확인하세요. 그 다음 SamsungSwitchWatchAgent 서비스와 TCP/18443을 점검합니다. 서비스를 수동 등록하지 말고 0.9.21-poc Agent 설치기를 사용하세요.</w:t>
+        <w:t>관리자 설치 창에 Agent installation failed가 표시되면 Cause 줄을 먼저 확인하세요. 설치 성공 뒤 AGENT_CONNECTION_REFUSED가 보이면 Viewer에 스위치 IP, Viewer PC 주소 또는 localhost가 아니라 Agent를 설치한 PC 주소를 입력했는지 먼저 확인하세요. 그 다음 SamsungSwitchWatchAgent 서비스와 TCP/18443을 점검합니다. 서비스를 수동 등록하지 말고 0.9.22-poc Agent 설치기를 사용하세요.</w:t>
       </w:r>
     </w:p>
     <w:p>
@@ -3305,6 +3305,34 @@
           <w:sz w:val="21"/>
         </w:rPr>
         <w:t>Viewer 종료, PC 절전 또는 네트워크 단절 중에는 감시하지 않습니다. 다시 실행하면 중단 시간을 감시 공백으로 표시하고 현재 결과를 새 기준으로 사용합니다. 그 사이 로그 버퍼에서 사라진 사건은 복원할 수 없습니다.</w:t>
+      </w:r>
+    </w:p>
+    <w:p>
+      <w:pPr>
+        <w:keepLines/>
+        <w:spacing w:before="80" w:after="160" w:line="283" w:lineRule="auto"/>
+        <w:ind w:left="115" w:right="58"/>
+        <w:shd w:fill="FEF2F2"/>
+        <w:pBdr>
+          <w:left w:val="single" w:sz="16" w:space="8" w:color="B42318"/>
+        </w:pBdr>
+      </w:pPr>
+      <w:r>
+        <w:rPr>
+          <w:rFonts w:ascii="맑은 고딕" w:hAnsi="맑은 고딕" w:eastAsia="맑은 고딕" w:cs="맑은 고딕"/>
+          <w:b/>
+          <w:color w:val="B42318"/>
+          <w:sz w:val="21"/>
+        </w:rPr>
+        <w:t xml:space="preserve">장비 목록 파일 오류  </w:t>
+      </w:r>
+      <w:r>
+        <w:rPr>
+          <w:rFonts w:ascii="맑은 고딕" w:hAnsi="맑은 고딕" w:eastAsia="맑은 고딕" w:cs="맑은 고딕"/>
+          <w:color w:val="16324F"/>
+          <w:sz w:val="21"/>
+        </w:rPr>
+        <w:t>장비 목록 파일이 손상됐거나 현재 Viewer보다 새로운 형식이거나 읽기·쓰기가 불가능하면 Viewer는 원본을 보존하고 해당 실행의 자동 감시와 장비 명령을 중지합니다. 기존 장비가 정상으로 보이거나 빈 목록으로 덮어써지지 않습니다. 화면의 오류 코드에 따라 격리 파일, Viewer 버전, 사용자 폴더 권한·파일 잠금과 Windows 사용자 프로필을 확인한 뒤 Viewer를 다시 시작하세요.</w:t>
       </w:r>
     </w:p>
     <w:p>
@@ -7235,7 +7263,7 @@
                 <w:rFonts w:ascii="맑은 고딕" w:hAnsi="맑은 고딕" w:eastAsia="맑은 고딕" w:cs="맑은 고딕"/>
                 <w:sz w:val="16"/>
               </w:rPr>
-              <w:t>손상 파일은 자동 격리됨. 장비 관리에서 장비를 다시 등록</w:t>
+              <w:t>원본은 .corrupt-*로 격리되고 이번 실행의 감시·명령이 중지됨. 격리 파일 보존 → Viewer 재시작 → 장비 재등록</w:t>
             </w:r>
           </w:p>
         </w:tc>
@@ -7262,7 +7290,7 @@
                 <w:rFonts w:ascii="맑은 고딕" w:hAnsi="맑은 고딕" w:eastAsia="맑은 고딕" w:cs="맑은 고딕"/>
                 <w:sz w:val="16"/>
               </w:rPr>
-              <w:t>VIEWER_DEVICE_STORE_UNAVAILABLE</w:t>
+              <w:t>VIEWER_DEVICE_STORE_VERSION_UNSUPPORTED</w:t>
             </w:r>
           </w:p>
         </w:tc>
@@ -7287,7 +7315,7 @@
                 <w:rFonts w:ascii="맑은 고딕" w:hAnsi="맑은 고딕" w:eastAsia="맑은 고딕" w:cs="맑은 고딕"/>
                 <w:sz w:val="16"/>
               </w:rPr>
-              <w:t>Viewer 사용자 폴더의 파일 권한과 다른 프로세스의 잠금 확인</w:t>
+              <w:t>원본을 변경하지 말고 같거나 최신 Viewer를 설치해 다시 시작</w:t>
             </w:r>
           </w:p>
         </w:tc>
@@ -7315,7 +7343,7 @@
                 <w:rFonts w:ascii="맑은 고딕" w:hAnsi="맑은 고딕" w:eastAsia="맑은 고딕" w:cs="맑은 고딕"/>
                 <w:sz w:val="16"/>
               </w:rPr>
-              <w:t>VIEWER_DEVICE_STORE_WRITE_FAILED</w:t>
+              <w:t>VIEWER_DEVICE_STORE_UNAVAILABLE</w:t>
             </w:r>
           </w:p>
         </w:tc>
@@ -7341,7 +7369,7 @@
                 <w:rFonts w:ascii="맑은 고딕" w:hAnsi="맑은 고딕" w:eastAsia="맑은 고딕" w:cs="맑은 고딕"/>
                 <w:sz w:val="16"/>
               </w:rPr>
-              <w:t>입력은 유지됨. Viewer 사용자 폴더 권한·잠금·디스크 확인 후 다시 저장</w:t>
+              <w:t>감시·명령 중지됨. 사용자 폴더 권한·잠금·Windows 사용자 프로필 확인 후 Viewer 재시작</w:t>
             </w:r>
           </w:p>
         </w:tc>
@@ -7368,6 +7396,59 @@
                 <w:rFonts w:ascii="맑은 고딕" w:hAnsi="맑은 고딕" w:eastAsia="맑은 고딕" w:cs="맑은 고딕"/>
                 <w:sz w:val="16"/>
               </w:rPr>
+              <w:t>VIEWER_DEVICE_STORE_WRITE_FAILED</w:t>
+            </w:r>
+          </w:p>
+        </w:tc>
+        <w:tc>
+          <w:tcPr>
+            <w:tcW w:type="dxa" w:w="5060"/>
+            <w:tcMar>
+              <w:top w:w="80" w:type="dxa"/>
+              <w:start w:w="120" w:type="dxa"/>
+              <w:bottom w:w="80" w:type="dxa"/>
+              <w:end w:w="120" w:type="dxa"/>
+            </w:tcMar>
+            <w:vAlign w:val="center"/>
+          </w:tcPr>
+          <w:p>
+            <w:pPr>
+              <w:spacing w:before="0" w:after="0" w:line="240" w:lineRule="auto"/>
+              <w:jc w:val="left"/>
+            </w:pPr>
+            <w:r>
+              <w:rPr>
+                <w:rFonts w:ascii="맑은 고딕" w:hAnsi="맑은 고딕" w:eastAsia="맑은 고딕" w:cs="맑은 고딕"/>
+                <w:sz w:val="16"/>
+              </w:rPr>
+              <w:t>입력·원본은 유지됨. 사용자 폴더 권한·잠금·디스크 확인 후 Viewer 재시작</w:t>
+            </w:r>
+          </w:p>
+        </w:tc>
+      </w:tr>
+      <w:tr>
+        <w:tc>
+          <w:tcPr>
+            <w:tcW w:type="dxa" w:w="4300"/>
+            <w:shd w:fill="FAFBFC"/>
+            <w:tcMar>
+              <w:top w:w="80" w:type="dxa"/>
+              <w:start w:w="120" w:type="dxa"/>
+              <w:bottom w:w="80" w:type="dxa"/>
+              <w:end w:w="120" w:type="dxa"/>
+            </w:tcMar>
+            <w:vAlign w:val="center"/>
+          </w:tcPr>
+          <w:p>
+            <w:pPr>
+              <w:spacing w:before="0" w:after="0" w:line="240" w:lineRule="auto"/>
+              <w:jc w:val="left"/>
+            </w:pPr>
+            <w:r>
+              <w:rPr>
+                <w:rFonts w:ascii="맑은 고딕" w:hAnsi="맑은 고딕" w:eastAsia="맑은 고딕" w:cs="맑은 고딕"/>
+                <w:sz w:val="16"/>
+              </w:rPr>
               <w:t>VIEWER_SETTINGS_WRITE_FAILED</w:t>
             </w:r>
           </w:p>
@@ -7375,6 +7456,7 @@
         <w:tc>
           <w:tcPr>
             <w:tcW w:type="dxa" w:w="5060"/>
+            <w:shd w:fill="FAFBFC"/>
             <w:tcMar>
               <w:top w:w="80" w:type="dxa"/>
               <w:start w:w="120" w:type="dxa"/>
@@ -7402,7 +7484,6 @@
         <w:tc>
           <w:tcPr>
             <w:tcW w:type="dxa" w:w="4300"/>
-            <w:shd w:fill="FAFBFC"/>
             <w:tcMar>
               <w:top w:w="80" w:type="dxa"/>
               <w:start w:w="120" w:type="dxa"/>
@@ -7428,7 +7509,6 @@
         <w:tc>
           <w:tcPr>
             <w:tcW w:type="dxa" w:w="5060"/>
-            <w:shd w:fill="FAFBFC"/>
             <w:tcMar>
               <w:top w:w="80" w:type="dxa"/>
               <w:start w:w="120" w:type="dxa"/>
@@ -7456,6 +7536,7 @@
         <w:tc>
           <w:tcPr>
             <w:tcW w:type="dxa" w:w="4300"/>
+            <w:shd w:fill="FAFBFC"/>
             <w:tcMar>
               <w:top w:w="80" w:type="dxa"/>
               <w:start w:w="120" w:type="dxa"/>
@@ -7481,6 +7562,7 @@
         <w:tc>
           <w:tcPr>
             <w:tcW w:type="dxa" w:w="5060"/>
+            <w:shd w:fill="FAFBFC"/>
             <w:tcMar>
               <w:top w:w="80" w:type="dxa"/>
               <w:start w:w="120" w:type="dxa"/>
@@ -7508,7 +7590,6 @@
         <w:tc>
           <w:tcPr>
             <w:tcW w:type="dxa" w:w="4300"/>
-            <w:shd w:fill="FAFBFC"/>
             <w:tcMar>
               <w:top w:w="80" w:type="dxa"/>
               <w:start w:w="120" w:type="dxa"/>
@@ -7534,7 +7615,6 @@
         <w:tc>
           <w:tcPr>
             <w:tcW w:type="dxa" w:w="5060"/>
-            <w:shd w:fill="FAFBFC"/>
             <w:tcMar>
               <w:top w:w="80" w:type="dxa"/>
               <w:start w:w="120" w:type="dxa"/>
@@ -7562,6 +7642,7 @@
         <w:tc>
           <w:tcPr>
             <w:tcW w:type="dxa" w:w="4300"/>
+            <w:shd w:fill="FAFBFC"/>
             <w:tcMar>
               <w:top w:w="80" w:type="dxa"/>
               <w:start w:w="120" w:type="dxa"/>
@@ -7587,6 +7668,7 @@
         <w:tc>
           <w:tcPr>
             <w:tcW w:type="dxa" w:w="5060"/>
+            <w:shd w:fill="FAFBFC"/>
             <w:tcMar>
               <w:top w:w="80" w:type="dxa"/>
               <w:start w:w="120" w:type="dxa"/>
@@ -7614,7 +7696,6 @@
         <w:tc>
           <w:tcPr>
             <w:tcW w:type="dxa" w:w="4300"/>
-            <w:shd w:fill="FAFBFC"/>
             <w:tcMar>
               <w:top w:w="80" w:type="dxa"/>
               <w:start w:w="120" w:type="dxa"/>
@@ -7640,7 +7721,6 @@
         <w:tc>
           <w:tcPr>
             <w:tcW w:type="dxa" w:w="5060"/>
-            <w:shd w:fill="FAFBFC"/>
             <w:tcMar>
               <w:top w:w="80" w:type="dxa"/>
               <w:start w:w="120" w:type="dxa"/>
@@ -8342,7 +8422,7 @@
         <w:color w:val="64748B"/>
         <w:sz w:val="17"/>
       </w:rPr>
-      <w:t xml:space="preserve">v0.9.21-poc  |  </w:t>
+      <w:t xml:space="preserve">v0.9.22-poc  |  </w:t>
     </w:r>
     <w:r>
       <w:rPr>
@@ -8373,7 +8453,7 @@
         <w:color w:val="64748B"/>
         <w:sz w:val="17"/>
       </w:rPr>
-      <w:t>v0.9.21-poc  |  2026-07-28</w:t>
+      <w:t>v0.9.22-poc  |  2026-07-28</w:t>
     </w:r>
   </w:p>
 </w:ftr>

</xml_diff>

<commit_message>
Fix Viewer rollback transaction isolation
</commit_message>
<xml_diff>
--- a/docs/SamsungSwitchWatch_User_Manual_KO.docx
+++ b/docs/SamsungSwitchWatch_User_Manual_KO.docx
@@ -1251,6 +1251,11 @@
       </w:r>
     </w:p>
     <w:p>
+      <w:r>
+        <w:br w:type="page"/>
+      </w:r>
+    </w:p>
+    <w:p>
       <w:pPr>
         <w:keepLines/>
         <w:spacing w:before="80" w:after="160" w:line="283" w:lineRule="auto"/>
@@ -1307,11 +1312,6 @@
       </w:r>
     </w:p>
     <w:p>
-      <w:r>
-        <w:br w:type="page"/>
-      </w:r>
-    </w:p>
-    <w:p>
       <w:pPr>
         <w:keepLines/>
         <w:spacing w:before="80" w:after="160" w:line="283" w:lineRule="auto"/>
@@ -1336,7 +1336,7 @@
           <w:color w:val="16324F"/>
           <w:sz w:val="21"/>
         </w:rPr>
-        <w:t>관리자 설치 창에 Agent installation failed가 표시되면 Cause 줄을 먼저 확인하세요. 설치 성공 뒤 AGENT_CONNECTION_REFUSED가 보이면 Viewer에 스위치 IP, Viewer PC 주소 또는 localhost가 아니라 Agent를 설치한 PC 주소를 입력했는지 먼저 확인하세요. 그 다음 SamsungSwitchWatchAgent 서비스와 TCP/18443을 점검합니다. 서비스를 수동 등록하지 말고 0.9.22-poc Agent 설치기를 사용하세요.</w:t>
+        <w:t>관리자 설치 창에 Agent installation failed가 표시되면 Cause 줄을 먼저 확인하세요. 설치 성공 뒤 AGENT_CONNECTION_REFUSED가 보이면 Viewer에 스위치 IP, Viewer PC 주소 또는 localhost가 아니라 Agent를 설치한 PC 주소를 입력했는지 먼저 확인하세요. 그 다음 SamsungSwitchWatchAgent 서비스와 TCP/18443을 점검합니다. 서비스를 수동 등록하지 말고 0.9.23-poc Agent 설치기를 사용하세요.</w:t>
       </w:r>
     </w:p>
     <w:p>
@@ -1453,7 +1453,7 @@
           <w:color w:val="16324F"/>
           <w:sz w:val="21"/>
         </w:rPr>
-        <w:t>설치 창의 Cause, Detail, 선택적 ExitCode, Recovery와 두 진단 경로를 확인하세요. PREVIOUS_VIEWER_RESTORED이면 시작 메뉴에서 Viewer를 다시 실행합니다. ROLLBACK_INCOMPLETE이면 백업과 진단 파일을 보존하고 Windows 관리자에게 전달하세요. Program Files 실행이 차단되면 보안 정책을 우회하거나 파일 차단을 해제하지 말고 해당 코드를 EDR·AppLocker·WDAC 담당자에게 전달하세요. 사용자 단계 실패 뒤에는 이전 Program Files 버전 복구 UAC가 한 번 더 표시될 수 있습니다. 취소하거나 실패하면 Viewer.__rollback을 삭제하지 마세요. 새 설치 파일이나 매니페스트가 EDR에 의해 격리 또는 손상돼도 보호된 현재 설치를 격리한 뒤 검증된 rollback 슬롯을 먼저 복원합니다. 제거 중 Viewer 프로세스나 활성 프로그램 폴더가 남으면 rollback 슬롯을 삭제하지 않습니다. 자세한 코드는 INSTALL_KO.md를 확인하세요.</w:t>
+        <w:t>설치 창의 Cause, Detail, 선택적 ExitCode, Recovery와 두 진단 경로를 확인하세요. PREVIOUS_VIEWER_RESTORED이면 시작 메뉴에서 Viewer를 다시 실행합니다. ROLLBACK_INCOMPLETE이면 백업과 진단 파일을 보존하고 Windows 관리자에게 전달하세요. Program Files 실행이 차단되면 보안 정책을 우회하거나 파일 차단을 해제하지 말고 해당 코드를 EDR·AppLocker·WDAC 담당자에게 전달하세요. 사용자 단계 실패 뒤에는 이전 Program Files 버전 복구 UAC가 한 번 더 표시될 수 있습니다. 취소하거나 실패하면 Viewer.__rollback을 삭제하지 마세요. 업데이트 직전에는 정상 현재 버전을 새 rollback 기준으로 회전하므로 실패하면 정확히 직전 버전을 복원합니다. 각 관리자 설치는 고유 작업 ID와 활성·rollback manifest SHA-256을 Administrators 전용 marker에 결속하므로, 같은 ZIP을 다시 설치했더라도 앞선 작업의 늦은 복구는 VIEWER_ROLLBACK_ACTIVE_CHANGED로 중단하고 최신 설치·rollback 슬롯·marker를 보존합니다. 기존 Viewer 자체점검만 일시적으로 실패한 경우에도 VIEWER_CURRENT_SELF_CHECK_FAILED로 자동 강등하지 않습니다. 새 설치 파일이나 매니페스트가 EDR에 의해 격리 또는 손상돼도 보호된 현재 설치를 격리한 뒤 검증된 rollback 슬롯을 먼저 복원합니다. 제거 중 Viewer 프로세스나 활성 프로그램 폴더가 남으면 rollback 슬롯을 삭제하지 않습니다. 자세한 코드는 INSTALL_KO.md를 확인하세요.</w:t>
       </w:r>
     </w:p>
     <w:p>
@@ -5912,6 +5912,377 @@
                 <w:rFonts w:ascii="맑은 고딕" w:hAnsi="맑은 고딕" w:eastAsia="맑은 고딕" w:cs="맑은 고딕"/>
                 <w:sz w:val="16"/>
               </w:rPr>
+              <w:t>VIEWER_CURRENT_SELF_CHECK_FAILED</w:t>
+            </w:r>
+          </w:p>
+        </w:tc>
+        <w:tc>
+          <w:tcPr>
+            <w:tcW w:type="dxa" w:w="5060"/>
+            <w:tcMar>
+              <w:top w:w="80" w:type="dxa"/>
+              <w:start w:w="120" w:type="dxa"/>
+              <w:bottom w:w="80" w:type="dxa"/>
+              <w:end w:w="120" w:type="dxa"/>
+            </w:tcMar>
+            <w:vAlign w:val="center"/>
+          </w:tcPr>
+          <w:p>
+            <w:pPr>
+              <w:spacing w:before="0" w:after="0" w:line="240" w:lineRule="auto"/>
+              <w:jc w:val="left"/>
+            </w:pPr>
+            <w:r>
+              <w:rPr>
+                <w:rFonts w:ascii="맑은 고딕" w:hAnsi="맑은 고딕" w:eastAsia="맑은 고딕" w:cs="맑은 고딕"/>
+                <w:sz w:val="16"/>
+              </w:rPr>
+              <w:t>현재·rollback 설치는 보존됨 → EDR·AppLocker·WDAC 지연·차단 확인 → 재시도</w:t>
+            </w:r>
+          </w:p>
+        </w:tc>
+      </w:tr>
+      <w:tr>
+        <w:tc>
+          <w:tcPr>
+            <w:tcW w:type="dxa" w:w="4300"/>
+            <w:shd w:fill="FAFBFC"/>
+            <w:tcMar>
+              <w:top w:w="80" w:type="dxa"/>
+              <w:start w:w="120" w:type="dxa"/>
+              <w:bottom w:w="80" w:type="dxa"/>
+              <w:end w:w="120" w:type="dxa"/>
+            </w:tcMar>
+            <w:vAlign w:val="center"/>
+          </w:tcPr>
+          <w:p>
+            <w:pPr>
+              <w:spacing w:before="0" w:after="0" w:line="240" w:lineRule="auto"/>
+              <w:jc w:val="left"/>
+            </w:pPr>
+            <w:r>
+              <w:rPr>
+                <w:rFonts w:ascii="맑은 고딕" w:hAnsi="맑은 고딕" w:eastAsia="맑은 고딕" w:cs="맑은 고딕"/>
+                <w:sz w:val="16"/>
+              </w:rPr>
+              <w:t>VIEWER_ROLLBACK_ACTIVE_CHANGED</w:t>
+            </w:r>
+          </w:p>
+        </w:tc>
+        <w:tc>
+          <w:tcPr>
+            <w:tcW w:type="dxa" w:w="5060"/>
+            <w:shd w:fill="FAFBFC"/>
+            <w:tcMar>
+              <w:top w:w="80" w:type="dxa"/>
+              <w:start w:w="120" w:type="dxa"/>
+              <w:bottom w:w="80" w:type="dxa"/>
+              <w:end w:w="120" w:type="dxa"/>
+            </w:tcMar>
+            <w:vAlign w:val="center"/>
+          </w:tcPr>
+          <w:p>
+            <w:pPr>
+              <w:spacing w:before="0" w:after="0" w:line="240" w:lineRule="auto"/>
+              <w:jc w:val="left"/>
+            </w:pPr>
+            <w:r>
+              <w:rPr>
+                <w:rFonts w:ascii="맑은 고딕" w:hAnsi="맑은 고딕" w:eastAsia="맑은 고딕" w:cs="맑은 고딕"/>
+                <w:sz w:val="16"/>
+              </w:rPr>
+              <w:t>다른 Viewer 설치가 먼저 완료됨 → 두 설치 증거 보존 → 최신 ZIP으로 다시 설치</w:t>
+            </w:r>
+          </w:p>
+        </w:tc>
+      </w:tr>
+      <w:tr>
+        <w:tc>
+          <w:tcPr>
+            <w:tcW w:type="dxa" w:w="4300"/>
+            <w:tcMar>
+              <w:top w:w="80" w:type="dxa"/>
+              <w:start w:w="120" w:type="dxa"/>
+              <w:bottom w:w="80" w:type="dxa"/>
+              <w:end w:w="120" w:type="dxa"/>
+            </w:tcMar>
+            <w:vAlign w:val="center"/>
+          </w:tcPr>
+          <w:p>
+            <w:pPr>
+              <w:spacing w:before="0" w:after="0" w:line="240" w:lineRule="auto"/>
+              <w:jc w:val="left"/>
+            </w:pPr>
+            <w:r>
+              <w:rPr>
+                <w:rFonts w:ascii="맑은 고딕" w:hAnsi="맑은 고딕" w:eastAsia="맑은 고딕" w:cs="맑은 고딕"/>
+                <w:sz w:val="16"/>
+              </w:rPr>
+              <w:t>VIEWER_ROLLBACK_TRANSACTION_MISSING</w:t>
+            </w:r>
+          </w:p>
+        </w:tc>
+        <w:tc>
+          <w:tcPr>
+            <w:tcW w:type="dxa" w:w="5060"/>
+            <w:tcMar>
+              <w:top w:w="80" w:type="dxa"/>
+              <w:start w:w="120" w:type="dxa"/>
+              <w:bottom w:w="80" w:type="dxa"/>
+              <w:end w:w="120" w:type="dxa"/>
+            </w:tcMar>
+            <w:vAlign w:val="center"/>
+          </w:tcPr>
+          <w:p>
+            <w:pPr>
+              <w:spacing w:before="0" w:after="0" w:line="240" w:lineRule="auto"/>
+              <w:jc w:val="left"/>
+            </w:pPr>
+            <w:r>
+              <w:rPr>
+                <w:rFonts w:ascii="맑은 고딕" w:hAnsi="맑은 고딕" w:eastAsia="맑은 고딕" w:cs="맑은 고딕"/>
+                <w:sz w:val="16"/>
+              </w:rPr>
+              <w:t>관리자 전용 작업 marker 없음 → 설치·slot 보존 → 최신 ZIP으로 관리자 재설치</w:t>
+            </w:r>
+          </w:p>
+        </w:tc>
+      </w:tr>
+      <w:tr>
+        <w:tc>
+          <w:tcPr>
+            <w:tcW w:type="dxa" w:w="4300"/>
+            <w:shd w:fill="FAFBFC"/>
+            <w:tcMar>
+              <w:top w:w="80" w:type="dxa"/>
+              <w:start w:w="120" w:type="dxa"/>
+              <w:bottom w:w="80" w:type="dxa"/>
+              <w:end w:w="120" w:type="dxa"/>
+            </w:tcMar>
+            <w:vAlign w:val="center"/>
+          </w:tcPr>
+          <w:p>
+            <w:pPr>
+              <w:spacing w:before="0" w:after="0" w:line="240" w:lineRule="auto"/>
+              <w:jc w:val="left"/>
+            </w:pPr>
+            <w:r>
+              <w:rPr>
+                <w:rFonts w:ascii="맑은 고딕" w:hAnsi="맑은 고딕" w:eastAsia="맑은 고딕" w:cs="맑은 고딕"/>
+                <w:sz w:val="16"/>
+              </w:rPr>
+              <w:t>VIEWER_ROLLBACK_TRANSACTION_INVALID</w:t>
+            </w:r>
+          </w:p>
+        </w:tc>
+        <w:tc>
+          <w:tcPr>
+            <w:tcW w:type="dxa" w:w="5060"/>
+            <w:shd w:fill="FAFBFC"/>
+            <w:tcMar>
+              <w:top w:w="80" w:type="dxa"/>
+              <w:start w:w="120" w:type="dxa"/>
+              <w:bottom w:w="80" w:type="dxa"/>
+              <w:end w:w="120" w:type="dxa"/>
+            </w:tcMar>
+            <w:vAlign w:val="center"/>
+          </w:tcPr>
+          <w:p>
+            <w:pPr>
+              <w:spacing w:before="0" w:after="0" w:line="240" w:lineRule="auto"/>
+              <w:jc w:val="left"/>
+            </w:pPr>
+            <w:r>
+              <w:rPr>
+                <w:rFonts w:ascii="맑은 고딕" w:hAnsi="맑은 고딕" w:eastAsia="맑은 고딕" w:cs="맑은 고딕"/>
+                <w:sz w:val="16"/>
+              </w:rPr>
+              <w:t>marker 작업 ID·해시·slot 결속 불일치 → 증거 삭제 금지 → 관리자 확인</w:t>
+            </w:r>
+          </w:p>
+        </w:tc>
+      </w:tr>
+      <w:tr>
+        <w:tc>
+          <w:tcPr>
+            <w:tcW w:type="dxa" w:w="4300"/>
+            <w:tcMar>
+              <w:top w:w="80" w:type="dxa"/>
+              <w:start w:w="120" w:type="dxa"/>
+              <w:bottom w:w="80" w:type="dxa"/>
+              <w:end w:w="120" w:type="dxa"/>
+            </w:tcMar>
+            <w:vAlign w:val="center"/>
+          </w:tcPr>
+          <w:p>
+            <w:pPr>
+              <w:spacing w:before="0" w:after="0" w:line="240" w:lineRule="auto"/>
+              <w:jc w:val="left"/>
+            </w:pPr>
+            <w:r>
+              <w:rPr>
+                <w:rFonts w:ascii="맑은 고딕" w:hAnsi="맑은 고딕" w:eastAsia="맑은 고딕" w:cs="맑은 고딕"/>
+                <w:sz w:val="16"/>
+              </w:rPr>
+              <w:t>VIEWER_ROLLBACK_TRANSACTION_TRUST_INVALID</w:t>
+            </w:r>
+          </w:p>
+        </w:tc>
+        <w:tc>
+          <w:tcPr>
+            <w:tcW w:type="dxa" w:w="5060"/>
+            <w:tcMar>
+              <w:top w:w="80" w:type="dxa"/>
+              <w:start w:w="120" w:type="dxa"/>
+              <w:bottom w:w="80" w:type="dxa"/>
+              <w:end w:w="120" w:type="dxa"/>
+            </w:tcMar>
+            <w:vAlign w:val="center"/>
+          </w:tcPr>
+          <w:p>
+            <w:pPr>
+              <w:spacing w:before="0" w:after="0" w:line="240" w:lineRule="auto"/>
+              <w:jc w:val="left"/>
+            </w:pPr>
+            <w:r>
+              <w:rPr>
+                <w:rFonts w:ascii="맑은 고딕" w:hAnsi="맑은 고딕" w:eastAsia="맑은 고딕" w:cs="맑은 고딕"/>
+                <w:sz w:val="16"/>
+              </w:rPr>
+              <w:t>marker ACL·소유권 신뢰 불가 → ACL 우회 금지 → 관리자·보안 담당자 확인</w:t>
+            </w:r>
+          </w:p>
+        </w:tc>
+      </w:tr>
+      <w:tr>
+        <w:tc>
+          <w:tcPr>
+            <w:tcW w:type="dxa" w:w="4300"/>
+            <w:shd w:fill="FAFBFC"/>
+            <w:tcMar>
+              <w:top w:w="80" w:type="dxa"/>
+              <w:start w:w="120" w:type="dxa"/>
+              <w:bottom w:w="80" w:type="dxa"/>
+              <w:end w:w="120" w:type="dxa"/>
+            </w:tcMar>
+            <w:vAlign w:val="center"/>
+          </w:tcPr>
+          <w:p>
+            <w:pPr>
+              <w:spacing w:before="0" w:after="0" w:line="240" w:lineRule="auto"/>
+              <w:jc w:val="left"/>
+            </w:pPr>
+            <w:r>
+              <w:rPr>
+                <w:rFonts w:ascii="맑은 고딕" w:hAnsi="맑은 고딕" w:eastAsia="맑은 고딕" w:cs="맑은 고딕"/>
+                <w:sz w:val="16"/>
+              </w:rPr>
+              <w:t>VIEWER_ROLLBACK_TRANSACTION_CONSUME_FAILED</w:t>
+            </w:r>
+          </w:p>
+        </w:tc>
+        <w:tc>
+          <w:tcPr>
+            <w:tcW w:type="dxa" w:w="5060"/>
+            <w:shd w:fill="FAFBFC"/>
+            <w:tcMar>
+              <w:top w:w="80" w:type="dxa"/>
+              <w:start w:w="120" w:type="dxa"/>
+              <w:bottom w:w="80" w:type="dxa"/>
+              <w:end w:w="120" w:type="dxa"/>
+            </w:tcMar>
+            <w:vAlign w:val="center"/>
+          </w:tcPr>
+          <w:p>
+            <w:pPr>
+              <w:spacing w:before="0" w:after="0" w:line="240" w:lineRule="auto"/>
+              <w:jc w:val="left"/>
+            </w:pPr>
+            <w:r>
+              <w:rPr>
+                <w:rFonts w:ascii="맑은 고딕" w:hAnsi="맑은 고딕" w:eastAsia="맑은 고딕" w:cs="맑은 고딕"/>
+                <w:sz w:val="16"/>
+              </w:rPr>
+              <w:t>복원 뒤 marker 제거 실패 → 복원된 Viewer 보존 → 관리자 재설치</w:t>
+            </w:r>
+          </w:p>
+        </w:tc>
+      </w:tr>
+      <w:tr>
+        <w:tc>
+          <w:tcPr>
+            <w:tcW w:type="dxa" w:w="4300"/>
+            <w:tcMar>
+              <w:top w:w="80" w:type="dxa"/>
+              <w:start w:w="120" w:type="dxa"/>
+              <w:bottom w:w="80" w:type="dxa"/>
+              <w:end w:w="120" w:type="dxa"/>
+            </w:tcMar>
+            <w:vAlign w:val="center"/>
+          </w:tcPr>
+          <w:p>
+            <w:pPr>
+              <w:spacing w:before="0" w:after="0" w:line="240" w:lineRule="auto"/>
+              <w:jc w:val="left"/>
+            </w:pPr>
+            <w:r>
+              <w:rPr>
+                <w:rFonts w:ascii="맑은 고딕" w:hAnsi="맑은 고딕" w:eastAsia="맑은 고딕" w:cs="맑은 고딕"/>
+                <w:sz w:val="16"/>
+              </w:rPr>
+              <w:t>VIEWER_ROLLBACK_TRANSACTION_WRITE_FAILED</w:t>
+            </w:r>
+          </w:p>
+        </w:tc>
+        <w:tc>
+          <w:tcPr>
+            <w:tcW w:type="dxa" w:w="5060"/>
+            <w:tcMar>
+              <w:top w:w="80" w:type="dxa"/>
+              <w:start w:w="120" w:type="dxa"/>
+              <w:bottom w:w="80" w:type="dxa"/>
+              <w:end w:w="120" w:type="dxa"/>
+            </w:tcMar>
+            <w:vAlign w:val="center"/>
+          </w:tcPr>
+          <w:p>
+            <w:pPr>
+              <w:spacing w:before="0" w:after="0" w:line="240" w:lineRule="auto"/>
+              <w:jc w:val="left"/>
+            </w:pPr>
+            <w:r>
+              <w:rPr>
+                <w:rFonts w:ascii="맑은 고딕" w:hAnsi="맑은 고딕" w:eastAsia="맑은 고딕" w:cs="맑은 고딕"/>
+                <w:sz w:val="16"/>
+              </w:rPr>
+              <w:t>새 marker 확정 실패 → Recovery 결과 → 설치·slot·marker 증거 보존</w:t>
+            </w:r>
+          </w:p>
+        </w:tc>
+      </w:tr>
+      <w:tr>
+        <w:tc>
+          <w:tcPr>
+            <w:tcW w:type="dxa" w:w="4300"/>
+            <w:shd w:fill="FAFBFC"/>
+            <w:tcMar>
+              <w:top w:w="80" w:type="dxa"/>
+              <w:start w:w="120" w:type="dxa"/>
+              <w:bottom w:w="80" w:type="dxa"/>
+              <w:end w:w="120" w:type="dxa"/>
+            </w:tcMar>
+            <w:vAlign w:val="center"/>
+          </w:tcPr>
+          <w:p>
+            <w:pPr>
+              <w:spacing w:before="0" w:after="0" w:line="240" w:lineRule="auto"/>
+              <w:jc w:val="left"/>
+            </w:pPr>
+            <w:r>
+              <w:rPr>
+                <w:rFonts w:ascii="맑은 고딕" w:hAnsi="맑은 고딕" w:eastAsia="맑은 고딕" w:cs="맑은 고딕"/>
+                <w:sz w:val="16"/>
+              </w:rPr>
               <w:t>VIEWER_MACHINE_ROLLBACK_INCOMPLETE</w:t>
             </w:r>
           </w:p>
@@ -5919,6 +6290,7 @@
         <w:tc>
           <w:tcPr>
             <w:tcW w:type="dxa" w:w="5060"/>
+            <w:shd w:fill="FAFBFC"/>
             <w:tcMar>
               <w:top w:w="80" w:type="dxa"/>
               <w:start w:w="120" w:type="dxa"/>
@@ -5946,7 +6318,6 @@
         <w:tc>
           <w:tcPr>
             <w:tcW w:type="dxa" w:w="4300"/>
-            <w:shd w:fill="FAFBFC"/>
             <w:tcMar>
               <w:top w:w="80" w:type="dxa"/>
               <w:start w:w="120" w:type="dxa"/>
@@ -5972,7 +6343,6 @@
         <w:tc>
           <w:tcPr>
             <w:tcW w:type="dxa" w:w="5060"/>
-            <w:shd w:fill="FAFBFC"/>
             <w:tcMar>
               <w:top w:w="80" w:type="dxa"/>
               <w:start w:w="120" w:type="dxa"/>
@@ -6000,6 +6370,7 @@
         <w:tc>
           <w:tcPr>
             <w:tcW w:type="dxa" w:w="4300"/>
+            <w:shd w:fill="FAFBFC"/>
             <w:tcMar>
               <w:top w:w="80" w:type="dxa"/>
               <w:start w:w="120" w:type="dxa"/>
@@ -6025,6 +6396,7 @@
         <w:tc>
           <w:tcPr>
             <w:tcW w:type="dxa" w:w="5060"/>
+            <w:shd w:fill="FAFBFC"/>
             <w:tcMar>
               <w:top w:w="80" w:type="dxa"/>
               <w:start w:w="120" w:type="dxa"/>
@@ -6052,7 +6424,6 @@
         <w:tc>
           <w:tcPr>
             <w:tcW w:type="dxa" w:w="4300"/>
-            <w:shd w:fill="FAFBFC"/>
             <w:tcMar>
               <w:top w:w="80" w:type="dxa"/>
               <w:start w:w="120" w:type="dxa"/>
@@ -6078,7 +6449,6 @@
         <w:tc>
           <w:tcPr>
             <w:tcW w:type="dxa" w:w="5060"/>
-            <w:shd w:fill="FAFBFC"/>
             <w:tcMar>
               <w:top w:w="80" w:type="dxa"/>
               <w:start w:w="120" w:type="dxa"/>
@@ -6106,6 +6476,7 @@
         <w:tc>
           <w:tcPr>
             <w:tcW w:type="dxa" w:w="4300"/>
+            <w:shd w:fill="FAFBFC"/>
             <w:tcMar>
               <w:top w:w="80" w:type="dxa"/>
               <w:start w:w="120" w:type="dxa"/>
@@ -6131,6 +6502,7 @@
         <w:tc>
           <w:tcPr>
             <w:tcW w:type="dxa" w:w="5060"/>
+            <w:shd w:fill="FAFBFC"/>
             <w:tcMar>
               <w:top w:w="80" w:type="dxa"/>
               <w:start w:w="120" w:type="dxa"/>
@@ -6158,7 +6530,6 @@
         <w:tc>
           <w:tcPr>
             <w:tcW w:type="dxa" w:w="4300"/>
-            <w:shd w:fill="FAFBFC"/>
             <w:tcMar>
               <w:top w:w="80" w:type="dxa"/>
               <w:start w:w="120" w:type="dxa"/>
@@ -6184,7 +6555,6 @@
         <w:tc>
           <w:tcPr>
             <w:tcW w:type="dxa" w:w="5060"/>
-            <w:shd w:fill="FAFBFC"/>
             <w:tcMar>
               <w:top w:w="80" w:type="dxa"/>
               <w:start w:w="120" w:type="dxa"/>
@@ -6212,6 +6582,7 @@
         <w:tc>
           <w:tcPr>
             <w:tcW w:type="dxa" w:w="4300"/>
+            <w:shd w:fill="FAFBFC"/>
             <w:tcMar>
               <w:top w:w="80" w:type="dxa"/>
               <w:start w:w="120" w:type="dxa"/>
@@ -6237,6 +6608,7 @@
         <w:tc>
           <w:tcPr>
             <w:tcW w:type="dxa" w:w="5060"/>
+            <w:shd w:fill="FAFBFC"/>
             <w:tcMar>
               <w:top w:w="80" w:type="dxa"/>
               <w:start w:w="120" w:type="dxa"/>
@@ -6264,7 +6636,6 @@
         <w:tc>
           <w:tcPr>
             <w:tcW w:type="dxa" w:w="4300"/>
-            <w:shd w:fill="FAFBFC"/>
             <w:tcMar>
               <w:top w:w="80" w:type="dxa"/>
               <w:start w:w="120" w:type="dxa"/>
@@ -6290,7 +6661,6 @@
         <w:tc>
           <w:tcPr>
             <w:tcW w:type="dxa" w:w="5060"/>
-            <w:shd w:fill="FAFBFC"/>
             <w:tcMar>
               <w:top w:w="80" w:type="dxa"/>
               <w:start w:w="120" w:type="dxa"/>
@@ -6318,6 +6688,7 @@
         <w:tc>
           <w:tcPr>
             <w:tcW w:type="dxa" w:w="4300"/>
+            <w:shd w:fill="FAFBFC"/>
             <w:tcMar>
               <w:top w:w="80" w:type="dxa"/>
               <w:start w:w="120" w:type="dxa"/>
@@ -6343,6 +6714,7 @@
         <w:tc>
           <w:tcPr>
             <w:tcW w:type="dxa" w:w="5060"/>
+            <w:shd w:fill="FAFBFC"/>
             <w:tcMar>
               <w:top w:w="80" w:type="dxa"/>
               <w:start w:w="120" w:type="dxa"/>
@@ -6370,7 +6742,6 @@
         <w:tc>
           <w:tcPr>
             <w:tcW w:type="dxa" w:w="4300"/>
-            <w:shd w:fill="FAFBFC"/>
             <w:tcMar>
               <w:top w:w="80" w:type="dxa"/>
               <w:start w:w="120" w:type="dxa"/>
@@ -6396,7 +6767,6 @@
         <w:tc>
           <w:tcPr>
             <w:tcW w:type="dxa" w:w="5060"/>
-            <w:shd w:fill="FAFBFC"/>
             <w:tcMar>
               <w:top w:w="80" w:type="dxa"/>
               <w:start w:w="120" w:type="dxa"/>
@@ -6424,6 +6794,7 @@
         <w:tc>
           <w:tcPr>
             <w:tcW w:type="dxa" w:w="4300"/>
+            <w:shd w:fill="FAFBFC"/>
             <w:tcMar>
               <w:top w:w="80" w:type="dxa"/>
               <w:start w:w="120" w:type="dxa"/>
@@ -6449,6 +6820,7 @@
         <w:tc>
           <w:tcPr>
             <w:tcW w:type="dxa" w:w="5060"/>
+            <w:shd w:fill="FAFBFC"/>
             <w:tcMar>
               <w:top w:w="80" w:type="dxa"/>
               <w:start w:w="120" w:type="dxa"/>
@@ -6476,7 +6848,6 @@
         <w:tc>
           <w:tcPr>
             <w:tcW w:type="dxa" w:w="4300"/>
-            <w:shd w:fill="FAFBFC"/>
             <w:tcMar>
               <w:top w:w="80" w:type="dxa"/>
               <w:start w:w="120" w:type="dxa"/>
@@ -6502,7 +6873,6 @@
         <w:tc>
           <w:tcPr>
             <w:tcW w:type="dxa" w:w="5060"/>
-            <w:shd w:fill="FAFBFC"/>
             <w:tcMar>
               <w:top w:w="80" w:type="dxa"/>
               <w:start w:w="120" w:type="dxa"/>
@@ -6530,6 +6900,7 @@
         <w:tc>
           <w:tcPr>
             <w:tcW w:type="dxa" w:w="4300"/>
+            <w:shd w:fill="FAFBFC"/>
             <w:tcMar>
               <w:top w:w="80" w:type="dxa"/>
               <w:start w:w="120" w:type="dxa"/>
@@ -6555,6 +6926,7 @@
         <w:tc>
           <w:tcPr>
             <w:tcW w:type="dxa" w:w="5060"/>
+            <w:shd w:fill="FAFBFC"/>
             <w:tcMar>
               <w:top w:w="80" w:type="dxa"/>
               <w:start w:w="120" w:type="dxa"/>
@@ -6582,7 +6954,6 @@
         <w:tc>
           <w:tcPr>
             <w:tcW w:type="dxa" w:w="4300"/>
-            <w:shd w:fill="FAFBFC"/>
             <w:tcMar>
               <w:top w:w="80" w:type="dxa"/>
               <w:start w:w="120" w:type="dxa"/>
@@ -6608,7 +6979,6 @@
         <w:tc>
           <w:tcPr>
             <w:tcW w:type="dxa" w:w="5060"/>
-            <w:shd w:fill="FAFBFC"/>
             <w:tcMar>
               <w:top w:w="80" w:type="dxa"/>
               <w:start w:w="120" w:type="dxa"/>
@@ -6636,6 +7006,7 @@
         <w:tc>
           <w:tcPr>
             <w:tcW w:type="dxa" w:w="4300"/>
+            <w:shd w:fill="FAFBFC"/>
             <w:tcMar>
               <w:top w:w="80" w:type="dxa"/>
               <w:start w:w="120" w:type="dxa"/>
@@ -6661,6 +7032,7 @@
         <w:tc>
           <w:tcPr>
             <w:tcW w:type="dxa" w:w="5060"/>
+            <w:shd w:fill="FAFBFC"/>
             <w:tcMar>
               <w:top w:w="80" w:type="dxa"/>
               <w:start w:w="120" w:type="dxa"/>
@@ -6688,7 +7060,6 @@
         <w:tc>
           <w:tcPr>
             <w:tcW w:type="dxa" w:w="4300"/>
-            <w:shd w:fill="FAFBFC"/>
             <w:tcMar>
               <w:top w:w="80" w:type="dxa"/>
               <w:start w:w="120" w:type="dxa"/>
@@ -6714,6 +7085,33 @@
         <w:tc>
           <w:tcPr>
             <w:tcW w:type="dxa" w:w="5060"/>
+            <w:tcMar>
+              <w:top w:w="80" w:type="dxa"/>
+              <w:start w:w="120" w:type="dxa"/>
+              <w:bottom w:w="80" w:type="dxa"/>
+              <w:end w:w="120" w:type="dxa"/>
+            </w:tcMar>
+            <w:vAlign w:val="center"/>
+          </w:tcPr>
+          <w:p>
+            <w:pPr>
+              <w:spacing w:before="0" w:after="0" w:line="240" w:lineRule="auto"/>
+              <w:jc w:val="left"/>
+            </w:pPr>
+            <w:r>
+              <w:rPr>
+                <w:rFonts w:ascii="맑은 고딕" w:hAnsi="맑은 고딕" w:eastAsia="맑은 고딕" w:cs="맑은 고딕"/>
+                <w:sz w:val="16"/>
+              </w:rPr>
+              <w:t>Viewer 프로세스·활성 프로그램 폴더 정리 → 관리자 제거 재실행</w:t>
+            </w:r>
+          </w:p>
+        </w:tc>
+      </w:tr>
+      <w:tr>
+        <w:tc>
+          <w:tcPr>
+            <w:tcW w:type="dxa" w:w="4300"/>
             <w:shd w:fill="FAFBFC"/>
             <w:tcMar>
               <w:top w:w="80" w:type="dxa"/>
@@ -6733,7 +7131,33 @@
                 <w:rFonts w:ascii="맑은 고딕" w:hAnsi="맑은 고딕" w:eastAsia="맑은 고딕" w:cs="맑은 고딕"/>
                 <w:sz w:val="16"/>
               </w:rPr>
-              <w:t>Viewer 프로세스·활성 프로그램 폴더 정리 → 관리자 제거 재실행</w:t>
+              <w:t>VIEWER_UNINSTALL_TRANSACTION_PRESERVED</w:t>
+            </w:r>
+          </w:p>
+        </w:tc>
+        <w:tc>
+          <w:tcPr>
+            <w:tcW w:type="dxa" w:w="5060"/>
+            <w:shd w:fill="FAFBFC"/>
+            <w:tcMar>
+              <w:top w:w="80" w:type="dxa"/>
+              <w:start w:w="120" w:type="dxa"/>
+              <w:bottom w:w="80" w:type="dxa"/>
+              <w:end w:w="120" w:type="dxa"/>
+            </w:tcMar>
+            <w:vAlign w:val="center"/>
+          </w:tcPr>
+          <w:p>
+            <w:pPr>
+              <w:spacing w:before="0" w:after="0" w:line="240" w:lineRule="auto"/>
+              <w:jc w:val="left"/>
+            </w:pPr>
+            <w:r>
+              <w:rPr>
+                <w:rFonts w:ascii="맑은 고딕" w:hAnsi="맑은 고딕" w:eastAsia="맑은 고딕" w:cs="맑은 고딕"/>
+                <w:sz w:val="16"/>
+              </w:rPr>
+              <w:t>활성 프로그램·rollback slot 제거 미확인 → marker 보존 → 관리자 제거 재실행</w:t>
             </w:r>
           </w:p>
         </w:tc>
@@ -8422,7 +8846,7 @@
         <w:color w:val="64748B"/>
         <w:sz w:val="17"/>
       </w:rPr>
-      <w:t xml:space="preserve">v0.9.22-poc  |  </w:t>
+      <w:t xml:space="preserve">v0.9.23-poc  |  </w:t>
     </w:r>
     <w:r>
       <w:rPr>
@@ -8453,7 +8877,7 @@
         <w:color w:val="64748B"/>
         <w:sz w:val="17"/>
       </w:rPr>
-      <w:t>v0.9.22-poc  |  2026-07-28</w:t>
+      <w:t>v0.9.23-poc  |  2026-07-28</w:t>
     </w:r>
   </w:p>
 </w:ftr>

</xml_diff>

<commit_message>
Fix Viewer rollback transaction isolation (#33)
</commit_message>
<xml_diff>
--- a/docs/SamsungSwitchWatch_User_Manual_KO.docx
+++ b/docs/SamsungSwitchWatch_User_Manual_KO.docx
@@ -1251,6 +1251,11 @@
       </w:r>
     </w:p>
     <w:p>
+      <w:r>
+        <w:br w:type="page"/>
+      </w:r>
+    </w:p>
+    <w:p>
       <w:pPr>
         <w:keepLines/>
         <w:spacing w:before="80" w:after="160" w:line="283" w:lineRule="auto"/>
@@ -1307,11 +1312,6 @@
       </w:r>
     </w:p>
     <w:p>
-      <w:r>
-        <w:br w:type="page"/>
-      </w:r>
-    </w:p>
-    <w:p>
       <w:pPr>
         <w:keepLines/>
         <w:spacing w:before="80" w:after="160" w:line="283" w:lineRule="auto"/>
@@ -1336,7 +1336,7 @@
           <w:color w:val="16324F"/>
           <w:sz w:val="21"/>
         </w:rPr>
-        <w:t>관리자 설치 창에 Agent installation failed가 표시되면 Cause 줄을 먼저 확인하세요. 설치 성공 뒤 AGENT_CONNECTION_REFUSED가 보이면 Viewer에 스위치 IP, Viewer PC 주소 또는 localhost가 아니라 Agent를 설치한 PC 주소를 입력했는지 먼저 확인하세요. 그 다음 SamsungSwitchWatchAgent 서비스와 TCP/18443을 점검합니다. 서비스를 수동 등록하지 말고 0.9.22-poc Agent 설치기를 사용하세요.</w:t>
+        <w:t>관리자 설치 창에 Agent installation failed가 표시되면 Cause 줄을 먼저 확인하세요. 설치 성공 뒤 AGENT_CONNECTION_REFUSED가 보이면 Viewer에 스위치 IP, Viewer PC 주소 또는 localhost가 아니라 Agent를 설치한 PC 주소를 입력했는지 먼저 확인하세요. 그 다음 SamsungSwitchWatchAgent 서비스와 TCP/18443을 점검합니다. 서비스를 수동 등록하지 말고 0.9.23-poc Agent 설치기를 사용하세요.</w:t>
       </w:r>
     </w:p>
     <w:p>
@@ -1453,7 +1453,7 @@
           <w:color w:val="16324F"/>
           <w:sz w:val="21"/>
         </w:rPr>
-        <w:t>설치 창의 Cause, Detail, 선택적 ExitCode, Recovery와 두 진단 경로를 확인하세요. PREVIOUS_VIEWER_RESTORED이면 시작 메뉴에서 Viewer를 다시 실행합니다. ROLLBACK_INCOMPLETE이면 백업과 진단 파일을 보존하고 Windows 관리자에게 전달하세요. Program Files 실행이 차단되면 보안 정책을 우회하거나 파일 차단을 해제하지 말고 해당 코드를 EDR·AppLocker·WDAC 담당자에게 전달하세요. 사용자 단계 실패 뒤에는 이전 Program Files 버전 복구 UAC가 한 번 더 표시될 수 있습니다. 취소하거나 실패하면 Viewer.__rollback을 삭제하지 마세요. 새 설치 파일이나 매니페스트가 EDR에 의해 격리 또는 손상돼도 보호된 현재 설치를 격리한 뒤 검증된 rollback 슬롯을 먼저 복원합니다. 제거 중 Viewer 프로세스나 활성 프로그램 폴더가 남으면 rollback 슬롯을 삭제하지 않습니다. 자세한 코드는 INSTALL_KO.md를 확인하세요.</w:t>
+        <w:t>설치 창의 Cause, Detail, 선택적 ExitCode, Recovery와 두 진단 경로를 확인하세요. PREVIOUS_VIEWER_RESTORED이면 시작 메뉴에서 Viewer를 다시 실행합니다. ROLLBACK_INCOMPLETE이면 백업과 진단 파일을 보존하고 Windows 관리자에게 전달하세요. Program Files 실행이 차단되면 보안 정책을 우회하거나 파일 차단을 해제하지 말고 해당 코드를 EDR·AppLocker·WDAC 담당자에게 전달하세요. 사용자 단계 실패 뒤에는 이전 Program Files 버전 복구 UAC가 한 번 더 표시될 수 있습니다. 취소하거나 실패하면 Viewer.__rollback을 삭제하지 마세요. 업데이트 직전에는 정상 현재 버전을 새 rollback 기준으로 회전하므로 실패하면 정확히 직전 버전을 복원합니다. 각 관리자 설치는 고유 작업 ID와 활성·rollback manifest SHA-256을 Administrators 전용 marker에 결속하므로, 같은 ZIP을 다시 설치했더라도 앞선 작업의 늦은 복구는 VIEWER_ROLLBACK_ACTIVE_CHANGED로 중단하고 최신 설치·rollback 슬롯·marker를 보존합니다. 기존 Viewer 자체점검만 일시적으로 실패한 경우에도 VIEWER_CURRENT_SELF_CHECK_FAILED로 자동 강등하지 않습니다. 새 설치 파일이나 매니페스트가 EDR에 의해 격리 또는 손상돼도 보호된 현재 설치를 격리한 뒤 검증된 rollback 슬롯을 먼저 복원합니다. 제거 중 Viewer 프로세스나 활성 프로그램 폴더가 남으면 rollback 슬롯을 삭제하지 않습니다. 자세한 코드는 INSTALL_KO.md를 확인하세요.</w:t>
       </w:r>
     </w:p>
     <w:p>
@@ -5912,6 +5912,377 @@
                 <w:rFonts w:ascii="맑은 고딕" w:hAnsi="맑은 고딕" w:eastAsia="맑은 고딕" w:cs="맑은 고딕"/>
                 <w:sz w:val="16"/>
               </w:rPr>
+              <w:t>VIEWER_CURRENT_SELF_CHECK_FAILED</w:t>
+            </w:r>
+          </w:p>
+        </w:tc>
+        <w:tc>
+          <w:tcPr>
+            <w:tcW w:type="dxa" w:w="5060"/>
+            <w:tcMar>
+              <w:top w:w="80" w:type="dxa"/>
+              <w:start w:w="120" w:type="dxa"/>
+              <w:bottom w:w="80" w:type="dxa"/>
+              <w:end w:w="120" w:type="dxa"/>
+            </w:tcMar>
+            <w:vAlign w:val="center"/>
+          </w:tcPr>
+          <w:p>
+            <w:pPr>
+              <w:spacing w:before="0" w:after="0" w:line="240" w:lineRule="auto"/>
+              <w:jc w:val="left"/>
+            </w:pPr>
+            <w:r>
+              <w:rPr>
+                <w:rFonts w:ascii="맑은 고딕" w:hAnsi="맑은 고딕" w:eastAsia="맑은 고딕" w:cs="맑은 고딕"/>
+                <w:sz w:val="16"/>
+              </w:rPr>
+              <w:t>현재·rollback 설치는 보존됨 → EDR·AppLocker·WDAC 지연·차단 확인 → 재시도</w:t>
+            </w:r>
+          </w:p>
+        </w:tc>
+      </w:tr>
+      <w:tr>
+        <w:tc>
+          <w:tcPr>
+            <w:tcW w:type="dxa" w:w="4300"/>
+            <w:shd w:fill="FAFBFC"/>
+            <w:tcMar>
+              <w:top w:w="80" w:type="dxa"/>
+              <w:start w:w="120" w:type="dxa"/>
+              <w:bottom w:w="80" w:type="dxa"/>
+              <w:end w:w="120" w:type="dxa"/>
+            </w:tcMar>
+            <w:vAlign w:val="center"/>
+          </w:tcPr>
+          <w:p>
+            <w:pPr>
+              <w:spacing w:before="0" w:after="0" w:line="240" w:lineRule="auto"/>
+              <w:jc w:val="left"/>
+            </w:pPr>
+            <w:r>
+              <w:rPr>
+                <w:rFonts w:ascii="맑은 고딕" w:hAnsi="맑은 고딕" w:eastAsia="맑은 고딕" w:cs="맑은 고딕"/>
+                <w:sz w:val="16"/>
+              </w:rPr>
+              <w:t>VIEWER_ROLLBACK_ACTIVE_CHANGED</w:t>
+            </w:r>
+          </w:p>
+        </w:tc>
+        <w:tc>
+          <w:tcPr>
+            <w:tcW w:type="dxa" w:w="5060"/>
+            <w:shd w:fill="FAFBFC"/>
+            <w:tcMar>
+              <w:top w:w="80" w:type="dxa"/>
+              <w:start w:w="120" w:type="dxa"/>
+              <w:bottom w:w="80" w:type="dxa"/>
+              <w:end w:w="120" w:type="dxa"/>
+            </w:tcMar>
+            <w:vAlign w:val="center"/>
+          </w:tcPr>
+          <w:p>
+            <w:pPr>
+              <w:spacing w:before="0" w:after="0" w:line="240" w:lineRule="auto"/>
+              <w:jc w:val="left"/>
+            </w:pPr>
+            <w:r>
+              <w:rPr>
+                <w:rFonts w:ascii="맑은 고딕" w:hAnsi="맑은 고딕" w:eastAsia="맑은 고딕" w:cs="맑은 고딕"/>
+                <w:sz w:val="16"/>
+              </w:rPr>
+              <w:t>다른 Viewer 설치가 먼저 완료됨 → 두 설치 증거 보존 → 최신 ZIP으로 다시 설치</w:t>
+            </w:r>
+          </w:p>
+        </w:tc>
+      </w:tr>
+      <w:tr>
+        <w:tc>
+          <w:tcPr>
+            <w:tcW w:type="dxa" w:w="4300"/>
+            <w:tcMar>
+              <w:top w:w="80" w:type="dxa"/>
+              <w:start w:w="120" w:type="dxa"/>
+              <w:bottom w:w="80" w:type="dxa"/>
+              <w:end w:w="120" w:type="dxa"/>
+            </w:tcMar>
+            <w:vAlign w:val="center"/>
+          </w:tcPr>
+          <w:p>
+            <w:pPr>
+              <w:spacing w:before="0" w:after="0" w:line="240" w:lineRule="auto"/>
+              <w:jc w:val="left"/>
+            </w:pPr>
+            <w:r>
+              <w:rPr>
+                <w:rFonts w:ascii="맑은 고딕" w:hAnsi="맑은 고딕" w:eastAsia="맑은 고딕" w:cs="맑은 고딕"/>
+                <w:sz w:val="16"/>
+              </w:rPr>
+              <w:t>VIEWER_ROLLBACK_TRANSACTION_MISSING</w:t>
+            </w:r>
+          </w:p>
+        </w:tc>
+        <w:tc>
+          <w:tcPr>
+            <w:tcW w:type="dxa" w:w="5060"/>
+            <w:tcMar>
+              <w:top w:w="80" w:type="dxa"/>
+              <w:start w:w="120" w:type="dxa"/>
+              <w:bottom w:w="80" w:type="dxa"/>
+              <w:end w:w="120" w:type="dxa"/>
+            </w:tcMar>
+            <w:vAlign w:val="center"/>
+          </w:tcPr>
+          <w:p>
+            <w:pPr>
+              <w:spacing w:before="0" w:after="0" w:line="240" w:lineRule="auto"/>
+              <w:jc w:val="left"/>
+            </w:pPr>
+            <w:r>
+              <w:rPr>
+                <w:rFonts w:ascii="맑은 고딕" w:hAnsi="맑은 고딕" w:eastAsia="맑은 고딕" w:cs="맑은 고딕"/>
+                <w:sz w:val="16"/>
+              </w:rPr>
+              <w:t>관리자 전용 작업 marker 없음 → 설치·slot 보존 → 최신 ZIP으로 관리자 재설치</w:t>
+            </w:r>
+          </w:p>
+        </w:tc>
+      </w:tr>
+      <w:tr>
+        <w:tc>
+          <w:tcPr>
+            <w:tcW w:type="dxa" w:w="4300"/>
+            <w:shd w:fill="FAFBFC"/>
+            <w:tcMar>
+              <w:top w:w="80" w:type="dxa"/>
+              <w:start w:w="120" w:type="dxa"/>
+              <w:bottom w:w="80" w:type="dxa"/>
+              <w:end w:w="120" w:type="dxa"/>
+            </w:tcMar>
+            <w:vAlign w:val="center"/>
+          </w:tcPr>
+          <w:p>
+            <w:pPr>
+              <w:spacing w:before="0" w:after="0" w:line="240" w:lineRule="auto"/>
+              <w:jc w:val="left"/>
+            </w:pPr>
+            <w:r>
+              <w:rPr>
+                <w:rFonts w:ascii="맑은 고딕" w:hAnsi="맑은 고딕" w:eastAsia="맑은 고딕" w:cs="맑은 고딕"/>
+                <w:sz w:val="16"/>
+              </w:rPr>
+              <w:t>VIEWER_ROLLBACK_TRANSACTION_INVALID</w:t>
+            </w:r>
+          </w:p>
+        </w:tc>
+        <w:tc>
+          <w:tcPr>
+            <w:tcW w:type="dxa" w:w="5060"/>
+            <w:shd w:fill="FAFBFC"/>
+            <w:tcMar>
+              <w:top w:w="80" w:type="dxa"/>
+              <w:start w:w="120" w:type="dxa"/>
+              <w:bottom w:w="80" w:type="dxa"/>
+              <w:end w:w="120" w:type="dxa"/>
+            </w:tcMar>
+            <w:vAlign w:val="center"/>
+          </w:tcPr>
+          <w:p>
+            <w:pPr>
+              <w:spacing w:before="0" w:after="0" w:line="240" w:lineRule="auto"/>
+              <w:jc w:val="left"/>
+            </w:pPr>
+            <w:r>
+              <w:rPr>
+                <w:rFonts w:ascii="맑은 고딕" w:hAnsi="맑은 고딕" w:eastAsia="맑은 고딕" w:cs="맑은 고딕"/>
+                <w:sz w:val="16"/>
+              </w:rPr>
+              <w:t>marker 작업 ID·해시·slot 결속 불일치 → 증거 삭제 금지 → 관리자 확인</w:t>
+            </w:r>
+          </w:p>
+        </w:tc>
+      </w:tr>
+      <w:tr>
+        <w:tc>
+          <w:tcPr>
+            <w:tcW w:type="dxa" w:w="4300"/>
+            <w:tcMar>
+              <w:top w:w="80" w:type="dxa"/>
+              <w:start w:w="120" w:type="dxa"/>
+              <w:bottom w:w="80" w:type="dxa"/>
+              <w:end w:w="120" w:type="dxa"/>
+            </w:tcMar>
+            <w:vAlign w:val="center"/>
+          </w:tcPr>
+          <w:p>
+            <w:pPr>
+              <w:spacing w:before="0" w:after="0" w:line="240" w:lineRule="auto"/>
+              <w:jc w:val="left"/>
+            </w:pPr>
+            <w:r>
+              <w:rPr>
+                <w:rFonts w:ascii="맑은 고딕" w:hAnsi="맑은 고딕" w:eastAsia="맑은 고딕" w:cs="맑은 고딕"/>
+                <w:sz w:val="16"/>
+              </w:rPr>
+              <w:t>VIEWER_ROLLBACK_TRANSACTION_TRUST_INVALID</w:t>
+            </w:r>
+          </w:p>
+        </w:tc>
+        <w:tc>
+          <w:tcPr>
+            <w:tcW w:type="dxa" w:w="5060"/>
+            <w:tcMar>
+              <w:top w:w="80" w:type="dxa"/>
+              <w:start w:w="120" w:type="dxa"/>
+              <w:bottom w:w="80" w:type="dxa"/>
+              <w:end w:w="120" w:type="dxa"/>
+            </w:tcMar>
+            <w:vAlign w:val="center"/>
+          </w:tcPr>
+          <w:p>
+            <w:pPr>
+              <w:spacing w:before="0" w:after="0" w:line="240" w:lineRule="auto"/>
+              <w:jc w:val="left"/>
+            </w:pPr>
+            <w:r>
+              <w:rPr>
+                <w:rFonts w:ascii="맑은 고딕" w:hAnsi="맑은 고딕" w:eastAsia="맑은 고딕" w:cs="맑은 고딕"/>
+                <w:sz w:val="16"/>
+              </w:rPr>
+              <w:t>marker ACL·소유권 신뢰 불가 → ACL 우회 금지 → 관리자·보안 담당자 확인</w:t>
+            </w:r>
+          </w:p>
+        </w:tc>
+      </w:tr>
+      <w:tr>
+        <w:tc>
+          <w:tcPr>
+            <w:tcW w:type="dxa" w:w="4300"/>
+            <w:shd w:fill="FAFBFC"/>
+            <w:tcMar>
+              <w:top w:w="80" w:type="dxa"/>
+              <w:start w:w="120" w:type="dxa"/>
+              <w:bottom w:w="80" w:type="dxa"/>
+              <w:end w:w="120" w:type="dxa"/>
+            </w:tcMar>
+            <w:vAlign w:val="center"/>
+          </w:tcPr>
+          <w:p>
+            <w:pPr>
+              <w:spacing w:before="0" w:after="0" w:line="240" w:lineRule="auto"/>
+              <w:jc w:val="left"/>
+            </w:pPr>
+            <w:r>
+              <w:rPr>
+                <w:rFonts w:ascii="맑은 고딕" w:hAnsi="맑은 고딕" w:eastAsia="맑은 고딕" w:cs="맑은 고딕"/>
+                <w:sz w:val="16"/>
+              </w:rPr>
+              <w:t>VIEWER_ROLLBACK_TRANSACTION_CONSUME_FAILED</w:t>
+            </w:r>
+          </w:p>
+        </w:tc>
+        <w:tc>
+          <w:tcPr>
+            <w:tcW w:type="dxa" w:w="5060"/>
+            <w:shd w:fill="FAFBFC"/>
+            <w:tcMar>
+              <w:top w:w="80" w:type="dxa"/>
+              <w:start w:w="120" w:type="dxa"/>
+              <w:bottom w:w="80" w:type="dxa"/>
+              <w:end w:w="120" w:type="dxa"/>
+            </w:tcMar>
+            <w:vAlign w:val="center"/>
+          </w:tcPr>
+          <w:p>
+            <w:pPr>
+              <w:spacing w:before="0" w:after="0" w:line="240" w:lineRule="auto"/>
+              <w:jc w:val="left"/>
+            </w:pPr>
+            <w:r>
+              <w:rPr>
+                <w:rFonts w:ascii="맑은 고딕" w:hAnsi="맑은 고딕" w:eastAsia="맑은 고딕" w:cs="맑은 고딕"/>
+                <w:sz w:val="16"/>
+              </w:rPr>
+              <w:t>복원 뒤 marker 제거 실패 → 복원된 Viewer 보존 → 관리자 재설치</w:t>
+            </w:r>
+          </w:p>
+        </w:tc>
+      </w:tr>
+      <w:tr>
+        <w:tc>
+          <w:tcPr>
+            <w:tcW w:type="dxa" w:w="4300"/>
+            <w:tcMar>
+              <w:top w:w="80" w:type="dxa"/>
+              <w:start w:w="120" w:type="dxa"/>
+              <w:bottom w:w="80" w:type="dxa"/>
+              <w:end w:w="120" w:type="dxa"/>
+            </w:tcMar>
+            <w:vAlign w:val="center"/>
+          </w:tcPr>
+          <w:p>
+            <w:pPr>
+              <w:spacing w:before="0" w:after="0" w:line="240" w:lineRule="auto"/>
+              <w:jc w:val="left"/>
+            </w:pPr>
+            <w:r>
+              <w:rPr>
+                <w:rFonts w:ascii="맑은 고딕" w:hAnsi="맑은 고딕" w:eastAsia="맑은 고딕" w:cs="맑은 고딕"/>
+                <w:sz w:val="16"/>
+              </w:rPr>
+              <w:t>VIEWER_ROLLBACK_TRANSACTION_WRITE_FAILED</w:t>
+            </w:r>
+          </w:p>
+        </w:tc>
+        <w:tc>
+          <w:tcPr>
+            <w:tcW w:type="dxa" w:w="5060"/>
+            <w:tcMar>
+              <w:top w:w="80" w:type="dxa"/>
+              <w:start w:w="120" w:type="dxa"/>
+              <w:bottom w:w="80" w:type="dxa"/>
+              <w:end w:w="120" w:type="dxa"/>
+            </w:tcMar>
+            <w:vAlign w:val="center"/>
+          </w:tcPr>
+          <w:p>
+            <w:pPr>
+              <w:spacing w:before="0" w:after="0" w:line="240" w:lineRule="auto"/>
+              <w:jc w:val="left"/>
+            </w:pPr>
+            <w:r>
+              <w:rPr>
+                <w:rFonts w:ascii="맑은 고딕" w:hAnsi="맑은 고딕" w:eastAsia="맑은 고딕" w:cs="맑은 고딕"/>
+                <w:sz w:val="16"/>
+              </w:rPr>
+              <w:t>새 marker 확정 실패 → Recovery 결과 → 설치·slot·marker 증거 보존</w:t>
+            </w:r>
+          </w:p>
+        </w:tc>
+      </w:tr>
+      <w:tr>
+        <w:tc>
+          <w:tcPr>
+            <w:tcW w:type="dxa" w:w="4300"/>
+            <w:shd w:fill="FAFBFC"/>
+            <w:tcMar>
+              <w:top w:w="80" w:type="dxa"/>
+              <w:start w:w="120" w:type="dxa"/>
+              <w:bottom w:w="80" w:type="dxa"/>
+              <w:end w:w="120" w:type="dxa"/>
+            </w:tcMar>
+            <w:vAlign w:val="center"/>
+          </w:tcPr>
+          <w:p>
+            <w:pPr>
+              <w:spacing w:before="0" w:after="0" w:line="240" w:lineRule="auto"/>
+              <w:jc w:val="left"/>
+            </w:pPr>
+            <w:r>
+              <w:rPr>
+                <w:rFonts w:ascii="맑은 고딕" w:hAnsi="맑은 고딕" w:eastAsia="맑은 고딕" w:cs="맑은 고딕"/>
+                <w:sz w:val="16"/>
+              </w:rPr>
               <w:t>VIEWER_MACHINE_ROLLBACK_INCOMPLETE</w:t>
             </w:r>
           </w:p>
@@ -5919,6 +6290,7 @@
         <w:tc>
           <w:tcPr>
             <w:tcW w:type="dxa" w:w="5060"/>
+            <w:shd w:fill="FAFBFC"/>
             <w:tcMar>
               <w:top w:w="80" w:type="dxa"/>
               <w:start w:w="120" w:type="dxa"/>
@@ -5946,7 +6318,6 @@
         <w:tc>
           <w:tcPr>
             <w:tcW w:type="dxa" w:w="4300"/>
-            <w:shd w:fill="FAFBFC"/>
             <w:tcMar>
               <w:top w:w="80" w:type="dxa"/>
               <w:start w:w="120" w:type="dxa"/>
@@ -5972,7 +6343,6 @@
         <w:tc>
           <w:tcPr>
             <w:tcW w:type="dxa" w:w="5060"/>
-            <w:shd w:fill="FAFBFC"/>
             <w:tcMar>
               <w:top w:w="80" w:type="dxa"/>
               <w:start w:w="120" w:type="dxa"/>
@@ -6000,6 +6370,7 @@
         <w:tc>
           <w:tcPr>
             <w:tcW w:type="dxa" w:w="4300"/>
+            <w:shd w:fill="FAFBFC"/>
             <w:tcMar>
               <w:top w:w="80" w:type="dxa"/>
               <w:start w:w="120" w:type="dxa"/>
@@ -6025,6 +6396,7 @@
         <w:tc>
           <w:tcPr>
             <w:tcW w:type="dxa" w:w="5060"/>
+            <w:shd w:fill="FAFBFC"/>
             <w:tcMar>
               <w:top w:w="80" w:type="dxa"/>
               <w:start w:w="120" w:type="dxa"/>
@@ -6052,7 +6424,6 @@
         <w:tc>
           <w:tcPr>
             <w:tcW w:type="dxa" w:w="4300"/>
-            <w:shd w:fill="FAFBFC"/>
             <w:tcMar>
               <w:top w:w="80" w:type="dxa"/>
               <w:start w:w="120" w:type="dxa"/>
@@ -6078,7 +6449,6 @@
         <w:tc>
           <w:tcPr>
             <w:tcW w:type="dxa" w:w="5060"/>
-            <w:shd w:fill="FAFBFC"/>
             <w:tcMar>
               <w:top w:w="80" w:type="dxa"/>
               <w:start w:w="120" w:type="dxa"/>
@@ -6106,6 +6476,7 @@
         <w:tc>
           <w:tcPr>
             <w:tcW w:type="dxa" w:w="4300"/>
+            <w:shd w:fill="FAFBFC"/>
             <w:tcMar>
               <w:top w:w="80" w:type="dxa"/>
               <w:start w:w="120" w:type="dxa"/>
@@ -6131,6 +6502,7 @@
         <w:tc>
           <w:tcPr>
             <w:tcW w:type="dxa" w:w="5060"/>
+            <w:shd w:fill="FAFBFC"/>
             <w:tcMar>
               <w:top w:w="80" w:type="dxa"/>
               <w:start w:w="120" w:type="dxa"/>
@@ -6158,7 +6530,6 @@
         <w:tc>
           <w:tcPr>
             <w:tcW w:type="dxa" w:w="4300"/>
-            <w:shd w:fill="FAFBFC"/>
             <w:tcMar>
               <w:top w:w="80" w:type="dxa"/>
               <w:start w:w="120" w:type="dxa"/>
@@ -6184,7 +6555,6 @@
         <w:tc>
           <w:tcPr>
             <w:tcW w:type="dxa" w:w="5060"/>
-            <w:shd w:fill="FAFBFC"/>
             <w:tcMar>
               <w:top w:w="80" w:type="dxa"/>
               <w:start w:w="120" w:type="dxa"/>
@@ -6212,6 +6582,7 @@
         <w:tc>
           <w:tcPr>
             <w:tcW w:type="dxa" w:w="4300"/>
+            <w:shd w:fill="FAFBFC"/>
             <w:tcMar>
               <w:top w:w="80" w:type="dxa"/>
               <w:start w:w="120" w:type="dxa"/>
@@ -6237,6 +6608,7 @@
         <w:tc>
           <w:tcPr>
             <w:tcW w:type="dxa" w:w="5060"/>
+            <w:shd w:fill="FAFBFC"/>
             <w:tcMar>
               <w:top w:w="80" w:type="dxa"/>
               <w:start w:w="120" w:type="dxa"/>
@@ -6264,7 +6636,6 @@
         <w:tc>
           <w:tcPr>
             <w:tcW w:type="dxa" w:w="4300"/>
-            <w:shd w:fill="FAFBFC"/>
             <w:tcMar>
               <w:top w:w="80" w:type="dxa"/>
               <w:start w:w="120" w:type="dxa"/>
@@ -6290,7 +6661,6 @@
         <w:tc>
           <w:tcPr>
             <w:tcW w:type="dxa" w:w="5060"/>
-            <w:shd w:fill="FAFBFC"/>
             <w:tcMar>
               <w:top w:w="80" w:type="dxa"/>
               <w:start w:w="120" w:type="dxa"/>
@@ -6318,6 +6688,7 @@
         <w:tc>
           <w:tcPr>
             <w:tcW w:type="dxa" w:w="4300"/>
+            <w:shd w:fill="FAFBFC"/>
             <w:tcMar>
               <w:top w:w="80" w:type="dxa"/>
               <w:start w:w="120" w:type="dxa"/>
@@ -6343,6 +6714,7 @@
         <w:tc>
           <w:tcPr>
             <w:tcW w:type="dxa" w:w="5060"/>
+            <w:shd w:fill="FAFBFC"/>
             <w:tcMar>
               <w:top w:w="80" w:type="dxa"/>
               <w:start w:w="120" w:type="dxa"/>
@@ -6370,7 +6742,6 @@
         <w:tc>
           <w:tcPr>
             <w:tcW w:type="dxa" w:w="4300"/>
-            <w:shd w:fill="FAFBFC"/>
             <w:tcMar>
               <w:top w:w="80" w:type="dxa"/>
               <w:start w:w="120" w:type="dxa"/>
@@ -6396,7 +6767,6 @@
         <w:tc>
           <w:tcPr>
             <w:tcW w:type="dxa" w:w="5060"/>
-            <w:shd w:fill="FAFBFC"/>
             <w:tcMar>
               <w:top w:w="80" w:type="dxa"/>
               <w:start w:w="120" w:type="dxa"/>
@@ -6424,6 +6794,7 @@
         <w:tc>
           <w:tcPr>
             <w:tcW w:type="dxa" w:w="4300"/>
+            <w:shd w:fill="FAFBFC"/>
             <w:tcMar>
               <w:top w:w="80" w:type="dxa"/>
               <w:start w:w="120" w:type="dxa"/>
@@ -6449,6 +6820,7 @@
         <w:tc>
           <w:tcPr>
             <w:tcW w:type="dxa" w:w="5060"/>
+            <w:shd w:fill="FAFBFC"/>
             <w:tcMar>
               <w:top w:w="80" w:type="dxa"/>
               <w:start w:w="120" w:type="dxa"/>
@@ -6476,7 +6848,6 @@
         <w:tc>
           <w:tcPr>
             <w:tcW w:type="dxa" w:w="4300"/>
-            <w:shd w:fill="FAFBFC"/>
             <w:tcMar>
               <w:top w:w="80" w:type="dxa"/>
               <w:start w:w="120" w:type="dxa"/>
@@ -6502,7 +6873,6 @@
         <w:tc>
           <w:tcPr>
             <w:tcW w:type="dxa" w:w="5060"/>
-            <w:shd w:fill="FAFBFC"/>
             <w:tcMar>
               <w:top w:w="80" w:type="dxa"/>
               <w:start w:w="120" w:type="dxa"/>
@@ -6530,6 +6900,7 @@
         <w:tc>
           <w:tcPr>
             <w:tcW w:type="dxa" w:w="4300"/>
+            <w:shd w:fill="FAFBFC"/>
             <w:tcMar>
               <w:top w:w="80" w:type="dxa"/>
               <w:start w:w="120" w:type="dxa"/>
@@ -6555,6 +6926,7 @@
         <w:tc>
           <w:tcPr>
             <w:tcW w:type="dxa" w:w="5060"/>
+            <w:shd w:fill="FAFBFC"/>
             <w:tcMar>
               <w:top w:w="80" w:type="dxa"/>
               <w:start w:w="120" w:type="dxa"/>
@@ -6582,7 +6954,6 @@
         <w:tc>
           <w:tcPr>
             <w:tcW w:type="dxa" w:w="4300"/>
-            <w:shd w:fill="FAFBFC"/>
             <w:tcMar>
               <w:top w:w="80" w:type="dxa"/>
               <w:start w:w="120" w:type="dxa"/>
@@ -6608,7 +6979,6 @@
         <w:tc>
           <w:tcPr>
             <w:tcW w:type="dxa" w:w="5060"/>
-            <w:shd w:fill="FAFBFC"/>
             <w:tcMar>
               <w:top w:w="80" w:type="dxa"/>
               <w:start w:w="120" w:type="dxa"/>
@@ -6636,6 +7006,7 @@
         <w:tc>
           <w:tcPr>
             <w:tcW w:type="dxa" w:w="4300"/>
+            <w:shd w:fill="FAFBFC"/>
             <w:tcMar>
               <w:top w:w="80" w:type="dxa"/>
               <w:start w:w="120" w:type="dxa"/>
@@ -6661,6 +7032,7 @@
         <w:tc>
           <w:tcPr>
             <w:tcW w:type="dxa" w:w="5060"/>
+            <w:shd w:fill="FAFBFC"/>
             <w:tcMar>
               <w:top w:w="80" w:type="dxa"/>
               <w:start w:w="120" w:type="dxa"/>
@@ -6688,7 +7060,6 @@
         <w:tc>
           <w:tcPr>
             <w:tcW w:type="dxa" w:w="4300"/>
-            <w:shd w:fill="FAFBFC"/>
             <w:tcMar>
               <w:top w:w="80" w:type="dxa"/>
               <w:start w:w="120" w:type="dxa"/>
@@ -6714,6 +7085,33 @@
         <w:tc>
           <w:tcPr>
             <w:tcW w:type="dxa" w:w="5060"/>
+            <w:tcMar>
+              <w:top w:w="80" w:type="dxa"/>
+              <w:start w:w="120" w:type="dxa"/>
+              <w:bottom w:w="80" w:type="dxa"/>
+              <w:end w:w="120" w:type="dxa"/>
+            </w:tcMar>
+            <w:vAlign w:val="center"/>
+          </w:tcPr>
+          <w:p>
+            <w:pPr>
+              <w:spacing w:before="0" w:after="0" w:line="240" w:lineRule="auto"/>
+              <w:jc w:val="left"/>
+            </w:pPr>
+            <w:r>
+              <w:rPr>
+                <w:rFonts w:ascii="맑은 고딕" w:hAnsi="맑은 고딕" w:eastAsia="맑은 고딕" w:cs="맑은 고딕"/>
+                <w:sz w:val="16"/>
+              </w:rPr>
+              <w:t>Viewer 프로세스·활성 프로그램 폴더 정리 → 관리자 제거 재실행</w:t>
+            </w:r>
+          </w:p>
+        </w:tc>
+      </w:tr>
+      <w:tr>
+        <w:tc>
+          <w:tcPr>
+            <w:tcW w:type="dxa" w:w="4300"/>
             <w:shd w:fill="FAFBFC"/>
             <w:tcMar>
               <w:top w:w="80" w:type="dxa"/>
@@ -6733,7 +7131,33 @@
                 <w:rFonts w:ascii="맑은 고딕" w:hAnsi="맑은 고딕" w:eastAsia="맑은 고딕" w:cs="맑은 고딕"/>
                 <w:sz w:val="16"/>
               </w:rPr>
-              <w:t>Viewer 프로세스·활성 프로그램 폴더 정리 → 관리자 제거 재실행</w:t>
+              <w:t>VIEWER_UNINSTALL_TRANSACTION_PRESERVED</w:t>
+            </w:r>
+          </w:p>
+        </w:tc>
+        <w:tc>
+          <w:tcPr>
+            <w:tcW w:type="dxa" w:w="5060"/>
+            <w:shd w:fill="FAFBFC"/>
+            <w:tcMar>
+              <w:top w:w="80" w:type="dxa"/>
+              <w:start w:w="120" w:type="dxa"/>
+              <w:bottom w:w="80" w:type="dxa"/>
+              <w:end w:w="120" w:type="dxa"/>
+            </w:tcMar>
+            <w:vAlign w:val="center"/>
+          </w:tcPr>
+          <w:p>
+            <w:pPr>
+              <w:spacing w:before="0" w:after="0" w:line="240" w:lineRule="auto"/>
+              <w:jc w:val="left"/>
+            </w:pPr>
+            <w:r>
+              <w:rPr>
+                <w:rFonts w:ascii="맑은 고딕" w:hAnsi="맑은 고딕" w:eastAsia="맑은 고딕" w:cs="맑은 고딕"/>
+                <w:sz w:val="16"/>
+              </w:rPr>
+              <w:t>활성 프로그램·rollback slot 제거 미확인 → marker 보존 → 관리자 제거 재실행</w:t>
             </w:r>
           </w:p>
         </w:tc>
@@ -8422,7 +8846,7 @@
         <w:color w:val="64748B"/>
         <w:sz w:val="17"/>
       </w:rPr>
-      <w:t xml:space="preserve">v0.9.22-poc  |  </w:t>
+      <w:t xml:space="preserve">v0.9.23-poc  |  </w:t>
     </w:r>
     <w:r>
       <w:rPr>
@@ -8453,7 +8877,7 @@
         <w:color w:val="64748B"/>
         <w:sz w:val="17"/>
       </w:rPr>
-      <w:t>v0.9.22-poc  |  2026-07-28</w:t>
+      <w:t>v0.9.23-poc  |  2026-07-28</w:t>
     </w:r>
   </w:p>
 </w:ftr>

</xml_diff>

<commit_message>
Native Agent Setup and portable Viewer v0.10
</commit_message>
<xml_diff>
--- a/docs/SamsungSwitchWatch_User_Manual_KO.docx
+++ b/docs/SamsungSwitchWatch_User_Manual_KO.docx
@@ -519,7 +519,7 @@
         <w:rPr>
           <w:rFonts w:ascii="맑은 고딕" w:hAnsi="맑은 고딕" w:eastAsia="맑은 고딕" w:cs="맑은 고딕"/>
         </w:rPr>
-        <w:t>원격 PC에서 Agent ZIP을 풀고 Install-or-Update-Agent.cmd를 실행합니다.</w:t>
+        <w:t>원격 PC에서 Agent ZIP을 풀고 SamsungSwitchWatch.Agent.Setup.exe를 실행한 뒤 UAC를 승인합니다.</w:t>
       </w:r>
     </w:p>
     <w:p>
@@ -533,7 +533,21 @@
         <w:rPr>
           <w:rFonts w:ascii="맑은 고딕" w:hAnsi="맑은 고딕" w:eastAsia="맑은 고딕" w:cs="맑은 고딕"/>
         </w:rPr>
-        <w:t>Viewer PC에서 Viewer ZIP을 풀고 Install-or-Update-Viewer.cmd를 실행한 뒤 UAC를 승인합니다.</w:t>
+        <w:t>고정 Viewer IPv4를 입력하고 자동 검색된 스위치 관리망 1~2개를 선택해 Agent 서비스를 설치합니다.</w:t>
+      </w:r>
+    </w:p>
+    <w:p>
+      <w:pPr>
+        <w:numPr>
+          <w:ilvl w:val="0"/>
+          <w:numId w:val="12"/>
+        </w:numPr>
+      </w:pPr>
+      <w:r>
+        <w:rPr>
+          <w:rFonts w:ascii="맑은 고딕" w:hAnsi="맑은 고딕" w:eastAsia="맑은 고딕" w:cs="맑은 고딕"/>
+        </w:rPr>
+        <w:t>Viewer PC에서 Viewer ZIP을 풀고 SamsungSwitchWatch.Viewer.exe를 직접 실행합니다.</w:t>
       </w:r>
     </w:p>
     <w:p>
@@ -952,7 +966,7 @@
                 <w:rFonts w:ascii="맑은 고딕" w:hAnsi="맑은 고딕" w:eastAsia="맑은 고딕" w:cs="맑은 고딕"/>
                 <w:sz w:val="18"/>
               </w:rPr>
-              <w:t>설치 시 지정한 스위치 관리 IPv4만 기본 허용</w:t>
+              <w:t>설치 시 선택한 관리망만 허용</w:t>
             </w:r>
           </w:p>
         </w:tc>
@@ -1024,7 +1038,7 @@
           <w:rFonts w:ascii="맑은 고딕" w:hAnsi="맑은 고딕" w:eastAsia="맑은 고딕" w:cs="맑은 고딕"/>
           <w:sz w:val="22"/>
         </w:rPr>
-        <w:t>Viewer 프로그램은 Program Files에 설치되지만 일반 사용자 권한으로 실행하며, 현재 Windows 사용자 범위에서만 계정을 복호화합니다.</w:t>
+        <w:t>Viewer는 압축 해제한 폴더에서 포터블로 실행하며, 현재 Windows 사용자 범위에서만 계정을 복호화합니다.</w:t>
       </w:r>
     </w:p>
     <w:p>
@@ -1095,6 +1109,34 @@
     </w:p>
     <w:p>
       <w:pPr>
+        <w:keepLines/>
+        <w:spacing w:before="80" w:after="160" w:line="283" w:lineRule="auto"/>
+        <w:ind w:left="115" w:right="58"/>
+        <w:shd w:fill="FEF2F2"/>
+        <w:pBdr>
+          <w:left w:val="single" w:sz="16" w:space="8" w:color="B42318"/>
+        </w:pBdr>
+      </w:pPr>
+      <w:r>
+        <w:rPr>
+          <w:rFonts w:ascii="맑은 고딕" w:hAnsi="맑은 고딕" w:eastAsia="맑은 고딕" w:cs="맑은 고딕"/>
+          <w:b/>
+          <w:color w:val="B42318"/>
+          <w:sz w:val="21"/>
+        </w:rPr>
+        <w:t xml:space="preserve">반입 파일 확인  </w:t>
+      </w:r>
+      <w:r>
+        <w:rPr>
+          <w:rFonts w:ascii="맑은 고딕" w:hAnsi="맑은 고딕" w:eastAsia="맑은 고딕" w:cs="맑은 고딕"/>
+          <w:color w:val="16324F"/>
+          <w:sz w:val="21"/>
+        </w:rPr>
+        <w:t>0.10.0-poc는 코드 서명되지 않은 시험판입니다. 압축을 풀기 전에 Agent와 Viewer ZIP의 SHA-256을 해당 GitHub Release 본문에 표시된 값과 비교하고 사내 보안 반입 절차를 완료하세요. SmartScreen 또는 EDR 경고를 우회하지 않습니다.</w:t>
+      </w:r>
+    </w:p>
+    <w:p>
+      <w:pPr>
         <w:numPr>
           <w:ilvl w:val="0"/>
           <w:numId w:val="13"/>
@@ -1118,7 +1160,7 @@
         <w:rPr>
           <w:rFonts w:ascii="맑은 고딕" w:hAnsi="맑은 고딕" w:eastAsia="맑은 고딕" w:cs="맑은 고딕"/>
         </w:rPr>
-        <w:t>Install-or-Update-Agent.cmd를 더블클릭하고 UAC 관리자 승인을 합니다.</w:t>
+        <w:t>SamsungSwitchWatch.Agent.Setup.exe를 실행하고 UAC 관리자 승인을 합니다.</w:t>
       </w:r>
     </w:p>
     <w:p>
@@ -1132,7 +1174,7 @@
         <w:rPr>
           <w:rFonts w:ascii="맑은 고딕" w:hAnsi="맑은 고딕" w:eastAsia="맑은 고딕" w:cs="맑은 고딕"/>
         </w:rPr>
-        <w:t>신규 설치에서는 Viewer PC IPv4와 스위치 관리 IPv4를 입력합니다. CIDR 계산은 필요하지 않습니다.</w:t>
+        <w:t>고정 Viewer PC IPv4를 입력하고 자동 검색된 직접 연결 사설 관리망 1~2개를 선택합니다.</w:t>
       </w:r>
     </w:p>
     <w:p>
@@ -1146,7 +1188,56 @@
         <w:rPr>
           <w:rFonts w:ascii="맑은 고딕" w:hAnsi="맑은 고딕" w:eastAsia="맑은 고딕" w:cs="맑은 고딕"/>
         </w:rPr>
-        <w:t>SamsungSwitchWatchAgent 서비스가 실행 중인지 확인합니다.</w:t>
+        <w:t>검사를 실행한 뒤 설치/업데이트를 누르고 SamsungSwitchWatchAgent 서비스가 실행 중인지 확인합니다.</w:t>
+      </w:r>
+    </w:p>
+    <w:p>
+      <w:pPr>
+        <w:keepNext/>
+        <w:spacing w:before="80" w:after="0"/>
+        <w:jc w:val="center"/>
+      </w:pPr>
+      <w:r>
+        <w:drawing>
+          <wp:inline xmlns:a="http://schemas.openxmlformats.org/drawingml/2006/main" xmlns:pic="http://schemas.openxmlformats.org/drawingml/2006/picture">
+            <wp:extent cx="4114800" cy="3789947"/>
+            <wp:docPr id="1" name="Picture 1" title="Agent Setup 화면" descr="고정 Viewer IPv4와 자동 검색된 직접 연결 관리망을 선택하는 Agent Setup 화면"/>
+            <wp:cNvGraphicFramePr>
+              <a:graphicFrameLocks noChangeAspect="1"/>
+            </wp:cNvGraphicFramePr>
+            <a:graphic>
+              <a:graphicData uri="http://schemas.openxmlformats.org/drawingml/2006/picture">
+                <pic:pic>
+                  <pic:nvPicPr>
+                    <pic:cNvPr id="0" name="00-agent-setup.png"/>
+                    <pic:cNvPicPr/>
+                  </pic:nvPicPr>
+                  <pic:blipFill>
+                    <a:blip r:embed="rId13"/>
+                    <a:stretch>
+                      <a:fillRect/>
+                    </a:stretch>
+                  </pic:blipFill>
+                  <pic:spPr>
+                    <a:xfrm>
+                      <a:off x="0" y="0"/>
+                      <a:ext cx="4114800" cy="3789947"/>
+                    </a:xfrm>
+                    <a:prstGeom prst="rect"/>
+                  </pic:spPr>
+                </pic:pic>
+              </a:graphicData>
+            </a:graphic>
+          </wp:inline>
+        </w:drawing>
+      </w:r>
+    </w:p>
+    <w:p>
+      <w:pPr>
+        <w:pStyle w:val="Caption"/>
+      </w:pPr>
+      <w:r>
+        <w:t>그림 1. Agent 서비스 설치와 네트워크 범위 선택</w:t>
       </w:r>
     </w:p>
     <w:p>
@@ -1164,7 +1255,7 @@
           <w:color w:val="243447"/>
           <w:sz w:val="17"/>
         </w:rPr>
-        <w:t>Viewer PC IPv4 예     : 192.0.2.25</w:t>
+        <w:t>Viewer PC IPv4 예     : 10.20.30.25</w:t>
       </w:r>
       <w:r>
         <w:br/>
@@ -1175,7 +1266,7 @@
           <w:color w:val="243447"/>
           <w:sz w:val="17"/>
         </w:rPr>
-        <w:t>스위치 관리 IPv4 예  : 198.51.100.11,198.51.100.12</w:t>
+        <w:t>선택 관리망 예       : 10.50.0.0/24</w:t>
       </w:r>
       <w:r>
         <w:br/>
@@ -1239,7 +1330,7 @@
           <w:color w:val="B42318"/>
           <w:sz w:val="21"/>
         </w:rPr>
-        <w:t xml:space="preserve">기존 폴더 신뢰 검사  </w:t>
+        <w:t xml:space="preserve">고정 설치 위치  </w:t>
       </w:r>
       <w:r>
         <w:rPr>
@@ -1247,12 +1338,7 @@
           <w:color w:val="16324F"/>
           <w:sz w:val="21"/>
         </w:rPr>
-        <w:t>설치·업데이트·제거는 install/data 폴더의 owner SID와 junction·symlink를 먼저 검사합니다. DataDirectory는 정확히 %ProgramData%\SamsungSwitchWatch만 허용하며, 신규 설치에서는 빈 선점 폴더도 채택하지 않습니다. AGENT_DIRECTORY_TRUST_INVALID가 표시되면 삭제나 강제 소유권 변경으로 우회하지 말고 Windows 관리자에게 확인을 요청하세요.</w:t>
-      </w:r>
-    </w:p>
-    <w:p>
-      <w:r>
-        <w:br w:type="page"/>
+        <w:t>Agent 프로그램은 %ProgramFiles%\SamsungSwitchWatch\Agent, HTTPS 신원과 데이터는 %ProgramData%\SamsungSwitchWatch에 둡니다. Setup이 경로 신뢰 검사를 통과하지 못하면 설치를 중단합니다. 폴더를 강제로 삭제하거나 소유권을 바꿔 우회하지 말고 Windows 관리자에게 실패 코드를 전달하세요.</w:t>
       </w:r>
     </w:p>
     <w:p>
@@ -1280,7 +1366,7 @@
           <w:color w:val="16324F"/>
           <w:sz w:val="21"/>
         </w:rPr>
-        <w:t>패키지는 SYSTEM·Administrators 전용 staging으로 복사한 뒤 SHA-256을 다시 확인합니다. install receipt는 관리자 전용 설치 증거이고, 허용 정책은 검증된 설정과 제품 소유 방화벽에서 가져옵니다. rollback 선행 단계가 실패하면 후속 파일 변경을 멈추고 snapshot·archive·journal을 보존합니다.</w:t>
+        <w:t>Setup은 BUILD-MANIFEST.json과 Agent 실행 파일 SHA-256을 확인하고, Program Files의 임시 staging에 복사한 파일을 다시 검사한 뒤 교체합니다. 서비스·프로그램·방화벽 변경 중 실패하면 설치 전 상태로 자동 복구하고, 완전히 복구하지 못하면 SETUP_ROLLBACK_FAILED를 표시합니다.</w:t>
       </w:r>
     </w:p>
     <w:p>
@@ -1300,7 +1386,7 @@
           <w:color w:val="2E74B5"/>
           <w:sz w:val="21"/>
         </w:rPr>
-        <w:t xml:space="preserve">허용 IP 변경  </w:t>
+        <w:t xml:space="preserve">네트워크 정책 변경  </w:t>
       </w:r>
       <w:r>
         <w:rPr>
@@ -1308,7 +1394,7 @@
           <w:color w:val="16324F"/>
           <w:sz w:val="21"/>
         </w:rPr>
-        <w:t>Viewer PC 또는 스위치 주소가 바뀌면 현재 Agent와 같은 버전 ZIP의 Configure-Agent-Allowed-IPs.cmd를 실행합니다. 일반 IPv4만 입력하며 내부에서 정확한 /32 정책으로 변환합니다. DHCP 또는 32대를 넘는 장비는 INSTALL_KO.md의 고급 CIDR 절차를 사용하세요. 기존 값과 같아도 서비스, TCP/18443 listener, 방화벽, 활성 프로필과 live/ready를 확인해 정상일 때만 변경 없음으로 끝납니다.</w:t>
+        <w:t>Viewer PC 주소나 스위치 관리망이 바뀌면 같은 Release의 Agent Setup을 다시 열어 고정 Viewer IPv4와 자동 검색된 관리망을 검토합니다. 사용자가 CIDR을 계산하거나 사설망 전체를 직접 허용하지 않습니다. 검사에서 서비스, TCP/18443 listener, 방화벽, 활성 프로필과 live/ready를 확인합니다.</w:t>
       </w:r>
     </w:p>
     <w:p>
@@ -1336,7 +1422,7 @@
           <w:color w:val="16324F"/>
           <w:sz w:val="21"/>
         </w:rPr>
-        <w:t>관리자 설치 창에 Agent installation failed가 표시되면 Cause 줄을 먼저 확인하세요. 설치 성공 뒤 AGENT_CONNECTION_REFUSED가 보이면 Viewer에 스위치 IP, Viewer PC 주소 또는 localhost가 아니라 Agent를 설치한 PC 주소를 입력했는지 먼저 확인하세요. 그 다음 SamsungSwitchWatchAgent 서비스와 TCP/18443을 점검합니다. 서비스를 수동 등록하지 말고 0.9.23-poc Agent 설치기를 사용하세요.</w:t>
+        <w:t>Agent Setup에 설치 실패가 표시되면 실패 단계와 Cause를 먼저 확인하세요. 설치 성공 뒤 AGENT_CONNECTION_REFUSED가 보이면 Viewer에 스위치 IP, Viewer PC 주소 또는 localhost가 아니라 Agent를 설치한 PC 주소를 입력했는지 먼저 확인하세요. 그 다음 Agent Setup의 검사에서 SamsungSwitchWatchAgent 서비스와 TCP/18443을 점검합니다. 서비스를 수동 등록하지 말고 0.10.0-poc Agent Setup을 사용하세요.</w:t>
       </w:r>
     </w:p>
     <w:p>
@@ -1355,7 +1441,35 @@
           <w:color w:val="2E74B5"/>
           <w:sz w:val="26"/>
         </w:rPr>
-        <w:t>Viewer 설치</w:t>
+        <w:t>Viewer 실행</w:t>
+      </w:r>
+    </w:p>
+    <w:p>
+      <w:pPr>
+        <w:keepLines/>
+        <w:spacing w:before="80" w:after="160" w:line="283" w:lineRule="auto"/>
+        <w:ind w:left="115" w:right="58"/>
+        <w:shd w:fill="FFF8E8"/>
+        <w:pBdr>
+          <w:left w:val="single" w:sz="16" w:space="8" w:color="8A5A00"/>
+        </w:pBdr>
+      </w:pPr>
+      <w:r>
+        <w:rPr>
+          <w:rFonts w:ascii="맑은 고딕" w:hAnsi="맑은 고딕" w:eastAsia="맑은 고딕" w:cs="맑은 고딕"/>
+          <w:b/>
+          <w:color w:val="8A5A00"/>
+          <w:sz w:val="21"/>
+        </w:rPr>
+        <w:t xml:space="preserve">0.9 설치형 Viewer에서 전환  </w:t>
+      </w:r>
+      <w:r>
+        <w:rPr>
+          <w:rFonts w:ascii="맑은 고딕" w:hAnsi="맑은 고딕" w:eastAsia="맑은 고딕" w:cs="맑은 고딕"/>
+          <w:color w:val="16324F"/>
+          <w:sz w:val="21"/>
+        </w:rPr>
+        <w:t>이전 Viewer가 실행 중이면 새 Viewer는 같은 사용자 데이터를 동시에 쓰지 않도록 실행을 차단하고 전환 순서를 표시합니다. 기존 트레이 아이콘에서 '프로그램 종료'를 선택한 뒤 Win+R에서 shell:startup을 열어 'Samsung Switch Watch' 바로 가기를 삭제합니다. 이어 shell:programs에서도 같은 이름의 이전 시작 메뉴 바로 가기를 삭제하고 새 Viewer를 다시 실행하세요. 기존 Agent 연결과 장비 정보는 유지됩니다. 창이 바로 보이지 않으면 알림 영역에서 대시보드를 열고 실행 경로가 새 v0.10 폴더인지 확인하세요.</w:t>
       </w:r>
     </w:p>
     <w:p>
@@ -1369,7 +1483,7 @@
         <w:rPr>
           <w:rFonts w:ascii="맑은 고딕" w:hAnsi="맑은 고딕" w:eastAsia="맑은 고딕" w:cs="맑은 고딕"/>
         </w:rPr>
-        <w:t>Viewer 릴리스 ZIP을 운영자 PC의 임시 폴더에 압축 해제합니다.</w:t>
+        <w:t>Viewer 릴리스 ZIP을 운영자 PC에서 계속 사용할 로컬 폴더에 압축 해제합니다.</w:t>
       </w:r>
     </w:p>
     <w:p>
@@ -1383,7 +1497,7 @@
         <w:rPr>
           <w:rFonts w:ascii="맑은 고딕" w:hAnsi="맑은 고딕" w:eastAsia="맑은 고딕" w:cs="맑은 고딕"/>
         </w:rPr>
-        <w:t>Install-or-Update-Viewer.cmd를 더블클릭하고 Program Files 설치를 위한 UAC를 승인합니다.</w:t>
+        <w:t>SamsungSwitchWatch.Viewer.exe를 더블클릭합니다.</w:t>
       </w:r>
     </w:p>
     <w:p>
@@ -1397,7 +1511,7 @@
         <w:rPr>
           <w:rFonts w:ascii="맑은 고딕" w:hAnsi="맑은 고딕" w:eastAsia="맑은 고딕" w:cs="맑은 고딕"/>
         </w:rPr>
-        <w:t>설치 완료 뒤 Viewer가 일반 사용자 권한으로 실행되고 다음 Windows 로그인부터 자동 시작되는지 확인합니다.</w:t>
+        <w:t>Viewer는 일반 사용자 권한으로 실행하며 설치, UAC와 Windows 로그인 자동 시작을 수행하지 않습니다.</w:t>
       </w:r>
     </w:p>
     <w:p>
@@ -1425,7 +1539,7 @@
           <w:color w:val="16324F"/>
           <w:sz w:val="21"/>
         </w:rPr>
-        <w:t>프로그램은 C:\Program Files\SamsungSwitchWatch\Viewer에 설치합니다. 장비 목록, DPAPI 자격 증명, 감시 이력과 화면 설정은 설치를 시작한 원래 사용자의 %LOCALAPPDATA%\SamsungSwitchWatch에 그대로 보존합니다. 관리자 단계가 성공한 뒤에만 원래 사용자 단계에서 바로 가기와 자동 시작을 반영합니다. 이전 Program Files 버전과 기존 사용자별 프로그램 폴더는 자동 삭제하지 않습니다.</w:t>
+        <w:t>Viewer는 압축 해제한 폴더에서 실행합니다. 장비 목록, DPAPI 자격 증명, 감시 이력과 화면 설정은 %LOCALAPPDATA%\SamsungSwitchWatch에 보존됩니다. Viewer 폴더를 교체해도 자료는 유지되지만 항상 Agent와 같은 Release를 사용하세요.</w:t>
       </w:r>
     </w:p>
     <w:p>
@@ -1445,7 +1559,7 @@
           <w:color w:val="B42318"/>
           <w:sz w:val="21"/>
         </w:rPr>
-        <w:t xml:space="preserve">Viewer 설치가 복구된 경우  </w:t>
+        <w:t xml:space="preserve">Viewer가 실행되지 않는 경우  </w:t>
       </w:r>
       <w:r>
         <w:rPr>
@@ -1453,7 +1567,7 @@
           <w:color w:val="16324F"/>
           <w:sz w:val="21"/>
         </w:rPr>
-        <w:t>설치 창의 Cause, Detail, 선택적 ExitCode, Recovery와 두 진단 경로를 확인하세요. PREVIOUS_VIEWER_RESTORED이면 시작 메뉴에서 Viewer를 다시 실행합니다. ROLLBACK_INCOMPLETE이면 백업과 진단 파일을 보존하고 Windows 관리자에게 전달하세요. Program Files 실행이 차단되면 보안 정책을 우회하거나 파일 차단을 해제하지 말고 해당 코드를 EDR·AppLocker·WDAC 담당자에게 전달하세요. 사용자 단계 실패 뒤에는 이전 Program Files 버전 복구 UAC가 한 번 더 표시될 수 있습니다. 취소하거나 실패하면 Viewer.__rollback을 삭제하지 마세요. 업데이트 직전에는 정상 현재 버전을 새 rollback 기준으로 회전하므로 실패하면 정확히 직전 버전을 복원합니다. 각 관리자 설치는 고유 작업 ID와 활성·rollback manifest SHA-256을 Administrators 전용 marker에 결속하므로, 같은 ZIP을 다시 설치했더라도 앞선 작업의 늦은 복구는 VIEWER_ROLLBACK_ACTIVE_CHANGED로 중단하고 최신 설치·rollback 슬롯·marker를 보존합니다. 기존 Viewer 자체점검만 일시적으로 실패한 경우에도 VIEWER_CURRENT_SELF_CHECK_FAILED로 자동 강등하지 않습니다. 새 설치 파일이나 매니페스트가 EDR에 의해 격리 또는 손상돼도 보호된 현재 설치를 격리한 뒤 검증된 rollback 슬롯을 먼저 복원합니다. 제거 중 Viewer 프로세스나 활성 프로그램 폴더가 남으면 rollback 슬롯을 삭제하지 않습니다. 자세한 코드는 INSTALL_KO.md를 확인하세요.</w:t>
+        <w:t>0.10.0-poc는 코드 서명되지 않아 SmartScreen이나 사내 EDR이 차단할 수 있습니다. ZIP을 완전히 압축 해제하고 Viewer EXE와 제공된 DLL이 같은 폴더에 있는지 확인하세요. EDR·AppLocker·WDAC가 차단하면 우회하지 말고 공식 ZIP의 버전·해시와 차단 기록을 보안 담당자에게 전달하세요.</w:t>
       </w:r>
     </w:p>
     <w:p>
@@ -1473,7 +1587,7 @@
           <w:color w:val="2E74B5"/>
           <w:sz w:val="21"/>
         </w:rPr>
-        <w:t xml:space="preserve">고급 설치  </w:t>
+        <w:t xml:space="preserve">포터블 운영  </w:t>
       </w:r>
       <w:r>
         <w:rPr>
@@ -1481,7 +1595,7 @@
           <w:color w:val="16324F"/>
           <w:sz w:val="21"/>
         </w:rPr>
-        <w:t>설치 전 검사, 설치 위치 또는 자동 시작 상태를 직접 지정할 때만 INSTALL_KO.md의 install-viewer.ps1 옵션을 사용하세요. 기존 사용자별 설치는 -PerUser를 명시하는 호환 경로이며 기본 설치가 아닙니다.</w:t>
+        <w:t>공개 Viewer 패키지에는 설치 스크립트와 자동 시작 기능이 없습니다. 필요하면 사용자가 직접 바로 가기를 만들고, 감시가 필요할 때 Viewer를 실행해 두세요.</w:t>
       </w:r>
     </w:p>
     <w:p>
@@ -1512,8 +1626,8 @@
       <w:r>
         <w:drawing>
           <wp:inline xmlns:a="http://schemas.openxmlformats.org/drawingml/2006/main" xmlns:pic="http://schemas.openxmlformats.org/drawingml/2006/picture">
-            <wp:extent cx="2560320" cy="2064774"/>
-            <wp:docPr id="1" name="Picture 1" title="Agent 연결 창" descr="Agent 주소만 입력하고 HTTPS 포트 18443을 자동 사용하는 연결 설정 창"/>
+            <wp:extent cx="2194560" cy="1840599"/>
+            <wp:docPr id="2" name="Picture 2" title="Agent 연결 창" descr="Agent 주소만 입력하고 HTTPS 포트 18443을 자동 사용하는 연결 설정 창"/>
             <wp:cNvGraphicFramePr>
               <a:graphicFrameLocks noChangeAspect="1"/>
             </wp:cNvGraphicFramePr>
@@ -1525,7 +1639,7 @@
                     <pic:cNvPicPr/>
                   </pic:nvPicPr>
                   <pic:blipFill>
-                    <a:blip r:embed="rId13"/>
+                    <a:blip r:embed="rId14"/>
                     <a:stretch>
                       <a:fillRect/>
                     </a:stretch>
@@ -1533,7 +1647,7 @@
                   <pic:spPr>
                     <a:xfrm>
                       <a:off x="0" y="0"/>
-                      <a:ext cx="2560320" cy="2064774"/>
+                      <a:ext cx="2194560" cy="1840599"/>
                     </a:xfrm>
                     <a:prstGeom prst="rect"/>
                   </pic:spPr>
@@ -1549,7 +1663,7 @@
         <w:pStyle w:val="Caption"/>
       </w:pPr>
       <w:r>
-        <w:t>그림 1. Agent 주소만 입력하는 연결 설정</w:t>
+        <w:t>그림 2. Agent 주소만 입력하는 연결 설정</w:t>
       </w:r>
     </w:p>
     <w:p>
@@ -1565,7 +1679,7 @@
           <w:rFonts w:ascii="맑은 고딕" w:hAnsi="맑은 고딕" w:eastAsia="맑은 고딕" w:cs="맑은 고딕"/>
           <w:sz w:val="22"/>
         </w:rPr>
-        <w:t>Agent를 설치한 원격 PC의 IPv4 또는 사내 DNS 이름만 입력합니다.</w:t>
+        <w:t>Agent를 설치한 원격 PC의 IPv4 또는 사내 DNS 이름만 입력합니다. 스위치 IP, Viewer PC 주소와 localhost는 두 프로그램이 같은 PC가 아닌 한 입력하지 않습니다.</w:t>
       </w:r>
     </w:p>
     <w:p>
@@ -1581,39 +1695,7 @@
           <w:rFonts w:ascii="맑은 고딕" w:hAnsi="맑은 고딕" w:eastAsia="맑은 고딕" w:cs="맑은 고딕"/>
           <w:sz w:val="22"/>
         </w:rPr>
-        <w:t>스위치 IP, Viewer PC 주소와 localhost는 Agent와 Viewer가 같은 PC가 아닌 한 입력하지 않습니다.</w:t>
-      </w:r>
-    </w:p>
-    <w:p>
-      <w:pPr>
-        <w:numPr>
-          <w:ilvl w:val="0"/>
-          <w:numId w:val="10"/>
-        </w:numPr>
-        <w:spacing w:before="0" w:after="120" w:line="300" w:lineRule="auto"/>
-      </w:pPr>
-      <w:r>
-        <w:rPr>
-          <w:rFonts w:ascii="맑은 고딕" w:hAnsi="맑은 고딕" w:eastAsia="맑은 고딕" w:cs="맑은 고딕"/>
-          <w:sz w:val="22"/>
-        </w:rPr>
-        <w:t>https://, 포트, 인증서 SHA-256 지문, 페어링 토큰은 입력하지 않습니다.</w:t>
-      </w:r>
-    </w:p>
-    <w:p>
-      <w:pPr>
-        <w:numPr>
-          <w:ilvl w:val="0"/>
-          <w:numId w:val="10"/>
-        </w:numPr>
-        <w:spacing w:before="0" w:after="120" w:line="300" w:lineRule="auto"/>
-      </w:pPr>
-      <w:r>
-        <w:rPr>
-          <w:rFonts w:ascii="맑은 고딕" w:hAnsi="맑은 고딕" w:eastAsia="맑은 고딕" w:cs="맑은 고딕"/>
-          <w:sz w:val="22"/>
-        </w:rPr>
-        <w:t>정상 Agent 교체나 재설치가 확실할 때만 '이 Agent로 다시 연결'을 사용합니다.</w:t>
+        <w:t>https://, 포트, 인증서 지문과 페어링 토큰은 입력하지 않습니다. 정상 Agent 교체나 재설치가 확실할 때만 '이 Agent로 다시 연결'을 사용합니다.</w:t>
       </w:r>
     </w:p>
     <w:p>
@@ -1645,7 +1727,7 @@
         <w:drawing>
           <wp:inline xmlns:a="http://schemas.openxmlformats.org/drawingml/2006/main" xmlns:pic="http://schemas.openxmlformats.org/drawingml/2006/picture">
             <wp:extent cx="5029200" cy="3540967"/>
-            <wp:docPr id="2" name="Picture 2" title="장비 관리 창" descr="장비명, 모델, IPv4, 계정 ID, 로그인 비밀번호, enable 비밀번호와 감시 설정을 입력하는 창"/>
+            <wp:docPr id="3" name="Picture 3" title="장비 관리 창" descr="장비명, 모델, IPv4, 계정 ID, 로그인 비밀번호, enable 비밀번호와 감시 설정을 입력하는 창"/>
             <wp:cNvGraphicFramePr>
               <a:graphicFrameLocks noChangeAspect="1"/>
             </wp:cNvGraphicFramePr>
@@ -1657,7 +1739,7 @@
                     <pic:cNvPicPr/>
                   </pic:nvPicPr>
                   <pic:blipFill>
-                    <a:blip r:embed="rId14"/>
+                    <a:blip r:embed="rId15"/>
                     <a:stretch>
                       <a:fillRect/>
                     </a:stretch>
@@ -1681,7 +1763,7 @@
         <w:pStyle w:val="Caption"/>
       </w:pPr>
       <w:r>
-        <w:t>그림 2. Viewer가 보관하는 장비 및 계정 입력 화면</w:t>
+        <w:t>그림 3. Viewer가 보관하는 장비 및 계정 입력 화면</w:t>
       </w:r>
     </w:p>
     <w:tbl>
@@ -2022,7 +2104,7 @@
                 <w:rFonts w:ascii="맑은 고딕" w:hAnsi="맑은 고딕" w:eastAsia="맑은 고딕" w:cs="맑은 고딕"/>
                 <w:sz w:val="18"/>
               </w:rPr>
-              <w:t>Agent 설치 또는 허용 IP 설정 도구에 등록한 관리 IP</w:t>
+              <w:t>Agent Setup에서 선택한 관리망에 속한 스위치 관리 IPv4</w:t>
             </w:r>
           </w:p>
         </w:tc>
@@ -2416,7 +2498,7 @@
         <w:drawing>
           <wp:inline xmlns:a="http://schemas.openxmlformats.org/drawingml/2006/main" xmlns:pic="http://schemas.openxmlformats.org/drawingml/2006/picture">
             <wp:extent cx="3977639" cy="2486024"/>
-            <wp:docPr id="3" name="Picture 3" title="장비 명령 실행 화면" descr="show running-config를 입력하고 데모 스위치의 익명화된 결과를 확인하는 장비 명령 탭"/>
+            <wp:docPr id="4" name="Picture 4" title="장비 명령 실행 화면" descr="show port status를 입력하고 데모 스위치의 익명화된 결과를 확인하는 장비 명령 탭"/>
             <wp:cNvGraphicFramePr>
               <a:graphicFrameLocks noChangeAspect="1"/>
             </wp:cNvGraphicFramePr>
@@ -2428,7 +2510,7 @@
                     <pic:cNvPicPr/>
                   </pic:nvPicPr>
                   <pic:blipFill>
-                    <a:blip r:embed="rId15"/>
+                    <a:blip r:embed="rId16"/>
                     <a:stretch>
                       <a:fillRect/>
                     </a:stretch>
@@ -2452,7 +2534,7 @@
         <w:pStyle w:val="Caption"/>
       </w:pPr>
       <w:r>
-        <w:t>그림 3. 한 줄 show 명령 실행과 메모리 내 결과 확인</w:t>
+        <w:t>그림 4. 한 줄 show 명령 실행과 메모리 내 결과 확인</w:t>
       </w:r>
     </w:p>
     <w:tbl>
@@ -2690,7 +2772,7 @@
                 <w:rFonts w:ascii="맑은 고딕" w:hAnsi="맑은 고딕" w:eastAsia="맑은 고딕" w:cs="맑은 고딕"/>
                 <w:sz w:val="18"/>
               </w:rPr>
-              <w:t>show running-config</w:t>
+              <w:t>show port status</w:t>
             </w:r>
           </w:p>
         </w:tc>
@@ -2716,7 +2798,7 @@
                 <w:rFonts w:ascii="맑은 고딕" w:hAnsi="맑은 고딕" w:eastAsia="맑은 고딕" w:cs="맑은 고딕"/>
                 <w:sz w:val="18"/>
               </w:rPr>
-              <w:t>실행, 민감정보 주의</w:t>
+              <w:t>실행, 포트 상태 확인</w:t>
             </w:r>
           </w:p>
         </w:tc>
@@ -2869,7 +2951,7 @@
           <w:color w:val="B42318"/>
           <w:sz w:val="21"/>
         </w:rPr>
-        <w:t xml:space="preserve">show running-config  </w:t>
+        <w:t xml:space="preserve">민감한 show 명령  </w:t>
       </w:r>
       <w:r>
         <w:rPr>
@@ -3473,7 +3555,7 @@
         <w:drawing>
           <wp:inline xmlns:a="http://schemas.openxmlformats.org/drawingml/2006/main" xmlns:pic="http://schemas.openxmlformats.org/drawingml/2006/picture">
             <wp:extent cx="4754880" cy="2971800"/>
-            <wp:docPr id="4" name="Picture 4" title="Viewer 대시보드" descr="장비 목록, 선택 장비 상태, 최근 이벤트와 Viewer 감시 상태를 보여 주는 대시보드"/>
+            <wp:docPr id="5" name="Picture 5" title="Viewer 대시보드" descr="장비 목록, 선택 장비 상태, 최근 이벤트와 Viewer 감시 상태를 보여 주는 대시보드"/>
             <wp:cNvGraphicFramePr>
               <a:graphicFrameLocks noChangeAspect="1"/>
             </wp:cNvGraphicFramePr>
@@ -3485,7 +3567,7 @@
                     <pic:cNvPicPr/>
                   </pic:nvPicPr>
                   <pic:blipFill>
-                    <a:blip r:embed="rId16"/>
+                    <a:blip r:embed="rId17"/>
                     <a:stretch>
                       <a:fillRect/>
                     </a:stretch>
@@ -3509,7 +3591,7 @@
         <w:pStyle w:val="Caption"/>
       </w:pPr>
       <w:r>
-        <w:t>그림 4. Viewer 중심 대시보드 전체 화면</w:t>
+        <w:t>그림 5. Viewer 중심 대시보드 전체 화면</w:t>
       </w:r>
     </w:p>
     <w:tbl>
@@ -3989,7 +4071,7 @@
         <w:drawing>
           <wp:inline xmlns:a="http://schemas.openxmlformats.org/drawingml/2006/main" xmlns:pic="http://schemas.openxmlformats.org/drawingml/2006/picture">
             <wp:extent cx="2971800" cy="1816099"/>
-            <wp:docPr id="5" name="Picture 5" title="항상 위 미니 창" descr="정상, 경고, 장애 수와 최근 문제를 보여 주는 작은 항상 위 창"/>
+            <wp:docPr id="6" name="Picture 6" title="항상 위 미니 창" descr="정상, 경고, 장애 수와 최근 문제를 보여 주는 작은 항상 위 창"/>
             <wp:cNvGraphicFramePr>
               <a:graphicFrameLocks noChangeAspect="1"/>
             </wp:cNvGraphicFramePr>
@@ -4001,7 +4083,7 @@
                     <pic:cNvPicPr/>
                   </pic:nvPicPr>
                   <pic:blipFill>
-                    <a:blip r:embed="rId17"/>
+                    <a:blip r:embed="rId18"/>
                     <a:stretch>
                       <a:fillRect/>
                     </a:stretch>
@@ -4025,7 +4107,7 @@
         <w:pStyle w:val="Caption"/>
       </w:pPr>
       <w:r>
-        <w:t>그림 5. 반복 운영용 미니 창</w:t>
+        <w:t>그림 6. 반복 운영용 미니 창</w:t>
       </w:r>
     </w:p>
     <w:p>
@@ -4038,7 +4120,7 @@
         <w:drawing>
           <wp:inline xmlns:a="http://schemas.openxmlformats.org/drawingml/2006/main" xmlns:pic="http://schemas.openxmlformats.org/drawingml/2006/picture">
             <wp:extent cx="3154680" cy="1296924"/>
-            <wp:docPr id="6" name="Picture 6" title="장애 알림 팝업" descr="데모 업링크 포트 Down 장애와 발생 시각을 보여 주는 알림 팝업"/>
+            <wp:docPr id="7" name="Picture 7" title="장애 알림 팝업" descr="데모 업링크 포트 Down 장애와 발생 시각을 보여 주는 알림 팝업"/>
             <wp:cNvGraphicFramePr>
               <a:graphicFrameLocks noChangeAspect="1"/>
             </wp:cNvGraphicFramePr>
@@ -4050,7 +4132,7 @@
                     <pic:cNvPicPr/>
                   </pic:nvPicPr>
                   <pic:blipFill>
-                    <a:blip r:embed="rId18"/>
+                    <a:blip r:embed="rId19"/>
                     <a:stretch>
                       <a:fillRect/>
                     </a:stretch>
@@ -4074,7 +4156,7 @@
         <w:pStyle w:val="Caption"/>
       </w:pPr>
       <w:r>
-        <w:t>그림 6. 새 장애 알림 팝업</w:t>
+        <w:t>그림 7. 새 장애 알림 팝업</w:t>
       </w:r>
     </w:p>
     <w:p>
@@ -4332,9 +4414,9 @@
                 <w:rFonts w:ascii="맑은 고딕" w:hAnsi="맑은 고딕" w:eastAsia="맑은 고딕" w:cs="맑은 고딕"/>
                 <w:sz w:val="18"/>
               </w:rPr>
-              <w:t>C:\Program Files\</w:t>
+              <w:t>사용자가 압축 해제한</w:t>
               <w:br/>
-              <w:t>SamsungSwitchWatch\Viewer</w:t>
+              <w:t>로컬 폴더</w:t>
             </w:r>
           </w:p>
         </w:tc>
@@ -4359,7 +4441,7 @@
                 <w:rFonts w:ascii="맑은 고딕" w:hAnsi="맑은 고딕" w:eastAsia="맑은 고딕" w:cs="맑은 고딕"/>
                 <w:sz w:val="18"/>
               </w:rPr>
-              <w:t>UAC 설치, 일반 사용자 권한으로 실행</w:t>
+              <w:t>포터블, 일반 사용자 권한으로 실행</w:t>
             </w:r>
           </w:p>
         </w:tc>
@@ -4782,7 +4864,7 @@
                 <w:rFonts w:ascii="맑은 고딕" w:hAnsi="맑은 고딕" w:eastAsia="맑은 고딕" w:cs="맑은 고딕"/>
                 <w:sz w:val="18"/>
               </w:rPr>
-              <w:t>Agent 설치 영수증</w:t>
+              <w:t>Agent 실행 설정</w:t>
             </w:r>
           </w:p>
         </w:tc>
@@ -4807,9 +4889,7 @@
                 <w:rFonts w:ascii="맑은 고딕" w:hAnsi="맑은 고딕" w:eastAsia="맑은 고딕" w:cs="맑은 고딕"/>
                 <w:sz w:val="18"/>
               </w:rPr>
-              <w:t>%ProgramData%\</w:t>
-              <w:br/>
-              <w:t>SamsungSwitchWatch</w:t>
+              <w:t>%ProgramFiles%\SamsungSwitchWatch\Agent</w:t>
             </w:r>
           </w:p>
         </w:tc>
@@ -4834,7 +4914,7 @@
                 <w:rFonts w:ascii="맑은 고딕" w:hAnsi="맑은 고딕" w:eastAsia="맑은 고딕" w:cs="맑은 고딕"/>
                 <w:sz w:val="18"/>
               </w:rPr>
-              <w:t>Administrators owner + SYSTEM/Administrators 전용 ACL</w:t>
+              <w:t>Viewer 주소와 선택 관리망에 맞춰 Setup이 생성</w:t>
             </w:r>
           </w:p>
         </w:tc>
@@ -4938,7 +5018,7 @@
           <w:rFonts w:ascii="맑은 고딕" w:hAnsi="맑은 고딕" w:eastAsia="맑은 고딕" w:cs="맑은 고딕"/>
           <w:sz w:val="22"/>
         </w:rPr>
-        <w:t>Viewer 설정 파일을 다른 PC나 다른 Windows 사용자에게 복사해도 계정은 복호화되지 않습니다.</w:t>
+        <w:t>Viewer 설정을 다른 PC나 Windows 사용자에게 복사해도 계정은 복호화되지 않으며, 진단 파일에는 IP·ID·비밀번호·호스트명·수동 명령 원문을 넣지 않습니다.</w:t>
       </w:r>
     </w:p>
     <w:p>
@@ -4954,7 +5034,7 @@
           <w:rFonts w:ascii="맑은 고딕" w:hAnsi="맑은 고딕" w:eastAsia="맑은 고딕" w:cs="맑은 고딕"/>
           <w:sz w:val="22"/>
         </w:rPr>
-        <w:t>진단 파일에는 IP, ID, 비밀번호, 호스트명과 수동 명령 원문을 넣지 않습니다.</w:t>
+        <w:t>기존 Agent HTTPS 신원과 유효한 실행 설정은 같은 PC의 업데이트에서 보존합니다.</w:t>
       </w:r>
     </w:p>
     <w:p>
@@ -4970,55 +5050,7 @@
           <w:rFonts w:ascii="맑은 고딕" w:hAnsi="맑은 고딕" w:eastAsia="맑은 고딕" w:cs="맑은 고딕"/>
           <w:sz w:val="22"/>
         </w:rPr>
-        <w:t>레거시 백업은 SYSTEM과 로컬 Administrators만 접근할 수 있으며 Agent 서비스 SID에는 권한을 주지 않습니다.</w:t>
-      </w:r>
-    </w:p>
-    <w:p>
-      <w:pPr>
-        <w:numPr>
-          <w:ilvl w:val="0"/>
-          <w:numId w:val="10"/>
-        </w:numPr>
-        <w:spacing w:before="0" w:after="120" w:line="300" w:lineRule="auto"/>
-      </w:pPr>
-      <w:r>
-        <w:rPr>
-          <w:rFonts w:ascii="맑은 고딕" w:hAnsi="맑은 고딕" w:eastAsia="맑은 고딕" w:cs="맑은 고딕"/>
-          <w:sz w:val="22"/>
-        </w:rPr>
-        <w:t>대상 정책은 설치 설정, Viewer 접근 정책은 제품 소유 방화벽 규칙이 권한원이며 설치 영수증에서 복원하지 않습니다.</w:t>
-      </w:r>
-    </w:p>
-    <w:p>
-      <w:pPr>
-        <w:numPr>
-          <w:ilvl w:val="0"/>
-          <w:numId w:val="10"/>
-        </w:numPr>
-        <w:spacing w:before="0" w:after="120" w:line="300" w:lineRule="auto"/>
-      </w:pPr>
-      <w:r>
-        <w:rPr>
-          <w:rFonts w:ascii="맑은 고딕" w:hAnsi="맑은 고딕" w:eastAsia="맑은 고딕" w:cs="맑은 고딕"/>
-          <w:sz w:val="22"/>
-        </w:rPr>
-        <w:t>Agent 방화벽은 등록한 Viewer PC IPv4 또는 고급 관리 CIDR만 HTTPS/18443에 접근하도록 제한합니다.</w:t>
-      </w:r>
-    </w:p>
-    <w:p>
-      <w:pPr>
-        <w:numPr>
-          <w:ilvl w:val="0"/>
-          <w:numId w:val="10"/>
-        </w:numPr>
-        <w:spacing w:before="0" w:after="120" w:line="300" w:lineRule="auto"/>
-      </w:pPr>
-      <w:r>
-        <w:rPr>
-          <w:rFonts w:ascii="맑은 고딕" w:hAnsi="맑은 고딕" w:eastAsia="맑은 고딕" w:cs="맑은 고딕"/>
-          <w:sz w:val="22"/>
-        </w:rPr>
-        <w:t>Agent는 등록한 스위치 IPv4 또는 고급 대상 CIDR과 고정 Telnet/23만 허용합니다.</w:t>
+        <w:t>방화벽은 고정 Viewer IPv4의 HTTPS/18443만 허용하고, Agent는 Setup에서 선택한 직접 연결 관리망의 Telnet/23만 사용합니다.</w:t>
       </w:r>
     </w:p>
     <w:p>
@@ -5170,7 +5202,7 @@
                 <w:rFonts w:ascii="맑은 고딕" w:hAnsi="맑은 고딕" w:eastAsia="맑은 고딕" w:cs="맑은 고딕"/>
                 <w:sz w:val="16"/>
               </w:rPr>
-              <w:t>DEPLOYMENT_ALREADY_RUNNING</w:t>
+              <w:t>AGENT_DNS_FAILED</w:t>
             </w:r>
           </w:p>
         </w:tc>
@@ -5195,431 +5227,7 @@
                 <w:rFonts w:ascii="맑은 고딕" w:hAnsi="맑은 고딕" w:eastAsia="맑은 고딕" w:cs="맑은 고딕"/>
                 <w:sz w:val="16"/>
               </w:rPr>
-              <w:t>먼저 시작한 같은 제품의 설치·제거가 끝난 뒤 다시 실행</w:t>
-            </w:r>
-          </w:p>
-        </w:tc>
-      </w:tr>
-      <w:tr>
-        <w:tc>
-          <w:tcPr>
-            <w:tcW w:type="dxa" w:w="4300"/>
-            <w:shd w:fill="FAFBFC"/>
-            <w:tcMar>
-              <w:top w:w="80" w:type="dxa"/>
-              <w:start w:w="120" w:type="dxa"/>
-              <w:bottom w:w="80" w:type="dxa"/>
-              <w:end w:w="120" w:type="dxa"/>
-            </w:tcMar>
-            <w:vAlign w:val="center"/>
-          </w:tcPr>
-          <w:p>
-            <w:pPr>
-              <w:spacing w:before="0" w:after="0" w:line="240" w:lineRule="auto"/>
-              <w:jc w:val="left"/>
-            </w:pPr>
-            <w:r>
-              <w:rPr>
-                <w:rFonts w:ascii="맑은 고딕" w:hAnsi="맑은 고딕" w:eastAsia="맑은 고딕" w:cs="맑은 고딕"/>
-                <w:sz w:val="16"/>
-              </w:rPr>
-              <w:t>DEPLOYMENT_PREVIOUS_RUN_INTERRUPTED</w:t>
-            </w:r>
-          </w:p>
-        </w:tc>
-        <w:tc>
-          <w:tcPr>
-            <w:tcW w:type="dxa" w:w="5060"/>
-            <w:shd w:fill="FAFBFC"/>
-            <w:tcMar>
-              <w:top w:w="80" w:type="dxa"/>
-              <w:start w:w="120" w:type="dxa"/>
-              <w:bottom w:w="80" w:type="dxa"/>
-              <w:end w:w="120" w:type="dxa"/>
-            </w:tcMar>
-            <w:vAlign w:val="center"/>
-          </w:tcPr>
-          <w:p>
-            <w:pPr>
-              <w:spacing w:before="0" w:after="0" w:line="240" w:lineRule="auto"/>
-              <w:jc w:val="left"/>
-            </w:pPr>
-            <w:r>
-              <w:rPr>
-                <w:rFonts w:ascii="맑은 고딕" w:hAnsi="맑은 고딕" w:eastAsia="맑은 고딕" w:cs="맑은 고딕"/>
-                <w:sz w:val="16"/>
-              </w:rPr>
-              <w:t>변경 전에 중단됨. 자동 복구가 아니므로 서비스·설치 폴더 상태 확인 후 다시 실행</w:t>
-            </w:r>
-          </w:p>
-        </w:tc>
-      </w:tr>
-      <w:tr>
-        <w:tc>
-          <w:tcPr>
-            <w:tcW w:type="dxa" w:w="4300"/>
-            <w:tcMar>
-              <w:top w:w="80" w:type="dxa"/>
-              <w:start w:w="120" w:type="dxa"/>
-              <w:bottom w:w="80" w:type="dxa"/>
-              <w:end w:w="120" w:type="dxa"/>
-            </w:tcMar>
-            <w:vAlign w:val="center"/>
-          </w:tcPr>
-          <w:p>
-            <w:pPr>
-              <w:spacing w:before="0" w:after="0" w:line="240" w:lineRule="auto"/>
-              <w:jc w:val="left"/>
-            </w:pPr>
-            <w:r>
-              <w:rPr>
-                <w:rFonts w:ascii="맑은 고딕" w:hAnsi="맑은 고딕" w:eastAsia="맑은 고딕" w:cs="맑은 고딕"/>
-                <w:sz w:val="16"/>
-              </w:rPr>
-              <w:t>DEPLOYMENT_LOCK_UNAVAILABLE</w:t>
-            </w:r>
-          </w:p>
-        </w:tc>
-        <w:tc>
-          <w:tcPr>
-            <w:tcW w:type="dxa" w:w="5060"/>
-            <w:tcMar>
-              <w:top w:w="80" w:type="dxa"/>
-              <w:start w:w="120" w:type="dxa"/>
-              <w:bottom w:w="80" w:type="dxa"/>
-              <w:end w:w="120" w:type="dxa"/>
-            </w:tcMar>
-            <w:vAlign w:val="center"/>
-          </w:tcPr>
-          <w:p>
-            <w:pPr>
-              <w:spacing w:before="0" w:after="0" w:line="240" w:lineRule="auto"/>
-              <w:jc w:val="left"/>
-            </w:pPr>
-            <w:r>
-              <w:rPr>
-                <w:rFonts w:ascii="맑은 고딕" w:hAnsi="맑은 고딕" w:eastAsia="맑은 고딕" w:cs="맑은 고딕"/>
-                <w:sz w:val="16"/>
-              </w:rPr>
-              <w:t>Agent 관리자 권한 또는 Viewer 동일 사용자 확인 → 보안 프로그램·정책 점검</w:t>
-            </w:r>
-          </w:p>
-        </w:tc>
-      </w:tr>
-      <w:tr>
-        <w:tc>
-          <w:tcPr>
-            <w:tcW w:type="dxa" w:w="4300"/>
-            <w:shd w:fill="FAFBFC"/>
-            <w:tcMar>
-              <w:top w:w="80" w:type="dxa"/>
-              <w:start w:w="120" w:type="dxa"/>
-              <w:bottom w:w="80" w:type="dxa"/>
-              <w:end w:w="120" w:type="dxa"/>
-            </w:tcMar>
-            <w:vAlign w:val="center"/>
-          </w:tcPr>
-          <w:p>
-            <w:pPr>
-              <w:spacing w:before="0" w:after="0" w:line="240" w:lineRule="auto"/>
-              <w:jc w:val="left"/>
-            </w:pPr>
-            <w:r>
-              <w:rPr>
-                <w:rFonts w:ascii="맑은 고딕" w:hAnsi="맑은 고딕" w:eastAsia="맑은 고딕" w:cs="맑은 고딕"/>
-                <w:sz w:val="16"/>
-              </w:rPr>
-              <w:t>AGENT_DEPLOYMENT_RECOVERY_REQUIRED</w:t>
-            </w:r>
-          </w:p>
-        </w:tc>
-        <w:tc>
-          <w:tcPr>
-            <w:tcW w:type="dxa" w:w="5060"/>
-            <w:shd w:fill="FAFBFC"/>
-            <w:tcMar>
-              <w:top w:w="80" w:type="dxa"/>
-              <w:start w:w="120" w:type="dxa"/>
-              <w:bottom w:w="80" w:type="dxa"/>
-              <w:end w:w="120" w:type="dxa"/>
-            </w:tcMar>
-            <w:vAlign w:val="center"/>
-          </w:tcPr>
-          <w:p>
-            <w:pPr>
-              <w:spacing w:before="0" w:after="0" w:line="240" w:lineRule="auto"/>
-              <w:jc w:val="left"/>
-            </w:pPr>
-            <w:r>
-              <w:rPr>
-                <w:rFonts w:ascii="맑은 고딕" w:hAnsi="맑은 고딕" w:eastAsia="맑은 고딕" w:cs="맑은 고딕"/>
-                <w:sz w:val="16"/>
-              </w:rPr>
-              <w:t>이전 Agent 설치·제거 미완료 또는 rollback 오류. journal·백업을 보존하고 관리자 확인</w:t>
-            </w:r>
-          </w:p>
-        </w:tc>
-      </w:tr>
-      <w:tr>
-        <w:tc>
-          <w:tcPr>
-            <w:tcW w:type="dxa" w:w="4300"/>
-            <w:tcMar>
-              <w:top w:w="80" w:type="dxa"/>
-              <w:start w:w="120" w:type="dxa"/>
-              <w:bottom w:w="80" w:type="dxa"/>
-              <w:end w:w="120" w:type="dxa"/>
-            </w:tcMar>
-            <w:vAlign w:val="center"/>
-          </w:tcPr>
-          <w:p>
-            <w:pPr>
-              <w:spacing w:before="0" w:after="0" w:line="240" w:lineRule="auto"/>
-              <w:jc w:val="left"/>
-            </w:pPr>
-            <w:r>
-              <w:rPr>
-                <w:rFonts w:ascii="맑은 고딕" w:hAnsi="맑은 고딕" w:eastAsia="맑은 고딕" w:cs="맑은 고딕"/>
-                <w:sz w:val="16"/>
-              </w:rPr>
-              <w:t>AGENT_DEPLOYMENT_JOURNAL_INVALID</w:t>
-            </w:r>
-          </w:p>
-        </w:tc>
-        <w:tc>
-          <w:tcPr>
-            <w:tcW w:type="dxa" w:w="5060"/>
-            <w:tcMar>
-              <w:top w:w="80" w:type="dxa"/>
-              <w:start w:w="120" w:type="dxa"/>
-              <w:bottom w:w="80" w:type="dxa"/>
-              <w:end w:w="120" w:type="dxa"/>
-            </w:tcMar>
-            <w:vAlign w:val="center"/>
-          </w:tcPr>
-          <w:p>
-            <w:pPr>
-              <w:spacing w:before="0" w:after="0" w:line="240" w:lineRule="auto"/>
-              <w:jc w:val="left"/>
-            </w:pPr>
-            <w:r>
-              <w:rPr>
-                <w:rFonts w:ascii="맑은 고딕" w:hAnsi="맑은 고딕" w:eastAsia="맑은 고딕" w:cs="맑은 고딕"/>
-                <w:sz w:val="16"/>
-              </w:rPr>
-              <w:t>Agent 작업 기록 손상 또는 미지원 형식. 기록을 삭제해 우회하지 말고 관리자 확인</w:t>
-            </w:r>
-          </w:p>
-        </w:tc>
-      </w:tr>
-      <w:tr>
-        <w:tc>
-          <w:tcPr>
-            <w:tcW w:type="dxa" w:w="4300"/>
-            <w:shd w:fill="FAFBFC"/>
-            <w:tcMar>
-              <w:top w:w="80" w:type="dxa"/>
-              <w:start w:w="120" w:type="dxa"/>
-              <w:bottom w:w="80" w:type="dxa"/>
-              <w:end w:w="120" w:type="dxa"/>
-            </w:tcMar>
-            <w:vAlign w:val="center"/>
-          </w:tcPr>
-          <w:p>
-            <w:pPr>
-              <w:spacing w:before="0" w:after="0" w:line="240" w:lineRule="auto"/>
-              <w:jc w:val="left"/>
-            </w:pPr>
-            <w:r>
-              <w:rPr>
-                <w:rFonts w:ascii="맑은 고딕" w:hAnsi="맑은 고딕" w:eastAsia="맑은 고딕" w:cs="맑은 고딕"/>
-                <w:sz w:val="16"/>
-              </w:rPr>
-              <w:t>AGENT_DEPLOYMENT_JOURNAL_TRUST_INVALID</w:t>
-            </w:r>
-          </w:p>
-        </w:tc>
-        <w:tc>
-          <w:tcPr>
-            <w:tcW w:type="dxa" w:w="5060"/>
-            <w:shd w:fill="FAFBFC"/>
-            <w:tcMar>
-              <w:top w:w="80" w:type="dxa"/>
-              <w:start w:w="120" w:type="dxa"/>
-              <w:bottom w:w="80" w:type="dxa"/>
-              <w:end w:w="120" w:type="dxa"/>
-            </w:tcMar>
-            <w:vAlign w:val="center"/>
-          </w:tcPr>
-          <w:p>
-            <w:pPr>
-              <w:spacing w:before="0" w:after="0" w:line="240" w:lineRule="auto"/>
-              <w:jc w:val="left"/>
-            </w:pPr>
-            <w:r>
-              <w:rPr>
-                <w:rFonts w:ascii="맑은 고딕" w:hAnsi="맑은 고딕" w:eastAsia="맑은 고딕" w:cs="맑은 고딕"/>
-                <w:sz w:val="16"/>
-              </w:rPr>
-              <w:t>작업 기록 폴더 소유자·ACL·파일 구성이 안전하지 않음. 관리자와 보안 정책 확인</w:t>
-            </w:r>
-          </w:p>
-        </w:tc>
-      </w:tr>
-      <w:tr>
-        <w:tc>
-          <w:tcPr>
-            <w:tcW w:type="dxa" w:w="4300"/>
-            <w:tcMar>
-              <w:top w:w="80" w:type="dxa"/>
-              <w:start w:w="120" w:type="dxa"/>
-              <w:bottom w:w="80" w:type="dxa"/>
-              <w:end w:w="120" w:type="dxa"/>
-            </w:tcMar>
-            <w:vAlign w:val="center"/>
-          </w:tcPr>
-          <w:p>
-            <w:pPr>
-              <w:spacing w:before="0" w:after="0" w:line="240" w:lineRule="auto"/>
-              <w:jc w:val="left"/>
-            </w:pPr>
-            <w:r>
-              <w:rPr>
-                <w:rFonts w:ascii="맑은 고딕" w:hAnsi="맑은 고딕" w:eastAsia="맑은 고딕" w:cs="맑은 고딕"/>
-                <w:sz w:val="16"/>
-              </w:rPr>
-              <w:t>AGENT_DIRECTORY_TRUST_INVALID</w:t>
-            </w:r>
-          </w:p>
-        </w:tc>
-        <w:tc>
-          <w:tcPr>
-            <w:tcW w:type="dxa" w:w="5060"/>
-            <w:tcMar>
-              <w:top w:w="80" w:type="dxa"/>
-              <w:start w:w="120" w:type="dxa"/>
-              <w:bottom w:w="80" w:type="dxa"/>
-              <w:end w:w="120" w:type="dxa"/>
-            </w:tcMar>
-            <w:vAlign w:val="center"/>
-          </w:tcPr>
-          <w:p>
-            <w:pPr>
-              <w:spacing w:before="0" w:after="0" w:line="240" w:lineRule="auto"/>
-              <w:jc w:val="left"/>
-            </w:pPr>
-            <w:r>
-              <w:rPr>
-                <w:rFonts w:ascii="맑은 고딕" w:hAnsi="맑은 고딕" w:eastAsia="맑은 고딕" w:cs="맑은 고딕"/>
-                <w:sz w:val="16"/>
-              </w:rPr>
-              <w:t>활성 Agent install/data 트리의 owner 또는 reparse 구성을 신뢰할 수 없음. 삭제·강제 소유권 변경 없이 Windows 관리자 확인</w:t>
-            </w:r>
-          </w:p>
-        </w:tc>
-      </w:tr>
-      <w:tr>
-        <w:tc>
-          <w:tcPr>
-            <w:tcW w:type="dxa" w:w="4300"/>
-            <w:shd w:fill="FAFBFC"/>
-            <w:tcMar>
-              <w:top w:w="80" w:type="dxa"/>
-              <w:start w:w="120" w:type="dxa"/>
-              <w:bottom w:w="80" w:type="dxa"/>
-              <w:end w:w="120" w:type="dxa"/>
-            </w:tcMar>
-            <w:vAlign w:val="center"/>
-          </w:tcPr>
-          <w:p>
-            <w:pPr>
-              <w:spacing w:before="0" w:after="0" w:line="240" w:lineRule="auto"/>
-              <w:jc w:val="left"/>
-            </w:pPr>
-            <w:r>
-              <w:rPr>
-                <w:rFonts w:ascii="맑은 고딕" w:hAnsi="맑은 고딕" w:eastAsia="맑은 고딕" w:cs="맑은 고딕"/>
-                <w:sz w:val="16"/>
-              </w:rPr>
-              <w:t>AGENT_RECEIPT_TRUST_INVALID</w:t>
-            </w:r>
-          </w:p>
-        </w:tc>
-        <w:tc>
-          <w:tcPr>
-            <w:tcW w:type="dxa" w:w="5060"/>
-            <w:shd w:fill="FAFBFC"/>
-            <w:tcMar>
-              <w:top w:w="80" w:type="dxa"/>
-              <w:start w:w="120" w:type="dxa"/>
-              <w:bottom w:w="80" w:type="dxa"/>
-              <w:end w:w="120" w:type="dxa"/>
-            </w:tcMar>
-            <w:vAlign w:val="center"/>
-          </w:tcPr>
-          <w:p>
-            <w:pPr>
-              <w:spacing w:before="0" w:after="0" w:line="240" w:lineRule="auto"/>
-              <w:jc w:val="left"/>
-            </w:pPr>
-            <w:r>
-              <w:rPr>
-                <w:rFonts w:ascii="맑은 고딕" w:hAnsi="맑은 고딕" w:eastAsia="맑은 고딕" w:cs="맑은 고딕"/>
-                <w:sz w:val="16"/>
-              </w:rPr>
-              <w:t>영구 삭제용 install receipt가 SYSTEM·Administrators 전용 일반 파일이 아님. 영수증과 데이터 보존 후 관리자 확인</w:t>
-            </w:r>
-          </w:p>
-        </w:tc>
-      </w:tr>
-      <w:tr>
-        <w:tc>
-          <w:tcPr>
-            <w:tcW w:type="dxa" w:w="4300"/>
-            <w:tcMar>
-              <w:top w:w="80" w:type="dxa"/>
-              <w:start w:w="120" w:type="dxa"/>
-              <w:bottom w:w="80" w:type="dxa"/>
-              <w:end w:w="120" w:type="dxa"/>
-            </w:tcMar>
-            <w:vAlign w:val="center"/>
-          </w:tcPr>
-          <w:p>
-            <w:pPr>
-              <w:spacing w:before="0" w:after="0" w:line="240" w:lineRule="auto"/>
-              <w:jc w:val="left"/>
-            </w:pPr>
-            <w:r>
-              <w:rPr>
-                <w:rFonts w:ascii="맑은 고딕" w:hAnsi="맑은 고딕" w:eastAsia="맑은 고딕" w:cs="맑은 고딕"/>
-                <w:sz w:val="16"/>
-              </w:rPr>
-              <w:t>AGENT_HTTPS_UNREACHABLE</w:t>
-            </w:r>
-          </w:p>
-        </w:tc>
-        <w:tc>
-          <w:tcPr>
-            <w:tcW w:type="dxa" w:w="5060"/>
-            <w:tcMar>
-              <w:top w:w="80" w:type="dxa"/>
-              <w:start w:w="120" w:type="dxa"/>
-              <w:bottom w:w="80" w:type="dxa"/>
-              <w:end w:w="120" w:type="dxa"/>
-            </w:tcMar>
-            <w:vAlign w:val="center"/>
-          </w:tcPr>
-          <w:p>
-            <w:pPr>
-              <w:spacing w:before="0" w:after="0" w:line="240" w:lineRule="auto"/>
-              <w:jc w:val="left"/>
-            </w:pPr>
-            <w:r>
-              <w:rPr>
-                <w:rFonts w:ascii="맑은 고딕" w:hAnsi="맑은 고딕" w:eastAsia="맑은 고딕" w:cs="맑은 고딕"/>
-                <w:sz w:val="16"/>
-              </w:rPr>
-              <w:t>Agent 서비스 → TCP/18443 경로 → Viewer PC 허용 IP 방화벽</w:t>
+              <w:t>입력한 Agent PC 이름 → 사내 DNS → IPv4 직접 입력</w:t>
             </w:r>
           </w:p>
         </w:tc>
@@ -5673,7 +5281,113 @@
                 <w:rFonts w:ascii="맑은 고딕" w:hAnsi="맑은 고딕" w:eastAsia="맑은 고딕" w:cs="맑은 고딕"/>
                 <w:sz w:val="16"/>
               </w:rPr>
-              <w:t>실제 Agent PC 주소 → 서비스 → 허용 IP 설정 도구 → Viewer PC의 원격 TCP/18443</w:t>
+              <w:t>실제 Agent PC 주소 → Agent Setup 검사 → 고정 Viewer IP → 원격 TCP/18443</w:t>
+            </w:r>
+          </w:p>
+        </w:tc>
+      </w:tr>
+      <w:tr>
+        <w:tc>
+          <w:tcPr>
+            <w:tcW w:type="dxa" w:w="4300"/>
+            <w:tcMar>
+              <w:top w:w="80" w:type="dxa"/>
+              <w:start w:w="120" w:type="dxa"/>
+              <w:bottom w:w="80" w:type="dxa"/>
+              <w:end w:w="120" w:type="dxa"/>
+            </w:tcMar>
+            <w:vAlign w:val="center"/>
+          </w:tcPr>
+          <w:p>
+            <w:pPr>
+              <w:spacing w:before="0" w:after="0" w:line="240" w:lineRule="auto"/>
+              <w:jc w:val="left"/>
+            </w:pPr>
+            <w:r>
+              <w:rPr>
+                <w:rFonts w:ascii="맑은 고딕" w:hAnsi="맑은 고딕" w:eastAsia="맑은 고딕" w:cs="맑은 고딕"/>
+                <w:sz w:val="16"/>
+              </w:rPr>
+              <w:t>AGENT_UNREACHABLE</w:t>
+            </w:r>
+          </w:p>
+        </w:tc>
+        <w:tc>
+          <w:tcPr>
+            <w:tcW w:type="dxa" w:w="5060"/>
+            <w:tcMar>
+              <w:top w:w="80" w:type="dxa"/>
+              <w:start w:w="120" w:type="dxa"/>
+              <w:bottom w:w="80" w:type="dxa"/>
+              <w:end w:w="120" w:type="dxa"/>
+            </w:tcMar>
+            <w:vAlign w:val="center"/>
+          </w:tcPr>
+          <w:p>
+            <w:pPr>
+              <w:spacing w:before="0" w:after="0" w:line="240" w:lineRule="auto"/>
+              <w:jc w:val="left"/>
+            </w:pPr>
+            <w:r>
+              <w:rPr>
+                <w:rFonts w:ascii="맑은 고딕" w:hAnsi="맑은 고딕" w:eastAsia="맑은 고딕" w:cs="맑은 고딕"/>
+                <w:sz w:val="16"/>
+              </w:rPr>
+              <w:t>Viewer와 Agent PC 사이 라우팅 → 방화벽 → EDR 차단</w:t>
+            </w:r>
+          </w:p>
+        </w:tc>
+      </w:tr>
+      <w:tr>
+        <w:tc>
+          <w:tcPr>
+            <w:tcW w:type="dxa" w:w="4300"/>
+            <w:shd w:fill="FAFBFC"/>
+            <w:tcMar>
+              <w:top w:w="80" w:type="dxa"/>
+              <w:start w:w="120" w:type="dxa"/>
+              <w:bottom w:w="80" w:type="dxa"/>
+              <w:end w:w="120" w:type="dxa"/>
+            </w:tcMar>
+            <w:vAlign w:val="center"/>
+          </w:tcPr>
+          <w:p>
+            <w:pPr>
+              <w:spacing w:before="0" w:after="0" w:line="240" w:lineRule="auto"/>
+              <w:jc w:val="left"/>
+            </w:pPr>
+            <w:r>
+              <w:rPr>
+                <w:rFonts w:ascii="맑은 고딕" w:hAnsi="맑은 고딕" w:eastAsia="맑은 고딕" w:cs="맑은 고딕"/>
+                <w:sz w:val="16"/>
+              </w:rPr>
+              <w:t>AGENT_VERSION_MISMATCH</w:t>
+            </w:r>
+          </w:p>
+        </w:tc>
+        <w:tc>
+          <w:tcPr>
+            <w:tcW w:type="dxa" w:w="5060"/>
+            <w:shd w:fill="FAFBFC"/>
+            <w:tcMar>
+              <w:top w:w="80" w:type="dxa"/>
+              <w:start w:w="120" w:type="dxa"/>
+              <w:bottom w:w="80" w:type="dxa"/>
+              <w:end w:w="120" w:type="dxa"/>
+            </w:tcMar>
+            <w:vAlign w:val="center"/>
+          </w:tcPr>
+          <w:p>
+            <w:pPr>
+              <w:spacing w:before="0" w:after="0" w:line="240" w:lineRule="auto"/>
+              <w:jc w:val="left"/>
+            </w:pPr>
+            <w:r>
+              <w:rPr>
+                <w:rFonts w:ascii="맑은 고딕" w:hAnsi="맑은 고딕" w:eastAsia="맑은 고딕" w:cs="맑은 고딕"/>
+                <w:sz w:val="16"/>
+              </w:rPr>
+              <w:t>같은 Release의 Agent ZIP과 Viewer ZIP으로 함께 업데이트</w:t>
             </w:r>
           </w:p>
         </w:tc>
@@ -5753,7 +5467,7 @@
                 <w:rFonts w:ascii="맑은 고딕" w:hAnsi="맑은 고딕" w:eastAsia="맑은 고딕" w:cs="맑은 고딕"/>
                 <w:sz w:val="16"/>
               </w:rPr>
-              <w:t>VIEWER_SOURCE_ACCESS_DENIED</w:t>
+              <w:t>AGENT_PROTOCOL_MISMATCH / TLS_IDENTITY_INVALID</w:t>
             </w:r>
           </w:p>
         </w:tc>
@@ -5779,7 +5493,7 @@
                 <w:rFonts w:ascii="맑은 고딕" w:hAnsi="맑은 고딕" w:eastAsia="맑은 고딕" w:cs="맑은 고딕"/>
                 <w:sz w:val="16"/>
               </w:rPr>
-              <w:t>UAC 관리자도 읽을 수 있는 승인된 임시 폴더에 공식 ZIP 다시 압축 해제</w:t>
+              <w:t>Agent Setup의 준비 상태 → PC 교체 여부 → HTTPS 신원 파일</w:t>
             </w:r>
           </w:p>
         </w:tc>
@@ -5806,7 +5520,7 @@
                 <w:rFonts w:ascii="맑은 고딕" w:hAnsi="맑은 고딕" w:eastAsia="맑은 고딕" w:cs="맑은 고딕"/>
                 <w:sz w:val="16"/>
               </w:rPr>
-              <w:t>VIEWER_INSTALL_PATH_EXECUTION_BLOCKED</w:t>
+              <w:t>SETUP_PACKAGE_NOT_FOUND</w:t>
             </w:r>
           </w:p>
         </w:tc>
@@ -5831,7 +5545,7 @@
                 <w:rFonts w:ascii="맑은 고딕" w:hAnsi="맑은 고딕" w:eastAsia="맑은 고딕" w:cs="맑은 고딕"/>
                 <w:sz w:val="16"/>
               </w:rPr>
-              <w:t>Program Files 실행 정책 → AppLocker·WDAC·EDR 기록 → 보안 담당자</w:t>
+              <w:t>Agent ZIP 전체 압축 해제 → Setup과 Agent EXE·BUILD-MANIFEST 존재 확인</w:t>
             </w:r>
           </w:p>
         </w:tc>
@@ -5859,7 +5573,7 @@
                 <w:rFonts w:ascii="맑은 고딕" w:hAnsi="맑은 고딕" w:eastAsia="맑은 고딕" w:cs="맑은 고딕"/>
                 <w:sz w:val="16"/>
               </w:rPr>
-              <w:t>VIEWER_USER_PHASE_FAILED</w:t>
+              <w:t>SETUP_PACKAGE_HASH_MISMATCH</w:t>
             </w:r>
           </w:p>
         </w:tc>
@@ -5885,7 +5599,7 @@
                 <w:rFonts w:ascii="맑은 고딕" w:hAnsi="맑은 고딕" w:eastAsia="맑은 고딕" w:cs="맑은 고딕"/>
                 <w:sz w:val="16"/>
               </w:rPr>
-              <w:t>원래 사용자 실행 검사·바로 가기 → 복구 UAC → Recovery 결과</w:t>
+              <w:t>실행 중지 → 공식 ZIP을 새 폴더에 다시 압축 해제 → EDR 격리 기록</w:t>
             </w:r>
           </w:p>
         </w:tc>
@@ -5912,7 +5626,7 @@
                 <w:rFonts w:ascii="맑은 고딕" w:hAnsi="맑은 고딕" w:eastAsia="맑은 고딕" w:cs="맑은 고딕"/>
                 <w:sz w:val="16"/>
               </w:rPr>
-              <w:t>VIEWER_CURRENT_SELF_CHECK_FAILED</w:t>
+              <w:t>SETUP_SERVICE_FAILED</w:t>
             </w:r>
           </w:p>
         </w:tc>
@@ -5937,7 +5651,7 @@
                 <w:rFonts w:ascii="맑은 고딕" w:hAnsi="맑은 고딕" w:eastAsia="맑은 고딕" w:cs="맑은 고딕"/>
                 <w:sz w:val="16"/>
               </w:rPr>
-              <w:t>현재·rollback 설치는 보존됨 → EDR·AppLocker·WDAC 지연·차단 확인 → 재시도</w:t>
+              <w:t>Windows 서비스 관리 권한 → 기존 SamsungSwitchWatchAgent 상태</w:t>
             </w:r>
           </w:p>
         </w:tc>
@@ -5965,7 +5679,7 @@
                 <w:rFonts w:ascii="맑은 고딕" w:hAnsi="맑은 고딕" w:eastAsia="맑은 고딕" w:cs="맑은 고딕"/>
                 <w:sz w:val="16"/>
               </w:rPr>
-              <w:t>VIEWER_ROLLBACK_ACTIVE_CHANGED</w:t>
+              <w:t>SETUP_FIREWALL_FAILED</w:t>
             </w:r>
           </w:p>
         </w:tc>
@@ -5991,7 +5705,7 @@
                 <w:rFonts w:ascii="맑은 고딕" w:hAnsi="맑은 고딕" w:eastAsia="맑은 고딕" w:cs="맑은 고딕"/>
                 <w:sz w:val="16"/>
               </w:rPr>
-              <w:t>다른 Viewer 설치가 먼저 완료됨 → 두 설치 증거 보존 → 최신 ZIP으로 다시 설치</w:t>
+              <w:t>Windows 방화벽 서비스 → 동명 비소유 규칙 → 보안 정책</w:t>
             </w:r>
           </w:p>
         </w:tc>
@@ -6018,7 +5732,7 @@
                 <w:rFonts w:ascii="맑은 고딕" w:hAnsi="맑은 고딕" w:eastAsia="맑은 고딕" w:cs="맑은 고딕"/>
                 <w:sz w:val="16"/>
               </w:rPr>
-              <w:t>VIEWER_ROLLBACK_TRANSACTION_MISSING</w:t>
+              <w:t>SETUP_HEALTH_FAILED</w:t>
             </w:r>
           </w:p>
         </w:tc>
@@ -6043,7 +5757,7 @@
                 <w:rFonts w:ascii="맑은 고딕" w:hAnsi="맑은 고딕" w:eastAsia="맑은 고딕" w:cs="맑은 고딕"/>
                 <w:sz w:val="16"/>
               </w:rPr>
-              <w:t>관리자 전용 작업 marker 없음 → 설치·slot 보존 → 최신 ZIP으로 관리자 재설치</w:t>
+              <w:t>서비스 실행 → 로컬 HTTPS/18443 → Agent 설정과 Windows 이벤트</w:t>
             </w:r>
           </w:p>
         </w:tc>
@@ -6071,7 +5785,7 @@
                 <w:rFonts w:ascii="맑은 고딕" w:hAnsi="맑은 고딕" w:eastAsia="맑은 고딕" w:cs="맑은 고딕"/>
                 <w:sz w:val="16"/>
               </w:rPr>
-              <w:t>VIEWER_ROLLBACK_TRANSACTION_INVALID</w:t>
+              <w:t>SETUP_ROLLBACK_FAILED</w:t>
             </w:r>
           </w:p>
         </w:tc>
@@ -6097,1067 +5811,7 @@
                 <w:rFonts w:ascii="맑은 고딕" w:hAnsi="맑은 고딕" w:eastAsia="맑은 고딕" w:cs="맑은 고딕"/>
                 <w:sz w:val="16"/>
               </w:rPr>
-              <w:t>marker 작업 ID·해시·slot 결속 불일치 → 증거 삭제 금지 → 관리자 확인</w:t>
-            </w:r>
-          </w:p>
-        </w:tc>
-      </w:tr>
-      <w:tr>
-        <w:tc>
-          <w:tcPr>
-            <w:tcW w:type="dxa" w:w="4300"/>
-            <w:tcMar>
-              <w:top w:w="80" w:type="dxa"/>
-              <w:start w:w="120" w:type="dxa"/>
-              <w:bottom w:w="80" w:type="dxa"/>
-              <w:end w:w="120" w:type="dxa"/>
-            </w:tcMar>
-            <w:vAlign w:val="center"/>
-          </w:tcPr>
-          <w:p>
-            <w:pPr>
-              <w:spacing w:before="0" w:after="0" w:line="240" w:lineRule="auto"/>
-              <w:jc w:val="left"/>
-            </w:pPr>
-            <w:r>
-              <w:rPr>
-                <w:rFonts w:ascii="맑은 고딕" w:hAnsi="맑은 고딕" w:eastAsia="맑은 고딕" w:cs="맑은 고딕"/>
-                <w:sz w:val="16"/>
-              </w:rPr>
-              <w:t>VIEWER_ROLLBACK_TRANSACTION_TRUST_INVALID</w:t>
-            </w:r>
-          </w:p>
-        </w:tc>
-        <w:tc>
-          <w:tcPr>
-            <w:tcW w:type="dxa" w:w="5060"/>
-            <w:tcMar>
-              <w:top w:w="80" w:type="dxa"/>
-              <w:start w:w="120" w:type="dxa"/>
-              <w:bottom w:w="80" w:type="dxa"/>
-              <w:end w:w="120" w:type="dxa"/>
-            </w:tcMar>
-            <w:vAlign w:val="center"/>
-          </w:tcPr>
-          <w:p>
-            <w:pPr>
-              <w:spacing w:before="0" w:after="0" w:line="240" w:lineRule="auto"/>
-              <w:jc w:val="left"/>
-            </w:pPr>
-            <w:r>
-              <w:rPr>
-                <w:rFonts w:ascii="맑은 고딕" w:hAnsi="맑은 고딕" w:eastAsia="맑은 고딕" w:cs="맑은 고딕"/>
-                <w:sz w:val="16"/>
-              </w:rPr>
-              <w:t>marker ACL·소유권 신뢰 불가 → ACL 우회 금지 → 관리자·보안 담당자 확인</w:t>
-            </w:r>
-          </w:p>
-        </w:tc>
-      </w:tr>
-      <w:tr>
-        <w:tc>
-          <w:tcPr>
-            <w:tcW w:type="dxa" w:w="4300"/>
-            <w:shd w:fill="FAFBFC"/>
-            <w:tcMar>
-              <w:top w:w="80" w:type="dxa"/>
-              <w:start w:w="120" w:type="dxa"/>
-              <w:bottom w:w="80" w:type="dxa"/>
-              <w:end w:w="120" w:type="dxa"/>
-            </w:tcMar>
-            <w:vAlign w:val="center"/>
-          </w:tcPr>
-          <w:p>
-            <w:pPr>
-              <w:spacing w:before="0" w:after="0" w:line="240" w:lineRule="auto"/>
-              <w:jc w:val="left"/>
-            </w:pPr>
-            <w:r>
-              <w:rPr>
-                <w:rFonts w:ascii="맑은 고딕" w:hAnsi="맑은 고딕" w:eastAsia="맑은 고딕" w:cs="맑은 고딕"/>
-                <w:sz w:val="16"/>
-              </w:rPr>
-              <w:t>VIEWER_ROLLBACK_TRANSACTION_CONSUME_FAILED</w:t>
-            </w:r>
-          </w:p>
-        </w:tc>
-        <w:tc>
-          <w:tcPr>
-            <w:tcW w:type="dxa" w:w="5060"/>
-            <w:shd w:fill="FAFBFC"/>
-            <w:tcMar>
-              <w:top w:w="80" w:type="dxa"/>
-              <w:start w:w="120" w:type="dxa"/>
-              <w:bottom w:w="80" w:type="dxa"/>
-              <w:end w:w="120" w:type="dxa"/>
-            </w:tcMar>
-            <w:vAlign w:val="center"/>
-          </w:tcPr>
-          <w:p>
-            <w:pPr>
-              <w:spacing w:before="0" w:after="0" w:line="240" w:lineRule="auto"/>
-              <w:jc w:val="left"/>
-            </w:pPr>
-            <w:r>
-              <w:rPr>
-                <w:rFonts w:ascii="맑은 고딕" w:hAnsi="맑은 고딕" w:eastAsia="맑은 고딕" w:cs="맑은 고딕"/>
-                <w:sz w:val="16"/>
-              </w:rPr>
-              <w:t>복원 뒤 marker 제거 실패 → 복원된 Viewer 보존 → 관리자 재설치</w:t>
-            </w:r>
-          </w:p>
-        </w:tc>
-      </w:tr>
-      <w:tr>
-        <w:tc>
-          <w:tcPr>
-            <w:tcW w:type="dxa" w:w="4300"/>
-            <w:tcMar>
-              <w:top w:w="80" w:type="dxa"/>
-              <w:start w:w="120" w:type="dxa"/>
-              <w:bottom w:w="80" w:type="dxa"/>
-              <w:end w:w="120" w:type="dxa"/>
-            </w:tcMar>
-            <w:vAlign w:val="center"/>
-          </w:tcPr>
-          <w:p>
-            <w:pPr>
-              <w:spacing w:before="0" w:after="0" w:line="240" w:lineRule="auto"/>
-              <w:jc w:val="left"/>
-            </w:pPr>
-            <w:r>
-              <w:rPr>
-                <w:rFonts w:ascii="맑은 고딕" w:hAnsi="맑은 고딕" w:eastAsia="맑은 고딕" w:cs="맑은 고딕"/>
-                <w:sz w:val="16"/>
-              </w:rPr>
-              <w:t>VIEWER_ROLLBACK_TRANSACTION_WRITE_FAILED</w:t>
-            </w:r>
-          </w:p>
-        </w:tc>
-        <w:tc>
-          <w:tcPr>
-            <w:tcW w:type="dxa" w:w="5060"/>
-            <w:tcMar>
-              <w:top w:w="80" w:type="dxa"/>
-              <w:start w:w="120" w:type="dxa"/>
-              <w:bottom w:w="80" w:type="dxa"/>
-              <w:end w:w="120" w:type="dxa"/>
-            </w:tcMar>
-            <w:vAlign w:val="center"/>
-          </w:tcPr>
-          <w:p>
-            <w:pPr>
-              <w:spacing w:before="0" w:after="0" w:line="240" w:lineRule="auto"/>
-              <w:jc w:val="left"/>
-            </w:pPr>
-            <w:r>
-              <w:rPr>
-                <w:rFonts w:ascii="맑은 고딕" w:hAnsi="맑은 고딕" w:eastAsia="맑은 고딕" w:cs="맑은 고딕"/>
-                <w:sz w:val="16"/>
-              </w:rPr>
-              <w:t>새 marker 확정 실패 → Recovery 결과 → 설치·slot·marker 증거 보존</w:t>
-            </w:r>
-          </w:p>
-        </w:tc>
-      </w:tr>
-      <w:tr>
-        <w:tc>
-          <w:tcPr>
-            <w:tcW w:type="dxa" w:w="4300"/>
-            <w:shd w:fill="FAFBFC"/>
-            <w:tcMar>
-              <w:top w:w="80" w:type="dxa"/>
-              <w:start w:w="120" w:type="dxa"/>
-              <w:bottom w:w="80" w:type="dxa"/>
-              <w:end w:w="120" w:type="dxa"/>
-            </w:tcMar>
-            <w:vAlign w:val="center"/>
-          </w:tcPr>
-          <w:p>
-            <w:pPr>
-              <w:spacing w:before="0" w:after="0" w:line="240" w:lineRule="auto"/>
-              <w:jc w:val="left"/>
-            </w:pPr>
-            <w:r>
-              <w:rPr>
-                <w:rFonts w:ascii="맑은 고딕" w:hAnsi="맑은 고딕" w:eastAsia="맑은 고딕" w:cs="맑은 고딕"/>
-                <w:sz w:val="16"/>
-              </w:rPr>
-              <w:t>VIEWER_MACHINE_ROLLBACK_INCOMPLETE</w:t>
-            </w:r>
-          </w:p>
-        </w:tc>
-        <w:tc>
-          <w:tcPr>
-            <w:tcW w:type="dxa" w:w="5060"/>
-            <w:shd w:fill="FAFBFC"/>
-            <w:tcMar>
-              <w:top w:w="80" w:type="dxa"/>
-              <w:start w:w="120" w:type="dxa"/>
-              <w:bottom w:w="80" w:type="dxa"/>
-              <w:end w:w="120" w:type="dxa"/>
-            </w:tcMar>
-            <w:vAlign w:val="center"/>
-          </w:tcPr>
-          <w:p>
-            <w:pPr>
-              <w:spacing w:before="0" w:after="0" w:line="240" w:lineRule="auto"/>
-              <w:jc w:val="left"/>
-            </w:pPr>
-            <w:r>
-              <w:rPr>
-                <w:rFonts w:ascii="맑은 고딕" w:hAnsi="맑은 고딕" w:eastAsia="맑은 고딕" w:cs="맑은 고딕"/>
-                <w:sz w:val="16"/>
-              </w:rPr>
-              <w:t>현재 설치와 Viewer.__rollback 보존 → Windows 관리자 확인</w:t>
-            </w:r>
-          </w:p>
-        </w:tc>
-      </w:tr>
-      <w:tr>
-        <w:tc>
-          <w:tcPr>
-            <w:tcW w:type="dxa" w:w="4300"/>
-            <w:tcMar>
-              <w:top w:w="80" w:type="dxa"/>
-              <w:start w:w="120" w:type="dxa"/>
-              <w:bottom w:w="80" w:type="dxa"/>
-              <w:end w:w="120" w:type="dxa"/>
-            </w:tcMar>
-            <w:vAlign w:val="center"/>
-          </w:tcPr>
-          <w:p>
-            <w:pPr>
-              <w:spacing w:before="0" w:after="0" w:line="240" w:lineRule="auto"/>
-              <w:jc w:val="left"/>
-            </w:pPr>
-            <w:r>
-              <w:rPr>
-                <w:rFonts w:ascii="맑은 고딕" w:hAnsi="맑은 고딕" w:eastAsia="맑은 고딕" w:cs="맑은 고딕"/>
-                <w:sz w:val="16"/>
-              </w:rPr>
-              <w:t>VIEWER_ROLLBACK_ELEVATION_NOT_GRANTED</w:t>
-            </w:r>
-          </w:p>
-        </w:tc>
-        <w:tc>
-          <w:tcPr>
-            <w:tcW w:type="dxa" w:w="5060"/>
-            <w:tcMar>
-              <w:top w:w="80" w:type="dxa"/>
-              <w:start w:w="120" w:type="dxa"/>
-              <w:bottom w:w="80" w:type="dxa"/>
-              <w:end w:w="120" w:type="dxa"/>
-            </w:tcMar>
-            <w:vAlign w:val="center"/>
-          </w:tcPr>
-          <w:p>
-            <w:pPr>
-              <w:spacing w:before="0" w:after="0" w:line="240" w:lineRule="auto"/>
-              <w:jc w:val="left"/>
-            </w:pPr>
-            <w:r>
-              <w:rPr>
-                <w:rFonts w:ascii="맑은 고딕" w:hAnsi="맑은 고딕" w:eastAsia="맑은 고딕" w:cs="맑은 고딕"/>
-                <w:sz w:val="16"/>
-              </w:rPr>
-              <w:t>복구 UAC 취소 여부 → rollback 슬롯 보존 → 관리자 재시도</w:t>
-            </w:r>
-          </w:p>
-        </w:tc>
-      </w:tr>
-      <w:tr>
-        <w:tc>
-          <w:tcPr>
-            <w:tcW w:type="dxa" w:w="4300"/>
-            <w:shd w:fill="FAFBFC"/>
-            <w:tcMar>
-              <w:top w:w="80" w:type="dxa"/>
-              <w:start w:w="120" w:type="dxa"/>
-              <w:bottom w:w="80" w:type="dxa"/>
-              <w:end w:w="120" w:type="dxa"/>
-            </w:tcMar>
-            <w:vAlign w:val="center"/>
-          </w:tcPr>
-          <w:p>
-            <w:pPr>
-              <w:spacing w:before="0" w:after="0" w:line="240" w:lineRule="auto"/>
-              <w:jc w:val="left"/>
-            </w:pPr>
-            <w:r>
-              <w:rPr>
-                <w:rFonts w:ascii="맑은 고딕" w:hAnsi="맑은 고딕" w:eastAsia="맑은 고딕" w:cs="맑은 고딕"/>
-                <w:sz w:val="16"/>
-              </w:rPr>
-              <w:t>VIEWER_SHORTCUT_DIRECTORY_UNAVAILABLE</w:t>
-            </w:r>
-          </w:p>
-        </w:tc>
-        <w:tc>
-          <w:tcPr>
-            <w:tcW w:type="dxa" w:w="5060"/>
-            <w:shd w:fill="FAFBFC"/>
-            <w:tcMar>
-              <w:top w:w="80" w:type="dxa"/>
-              <w:start w:w="120" w:type="dxa"/>
-              <w:bottom w:w="80" w:type="dxa"/>
-              <w:end w:w="120" w:type="dxa"/>
-            </w:tcMar>
-            <w:vAlign w:val="center"/>
-          </w:tcPr>
-          <w:p>
-            <w:pPr>
-              <w:spacing w:before="0" w:after="0" w:line="240" w:lineRule="auto"/>
-              <w:jc w:val="left"/>
-            </w:pPr>
-            <w:r>
-              <w:rPr>
-                <w:rFonts w:ascii="맑은 고딕" w:hAnsi="맑은 고딕" w:eastAsia="맑은 고딕" w:cs="맑은 고딕"/>
-                <w:sz w:val="16"/>
-              </w:rPr>
-              <w:t>Viewer를 설치할 동일 Windows 사용자 → 시작 메뉴·시작프로그램 폴더 쓰기 권한 → 보안 정책</w:t>
-            </w:r>
-          </w:p>
-        </w:tc>
-      </w:tr>
-      <w:tr>
-        <w:tc>
-          <w:tcPr>
-            <w:tcW w:type="dxa" w:w="4300"/>
-            <w:tcMar>
-              <w:top w:w="80" w:type="dxa"/>
-              <w:start w:w="120" w:type="dxa"/>
-              <w:bottom w:w="80" w:type="dxa"/>
-              <w:end w:w="120" w:type="dxa"/>
-            </w:tcMar>
-            <w:vAlign w:val="center"/>
-          </w:tcPr>
-          <w:p>
-            <w:pPr>
-              <w:spacing w:before="0" w:after="0" w:line="240" w:lineRule="auto"/>
-              <w:jc w:val="left"/>
-            </w:pPr>
-            <w:r>
-              <w:rPr>
-                <w:rFonts w:ascii="맑은 고딕" w:hAnsi="맑은 고딕" w:eastAsia="맑은 고딕" w:cs="맑은 고딕"/>
-                <w:sz w:val="16"/>
-              </w:rPr>
-              <w:t>VIEWER_SHORTCUT_SETUP_FAILED</w:t>
-            </w:r>
-          </w:p>
-        </w:tc>
-        <w:tc>
-          <w:tcPr>
-            <w:tcW w:type="dxa" w:w="5060"/>
-            <w:tcMar>
-              <w:top w:w="80" w:type="dxa"/>
-              <w:start w:w="120" w:type="dxa"/>
-              <w:bottom w:w="80" w:type="dxa"/>
-              <w:end w:w="120" w:type="dxa"/>
-            </w:tcMar>
-            <w:vAlign w:val="center"/>
-          </w:tcPr>
-          <w:p>
-            <w:pPr>
-              <w:spacing w:before="0" w:after="0" w:line="240" w:lineRule="auto"/>
-              <w:jc w:val="left"/>
-            </w:pPr>
-            <w:r>
-              <w:rPr>
-                <w:rFonts w:ascii="맑은 고딕" w:hAnsi="맑은 고딕" w:eastAsia="맑은 고딕" w:cs="맑은 고딕"/>
-                <w:sz w:val="16"/>
-              </w:rPr>
-              <w:t>Recovery 결과 → 바로 가기 생성 권한 → 보안 프로그램 차단</w:t>
-            </w:r>
-          </w:p>
-        </w:tc>
-      </w:tr>
-      <w:tr>
-        <w:tc>
-          <w:tcPr>
-            <w:tcW w:type="dxa" w:w="4300"/>
-            <w:shd w:fill="FAFBFC"/>
-            <w:tcMar>
-              <w:top w:w="80" w:type="dxa"/>
-              <w:start w:w="120" w:type="dxa"/>
-              <w:bottom w:w="80" w:type="dxa"/>
-              <w:end w:w="120" w:type="dxa"/>
-            </w:tcMar>
-            <w:vAlign w:val="center"/>
-          </w:tcPr>
-          <w:p>
-            <w:pPr>
-              <w:spacing w:before="0" w:after="0" w:line="240" w:lineRule="auto"/>
-              <w:jc w:val="left"/>
-            </w:pPr>
-            <w:r>
-              <w:rPr>
-                <w:rFonts w:ascii="맑은 고딕" w:hAnsi="맑은 고딕" w:eastAsia="맑은 고딕" w:cs="맑은 고딕"/>
-                <w:sz w:val="16"/>
-              </w:rPr>
-              <w:t>VIEWER_SMOKE_CHECK_FAILED</w:t>
-            </w:r>
-          </w:p>
-        </w:tc>
-        <w:tc>
-          <w:tcPr>
-            <w:tcW w:type="dxa" w:w="5060"/>
-            <w:shd w:fill="FAFBFC"/>
-            <w:tcMar>
-              <w:top w:w="80" w:type="dxa"/>
-              <w:start w:w="120" w:type="dxa"/>
-              <w:bottom w:w="80" w:type="dxa"/>
-              <w:end w:w="120" w:type="dxa"/>
-            </w:tcMar>
-            <w:vAlign w:val="center"/>
-          </w:tcPr>
-          <w:p>
-            <w:pPr>
-              <w:spacing w:before="0" w:after="0" w:line="240" w:lineRule="auto"/>
-              <w:jc w:val="left"/>
-            </w:pPr>
-            <w:r>
-              <w:rPr>
-                <w:rFonts w:ascii="맑은 고딕" w:hAnsi="맑은 고딕" w:eastAsia="맑은 고딕" w:cs="맑은 고딕"/>
-                <w:sz w:val="16"/>
-              </w:rPr>
-              <w:t>Detail·ExitCode → 기존 Viewer 복구 → 설치 journal·Viewer 진단 로그 → 보안 프로그램</w:t>
-            </w:r>
-          </w:p>
-        </w:tc>
-      </w:tr>
-      <w:tr>
-        <w:tc>
-          <w:tcPr>
-            <w:tcW w:type="dxa" w:w="4300"/>
-            <w:tcMar>
-              <w:top w:w="80" w:type="dxa"/>
-              <w:start w:w="120" w:type="dxa"/>
-              <w:bottom w:w="80" w:type="dxa"/>
-              <w:end w:w="120" w:type="dxa"/>
-            </w:tcMar>
-            <w:vAlign w:val="center"/>
-          </w:tcPr>
-          <w:p>
-            <w:pPr>
-              <w:spacing w:before="0" w:after="0" w:line="240" w:lineRule="auto"/>
-              <w:jc w:val="left"/>
-            </w:pPr>
-            <w:r>
-              <w:rPr>
-                <w:rFonts w:ascii="맑은 고딕" w:hAnsi="맑은 고딕" w:eastAsia="맑은 고딕" w:cs="맑은 고딕"/>
-                <w:sz w:val="16"/>
-              </w:rPr>
-              <w:t>VIEWER_PACKAGE_FILE_MISSING</w:t>
-            </w:r>
-          </w:p>
-        </w:tc>
-        <w:tc>
-          <w:tcPr>
-            <w:tcW w:type="dxa" w:w="5060"/>
-            <w:tcMar>
-              <w:top w:w="80" w:type="dxa"/>
-              <w:start w:w="120" w:type="dxa"/>
-              <w:bottom w:w="80" w:type="dxa"/>
-              <w:end w:w="120" w:type="dxa"/>
-            </w:tcMar>
-            <w:vAlign w:val="center"/>
-          </w:tcPr>
-          <w:p>
-            <w:pPr>
-              <w:spacing w:before="0" w:after="0" w:line="240" w:lineRule="auto"/>
-              <w:jc w:val="left"/>
-            </w:pPr>
-            <w:r>
-              <w:rPr>
-                <w:rFonts w:ascii="맑은 고딕" w:hAnsi="맑은 고딕" w:eastAsia="맑은 고딕" w:cs="맑은 고딕"/>
-                <w:sz w:val="16"/>
-              </w:rPr>
-              <w:t>공식 ZIP을 새 폴더에 다시 압축 해제 → EDR 격리 기록 확인</w:t>
-            </w:r>
-          </w:p>
-        </w:tc>
-      </w:tr>
-      <w:tr>
-        <w:tc>
-          <w:tcPr>
-            <w:tcW w:type="dxa" w:w="4300"/>
-            <w:shd w:fill="FAFBFC"/>
-            <w:tcMar>
-              <w:top w:w="80" w:type="dxa"/>
-              <w:start w:w="120" w:type="dxa"/>
-              <w:bottom w:w="80" w:type="dxa"/>
-              <w:end w:w="120" w:type="dxa"/>
-            </w:tcMar>
-            <w:vAlign w:val="center"/>
-          </w:tcPr>
-          <w:p>
-            <w:pPr>
-              <w:spacing w:before="0" w:after="0" w:line="240" w:lineRule="auto"/>
-              <w:jc w:val="left"/>
-            </w:pPr>
-            <w:r>
-              <w:rPr>
-                <w:rFonts w:ascii="맑은 고딕" w:hAnsi="맑은 고딕" w:eastAsia="맑은 고딕" w:cs="맑은 고딕"/>
-                <w:sz w:val="16"/>
-              </w:rPr>
-              <w:t>VIEWER_PACKAGE_HASH_MISMATCH</w:t>
-            </w:r>
-          </w:p>
-        </w:tc>
-        <w:tc>
-          <w:tcPr>
-            <w:tcW w:type="dxa" w:w="5060"/>
-            <w:shd w:fill="FAFBFC"/>
-            <w:tcMar>
-              <w:top w:w="80" w:type="dxa"/>
-              <w:start w:w="120" w:type="dxa"/>
-              <w:bottom w:w="80" w:type="dxa"/>
-              <w:end w:w="120" w:type="dxa"/>
-            </w:tcMar>
-            <w:vAlign w:val="center"/>
-          </w:tcPr>
-          <w:p>
-            <w:pPr>
-              <w:spacing w:before="0" w:after="0" w:line="240" w:lineRule="auto"/>
-              <w:jc w:val="left"/>
-            </w:pPr>
-            <w:r>
-              <w:rPr>
-                <w:rFonts w:ascii="맑은 고딕" w:hAnsi="맑은 고딕" w:eastAsia="맑은 고딕" w:cs="맑은 고딕"/>
-                <w:sz w:val="16"/>
-              </w:rPr>
-              <w:t>변조 파일 실행 중지 → 공식 ZIP·매니페스트와 보안 프로그램 기록 확인</w:t>
-            </w:r>
-          </w:p>
-        </w:tc>
-      </w:tr>
-      <w:tr>
-        <w:tc>
-          <w:tcPr>
-            <w:tcW w:type="dxa" w:w="4300"/>
-            <w:tcMar>
-              <w:top w:w="80" w:type="dxa"/>
-              <w:start w:w="120" w:type="dxa"/>
-              <w:bottom w:w="80" w:type="dxa"/>
-              <w:end w:w="120" w:type="dxa"/>
-            </w:tcMar>
-            <w:vAlign w:val="center"/>
-          </w:tcPr>
-          <w:p>
-            <w:pPr>
-              <w:spacing w:before="0" w:after="0" w:line="240" w:lineRule="auto"/>
-              <w:jc w:val="left"/>
-            </w:pPr>
-            <w:r>
-              <w:rPr>
-                <w:rFonts w:ascii="맑은 고딕" w:hAnsi="맑은 고딕" w:eastAsia="맑은 고딕" w:cs="맑은 고딕"/>
-                <w:sz w:val="16"/>
-              </w:rPr>
-              <w:t>VIEWER_UNSUPPORTED_ARCHITECTURE</w:t>
-            </w:r>
-          </w:p>
-        </w:tc>
-        <w:tc>
-          <w:tcPr>
-            <w:tcW w:type="dxa" w:w="5060"/>
-            <w:tcMar>
-              <w:top w:w="80" w:type="dxa"/>
-              <w:start w:w="120" w:type="dxa"/>
-              <w:bottom w:w="80" w:type="dxa"/>
-              <w:end w:w="120" w:type="dxa"/>
-            </w:tcMar>
-            <w:vAlign w:val="center"/>
-          </w:tcPr>
-          <w:p>
-            <w:pPr>
-              <w:spacing w:before="0" w:after="0" w:line="240" w:lineRule="auto"/>
-              <w:jc w:val="left"/>
-            </w:pPr>
-            <w:r>
-              <w:rPr>
-                <w:rFonts w:ascii="맑은 고딕" w:hAnsi="맑은 고딕" w:eastAsia="맑은 고딕" w:cs="맑은 고딕"/>
-                <w:sz w:val="16"/>
-              </w:rPr>
-              <w:t>64비트 Windows PC에서 win-x64 Viewer 설치</w:t>
-            </w:r>
-          </w:p>
-        </w:tc>
-      </w:tr>
-      <w:tr>
-        <w:tc>
-          <w:tcPr>
-            <w:tcW w:type="dxa" w:w="4300"/>
-            <w:shd w:fill="FAFBFC"/>
-            <w:tcMar>
-              <w:top w:w="80" w:type="dxa"/>
-              <w:start w:w="120" w:type="dxa"/>
-              <w:bottom w:w="80" w:type="dxa"/>
-              <w:end w:w="120" w:type="dxa"/>
-            </w:tcMar>
-            <w:vAlign w:val="center"/>
-          </w:tcPr>
-          <w:p>
-            <w:pPr>
-              <w:spacing w:before="0" w:after="0" w:line="240" w:lineRule="auto"/>
-              <w:jc w:val="left"/>
-            </w:pPr>
-            <w:r>
-              <w:rPr>
-                <w:rFonts w:ascii="맑은 고딕" w:hAnsi="맑은 고딕" w:eastAsia="맑은 고딕" w:cs="맑은 고딕"/>
-                <w:sz w:val="16"/>
-              </w:rPr>
-              <w:t>VIEWER_SELF_CHECK_START_FAILED</w:t>
-            </w:r>
-          </w:p>
-        </w:tc>
-        <w:tc>
-          <w:tcPr>
-            <w:tcW w:type="dxa" w:w="5060"/>
-            <w:shd w:fill="FAFBFC"/>
-            <w:tcMar>
-              <w:top w:w="80" w:type="dxa"/>
-              <w:start w:w="120" w:type="dxa"/>
-              <w:bottom w:w="80" w:type="dxa"/>
-              <w:end w:w="120" w:type="dxa"/>
-            </w:tcMar>
-            <w:vAlign w:val="center"/>
-          </w:tcPr>
-          <w:p>
-            <w:pPr>
-              <w:spacing w:before="0" w:after="0" w:line="240" w:lineRule="auto"/>
-              <w:jc w:val="left"/>
-            </w:pPr>
-            <w:r>
-              <w:rPr>
-                <w:rFonts w:ascii="맑은 고딕" w:hAnsi="맑은 고딕" w:eastAsia="맑은 고딕" w:cs="맑은 고딕"/>
-                <w:sz w:val="16"/>
-              </w:rPr>
-              <w:t>Windows x64 → AppLocker·WDAC·EDR 실행 차단 확인</w:t>
-            </w:r>
-          </w:p>
-        </w:tc>
-      </w:tr>
-      <w:tr>
-        <w:tc>
-          <w:tcPr>
-            <w:tcW w:type="dxa" w:w="4300"/>
-            <w:tcMar>
-              <w:top w:w="80" w:type="dxa"/>
-              <w:start w:w="120" w:type="dxa"/>
-              <w:bottom w:w="80" w:type="dxa"/>
-              <w:end w:w="120" w:type="dxa"/>
-            </w:tcMar>
-            <w:vAlign w:val="center"/>
-          </w:tcPr>
-          <w:p>
-            <w:pPr>
-              <w:spacing w:before="0" w:after="0" w:line="240" w:lineRule="auto"/>
-              <w:jc w:val="left"/>
-            </w:pPr>
-            <w:r>
-              <w:rPr>
-                <w:rFonts w:ascii="맑은 고딕" w:hAnsi="맑은 고딕" w:eastAsia="맑은 고딕" w:cs="맑은 고딕"/>
-                <w:sz w:val="16"/>
-              </w:rPr>
-              <w:t>VIEWER_SELF_CHECK_WAIT_FAILED</w:t>
-            </w:r>
-          </w:p>
-        </w:tc>
-        <w:tc>
-          <w:tcPr>
-            <w:tcW w:type="dxa" w:w="5060"/>
-            <w:tcMar>
-              <w:top w:w="80" w:type="dxa"/>
-              <w:start w:w="120" w:type="dxa"/>
-              <w:bottom w:w="80" w:type="dxa"/>
-              <w:end w:w="120" w:type="dxa"/>
-            </w:tcMar>
-            <w:vAlign w:val="center"/>
-          </w:tcPr>
-          <w:p>
-            <w:pPr>
-              <w:spacing w:before="0" w:after="0" w:line="240" w:lineRule="auto"/>
-              <w:jc w:val="left"/>
-            </w:pPr>
-            <w:r>
-              <w:rPr>
-                <w:rFonts w:ascii="맑은 고딕" w:hAnsi="맑은 고딕" w:eastAsia="맑은 고딕" w:cs="맑은 고딕"/>
-                <w:sz w:val="16"/>
-              </w:rPr>
-              <w:t>설치 journal → Windows Application 로그 → 다시 설치</w:t>
-            </w:r>
-          </w:p>
-        </w:tc>
-      </w:tr>
-      <w:tr>
-        <w:tc>
-          <w:tcPr>
-            <w:tcW w:type="dxa" w:w="4300"/>
-            <w:shd w:fill="FAFBFC"/>
-            <w:tcMar>
-              <w:top w:w="80" w:type="dxa"/>
-              <w:start w:w="120" w:type="dxa"/>
-              <w:bottom w:w="80" w:type="dxa"/>
-              <w:end w:w="120" w:type="dxa"/>
-            </w:tcMar>
-            <w:vAlign w:val="center"/>
-          </w:tcPr>
-          <w:p>
-            <w:pPr>
-              <w:spacing w:before="0" w:after="0" w:line="240" w:lineRule="auto"/>
-              <w:jc w:val="left"/>
-            </w:pPr>
-            <w:r>
-              <w:rPr>
-                <w:rFonts w:ascii="맑은 고딕" w:hAnsi="맑은 고딕" w:eastAsia="맑은 고딕" w:cs="맑은 고딕"/>
-                <w:sz w:val="16"/>
-              </w:rPr>
-              <w:t>VIEWER_SELF_CHECK_EXITED_NONZERO</w:t>
-            </w:r>
-          </w:p>
-        </w:tc>
-        <w:tc>
-          <w:tcPr>
-            <w:tcW w:type="dxa" w:w="5060"/>
-            <w:shd w:fill="FAFBFC"/>
-            <w:tcMar>
-              <w:top w:w="80" w:type="dxa"/>
-              <w:start w:w="120" w:type="dxa"/>
-              <w:bottom w:w="80" w:type="dxa"/>
-              <w:end w:w="120" w:type="dxa"/>
-            </w:tcMar>
-            <w:vAlign w:val="center"/>
-          </w:tcPr>
-          <w:p>
-            <w:pPr>
-              <w:spacing w:before="0" w:after="0" w:line="240" w:lineRule="auto"/>
-              <w:jc w:val="left"/>
-            </w:pPr>
-            <w:r>
-              <w:rPr>
-                <w:rFonts w:ascii="맑은 고딕" w:hAnsi="맑은 고딕" w:eastAsia="맑은 고딕" w:cs="맑은 고딕"/>
-                <w:sz w:val="16"/>
-              </w:rPr>
-              <w:t>표시된 ExitCode → Windows Application 로그·EDR 기록 확인</w:t>
-            </w:r>
-          </w:p>
-        </w:tc>
-      </w:tr>
-      <w:tr>
-        <w:tc>
-          <w:tcPr>
-            <w:tcW w:type="dxa" w:w="4300"/>
-            <w:tcMar>
-              <w:top w:w="80" w:type="dxa"/>
-              <w:start w:w="120" w:type="dxa"/>
-              <w:bottom w:w="80" w:type="dxa"/>
-              <w:end w:w="120" w:type="dxa"/>
-            </w:tcMar>
-            <w:vAlign w:val="center"/>
-          </w:tcPr>
-          <w:p>
-            <w:pPr>
-              <w:spacing w:before="0" w:after="0" w:line="240" w:lineRule="auto"/>
-              <w:jc w:val="left"/>
-            </w:pPr>
-            <w:r>
-              <w:rPr>
-                <w:rFonts w:ascii="맑은 고딕" w:hAnsi="맑은 고딕" w:eastAsia="맑은 고딕" w:cs="맑은 고딕"/>
-                <w:sz w:val="16"/>
-              </w:rPr>
-              <w:t>VIEWER_SELF_CHECK_ACCESS_DENIED</w:t>
-            </w:r>
-          </w:p>
-        </w:tc>
-        <w:tc>
-          <w:tcPr>
-            <w:tcW w:type="dxa" w:w="5060"/>
-            <w:tcMar>
-              <w:top w:w="80" w:type="dxa"/>
-              <w:start w:w="120" w:type="dxa"/>
-              <w:bottom w:w="80" w:type="dxa"/>
-              <w:end w:w="120" w:type="dxa"/>
-            </w:tcMar>
-            <w:vAlign w:val="center"/>
-          </w:tcPr>
-          <w:p>
-            <w:pPr>
-              <w:spacing w:before="0" w:after="0" w:line="240" w:lineRule="auto"/>
-              <w:jc w:val="left"/>
-            </w:pPr>
-            <w:r>
-              <w:rPr>
-                <w:rFonts w:ascii="맑은 고딕" w:hAnsi="맑은 고딕" w:eastAsia="맑은 고딕" w:cs="맑은 고딕"/>
-                <w:sz w:val="16"/>
-              </w:rPr>
-              <w:t>Program Files 실행 권한 → EDR·AppLocker·WDAC 기록 확인</w:t>
-            </w:r>
-          </w:p>
-        </w:tc>
-      </w:tr>
-      <w:tr>
-        <w:tc>
-          <w:tcPr>
-            <w:tcW w:type="dxa" w:w="4300"/>
-            <w:shd w:fill="FAFBFC"/>
-            <w:tcMar>
-              <w:top w:w="80" w:type="dxa"/>
-              <w:start w:w="120" w:type="dxa"/>
-              <w:bottom w:w="80" w:type="dxa"/>
-              <w:end w:w="120" w:type="dxa"/>
-            </w:tcMar>
-            <w:vAlign w:val="center"/>
-          </w:tcPr>
-          <w:p>
-            <w:pPr>
-              <w:spacing w:before="0" w:after="0" w:line="240" w:lineRule="auto"/>
-              <w:jc w:val="left"/>
-            </w:pPr>
-            <w:r>
-              <w:rPr>
-                <w:rFonts w:ascii="맑은 고딕" w:hAnsi="맑은 고딕" w:eastAsia="맑은 고딕" w:cs="맑은 고딕"/>
-                <w:sz w:val="16"/>
-              </w:rPr>
-              <w:t>FILE_MISSING</w:t>
-            </w:r>
-          </w:p>
-        </w:tc>
-        <w:tc>
-          <w:tcPr>
-            <w:tcW w:type="dxa" w:w="5060"/>
-            <w:shd w:fill="FAFBFC"/>
-            <w:tcMar>
-              <w:top w:w="80" w:type="dxa"/>
-              <w:start w:w="120" w:type="dxa"/>
-              <w:bottom w:w="80" w:type="dxa"/>
-              <w:end w:w="120" w:type="dxa"/>
-            </w:tcMar>
-            <w:vAlign w:val="center"/>
-          </w:tcPr>
-          <w:p>
-            <w:pPr>
-              <w:spacing w:before="0" w:after="0" w:line="240" w:lineRule="auto"/>
-              <w:jc w:val="left"/>
-            </w:pPr>
-            <w:r>
-              <w:rPr>
-                <w:rFonts w:ascii="맑은 고딕" w:hAnsi="맑은 고딕" w:eastAsia="맑은 고딕" w:cs="맑은 고딕"/>
-                <w:sz w:val="16"/>
-              </w:rPr>
-              <w:t>설치 파일 누락 또는 EDR 격리 기록 확인</w:t>
-            </w:r>
-          </w:p>
-        </w:tc>
-      </w:tr>
-      <w:tr>
-        <w:tc>
-          <w:tcPr>
-            <w:tcW w:type="dxa" w:w="4300"/>
-            <w:tcMar>
-              <w:top w:w="80" w:type="dxa"/>
-              <w:start w:w="120" w:type="dxa"/>
-              <w:bottom w:w="80" w:type="dxa"/>
-              <w:end w:w="120" w:type="dxa"/>
-            </w:tcMar>
-            <w:vAlign w:val="center"/>
-          </w:tcPr>
-          <w:p>
-            <w:pPr>
-              <w:spacing w:before="0" w:after="0" w:line="240" w:lineRule="auto"/>
-              <w:jc w:val="left"/>
-            </w:pPr>
-            <w:r>
-              <w:rPr>
-                <w:rFonts w:ascii="맑은 고딕" w:hAnsi="맑은 고딕" w:eastAsia="맑은 고딕" w:cs="맑은 고딕"/>
-                <w:sz w:val="16"/>
-              </w:rPr>
-              <w:t>BAD_IMAGE</w:t>
-            </w:r>
-          </w:p>
-        </w:tc>
-        <w:tc>
-          <w:tcPr>
-            <w:tcW w:type="dxa" w:w="5060"/>
-            <w:tcMar>
-              <w:top w:w="80" w:type="dxa"/>
-              <w:start w:w="120" w:type="dxa"/>
-              <w:bottom w:w="80" w:type="dxa"/>
-              <w:end w:w="120" w:type="dxa"/>
-            </w:tcMar>
-            <w:vAlign w:val="center"/>
-          </w:tcPr>
-          <w:p>
-            <w:pPr>
-              <w:spacing w:before="0" w:after="0" w:line="240" w:lineRule="auto"/>
-              <w:jc w:val="left"/>
-            </w:pPr>
-            <w:r>
-              <w:rPr>
-                <w:rFonts w:ascii="맑은 고딕" w:hAnsi="맑은 고딕" w:eastAsia="맑은 고딕" w:cs="맑은 고딕"/>
-                <w:sz w:val="16"/>
-              </w:rPr>
-              <w:t>Windows x64 → 파일 손상·격리와 실행 파일 형식 확인</w:t>
-            </w:r>
-          </w:p>
-        </w:tc>
-      </w:tr>
-      <w:tr>
-        <w:tc>
-          <w:tcPr>
-            <w:tcW w:type="dxa" w:w="4300"/>
-            <w:shd w:fill="FAFBFC"/>
-            <w:tcMar>
-              <w:top w:w="80" w:type="dxa"/>
-              <w:start w:w="120" w:type="dxa"/>
-              <w:bottom w:w="80" w:type="dxa"/>
-              <w:end w:w="120" w:type="dxa"/>
-            </w:tcMar>
-            <w:vAlign w:val="center"/>
-          </w:tcPr>
-          <w:p>
-            <w:pPr>
-              <w:spacing w:before="0" w:after="0" w:line="240" w:lineRule="auto"/>
-              <w:jc w:val="left"/>
-            </w:pPr>
-            <w:r>
-              <w:rPr>
-                <w:rFonts w:ascii="맑은 고딕" w:hAnsi="맑은 고딕" w:eastAsia="맑은 고딕" w:cs="맑은 고딕"/>
-                <w:sz w:val="16"/>
-              </w:rPr>
-              <w:t>TIMEOUT</w:t>
-            </w:r>
-          </w:p>
-        </w:tc>
-        <w:tc>
-          <w:tcPr>
-            <w:tcW w:type="dxa" w:w="5060"/>
-            <w:shd w:fill="FAFBFC"/>
-            <w:tcMar>
-              <w:top w:w="80" w:type="dxa"/>
-              <w:start w:w="120" w:type="dxa"/>
-              <w:bottom w:w="80" w:type="dxa"/>
-              <w:end w:w="120" w:type="dxa"/>
-            </w:tcMar>
-            <w:vAlign w:val="center"/>
-          </w:tcPr>
-          <w:p>
-            <w:pPr>
-              <w:spacing w:before="0" w:after="0" w:line="240" w:lineRule="auto"/>
-              <w:jc w:val="left"/>
-            </w:pPr>
-            <w:r>
-              <w:rPr>
-                <w:rFonts w:ascii="맑은 고딕" w:hAnsi="맑은 고딕" w:eastAsia="맑은 고딕" w:cs="맑은 고딕"/>
-                <w:sz w:val="16"/>
-              </w:rPr>
-              <w:t>20초 자체점검 제한 → 남은 프로세스·보안 프로그램 지연 확인</w:t>
-            </w:r>
-          </w:p>
-        </w:tc>
-      </w:tr>
-      <w:tr>
-        <w:tc>
-          <w:tcPr>
-            <w:tcW w:type="dxa" w:w="4300"/>
-            <w:tcMar>
-              <w:top w:w="80" w:type="dxa"/>
-              <w:start w:w="120" w:type="dxa"/>
-              <w:bottom w:w="80" w:type="dxa"/>
-              <w:end w:w="120" w:type="dxa"/>
-            </w:tcMar>
-            <w:vAlign w:val="center"/>
-          </w:tcPr>
-          <w:p>
-            <w:pPr>
-              <w:spacing w:before="0" w:after="0" w:line="240" w:lineRule="auto"/>
-              <w:jc w:val="left"/>
-            </w:pPr>
-            <w:r>
-              <w:rPr>
-                <w:rFonts w:ascii="맑은 고딕" w:hAnsi="맑은 고딕" w:eastAsia="맑은 고딕" w:cs="맑은 고딕"/>
-                <w:sz w:val="16"/>
-              </w:rPr>
-              <w:t>VIEWER_UNINSTALL_ROLLBACK_PRESERVED</w:t>
-            </w:r>
-          </w:p>
-        </w:tc>
-        <w:tc>
-          <w:tcPr>
-            <w:tcW w:type="dxa" w:w="5060"/>
-            <w:tcMar>
-              <w:top w:w="80" w:type="dxa"/>
-              <w:start w:w="120" w:type="dxa"/>
-              <w:bottom w:w="80" w:type="dxa"/>
-              <w:end w:w="120" w:type="dxa"/>
-            </w:tcMar>
-            <w:vAlign w:val="center"/>
-          </w:tcPr>
-          <w:p>
-            <w:pPr>
-              <w:spacing w:before="0" w:after="0" w:line="240" w:lineRule="auto"/>
-              <w:jc w:val="left"/>
-            </w:pPr>
-            <w:r>
-              <w:rPr>
-                <w:rFonts w:ascii="맑은 고딕" w:hAnsi="맑은 고딕" w:eastAsia="맑은 고딕" w:cs="맑은 고딕"/>
-                <w:sz w:val="16"/>
-              </w:rPr>
-              <w:t>Viewer 프로세스·활성 프로그램 폴더 정리 → 관리자 제거 재실행</w:t>
-            </w:r>
-          </w:p>
-        </w:tc>
-      </w:tr>
-      <w:tr>
-        <w:tc>
-          <w:tcPr>
-            <w:tcW w:type="dxa" w:w="4300"/>
-            <w:shd w:fill="FAFBFC"/>
-            <w:tcMar>
-              <w:top w:w="80" w:type="dxa"/>
-              <w:start w:w="120" w:type="dxa"/>
-              <w:bottom w:w="80" w:type="dxa"/>
-              <w:end w:w="120" w:type="dxa"/>
-            </w:tcMar>
-            <w:vAlign w:val="center"/>
-          </w:tcPr>
-          <w:p>
-            <w:pPr>
-              <w:spacing w:before="0" w:after="0" w:line="240" w:lineRule="auto"/>
-              <w:jc w:val="left"/>
-            </w:pPr>
-            <w:r>
-              <w:rPr>
-                <w:rFonts w:ascii="맑은 고딕" w:hAnsi="맑은 고딕" w:eastAsia="맑은 고딕" w:cs="맑은 고딕"/>
-                <w:sz w:val="16"/>
-              </w:rPr>
-              <w:t>VIEWER_UNINSTALL_TRANSACTION_PRESERVED</w:t>
-            </w:r>
-          </w:p>
-        </w:tc>
-        <w:tc>
-          <w:tcPr>
-            <w:tcW w:type="dxa" w:w="5060"/>
-            <w:shd w:fill="FAFBFC"/>
-            <w:tcMar>
-              <w:top w:w="80" w:type="dxa"/>
-              <w:start w:w="120" w:type="dxa"/>
-              <w:bottom w:w="80" w:type="dxa"/>
-              <w:end w:w="120" w:type="dxa"/>
-            </w:tcMar>
-            <w:vAlign w:val="center"/>
-          </w:tcPr>
-          <w:p>
-            <w:pPr>
-              <w:spacing w:before="0" w:after="0" w:line="240" w:lineRule="auto"/>
-              <w:jc w:val="left"/>
-            </w:pPr>
-            <w:r>
-              <w:rPr>
-                <w:rFonts w:ascii="맑은 고딕" w:hAnsi="맑은 고딕" w:eastAsia="맑은 고딕" w:cs="맑은 고딕"/>
-                <w:sz w:val="16"/>
-              </w:rPr>
-              <w:t>활성 프로그램·rollback slot 제거 미확인 → marker 보존 → 관리자 제거 재실행</w:t>
+              <w:t>재실행하지 말고 표시 단계와 보존된 백업을 Windows 관리자에게 전달</w:t>
             </w:r>
           </w:p>
         </w:tc>
@@ -7209,7 +5863,7 @@
                 <w:rFonts w:ascii="맑은 고딕" w:hAnsi="맑은 고딕" w:eastAsia="맑은 고딕" w:cs="맑은 고딕"/>
                 <w:sz w:val="16"/>
               </w:rPr>
-              <w:t>장비 IPv4가 등록된 허용 IP인지 → Agent 허용 IP 설정 도구</w:t>
+              <w:t>장비 IPv4가 Setup에서 선택한 관리망 내부인지 확인</w:t>
             </w:r>
           </w:p>
         </w:tc>
@@ -8199,7 +6853,7 @@
           <w:color w:val="16324F"/>
           <w:sz w:val="21"/>
         </w:rPr>
-        <w:t>AGENT_DIRECTORY_TRUST_INVALID는 작업 journal 오류가 아니라 활성 install/data 트리의 소유권 또는 reparse 검사가 실패했다는 뜻입니다. DataDirectory는 정확히 %ProgramData%\SamsungSwitchWatch만 허용하고 신규 설치의 빈 선점 폴더도 거부합니다. 이전 릴리스의 owner가 현재 실행한 관리자와 다를 때도 fail-closed로 중단될 수 있습니다. 폴더와 설치 이력을 보존한 채 사내 Windows 관리자에게 확인하세요.</w:t>
+        <w:t>SETUP_PATH_INVALID는 활성 install/data 트리의 소유권 또는 junction·symlink 검사가 실패했다는 뜻입니다. DataDirectory는 정확히 %ProgramData%\SamsungSwitchWatch만 허용하고 신규 설치의 빈 선점 폴더도 거부합니다. 폴더와 설치 이력을 보존한 채 사내 Windows 관리자에게 확인하세요.</w:t>
       </w:r>
     </w:p>
     <w:p>
@@ -8224,7 +6878,7 @@
           <w:color w:val="B42318"/>
           <w:sz w:val="21"/>
         </w:rPr>
-        <w:t xml:space="preserve">Agent 중단 기록 보존  </w:t>
+        <w:t xml:space="preserve">자동 복구 실패 시  </w:t>
       </w:r>
       <w:r>
         <w:rPr>
@@ -8232,7 +6886,7 @@
           <w:color w:val="16324F"/>
           <w:sz w:val="21"/>
         </w:rPr>
-        <w:t>%ProgramData%\SamsungSwitchWatch-Operations, .__staging_*, .__backup_*와 legacy 백업은 자동 복구 자료가 아니라 관리자 판단 증거입니다. 작업 기록 루트는 부모부터 Administrators 소유와 SYSTEM·Administrators 전용 ACL로 이관하며, 64KiB를 넘는 journal은 파싱하지 않습니다. 이전 기록이 현재 실행한 관리자와 다른 계정 소유면 자동 이관하지 않습니다. 서비스 중지·삭제나 legacy 이동이 완결되지 않으면 후속 파일 복구를 차단하고 snapshot·archive를 보존합니다. 오류가 표시되면 삭제·이동·이름 변경하지 마세요.</w:t>
+        <w:t>설치 도중 실패하면 Setup이 이전 프로그램·서비스·방화벽 상태를 되돌립니다. SETUP_ROLLBACK_FAILED가 표시되면 남은 .__staging_, .__backup_, .__failed_ 폴더를 삭제·이동·이름 변경하지 말고 표시된 단계와 오류 코드를 사내 Windows 관리자에게 전달하세요.</w:t>
       </w:r>
     </w:p>
     <w:p>
@@ -8251,25 +6905,19 @@
           <w:color w:val="2E74B5"/>
           <w:sz w:val="26"/>
         </w:rPr>
-        <w:t>현장 진단 파일</w:t>
+        <w:t>현장 진단</w:t>
       </w:r>
     </w:p>
     <w:p>
       <w:pPr>
-        <w:pStyle w:val="CodeBlock"/>
-        <w:keepLines/>
-        <w:shd w:fill="F4F6F9"/>
-        <w:pBdr>
-          <w:left w:val="single" w:sz="10" w:space="8" w:color="64748B"/>
-        </w:pBdr>
+        <w:spacing w:before="0" w:after="120" w:line="300" w:lineRule="auto"/>
+        <w:jc w:val="left"/>
       </w:pPr>
       <w:r>
         <w:rPr>
-          <w:rFonts w:ascii="Consolas" w:hAnsi="Consolas" w:eastAsia="Consolas" w:cs="Consolas"/>
-          <w:color w:val="243447"/>
-          <w:sz w:val="17"/>
+          <w:rFonts w:ascii="맑은 고딕" w:hAnsi="맑은 고딕" w:eastAsia="맑은 고딕" w:cs="맑은 고딕"/>
         </w:rPr>
-        <w:t>.\diagnose-agent.ps1 -OutputPath "$env:TEMP\ssw-diagnostic.json"</w:t>
+        <w:t>Agent PC에서는 Agent Setup을 다시 열고 검사를 실행합니다. Viewer에서는 Agent 연결 진단을 실행합니다. 두 화면의 단계와 안정 오류 코드만 기록하고 실제 IP, 계정, 비밀번호와 장비 원문은 외부로 전달하지 않습니다.</w:t>
       </w:r>
     </w:p>
     <w:tbl>
@@ -8453,7 +7101,7 @@
                 <w:rFonts w:ascii="맑은 고딕" w:hAnsi="맑은 고딕" w:eastAsia="맑은 고딕" w:cs="맑은 고딕"/>
                 <w:sz w:val="16"/>
               </w:rPr>
-              <w:t>service.status=Running, listener.status=Listening, firewall.enabled/exact=true, 지원 프로필 포함, health.live=LIVE, health.ready=READY인지 확인합니다.</w:t>
+              <w:t>Agent Setup의 사전 점검에서 패키지, 서비스, 방화벽과 Agent 준비 상태를 확인합니다.</w:t>
             </w:r>
           </w:p>
         </w:tc>
@@ -8505,7 +7153,7 @@
                 <w:rFonts w:ascii="맑은 고딕" w:hAnsi="맑은 고딕" w:eastAsia="맑은 고딕" w:cs="맑은 고딕"/>
                 <w:sz w:val="16"/>
               </w:rPr>
-              <w:t>Test-NetConnection &lt;Agent-PC-주소&gt; -Port 18443을 실행합니다. 실패하면 Viewer PC 허용 IP, Domain/Private 방화벽, 라우팅과 EDR을 확인합니다.</w:t>
+              <w:t>연결 설정의 주소 → DNS/IPv4 → TCP/18443 → HTTPS → Agent API/버전 단계 중 처음 실패한 항목을 확인합니다.</w:t>
             </w:r>
           </w:p>
         </w:tc>
@@ -8607,7 +7255,7 @@
         <w:rPr>
           <w:rFonts w:ascii="맑은 고딕" w:hAnsi="맑은 고딕" w:eastAsia="맑은 고딕" w:cs="맑은 고딕"/>
         </w:rPr>
-        <w:t>Agent PC에서 Install-or-Update-Agent.cmd를 실행합니다. 기존 허용 정책은 기본적으로 보존됩니다.</w:t>
+        <w:t>Agent PC에서 SamsungSwitchWatch.Agent.Setup.exe를 실행합니다. 기존 신원과 유효한 정책은 보존됩니다.</w:t>
       </w:r>
     </w:p>
     <w:p>
@@ -8621,7 +7269,7 @@
         <w:rPr>
           <w:rFonts w:ascii="맑은 고딕" w:hAnsi="맑은 고딕" w:eastAsia="맑은 고딕" w:cs="맑은 고딕"/>
         </w:rPr>
-        <w:t>Viewer PC에서 새 Viewer 패키지의 Install-or-Update-Viewer.cmd를 실행합니다.</w:t>
+        <w:t>Viewer PC에서 새 Viewer 패키지의 SamsungSwitchWatch.Viewer.exe를 직접 실행합니다.</w:t>
       </w:r>
     </w:p>
     <w:p>
@@ -8659,52 +7307,14 @@
     </w:p>
     <w:p>
       <w:pPr>
-        <w:pStyle w:val="CodeBlock"/>
-        <w:keepLines/>
-        <w:shd w:fill="F4F6F9"/>
-        <w:pBdr>
-          <w:left w:val="single" w:sz="10" w:space="8" w:color="64748B"/>
-        </w:pBdr>
+        <w:spacing w:before="0" w:after="120" w:line="300" w:lineRule="auto"/>
+        <w:jc w:val="left"/>
       </w:pPr>
       <w:r>
         <w:rPr>
-          <w:rFonts w:ascii="Consolas" w:hAnsi="Consolas" w:eastAsia="Consolas" w:cs="Consolas"/>
-          <w:color w:val="243447"/>
-          <w:sz w:val="17"/>
+          <w:rFonts w:ascii="맑은 고딕" w:hAnsi="맑은 고딕" w:eastAsia="맑은 고딕" w:cs="맑은 고딕"/>
         </w:rPr>
-        <w:t>.\uninstall-agent.ps1</w:t>
-      </w:r>
-      <w:r>
-        <w:br/>
-      </w:r>
-      <w:r>
-        <w:rPr>
-          <w:rFonts w:ascii="Consolas" w:hAnsi="Consolas" w:eastAsia="Consolas" w:cs="Consolas"/>
-          <w:color w:val="243447"/>
-          <w:sz w:val="17"/>
-        </w:rPr>
-      </w:r>
-      <w:r>
-        <w:br/>
-      </w:r>
-      <w:r>
-        <w:rPr>
-          <w:rFonts w:ascii="Consolas" w:hAnsi="Consolas" w:eastAsia="Consolas" w:cs="Consolas"/>
-          <w:color w:val="243447"/>
-          <w:sz w:val="17"/>
-        </w:rPr>
-        <w:t># HTTPS 신원과 설치 데이터를 영구 삭제할 때만</w:t>
-      </w:r>
-      <w:r>
-        <w:br/>
-      </w:r>
-      <w:r>
-        <w:rPr>
-          <w:rFonts w:ascii="Consolas" w:hAnsi="Consolas" w:eastAsia="Consolas" w:cs="Consolas"/>
-          <w:color w:val="243447"/>
-          <w:sz w:val="17"/>
-        </w:rPr>
-        <w:t>.\uninstall-agent.ps1 -RemoveData</w:t>
+        <w:t>서비스와 방화벽을 변경하므로 Agent 제거는 사내 Windows 관리자가 승인된 관리 절차로 수행합니다. 공개 패키지에는 제거 스크립트를 포함하지 않습니다. HTTPS 신원과 %ProgramData% 데이터의 영구 삭제는 Viewer의 신원 변경 경고를 발생시키므로 별도 승인 없이 삭제하지 않습니다.</w:t>
       </w:r>
     </w:p>
     <w:p>
@@ -8732,7 +7342,7 @@
           <w:color w:val="16324F"/>
           <w:sz w:val="21"/>
         </w:rPr>
-        <w:t>-RemoveData를 사용하면 Agent HTTPS 신원이 복구되지 않습니다. 이후 Viewer에서 신원 변경 경고가 발생합니다.</w:t>
+        <w:t>Agent HTTPS 신원과 설치 데이터를 삭제하면 복구할 수 없고 이후 Viewer에서 신원 변경 경고가 발생합니다.</w:t>
       </w:r>
     </w:p>
     <w:p>
@@ -8846,7 +7456,7 @@
         <w:color w:val="64748B"/>
         <w:sz w:val="17"/>
       </w:rPr>
-      <w:t xml:space="preserve">v0.9.23-poc  |  </w:t>
+      <w:t xml:space="preserve">v0.10.0-poc  |  </w:t>
     </w:r>
     <w:r>
       <w:rPr>
@@ -8877,7 +7487,7 @@
         <w:color w:val="64748B"/>
         <w:sz w:val="17"/>
       </w:rPr>
-      <w:t>v0.9.23-poc  |  2026-07-28</w:t>
+      <w:t>v0.10.0-poc  |  2026-07-28</w:t>
     </w:r>
   </w:p>
 </w:ftr>

</xml_diff>

<commit_message>
Native Agent Setup and portable Viewer v0.10 (#34)
* Native Agent Setup and portable Viewer v0.10

* Stabilize WPF smoke test on CI

* Read release contracts as UTF-8
</commit_message>
<xml_diff>
--- a/docs/SamsungSwitchWatch_User_Manual_KO.docx
+++ b/docs/SamsungSwitchWatch_User_Manual_KO.docx
@@ -519,7 +519,7 @@
         <w:rPr>
           <w:rFonts w:ascii="맑은 고딕" w:hAnsi="맑은 고딕" w:eastAsia="맑은 고딕" w:cs="맑은 고딕"/>
         </w:rPr>
-        <w:t>원격 PC에서 Agent ZIP을 풀고 Install-or-Update-Agent.cmd를 실행합니다.</w:t>
+        <w:t>원격 PC에서 Agent ZIP을 풀고 SamsungSwitchWatch.Agent.Setup.exe를 실행한 뒤 UAC를 승인합니다.</w:t>
       </w:r>
     </w:p>
     <w:p>
@@ -533,7 +533,21 @@
         <w:rPr>
           <w:rFonts w:ascii="맑은 고딕" w:hAnsi="맑은 고딕" w:eastAsia="맑은 고딕" w:cs="맑은 고딕"/>
         </w:rPr>
-        <w:t>Viewer PC에서 Viewer ZIP을 풀고 Install-or-Update-Viewer.cmd를 실행한 뒤 UAC를 승인합니다.</w:t>
+        <w:t>고정 Viewer IPv4를 입력하고 자동 검색된 스위치 관리망 1~2개를 선택해 Agent 서비스를 설치합니다.</w:t>
+      </w:r>
+    </w:p>
+    <w:p>
+      <w:pPr>
+        <w:numPr>
+          <w:ilvl w:val="0"/>
+          <w:numId w:val="12"/>
+        </w:numPr>
+      </w:pPr>
+      <w:r>
+        <w:rPr>
+          <w:rFonts w:ascii="맑은 고딕" w:hAnsi="맑은 고딕" w:eastAsia="맑은 고딕" w:cs="맑은 고딕"/>
+        </w:rPr>
+        <w:t>Viewer PC에서 Viewer ZIP을 풀고 SamsungSwitchWatch.Viewer.exe를 직접 실행합니다.</w:t>
       </w:r>
     </w:p>
     <w:p>
@@ -952,7 +966,7 @@
                 <w:rFonts w:ascii="맑은 고딕" w:hAnsi="맑은 고딕" w:eastAsia="맑은 고딕" w:cs="맑은 고딕"/>
                 <w:sz w:val="18"/>
               </w:rPr>
-              <w:t>설치 시 지정한 스위치 관리 IPv4만 기본 허용</w:t>
+              <w:t>설치 시 선택한 관리망만 허용</w:t>
             </w:r>
           </w:p>
         </w:tc>
@@ -1024,7 +1038,7 @@
           <w:rFonts w:ascii="맑은 고딕" w:hAnsi="맑은 고딕" w:eastAsia="맑은 고딕" w:cs="맑은 고딕"/>
           <w:sz w:val="22"/>
         </w:rPr>
-        <w:t>Viewer 프로그램은 Program Files에 설치되지만 일반 사용자 권한으로 실행하며, 현재 Windows 사용자 범위에서만 계정을 복호화합니다.</w:t>
+        <w:t>Viewer는 압축 해제한 폴더에서 포터블로 실행하며, 현재 Windows 사용자 범위에서만 계정을 복호화합니다.</w:t>
       </w:r>
     </w:p>
     <w:p>
@@ -1095,6 +1109,34 @@
     </w:p>
     <w:p>
       <w:pPr>
+        <w:keepLines/>
+        <w:spacing w:before="80" w:after="160" w:line="283" w:lineRule="auto"/>
+        <w:ind w:left="115" w:right="58"/>
+        <w:shd w:fill="FEF2F2"/>
+        <w:pBdr>
+          <w:left w:val="single" w:sz="16" w:space="8" w:color="B42318"/>
+        </w:pBdr>
+      </w:pPr>
+      <w:r>
+        <w:rPr>
+          <w:rFonts w:ascii="맑은 고딕" w:hAnsi="맑은 고딕" w:eastAsia="맑은 고딕" w:cs="맑은 고딕"/>
+          <w:b/>
+          <w:color w:val="B42318"/>
+          <w:sz w:val="21"/>
+        </w:rPr>
+        <w:t xml:space="preserve">반입 파일 확인  </w:t>
+      </w:r>
+      <w:r>
+        <w:rPr>
+          <w:rFonts w:ascii="맑은 고딕" w:hAnsi="맑은 고딕" w:eastAsia="맑은 고딕" w:cs="맑은 고딕"/>
+          <w:color w:val="16324F"/>
+          <w:sz w:val="21"/>
+        </w:rPr>
+        <w:t>0.10.0-poc는 코드 서명되지 않은 시험판입니다. 압축을 풀기 전에 Agent와 Viewer ZIP의 SHA-256을 해당 GitHub Release 본문에 표시된 값과 비교하고 사내 보안 반입 절차를 완료하세요. SmartScreen 또는 EDR 경고를 우회하지 않습니다.</w:t>
+      </w:r>
+    </w:p>
+    <w:p>
+      <w:pPr>
         <w:numPr>
           <w:ilvl w:val="0"/>
           <w:numId w:val="13"/>
@@ -1118,7 +1160,7 @@
         <w:rPr>
           <w:rFonts w:ascii="맑은 고딕" w:hAnsi="맑은 고딕" w:eastAsia="맑은 고딕" w:cs="맑은 고딕"/>
         </w:rPr>
-        <w:t>Install-or-Update-Agent.cmd를 더블클릭하고 UAC 관리자 승인을 합니다.</w:t>
+        <w:t>SamsungSwitchWatch.Agent.Setup.exe를 실행하고 UAC 관리자 승인을 합니다.</w:t>
       </w:r>
     </w:p>
     <w:p>
@@ -1132,7 +1174,7 @@
         <w:rPr>
           <w:rFonts w:ascii="맑은 고딕" w:hAnsi="맑은 고딕" w:eastAsia="맑은 고딕" w:cs="맑은 고딕"/>
         </w:rPr>
-        <w:t>신규 설치에서는 Viewer PC IPv4와 스위치 관리 IPv4를 입력합니다. CIDR 계산은 필요하지 않습니다.</w:t>
+        <w:t>고정 Viewer PC IPv4를 입력하고 자동 검색된 직접 연결 사설 관리망 1~2개를 선택합니다.</w:t>
       </w:r>
     </w:p>
     <w:p>
@@ -1146,7 +1188,56 @@
         <w:rPr>
           <w:rFonts w:ascii="맑은 고딕" w:hAnsi="맑은 고딕" w:eastAsia="맑은 고딕" w:cs="맑은 고딕"/>
         </w:rPr>
-        <w:t>SamsungSwitchWatchAgent 서비스가 실행 중인지 확인합니다.</w:t>
+        <w:t>검사를 실행한 뒤 설치/업데이트를 누르고 SamsungSwitchWatchAgent 서비스가 실행 중인지 확인합니다.</w:t>
+      </w:r>
+    </w:p>
+    <w:p>
+      <w:pPr>
+        <w:keepNext/>
+        <w:spacing w:before="80" w:after="0"/>
+        <w:jc w:val="center"/>
+      </w:pPr>
+      <w:r>
+        <w:drawing>
+          <wp:inline xmlns:a="http://schemas.openxmlformats.org/drawingml/2006/main" xmlns:pic="http://schemas.openxmlformats.org/drawingml/2006/picture">
+            <wp:extent cx="4114800" cy="3789947"/>
+            <wp:docPr id="1" name="Picture 1" title="Agent Setup 화면" descr="고정 Viewer IPv4와 자동 검색된 직접 연결 관리망을 선택하는 Agent Setup 화면"/>
+            <wp:cNvGraphicFramePr>
+              <a:graphicFrameLocks noChangeAspect="1"/>
+            </wp:cNvGraphicFramePr>
+            <a:graphic>
+              <a:graphicData uri="http://schemas.openxmlformats.org/drawingml/2006/picture">
+                <pic:pic>
+                  <pic:nvPicPr>
+                    <pic:cNvPr id="0" name="00-agent-setup.png"/>
+                    <pic:cNvPicPr/>
+                  </pic:nvPicPr>
+                  <pic:blipFill>
+                    <a:blip r:embed="rId13"/>
+                    <a:stretch>
+                      <a:fillRect/>
+                    </a:stretch>
+                  </pic:blipFill>
+                  <pic:spPr>
+                    <a:xfrm>
+                      <a:off x="0" y="0"/>
+                      <a:ext cx="4114800" cy="3789947"/>
+                    </a:xfrm>
+                    <a:prstGeom prst="rect"/>
+                  </pic:spPr>
+                </pic:pic>
+              </a:graphicData>
+            </a:graphic>
+          </wp:inline>
+        </w:drawing>
+      </w:r>
+    </w:p>
+    <w:p>
+      <w:pPr>
+        <w:pStyle w:val="Caption"/>
+      </w:pPr>
+      <w:r>
+        <w:t>그림 1. Agent 서비스 설치와 네트워크 범위 선택</w:t>
       </w:r>
     </w:p>
     <w:p>
@@ -1164,7 +1255,7 @@
           <w:color w:val="243447"/>
           <w:sz w:val="17"/>
         </w:rPr>
-        <w:t>Viewer PC IPv4 예     : 192.0.2.25</w:t>
+        <w:t>Viewer PC IPv4 예     : 10.20.30.25</w:t>
       </w:r>
       <w:r>
         <w:br/>
@@ -1175,7 +1266,7 @@
           <w:color w:val="243447"/>
           <w:sz w:val="17"/>
         </w:rPr>
-        <w:t>스위치 관리 IPv4 예  : 198.51.100.11,198.51.100.12</w:t>
+        <w:t>선택 관리망 예       : 10.50.0.0/24</w:t>
       </w:r>
       <w:r>
         <w:br/>
@@ -1239,7 +1330,7 @@
           <w:color w:val="B42318"/>
           <w:sz w:val="21"/>
         </w:rPr>
-        <w:t xml:space="preserve">기존 폴더 신뢰 검사  </w:t>
+        <w:t xml:space="preserve">고정 설치 위치  </w:t>
       </w:r>
       <w:r>
         <w:rPr>
@@ -1247,12 +1338,7 @@
           <w:color w:val="16324F"/>
           <w:sz w:val="21"/>
         </w:rPr>
-        <w:t>설치·업데이트·제거는 install/data 폴더의 owner SID와 junction·symlink를 먼저 검사합니다. DataDirectory는 정확히 %ProgramData%\SamsungSwitchWatch만 허용하며, 신규 설치에서는 빈 선점 폴더도 채택하지 않습니다. AGENT_DIRECTORY_TRUST_INVALID가 표시되면 삭제나 강제 소유권 변경으로 우회하지 말고 Windows 관리자에게 확인을 요청하세요.</w:t>
-      </w:r>
-    </w:p>
-    <w:p>
-      <w:r>
-        <w:br w:type="page"/>
+        <w:t>Agent 프로그램은 %ProgramFiles%\SamsungSwitchWatch\Agent, HTTPS 신원과 데이터는 %ProgramData%\SamsungSwitchWatch에 둡니다. Setup이 경로 신뢰 검사를 통과하지 못하면 설치를 중단합니다. 폴더를 강제로 삭제하거나 소유권을 바꿔 우회하지 말고 Windows 관리자에게 실패 코드를 전달하세요.</w:t>
       </w:r>
     </w:p>
     <w:p>
@@ -1280,7 +1366,7 @@
           <w:color w:val="16324F"/>
           <w:sz w:val="21"/>
         </w:rPr>
-        <w:t>패키지는 SYSTEM·Administrators 전용 staging으로 복사한 뒤 SHA-256을 다시 확인합니다. install receipt는 관리자 전용 설치 증거이고, 허용 정책은 검증된 설정과 제품 소유 방화벽에서 가져옵니다. rollback 선행 단계가 실패하면 후속 파일 변경을 멈추고 snapshot·archive·journal을 보존합니다.</w:t>
+        <w:t>Setup은 BUILD-MANIFEST.json과 Agent 실행 파일 SHA-256을 확인하고, Program Files의 임시 staging에 복사한 파일을 다시 검사한 뒤 교체합니다. 서비스·프로그램·방화벽 변경 중 실패하면 설치 전 상태로 자동 복구하고, 완전히 복구하지 못하면 SETUP_ROLLBACK_FAILED를 표시합니다.</w:t>
       </w:r>
     </w:p>
     <w:p>
@@ -1300,7 +1386,7 @@
           <w:color w:val="2E74B5"/>
           <w:sz w:val="21"/>
         </w:rPr>
-        <w:t xml:space="preserve">허용 IP 변경  </w:t>
+        <w:t xml:space="preserve">네트워크 정책 변경  </w:t>
       </w:r>
       <w:r>
         <w:rPr>
@@ -1308,7 +1394,7 @@
           <w:color w:val="16324F"/>
           <w:sz w:val="21"/>
         </w:rPr>
-        <w:t>Viewer PC 또는 스위치 주소가 바뀌면 현재 Agent와 같은 버전 ZIP의 Configure-Agent-Allowed-IPs.cmd를 실행합니다. 일반 IPv4만 입력하며 내부에서 정확한 /32 정책으로 변환합니다. DHCP 또는 32대를 넘는 장비는 INSTALL_KO.md의 고급 CIDR 절차를 사용하세요. 기존 값과 같아도 서비스, TCP/18443 listener, 방화벽, 활성 프로필과 live/ready를 확인해 정상일 때만 변경 없음으로 끝납니다.</w:t>
+        <w:t>Viewer PC 주소나 스위치 관리망이 바뀌면 같은 Release의 Agent Setup을 다시 열어 고정 Viewer IPv4와 자동 검색된 관리망을 검토합니다. 사용자가 CIDR을 계산하거나 사설망 전체를 직접 허용하지 않습니다. 검사에서 서비스, TCP/18443 listener, 방화벽, 활성 프로필과 live/ready를 확인합니다.</w:t>
       </w:r>
     </w:p>
     <w:p>
@@ -1336,7 +1422,7 @@
           <w:color w:val="16324F"/>
           <w:sz w:val="21"/>
         </w:rPr>
-        <w:t>관리자 설치 창에 Agent installation failed가 표시되면 Cause 줄을 먼저 확인하세요. 설치 성공 뒤 AGENT_CONNECTION_REFUSED가 보이면 Viewer에 스위치 IP, Viewer PC 주소 또는 localhost가 아니라 Agent를 설치한 PC 주소를 입력했는지 먼저 확인하세요. 그 다음 SamsungSwitchWatchAgent 서비스와 TCP/18443을 점검합니다. 서비스를 수동 등록하지 말고 0.9.23-poc Agent 설치기를 사용하세요.</w:t>
+        <w:t>Agent Setup에 설치 실패가 표시되면 실패 단계와 Cause를 먼저 확인하세요. 설치 성공 뒤 AGENT_CONNECTION_REFUSED가 보이면 Viewer에 스위치 IP, Viewer PC 주소 또는 localhost가 아니라 Agent를 설치한 PC 주소를 입력했는지 먼저 확인하세요. 그 다음 Agent Setup의 검사에서 SamsungSwitchWatchAgent 서비스와 TCP/18443을 점검합니다. 서비스를 수동 등록하지 말고 0.10.0-poc Agent Setup을 사용하세요.</w:t>
       </w:r>
     </w:p>
     <w:p>
@@ -1355,7 +1441,35 @@
           <w:color w:val="2E74B5"/>
           <w:sz w:val="26"/>
         </w:rPr>
-        <w:t>Viewer 설치</w:t>
+        <w:t>Viewer 실행</w:t>
+      </w:r>
+    </w:p>
+    <w:p>
+      <w:pPr>
+        <w:keepLines/>
+        <w:spacing w:before="80" w:after="160" w:line="283" w:lineRule="auto"/>
+        <w:ind w:left="115" w:right="58"/>
+        <w:shd w:fill="FFF8E8"/>
+        <w:pBdr>
+          <w:left w:val="single" w:sz="16" w:space="8" w:color="8A5A00"/>
+        </w:pBdr>
+      </w:pPr>
+      <w:r>
+        <w:rPr>
+          <w:rFonts w:ascii="맑은 고딕" w:hAnsi="맑은 고딕" w:eastAsia="맑은 고딕" w:cs="맑은 고딕"/>
+          <w:b/>
+          <w:color w:val="8A5A00"/>
+          <w:sz w:val="21"/>
+        </w:rPr>
+        <w:t xml:space="preserve">0.9 설치형 Viewer에서 전환  </w:t>
+      </w:r>
+      <w:r>
+        <w:rPr>
+          <w:rFonts w:ascii="맑은 고딕" w:hAnsi="맑은 고딕" w:eastAsia="맑은 고딕" w:cs="맑은 고딕"/>
+          <w:color w:val="16324F"/>
+          <w:sz w:val="21"/>
+        </w:rPr>
+        <w:t>이전 Viewer가 실행 중이면 새 Viewer는 같은 사용자 데이터를 동시에 쓰지 않도록 실행을 차단하고 전환 순서를 표시합니다. 기존 트레이 아이콘에서 '프로그램 종료'를 선택한 뒤 Win+R에서 shell:startup을 열어 'Samsung Switch Watch' 바로 가기를 삭제합니다. 이어 shell:programs에서도 같은 이름의 이전 시작 메뉴 바로 가기를 삭제하고 새 Viewer를 다시 실행하세요. 기존 Agent 연결과 장비 정보는 유지됩니다. 창이 바로 보이지 않으면 알림 영역에서 대시보드를 열고 실행 경로가 새 v0.10 폴더인지 확인하세요.</w:t>
       </w:r>
     </w:p>
     <w:p>
@@ -1369,7 +1483,7 @@
         <w:rPr>
           <w:rFonts w:ascii="맑은 고딕" w:hAnsi="맑은 고딕" w:eastAsia="맑은 고딕" w:cs="맑은 고딕"/>
         </w:rPr>
-        <w:t>Viewer 릴리스 ZIP을 운영자 PC의 임시 폴더에 압축 해제합니다.</w:t>
+        <w:t>Viewer 릴리스 ZIP을 운영자 PC에서 계속 사용할 로컬 폴더에 압축 해제합니다.</w:t>
       </w:r>
     </w:p>
     <w:p>
@@ -1383,7 +1497,7 @@
         <w:rPr>
           <w:rFonts w:ascii="맑은 고딕" w:hAnsi="맑은 고딕" w:eastAsia="맑은 고딕" w:cs="맑은 고딕"/>
         </w:rPr>
-        <w:t>Install-or-Update-Viewer.cmd를 더블클릭하고 Program Files 설치를 위한 UAC를 승인합니다.</w:t>
+        <w:t>SamsungSwitchWatch.Viewer.exe를 더블클릭합니다.</w:t>
       </w:r>
     </w:p>
     <w:p>
@@ -1397,7 +1511,7 @@
         <w:rPr>
           <w:rFonts w:ascii="맑은 고딕" w:hAnsi="맑은 고딕" w:eastAsia="맑은 고딕" w:cs="맑은 고딕"/>
         </w:rPr>
-        <w:t>설치 완료 뒤 Viewer가 일반 사용자 권한으로 실행되고 다음 Windows 로그인부터 자동 시작되는지 확인합니다.</w:t>
+        <w:t>Viewer는 일반 사용자 권한으로 실행하며 설치, UAC와 Windows 로그인 자동 시작을 수행하지 않습니다.</w:t>
       </w:r>
     </w:p>
     <w:p>
@@ -1425,7 +1539,7 @@
           <w:color w:val="16324F"/>
           <w:sz w:val="21"/>
         </w:rPr>
-        <w:t>프로그램은 C:\Program Files\SamsungSwitchWatch\Viewer에 설치합니다. 장비 목록, DPAPI 자격 증명, 감시 이력과 화면 설정은 설치를 시작한 원래 사용자의 %LOCALAPPDATA%\SamsungSwitchWatch에 그대로 보존합니다. 관리자 단계가 성공한 뒤에만 원래 사용자 단계에서 바로 가기와 자동 시작을 반영합니다. 이전 Program Files 버전과 기존 사용자별 프로그램 폴더는 자동 삭제하지 않습니다.</w:t>
+        <w:t>Viewer는 압축 해제한 폴더에서 실행합니다. 장비 목록, DPAPI 자격 증명, 감시 이력과 화면 설정은 %LOCALAPPDATA%\SamsungSwitchWatch에 보존됩니다. Viewer 폴더를 교체해도 자료는 유지되지만 항상 Agent와 같은 Release를 사용하세요.</w:t>
       </w:r>
     </w:p>
     <w:p>
@@ -1445,7 +1559,7 @@
           <w:color w:val="B42318"/>
           <w:sz w:val="21"/>
         </w:rPr>
-        <w:t xml:space="preserve">Viewer 설치가 복구된 경우  </w:t>
+        <w:t xml:space="preserve">Viewer가 실행되지 않는 경우  </w:t>
       </w:r>
       <w:r>
         <w:rPr>
@@ -1453,7 +1567,7 @@
           <w:color w:val="16324F"/>
           <w:sz w:val="21"/>
         </w:rPr>
-        <w:t>설치 창의 Cause, Detail, 선택적 ExitCode, Recovery와 두 진단 경로를 확인하세요. PREVIOUS_VIEWER_RESTORED이면 시작 메뉴에서 Viewer를 다시 실행합니다. ROLLBACK_INCOMPLETE이면 백업과 진단 파일을 보존하고 Windows 관리자에게 전달하세요. Program Files 실행이 차단되면 보안 정책을 우회하거나 파일 차단을 해제하지 말고 해당 코드를 EDR·AppLocker·WDAC 담당자에게 전달하세요. 사용자 단계 실패 뒤에는 이전 Program Files 버전 복구 UAC가 한 번 더 표시될 수 있습니다. 취소하거나 실패하면 Viewer.__rollback을 삭제하지 마세요. 업데이트 직전에는 정상 현재 버전을 새 rollback 기준으로 회전하므로 실패하면 정확히 직전 버전을 복원합니다. 각 관리자 설치는 고유 작업 ID와 활성·rollback manifest SHA-256을 Administrators 전용 marker에 결속하므로, 같은 ZIP을 다시 설치했더라도 앞선 작업의 늦은 복구는 VIEWER_ROLLBACK_ACTIVE_CHANGED로 중단하고 최신 설치·rollback 슬롯·marker를 보존합니다. 기존 Viewer 자체점검만 일시적으로 실패한 경우에도 VIEWER_CURRENT_SELF_CHECK_FAILED로 자동 강등하지 않습니다. 새 설치 파일이나 매니페스트가 EDR에 의해 격리 또는 손상돼도 보호된 현재 설치를 격리한 뒤 검증된 rollback 슬롯을 먼저 복원합니다. 제거 중 Viewer 프로세스나 활성 프로그램 폴더가 남으면 rollback 슬롯을 삭제하지 않습니다. 자세한 코드는 INSTALL_KO.md를 확인하세요.</w:t>
+        <w:t>0.10.0-poc는 코드 서명되지 않아 SmartScreen이나 사내 EDR이 차단할 수 있습니다. ZIP을 완전히 압축 해제하고 Viewer EXE와 제공된 DLL이 같은 폴더에 있는지 확인하세요. EDR·AppLocker·WDAC가 차단하면 우회하지 말고 공식 ZIP의 버전·해시와 차단 기록을 보안 담당자에게 전달하세요.</w:t>
       </w:r>
     </w:p>
     <w:p>
@@ -1473,7 +1587,7 @@
           <w:color w:val="2E74B5"/>
           <w:sz w:val="21"/>
         </w:rPr>
-        <w:t xml:space="preserve">고급 설치  </w:t>
+        <w:t xml:space="preserve">포터블 운영  </w:t>
       </w:r>
       <w:r>
         <w:rPr>
@@ -1481,7 +1595,7 @@
           <w:color w:val="16324F"/>
           <w:sz w:val="21"/>
         </w:rPr>
-        <w:t>설치 전 검사, 설치 위치 또는 자동 시작 상태를 직접 지정할 때만 INSTALL_KO.md의 install-viewer.ps1 옵션을 사용하세요. 기존 사용자별 설치는 -PerUser를 명시하는 호환 경로이며 기본 설치가 아닙니다.</w:t>
+        <w:t>공개 Viewer 패키지에는 설치 스크립트와 자동 시작 기능이 없습니다. 필요하면 사용자가 직접 바로 가기를 만들고, 감시가 필요할 때 Viewer를 실행해 두세요.</w:t>
       </w:r>
     </w:p>
     <w:p>
@@ -1512,8 +1626,8 @@
       <w:r>
         <w:drawing>
           <wp:inline xmlns:a="http://schemas.openxmlformats.org/drawingml/2006/main" xmlns:pic="http://schemas.openxmlformats.org/drawingml/2006/picture">
-            <wp:extent cx="2560320" cy="2064774"/>
-            <wp:docPr id="1" name="Picture 1" title="Agent 연결 창" descr="Agent 주소만 입력하고 HTTPS 포트 18443을 자동 사용하는 연결 설정 창"/>
+            <wp:extent cx="2194560" cy="1840599"/>
+            <wp:docPr id="2" name="Picture 2" title="Agent 연결 창" descr="Agent 주소만 입력하고 HTTPS 포트 18443을 자동 사용하는 연결 설정 창"/>
             <wp:cNvGraphicFramePr>
               <a:graphicFrameLocks noChangeAspect="1"/>
             </wp:cNvGraphicFramePr>
@@ -1525,7 +1639,7 @@
                     <pic:cNvPicPr/>
                   </pic:nvPicPr>
                   <pic:blipFill>
-                    <a:blip r:embed="rId13"/>
+                    <a:blip r:embed="rId14"/>
                     <a:stretch>
                       <a:fillRect/>
                     </a:stretch>
@@ -1533,7 +1647,7 @@
                   <pic:spPr>
                     <a:xfrm>
                       <a:off x="0" y="0"/>
-                      <a:ext cx="2560320" cy="2064774"/>
+                      <a:ext cx="2194560" cy="1840599"/>
                     </a:xfrm>
                     <a:prstGeom prst="rect"/>
                   </pic:spPr>
@@ -1549,7 +1663,7 @@
         <w:pStyle w:val="Caption"/>
       </w:pPr>
       <w:r>
-        <w:t>그림 1. Agent 주소만 입력하는 연결 설정</w:t>
+        <w:t>그림 2. Agent 주소만 입력하는 연결 설정</w:t>
       </w:r>
     </w:p>
     <w:p>
@@ -1565,7 +1679,7 @@
           <w:rFonts w:ascii="맑은 고딕" w:hAnsi="맑은 고딕" w:eastAsia="맑은 고딕" w:cs="맑은 고딕"/>
           <w:sz w:val="22"/>
         </w:rPr>
-        <w:t>Agent를 설치한 원격 PC의 IPv4 또는 사내 DNS 이름만 입력합니다.</w:t>
+        <w:t>Agent를 설치한 원격 PC의 IPv4 또는 사내 DNS 이름만 입력합니다. 스위치 IP, Viewer PC 주소와 localhost는 두 프로그램이 같은 PC가 아닌 한 입력하지 않습니다.</w:t>
       </w:r>
     </w:p>
     <w:p>
@@ -1581,39 +1695,7 @@
           <w:rFonts w:ascii="맑은 고딕" w:hAnsi="맑은 고딕" w:eastAsia="맑은 고딕" w:cs="맑은 고딕"/>
           <w:sz w:val="22"/>
         </w:rPr>
-        <w:t>스위치 IP, Viewer PC 주소와 localhost는 Agent와 Viewer가 같은 PC가 아닌 한 입력하지 않습니다.</w:t>
-      </w:r>
-    </w:p>
-    <w:p>
-      <w:pPr>
-        <w:numPr>
-          <w:ilvl w:val="0"/>
-          <w:numId w:val="10"/>
-        </w:numPr>
-        <w:spacing w:before="0" w:after="120" w:line="300" w:lineRule="auto"/>
-      </w:pPr>
-      <w:r>
-        <w:rPr>
-          <w:rFonts w:ascii="맑은 고딕" w:hAnsi="맑은 고딕" w:eastAsia="맑은 고딕" w:cs="맑은 고딕"/>
-          <w:sz w:val="22"/>
-        </w:rPr>
-        <w:t>https://, 포트, 인증서 SHA-256 지문, 페어링 토큰은 입력하지 않습니다.</w:t>
-      </w:r>
-    </w:p>
-    <w:p>
-      <w:pPr>
-        <w:numPr>
-          <w:ilvl w:val="0"/>
-          <w:numId w:val="10"/>
-        </w:numPr>
-        <w:spacing w:before="0" w:after="120" w:line="300" w:lineRule="auto"/>
-      </w:pPr>
-      <w:r>
-        <w:rPr>
-          <w:rFonts w:ascii="맑은 고딕" w:hAnsi="맑은 고딕" w:eastAsia="맑은 고딕" w:cs="맑은 고딕"/>
-          <w:sz w:val="22"/>
-        </w:rPr>
-        <w:t>정상 Agent 교체나 재설치가 확실할 때만 '이 Agent로 다시 연결'을 사용합니다.</w:t>
+        <w:t>https://, 포트, 인증서 지문과 페어링 토큰은 입력하지 않습니다. 정상 Agent 교체나 재설치가 확실할 때만 '이 Agent로 다시 연결'을 사용합니다.</w:t>
       </w:r>
     </w:p>
     <w:p>
@@ -1645,7 +1727,7 @@
         <w:drawing>
           <wp:inline xmlns:a="http://schemas.openxmlformats.org/drawingml/2006/main" xmlns:pic="http://schemas.openxmlformats.org/drawingml/2006/picture">
             <wp:extent cx="5029200" cy="3540967"/>
-            <wp:docPr id="2" name="Picture 2" title="장비 관리 창" descr="장비명, 모델, IPv4, 계정 ID, 로그인 비밀번호, enable 비밀번호와 감시 설정을 입력하는 창"/>
+            <wp:docPr id="3" name="Picture 3" title="장비 관리 창" descr="장비명, 모델, IPv4, 계정 ID, 로그인 비밀번호, enable 비밀번호와 감시 설정을 입력하는 창"/>
             <wp:cNvGraphicFramePr>
               <a:graphicFrameLocks noChangeAspect="1"/>
             </wp:cNvGraphicFramePr>
@@ -1657,7 +1739,7 @@
                     <pic:cNvPicPr/>
                   </pic:nvPicPr>
                   <pic:blipFill>
-                    <a:blip r:embed="rId14"/>
+                    <a:blip r:embed="rId15"/>
                     <a:stretch>
                       <a:fillRect/>
                     </a:stretch>
@@ -1681,7 +1763,7 @@
         <w:pStyle w:val="Caption"/>
       </w:pPr>
       <w:r>
-        <w:t>그림 2. Viewer가 보관하는 장비 및 계정 입력 화면</w:t>
+        <w:t>그림 3. Viewer가 보관하는 장비 및 계정 입력 화면</w:t>
       </w:r>
     </w:p>
     <w:tbl>
@@ -2022,7 +2104,7 @@
                 <w:rFonts w:ascii="맑은 고딕" w:hAnsi="맑은 고딕" w:eastAsia="맑은 고딕" w:cs="맑은 고딕"/>
                 <w:sz w:val="18"/>
               </w:rPr>
-              <w:t>Agent 설치 또는 허용 IP 설정 도구에 등록한 관리 IP</w:t>
+              <w:t>Agent Setup에서 선택한 관리망에 속한 스위치 관리 IPv4</w:t>
             </w:r>
           </w:p>
         </w:tc>
@@ -2416,7 +2498,7 @@
         <w:drawing>
           <wp:inline xmlns:a="http://schemas.openxmlformats.org/drawingml/2006/main" xmlns:pic="http://schemas.openxmlformats.org/drawingml/2006/picture">
             <wp:extent cx="3977639" cy="2486024"/>
-            <wp:docPr id="3" name="Picture 3" title="장비 명령 실행 화면" descr="show running-config를 입력하고 데모 스위치의 익명화된 결과를 확인하는 장비 명령 탭"/>
+            <wp:docPr id="4" name="Picture 4" title="장비 명령 실행 화면" descr="show port status를 입력하고 데모 스위치의 익명화된 결과를 확인하는 장비 명령 탭"/>
             <wp:cNvGraphicFramePr>
               <a:graphicFrameLocks noChangeAspect="1"/>
             </wp:cNvGraphicFramePr>
@@ -2428,7 +2510,7 @@
                     <pic:cNvPicPr/>
                   </pic:nvPicPr>
                   <pic:blipFill>
-                    <a:blip r:embed="rId15"/>
+                    <a:blip r:embed="rId16"/>
                     <a:stretch>
                       <a:fillRect/>
                     </a:stretch>
@@ -2452,7 +2534,7 @@
         <w:pStyle w:val="Caption"/>
       </w:pPr>
       <w:r>
-        <w:t>그림 3. 한 줄 show 명령 실행과 메모리 내 결과 확인</w:t>
+        <w:t>그림 4. 한 줄 show 명령 실행과 메모리 내 결과 확인</w:t>
       </w:r>
     </w:p>
     <w:tbl>
@@ -2690,7 +2772,7 @@
                 <w:rFonts w:ascii="맑은 고딕" w:hAnsi="맑은 고딕" w:eastAsia="맑은 고딕" w:cs="맑은 고딕"/>
                 <w:sz w:val="18"/>
               </w:rPr>
-              <w:t>show running-config</w:t>
+              <w:t>show port status</w:t>
             </w:r>
           </w:p>
         </w:tc>
@@ -2716,7 +2798,7 @@
                 <w:rFonts w:ascii="맑은 고딕" w:hAnsi="맑은 고딕" w:eastAsia="맑은 고딕" w:cs="맑은 고딕"/>
                 <w:sz w:val="18"/>
               </w:rPr>
-              <w:t>실행, 민감정보 주의</w:t>
+              <w:t>실행, 포트 상태 확인</w:t>
             </w:r>
           </w:p>
         </w:tc>
@@ -2869,7 +2951,7 @@
           <w:color w:val="B42318"/>
           <w:sz w:val="21"/>
         </w:rPr>
-        <w:t xml:space="preserve">show running-config  </w:t>
+        <w:t xml:space="preserve">민감한 show 명령  </w:t>
       </w:r>
       <w:r>
         <w:rPr>
@@ -3473,7 +3555,7 @@
         <w:drawing>
           <wp:inline xmlns:a="http://schemas.openxmlformats.org/drawingml/2006/main" xmlns:pic="http://schemas.openxmlformats.org/drawingml/2006/picture">
             <wp:extent cx="4754880" cy="2971800"/>
-            <wp:docPr id="4" name="Picture 4" title="Viewer 대시보드" descr="장비 목록, 선택 장비 상태, 최근 이벤트와 Viewer 감시 상태를 보여 주는 대시보드"/>
+            <wp:docPr id="5" name="Picture 5" title="Viewer 대시보드" descr="장비 목록, 선택 장비 상태, 최근 이벤트와 Viewer 감시 상태를 보여 주는 대시보드"/>
             <wp:cNvGraphicFramePr>
               <a:graphicFrameLocks noChangeAspect="1"/>
             </wp:cNvGraphicFramePr>
@@ -3485,7 +3567,7 @@
                     <pic:cNvPicPr/>
                   </pic:nvPicPr>
                   <pic:blipFill>
-                    <a:blip r:embed="rId16"/>
+                    <a:blip r:embed="rId17"/>
                     <a:stretch>
                       <a:fillRect/>
                     </a:stretch>
@@ -3509,7 +3591,7 @@
         <w:pStyle w:val="Caption"/>
       </w:pPr>
       <w:r>
-        <w:t>그림 4. Viewer 중심 대시보드 전체 화면</w:t>
+        <w:t>그림 5. Viewer 중심 대시보드 전체 화면</w:t>
       </w:r>
     </w:p>
     <w:tbl>
@@ -3989,7 +4071,7 @@
         <w:drawing>
           <wp:inline xmlns:a="http://schemas.openxmlformats.org/drawingml/2006/main" xmlns:pic="http://schemas.openxmlformats.org/drawingml/2006/picture">
             <wp:extent cx="2971800" cy="1816099"/>
-            <wp:docPr id="5" name="Picture 5" title="항상 위 미니 창" descr="정상, 경고, 장애 수와 최근 문제를 보여 주는 작은 항상 위 창"/>
+            <wp:docPr id="6" name="Picture 6" title="항상 위 미니 창" descr="정상, 경고, 장애 수와 최근 문제를 보여 주는 작은 항상 위 창"/>
             <wp:cNvGraphicFramePr>
               <a:graphicFrameLocks noChangeAspect="1"/>
             </wp:cNvGraphicFramePr>
@@ -4001,7 +4083,7 @@
                     <pic:cNvPicPr/>
                   </pic:nvPicPr>
                   <pic:blipFill>
-                    <a:blip r:embed="rId17"/>
+                    <a:blip r:embed="rId18"/>
                     <a:stretch>
                       <a:fillRect/>
                     </a:stretch>
@@ -4025,7 +4107,7 @@
         <w:pStyle w:val="Caption"/>
       </w:pPr>
       <w:r>
-        <w:t>그림 5. 반복 운영용 미니 창</w:t>
+        <w:t>그림 6. 반복 운영용 미니 창</w:t>
       </w:r>
     </w:p>
     <w:p>
@@ -4038,7 +4120,7 @@
         <w:drawing>
           <wp:inline xmlns:a="http://schemas.openxmlformats.org/drawingml/2006/main" xmlns:pic="http://schemas.openxmlformats.org/drawingml/2006/picture">
             <wp:extent cx="3154680" cy="1296924"/>
-            <wp:docPr id="6" name="Picture 6" title="장애 알림 팝업" descr="데모 업링크 포트 Down 장애와 발생 시각을 보여 주는 알림 팝업"/>
+            <wp:docPr id="7" name="Picture 7" title="장애 알림 팝업" descr="데모 업링크 포트 Down 장애와 발생 시각을 보여 주는 알림 팝업"/>
             <wp:cNvGraphicFramePr>
               <a:graphicFrameLocks noChangeAspect="1"/>
             </wp:cNvGraphicFramePr>
@@ -4050,7 +4132,7 @@
                     <pic:cNvPicPr/>
                   </pic:nvPicPr>
                   <pic:blipFill>
-                    <a:blip r:embed="rId18"/>
+                    <a:blip r:embed="rId19"/>
                     <a:stretch>
                       <a:fillRect/>
                     </a:stretch>
@@ -4074,7 +4156,7 @@
         <w:pStyle w:val="Caption"/>
       </w:pPr>
       <w:r>
-        <w:t>그림 6. 새 장애 알림 팝업</w:t>
+        <w:t>그림 7. 새 장애 알림 팝업</w:t>
       </w:r>
     </w:p>
     <w:p>
@@ -4332,9 +4414,9 @@
                 <w:rFonts w:ascii="맑은 고딕" w:hAnsi="맑은 고딕" w:eastAsia="맑은 고딕" w:cs="맑은 고딕"/>
                 <w:sz w:val="18"/>
               </w:rPr>
-              <w:t>C:\Program Files\</w:t>
+              <w:t>사용자가 압축 해제한</w:t>
               <w:br/>
-              <w:t>SamsungSwitchWatch\Viewer</w:t>
+              <w:t>로컬 폴더</w:t>
             </w:r>
           </w:p>
         </w:tc>
@@ -4359,7 +4441,7 @@
                 <w:rFonts w:ascii="맑은 고딕" w:hAnsi="맑은 고딕" w:eastAsia="맑은 고딕" w:cs="맑은 고딕"/>
                 <w:sz w:val="18"/>
               </w:rPr>
-              <w:t>UAC 설치, 일반 사용자 권한으로 실행</w:t>
+              <w:t>포터블, 일반 사용자 권한으로 실행</w:t>
             </w:r>
           </w:p>
         </w:tc>
@@ -4782,7 +4864,7 @@
                 <w:rFonts w:ascii="맑은 고딕" w:hAnsi="맑은 고딕" w:eastAsia="맑은 고딕" w:cs="맑은 고딕"/>
                 <w:sz w:val="18"/>
               </w:rPr>
-              <w:t>Agent 설치 영수증</w:t>
+              <w:t>Agent 실행 설정</w:t>
             </w:r>
           </w:p>
         </w:tc>
@@ -4807,9 +4889,7 @@
                 <w:rFonts w:ascii="맑은 고딕" w:hAnsi="맑은 고딕" w:eastAsia="맑은 고딕" w:cs="맑은 고딕"/>
                 <w:sz w:val="18"/>
               </w:rPr>
-              <w:t>%ProgramData%\</w:t>
-              <w:br/>
-              <w:t>SamsungSwitchWatch</w:t>
+              <w:t>%ProgramFiles%\SamsungSwitchWatch\Agent</w:t>
             </w:r>
           </w:p>
         </w:tc>
@@ -4834,7 +4914,7 @@
                 <w:rFonts w:ascii="맑은 고딕" w:hAnsi="맑은 고딕" w:eastAsia="맑은 고딕" w:cs="맑은 고딕"/>
                 <w:sz w:val="18"/>
               </w:rPr>
-              <w:t>Administrators owner + SYSTEM/Administrators 전용 ACL</w:t>
+              <w:t>Viewer 주소와 선택 관리망에 맞춰 Setup이 생성</w:t>
             </w:r>
           </w:p>
         </w:tc>
@@ -4938,7 +5018,7 @@
           <w:rFonts w:ascii="맑은 고딕" w:hAnsi="맑은 고딕" w:eastAsia="맑은 고딕" w:cs="맑은 고딕"/>
           <w:sz w:val="22"/>
         </w:rPr>
-        <w:t>Viewer 설정 파일을 다른 PC나 다른 Windows 사용자에게 복사해도 계정은 복호화되지 않습니다.</w:t>
+        <w:t>Viewer 설정을 다른 PC나 Windows 사용자에게 복사해도 계정은 복호화되지 않으며, 진단 파일에는 IP·ID·비밀번호·호스트명·수동 명령 원문을 넣지 않습니다.</w:t>
       </w:r>
     </w:p>
     <w:p>
@@ -4954,7 +5034,7 @@
           <w:rFonts w:ascii="맑은 고딕" w:hAnsi="맑은 고딕" w:eastAsia="맑은 고딕" w:cs="맑은 고딕"/>
           <w:sz w:val="22"/>
         </w:rPr>
-        <w:t>진단 파일에는 IP, ID, 비밀번호, 호스트명과 수동 명령 원문을 넣지 않습니다.</w:t>
+        <w:t>기존 Agent HTTPS 신원과 유효한 실행 설정은 같은 PC의 업데이트에서 보존합니다.</w:t>
       </w:r>
     </w:p>
     <w:p>
@@ -4970,55 +5050,7 @@
           <w:rFonts w:ascii="맑은 고딕" w:hAnsi="맑은 고딕" w:eastAsia="맑은 고딕" w:cs="맑은 고딕"/>
           <w:sz w:val="22"/>
         </w:rPr>
-        <w:t>레거시 백업은 SYSTEM과 로컬 Administrators만 접근할 수 있으며 Agent 서비스 SID에는 권한을 주지 않습니다.</w:t>
-      </w:r>
-    </w:p>
-    <w:p>
-      <w:pPr>
-        <w:numPr>
-          <w:ilvl w:val="0"/>
-          <w:numId w:val="10"/>
-        </w:numPr>
-        <w:spacing w:before="0" w:after="120" w:line="300" w:lineRule="auto"/>
-      </w:pPr>
-      <w:r>
-        <w:rPr>
-          <w:rFonts w:ascii="맑은 고딕" w:hAnsi="맑은 고딕" w:eastAsia="맑은 고딕" w:cs="맑은 고딕"/>
-          <w:sz w:val="22"/>
-        </w:rPr>
-        <w:t>대상 정책은 설치 설정, Viewer 접근 정책은 제품 소유 방화벽 규칙이 권한원이며 설치 영수증에서 복원하지 않습니다.</w:t>
-      </w:r>
-    </w:p>
-    <w:p>
-      <w:pPr>
-        <w:numPr>
-          <w:ilvl w:val="0"/>
-          <w:numId w:val="10"/>
-        </w:numPr>
-        <w:spacing w:before="0" w:after="120" w:line="300" w:lineRule="auto"/>
-      </w:pPr>
-      <w:r>
-        <w:rPr>
-          <w:rFonts w:ascii="맑은 고딕" w:hAnsi="맑은 고딕" w:eastAsia="맑은 고딕" w:cs="맑은 고딕"/>
-          <w:sz w:val="22"/>
-        </w:rPr>
-        <w:t>Agent 방화벽은 등록한 Viewer PC IPv4 또는 고급 관리 CIDR만 HTTPS/18443에 접근하도록 제한합니다.</w:t>
-      </w:r>
-    </w:p>
-    <w:p>
-      <w:pPr>
-        <w:numPr>
-          <w:ilvl w:val="0"/>
-          <w:numId w:val="10"/>
-        </w:numPr>
-        <w:spacing w:before="0" w:after="120" w:line="300" w:lineRule="auto"/>
-      </w:pPr>
-      <w:r>
-        <w:rPr>
-          <w:rFonts w:ascii="맑은 고딕" w:hAnsi="맑은 고딕" w:eastAsia="맑은 고딕" w:cs="맑은 고딕"/>
-          <w:sz w:val="22"/>
-        </w:rPr>
-        <w:t>Agent는 등록한 스위치 IPv4 또는 고급 대상 CIDR과 고정 Telnet/23만 허용합니다.</w:t>
+        <w:t>방화벽은 고정 Viewer IPv4의 HTTPS/18443만 허용하고, Agent는 Setup에서 선택한 직접 연결 관리망의 Telnet/23만 사용합니다.</w:t>
       </w:r>
     </w:p>
     <w:p>
@@ -5170,7 +5202,7 @@
                 <w:rFonts w:ascii="맑은 고딕" w:hAnsi="맑은 고딕" w:eastAsia="맑은 고딕" w:cs="맑은 고딕"/>
                 <w:sz w:val="16"/>
               </w:rPr>
-              <w:t>DEPLOYMENT_ALREADY_RUNNING</w:t>
+              <w:t>AGENT_DNS_FAILED</w:t>
             </w:r>
           </w:p>
         </w:tc>
@@ -5195,431 +5227,7 @@
                 <w:rFonts w:ascii="맑은 고딕" w:hAnsi="맑은 고딕" w:eastAsia="맑은 고딕" w:cs="맑은 고딕"/>
                 <w:sz w:val="16"/>
               </w:rPr>
-              <w:t>먼저 시작한 같은 제품의 설치·제거가 끝난 뒤 다시 실행</w:t>
-            </w:r>
-          </w:p>
-        </w:tc>
-      </w:tr>
-      <w:tr>
-        <w:tc>
-          <w:tcPr>
-            <w:tcW w:type="dxa" w:w="4300"/>
-            <w:shd w:fill="FAFBFC"/>
-            <w:tcMar>
-              <w:top w:w="80" w:type="dxa"/>
-              <w:start w:w="120" w:type="dxa"/>
-              <w:bottom w:w="80" w:type="dxa"/>
-              <w:end w:w="120" w:type="dxa"/>
-            </w:tcMar>
-            <w:vAlign w:val="center"/>
-          </w:tcPr>
-          <w:p>
-            <w:pPr>
-              <w:spacing w:before="0" w:after="0" w:line="240" w:lineRule="auto"/>
-              <w:jc w:val="left"/>
-            </w:pPr>
-            <w:r>
-              <w:rPr>
-                <w:rFonts w:ascii="맑은 고딕" w:hAnsi="맑은 고딕" w:eastAsia="맑은 고딕" w:cs="맑은 고딕"/>
-                <w:sz w:val="16"/>
-              </w:rPr>
-              <w:t>DEPLOYMENT_PREVIOUS_RUN_INTERRUPTED</w:t>
-            </w:r>
-          </w:p>
-        </w:tc>
-        <w:tc>
-          <w:tcPr>
-            <w:tcW w:type="dxa" w:w="5060"/>
-            <w:shd w:fill="FAFBFC"/>
-            <w:tcMar>
-              <w:top w:w="80" w:type="dxa"/>
-              <w:start w:w="120" w:type="dxa"/>
-              <w:bottom w:w="80" w:type="dxa"/>
-              <w:end w:w="120" w:type="dxa"/>
-            </w:tcMar>
-            <w:vAlign w:val="center"/>
-          </w:tcPr>
-          <w:p>
-            <w:pPr>
-              <w:spacing w:before="0" w:after="0" w:line="240" w:lineRule="auto"/>
-              <w:jc w:val="left"/>
-            </w:pPr>
-            <w:r>
-              <w:rPr>
-                <w:rFonts w:ascii="맑은 고딕" w:hAnsi="맑은 고딕" w:eastAsia="맑은 고딕" w:cs="맑은 고딕"/>
-                <w:sz w:val="16"/>
-              </w:rPr>
-              <w:t>변경 전에 중단됨. 자동 복구가 아니므로 서비스·설치 폴더 상태 확인 후 다시 실행</w:t>
-            </w:r>
-          </w:p>
-        </w:tc>
-      </w:tr>
-      <w:tr>
-        <w:tc>
-          <w:tcPr>
-            <w:tcW w:type="dxa" w:w="4300"/>
-            <w:tcMar>
-              <w:top w:w="80" w:type="dxa"/>
-              <w:start w:w="120" w:type="dxa"/>
-              <w:bottom w:w="80" w:type="dxa"/>
-              <w:end w:w="120" w:type="dxa"/>
-            </w:tcMar>
-            <w:vAlign w:val="center"/>
-          </w:tcPr>
-          <w:p>
-            <w:pPr>
-              <w:spacing w:before="0" w:after="0" w:line="240" w:lineRule="auto"/>
-              <w:jc w:val="left"/>
-            </w:pPr>
-            <w:r>
-              <w:rPr>
-                <w:rFonts w:ascii="맑은 고딕" w:hAnsi="맑은 고딕" w:eastAsia="맑은 고딕" w:cs="맑은 고딕"/>
-                <w:sz w:val="16"/>
-              </w:rPr>
-              <w:t>DEPLOYMENT_LOCK_UNAVAILABLE</w:t>
-            </w:r>
-          </w:p>
-        </w:tc>
-        <w:tc>
-          <w:tcPr>
-            <w:tcW w:type="dxa" w:w="5060"/>
-            <w:tcMar>
-              <w:top w:w="80" w:type="dxa"/>
-              <w:start w:w="120" w:type="dxa"/>
-              <w:bottom w:w="80" w:type="dxa"/>
-              <w:end w:w="120" w:type="dxa"/>
-            </w:tcMar>
-            <w:vAlign w:val="center"/>
-          </w:tcPr>
-          <w:p>
-            <w:pPr>
-              <w:spacing w:before="0" w:after="0" w:line="240" w:lineRule="auto"/>
-              <w:jc w:val="left"/>
-            </w:pPr>
-            <w:r>
-              <w:rPr>
-                <w:rFonts w:ascii="맑은 고딕" w:hAnsi="맑은 고딕" w:eastAsia="맑은 고딕" w:cs="맑은 고딕"/>
-                <w:sz w:val="16"/>
-              </w:rPr>
-              <w:t>Agent 관리자 권한 또는 Viewer 동일 사용자 확인 → 보안 프로그램·정책 점검</w:t>
-            </w:r>
-          </w:p>
-        </w:tc>
-      </w:tr>
-      <w:tr>
-        <w:tc>
-          <w:tcPr>
-            <w:tcW w:type="dxa" w:w="4300"/>
-            <w:shd w:fill="FAFBFC"/>
-            <w:tcMar>
-              <w:top w:w="80" w:type="dxa"/>
-              <w:start w:w="120" w:type="dxa"/>
-              <w:bottom w:w="80" w:type="dxa"/>
-              <w:end w:w="120" w:type="dxa"/>
-            </w:tcMar>
-            <w:vAlign w:val="center"/>
-          </w:tcPr>
-          <w:p>
-            <w:pPr>
-              <w:spacing w:before="0" w:after="0" w:line="240" w:lineRule="auto"/>
-              <w:jc w:val="left"/>
-            </w:pPr>
-            <w:r>
-              <w:rPr>
-                <w:rFonts w:ascii="맑은 고딕" w:hAnsi="맑은 고딕" w:eastAsia="맑은 고딕" w:cs="맑은 고딕"/>
-                <w:sz w:val="16"/>
-              </w:rPr>
-              <w:t>AGENT_DEPLOYMENT_RECOVERY_REQUIRED</w:t>
-            </w:r>
-          </w:p>
-        </w:tc>
-        <w:tc>
-          <w:tcPr>
-            <w:tcW w:type="dxa" w:w="5060"/>
-            <w:shd w:fill="FAFBFC"/>
-            <w:tcMar>
-              <w:top w:w="80" w:type="dxa"/>
-              <w:start w:w="120" w:type="dxa"/>
-              <w:bottom w:w="80" w:type="dxa"/>
-              <w:end w:w="120" w:type="dxa"/>
-            </w:tcMar>
-            <w:vAlign w:val="center"/>
-          </w:tcPr>
-          <w:p>
-            <w:pPr>
-              <w:spacing w:before="0" w:after="0" w:line="240" w:lineRule="auto"/>
-              <w:jc w:val="left"/>
-            </w:pPr>
-            <w:r>
-              <w:rPr>
-                <w:rFonts w:ascii="맑은 고딕" w:hAnsi="맑은 고딕" w:eastAsia="맑은 고딕" w:cs="맑은 고딕"/>
-                <w:sz w:val="16"/>
-              </w:rPr>
-              <w:t>이전 Agent 설치·제거 미완료 또는 rollback 오류. journal·백업을 보존하고 관리자 확인</w:t>
-            </w:r>
-          </w:p>
-        </w:tc>
-      </w:tr>
-      <w:tr>
-        <w:tc>
-          <w:tcPr>
-            <w:tcW w:type="dxa" w:w="4300"/>
-            <w:tcMar>
-              <w:top w:w="80" w:type="dxa"/>
-              <w:start w:w="120" w:type="dxa"/>
-              <w:bottom w:w="80" w:type="dxa"/>
-              <w:end w:w="120" w:type="dxa"/>
-            </w:tcMar>
-            <w:vAlign w:val="center"/>
-          </w:tcPr>
-          <w:p>
-            <w:pPr>
-              <w:spacing w:before="0" w:after="0" w:line="240" w:lineRule="auto"/>
-              <w:jc w:val="left"/>
-            </w:pPr>
-            <w:r>
-              <w:rPr>
-                <w:rFonts w:ascii="맑은 고딕" w:hAnsi="맑은 고딕" w:eastAsia="맑은 고딕" w:cs="맑은 고딕"/>
-                <w:sz w:val="16"/>
-              </w:rPr>
-              <w:t>AGENT_DEPLOYMENT_JOURNAL_INVALID</w:t>
-            </w:r>
-          </w:p>
-        </w:tc>
-        <w:tc>
-          <w:tcPr>
-            <w:tcW w:type="dxa" w:w="5060"/>
-            <w:tcMar>
-              <w:top w:w="80" w:type="dxa"/>
-              <w:start w:w="120" w:type="dxa"/>
-              <w:bottom w:w="80" w:type="dxa"/>
-              <w:end w:w="120" w:type="dxa"/>
-            </w:tcMar>
-            <w:vAlign w:val="center"/>
-          </w:tcPr>
-          <w:p>
-            <w:pPr>
-              <w:spacing w:before="0" w:after="0" w:line="240" w:lineRule="auto"/>
-              <w:jc w:val="left"/>
-            </w:pPr>
-            <w:r>
-              <w:rPr>
-                <w:rFonts w:ascii="맑은 고딕" w:hAnsi="맑은 고딕" w:eastAsia="맑은 고딕" w:cs="맑은 고딕"/>
-                <w:sz w:val="16"/>
-              </w:rPr>
-              <w:t>Agent 작업 기록 손상 또는 미지원 형식. 기록을 삭제해 우회하지 말고 관리자 확인</w:t>
-            </w:r>
-          </w:p>
-        </w:tc>
-      </w:tr>
-      <w:tr>
-        <w:tc>
-          <w:tcPr>
-            <w:tcW w:type="dxa" w:w="4300"/>
-            <w:shd w:fill="FAFBFC"/>
-            <w:tcMar>
-              <w:top w:w="80" w:type="dxa"/>
-              <w:start w:w="120" w:type="dxa"/>
-              <w:bottom w:w="80" w:type="dxa"/>
-              <w:end w:w="120" w:type="dxa"/>
-            </w:tcMar>
-            <w:vAlign w:val="center"/>
-          </w:tcPr>
-          <w:p>
-            <w:pPr>
-              <w:spacing w:before="0" w:after="0" w:line="240" w:lineRule="auto"/>
-              <w:jc w:val="left"/>
-            </w:pPr>
-            <w:r>
-              <w:rPr>
-                <w:rFonts w:ascii="맑은 고딕" w:hAnsi="맑은 고딕" w:eastAsia="맑은 고딕" w:cs="맑은 고딕"/>
-                <w:sz w:val="16"/>
-              </w:rPr>
-              <w:t>AGENT_DEPLOYMENT_JOURNAL_TRUST_INVALID</w:t>
-            </w:r>
-          </w:p>
-        </w:tc>
-        <w:tc>
-          <w:tcPr>
-            <w:tcW w:type="dxa" w:w="5060"/>
-            <w:shd w:fill="FAFBFC"/>
-            <w:tcMar>
-              <w:top w:w="80" w:type="dxa"/>
-              <w:start w:w="120" w:type="dxa"/>
-              <w:bottom w:w="80" w:type="dxa"/>
-              <w:end w:w="120" w:type="dxa"/>
-            </w:tcMar>
-            <w:vAlign w:val="center"/>
-          </w:tcPr>
-          <w:p>
-            <w:pPr>
-              <w:spacing w:before="0" w:after="0" w:line="240" w:lineRule="auto"/>
-              <w:jc w:val="left"/>
-            </w:pPr>
-            <w:r>
-              <w:rPr>
-                <w:rFonts w:ascii="맑은 고딕" w:hAnsi="맑은 고딕" w:eastAsia="맑은 고딕" w:cs="맑은 고딕"/>
-                <w:sz w:val="16"/>
-              </w:rPr>
-              <w:t>작업 기록 폴더 소유자·ACL·파일 구성이 안전하지 않음. 관리자와 보안 정책 확인</w:t>
-            </w:r>
-          </w:p>
-        </w:tc>
-      </w:tr>
-      <w:tr>
-        <w:tc>
-          <w:tcPr>
-            <w:tcW w:type="dxa" w:w="4300"/>
-            <w:tcMar>
-              <w:top w:w="80" w:type="dxa"/>
-              <w:start w:w="120" w:type="dxa"/>
-              <w:bottom w:w="80" w:type="dxa"/>
-              <w:end w:w="120" w:type="dxa"/>
-            </w:tcMar>
-            <w:vAlign w:val="center"/>
-          </w:tcPr>
-          <w:p>
-            <w:pPr>
-              <w:spacing w:before="0" w:after="0" w:line="240" w:lineRule="auto"/>
-              <w:jc w:val="left"/>
-            </w:pPr>
-            <w:r>
-              <w:rPr>
-                <w:rFonts w:ascii="맑은 고딕" w:hAnsi="맑은 고딕" w:eastAsia="맑은 고딕" w:cs="맑은 고딕"/>
-                <w:sz w:val="16"/>
-              </w:rPr>
-              <w:t>AGENT_DIRECTORY_TRUST_INVALID</w:t>
-            </w:r>
-          </w:p>
-        </w:tc>
-        <w:tc>
-          <w:tcPr>
-            <w:tcW w:type="dxa" w:w="5060"/>
-            <w:tcMar>
-              <w:top w:w="80" w:type="dxa"/>
-              <w:start w:w="120" w:type="dxa"/>
-              <w:bottom w:w="80" w:type="dxa"/>
-              <w:end w:w="120" w:type="dxa"/>
-            </w:tcMar>
-            <w:vAlign w:val="center"/>
-          </w:tcPr>
-          <w:p>
-            <w:pPr>
-              <w:spacing w:before="0" w:after="0" w:line="240" w:lineRule="auto"/>
-              <w:jc w:val="left"/>
-            </w:pPr>
-            <w:r>
-              <w:rPr>
-                <w:rFonts w:ascii="맑은 고딕" w:hAnsi="맑은 고딕" w:eastAsia="맑은 고딕" w:cs="맑은 고딕"/>
-                <w:sz w:val="16"/>
-              </w:rPr>
-              <w:t>활성 Agent install/data 트리의 owner 또는 reparse 구성을 신뢰할 수 없음. 삭제·강제 소유권 변경 없이 Windows 관리자 확인</w:t>
-            </w:r>
-          </w:p>
-        </w:tc>
-      </w:tr>
-      <w:tr>
-        <w:tc>
-          <w:tcPr>
-            <w:tcW w:type="dxa" w:w="4300"/>
-            <w:shd w:fill="FAFBFC"/>
-            <w:tcMar>
-              <w:top w:w="80" w:type="dxa"/>
-              <w:start w:w="120" w:type="dxa"/>
-              <w:bottom w:w="80" w:type="dxa"/>
-              <w:end w:w="120" w:type="dxa"/>
-            </w:tcMar>
-            <w:vAlign w:val="center"/>
-          </w:tcPr>
-          <w:p>
-            <w:pPr>
-              <w:spacing w:before="0" w:after="0" w:line="240" w:lineRule="auto"/>
-              <w:jc w:val="left"/>
-            </w:pPr>
-            <w:r>
-              <w:rPr>
-                <w:rFonts w:ascii="맑은 고딕" w:hAnsi="맑은 고딕" w:eastAsia="맑은 고딕" w:cs="맑은 고딕"/>
-                <w:sz w:val="16"/>
-              </w:rPr>
-              <w:t>AGENT_RECEIPT_TRUST_INVALID</w:t>
-            </w:r>
-          </w:p>
-        </w:tc>
-        <w:tc>
-          <w:tcPr>
-            <w:tcW w:type="dxa" w:w="5060"/>
-            <w:shd w:fill="FAFBFC"/>
-            <w:tcMar>
-              <w:top w:w="80" w:type="dxa"/>
-              <w:start w:w="120" w:type="dxa"/>
-              <w:bottom w:w="80" w:type="dxa"/>
-              <w:end w:w="120" w:type="dxa"/>
-            </w:tcMar>
-            <w:vAlign w:val="center"/>
-          </w:tcPr>
-          <w:p>
-            <w:pPr>
-              <w:spacing w:before="0" w:after="0" w:line="240" w:lineRule="auto"/>
-              <w:jc w:val="left"/>
-            </w:pPr>
-            <w:r>
-              <w:rPr>
-                <w:rFonts w:ascii="맑은 고딕" w:hAnsi="맑은 고딕" w:eastAsia="맑은 고딕" w:cs="맑은 고딕"/>
-                <w:sz w:val="16"/>
-              </w:rPr>
-              <w:t>영구 삭제용 install receipt가 SYSTEM·Administrators 전용 일반 파일이 아님. 영수증과 데이터 보존 후 관리자 확인</w:t>
-            </w:r>
-          </w:p>
-        </w:tc>
-      </w:tr>
-      <w:tr>
-        <w:tc>
-          <w:tcPr>
-            <w:tcW w:type="dxa" w:w="4300"/>
-            <w:tcMar>
-              <w:top w:w="80" w:type="dxa"/>
-              <w:start w:w="120" w:type="dxa"/>
-              <w:bottom w:w="80" w:type="dxa"/>
-              <w:end w:w="120" w:type="dxa"/>
-            </w:tcMar>
-            <w:vAlign w:val="center"/>
-          </w:tcPr>
-          <w:p>
-            <w:pPr>
-              <w:spacing w:before="0" w:after="0" w:line="240" w:lineRule="auto"/>
-              <w:jc w:val="left"/>
-            </w:pPr>
-            <w:r>
-              <w:rPr>
-                <w:rFonts w:ascii="맑은 고딕" w:hAnsi="맑은 고딕" w:eastAsia="맑은 고딕" w:cs="맑은 고딕"/>
-                <w:sz w:val="16"/>
-              </w:rPr>
-              <w:t>AGENT_HTTPS_UNREACHABLE</w:t>
-            </w:r>
-          </w:p>
-        </w:tc>
-        <w:tc>
-          <w:tcPr>
-            <w:tcW w:type="dxa" w:w="5060"/>
-            <w:tcMar>
-              <w:top w:w="80" w:type="dxa"/>
-              <w:start w:w="120" w:type="dxa"/>
-              <w:bottom w:w="80" w:type="dxa"/>
-              <w:end w:w="120" w:type="dxa"/>
-            </w:tcMar>
-            <w:vAlign w:val="center"/>
-          </w:tcPr>
-          <w:p>
-            <w:pPr>
-              <w:spacing w:before="0" w:after="0" w:line="240" w:lineRule="auto"/>
-              <w:jc w:val="left"/>
-            </w:pPr>
-            <w:r>
-              <w:rPr>
-                <w:rFonts w:ascii="맑은 고딕" w:hAnsi="맑은 고딕" w:eastAsia="맑은 고딕" w:cs="맑은 고딕"/>
-                <w:sz w:val="16"/>
-              </w:rPr>
-              <w:t>Agent 서비스 → TCP/18443 경로 → Viewer PC 허용 IP 방화벽</w:t>
+              <w:t>입력한 Agent PC 이름 → 사내 DNS → IPv4 직접 입력</w:t>
             </w:r>
           </w:p>
         </w:tc>
@@ -5673,7 +5281,113 @@
                 <w:rFonts w:ascii="맑은 고딕" w:hAnsi="맑은 고딕" w:eastAsia="맑은 고딕" w:cs="맑은 고딕"/>
                 <w:sz w:val="16"/>
               </w:rPr>
-              <w:t>실제 Agent PC 주소 → 서비스 → 허용 IP 설정 도구 → Viewer PC의 원격 TCP/18443</w:t>
+              <w:t>실제 Agent PC 주소 → Agent Setup 검사 → 고정 Viewer IP → 원격 TCP/18443</w:t>
+            </w:r>
+          </w:p>
+        </w:tc>
+      </w:tr>
+      <w:tr>
+        <w:tc>
+          <w:tcPr>
+            <w:tcW w:type="dxa" w:w="4300"/>
+            <w:tcMar>
+              <w:top w:w="80" w:type="dxa"/>
+              <w:start w:w="120" w:type="dxa"/>
+              <w:bottom w:w="80" w:type="dxa"/>
+              <w:end w:w="120" w:type="dxa"/>
+            </w:tcMar>
+            <w:vAlign w:val="center"/>
+          </w:tcPr>
+          <w:p>
+            <w:pPr>
+              <w:spacing w:before="0" w:after="0" w:line="240" w:lineRule="auto"/>
+              <w:jc w:val="left"/>
+            </w:pPr>
+            <w:r>
+              <w:rPr>
+                <w:rFonts w:ascii="맑은 고딕" w:hAnsi="맑은 고딕" w:eastAsia="맑은 고딕" w:cs="맑은 고딕"/>
+                <w:sz w:val="16"/>
+              </w:rPr>
+              <w:t>AGENT_UNREACHABLE</w:t>
+            </w:r>
+          </w:p>
+        </w:tc>
+        <w:tc>
+          <w:tcPr>
+            <w:tcW w:type="dxa" w:w="5060"/>
+            <w:tcMar>
+              <w:top w:w="80" w:type="dxa"/>
+              <w:start w:w="120" w:type="dxa"/>
+              <w:bottom w:w="80" w:type="dxa"/>
+              <w:end w:w="120" w:type="dxa"/>
+            </w:tcMar>
+            <w:vAlign w:val="center"/>
+          </w:tcPr>
+          <w:p>
+            <w:pPr>
+              <w:spacing w:before="0" w:after="0" w:line="240" w:lineRule="auto"/>
+              <w:jc w:val="left"/>
+            </w:pPr>
+            <w:r>
+              <w:rPr>
+                <w:rFonts w:ascii="맑은 고딕" w:hAnsi="맑은 고딕" w:eastAsia="맑은 고딕" w:cs="맑은 고딕"/>
+                <w:sz w:val="16"/>
+              </w:rPr>
+              <w:t>Viewer와 Agent PC 사이 라우팅 → 방화벽 → EDR 차단</w:t>
+            </w:r>
+          </w:p>
+        </w:tc>
+      </w:tr>
+      <w:tr>
+        <w:tc>
+          <w:tcPr>
+            <w:tcW w:type="dxa" w:w="4300"/>
+            <w:shd w:fill="FAFBFC"/>
+            <w:tcMar>
+              <w:top w:w="80" w:type="dxa"/>
+              <w:start w:w="120" w:type="dxa"/>
+              <w:bottom w:w="80" w:type="dxa"/>
+              <w:end w:w="120" w:type="dxa"/>
+            </w:tcMar>
+            <w:vAlign w:val="center"/>
+          </w:tcPr>
+          <w:p>
+            <w:pPr>
+              <w:spacing w:before="0" w:after="0" w:line="240" w:lineRule="auto"/>
+              <w:jc w:val="left"/>
+            </w:pPr>
+            <w:r>
+              <w:rPr>
+                <w:rFonts w:ascii="맑은 고딕" w:hAnsi="맑은 고딕" w:eastAsia="맑은 고딕" w:cs="맑은 고딕"/>
+                <w:sz w:val="16"/>
+              </w:rPr>
+              <w:t>AGENT_VERSION_MISMATCH</w:t>
+            </w:r>
+          </w:p>
+        </w:tc>
+        <w:tc>
+          <w:tcPr>
+            <w:tcW w:type="dxa" w:w="5060"/>
+            <w:shd w:fill="FAFBFC"/>
+            <w:tcMar>
+              <w:top w:w="80" w:type="dxa"/>
+              <w:start w:w="120" w:type="dxa"/>
+              <w:bottom w:w="80" w:type="dxa"/>
+              <w:end w:w="120" w:type="dxa"/>
+            </w:tcMar>
+            <w:vAlign w:val="center"/>
+          </w:tcPr>
+          <w:p>
+            <w:pPr>
+              <w:spacing w:before="0" w:after="0" w:line="240" w:lineRule="auto"/>
+              <w:jc w:val="left"/>
+            </w:pPr>
+            <w:r>
+              <w:rPr>
+                <w:rFonts w:ascii="맑은 고딕" w:hAnsi="맑은 고딕" w:eastAsia="맑은 고딕" w:cs="맑은 고딕"/>
+                <w:sz w:val="16"/>
+              </w:rPr>
+              <w:t>같은 Release의 Agent ZIP과 Viewer ZIP으로 함께 업데이트</w:t>
             </w:r>
           </w:p>
         </w:tc>
@@ -5753,7 +5467,7 @@
                 <w:rFonts w:ascii="맑은 고딕" w:hAnsi="맑은 고딕" w:eastAsia="맑은 고딕" w:cs="맑은 고딕"/>
                 <w:sz w:val="16"/>
               </w:rPr>
-              <w:t>VIEWER_SOURCE_ACCESS_DENIED</w:t>
+              <w:t>AGENT_PROTOCOL_MISMATCH / TLS_IDENTITY_INVALID</w:t>
             </w:r>
           </w:p>
         </w:tc>
@@ -5779,7 +5493,7 @@
                 <w:rFonts w:ascii="맑은 고딕" w:hAnsi="맑은 고딕" w:eastAsia="맑은 고딕" w:cs="맑은 고딕"/>
                 <w:sz w:val="16"/>
               </w:rPr>
-              <w:t>UAC 관리자도 읽을 수 있는 승인된 임시 폴더에 공식 ZIP 다시 압축 해제</w:t>
+              <w:t>Agent Setup의 준비 상태 → PC 교체 여부 → HTTPS 신원 파일</w:t>
             </w:r>
           </w:p>
         </w:tc>
@@ -5806,7 +5520,7 @@
                 <w:rFonts w:ascii="맑은 고딕" w:hAnsi="맑은 고딕" w:eastAsia="맑은 고딕" w:cs="맑은 고딕"/>
                 <w:sz w:val="16"/>
               </w:rPr>
-              <w:t>VIEWER_INSTALL_PATH_EXECUTION_BLOCKED</w:t>
+              <w:t>SETUP_PACKAGE_NOT_FOUND</w:t>
             </w:r>
           </w:p>
         </w:tc>
@@ -5831,7 +5545,7 @@
                 <w:rFonts w:ascii="맑은 고딕" w:hAnsi="맑은 고딕" w:eastAsia="맑은 고딕" w:cs="맑은 고딕"/>
                 <w:sz w:val="16"/>
               </w:rPr>
-              <w:t>Program Files 실행 정책 → AppLocker·WDAC·EDR 기록 → 보안 담당자</w:t>
+              <w:t>Agent ZIP 전체 압축 해제 → Setup과 Agent EXE·BUILD-MANIFEST 존재 확인</w:t>
             </w:r>
           </w:p>
         </w:tc>
@@ -5859,7 +5573,7 @@
                 <w:rFonts w:ascii="맑은 고딕" w:hAnsi="맑은 고딕" w:eastAsia="맑은 고딕" w:cs="맑은 고딕"/>
                 <w:sz w:val="16"/>
               </w:rPr>
-              <w:t>VIEWER_USER_PHASE_FAILED</w:t>
+              <w:t>SETUP_PACKAGE_HASH_MISMATCH</w:t>
             </w:r>
           </w:p>
         </w:tc>
@@ -5885,7 +5599,7 @@
                 <w:rFonts w:ascii="맑은 고딕" w:hAnsi="맑은 고딕" w:eastAsia="맑은 고딕" w:cs="맑은 고딕"/>
                 <w:sz w:val="16"/>
               </w:rPr>
-              <w:t>원래 사용자 실행 검사·바로 가기 → 복구 UAC → Recovery 결과</w:t>
+              <w:t>실행 중지 → 공식 ZIP을 새 폴더에 다시 압축 해제 → EDR 격리 기록</w:t>
             </w:r>
           </w:p>
         </w:tc>
@@ -5912,7 +5626,7 @@
                 <w:rFonts w:ascii="맑은 고딕" w:hAnsi="맑은 고딕" w:eastAsia="맑은 고딕" w:cs="맑은 고딕"/>
                 <w:sz w:val="16"/>
               </w:rPr>
-              <w:t>VIEWER_CURRENT_SELF_CHECK_FAILED</w:t>
+              <w:t>SETUP_SERVICE_FAILED</w:t>
             </w:r>
           </w:p>
         </w:tc>
@@ -5937,7 +5651,7 @@
                 <w:rFonts w:ascii="맑은 고딕" w:hAnsi="맑은 고딕" w:eastAsia="맑은 고딕" w:cs="맑은 고딕"/>
                 <w:sz w:val="16"/>
               </w:rPr>
-              <w:t>현재·rollback 설치는 보존됨 → EDR·AppLocker·WDAC 지연·차단 확인 → 재시도</w:t>
+              <w:t>Windows 서비스 관리 권한 → 기존 SamsungSwitchWatchAgent 상태</w:t>
             </w:r>
           </w:p>
         </w:tc>
@@ -5965,7 +5679,7 @@
                 <w:rFonts w:ascii="맑은 고딕" w:hAnsi="맑은 고딕" w:eastAsia="맑은 고딕" w:cs="맑은 고딕"/>
                 <w:sz w:val="16"/>
               </w:rPr>
-              <w:t>VIEWER_ROLLBACK_ACTIVE_CHANGED</w:t>
+              <w:t>SETUP_FIREWALL_FAILED</w:t>
             </w:r>
           </w:p>
         </w:tc>
@@ -5991,7 +5705,7 @@
                 <w:rFonts w:ascii="맑은 고딕" w:hAnsi="맑은 고딕" w:eastAsia="맑은 고딕" w:cs="맑은 고딕"/>
                 <w:sz w:val="16"/>
               </w:rPr>
-              <w:t>다른 Viewer 설치가 먼저 완료됨 → 두 설치 증거 보존 → 최신 ZIP으로 다시 설치</w:t>
+              <w:t>Windows 방화벽 서비스 → 동명 비소유 규칙 → 보안 정책</w:t>
             </w:r>
           </w:p>
         </w:tc>
@@ -6018,7 +5732,7 @@
                 <w:rFonts w:ascii="맑은 고딕" w:hAnsi="맑은 고딕" w:eastAsia="맑은 고딕" w:cs="맑은 고딕"/>
                 <w:sz w:val="16"/>
               </w:rPr>
-              <w:t>VIEWER_ROLLBACK_TRANSACTION_MISSING</w:t>
+              <w:t>SETUP_HEALTH_FAILED</w:t>
             </w:r>
           </w:p>
         </w:tc>
@@ -6043,7 +5757,7 @@
                 <w:rFonts w:ascii="맑은 고딕" w:hAnsi="맑은 고딕" w:eastAsia="맑은 고딕" w:cs="맑은 고딕"/>
                 <w:sz w:val="16"/>
               </w:rPr>
-              <w:t>관리자 전용 작업 marker 없음 → 설치·slot 보존 → 최신 ZIP으로 관리자 재설치</w:t>
+              <w:t>서비스 실행 → 로컬 HTTPS/18443 → Agent 설정과 Windows 이벤트</w:t>
             </w:r>
           </w:p>
         </w:tc>
@@ -6071,7 +5785,7 @@
                 <w:rFonts w:ascii="맑은 고딕" w:hAnsi="맑은 고딕" w:eastAsia="맑은 고딕" w:cs="맑은 고딕"/>
                 <w:sz w:val="16"/>
               </w:rPr>
-              <w:t>VIEWER_ROLLBACK_TRANSACTION_INVALID</w:t>
+              <w:t>SETUP_ROLLBACK_FAILED</w:t>
             </w:r>
           </w:p>
         </w:tc>
@@ -6097,1067 +5811,7 @@
                 <w:rFonts w:ascii="맑은 고딕" w:hAnsi="맑은 고딕" w:eastAsia="맑은 고딕" w:cs="맑은 고딕"/>
                 <w:sz w:val="16"/>
               </w:rPr>
-              <w:t>marker 작업 ID·해시·slot 결속 불일치 → 증거 삭제 금지 → 관리자 확인</w:t>
-            </w:r>
-          </w:p>
-        </w:tc>
-      </w:tr>
-      <w:tr>
-        <w:tc>
-          <w:tcPr>
-            <w:tcW w:type="dxa" w:w="4300"/>
-            <w:tcMar>
-              <w:top w:w="80" w:type="dxa"/>
-              <w:start w:w="120" w:type="dxa"/>
-              <w:bottom w:w="80" w:type="dxa"/>
-              <w:end w:w="120" w:type="dxa"/>
-            </w:tcMar>
-            <w:vAlign w:val="center"/>
-          </w:tcPr>
-          <w:p>
-            <w:pPr>
-              <w:spacing w:before="0" w:after="0" w:line="240" w:lineRule="auto"/>
-              <w:jc w:val="left"/>
-            </w:pPr>
-            <w:r>
-              <w:rPr>
-                <w:rFonts w:ascii="맑은 고딕" w:hAnsi="맑은 고딕" w:eastAsia="맑은 고딕" w:cs="맑은 고딕"/>
-                <w:sz w:val="16"/>
-              </w:rPr>
-              <w:t>VIEWER_ROLLBACK_TRANSACTION_TRUST_INVALID</w:t>
-            </w:r>
-          </w:p>
-        </w:tc>
-        <w:tc>
-          <w:tcPr>
-            <w:tcW w:type="dxa" w:w="5060"/>
-            <w:tcMar>
-              <w:top w:w="80" w:type="dxa"/>
-              <w:start w:w="120" w:type="dxa"/>
-              <w:bottom w:w="80" w:type="dxa"/>
-              <w:end w:w="120" w:type="dxa"/>
-            </w:tcMar>
-            <w:vAlign w:val="center"/>
-          </w:tcPr>
-          <w:p>
-            <w:pPr>
-              <w:spacing w:before="0" w:after="0" w:line="240" w:lineRule="auto"/>
-              <w:jc w:val="left"/>
-            </w:pPr>
-            <w:r>
-              <w:rPr>
-                <w:rFonts w:ascii="맑은 고딕" w:hAnsi="맑은 고딕" w:eastAsia="맑은 고딕" w:cs="맑은 고딕"/>
-                <w:sz w:val="16"/>
-              </w:rPr>
-              <w:t>marker ACL·소유권 신뢰 불가 → ACL 우회 금지 → 관리자·보안 담당자 확인</w:t>
-            </w:r>
-          </w:p>
-        </w:tc>
-      </w:tr>
-      <w:tr>
-        <w:tc>
-          <w:tcPr>
-            <w:tcW w:type="dxa" w:w="4300"/>
-            <w:shd w:fill="FAFBFC"/>
-            <w:tcMar>
-              <w:top w:w="80" w:type="dxa"/>
-              <w:start w:w="120" w:type="dxa"/>
-              <w:bottom w:w="80" w:type="dxa"/>
-              <w:end w:w="120" w:type="dxa"/>
-            </w:tcMar>
-            <w:vAlign w:val="center"/>
-          </w:tcPr>
-          <w:p>
-            <w:pPr>
-              <w:spacing w:before="0" w:after="0" w:line="240" w:lineRule="auto"/>
-              <w:jc w:val="left"/>
-            </w:pPr>
-            <w:r>
-              <w:rPr>
-                <w:rFonts w:ascii="맑은 고딕" w:hAnsi="맑은 고딕" w:eastAsia="맑은 고딕" w:cs="맑은 고딕"/>
-                <w:sz w:val="16"/>
-              </w:rPr>
-              <w:t>VIEWER_ROLLBACK_TRANSACTION_CONSUME_FAILED</w:t>
-            </w:r>
-          </w:p>
-        </w:tc>
-        <w:tc>
-          <w:tcPr>
-            <w:tcW w:type="dxa" w:w="5060"/>
-            <w:shd w:fill="FAFBFC"/>
-            <w:tcMar>
-              <w:top w:w="80" w:type="dxa"/>
-              <w:start w:w="120" w:type="dxa"/>
-              <w:bottom w:w="80" w:type="dxa"/>
-              <w:end w:w="120" w:type="dxa"/>
-            </w:tcMar>
-            <w:vAlign w:val="center"/>
-          </w:tcPr>
-          <w:p>
-            <w:pPr>
-              <w:spacing w:before="0" w:after="0" w:line="240" w:lineRule="auto"/>
-              <w:jc w:val="left"/>
-            </w:pPr>
-            <w:r>
-              <w:rPr>
-                <w:rFonts w:ascii="맑은 고딕" w:hAnsi="맑은 고딕" w:eastAsia="맑은 고딕" w:cs="맑은 고딕"/>
-                <w:sz w:val="16"/>
-              </w:rPr>
-              <w:t>복원 뒤 marker 제거 실패 → 복원된 Viewer 보존 → 관리자 재설치</w:t>
-            </w:r>
-          </w:p>
-        </w:tc>
-      </w:tr>
-      <w:tr>
-        <w:tc>
-          <w:tcPr>
-            <w:tcW w:type="dxa" w:w="4300"/>
-            <w:tcMar>
-              <w:top w:w="80" w:type="dxa"/>
-              <w:start w:w="120" w:type="dxa"/>
-              <w:bottom w:w="80" w:type="dxa"/>
-              <w:end w:w="120" w:type="dxa"/>
-            </w:tcMar>
-            <w:vAlign w:val="center"/>
-          </w:tcPr>
-          <w:p>
-            <w:pPr>
-              <w:spacing w:before="0" w:after="0" w:line="240" w:lineRule="auto"/>
-              <w:jc w:val="left"/>
-            </w:pPr>
-            <w:r>
-              <w:rPr>
-                <w:rFonts w:ascii="맑은 고딕" w:hAnsi="맑은 고딕" w:eastAsia="맑은 고딕" w:cs="맑은 고딕"/>
-                <w:sz w:val="16"/>
-              </w:rPr>
-              <w:t>VIEWER_ROLLBACK_TRANSACTION_WRITE_FAILED</w:t>
-            </w:r>
-          </w:p>
-        </w:tc>
-        <w:tc>
-          <w:tcPr>
-            <w:tcW w:type="dxa" w:w="5060"/>
-            <w:tcMar>
-              <w:top w:w="80" w:type="dxa"/>
-              <w:start w:w="120" w:type="dxa"/>
-              <w:bottom w:w="80" w:type="dxa"/>
-              <w:end w:w="120" w:type="dxa"/>
-            </w:tcMar>
-            <w:vAlign w:val="center"/>
-          </w:tcPr>
-          <w:p>
-            <w:pPr>
-              <w:spacing w:before="0" w:after="0" w:line="240" w:lineRule="auto"/>
-              <w:jc w:val="left"/>
-            </w:pPr>
-            <w:r>
-              <w:rPr>
-                <w:rFonts w:ascii="맑은 고딕" w:hAnsi="맑은 고딕" w:eastAsia="맑은 고딕" w:cs="맑은 고딕"/>
-                <w:sz w:val="16"/>
-              </w:rPr>
-              <w:t>새 marker 확정 실패 → Recovery 결과 → 설치·slot·marker 증거 보존</w:t>
-            </w:r>
-          </w:p>
-        </w:tc>
-      </w:tr>
-      <w:tr>
-        <w:tc>
-          <w:tcPr>
-            <w:tcW w:type="dxa" w:w="4300"/>
-            <w:shd w:fill="FAFBFC"/>
-            <w:tcMar>
-              <w:top w:w="80" w:type="dxa"/>
-              <w:start w:w="120" w:type="dxa"/>
-              <w:bottom w:w="80" w:type="dxa"/>
-              <w:end w:w="120" w:type="dxa"/>
-            </w:tcMar>
-            <w:vAlign w:val="center"/>
-          </w:tcPr>
-          <w:p>
-            <w:pPr>
-              <w:spacing w:before="0" w:after="0" w:line="240" w:lineRule="auto"/>
-              <w:jc w:val="left"/>
-            </w:pPr>
-            <w:r>
-              <w:rPr>
-                <w:rFonts w:ascii="맑은 고딕" w:hAnsi="맑은 고딕" w:eastAsia="맑은 고딕" w:cs="맑은 고딕"/>
-                <w:sz w:val="16"/>
-              </w:rPr>
-              <w:t>VIEWER_MACHINE_ROLLBACK_INCOMPLETE</w:t>
-            </w:r>
-          </w:p>
-        </w:tc>
-        <w:tc>
-          <w:tcPr>
-            <w:tcW w:type="dxa" w:w="5060"/>
-            <w:shd w:fill="FAFBFC"/>
-            <w:tcMar>
-              <w:top w:w="80" w:type="dxa"/>
-              <w:start w:w="120" w:type="dxa"/>
-              <w:bottom w:w="80" w:type="dxa"/>
-              <w:end w:w="120" w:type="dxa"/>
-            </w:tcMar>
-            <w:vAlign w:val="center"/>
-          </w:tcPr>
-          <w:p>
-            <w:pPr>
-              <w:spacing w:before="0" w:after="0" w:line="240" w:lineRule="auto"/>
-              <w:jc w:val="left"/>
-            </w:pPr>
-            <w:r>
-              <w:rPr>
-                <w:rFonts w:ascii="맑은 고딕" w:hAnsi="맑은 고딕" w:eastAsia="맑은 고딕" w:cs="맑은 고딕"/>
-                <w:sz w:val="16"/>
-              </w:rPr>
-              <w:t>현재 설치와 Viewer.__rollback 보존 → Windows 관리자 확인</w:t>
-            </w:r>
-          </w:p>
-        </w:tc>
-      </w:tr>
-      <w:tr>
-        <w:tc>
-          <w:tcPr>
-            <w:tcW w:type="dxa" w:w="4300"/>
-            <w:tcMar>
-              <w:top w:w="80" w:type="dxa"/>
-              <w:start w:w="120" w:type="dxa"/>
-              <w:bottom w:w="80" w:type="dxa"/>
-              <w:end w:w="120" w:type="dxa"/>
-            </w:tcMar>
-            <w:vAlign w:val="center"/>
-          </w:tcPr>
-          <w:p>
-            <w:pPr>
-              <w:spacing w:before="0" w:after="0" w:line="240" w:lineRule="auto"/>
-              <w:jc w:val="left"/>
-            </w:pPr>
-            <w:r>
-              <w:rPr>
-                <w:rFonts w:ascii="맑은 고딕" w:hAnsi="맑은 고딕" w:eastAsia="맑은 고딕" w:cs="맑은 고딕"/>
-                <w:sz w:val="16"/>
-              </w:rPr>
-              <w:t>VIEWER_ROLLBACK_ELEVATION_NOT_GRANTED</w:t>
-            </w:r>
-          </w:p>
-        </w:tc>
-        <w:tc>
-          <w:tcPr>
-            <w:tcW w:type="dxa" w:w="5060"/>
-            <w:tcMar>
-              <w:top w:w="80" w:type="dxa"/>
-              <w:start w:w="120" w:type="dxa"/>
-              <w:bottom w:w="80" w:type="dxa"/>
-              <w:end w:w="120" w:type="dxa"/>
-            </w:tcMar>
-            <w:vAlign w:val="center"/>
-          </w:tcPr>
-          <w:p>
-            <w:pPr>
-              <w:spacing w:before="0" w:after="0" w:line="240" w:lineRule="auto"/>
-              <w:jc w:val="left"/>
-            </w:pPr>
-            <w:r>
-              <w:rPr>
-                <w:rFonts w:ascii="맑은 고딕" w:hAnsi="맑은 고딕" w:eastAsia="맑은 고딕" w:cs="맑은 고딕"/>
-                <w:sz w:val="16"/>
-              </w:rPr>
-              <w:t>복구 UAC 취소 여부 → rollback 슬롯 보존 → 관리자 재시도</w:t>
-            </w:r>
-          </w:p>
-        </w:tc>
-      </w:tr>
-      <w:tr>
-        <w:tc>
-          <w:tcPr>
-            <w:tcW w:type="dxa" w:w="4300"/>
-            <w:shd w:fill="FAFBFC"/>
-            <w:tcMar>
-              <w:top w:w="80" w:type="dxa"/>
-              <w:start w:w="120" w:type="dxa"/>
-              <w:bottom w:w="80" w:type="dxa"/>
-              <w:end w:w="120" w:type="dxa"/>
-            </w:tcMar>
-            <w:vAlign w:val="center"/>
-          </w:tcPr>
-          <w:p>
-            <w:pPr>
-              <w:spacing w:before="0" w:after="0" w:line="240" w:lineRule="auto"/>
-              <w:jc w:val="left"/>
-            </w:pPr>
-            <w:r>
-              <w:rPr>
-                <w:rFonts w:ascii="맑은 고딕" w:hAnsi="맑은 고딕" w:eastAsia="맑은 고딕" w:cs="맑은 고딕"/>
-                <w:sz w:val="16"/>
-              </w:rPr>
-              <w:t>VIEWER_SHORTCUT_DIRECTORY_UNAVAILABLE</w:t>
-            </w:r>
-          </w:p>
-        </w:tc>
-        <w:tc>
-          <w:tcPr>
-            <w:tcW w:type="dxa" w:w="5060"/>
-            <w:shd w:fill="FAFBFC"/>
-            <w:tcMar>
-              <w:top w:w="80" w:type="dxa"/>
-              <w:start w:w="120" w:type="dxa"/>
-              <w:bottom w:w="80" w:type="dxa"/>
-              <w:end w:w="120" w:type="dxa"/>
-            </w:tcMar>
-            <w:vAlign w:val="center"/>
-          </w:tcPr>
-          <w:p>
-            <w:pPr>
-              <w:spacing w:before="0" w:after="0" w:line="240" w:lineRule="auto"/>
-              <w:jc w:val="left"/>
-            </w:pPr>
-            <w:r>
-              <w:rPr>
-                <w:rFonts w:ascii="맑은 고딕" w:hAnsi="맑은 고딕" w:eastAsia="맑은 고딕" w:cs="맑은 고딕"/>
-                <w:sz w:val="16"/>
-              </w:rPr>
-              <w:t>Viewer를 설치할 동일 Windows 사용자 → 시작 메뉴·시작프로그램 폴더 쓰기 권한 → 보안 정책</w:t>
-            </w:r>
-          </w:p>
-        </w:tc>
-      </w:tr>
-      <w:tr>
-        <w:tc>
-          <w:tcPr>
-            <w:tcW w:type="dxa" w:w="4300"/>
-            <w:tcMar>
-              <w:top w:w="80" w:type="dxa"/>
-              <w:start w:w="120" w:type="dxa"/>
-              <w:bottom w:w="80" w:type="dxa"/>
-              <w:end w:w="120" w:type="dxa"/>
-            </w:tcMar>
-            <w:vAlign w:val="center"/>
-          </w:tcPr>
-          <w:p>
-            <w:pPr>
-              <w:spacing w:before="0" w:after="0" w:line="240" w:lineRule="auto"/>
-              <w:jc w:val="left"/>
-            </w:pPr>
-            <w:r>
-              <w:rPr>
-                <w:rFonts w:ascii="맑은 고딕" w:hAnsi="맑은 고딕" w:eastAsia="맑은 고딕" w:cs="맑은 고딕"/>
-                <w:sz w:val="16"/>
-              </w:rPr>
-              <w:t>VIEWER_SHORTCUT_SETUP_FAILED</w:t>
-            </w:r>
-          </w:p>
-        </w:tc>
-        <w:tc>
-          <w:tcPr>
-            <w:tcW w:type="dxa" w:w="5060"/>
-            <w:tcMar>
-              <w:top w:w="80" w:type="dxa"/>
-              <w:start w:w="120" w:type="dxa"/>
-              <w:bottom w:w="80" w:type="dxa"/>
-              <w:end w:w="120" w:type="dxa"/>
-            </w:tcMar>
-            <w:vAlign w:val="center"/>
-          </w:tcPr>
-          <w:p>
-            <w:pPr>
-              <w:spacing w:before="0" w:after="0" w:line="240" w:lineRule="auto"/>
-              <w:jc w:val="left"/>
-            </w:pPr>
-            <w:r>
-              <w:rPr>
-                <w:rFonts w:ascii="맑은 고딕" w:hAnsi="맑은 고딕" w:eastAsia="맑은 고딕" w:cs="맑은 고딕"/>
-                <w:sz w:val="16"/>
-              </w:rPr>
-              <w:t>Recovery 결과 → 바로 가기 생성 권한 → 보안 프로그램 차단</w:t>
-            </w:r>
-          </w:p>
-        </w:tc>
-      </w:tr>
-      <w:tr>
-        <w:tc>
-          <w:tcPr>
-            <w:tcW w:type="dxa" w:w="4300"/>
-            <w:shd w:fill="FAFBFC"/>
-            <w:tcMar>
-              <w:top w:w="80" w:type="dxa"/>
-              <w:start w:w="120" w:type="dxa"/>
-              <w:bottom w:w="80" w:type="dxa"/>
-              <w:end w:w="120" w:type="dxa"/>
-            </w:tcMar>
-            <w:vAlign w:val="center"/>
-          </w:tcPr>
-          <w:p>
-            <w:pPr>
-              <w:spacing w:before="0" w:after="0" w:line="240" w:lineRule="auto"/>
-              <w:jc w:val="left"/>
-            </w:pPr>
-            <w:r>
-              <w:rPr>
-                <w:rFonts w:ascii="맑은 고딕" w:hAnsi="맑은 고딕" w:eastAsia="맑은 고딕" w:cs="맑은 고딕"/>
-                <w:sz w:val="16"/>
-              </w:rPr>
-              <w:t>VIEWER_SMOKE_CHECK_FAILED</w:t>
-            </w:r>
-          </w:p>
-        </w:tc>
-        <w:tc>
-          <w:tcPr>
-            <w:tcW w:type="dxa" w:w="5060"/>
-            <w:shd w:fill="FAFBFC"/>
-            <w:tcMar>
-              <w:top w:w="80" w:type="dxa"/>
-              <w:start w:w="120" w:type="dxa"/>
-              <w:bottom w:w="80" w:type="dxa"/>
-              <w:end w:w="120" w:type="dxa"/>
-            </w:tcMar>
-            <w:vAlign w:val="center"/>
-          </w:tcPr>
-          <w:p>
-            <w:pPr>
-              <w:spacing w:before="0" w:after="0" w:line="240" w:lineRule="auto"/>
-              <w:jc w:val="left"/>
-            </w:pPr>
-            <w:r>
-              <w:rPr>
-                <w:rFonts w:ascii="맑은 고딕" w:hAnsi="맑은 고딕" w:eastAsia="맑은 고딕" w:cs="맑은 고딕"/>
-                <w:sz w:val="16"/>
-              </w:rPr>
-              <w:t>Detail·ExitCode → 기존 Viewer 복구 → 설치 journal·Viewer 진단 로그 → 보안 프로그램</w:t>
-            </w:r>
-          </w:p>
-        </w:tc>
-      </w:tr>
-      <w:tr>
-        <w:tc>
-          <w:tcPr>
-            <w:tcW w:type="dxa" w:w="4300"/>
-            <w:tcMar>
-              <w:top w:w="80" w:type="dxa"/>
-              <w:start w:w="120" w:type="dxa"/>
-              <w:bottom w:w="80" w:type="dxa"/>
-              <w:end w:w="120" w:type="dxa"/>
-            </w:tcMar>
-            <w:vAlign w:val="center"/>
-          </w:tcPr>
-          <w:p>
-            <w:pPr>
-              <w:spacing w:before="0" w:after="0" w:line="240" w:lineRule="auto"/>
-              <w:jc w:val="left"/>
-            </w:pPr>
-            <w:r>
-              <w:rPr>
-                <w:rFonts w:ascii="맑은 고딕" w:hAnsi="맑은 고딕" w:eastAsia="맑은 고딕" w:cs="맑은 고딕"/>
-                <w:sz w:val="16"/>
-              </w:rPr>
-              <w:t>VIEWER_PACKAGE_FILE_MISSING</w:t>
-            </w:r>
-          </w:p>
-        </w:tc>
-        <w:tc>
-          <w:tcPr>
-            <w:tcW w:type="dxa" w:w="5060"/>
-            <w:tcMar>
-              <w:top w:w="80" w:type="dxa"/>
-              <w:start w:w="120" w:type="dxa"/>
-              <w:bottom w:w="80" w:type="dxa"/>
-              <w:end w:w="120" w:type="dxa"/>
-            </w:tcMar>
-            <w:vAlign w:val="center"/>
-          </w:tcPr>
-          <w:p>
-            <w:pPr>
-              <w:spacing w:before="0" w:after="0" w:line="240" w:lineRule="auto"/>
-              <w:jc w:val="left"/>
-            </w:pPr>
-            <w:r>
-              <w:rPr>
-                <w:rFonts w:ascii="맑은 고딕" w:hAnsi="맑은 고딕" w:eastAsia="맑은 고딕" w:cs="맑은 고딕"/>
-                <w:sz w:val="16"/>
-              </w:rPr>
-              <w:t>공식 ZIP을 새 폴더에 다시 압축 해제 → EDR 격리 기록 확인</w:t>
-            </w:r>
-          </w:p>
-        </w:tc>
-      </w:tr>
-      <w:tr>
-        <w:tc>
-          <w:tcPr>
-            <w:tcW w:type="dxa" w:w="4300"/>
-            <w:shd w:fill="FAFBFC"/>
-            <w:tcMar>
-              <w:top w:w="80" w:type="dxa"/>
-              <w:start w:w="120" w:type="dxa"/>
-              <w:bottom w:w="80" w:type="dxa"/>
-              <w:end w:w="120" w:type="dxa"/>
-            </w:tcMar>
-            <w:vAlign w:val="center"/>
-          </w:tcPr>
-          <w:p>
-            <w:pPr>
-              <w:spacing w:before="0" w:after="0" w:line="240" w:lineRule="auto"/>
-              <w:jc w:val="left"/>
-            </w:pPr>
-            <w:r>
-              <w:rPr>
-                <w:rFonts w:ascii="맑은 고딕" w:hAnsi="맑은 고딕" w:eastAsia="맑은 고딕" w:cs="맑은 고딕"/>
-                <w:sz w:val="16"/>
-              </w:rPr>
-              <w:t>VIEWER_PACKAGE_HASH_MISMATCH</w:t>
-            </w:r>
-          </w:p>
-        </w:tc>
-        <w:tc>
-          <w:tcPr>
-            <w:tcW w:type="dxa" w:w="5060"/>
-            <w:shd w:fill="FAFBFC"/>
-            <w:tcMar>
-              <w:top w:w="80" w:type="dxa"/>
-              <w:start w:w="120" w:type="dxa"/>
-              <w:bottom w:w="80" w:type="dxa"/>
-              <w:end w:w="120" w:type="dxa"/>
-            </w:tcMar>
-            <w:vAlign w:val="center"/>
-          </w:tcPr>
-          <w:p>
-            <w:pPr>
-              <w:spacing w:before="0" w:after="0" w:line="240" w:lineRule="auto"/>
-              <w:jc w:val="left"/>
-            </w:pPr>
-            <w:r>
-              <w:rPr>
-                <w:rFonts w:ascii="맑은 고딕" w:hAnsi="맑은 고딕" w:eastAsia="맑은 고딕" w:cs="맑은 고딕"/>
-                <w:sz w:val="16"/>
-              </w:rPr>
-              <w:t>변조 파일 실행 중지 → 공식 ZIP·매니페스트와 보안 프로그램 기록 확인</w:t>
-            </w:r>
-          </w:p>
-        </w:tc>
-      </w:tr>
-      <w:tr>
-        <w:tc>
-          <w:tcPr>
-            <w:tcW w:type="dxa" w:w="4300"/>
-            <w:tcMar>
-              <w:top w:w="80" w:type="dxa"/>
-              <w:start w:w="120" w:type="dxa"/>
-              <w:bottom w:w="80" w:type="dxa"/>
-              <w:end w:w="120" w:type="dxa"/>
-            </w:tcMar>
-            <w:vAlign w:val="center"/>
-          </w:tcPr>
-          <w:p>
-            <w:pPr>
-              <w:spacing w:before="0" w:after="0" w:line="240" w:lineRule="auto"/>
-              <w:jc w:val="left"/>
-            </w:pPr>
-            <w:r>
-              <w:rPr>
-                <w:rFonts w:ascii="맑은 고딕" w:hAnsi="맑은 고딕" w:eastAsia="맑은 고딕" w:cs="맑은 고딕"/>
-                <w:sz w:val="16"/>
-              </w:rPr>
-              <w:t>VIEWER_UNSUPPORTED_ARCHITECTURE</w:t>
-            </w:r>
-          </w:p>
-        </w:tc>
-        <w:tc>
-          <w:tcPr>
-            <w:tcW w:type="dxa" w:w="5060"/>
-            <w:tcMar>
-              <w:top w:w="80" w:type="dxa"/>
-              <w:start w:w="120" w:type="dxa"/>
-              <w:bottom w:w="80" w:type="dxa"/>
-              <w:end w:w="120" w:type="dxa"/>
-            </w:tcMar>
-            <w:vAlign w:val="center"/>
-          </w:tcPr>
-          <w:p>
-            <w:pPr>
-              <w:spacing w:before="0" w:after="0" w:line="240" w:lineRule="auto"/>
-              <w:jc w:val="left"/>
-            </w:pPr>
-            <w:r>
-              <w:rPr>
-                <w:rFonts w:ascii="맑은 고딕" w:hAnsi="맑은 고딕" w:eastAsia="맑은 고딕" w:cs="맑은 고딕"/>
-                <w:sz w:val="16"/>
-              </w:rPr>
-              <w:t>64비트 Windows PC에서 win-x64 Viewer 설치</w:t>
-            </w:r>
-          </w:p>
-        </w:tc>
-      </w:tr>
-      <w:tr>
-        <w:tc>
-          <w:tcPr>
-            <w:tcW w:type="dxa" w:w="4300"/>
-            <w:shd w:fill="FAFBFC"/>
-            <w:tcMar>
-              <w:top w:w="80" w:type="dxa"/>
-              <w:start w:w="120" w:type="dxa"/>
-              <w:bottom w:w="80" w:type="dxa"/>
-              <w:end w:w="120" w:type="dxa"/>
-            </w:tcMar>
-            <w:vAlign w:val="center"/>
-          </w:tcPr>
-          <w:p>
-            <w:pPr>
-              <w:spacing w:before="0" w:after="0" w:line="240" w:lineRule="auto"/>
-              <w:jc w:val="left"/>
-            </w:pPr>
-            <w:r>
-              <w:rPr>
-                <w:rFonts w:ascii="맑은 고딕" w:hAnsi="맑은 고딕" w:eastAsia="맑은 고딕" w:cs="맑은 고딕"/>
-                <w:sz w:val="16"/>
-              </w:rPr>
-              <w:t>VIEWER_SELF_CHECK_START_FAILED</w:t>
-            </w:r>
-          </w:p>
-        </w:tc>
-        <w:tc>
-          <w:tcPr>
-            <w:tcW w:type="dxa" w:w="5060"/>
-            <w:shd w:fill="FAFBFC"/>
-            <w:tcMar>
-              <w:top w:w="80" w:type="dxa"/>
-              <w:start w:w="120" w:type="dxa"/>
-              <w:bottom w:w="80" w:type="dxa"/>
-              <w:end w:w="120" w:type="dxa"/>
-            </w:tcMar>
-            <w:vAlign w:val="center"/>
-          </w:tcPr>
-          <w:p>
-            <w:pPr>
-              <w:spacing w:before="0" w:after="0" w:line="240" w:lineRule="auto"/>
-              <w:jc w:val="left"/>
-            </w:pPr>
-            <w:r>
-              <w:rPr>
-                <w:rFonts w:ascii="맑은 고딕" w:hAnsi="맑은 고딕" w:eastAsia="맑은 고딕" w:cs="맑은 고딕"/>
-                <w:sz w:val="16"/>
-              </w:rPr>
-              <w:t>Windows x64 → AppLocker·WDAC·EDR 실행 차단 확인</w:t>
-            </w:r>
-          </w:p>
-        </w:tc>
-      </w:tr>
-      <w:tr>
-        <w:tc>
-          <w:tcPr>
-            <w:tcW w:type="dxa" w:w="4300"/>
-            <w:tcMar>
-              <w:top w:w="80" w:type="dxa"/>
-              <w:start w:w="120" w:type="dxa"/>
-              <w:bottom w:w="80" w:type="dxa"/>
-              <w:end w:w="120" w:type="dxa"/>
-            </w:tcMar>
-            <w:vAlign w:val="center"/>
-          </w:tcPr>
-          <w:p>
-            <w:pPr>
-              <w:spacing w:before="0" w:after="0" w:line="240" w:lineRule="auto"/>
-              <w:jc w:val="left"/>
-            </w:pPr>
-            <w:r>
-              <w:rPr>
-                <w:rFonts w:ascii="맑은 고딕" w:hAnsi="맑은 고딕" w:eastAsia="맑은 고딕" w:cs="맑은 고딕"/>
-                <w:sz w:val="16"/>
-              </w:rPr>
-              <w:t>VIEWER_SELF_CHECK_WAIT_FAILED</w:t>
-            </w:r>
-          </w:p>
-        </w:tc>
-        <w:tc>
-          <w:tcPr>
-            <w:tcW w:type="dxa" w:w="5060"/>
-            <w:tcMar>
-              <w:top w:w="80" w:type="dxa"/>
-              <w:start w:w="120" w:type="dxa"/>
-              <w:bottom w:w="80" w:type="dxa"/>
-              <w:end w:w="120" w:type="dxa"/>
-            </w:tcMar>
-            <w:vAlign w:val="center"/>
-          </w:tcPr>
-          <w:p>
-            <w:pPr>
-              <w:spacing w:before="0" w:after="0" w:line="240" w:lineRule="auto"/>
-              <w:jc w:val="left"/>
-            </w:pPr>
-            <w:r>
-              <w:rPr>
-                <w:rFonts w:ascii="맑은 고딕" w:hAnsi="맑은 고딕" w:eastAsia="맑은 고딕" w:cs="맑은 고딕"/>
-                <w:sz w:val="16"/>
-              </w:rPr>
-              <w:t>설치 journal → Windows Application 로그 → 다시 설치</w:t>
-            </w:r>
-          </w:p>
-        </w:tc>
-      </w:tr>
-      <w:tr>
-        <w:tc>
-          <w:tcPr>
-            <w:tcW w:type="dxa" w:w="4300"/>
-            <w:shd w:fill="FAFBFC"/>
-            <w:tcMar>
-              <w:top w:w="80" w:type="dxa"/>
-              <w:start w:w="120" w:type="dxa"/>
-              <w:bottom w:w="80" w:type="dxa"/>
-              <w:end w:w="120" w:type="dxa"/>
-            </w:tcMar>
-            <w:vAlign w:val="center"/>
-          </w:tcPr>
-          <w:p>
-            <w:pPr>
-              <w:spacing w:before="0" w:after="0" w:line="240" w:lineRule="auto"/>
-              <w:jc w:val="left"/>
-            </w:pPr>
-            <w:r>
-              <w:rPr>
-                <w:rFonts w:ascii="맑은 고딕" w:hAnsi="맑은 고딕" w:eastAsia="맑은 고딕" w:cs="맑은 고딕"/>
-                <w:sz w:val="16"/>
-              </w:rPr>
-              <w:t>VIEWER_SELF_CHECK_EXITED_NONZERO</w:t>
-            </w:r>
-          </w:p>
-        </w:tc>
-        <w:tc>
-          <w:tcPr>
-            <w:tcW w:type="dxa" w:w="5060"/>
-            <w:shd w:fill="FAFBFC"/>
-            <w:tcMar>
-              <w:top w:w="80" w:type="dxa"/>
-              <w:start w:w="120" w:type="dxa"/>
-              <w:bottom w:w="80" w:type="dxa"/>
-              <w:end w:w="120" w:type="dxa"/>
-            </w:tcMar>
-            <w:vAlign w:val="center"/>
-          </w:tcPr>
-          <w:p>
-            <w:pPr>
-              <w:spacing w:before="0" w:after="0" w:line="240" w:lineRule="auto"/>
-              <w:jc w:val="left"/>
-            </w:pPr>
-            <w:r>
-              <w:rPr>
-                <w:rFonts w:ascii="맑은 고딕" w:hAnsi="맑은 고딕" w:eastAsia="맑은 고딕" w:cs="맑은 고딕"/>
-                <w:sz w:val="16"/>
-              </w:rPr>
-              <w:t>표시된 ExitCode → Windows Application 로그·EDR 기록 확인</w:t>
-            </w:r>
-          </w:p>
-        </w:tc>
-      </w:tr>
-      <w:tr>
-        <w:tc>
-          <w:tcPr>
-            <w:tcW w:type="dxa" w:w="4300"/>
-            <w:tcMar>
-              <w:top w:w="80" w:type="dxa"/>
-              <w:start w:w="120" w:type="dxa"/>
-              <w:bottom w:w="80" w:type="dxa"/>
-              <w:end w:w="120" w:type="dxa"/>
-            </w:tcMar>
-            <w:vAlign w:val="center"/>
-          </w:tcPr>
-          <w:p>
-            <w:pPr>
-              <w:spacing w:before="0" w:after="0" w:line="240" w:lineRule="auto"/>
-              <w:jc w:val="left"/>
-            </w:pPr>
-            <w:r>
-              <w:rPr>
-                <w:rFonts w:ascii="맑은 고딕" w:hAnsi="맑은 고딕" w:eastAsia="맑은 고딕" w:cs="맑은 고딕"/>
-                <w:sz w:val="16"/>
-              </w:rPr>
-              <w:t>VIEWER_SELF_CHECK_ACCESS_DENIED</w:t>
-            </w:r>
-          </w:p>
-        </w:tc>
-        <w:tc>
-          <w:tcPr>
-            <w:tcW w:type="dxa" w:w="5060"/>
-            <w:tcMar>
-              <w:top w:w="80" w:type="dxa"/>
-              <w:start w:w="120" w:type="dxa"/>
-              <w:bottom w:w="80" w:type="dxa"/>
-              <w:end w:w="120" w:type="dxa"/>
-            </w:tcMar>
-            <w:vAlign w:val="center"/>
-          </w:tcPr>
-          <w:p>
-            <w:pPr>
-              <w:spacing w:before="0" w:after="0" w:line="240" w:lineRule="auto"/>
-              <w:jc w:val="left"/>
-            </w:pPr>
-            <w:r>
-              <w:rPr>
-                <w:rFonts w:ascii="맑은 고딕" w:hAnsi="맑은 고딕" w:eastAsia="맑은 고딕" w:cs="맑은 고딕"/>
-                <w:sz w:val="16"/>
-              </w:rPr>
-              <w:t>Program Files 실행 권한 → EDR·AppLocker·WDAC 기록 확인</w:t>
-            </w:r>
-          </w:p>
-        </w:tc>
-      </w:tr>
-      <w:tr>
-        <w:tc>
-          <w:tcPr>
-            <w:tcW w:type="dxa" w:w="4300"/>
-            <w:shd w:fill="FAFBFC"/>
-            <w:tcMar>
-              <w:top w:w="80" w:type="dxa"/>
-              <w:start w:w="120" w:type="dxa"/>
-              <w:bottom w:w="80" w:type="dxa"/>
-              <w:end w:w="120" w:type="dxa"/>
-            </w:tcMar>
-            <w:vAlign w:val="center"/>
-          </w:tcPr>
-          <w:p>
-            <w:pPr>
-              <w:spacing w:before="0" w:after="0" w:line="240" w:lineRule="auto"/>
-              <w:jc w:val="left"/>
-            </w:pPr>
-            <w:r>
-              <w:rPr>
-                <w:rFonts w:ascii="맑은 고딕" w:hAnsi="맑은 고딕" w:eastAsia="맑은 고딕" w:cs="맑은 고딕"/>
-                <w:sz w:val="16"/>
-              </w:rPr>
-              <w:t>FILE_MISSING</w:t>
-            </w:r>
-          </w:p>
-        </w:tc>
-        <w:tc>
-          <w:tcPr>
-            <w:tcW w:type="dxa" w:w="5060"/>
-            <w:shd w:fill="FAFBFC"/>
-            <w:tcMar>
-              <w:top w:w="80" w:type="dxa"/>
-              <w:start w:w="120" w:type="dxa"/>
-              <w:bottom w:w="80" w:type="dxa"/>
-              <w:end w:w="120" w:type="dxa"/>
-            </w:tcMar>
-            <w:vAlign w:val="center"/>
-          </w:tcPr>
-          <w:p>
-            <w:pPr>
-              <w:spacing w:before="0" w:after="0" w:line="240" w:lineRule="auto"/>
-              <w:jc w:val="left"/>
-            </w:pPr>
-            <w:r>
-              <w:rPr>
-                <w:rFonts w:ascii="맑은 고딕" w:hAnsi="맑은 고딕" w:eastAsia="맑은 고딕" w:cs="맑은 고딕"/>
-                <w:sz w:val="16"/>
-              </w:rPr>
-              <w:t>설치 파일 누락 또는 EDR 격리 기록 확인</w:t>
-            </w:r>
-          </w:p>
-        </w:tc>
-      </w:tr>
-      <w:tr>
-        <w:tc>
-          <w:tcPr>
-            <w:tcW w:type="dxa" w:w="4300"/>
-            <w:tcMar>
-              <w:top w:w="80" w:type="dxa"/>
-              <w:start w:w="120" w:type="dxa"/>
-              <w:bottom w:w="80" w:type="dxa"/>
-              <w:end w:w="120" w:type="dxa"/>
-            </w:tcMar>
-            <w:vAlign w:val="center"/>
-          </w:tcPr>
-          <w:p>
-            <w:pPr>
-              <w:spacing w:before="0" w:after="0" w:line="240" w:lineRule="auto"/>
-              <w:jc w:val="left"/>
-            </w:pPr>
-            <w:r>
-              <w:rPr>
-                <w:rFonts w:ascii="맑은 고딕" w:hAnsi="맑은 고딕" w:eastAsia="맑은 고딕" w:cs="맑은 고딕"/>
-                <w:sz w:val="16"/>
-              </w:rPr>
-              <w:t>BAD_IMAGE</w:t>
-            </w:r>
-          </w:p>
-        </w:tc>
-        <w:tc>
-          <w:tcPr>
-            <w:tcW w:type="dxa" w:w="5060"/>
-            <w:tcMar>
-              <w:top w:w="80" w:type="dxa"/>
-              <w:start w:w="120" w:type="dxa"/>
-              <w:bottom w:w="80" w:type="dxa"/>
-              <w:end w:w="120" w:type="dxa"/>
-            </w:tcMar>
-            <w:vAlign w:val="center"/>
-          </w:tcPr>
-          <w:p>
-            <w:pPr>
-              <w:spacing w:before="0" w:after="0" w:line="240" w:lineRule="auto"/>
-              <w:jc w:val="left"/>
-            </w:pPr>
-            <w:r>
-              <w:rPr>
-                <w:rFonts w:ascii="맑은 고딕" w:hAnsi="맑은 고딕" w:eastAsia="맑은 고딕" w:cs="맑은 고딕"/>
-                <w:sz w:val="16"/>
-              </w:rPr>
-              <w:t>Windows x64 → 파일 손상·격리와 실행 파일 형식 확인</w:t>
-            </w:r>
-          </w:p>
-        </w:tc>
-      </w:tr>
-      <w:tr>
-        <w:tc>
-          <w:tcPr>
-            <w:tcW w:type="dxa" w:w="4300"/>
-            <w:shd w:fill="FAFBFC"/>
-            <w:tcMar>
-              <w:top w:w="80" w:type="dxa"/>
-              <w:start w:w="120" w:type="dxa"/>
-              <w:bottom w:w="80" w:type="dxa"/>
-              <w:end w:w="120" w:type="dxa"/>
-            </w:tcMar>
-            <w:vAlign w:val="center"/>
-          </w:tcPr>
-          <w:p>
-            <w:pPr>
-              <w:spacing w:before="0" w:after="0" w:line="240" w:lineRule="auto"/>
-              <w:jc w:val="left"/>
-            </w:pPr>
-            <w:r>
-              <w:rPr>
-                <w:rFonts w:ascii="맑은 고딕" w:hAnsi="맑은 고딕" w:eastAsia="맑은 고딕" w:cs="맑은 고딕"/>
-                <w:sz w:val="16"/>
-              </w:rPr>
-              <w:t>TIMEOUT</w:t>
-            </w:r>
-          </w:p>
-        </w:tc>
-        <w:tc>
-          <w:tcPr>
-            <w:tcW w:type="dxa" w:w="5060"/>
-            <w:shd w:fill="FAFBFC"/>
-            <w:tcMar>
-              <w:top w:w="80" w:type="dxa"/>
-              <w:start w:w="120" w:type="dxa"/>
-              <w:bottom w:w="80" w:type="dxa"/>
-              <w:end w:w="120" w:type="dxa"/>
-            </w:tcMar>
-            <w:vAlign w:val="center"/>
-          </w:tcPr>
-          <w:p>
-            <w:pPr>
-              <w:spacing w:before="0" w:after="0" w:line="240" w:lineRule="auto"/>
-              <w:jc w:val="left"/>
-            </w:pPr>
-            <w:r>
-              <w:rPr>
-                <w:rFonts w:ascii="맑은 고딕" w:hAnsi="맑은 고딕" w:eastAsia="맑은 고딕" w:cs="맑은 고딕"/>
-                <w:sz w:val="16"/>
-              </w:rPr>
-              <w:t>20초 자체점검 제한 → 남은 프로세스·보안 프로그램 지연 확인</w:t>
-            </w:r>
-          </w:p>
-        </w:tc>
-      </w:tr>
-      <w:tr>
-        <w:tc>
-          <w:tcPr>
-            <w:tcW w:type="dxa" w:w="4300"/>
-            <w:tcMar>
-              <w:top w:w="80" w:type="dxa"/>
-              <w:start w:w="120" w:type="dxa"/>
-              <w:bottom w:w="80" w:type="dxa"/>
-              <w:end w:w="120" w:type="dxa"/>
-            </w:tcMar>
-            <w:vAlign w:val="center"/>
-          </w:tcPr>
-          <w:p>
-            <w:pPr>
-              <w:spacing w:before="0" w:after="0" w:line="240" w:lineRule="auto"/>
-              <w:jc w:val="left"/>
-            </w:pPr>
-            <w:r>
-              <w:rPr>
-                <w:rFonts w:ascii="맑은 고딕" w:hAnsi="맑은 고딕" w:eastAsia="맑은 고딕" w:cs="맑은 고딕"/>
-                <w:sz w:val="16"/>
-              </w:rPr>
-              <w:t>VIEWER_UNINSTALL_ROLLBACK_PRESERVED</w:t>
-            </w:r>
-          </w:p>
-        </w:tc>
-        <w:tc>
-          <w:tcPr>
-            <w:tcW w:type="dxa" w:w="5060"/>
-            <w:tcMar>
-              <w:top w:w="80" w:type="dxa"/>
-              <w:start w:w="120" w:type="dxa"/>
-              <w:bottom w:w="80" w:type="dxa"/>
-              <w:end w:w="120" w:type="dxa"/>
-            </w:tcMar>
-            <w:vAlign w:val="center"/>
-          </w:tcPr>
-          <w:p>
-            <w:pPr>
-              <w:spacing w:before="0" w:after="0" w:line="240" w:lineRule="auto"/>
-              <w:jc w:val="left"/>
-            </w:pPr>
-            <w:r>
-              <w:rPr>
-                <w:rFonts w:ascii="맑은 고딕" w:hAnsi="맑은 고딕" w:eastAsia="맑은 고딕" w:cs="맑은 고딕"/>
-                <w:sz w:val="16"/>
-              </w:rPr>
-              <w:t>Viewer 프로세스·활성 프로그램 폴더 정리 → 관리자 제거 재실행</w:t>
-            </w:r>
-          </w:p>
-        </w:tc>
-      </w:tr>
-      <w:tr>
-        <w:tc>
-          <w:tcPr>
-            <w:tcW w:type="dxa" w:w="4300"/>
-            <w:shd w:fill="FAFBFC"/>
-            <w:tcMar>
-              <w:top w:w="80" w:type="dxa"/>
-              <w:start w:w="120" w:type="dxa"/>
-              <w:bottom w:w="80" w:type="dxa"/>
-              <w:end w:w="120" w:type="dxa"/>
-            </w:tcMar>
-            <w:vAlign w:val="center"/>
-          </w:tcPr>
-          <w:p>
-            <w:pPr>
-              <w:spacing w:before="0" w:after="0" w:line="240" w:lineRule="auto"/>
-              <w:jc w:val="left"/>
-            </w:pPr>
-            <w:r>
-              <w:rPr>
-                <w:rFonts w:ascii="맑은 고딕" w:hAnsi="맑은 고딕" w:eastAsia="맑은 고딕" w:cs="맑은 고딕"/>
-                <w:sz w:val="16"/>
-              </w:rPr>
-              <w:t>VIEWER_UNINSTALL_TRANSACTION_PRESERVED</w:t>
-            </w:r>
-          </w:p>
-        </w:tc>
-        <w:tc>
-          <w:tcPr>
-            <w:tcW w:type="dxa" w:w="5060"/>
-            <w:shd w:fill="FAFBFC"/>
-            <w:tcMar>
-              <w:top w:w="80" w:type="dxa"/>
-              <w:start w:w="120" w:type="dxa"/>
-              <w:bottom w:w="80" w:type="dxa"/>
-              <w:end w:w="120" w:type="dxa"/>
-            </w:tcMar>
-            <w:vAlign w:val="center"/>
-          </w:tcPr>
-          <w:p>
-            <w:pPr>
-              <w:spacing w:before="0" w:after="0" w:line="240" w:lineRule="auto"/>
-              <w:jc w:val="left"/>
-            </w:pPr>
-            <w:r>
-              <w:rPr>
-                <w:rFonts w:ascii="맑은 고딕" w:hAnsi="맑은 고딕" w:eastAsia="맑은 고딕" w:cs="맑은 고딕"/>
-                <w:sz w:val="16"/>
-              </w:rPr>
-              <w:t>활성 프로그램·rollback slot 제거 미확인 → marker 보존 → 관리자 제거 재실행</w:t>
+              <w:t>재실행하지 말고 표시 단계와 보존된 백업을 Windows 관리자에게 전달</w:t>
             </w:r>
           </w:p>
         </w:tc>
@@ -7209,7 +5863,7 @@
                 <w:rFonts w:ascii="맑은 고딕" w:hAnsi="맑은 고딕" w:eastAsia="맑은 고딕" w:cs="맑은 고딕"/>
                 <w:sz w:val="16"/>
               </w:rPr>
-              <w:t>장비 IPv4가 등록된 허용 IP인지 → Agent 허용 IP 설정 도구</w:t>
+              <w:t>장비 IPv4가 Setup에서 선택한 관리망 내부인지 확인</w:t>
             </w:r>
           </w:p>
         </w:tc>
@@ -8199,7 +6853,7 @@
           <w:color w:val="16324F"/>
           <w:sz w:val="21"/>
         </w:rPr>
-        <w:t>AGENT_DIRECTORY_TRUST_INVALID는 작업 journal 오류가 아니라 활성 install/data 트리의 소유권 또는 reparse 검사가 실패했다는 뜻입니다. DataDirectory는 정확히 %ProgramData%\SamsungSwitchWatch만 허용하고 신규 설치의 빈 선점 폴더도 거부합니다. 이전 릴리스의 owner가 현재 실행한 관리자와 다를 때도 fail-closed로 중단될 수 있습니다. 폴더와 설치 이력을 보존한 채 사내 Windows 관리자에게 확인하세요.</w:t>
+        <w:t>SETUP_PATH_INVALID는 활성 install/data 트리의 소유권 또는 junction·symlink 검사가 실패했다는 뜻입니다. DataDirectory는 정확히 %ProgramData%\SamsungSwitchWatch만 허용하고 신규 설치의 빈 선점 폴더도 거부합니다. 폴더와 설치 이력을 보존한 채 사내 Windows 관리자에게 확인하세요.</w:t>
       </w:r>
     </w:p>
     <w:p>
@@ -8224,7 +6878,7 @@
           <w:color w:val="B42318"/>
           <w:sz w:val="21"/>
         </w:rPr>
-        <w:t xml:space="preserve">Agent 중단 기록 보존  </w:t>
+        <w:t xml:space="preserve">자동 복구 실패 시  </w:t>
       </w:r>
       <w:r>
         <w:rPr>
@@ -8232,7 +6886,7 @@
           <w:color w:val="16324F"/>
           <w:sz w:val="21"/>
         </w:rPr>
-        <w:t>%ProgramData%\SamsungSwitchWatch-Operations, .__staging_*, .__backup_*와 legacy 백업은 자동 복구 자료가 아니라 관리자 판단 증거입니다. 작업 기록 루트는 부모부터 Administrators 소유와 SYSTEM·Administrators 전용 ACL로 이관하며, 64KiB를 넘는 journal은 파싱하지 않습니다. 이전 기록이 현재 실행한 관리자와 다른 계정 소유면 자동 이관하지 않습니다. 서비스 중지·삭제나 legacy 이동이 완결되지 않으면 후속 파일 복구를 차단하고 snapshot·archive를 보존합니다. 오류가 표시되면 삭제·이동·이름 변경하지 마세요.</w:t>
+        <w:t>설치 도중 실패하면 Setup이 이전 프로그램·서비스·방화벽 상태를 되돌립니다. SETUP_ROLLBACK_FAILED가 표시되면 남은 .__staging_, .__backup_, .__failed_ 폴더를 삭제·이동·이름 변경하지 말고 표시된 단계와 오류 코드를 사내 Windows 관리자에게 전달하세요.</w:t>
       </w:r>
     </w:p>
     <w:p>
@@ -8251,25 +6905,19 @@
           <w:color w:val="2E74B5"/>
           <w:sz w:val="26"/>
         </w:rPr>
-        <w:t>현장 진단 파일</w:t>
+        <w:t>현장 진단</w:t>
       </w:r>
     </w:p>
     <w:p>
       <w:pPr>
-        <w:pStyle w:val="CodeBlock"/>
-        <w:keepLines/>
-        <w:shd w:fill="F4F6F9"/>
-        <w:pBdr>
-          <w:left w:val="single" w:sz="10" w:space="8" w:color="64748B"/>
-        </w:pBdr>
+        <w:spacing w:before="0" w:after="120" w:line="300" w:lineRule="auto"/>
+        <w:jc w:val="left"/>
       </w:pPr>
       <w:r>
         <w:rPr>
-          <w:rFonts w:ascii="Consolas" w:hAnsi="Consolas" w:eastAsia="Consolas" w:cs="Consolas"/>
-          <w:color w:val="243447"/>
-          <w:sz w:val="17"/>
+          <w:rFonts w:ascii="맑은 고딕" w:hAnsi="맑은 고딕" w:eastAsia="맑은 고딕" w:cs="맑은 고딕"/>
         </w:rPr>
-        <w:t>.\diagnose-agent.ps1 -OutputPath "$env:TEMP\ssw-diagnostic.json"</w:t>
+        <w:t>Agent PC에서는 Agent Setup을 다시 열고 검사를 실행합니다. Viewer에서는 Agent 연결 진단을 실행합니다. 두 화면의 단계와 안정 오류 코드만 기록하고 실제 IP, 계정, 비밀번호와 장비 원문은 외부로 전달하지 않습니다.</w:t>
       </w:r>
     </w:p>
     <w:tbl>
@@ -8453,7 +7101,7 @@
                 <w:rFonts w:ascii="맑은 고딕" w:hAnsi="맑은 고딕" w:eastAsia="맑은 고딕" w:cs="맑은 고딕"/>
                 <w:sz w:val="16"/>
               </w:rPr>
-              <w:t>service.status=Running, listener.status=Listening, firewall.enabled/exact=true, 지원 프로필 포함, health.live=LIVE, health.ready=READY인지 확인합니다.</w:t>
+              <w:t>Agent Setup의 사전 점검에서 패키지, 서비스, 방화벽과 Agent 준비 상태를 확인합니다.</w:t>
             </w:r>
           </w:p>
         </w:tc>
@@ -8505,7 +7153,7 @@
                 <w:rFonts w:ascii="맑은 고딕" w:hAnsi="맑은 고딕" w:eastAsia="맑은 고딕" w:cs="맑은 고딕"/>
                 <w:sz w:val="16"/>
               </w:rPr>
-              <w:t>Test-NetConnection &lt;Agent-PC-주소&gt; -Port 18443을 실행합니다. 실패하면 Viewer PC 허용 IP, Domain/Private 방화벽, 라우팅과 EDR을 확인합니다.</w:t>
+              <w:t>연결 설정의 주소 → DNS/IPv4 → TCP/18443 → HTTPS → Agent API/버전 단계 중 처음 실패한 항목을 확인합니다.</w:t>
             </w:r>
           </w:p>
         </w:tc>
@@ -8607,7 +7255,7 @@
         <w:rPr>
           <w:rFonts w:ascii="맑은 고딕" w:hAnsi="맑은 고딕" w:eastAsia="맑은 고딕" w:cs="맑은 고딕"/>
         </w:rPr>
-        <w:t>Agent PC에서 Install-or-Update-Agent.cmd를 실행합니다. 기존 허용 정책은 기본적으로 보존됩니다.</w:t>
+        <w:t>Agent PC에서 SamsungSwitchWatch.Agent.Setup.exe를 실행합니다. 기존 신원과 유효한 정책은 보존됩니다.</w:t>
       </w:r>
     </w:p>
     <w:p>
@@ -8621,7 +7269,7 @@
         <w:rPr>
           <w:rFonts w:ascii="맑은 고딕" w:hAnsi="맑은 고딕" w:eastAsia="맑은 고딕" w:cs="맑은 고딕"/>
         </w:rPr>
-        <w:t>Viewer PC에서 새 Viewer 패키지의 Install-or-Update-Viewer.cmd를 실행합니다.</w:t>
+        <w:t>Viewer PC에서 새 Viewer 패키지의 SamsungSwitchWatch.Viewer.exe를 직접 실행합니다.</w:t>
       </w:r>
     </w:p>
     <w:p>
@@ -8659,52 +7307,14 @@
     </w:p>
     <w:p>
       <w:pPr>
-        <w:pStyle w:val="CodeBlock"/>
-        <w:keepLines/>
-        <w:shd w:fill="F4F6F9"/>
-        <w:pBdr>
-          <w:left w:val="single" w:sz="10" w:space="8" w:color="64748B"/>
-        </w:pBdr>
+        <w:spacing w:before="0" w:after="120" w:line="300" w:lineRule="auto"/>
+        <w:jc w:val="left"/>
       </w:pPr>
       <w:r>
         <w:rPr>
-          <w:rFonts w:ascii="Consolas" w:hAnsi="Consolas" w:eastAsia="Consolas" w:cs="Consolas"/>
-          <w:color w:val="243447"/>
-          <w:sz w:val="17"/>
+          <w:rFonts w:ascii="맑은 고딕" w:hAnsi="맑은 고딕" w:eastAsia="맑은 고딕" w:cs="맑은 고딕"/>
         </w:rPr>
-        <w:t>.\uninstall-agent.ps1</w:t>
-      </w:r>
-      <w:r>
-        <w:br/>
-      </w:r>
-      <w:r>
-        <w:rPr>
-          <w:rFonts w:ascii="Consolas" w:hAnsi="Consolas" w:eastAsia="Consolas" w:cs="Consolas"/>
-          <w:color w:val="243447"/>
-          <w:sz w:val="17"/>
-        </w:rPr>
-      </w:r>
-      <w:r>
-        <w:br/>
-      </w:r>
-      <w:r>
-        <w:rPr>
-          <w:rFonts w:ascii="Consolas" w:hAnsi="Consolas" w:eastAsia="Consolas" w:cs="Consolas"/>
-          <w:color w:val="243447"/>
-          <w:sz w:val="17"/>
-        </w:rPr>
-        <w:t># HTTPS 신원과 설치 데이터를 영구 삭제할 때만</w:t>
-      </w:r>
-      <w:r>
-        <w:br/>
-      </w:r>
-      <w:r>
-        <w:rPr>
-          <w:rFonts w:ascii="Consolas" w:hAnsi="Consolas" w:eastAsia="Consolas" w:cs="Consolas"/>
-          <w:color w:val="243447"/>
-          <w:sz w:val="17"/>
-        </w:rPr>
-        <w:t>.\uninstall-agent.ps1 -RemoveData</w:t>
+        <w:t>서비스와 방화벽을 변경하므로 Agent 제거는 사내 Windows 관리자가 승인된 관리 절차로 수행합니다. 공개 패키지에는 제거 스크립트를 포함하지 않습니다. HTTPS 신원과 %ProgramData% 데이터의 영구 삭제는 Viewer의 신원 변경 경고를 발생시키므로 별도 승인 없이 삭제하지 않습니다.</w:t>
       </w:r>
     </w:p>
     <w:p>
@@ -8732,7 +7342,7 @@
           <w:color w:val="16324F"/>
           <w:sz w:val="21"/>
         </w:rPr>
-        <w:t>-RemoveData를 사용하면 Agent HTTPS 신원이 복구되지 않습니다. 이후 Viewer에서 신원 변경 경고가 발생합니다.</w:t>
+        <w:t>Agent HTTPS 신원과 설치 데이터를 삭제하면 복구할 수 없고 이후 Viewer에서 신원 변경 경고가 발생합니다.</w:t>
       </w:r>
     </w:p>
     <w:p>
@@ -8846,7 +7456,7 @@
         <w:color w:val="64748B"/>
         <w:sz w:val="17"/>
       </w:rPr>
-      <w:t xml:space="preserve">v0.9.23-poc  |  </w:t>
+      <w:t xml:space="preserve">v0.10.0-poc  |  </w:t>
     </w:r>
     <w:r>
       <w:rPr>
@@ -8877,7 +7487,7 @@
         <w:color w:val="64748B"/>
         <w:sz w:val="17"/>
       </w:rPr>
-      <w:t>v0.9.23-poc  |  2026-07-28</w:t>
+      <w:t>v0.10.0-poc  |  2026-07-28</w:t>
     </w:r>
   </w:p>
 </w:ftr>

</xml_diff>

<commit_message>
Prepare v0.10.1 release documentation
</commit_message>
<xml_diff>
--- a/docs/SamsungSwitchWatch_User_Manual_KO.docx
+++ b/docs/SamsungSwitchWatch_User_Manual_KO.docx
@@ -1132,7 +1132,7 @@
           <w:color w:val="16324F"/>
           <w:sz w:val="21"/>
         </w:rPr>
-        <w:t>0.10.0-poc는 코드 서명되지 않은 시험판입니다. 압축을 풀기 전에 Agent와 Viewer ZIP의 SHA-256을 해당 GitHub Release 본문에 표시된 값과 비교하고 사내 보안 반입 절차를 완료하세요. SmartScreen 또는 EDR 경고를 우회하지 않습니다.</w:t>
+        <w:t>0.10.1-poc는 코드 서명되지 않은 시험판입니다. 압축을 풀기 전에 Agent와 Viewer ZIP의 SHA-256을 해당 GitHub Release 본문에 표시된 값과 비교하고 사내 보안 반입 절차를 완료하세요. SmartScreen 또는 EDR 경고를 우회하지 않습니다.</w:t>
       </w:r>
     </w:p>
     <w:p>
@@ -1422,7 +1422,7 @@
           <w:color w:val="16324F"/>
           <w:sz w:val="21"/>
         </w:rPr>
-        <w:t>Agent Setup에 설치 실패가 표시되면 실패 단계와 Cause를 먼저 확인하세요. 설치 성공 뒤 AGENT_CONNECTION_REFUSED가 보이면 Viewer에 스위치 IP, Viewer PC 주소 또는 localhost가 아니라 Agent를 설치한 PC 주소를 입력했는지 먼저 확인하세요. 그 다음 Agent Setup의 검사에서 SamsungSwitchWatchAgent 서비스와 TCP/18443을 점검합니다. 서비스를 수동 등록하지 말고 0.10.0-poc Agent Setup을 사용하세요.</w:t>
+        <w:t>Agent Setup에 설치 실패가 표시되면 실패 단계와 Cause를 먼저 확인하세요. 설치 성공 뒤 AGENT_CONNECTION_REFUSED가 보이면 Viewer에 스위치 IP, Viewer PC 주소 또는 localhost가 아니라 Agent를 설치한 PC 주소를 입력했는지 먼저 확인하세요. 그 다음 Agent Setup의 검사에서 SamsungSwitchWatchAgent 서비스와 TCP/18443을 점검합니다. 서비스를 수동 등록하지 말고 0.10.1-poc Agent Setup을 사용하세요.</w:t>
       </w:r>
     </w:p>
     <w:p>
@@ -1469,7 +1469,7 @@
           <w:color w:val="16324F"/>
           <w:sz w:val="21"/>
         </w:rPr>
-        <w:t>이전 Viewer가 실행 중이면 새 Viewer는 같은 사용자 데이터를 동시에 쓰지 않도록 실행을 차단하고 전환 순서를 표시합니다. 기존 트레이 아이콘에서 '프로그램 종료'를 선택한 뒤 Win+R에서 shell:startup을 열어 'Samsung Switch Watch' 바로 가기를 삭제합니다. 이어 shell:programs에서도 같은 이름의 이전 시작 메뉴 바로 가기를 삭제하고 새 Viewer를 다시 실행하세요. 기존 Agent 연결과 장비 정보는 유지됩니다. 창이 바로 보이지 않으면 알림 영역에서 대시보드를 열고 실행 경로가 새 v0.10 폴더인지 확인하세요.</w:t>
+        <w:t>이전 Viewer가 실행 중이면 새 Viewer는 같은 사용자 데이터를 동시에 쓰지 않도록 실행을 차단하고 전환 순서를 표시합니다. 기존 트레이 아이콘에서 '프로그램 종료'를 선택한 뒤 Win+R에서 shell:startup을 열어 'Samsung Switch Watch' 바로 가기를 삭제합니다. 이어 shell:programs에서도 같은 이름의 이전 시작 메뉴 바로 가기를 삭제하고 새 Viewer를 다시 실행하세요. 기존 Agent 연결과 장비 정보는 유지됩니다. 창이 바로 보이지 않으면 알림 영역에서 대시보드를 열고 실행 경로가 새 0.10.1-poc 폴더인지 확인하세요.</w:t>
       </w:r>
     </w:p>
     <w:p>
@@ -1567,7 +1567,7 @@
           <w:color w:val="16324F"/>
           <w:sz w:val="21"/>
         </w:rPr>
-        <w:t>0.10.0-poc는 코드 서명되지 않아 SmartScreen이나 사내 EDR이 차단할 수 있습니다. ZIP을 완전히 압축 해제하고 Viewer EXE와 제공된 DLL이 같은 폴더에 있는지 확인하세요. EDR·AppLocker·WDAC가 차단하면 우회하지 말고 공식 ZIP의 버전·해시와 차단 기록을 보안 담당자에게 전달하세요.</w:t>
+        <w:t>0.10.1-poc는 코드 서명되지 않아 SmartScreen이나 사내 EDR이 차단할 수 있습니다. ZIP을 완전히 압축 해제하고 Viewer EXE와 제공된 DLL이 같은 폴더에 있는지 확인하세요. EDR·AppLocker·WDAC가 차단하면 우회하지 말고 공식 ZIP의 버전·해시와 차단 기록을 보안 담당자에게 전달하세요.</w:t>
       </w:r>
     </w:p>
     <w:p>
@@ -1626,7 +1626,7 @@
       <w:r>
         <w:drawing>
           <wp:inline xmlns:a="http://schemas.openxmlformats.org/drawingml/2006/main" xmlns:pic="http://schemas.openxmlformats.org/drawingml/2006/picture">
-            <wp:extent cx="2194560" cy="1840599"/>
+            <wp:extent cx="2194560" cy="1769806"/>
             <wp:docPr id="2" name="Picture 2" title="Agent 연결 창" descr="Agent 주소만 입력하고 HTTPS 포트 18443을 자동 사용하는 연결 설정 창"/>
             <wp:cNvGraphicFramePr>
               <a:graphicFrameLocks noChangeAspect="1"/>
@@ -1647,7 +1647,7 @@
                   <pic:spPr>
                     <a:xfrm>
                       <a:off x="0" y="0"/>
-                      <a:ext cx="2194560" cy="1840599"/>
+                      <a:ext cx="2194560" cy="1769806"/>
                     </a:xfrm>
                     <a:prstGeom prst="rect"/>
                   </pic:spPr>
@@ -3491,6 +3491,17 @@
           <w:sz w:val="17"/>
         </w:rPr>
         <w:t>최대 세션 시간: 240초</w:t>
+      </w:r>
+      <w:r>
+        <w:br/>
+      </w:r>
+      <w:r>
+        <w:rPr>
+          <w:rFonts w:ascii="Consolas" w:hAnsi="Consolas" w:eastAsia="Consolas" w:cs="Consolas"/>
+          <w:color w:val="243447"/>
+          <w:sz w:val="17"/>
+        </w:rPr>
+        <w:t>명령 합산 예산이 240초를 넘는 경우: 순서를 유지한 여러 세션으로 미리 분할</w:t>
       </w:r>
       <w:r>
         <w:br/>
@@ -7456,7 +7467,7 @@
         <w:color w:val="64748B"/>
         <w:sz w:val="17"/>
       </w:rPr>
-      <w:t xml:space="preserve">v0.10.0-poc  |  </w:t>
+      <w:t xml:space="preserve">v0.10.1-poc  |  </w:t>
     </w:r>
     <w:r>
       <w:rPr>
@@ -7487,7 +7498,7 @@
         <w:color w:val="64748B"/>
         <w:sz w:val="17"/>
       </w:rPr>
-      <w:t>v0.10.0-poc  |  2026-07-28</w:t>
+      <w:t>v0.10.1-poc  |  2026-07-29</w:t>
     </w:r>
   </w:p>
 </w:ftr>

</xml_diff>

<commit_message>
Stabilize Agent, Viewer, and v0.10.1 release (#36)
* Correct Viewer identity failure state

* Split long Viewer Telnet command sessions

* Publish connected only after Agent trust

* Guard inline release PowerShell encoding

* Make release draft uploads recoverable

* Make Agent rollback recovery resumable

* Clarify Agent path preflight scope

* Prepare v0.10.1 release documentation
</commit_message>
<xml_diff>
--- a/docs/SamsungSwitchWatch_User_Manual_KO.docx
+++ b/docs/SamsungSwitchWatch_User_Manual_KO.docx
@@ -1132,7 +1132,7 @@
           <w:color w:val="16324F"/>
           <w:sz w:val="21"/>
         </w:rPr>
-        <w:t>0.10.0-poc는 코드 서명되지 않은 시험판입니다. 압축을 풀기 전에 Agent와 Viewer ZIP의 SHA-256을 해당 GitHub Release 본문에 표시된 값과 비교하고 사내 보안 반입 절차를 완료하세요. SmartScreen 또는 EDR 경고를 우회하지 않습니다.</w:t>
+        <w:t>0.10.1-poc는 코드 서명되지 않은 시험판입니다. 압축을 풀기 전에 Agent와 Viewer ZIP의 SHA-256을 해당 GitHub Release 본문에 표시된 값과 비교하고 사내 보안 반입 절차를 완료하세요. SmartScreen 또는 EDR 경고를 우회하지 않습니다.</w:t>
       </w:r>
     </w:p>
     <w:p>
@@ -1422,7 +1422,7 @@
           <w:color w:val="16324F"/>
           <w:sz w:val="21"/>
         </w:rPr>
-        <w:t>Agent Setup에 설치 실패가 표시되면 실패 단계와 Cause를 먼저 확인하세요. 설치 성공 뒤 AGENT_CONNECTION_REFUSED가 보이면 Viewer에 스위치 IP, Viewer PC 주소 또는 localhost가 아니라 Agent를 설치한 PC 주소를 입력했는지 먼저 확인하세요. 그 다음 Agent Setup의 검사에서 SamsungSwitchWatchAgent 서비스와 TCP/18443을 점검합니다. 서비스를 수동 등록하지 말고 0.10.0-poc Agent Setup을 사용하세요.</w:t>
+        <w:t>Agent Setup에 설치 실패가 표시되면 실패 단계와 Cause를 먼저 확인하세요. 설치 성공 뒤 AGENT_CONNECTION_REFUSED가 보이면 Viewer에 스위치 IP, Viewer PC 주소 또는 localhost가 아니라 Agent를 설치한 PC 주소를 입력했는지 먼저 확인하세요. 그 다음 Agent Setup의 검사에서 SamsungSwitchWatchAgent 서비스와 TCP/18443을 점검합니다. 서비스를 수동 등록하지 말고 0.10.1-poc Agent Setup을 사용하세요.</w:t>
       </w:r>
     </w:p>
     <w:p>
@@ -1469,7 +1469,7 @@
           <w:color w:val="16324F"/>
           <w:sz w:val="21"/>
         </w:rPr>
-        <w:t>이전 Viewer가 실행 중이면 새 Viewer는 같은 사용자 데이터를 동시에 쓰지 않도록 실행을 차단하고 전환 순서를 표시합니다. 기존 트레이 아이콘에서 '프로그램 종료'를 선택한 뒤 Win+R에서 shell:startup을 열어 'Samsung Switch Watch' 바로 가기를 삭제합니다. 이어 shell:programs에서도 같은 이름의 이전 시작 메뉴 바로 가기를 삭제하고 새 Viewer를 다시 실행하세요. 기존 Agent 연결과 장비 정보는 유지됩니다. 창이 바로 보이지 않으면 알림 영역에서 대시보드를 열고 실행 경로가 새 v0.10 폴더인지 확인하세요.</w:t>
+        <w:t>이전 Viewer가 실행 중이면 새 Viewer는 같은 사용자 데이터를 동시에 쓰지 않도록 실행을 차단하고 전환 순서를 표시합니다. 기존 트레이 아이콘에서 '프로그램 종료'를 선택한 뒤 Win+R에서 shell:startup을 열어 'Samsung Switch Watch' 바로 가기를 삭제합니다. 이어 shell:programs에서도 같은 이름의 이전 시작 메뉴 바로 가기를 삭제하고 새 Viewer를 다시 실행하세요. 기존 Agent 연결과 장비 정보는 유지됩니다. 창이 바로 보이지 않으면 알림 영역에서 대시보드를 열고 실행 경로가 새 0.10.1-poc 폴더인지 확인하세요.</w:t>
       </w:r>
     </w:p>
     <w:p>
@@ -1567,7 +1567,7 @@
           <w:color w:val="16324F"/>
           <w:sz w:val="21"/>
         </w:rPr>
-        <w:t>0.10.0-poc는 코드 서명되지 않아 SmartScreen이나 사내 EDR이 차단할 수 있습니다. ZIP을 완전히 압축 해제하고 Viewer EXE와 제공된 DLL이 같은 폴더에 있는지 확인하세요. EDR·AppLocker·WDAC가 차단하면 우회하지 말고 공식 ZIP의 버전·해시와 차단 기록을 보안 담당자에게 전달하세요.</w:t>
+        <w:t>0.10.1-poc는 코드 서명되지 않아 SmartScreen이나 사내 EDR이 차단할 수 있습니다. ZIP을 완전히 압축 해제하고 Viewer EXE와 제공된 DLL이 같은 폴더에 있는지 확인하세요. EDR·AppLocker·WDAC가 차단하면 우회하지 말고 공식 ZIP의 버전·해시와 차단 기록을 보안 담당자에게 전달하세요.</w:t>
       </w:r>
     </w:p>
     <w:p>
@@ -1626,7 +1626,7 @@
       <w:r>
         <w:drawing>
           <wp:inline xmlns:a="http://schemas.openxmlformats.org/drawingml/2006/main" xmlns:pic="http://schemas.openxmlformats.org/drawingml/2006/picture">
-            <wp:extent cx="2194560" cy="1840599"/>
+            <wp:extent cx="2194560" cy="1769806"/>
             <wp:docPr id="2" name="Picture 2" title="Agent 연결 창" descr="Agent 주소만 입력하고 HTTPS 포트 18443을 자동 사용하는 연결 설정 창"/>
             <wp:cNvGraphicFramePr>
               <a:graphicFrameLocks noChangeAspect="1"/>
@@ -1647,7 +1647,7 @@
                   <pic:spPr>
                     <a:xfrm>
                       <a:off x="0" y="0"/>
-                      <a:ext cx="2194560" cy="1840599"/>
+                      <a:ext cx="2194560" cy="1769806"/>
                     </a:xfrm>
                     <a:prstGeom prst="rect"/>
                   </pic:spPr>
@@ -3491,6 +3491,17 @@
           <w:sz w:val="17"/>
         </w:rPr>
         <w:t>최대 세션 시간: 240초</w:t>
+      </w:r>
+      <w:r>
+        <w:br/>
+      </w:r>
+      <w:r>
+        <w:rPr>
+          <w:rFonts w:ascii="Consolas" w:hAnsi="Consolas" w:eastAsia="Consolas" w:cs="Consolas"/>
+          <w:color w:val="243447"/>
+          <w:sz w:val="17"/>
+        </w:rPr>
+        <w:t>명령 합산 예산이 240초를 넘는 경우: 순서를 유지한 여러 세션으로 미리 분할</w:t>
       </w:r>
       <w:r>
         <w:br/>
@@ -7456,7 +7467,7 @@
         <w:color w:val="64748B"/>
         <w:sz w:val="17"/>
       </w:rPr>
-      <w:t xml:space="preserve">v0.10.0-poc  |  </w:t>
+      <w:t xml:space="preserve">v0.10.1-poc  |  </w:t>
     </w:r>
     <w:r>
       <w:rPr>
@@ -7487,7 +7498,7 @@
         <w:color w:val="64748B"/>
         <w:sz w:val="17"/>
       </w:rPr>
-      <w:t>v0.10.0-poc  |  2026-07-28</w:t>
+      <w:t>v0.10.1-poc  |  2026-07-29</w:t>
     </w:r>
   </w:p>
 </w:ftr>

</xml_diff>

<commit_message>
Prepare v0.10.2 recovery patch release
</commit_message>
<xml_diff>
--- a/docs/SamsungSwitchWatch_User_Manual_KO.docx
+++ b/docs/SamsungSwitchWatch_User_Manual_KO.docx
@@ -1132,7 +1132,7 @@
           <w:color w:val="16324F"/>
           <w:sz w:val="21"/>
         </w:rPr>
-        <w:t>0.10.1-poc는 코드 서명되지 않은 시험판입니다. 압축을 풀기 전에 Agent와 Viewer ZIP의 SHA-256을 해당 GitHub Release 본문에 표시된 값과 비교하고 사내 보안 반입 절차를 완료하세요. SmartScreen 또는 EDR 경고를 우회하지 않습니다.</w:t>
+        <w:t>0.10.2-poc는 코드 서명되지 않은 시험판입니다. 압축을 풀기 전에 Agent와 Viewer ZIP의 SHA-256을 해당 GitHub Release 본문에 표시된 값과 비교하고 사내 보안 반입 절차를 완료하세요. SmartScreen 또는 EDR 경고를 우회하지 않습니다.</w:t>
       </w:r>
     </w:p>
     <w:p>
@@ -1422,7 +1422,7 @@
           <w:color w:val="16324F"/>
           <w:sz w:val="21"/>
         </w:rPr>
-        <w:t>Agent Setup에 설치 실패가 표시되면 실패 단계와 Cause를 먼저 확인하세요. 설치 성공 뒤 AGENT_CONNECTION_REFUSED가 보이면 Viewer에 스위치 IP, Viewer PC 주소 또는 localhost가 아니라 Agent를 설치한 PC 주소를 입력했는지 먼저 확인하세요. 그 다음 Agent Setup의 검사에서 SamsungSwitchWatchAgent 서비스와 TCP/18443을 점검합니다. 서비스를 수동 등록하지 말고 0.10.1-poc Agent Setup을 사용하세요.</w:t>
+        <w:t>Agent Setup에 설치 실패가 표시되면 실패 단계와 Cause를 먼저 확인하세요. 설치 성공 뒤 AGENT_CONNECTION_REFUSED가 보이면 Viewer에 스위치 IP, Viewer PC 주소 또는 localhost가 아니라 Agent를 설치한 PC 주소를 입력했는지 먼저 확인하세요. 그 다음 Agent Setup의 검사에서 SamsungSwitchWatchAgent 서비스와 TCP/18443을 점검합니다. 서비스를 수동 등록하지 말고 0.10.2-poc Agent Setup을 사용하세요.</w:t>
       </w:r>
     </w:p>
     <w:p>
@@ -1469,7 +1469,7 @@
           <w:color w:val="16324F"/>
           <w:sz w:val="21"/>
         </w:rPr>
-        <w:t>이전 Viewer가 실행 중이면 새 Viewer는 같은 사용자 데이터를 동시에 쓰지 않도록 실행을 차단하고 전환 순서를 표시합니다. 기존 트레이 아이콘에서 '프로그램 종료'를 선택한 뒤 Win+R에서 shell:startup을 열어 'Samsung Switch Watch' 바로 가기를 삭제합니다. 이어 shell:programs에서도 같은 이름의 이전 시작 메뉴 바로 가기를 삭제하고 새 Viewer를 다시 실행하세요. 기존 Agent 연결과 장비 정보는 유지됩니다. 창이 바로 보이지 않으면 알림 영역에서 대시보드를 열고 실행 경로가 새 0.10.1-poc 폴더인지 확인하세요.</w:t>
+        <w:t>이전 Viewer가 실행 중이면 새 Viewer는 같은 사용자 데이터를 동시에 쓰지 않도록 실행을 차단하고 전환 순서를 표시합니다. 기존 트레이 아이콘에서 '프로그램 종료'를 선택한 뒤 Win+R에서 shell:startup을 열어 'Samsung Switch Watch' 바로 가기를 삭제합니다. 이어 shell:programs에서도 같은 이름의 이전 시작 메뉴 바로 가기를 삭제하고 새 Viewer를 다시 실행하세요. 기존 Agent 연결과 장비 정보는 유지됩니다. 창이 바로 보이지 않으면 알림 영역에서 대시보드를 열고 실행 경로가 새 0.10.2-poc 폴더인지 확인하세요.</w:t>
       </w:r>
     </w:p>
     <w:p>
@@ -1567,7 +1567,7 @@
           <w:color w:val="16324F"/>
           <w:sz w:val="21"/>
         </w:rPr>
-        <w:t>0.10.1-poc는 코드 서명되지 않아 SmartScreen이나 사내 EDR이 차단할 수 있습니다. ZIP을 완전히 압축 해제하고 Viewer EXE와 제공된 DLL이 같은 폴더에 있는지 확인하세요. EDR·AppLocker·WDAC가 차단하면 우회하지 말고 공식 ZIP의 버전·해시와 차단 기록을 보안 담당자에게 전달하세요.</w:t>
+        <w:t>0.10.2-poc는 코드 서명되지 않아 SmartScreen이나 사내 EDR이 차단할 수 있습니다. ZIP을 완전히 압축 해제하고 Viewer EXE와 제공된 DLL이 같은 폴더에 있는지 확인하세요. EDR·AppLocker·WDAC가 차단하면 우회하지 말고 공식 ZIP의 버전·해시와 차단 기록을 보안 담당자에게 전달하세요.</w:t>
       </w:r>
     </w:p>
     <w:p>
@@ -7467,7 +7467,7 @@
         <w:color w:val="64748B"/>
         <w:sz w:val="17"/>
       </w:rPr>
-      <w:t xml:space="preserve">v0.10.1-poc  |  </w:t>
+      <w:t xml:space="preserve">v0.10.2-poc  |  </w:t>
     </w:r>
     <w:r>
       <w:rPr>
@@ -7498,7 +7498,7 @@
         <w:color w:val="64748B"/>
         <w:sz w:val="17"/>
       </w:rPr>
-      <w:t>v0.10.1-poc  |  2026-07-29</w:t>
+      <w:t>v0.10.2-poc  |  2026-07-29</w:t>
     </w:r>
   </w:p>
 </w:ftr>

</xml_diff>

<commit_message>
Harden Agent rollback recovery for v0.10.2 (#37)
* Fix resumable Agent rollback cleanup

* Harden Agent recovery journal compatibility

* Prepare v0.10.2 recovery patch release
</commit_message>
<xml_diff>
--- a/docs/SamsungSwitchWatch_User_Manual_KO.docx
+++ b/docs/SamsungSwitchWatch_User_Manual_KO.docx
@@ -1132,7 +1132,7 @@
           <w:color w:val="16324F"/>
           <w:sz w:val="21"/>
         </w:rPr>
-        <w:t>0.10.1-poc는 코드 서명되지 않은 시험판입니다. 압축을 풀기 전에 Agent와 Viewer ZIP의 SHA-256을 해당 GitHub Release 본문에 표시된 값과 비교하고 사내 보안 반입 절차를 완료하세요. SmartScreen 또는 EDR 경고를 우회하지 않습니다.</w:t>
+        <w:t>0.10.2-poc는 코드 서명되지 않은 시험판입니다. 압축을 풀기 전에 Agent와 Viewer ZIP의 SHA-256을 해당 GitHub Release 본문에 표시된 값과 비교하고 사내 보안 반입 절차를 완료하세요. SmartScreen 또는 EDR 경고를 우회하지 않습니다.</w:t>
       </w:r>
     </w:p>
     <w:p>
@@ -1422,7 +1422,7 @@
           <w:color w:val="16324F"/>
           <w:sz w:val="21"/>
         </w:rPr>
-        <w:t>Agent Setup에 설치 실패가 표시되면 실패 단계와 Cause를 먼저 확인하세요. 설치 성공 뒤 AGENT_CONNECTION_REFUSED가 보이면 Viewer에 스위치 IP, Viewer PC 주소 또는 localhost가 아니라 Agent를 설치한 PC 주소를 입력했는지 먼저 확인하세요. 그 다음 Agent Setup의 검사에서 SamsungSwitchWatchAgent 서비스와 TCP/18443을 점검합니다. 서비스를 수동 등록하지 말고 0.10.1-poc Agent Setup을 사용하세요.</w:t>
+        <w:t>Agent Setup에 설치 실패가 표시되면 실패 단계와 Cause를 먼저 확인하세요. 설치 성공 뒤 AGENT_CONNECTION_REFUSED가 보이면 Viewer에 스위치 IP, Viewer PC 주소 또는 localhost가 아니라 Agent를 설치한 PC 주소를 입력했는지 먼저 확인하세요. 그 다음 Agent Setup의 검사에서 SamsungSwitchWatchAgent 서비스와 TCP/18443을 점검합니다. 서비스를 수동 등록하지 말고 0.10.2-poc Agent Setup을 사용하세요.</w:t>
       </w:r>
     </w:p>
     <w:p>
@@ -1469,7 +1469,7 @@
           <w:color w:val="16324F"/>
           <w:sz w:val="21"/>
         </w:rPr>
-        <w:t>이전 Viewer가 실행 중이면 새 Viewer는 같은 사용자 데이터를 동시에 쓰지 않도록 실행을 차단하고 전환 순서를 표시합니다. 기존 트레이 아이콘에서 '프로그램 종료'를 선택한 뒤 Win+R에서 shell:startup을 열어 'Samsung Switch Watch' 바로 가기를 삭제합니다. 이어 shell:programs에서도 같은 이름의 이전 시작 메뉴 바로 가기를 삭제하고 새 Viewer를 다시 실행하세요. 기존 Agent 연결과 장비 정보는 유지됩니다. 창이 바로 보이지 않으면 알림 영역에서 대시보드를 열고 실행 경로가 새 0.10.1-poc 폴더인지 확인하세요.</w:t>
+        <w:t>이전 Viewer가 실행 중이면 새 Viewer는 같은 사용자 데이터를 동시에 쓰지 않도록 실행을 차단하고 전환 순서를 표시합니다. 기존 트레이 아이콘에서 '프로그램 종료'를 선택한 뒤 Win+R에서 shell:startup을 열어 'Samsung Switch Watch' 바로 가기를 삭제합니다. 이어 shell:programs에서도 같은 이름의 이전 시작 메뉴 바로 가기를 삭제하고 새 Viewer를 다시 실행하세요. 기존 Agent 연결과 장비 정보는 유지됩니다. 창이 바로 보이지 않으면 알림 영역에서 대시보드를 열고 실행 경로가 새 0.10.2-poc 폴더인지 확인하세요.</w:t>
       </w:r>
     </w:p>
     <w:p>
@@ -1567,7 +1567,7 @@
           <w:color w:val="16324F"/>
           <w:sz w:val="21"/>
         </w:rPr>
-        <w:t>0.10.1-poc는 코드 서명되지 않아 SmartScreen이나 사내 EDR이 차단할 수 있습니다. ZIP을 완전히 압축 해제하고 Viewer EXE와 제공된 DLL이 같은 폴더에 있는지 확인하세요. EDR·AppLocker·WDAC가 차단하면 우회하지 말고 공식 ZIP의 버전·해시와 차단 기록을 보안 담당자에게 전달하세요.</w:t>
+        <w:t>0.10.2-poc는 코드 서명되지 않아 SmartScreen이나 사내 EDR이 차단할 수 있습니다. ZIP을 완전히 압축 해제하고 Viewer EXE와 제공된 DLL이 같은 폴더에 있는지 확인하세요. EDR·AppLocker·WDAC가 차단하면 우회하지 말고 공식 ZIP의 버전·해시와 차단 기록을 보안 담당자에게 전달하세요.</w:t>
       </w:r>
     </w:p>
     <w:p>
@@ -7467,7 +7467,7 @@
         <w:color w:val="64748B"/>
         <w:sz w:val="17"/>
       </w:rPr>
-      <w:t xml:space="preserve">v0.10.1-poc  |  </w:t>
+      <w:t xml:space="preserve">v0.10.2-poc  |  </w:t>
     </w:r>
     <w:r>
       <w:rPr>
@@ -7498,7 +7498,7 @@
         <w:color w:val="64748B"/>
         <w:sz w:val="17"/>
       </w:rPr>
-      <w:t>v0.10.1-poc  |  2026-07-29</w:t>
+      <w:t>v0.10.2-poc  |  2026-07-29</w:t>
     </w:r>
   </w:p>
 </w:ftr>

</xml_diff>

<commit_message>
fix: preserve external firewall rules with viewer IP guard
</commit_message>
<xml_diff>
--- a/docs/SamsungSwitchWatch_User_Manual_KO.docx
+++ b/docs/SamsungSwitchWatch_User_Manual_KO.docx
@@ -886,7 +886,7 @@
                 <w:rFonts w:ascii="맑은 고딕" w:hAnsi="맑은 고딕" w:eastAsia="맑은 고딕" w:cs="맑은 고딕"/>
                 <w:sz w:val="18"/>
               </w:rPr>
-              <w:t>설치 시 지정한 Viewer PC IPv4만 기본 허용</w:t>
+              <w:t>Viewer /32 방화벽과 Agent의 동일 IPv4 재검증</w:t>
             </w:r>
           </w:p>
         </w:tc>
@@ -1132,7 +1132,7 @@
           <w:color w:val="16324F"/>
           <w:sz w:val="21"/>
         </w:rPr>
-        <w:t>0.10.2-poc는 코드 서명되지 않은 시험판입니다. 압축을 풀기 전에 Agent와 Viewer ZIP의 SHA-256을 해당 GitHub Release 본문에 표시된 값과 비교하고 사내 보안 반입 절차를 완료하세요. SmartScreen 또는 EDR 경고를 우회하지 않습니다.</w:t>
+        <w:t>0.10.3-poc는 코드 서명되지 않은 시험판입니다. 압축을 풀기 전에 Agent와 Viewer ZIP의 SHA-256을 해당 GitHub Release 본문에 표시된 값과 비교하고 사내 보안 반입 절차를 완료하세요. SmartScreen 또는 EDR 경고를 우회하지 않습니다.</w:t>
       </w:r>
     </w:p>
     <w:p>
@@ -1238,6 +1238,34 @@
       </w:pPr>
       <w:r>
         <w:t>그림 1. Agent 서비스 설치와 네트워크 범위 선택</w:t>
+      </w:r>
+    </w:p>
+    <w:p>
+      <w:pPr>
+        <w:keepLines/>
+        <w:spacing w:before="80" w:after="160" w:line="283" w:lineRule="auto"/>
+        <w:ind w:left="115" w:right="58"/>
+        <w:shd w:fill="FFF8E8"/>
+        <w:pBdr>
+          <w:left w:val="single" w:sz="16" w:space="8" w:color="8A5A00"/>
+        </w:pBdr>
+      </w:pPr>
+      <w:r>
+        <w:rPr>
+          <w:rFonts w:ascii="맑은 고딕" w:hAnsi="맑은 고딕" w:eastAsia="맑은 고딕" w:cs="맑은 고딕"/>
+          <w:b/>
+          <w:color w:val="8A5A00"/>
+          <w:sz w:val="21"/>
+        </w:rPr>
+        <w:t xml:space="preserve">기존 TCP/18443 허용 규칙 경고  </w:t>
+      </w:r>
+      <w:r>
+        <w:rPr>
+          <w:rFonts w:ascii="맑은 고딕" w:hAnsi="맑은 고딕" w:eastAsia="맑은 고딕" w:cs="맑은 고딕"/>
+          <w:color w:val="16324F"/>
+          <w:sz w:val="21"/>
+        </w:rPr>
+        <w:t>다른 프로그램이 만든 인바운드 허용 규칙이 있으면 FIREWALL_OVERLAP_PROTECTED 경고를 표시하지만 해당 규칙은 변경하지 않고 설치를 계속합니다. 설치 후 제품 소유 Viewer /32 규칙과 Agent 내부 Viewer IPv4 검증을 함께 적용합니다.</w:t>
       </w:r>
     </w:p>
     <w:p>
@@ -1394,7 +1422,7 @@
           <w:color w:val="16324F"/>
           <w:sz w:val="21"/>
         </w:rPr>
-        <w:t>Viewer PC 주소나 스위치 관리망이 바뀌면 같은 Release의 Agent Setup을 다시 열어 고정 Viewer IPv4와 자동 검색된 관리망을 검토합니다. 사용자가 CIDR을 계산하거나 사설망 전체를 직접 허용하지 않습니다. 검사에서 서비스, TCP/18443 listener, 방화벽, 활성 프로필과 live/ready를 확인합니다.</w:t>
+        <w:t>Viewer PC 주소나 스위치 관리망이 바뀌면 같은 Release의 Agent Setup을 다시 열어 고정 Viewer IPv4와 자동 검색된 관리망을 검토합니다. 사용자가 CIDR을 계산하거나 사설망 전체를 직접 허용하지 않습니다. 검사에서 서비스, TCP/18443 listener, 방화벽, Agent 내부 Viewer 허용 주소, 활성 프로필과 live/ready를 확인합니다.</w:t>
       </w:r>
     </w:p>
     <w:p>
@@ -1422,7 +1450,7 @@
           <w:color w:val="16324F"/>
           <w:sz w:val="21"/>
         </w:rPr>
-        <w:t>Agent Setup에 설치 실패가 표시되면 실패 단계와 Cause를 먼저 확인하세요. 설치 성공 뒤 AGENT_CONNECTION_REFUSED가 보이면 Viewer에 스위치 IP, Viewer PC 주소 또는 localhost가 아니라 Agent를 설치한 PC 주소를 입력했는지 먼저 확인하세요. 그 다음 Agent Setup의 검사에서 SamsungSwitchWatchAgent 서비스와 TCP/18443을 점검합니다. 서비스를 수동 등록하지 말고 0.10.2-poc Agent Setup을 사용하세요.</w:t>
+        <w:t>Agent Setup에 설치 실패가 표시되면 실패 단계와 Cause를 먼저 확인하세요. 설치 성공 뒤 AGENT_CONNECTION_REFUSED가 보이면 Viewer에 스위치 IP, Viewer PC 주소 또는 localhost가 아니라 Agent를 설치한 PC 주소를 입력했는지 먼저 확인하세요. 그 다음 Agent Setup의 검사에서 SamsungSwitchWatchAgent 서비스와 TCP/18443을 점검합니다. AGENT_CLIENT_NOT_ALLOWED이면 현재 Viewer PC의 고정 IPv4를 Agent Setup에 다시 입력하고 설치/업데이트합니다. 서비스를 수동 등록하지 말고 0.10.3-poc Agent Setup을 사용하세요.</w:t>
       </w:r>
     </w:p>
     <w:p>
@@ -1469,7 +1497,7 @@
           <w:color w:val="16324F"/>
           <w:sz w:val="21"/>
         </w:rPr>
-        <w:t>이전 Viewer가 실행 중이면 새 Viewer는 같은 사용자 데이터를 동시에 쓰지 않도록 실행을 차단하고 전환 순서를 표시합니다. 기존 트레이 아이콘에서 '프로그램 종료'를 선택한 뒤 Win+R에서 shell:startup을 열어 'Samsung Switch Watch' 바로 가기를 삭제합니다. 이어 shell:programs에서도 같은 이름의 이전 시작 메뉴 바로 가기를 삭제하고 새 Viewer를 다시 실행하세요. 기존 Agent 연결과 장비 정보는 유지됩니다. 창이 바로 보이지 않으면 알림 영역에서 대시보드를 열고 실행 경로가 새 0.10.2-poc 폴더인지 확인하세요.</w:t>
+        <w:t>이전 Viewer가 실행 중이면 새 Viewer는 같은 사용자 데이터를 동시에 쓰지 않도록 실행을 차단하고 전환 순서를 표시합니다. 기존 트레이 아이콘에서 '프로그램 종료'를 선택한 뒤 Win+R에서 shell:startup을 열어 'Samsung Switch Watch' 바로 가기를 삭제합니다. 이어 shell:programs에서도 같은 이름의 이전 시작 메뉴 바로 가기를 삭제하고 새 Viewer를 다시 실행하세요. 기존 Agent 연결과 장비 정보는 유지됩니다. 창이 바로 보이지 않으면 알림 영역에서 대시보드를 열고 실행 경로가 새 0.10.3-poc 폴더인지 확인하세요.</w:t>
       </w:r>
     </w:p>
     <w:p>
@@ -1567,7 +1595,7 @@
           <w:color w:val="16324F"/>
           <w:sz w:val="21"/>
         </w:rPr>
-        <w:t>0.10.2-poc는 코드 서명되지 않아 SmartScreen이나 사내 EDR이 차단할 수 있습니다. ZIP을 완전히 압축 해제하고 Viewer EXE와 제공된 DLL이 같은 폴더에 있는지 확인하세요. EDR·AppLocker·WDAC가 차단하면 우회하지 말고 공식 ZIP의 버전·해시와 차단 기록을 보안 담당자에게 전달하세요.</w:t>
+        <w:t>0.10.3-poc는 코드 서명되지 않아 SmartScreen이나 사내 EDR이 차단할 수 있습니다. ZIP을 완전히 압축 해제하고 Viewer EXE와 제공된 DLL이 같은 폴더에 있는지 확인하세요. EDR·AppLocker·WDAC가 차단하면 우회하지 말고 공식 ZIP의 버전·해시와 차단 기록을 보안 담당자에게 전달하세요.</w:t>
       </w:r>
     </w:p>
     <w:p>
@@ -1626,7 +1654,7 @@
       <w:r>
         <w:drawing>
           <wp:inline xmlns:a="http://schemas.openxmlformats.org/drawingml/2006/main" xmlns:pic="http://schemas.openxmlformats.org/drawingml/2006/picture">
-            <wp:extent cx="2194560" cy="1769806"/>
+            <wp:extent cx="2194560" cy="1840599"/>
             <wp:docPr id="2" name="Picture 2" title="Agent 연결 창" descr="Agent 주소만 입력하고 HTTPS 포트 18443을 자동 사용하는 연결 설정 창"/>
             <wp:cNvGraphicFramePr>
               <a:graphicFrameLocks noChangeAspect="1"/>
@@ -1647,7 +1675,7 @@
                   <pic:spPr>
                     <a:xfrm>
                       <a:off x="0" y="0"/>
-                      <a:ext cx="2194560" cy="1769806"/>
+                      <a:ext cx="2194560" cy="1840599"/>
                     </a:xfrm>
                     <a:prstGeom prst="rect"/>
                   </pic:spPr>
@@ -5061,7 +5089,7 @@
           <w:rFonts w:ascii="맑은 고딕" w:hAnsi="맑은 고딕" w:eastAsia="맑은 고딕" w:cs="맑은 고딕"/>
           <w:sz w:val="22"/>
         </w:rPr>
-        <w:t>방화벽은 고정 Viewer IPv4의 HTTPS/18443만 허용하고, Agent는 Setup에서 선택한 직접 연결 관리망의 Telnet/23만 사용합니다.</w:t>
+        <w:t>제품 소유 방화벽 규칙과 Agent 원격 업무 API는 같은 고정 Viewer IPv4를 허용합니다. 외부 방화벽 규칙은 변경하지 않으며, Agent PC의 로컬 준비 상태 점검만 예외입니다. Agent는 Setup에서 선택한 직접 연결 관리망의 Telnet/23만 사용합니다.</w:t>
       </w:r>
     </w:p>
     <w:p>
@@ -5319,6 +5347,59 @@
                 <w:rFonts w:ascii="맑은 고딕" w:hAnsi="맑은 고딕" w:eastAsia="맑은 고딕" w:cs="맑은 고딕"/>
                 <w:sz w:val="16"/>
               </w:rPr>
+              <w:t>AGENT_CLIENT_NOT_ALLOWED</w:t>
+            </w:r>
+          </w:p>
+        </w:tc>
+        <w:tc>
+          <w:tcPr>
+            <w:tcW w:type="dxa" w:w="5060"/>
+            <w:tcMar>
+              <w:top w:w="80" w:type="dxa"/>
+              <w:start w:w="120" w:type="dxa"/>
+              <w:bottom w:w="80" w:type="dxa"/>
+              <w:end w:w="120" w:type="dxa"/>
+            </w:tcMar>
+            <w:vAlign w:val="center"/>
+          </w:tcPr>
+          <w:p>
+            <w:pPr>
+              <w:spacing w:before="0" w:after="0" w:line="240" w:lineRule="auto"/>
+              <w:jc w:val="left"/>
+            </w:pPr>
+            <w:r>
+              <w:rPr>
+                <w:rFonts w:ascii="맑은 고딕" w:hAnsi="맑은 고딕" w:eastAsia="맑은 고딕" w:cs="맑은 고딕"/>
+                <w:sz w:val="16"/>
+              </w:rPr>
+              <w:t>Agent PC에서 Setup 재실행 → 현재 Viewer 고정 IPv4 입력 → 설치/업데이트</w:t>
+            </w:r>
+          </w:p>
+        </w:tc>
+      </w:tr>
+      <w:tr>
+        <w:tc>
+          <w:tcPr>
+            <w:tcW w:type="dxa" w:w="4300"/>
+            <w:shd w:fill="FAFBFC"/>
+            <w:tcMar>
+              <w:top w:w="80" w:type="dxa"/>
+              <w:start w:w="120" w:type="dxa"/>
+              <w:bottom w:w="80" w:type="dxa"/>
+              <w:end w:w="120" w:type="dxa"/>
+            </w:tcMar>
+            <w:vAlign w:val="center"/>
+          </w:tcPr>
+          <w:p>
+            <w:pPr>
+              <w:spacing w:before="0" w:after="0" w:line="240" w:lineRule="auto"/>
+              <w:jc w:val="left"/>
+            </w:pPr>
+            <w:r>
+              <w:rPr>
+                <w:rFonts w:ascii="맑은 고딕" w:hAnsi="맑은 고딕" w:eastAsia="맑은 고딕" w:cs="맑은 고딕"/>
+                <w:sz w:val="16"/>
+              </w:rPr>
               <w:t>AGENT_UNREACHABLE</w:t>
             </w:r>
           </w:p>
@@ -5326,6 +5407,7 @@
         <w:tc>
           <w:tcPr>
             <w:tcW w:type="dxa" w:w="5060"/>
+            <w:shd w:fill="FAFBFC"/>
             <w:tcMar>
               <w:top w:w="80" w:type="dxa"/>
               <w:start w:w="120" w:type="dxa"/>
@@ -5353,7 +5435,6 @@
         <w:tc>
           <w:tcPr>
             <w:tcW w:type="dxa" w:w="4300"/>
-            <w:shd w:fill="FAFBFC"/>
             <w:tcMar>
               <w:top w:w="80" w:type="dxa"/>
               <w:start w:w="120" w:type="dxa"/>
@@ -5379,7 +5460,6 @@
         <w:tc>
           <w:tcPr>
             <w:tcW w:type="dxa" w:w="5060"/>
-            <w:shd w:fill="FAFBFC"/>
             <w:tcMar>
               <w:top w:w="80" w:type="dxa"/>
               <w:start w:w="120" w:type="dxa"/>
@@ -5407,6 +5487,7 @@
         <w:tc>
           <w:tcPr>
             <w:tcW w:type="dxa" w:w="4300"/>
+            <w:shd w:fill="FAFBFC"/>
             <w:tcMar>
               <w:top w:w="80" w:type="dxa"/>
               <w:start w:w="120" w:type="dxa"/>
@@ -5432,6 +5513,7 @@
         <w:tc>
           <w:tcPr>
             <w:tcW w:type="dxa" w:w="5060"/>
+            <w:shd w:fill="FAFBFC"/>
             <w:tcMar>
               <w:top w:w="80" w:type="dxa"/>
               <w:start w:w="120" w:type="dxa"/>
@@ -5459,7 +5541,6 @@
         <w:tc>
           <w:tcPr>
             <w:tcW w:type="dxa" w:w="4300"/>
-            <w:shd w:fill="FAFBFC"/>
             <w:tcMar>
               <w:top w:w="80" w:type="dxa"/>
               <w:start w:w="120" w:type="dxa"/>
@@ -5485,7 +5566,6 @@
         <w:tc>
           <w:tcPr>
             <w:tcW w:type="dxa" w:w="5060"/>
-            <w:shd w:fill="FAFBFC"/>
             <w:tcMar>
               <w:top w:w="80" w:type="dxa"/>
               <w:start w:w="120" w:type="dxa"/>
@@ -5513,6 +5593,7 @@
         <w:tc>
           <w:tcPr>
             <w:tcW w:type="dxa" w:w="4300"/>
+            <w:shd w:fill="FAFBFC"/>
             <w:tcMar>
               <w:top w:w="80" w:type="dxa"/>
               <w:start w:w="120" w:type="dxa"/>
@@ -5538,6 +5619,7 @@
         <w:tc>
           <w:tcPr>
             <w:tcW w:type="dxa" w:w="5060"/>
+            <w:shd w:fill="FAFBFC"/>
             <w:tcMar>
               <w:top w:w="80" w:type="dxa"/>
               <w:start w:w="120" w:type="dxa"/>
@@ -5565,7 +5647,6 @@
         <w:tc>
           <w:tcPr>
             <w:tcW w:type="dxa" w:w="4300"/>
-            <w:shd w:fill="FAFBFC"/>
             <w:tcMar>
               <w:top w:w="80" w:type="dxa"/>
               <w:start w:w="120" w:type="dxa"/>
@@ -5591,7 +5672,6 @@
         <w:tc>
           <w:tcPr>
             <w:tcW w:type="dxa" w:w="5060"/>
-            <w:shd w:fill="FAFBFC"/>
             <w:tcMar>
               <w:top w:w="80" w:type="dxa"/>
               <w:start w:w="120" w:type="dxa"/>
@@ -5619,6 +5699,7 @@
         <w:tc>
           <w:tcPr>
             <w:tcW w:type="dxa" w:w="4300"/>
+            <w:shd w:fill="FAFBFC"/>
             <w:tcMar>
               <w:top w:w="80" w:type="dxa"/>
               <w:start w:w="120" w:type="dxa"/>
@@ -5644,6 +5725,7 @@
         <w:tc>
           <w:tcPr>
             <w:tcW w:type="dxa" w:w="5060"/>
+            <w:shd w:fill="FAFBFC"/>
             <w:tcMar>
               <w:top w:w="80" w:type="dxa"/>
               <w:start w:w="120" w:type="dxa"/>
@@ -5663,6 +5745,58 @@
                 <w:sz w:val="16"/>
               </w:rPr>
               <w:t>Windows 서비스 관리 권한 → 기존 SamsungSwitchWatchAgent 상태</w:t>
+            </w:r>
+          </w:p>
+        </w:tc>
+      </w:tr>
+      <w:tr>
+        <w:tc>
+          <w:tcPr>
+            <w:tcW w:type="dxa" w:w="4300"/>
+            <w:tcMar>
+              <w:top w:w="80" w:type="dxa"/>
+              <w:start w:w="120" w:type="dxa"/>
+              <w:bottom w:w="80" w:type="dxa"/>
+              <w:end w:w="120" w:type="dxa"/>
+            </w:tcMar>
+            <w:vAlign w:val="center"/>
+          </w:tcPr>
+          <w:p>
+            <w:pPr>
+              <w:spacing w:before="0" w:after="0" w:line="240" w:lineRule="auto"/>
+              <w:jc w:val="left"/>
+            </w:pPr>
+            <w:r>
+              <w:rPr>
+                <w:rFonts w:ascii="맑은 고딕" w:hAnsi="맑은 고딕" w:eastAsia="맑은 고딕" w:cs="맑은 고딕"/>
+                <w:sz w:val="16"/>
+              </w:rPr>
+              <w:t>FIREWALL_OVERLAP_PROTECTED</w:t>
+            </w:r>
+          </w:p>
+        </w:tc>
+        <w:tc>
+          <w:tcPr>
+            <w:tcW w:type="dxa" w:w="5060"/>
+            <w:tcMar>
+              <w:top w:w="80" w:type="dxa"/>
+              <w:start w:w="120" w:type="dxa"/>
+              <w:bottom w:w="80" w:type="dxa"/>
+              <w:end w:w="120" w:type="dxa"/>
+            </w:tcMar>
+            <w:vAlign w:val="center"/>
+          </w:tcPr>
+          <w:p>
+            <w:pPr>
+              <w:spacing w:before="0" w:after="0" w:line="240" w:lineRule="auto"/>
+              <w:jc w:val="left"/>
+            </w:pPr>
+            <w:r>
+              <w:rPr>
+                <w:rFonts w:ascii="맑은 고딕" w:hAnsi="맑은 고딕" w:eastAsia="맑은 고딕" w:cs="맑은 고딕"/>
+                <w:sz w:val="16"/>
+              </w:rPr>
+              <w:t>외부 규칙은 보존됨 → Viewer 고정 IPv4 확인 → 설치/업데이트 계속</w:t>
             </w:r>
           </w:p>
         </w:tc>
@@ -5716,7 +5850,7 @@
                 <w:rFonts w:ascii="맑은 고딕" w:hAnsi="맑은 고딕" w:eastAsia="맑은 고딕" w:cs="맑은 고딕"/>
                 <w:sz w:val="16"/>
               </w:rPr>
-              <w:t>Windows 방화벽 서비스 → 동명 비소유 규칙 → 보안 정책</w:t>
+              <w:t>Windows 방화벽 서비스 → 제품 규칙 이름 충돌 → 기본 인바운드·그룹 정책</w:t>
             </w:r>
           </w:p>
         </w:tc>
@@ -7467,7 +7601,7 @@
         <w:color w:val="64748B"/>
         <w:sz w:val="17"/>
       </w:rPr>
-      <w:t xml:space="preserve">v0.10.2-poc  |  </w:t>
+      <w:t xml:space="preserve">v0.10.3-poc  |  </w:t>
     </w:r>
     <w:r>
       <w:rPr>
@@ -7498,7 +7632,7 @@
         <w:color w:val="64748B"/>
         <w:sz w:val="17"/>
       </w:rPr>
-      <w:t>v0.10.2-poc  |  2026-07-29</w:t>
+      <w:t>v0.10.3-poc  |  2026-07-29</w:t>
     </w:r>
   </w:p>
 </w:ftr>

</xml_diff>

<commit_message>
Add manual management network setup flow
</commit_message>
<xml_diff>
--- a/docs/SamsungSwitchWatch_User_Manual_KO.docx
+++ b/docs/SamsungSwitchWatch_User_Manual_KO.docx
@@ -533,7 +533,7 @@
         <w:rPr>
           <w:rFonts w:ascii="맑은 고딕" w:hAnsi="맑은 고딕" w:eastAsia="맑은 고딕" w:cs="맑은 고딕"/>
         </w:rPr>
-        <w:t>고정 Viewer IPv4를 입력하고 자동 검색된 스위치 관리망 1~2개를 선택해 Agent 서비스를 설치합니다.</w:t>
+        <w:t>고정 Viewer IPv4를 입력하고 자동 검색된 관리망을 선택합니다. 목록에 없으면 승인된 사설 관리망을 직접 추가해 합계 1~2개로 설치합니다.</w:t>
       </w:r>
     </w:p>
     <w:p>
@@ -966,7 +966,7 @@
                 <w:rFonts w:ascii="맑은 고딕" w:hAnsi="맑은 고딕" w:eastAsia="맑은 고딕" w:cs="맑은 고딕"/>
                 <w:sz w:val="18"/>
               </w:rPr>
-              <w:t>설치 시 선택한 관리망만 허용</w:t>
+              <w:t>설치 시 선택·추가한 관리망만 허용</w:t>
             </w:r>
           </w:p>
         </w:tc>
@@ -1132,7 +1132,7 @@
           <w:color w:val="16324F"/>
           <w:sz w:val="21"/>
         </w:rPr>
-        <w:t>0.10.3-poc는 코드 서명되지 않은 시험판입니다. 압축을 풀기 전에 Agent와 Viewer ZIP의 SHA-256을 해당 GitHub Release 본문에 표시된 값과 비교하고 사내 보안 반입 절차를 완료하세요. SmartScreen 또는 EDR 경고를 우회하지 않습니다.</w:t>
+        <w:t>0.10.4-poc는 코드 서명되지 않은 시험판입니다. 압축을 풀기 전에 Agent와 Viewer ZIP의 SHA-256을 해당 GitHub Release 본문에 표시된 값과 비교하고 사내 보안 반입 절차를 완료하세요. SmartScreen 또는 EDR 경고를 우회하지 않습니다.</w:t>
       </w:r>
     </w:p>
     <w:p>
@@ -1174,7 +1174,21 @@
         <w:rPr>
           <w:rFonts w:ascii="맑은 고딕" w:hAnsi="맑은 고딕" w:eastAsia="맑은 고딕" w:cs="맑은 고딕"/>
         </w:rPr>
-        <w:t>고정 Viewer PC IPv4를 입력하고 자동 검색된 직접 연결 사설 관리망 1~2개를 선택합니다.</w:t>
+        <w:t>고정 Viewer PC IPv4를 입력하고 자동 검색된 관리망을 선택합니다. 목록에 없으면 승인된 RFC1918 관리망을 IPv4/prefix로 직접 추가합니다.</w:t>
+      </w:r>
+    </w:p>
+    <w:p>
+      <w:pPr>
+        <w:numPr>
+          <w:ilvl w:val="0"/>
+          <w:numId w:val="13"/>
+        </w:numPr>
+      </w:pPr>
+      <w:r>
+        <w:rPr>
+          <w:rFonts w:ascii="맑은 고딕" w:hAnsi="맑은 고딕" w:eastAsia="맑은 고딕" w:cs="맑은 고딕"/>
+        </w:rPr>
+        <w:t>직접 입력한 주소가 네트워크 주소로 정규화되었는지 확인하고, 자동 선택과 직접 추가를 합해 1~2개인지 확인합니다.</w:t>
       </w:r>
     </w:p>
     <w:p>
@@ -1201,7 +1215,7 @@
         <w:drawing>
           <wp:inline xmlns:a="http://schemas.openxmlformats.org/drawingml/2006/main" xmlns:pic="http://schemas.openxmlformats.org/drawingml/2006/picture">
             <wp:extent cx="4114800" cy="3789947"/>
-            <wp:docPr id="1" name="Picture 1" title="Agent Setup 화면" descr="고정 Viewer IPv4와 자동 검색된 직접 연결 관리망을 선택하는 Agent Setup 화면"/>
+            <wp:docPr id="1" name="Picture 1" title="Agent Setup 화면" descr="고정 Viewer IPv4, 자동 검색 관리망, 정규화된 직접 추가 관리망을 확인하는 Agent Setup 화면"/>
             <wp:cNvGraphicFramePr>
               <a:graphicFrameLocks noChangeAspect="1"/>
             </wp:cNvGraphicFramePr>
@@ -1237,7 +1251,7 @@
         <w:pStyle w:val="Caption"/>
       </w:pPr>
       <w:r>
-        <w:t>그림 1. Agent 서비스 설치와 네트워크 범위 선택</w:t>
+        <w:t>그림 1. Agent 서비스 설치와 자동·직접 추가 관리망 범위 확인</w:t>
       </w:r>
     </w:p>
     <w:p>
@@ -1294,7 +1308,29 @@
           <w:color w:val="243447"/>
           <w:sz w:val="17"/>
         </w:rPr>
-        <w:t>선택 관리망 예       : 10.50.0.0/24</w:t>
+        <w:t>자동 검색 관리망     : 10.50.0.0/24</w:t>
+      </w:r>
+      <w:r>
+        <w:br/>
+      </w:r>
+      <w:r>
+        <w:rPr>
+          <w:rFonts w:ascii="Consolas" w:hAnsi="Consolas" w:eastAsia="Consolas" w:cs="Consolas"/>
+          <w:color w:val="243447"/>
+          <w:sz w:val="17"/>
+        </w:rPr>
+        <w:t>직접 추가 입력       : 172.20.40.25/24</w:t>
+      </w:r>
+      <w:r>
+        <w:br/>
+      </w:r>
+      <w:r>
+        <w:rPr>
+          <w:rFonts w:ascii="Consolas" w:hAnsi="Consolas" w:eastAsia="Consolas" w:cs="Consolas"/>
+          <w:color w:val="243447"/>
+          <w:sz w:val="17"/>
+        </w:rPr>
+        <w:t>정규화 결과          : 172.20.40.0/24</w:t>
       </w:r>
       <w:r>
         <w:br/>
@@ -1422,7 +1458,7 @@
           <w:color w:val="16324F"/>
           <w:sz w:val="21"/>
         </w:rPr>
-        <w:t>Viewer PC 주소나 스위치 관리망이 바뀌면 같은 Release의 Agent Setup을 다시 열어 고정 Viewer IPv4와 자동 검색된 관리망을 검토합니다. 사용자가 CIDR을 계산하거나 사설망 전체를 직접 허용하지 않습니다. 검사에서 서비스, TCP/18443 listener, 방화벽, Agent 내부 Viewer 허용 주소, 활성 프로필과 live/ready를 확인합니다.</w:t>
+        <w:t>Viewer PC 주소나 스위치 관리망이 바뀌면 같은 Release의 Agent Setup을 다시 열어 고정 Viewer IPv4와 자동 검색 또는 직접 추가 관리망을 검토합니다. 직접 입력은 네트워크 주소로 자동 정규화되며 RFC1918 범위만 허용됩니다. 검사에서 서비스, TCP/18443 listener, 방화벽, Agent 내부 Viewer 허용 주소, 활성 프로필과 live/ready를 확인합니다.</w:t>
       </w:r>
     </w:p>
     <w:p>
@@ -1450,7 +1486,7 @@
           <w:color w:val="16324F"/>
           <w:sz w:val="21"/>
         </w:rPr>
-        <w:t>Agent Setup에 설치 실패가 표시되면 실패 단계와 Cause를 먼저 확인하세요. 설치 성공 뒤 AGENT_CONNECTION_REFUSED가 보이면 Viewer에 스위치 IP, Viewer PC 주소 또는 localhost가 아니라 Agent를 설치한 PC 주소를 입력했는지 먼저 확인하세요. 그 다음 Agent Setup의 검사에서 SamsungSwitchWatchAgent 서비스와 TCP/18443을 점검합니다. AGENT_CLIENT_NOT_ALLOWED이면 현재 Viewer PC의 고정 IPv4를 Agent Setup에 다시 입력하고 설치/업데이트합니다. 서비스를 수동 등록하지 말고 0.10.3-poc Agent Setup을 사용하세요.</w:t>
+        <w:t>Agent Setup에 설치 실패가 표시되면 실패 단계와 Cause를 먼저 확인하세요. 설치 성공 뒤 AGENT_CONNECTION_REFUSED가 보이면 Viewer에 스위치 IP, Viewer PC 주소 또는 localhost가 아니라 Agent를 설치한 PC 주소를 입력했는지 먼저 확인하세요. 그 다음 Agent Setup의 검사에서 SamsungSwitchWatchAgent 서비스와 TCP/18443을 점검합니다. AGENT_CLIENT_NOT_ALLOWED이면 현재 Viewer PC의 고정 IPv4를 Agent Setup에 다시 입력하고 설치/업데이트합니다. 서비스를 수동 등록하지 말고 0.10.4-poc Agent Setup을 사용하세요.</w:t>
       </w:r>
     </w:p>
     <w:p>
@@ -1497,7 +1533,7 @@
           <w:color w:val="16324F"/>
           <w:sz w:val="21"/>
         </w:rPr>
-        <w:t>이전 Viewer가 실행 중이면 새 Viewer는 같은 사용자 데이터를 동시에 쓰지 않도록 실행을 차단하고 전환 순서를 표시합니다. 기존 트레이 아이콘에서 '프로그램 종료'를 선택한 뒤 Win+R에서 shell:startup을 열어 'Samsung Switch Watch' 바로 가기를 삭제합니다. 이어 shell:programs에서도 같은 이름의 이전 시작 메뉴 바로 가기를 삭제하고 새 Viewer를 다시 실행하세요. 기존 Agent 연결과 장비 정보는 유지됩니다. 창이 바로 보이지 않으면 알림 영역에서 대시보드를 열고 실행 경로가 새 0.10.3-poc 폴더인지 확인하세요.</w:t>
+        <w:t>이전 Viewer가 실행 중이면 새 Viewer는 같은 사용자 데이터를 동시에 쓰지 않도록 실행을 차단하고 전환 순서를 표시합니다. 기존 트레이 아이콘에서 '프로그램 종료'를 선택한 뒤 Win+R에서 shell:startup을 열어 'Samsung Switch Watch' 바로 가기를 삭제합니다. 이어 shell:programs에서도 같은 이름의 이전 시작 메뉴 바로 가기를 삭제하고 새 Viewer를 다시 실행하세요. 기존 Agent 연결과 장비 정보는 유지됩니다. 창이 바로 보이지 않으면 알림 영역에서 대시보드를 열고 실행 경로가 새 0.10.4-poc 폴더인지 확인하세요.</w:t>
       </w:r>
     </w:p>
     <w:p>
@@ -1595,7 +1631,7 @@
           <w:color w:val="16324F"/>
           <w:sz w:val="21"/>
         </w:rPr>
-        <w:t>0.10.3-poc는 코드 서명되지 않아 SmartScreen이나 사내 EDR이 차단할 수 있습니다. ZIP을 완전히 압축 해제하고 Viewer EXE와 제공된 DLL이 같은 폴더에 있는지 확인하세요. EDR·AppLocker·WDAC가 차단하면 우회하지 말고 공식 ZIP의 버전·해시와 차단 기록을 보안 담당자에게 전달하세요.</w:t>
+        <w:t>0.10.4-poc는 코드 서명되지 않아 SmartScreen이나 사내 EDR이 차단할 수 있습니다. ZIP을 완전히 압축 해제하고 Viewer EXE와 제공된 DLL이 같은 폴더에 있는지 확인하세요. EDR·AppLocker·WDAC가 차단하면 우회하지 말고 공식 ZIP의 버전·해시와 차단 기록을 보안 담당자에게 전달하세요.</w:t>
       </w:r>
     </w:p>
     <w:p>
@@ -5089,7 +5125,7 @@
           <w:rFonts w:ascii="맑은 고딕" w:hAnsi="맑은 고딕" w:eastAsia="맑은 고딕" w:cs="맑은 고딕"/>
           <w:sz w:val="22"/>
         </w:rPr>
-        <w:t>제품 소유 방화벽 규칙과 Agent 원격 업무 API는 같은 고정 Viewer IPv4를 허용합니다. 외부 방화벽 규칙은 변경하지 않으며, Agent PC의 로컬 준비 상태 점검만 예외입니다. Agent는 Setup에서 선택한 직접 연결 관리망의 Telnet/23만 사용합니다.</w:t>
+        <w:t>제품 소유 방화벽 규칙과 Agent 원격 업무 API는 같은 고정 Viewer IPv4를 허용합니다. 외부 방화벽 규칙은 변경하지 않으며, Agent PC의 로컬 준비 상태 점검만 예외입니다. Agent는 Setup에서 선택하거나 직접 추가해 확정한 관리망의 Telnet/23만 사용합니다.</w:t>
       </w:r>
     </w:p>
     <w:p>
@@ -5983,7 +6019,7 @@
                 <w:rFonts w:ascii="맑은 고딕" w:hAnsi="맑은 고딕" w:eastAsia="맑은 고딕" w:cs="맑은 고딕"/>
                 <w:sz w:val="16"/>
               </w:rPr>
-              <w:t>TARGET_NOT_ALLOWED</w:t>
+              <w:t>SETUP_EXISTING_NETWORKS_NOT_LOADED</w:t>
             </w:r>
           </w:p>
         </w:tc>
@@ -6008,7 +6044,7 @@
                 <w:rFonts w:ascii="맑은 고딕" w:hAnsi="맑은 고딕" w:eastAsia="맑은 고딕" w:cs="맑은 고딕"/>
                 <w:sz w:val="16"/>
               </w:rPr>
-              <w:t>장비 IPv4가 Setup에서 선택한 관리망 내부인지 확인</w:t>
+              <w:t>기존 관리망을 자동 복원하지 못함. 승인된 관리망을 다시 선택하거나 IPv4/prefix로 직접 추가</w:t>
             </w:r>
           </w:p>
         </w:tc>
@@ -6036,6 +6072,59 @@
                 <w:rFonts w:ascii="맑은 고딕" w:hAnsi="맑은 고딕" w:eastAsia="맑은 고딕" w:cs="맑은 고딕"/>
                 <w:sz w:val="16"/>
               </w:rPr>
+              <w:t>TARGET_NOT_ALLOWED</w:t>
+            </w:r>
+          </w:p>
+        </w:tc>
+        <w:tc>
+          <w:tcPr>
+            <w:tcW w:type="dxa" w:w="5060"/>
+            <w:shd w:fill="FAFBFC"/>
+            <w:tcMar>
+              <w:top w:w="80" w:type="dxa"/>
+              <w:start w:w="120" w:type="dxa"/>
+              <w:bottom w:w="80" w:type="dxa"/>
+              <w:end w:w="120" w:type="dxa"/>
+            </w:tcMar>
+            <w:vAlign w:val="center"/>
+          </w:tcPr>
+          <w:p>
+            <w:pPr>
+              <w:spacing w:before="0" w:after="0" w:line="240" w:lineRule="auto"/>
+              <w:jc w:val="left"/>
+            </w:pPr>
+            <w:r>
+              <w:rPr>
+                <w:rFonts w:ascii="맑은 고딕" w:hAnsi="맑은 고딕" w:eastAsia="맑은 고딕" w:cs="맑은 고딕"/>
+                <w:sz w:val="16"/>
+              </w:rPr>
+              <w:t>장비 IPv4가 Setup에서 선택·추가한 관리망 내부인지 확인. 필요하면 승인된 사설 CIDR을 Setup에서 추가</w:t>
+            </w:r>
+          </w:p>
+        </w:tc>
+      </w:tr>
+      <w:tr>
+        <w:tc>
+          <w:tcPr>
+            <w:tcW w:type="dxa" w:w="4300"/>
+            <w:tcMar>
+              <w:top w:w="80" w:type="dxa"/>
+              <w:start w:w="120" w:type="dxa"/>
+              <w:bottom w:w="80" w:type="dxa"/>
+              <w:end w:w="120" w:type="dxa"/>
+            </w:tcMar>
+            <w:vAlign w:val="center"/>
+          </w:tcPr>
+          <w:p>
+            <w:pPr>
+              <w:spacing w:before="0" w:after="0" w:line="240" w:lineRule="auto"/>
+              <w:jc w:val="left"/>
+            </w:pPr>
+            <w:r>
+              <w:rPr>
+                <w:rFonts w:ascii="맑은 고딕" w:hAnsi="맑은 고딕" w:eastAsia="맑은 고딕" w:cs="맑은 고딕"/>
+                <w:sz w:val="16"/>
+              </w:rPr>
               <w:t>TCP_TIMEOUT</w:t>
             </w:r>
           </w:p>
@@ -6043,7 +6132,6 @@
         <w:tc>
           <w:tcPr>
             <w:tcW w:type="dxa" w:w="5060"/>
-            <w:shd w:fill="FAFBFC"/>
             <w:tcMar>
               <w:top w:w="80" w:type="dxa"/>
               <w:start w:w="120" w:type="dxa"/>
@@ -6071,6 +6159,7 @@
         <w:tc>
           <w:tcPr>
             <w:tcW w:type="dxa" w:w="4300"/>
+            <w:shd w:fill="FAFBFC"/>
             <w:tcMar>
               <w:top w:w="80" w:type="dxa"/>
               <w:start w:w="120" w:type="dxa"/>
@@ -6096,6 +6185,7 @@
         <w:tc>
           <w:tcPr>
             <w:tcW w:type="dxa" w:w="5060"/>
+            <w:shd w:fill="FAFBFC"/>
             <w:tcMar>
               <w:top w:w="80" w:type="dxa"/>
               <w:start w:w="120" w:type="dxa"/>
@@ -6123,7 +6213,6 @@
         <w:tc>
           <w:tcPr>
             <w:tcW w:type="dxa" w:w="4300"/>
-            <w:shd w:fill="FAFBFC"/>
             <w:tcMar>
               <w:top w:w="80" w:type="dxa"/>
               <w:start w:w="120" w:type="dxa"/>
@@ -6149,7 +6238,6 @@
         <w:tc>
           <w:tcPr>
             <w:tcW w:type="dxa" w:w="5060"/>
-            <w:shd w:fill="FAFBFC"/>
             <w:tcMar>
               <w:top w:w="80" w:type="dxa"/>
               <w:start w:w="120" w:type="dxa"/>
@@ -6177,6 +6265,7 @@
         <w:tc>
           <w:tcPr>
             <w:tcW w:type="dxa" w:w="4300"/>
+            <w:shd w:fill="FAFBFC"/>
             <w:tcMar>
               <w:top w:w="80" w:type="dxa"/>
               <w:start w:w="120" w:type="dxa"/>
@@ -6202,6 +6291,7 @@
         <w:tc>
           <w:tcPr>
             <w:tcW w:type="dxa" w:w="5060"/>
+            <w:shd w:fill="FAFBFC"/>
             <w:tcMar>
               <w:top w:w="80" w:type="dxa"/>
               <w:start w:w="120" w:type="dxa"/>
@@ -6229,7 +6319,6 @@
         <w:tc>
           <w:tcPr>
             <w:tcW w:type="dxa" w:w="4300"/>
-            <w:shd w:fill="FAFBFC"/>
             <w:tcMar>
               <w:top w:w="80" w:type="dxa"/>
               <w:start w:w="120" w:type="dxa"/>
@@ -6255,7 +6344,6 @@
         <w:tc>
           <w:tcPr>
             <w:tcW w:type="dxa" w:w="5060"/>
-            <w:shd w:fill="FAFBFC"/>
             <w:tcMar>
               <w:top w:w="80" w:type="dxa"/>
               <w:start w:w="120" w:type="dxa"/>
@@ -6283,6 +6371,7 @@
         <w:tc>
           <w:tcPr>
             <w:tcW w:type="dxa" w:w="4300"/>
+            <w:shd w:fill="FAFBFC"/>
             <w:tcMar>
               <w:top w:w="80" w:type="dxa"/>
               <w:start w:w="120" w:type="dxa"/>
@@ -6308,6 +6397,7 @@
         <w:tc>
           <w:tcPr>
             <w:tcW w:type="dxa" w:w="5060"/>
+            <w:shd w:fill="FAFBFC"/>
             <w:tcMar>
               <w:top w:w="80" w:type="dxa"/>
               <w:start w:w="120" w:type="dxa"/>
@@ -6335,7 +6425,6 @@
         <w:tc>
           <w:tcPr>
             <w:tcW w:type="dxa" w:w="4300"/>
-            <w:shd w:fill="FAFBFC"/>
             <w:tcMar>
               <w:top w:w="80" w:type="dxa"/>
               <w:start w:w="120" w:type="dxa"/>
@@ -6361,7 +6450,6 @@
         <w:tc>
           <w:tcPr>
             <w:tcW w:type="dxa" w:w="5060"/>
-            <w:shd w:fill="FAFBFC"/>
             <w:tcMar>
               <w:top w:w="80" w:type="dxa"/>
               <w:start w:w="120" w:type="dxa"/>
@@ -6389,6 +6477,7 @@
         <w:tc>
           <w:tcPr>
             <w:tcW w:type="dxa" w:w="4300"/>
+            <w:shd w:fill="FAFBFC"/>
             <w:tcMar>
               <w:top w:w="80" w:type="dxa"/>
               <w:start w:w="120" w:type="dxa"/>
@@ -6414,6 +6503,7 @@
         <w:tc>
           <w:tcPr>
             <w:tcW w:type="dxa" w:w="5060"/>
+            <w:shd w:fill="FAFBFC"/>
             <w:tcMar>
               <w:top w:w="80" w:type="dxa"/>
               <w:start w:w="120" w:type="dxa"/>
@@ -6441,7 +6531,6 @@
         <w:tc>
           <w:tcPr>
             <w:tcW w:type="dxa" w:w="4300"/>
-            <w:shd w:fill="FAFBFC"/>
             <w:tcMar>
               <w:top w:w="80" w:type="dxa"/>
               <w:start w:w="120" w:type="dxa"/>
@@ -6467,7 +6556,6 @@
         <w:tc>
           <w:tcPr>
             <w:tcW w:type="dxa" w:w="5060"/>
-            <w:shd w:fill="FAFBFC"/>
             <w:tcMar>
               <w:top w:w="80" w:type="dxa"/>
               <w:start w:w="120" w:type="dxa"/>
@@ -6495,6 +6583,7 @@
         <w:tc>
           <w:tcPr>
             <w:tcW w:type="dxa" w:w="4300"/>
+            <w:shd w:fill="FAFBFC"/>
             <w:tcMar>
               <w:top w:w="80" w:type="dxa"/>
               <w:start w:w="120" w:type="dxa"/>
@@ -6520,6 +6609,7 @@
         <w:tc>
           <w:tcPr>
             <w:tcW w:type="dxa" w:w="5060"/>
+            <w:shd w:fill="FAFBFC"/>
             <w:tcMar>
               <w:top w:w="80" w:type="dxa"/>
               <w:start w:w="120" w:type="dxa"/>
@@ -6547,7 +6637,6 @@
         <w:tc>
           <w:tcPr>
             <w:tcW w:type="dxa" w:w="4300"/>
-            <w:shd w:fill="FAFBFC"/>
             <w:tcMar>
               <w:top w:w="80" w:type="dxa"/>
               <w:start w:w="120" w:type="dxa"/>
@@ -6573,7 +6662,6 @@
         <w:tc>
           <w:tcPr>
             <w:tcW w:type="dxa" w:w="5060"/>
-            <w:shd w:fill="FAFBFC"/>
             <w:tcMar>
               <w:top w:w="80" w:type="dxa"/>
               <w:start w:w="120" w:type="dxa"/>
@@ -6601,6 +6689,7 @@
         <w:tc>
           <w:tcPr>
             <w:tcW w:type="dxa" w:w="4300"/>
+            <w:shd w:fill="FAFBFC"/>
             <w:tcMar>
               <w:top w:w="80" w:type="dxa"/>
               <w:start w:w="120" w:type="dxa"/>
@@ -6626,6 +6715,7 @@
         <w:tc>
           <w:tcPr>
             <w:tcW w:type="dxa" w:w="5060"/>
+            <w:shd w:fill="FAFBFC"/>
             <w:tcMar>
               <w:top w:w="80" w:type="dxa"/>
               <w:start w:w="120" w:type="dxa"/>
@@ -6653,7 +6743,6 @@
         <w:tc>
           <w:tcPr>
             <w:tcW w:type="dxa" w:w="4300"/>
-            <w:shd w:fill="FAFBFC"/>
             <w:tcMar>
               <w:top w:w="80" w:type="dxa"/>
               <w:start w:w="120" w:type="dxa"/>
@@ -6679,7 +6768,6 @@
         <w:tc>
           <w:tcPr>
             <w:tcW w:type="dxa" w:w="5060"/>
-            <w:shd w:fill="FAFBFC"/>
             <w:tcMar>
               <w:top w:w="80" w:type="dxa"/>
               <w:start w:w="120" w:type="dxa"/>
@@ -6707,6 +6795,7 @@
         <w:tc>
           <w:tcPr>
             <w:tcW w:type="dxa" w:w="4300"/>
+            <w:shd w:fill="FAFBFC"/>
             <w:tcMar>
               <w:top w:w="80" w:type="dxa"/>
               <w:start w:w="120" w:type="dxa"/>
@@ -6732,6 +6821,7 @@
         <w:tc>
           <w:tcPr>
             <w:tcW w:type="dxa" w:w="5060"/>
+            <w:shd w:fill="FAFBFC"/>
             <w:tcMar>
               <w:top w:w="80" w:type="dxa"/>
               <w:start w:w="120" w:type="dxa"/>
@@ -6759,7 +6849,6 @@
         <w:tc>
           <w:tcPr>
             <w:tcW w:type="dxa" w:w="4300"/>
-            <w:shd w:fill="FAFBFC"/>
             <w:tcMar>
               <w:top w:w="80" w:type="dxa"/>
               <w:start w:w="120" w:type="dxa"/>
@@ -6785,7 +6874,6 @@
         <w:tc>
           <w:tcPr>
             <w:tcW w:type="dxa" w:w="5060"/>
-            <w:shd w:fill="FAFBFC"/>
             <w:tcMar>
               <w:top w:w="80" w:type="dxa"/>
               <w:start w:w="120" w:type="dxa"/>
@@ -6813,6 +6901,7 @@
         <w:tc>
           <w:tcPr>
             <w:tcW w:type="dxa" w:w="4300"/>
+            <w:shd w:fill="FAFBFC"/>
             <w:tcMar>
               <w:top w:w="80" w:type="dxa"/>
               <w:start w:w="120" w:type="dxa"/>
@@ -6838,6 +6927,7 @@
         <w:tc>
           <w:tcPr>
             <w:tcW w:type="dxa" w:w="5060"/>
+            <w:shd w:fill="FAFBFC"/>
             <w:tcMar>
               <w:top w:w="80" w:type="dxa"/>
               <w:start w:w="120" w:type="dxa"/>
@@ -6865,7 +6955,6 @@
         <w:tc>
           <w:tcPr>
             <w:tcW w:type="dxa" w:w="4300"/>
-            <w:shd w:fill="FAFBFC"/>
             <w:tcMar>
               <w:top w:w="80" w:type="dxa"/>
               <w:start w:w="120" w:type="dxa"/>
@@ -6891,7 +6980,6 @@
         <w:tc>
           <w:tcPr>
             <w:tcW w:type="dxa" w:w="5060"/>
-            <w:shd w:fill="FAFBFC"/>
             <w:tcMar>
               <w:top w:w="80" w:type="dxa"/>
               <w:start w:w="120" w:type="dxa"/>
@@ -6919,6 +7007,7 @@
         <w:tc>
           <w:tcPr>
             <w:tcW w:type="dxa" w:w="4300"/>
+            <w:shd w:fill="FAFBFC"/>
             <w:tcMar>
               <w:top w:w="80" w:type="dxa"/>
               <w:start w:w="120" w:type="dxa"/>
@@ -6944,6 +7033,7 @@
         <w:tc>
           <w:tcPr>
             <w:tcW w:type="dxa" w:w="5060"/>
+            <w:shd w:fill="FAFBFC"/>
             <w:tcMar>
               <w:top w:w="80" w:type="dxa"/>
               <w:start w:w="120" w:type="dxa"/>
@@ -7601,7 +7691,7 @@
         <w:color w:val="64748B"/>
         <w:sz w:val="17"/>
       </w:rPr>
-      <w:t xml:space="preserve">v0.10.3-poc  |  </w:t>
+      <w:t xml:space="preserve">v0.10.4-poc  |  </w:t>
     </w:r>
     <w:r>
       <w:rPr>
@@ -7632,7 +7722,7 @@
         <w:color w:val="64748B"/>
         <w:sz w:val="17"/>
       </w:rPr>
-      <w:t>v0.10.3-poc  |  2026-07-29</w:t>
+      <w:t>v0.10.4-poc  |  2026-07-29</w:t>
     </w:r>
   </w:p>
 </w:ftr>

</xml_diff>

<commit_message>
Add manual management network setup flow (#39)
Allow operators to add approved RFC1918 switch management networks when Agent Setup cannot discover them automatically, while preserving canonicalization, the two-network limit, existing-setting reload, and read-only access controls.
</commit_message>
<xml_diff>
--- a/docs/SamsungSwitchWatch_User_Manual_KO.docx
+++ b/docs/SamsungSwitchWatch_User_Manual_KO.docx
@@ -533,7 +533,7 @@
         <w:rPr>
           <w:rFonts w:ascii="맑은 고딕" w:hAnsi="맑은 고딕" w:eastAsia="맑은 고딕" w:cs="맑은 고딕"/>
         </w:rPr>
-        <w:t>고정 Viewer IPv4를 입력하고 자동 검색된 스위치 관리망 1~2개를 선택해 Agent 서비스를 설치합니다.</w:t>
+        <w:t>고정 Viewer IPv4를 입력하고 자동 검색된 관리망을 선택합니다. 목록에 없으면 승인된 사설 관리망을 직접 추가해 합계 1~2개로 설치합니다.</w:t>
       </w:r>
     </w:p>
     <w:p>
@@ -966,7 +966,7 @@
                 <w:rFonts w:ascii="맑은 고딕" w:hAnsi="맑은 고딕" w:eastAsia="맑은 고딕" w:cs="맑은 고딕"/>
                 <w:sz w:val="18"/>
               </w:rPr>
-              <w:t>설치 시 선택한 관리망만 허용</w:t>
+              <w:t>설치 시 선택·추가한 관리망만 허용</w:t>
             </w:r>
           </w:p>
         </w:tc>
@@ -1132,7 +1132,7 @@
           <w:color w:val="16324F"/>
           <w:sz w:val="21"/>
         </w:rPr>
-        <w:t>0.10.3-poc는 코드 서명되지 않은 시험판입니다. 압축을 풀기 전에 Agent와 Viewer ZIP의 SHA-256을 해당 GitHub Release 본문에 표시된 값과 비교하고 사내 보안 반입 절차를 완료하세요. SmartScreen 또는 EDR 경고를 우회하지 않습니다.</w:t>
+        <w:t>0.10.4-poc는 코드 서명되지 않은 시험판입니다. 압축을 풀기 전에 Agent와 Viewer ZIP의 SHA-256을 해당 GitHub Release 본문에 표시된 값과 비교하고 사내 보안 반입 절차를 완료하세요. SmartScreen 또는 EDR 경고를 우회하지 않습니다.</w:t>
       </w:r>
     </w:p>
     <w:p>
@@ -1174,7 +1174,21 @@
         <w:rPr>
           <w:rFonts w:ascii="맑은 고딕" w:hAnsi="맑은 고딕" w:eastAsia="맑은 고딕" w:cs="맑은 고딕"/>
         </w:rPr>
-        <w:t>고정 Viewer PC IPv4를 입력하고 자동 검색된 직접 연결 사설 관리망 1~2개를 선택합니다.</w:t>
+        <w:t>고정 Viewer PC IPv4를 입력하고 자동 검색된 관리망을 선택합니다. 목록에 없으면 승인된 RFC1918 관리망을 IPv4/prefix로 직접 추가합니다.</w:t>
+      </w:r>
+    </w:p>
+    <w:p>
+      <w:pPr>
+        <w:numPr>
+          <w:ilvl w:val="0"/>
+          <w:numId w:val="13"/>
+        </w:numPr>
+      </w:pPr>
+      <w:r>
+        <w:rPr>
+          <w:rFonts w:ascii="맑은 고딕" w:hAnsi="맑은 고딕" w:eastAsia="맑은 고딕" w:cs="맑은 고딕"/>
+        </w:rPr>
+        <w:t>직접 입력한 주소가 네트워크 주소로 정규화되었는지 확인하고, 자동 선택과 직접 추가를 합해 1~2개인지 확인합니다.</w:t>
       </w:r>
     </w:p>
     <w:p>
@@ -1201,7 +1215,7 @@
         <w:drawing>
           <wp:inline xmlns:a="http://schemas.openxmlformats.org/drawingml/2006/main" xmlns:pic="http://schemas.openxmlformats.org/drawingml/2006/picture">
             <wp:extent cx="4114800" cy="3789947"/>
-            <wp:docPr id="1" name="Picture 1" title="Agent Setup 화면" descr="고정 Viewer IPv4와 자동 검색된 직접 연결 관리망을 선택하는 Agent Setup 화면"/>
+            <wp:docPr id="1" name="Picture 1" title="Agent Setup 화면" descr="고정 Viewer IPv4, 자동 검색 관리망, 정규화된 직접 추가 관리망을 확인하는 Agent Setup 화면"/>
             <wp:cNvGraphicFramePr>
               <a:graphicFrameLocks noChangeAspect="1"/>
             </wp:cNvGraphicFramePr>
@@ -1237,7 +1251,7 @@
         <w:pStyle w:val="Caption"/>
       </w:pPr>
       <w:r>
-        <w:t>그림 1. Agent 서비스 설치와 네트워크 범위 선택</w:t>
+        <w:t>그림 1. Agent 서비스 설치와 자동·직접 추가 관리망 범위 확인</w:t>
       </w:r>
     </w:p>
     <w:p>
@@ -1294,7 +1308,29 @@
           <w:color w:val="243447"/>
           <w:sz w:val="17"/>
         </w:rPr>
-        <w:t>선택 관리망 예       : 10.50.0.0/24</w:t>
+        <w:t>자동 검색 관리망     : 10.50.0.0/24</w:t>
+      </w:r>
+      <w:r>
+        <w:br/>
+      </w:r>
+      <w:r>
+        <w:rPr>
+          <w:rFonts w:ascii="Consolas" w:hAnsi="Consolas" w:eastAsia="Consolas" w:cs="Consolas"/>
+          <w:color w:val="243447"/>
+          <w:sz w:val="17"/>
+        </w:rPr>
+        <w:t>직접 추가 입력       : 172.20.40.25/24</w:t>
+      </w:r>
+      <w:r>
+        <w:br/>
+      </w:r>
+      <w:r>
+        <w:rPr>
+          <w:rFonts w:ascii="Consolas" w:hAnsi="Consolas" w:eastAsia="Consolas" w:cs="Consolas"/>
+          <w:color w:val="243447"/>
+          <w:sz w:val="17"/>
+        </w:rPr>
+        <w:t>정규화 결과          : 172.20.40.0/24</w:t>
       </w:r>
       <w:r>
         <w:br/>
@@ -1422,7 +1458,7 @@
           <w:color w:val="16324F"/>
           <w:sz w:val="21"/>
         </w:rPr>
-        <w:t>Viewer PC 주소나 스위치 관리망이 바뀌면 같은 Release의 Agent Setup을 다시 열어 고정 Viewer IPv4와 자동 검색된 관리망을 검토합니다. 사용자가 CIDR을 계산하거나 사설망 전체를 직접 허용하지 않습니다. 검사에서 서비스, TCP/18443 listener, 방화벽, Agent 내부 Viewer 허용 주소, 활성 프로필과 live/ready를 확인합니다.</w:t>
+        <w:t>Viewer PC 주소나 스위치 관리망이 바뀌면 같은 Release의 Agent Setup을 다시 열어 고정 Viewer IPv4와 자동 검색 또는 직접 추가 관리망을 검토합니다. 직접 입력은 네트워크 주소로 자동 정규화되며 RFC1918 범위만 허용됩니다. 검사에서 서비스, TCP/18443 listener, 방화벽, Agent 내부 Viewer 허용 주소, 활성 프로필과 live/ready를 확인합니다.</w:t>
       </w:r>
     </w:p>
     <w:p>
@@ -1450,7 +1486,7 @@
           <w:color w:val="16324F"/>
           <w:sz w:val="21"/>
         </w:rPr>
-        <w:t>Agent Setup에 설치 실패가 표시되면 실패 단계와 Cause를 먼저 확인하세요. 설치 성공 뒤 AGENT_CONNECTION_REFUSED가 보이면 Viewer에 스위치 IP, Viewer PC 주소 또는 localhost가 아니라 Agent를 설치한 PC 주소를 입력했는지 먼저 확인하세요. 그 다음 Agent Setup의 검사에서 SamsungSwitchWatchAgent 서비스와 TCP/18443을 점검합니다. AGENT_CLIENT_NOT_ALLOWED이면 현재 Viewer PC의 고정 IPv4를 Agent Setup에 다시 입력하고 설치/업데이트합니다. 서비스를 수동 등록하지 말고 0.10.3-poc Agent Setup을 사용하세요.</w:t>
+        <w:t>Agent Setup에 설치 실패가 표시되면 실패 단계와 Cause를 먼저 확인하세요. 설치 성공 뒤 AGENT_CONNECTION_REFUSED가 보이면 Viewer에 스위치 IP, Viewer PC 주소 또는 localhost가 아니라 Agent를 설치한 PC 주소를 입력했는지 먼저 확인하세요. 그 다음 Agent Setup의 검사에서 SamsungSwitchWatchAgent 서비스와 TCP/18443을 점검합니다. AGENT_CLIENT_NOT_ALLOWED이면 현재 Viewer PC의 고정 IPv4를 Agent Setup에 다시 입력하고 설치/업데이트합니다. 서비스를 수동 등록하지 말고 0.10.4-poc Agent Setup을 사용하세요.</w:t>
       </w:r>
     </w:p>
     <w:p>
@@ -1497,7 +1533,7 @@
           <w:color w:val="16324F"/>
           <w:sz w:val="21"/>
         </w:rPr>
-        <w:t>이전 Viewer가 실행 중이면 새 Viewer는 같은 사용자 데이터를 동시에 쓰지 않도록 실행을 차단하고 전환 순서를 표시합니다. 기존 트레이 아이콘에서 '프로그램 종료'를 선택한 뒤 Win+R에서 shell:startup을 열어 'Samsung Switch Watch' 바로 가기를 삭제합니다. 이어 shell:programs에서도 같은 이름의 이전 시작 메뉴 바로 가기를 삭제하고 새 Viewer를 다시 실행하세요. 기존 Agent 연결과 장비 정보는 유지됩니다. 창이 바로 보이지 않으면 알림 영역에서 대시보드를 열고 실행 경로가 새 0.10.3-poc 폴더인지 확인하세요.</w:t>
+        <w:t>이전 Viewer가 실행 중이면 새 Viewer는 같은 사용자 데이터를 동시에 쓰지 않도록 실행을 차단하고 전환 순서를 표시합니다. 기존 트레이 아이콘에서 '프로그램 종료'를 선택한 뒤 Win+R에서 shell:startup을 열어 'Samsung Switch Watch' 바로 가기를 삭제합니다. 이어 shell:programs에서도 같은 이름의 이전 시작 메뉴 바로 가기를 삭제하고 새 Viewer를 다시 실행하세요. 기존 Agent 연결과 장비 정보는 유지됩니다. 창이 바로 보이지 않으면 알림 영역에서 대시보드를 열고 실행 경로가 새 0.10.4-poc 폴더인지 확인하세요.</w:t>
       </w:r>
     </w:p>
     <w:p>
@@ -1595,7 +1631,7 @@
           <w:color w:val="16324F"/>
           <w:sz w:val="21"/>
         </w:rPr>
-        <w:t>0.10.3-poc는 코드 서명되지 않아 SmartScreen이나 사내 EDR이 차단할 수 있습니다. ZIP을 완전히 압축 해제하고 Viewer EXE와 제공된 DLL이 같은 폴더에 있는지 확인하세요. EDR·AppLocker·WDAC가 차단하면 우회하지 말고 공식 ZIP의 버전·해시와 차단 기록을 보안 담당자에게 전달하세요.</w:t>
+        <w:t>0.10.4-poc는 코드 서명되지 않아 SmartScreen이나 사내 EDR이 차단할 수 있습니다. ZIP을 완전히 압축 해제하고 Viewer EXE와 제공된 DLL이 같은 폴더에 있는지 확인하세요. EDR·AppLocker·WDAC가 차단하면 우회하지 말고 공식 ZIP의 버전·해시와 차단 기록을 보안 담당자에게 전달하세요.</w:t>
       </w:r>
     </w:p>
     <w:p>
@@ -5089,7 +5125,7 @@
           <w:rFonts w:ascii="맑은 고딕" w:hAnsi="맑은 고딕" w:eastAsia="맑은 고딕" w:cs="맑은 고딕"/>
           <w:sz w:val="22"/>
         </w:rPr>
-        <w:t>제품 소유 방화벽 규칙과 Agent 원격 업무 API는 같은 고정 Viewer IPv4를 허용합니다. 외부 방화벽 규칙은 변경하지 않으며, Agent PC의 로컬 준비 상태 점검만 예외입니다. Agent는 Setup에서 선택한 직접 연결 관리망의 Telnet/23만 사용합니다.</w:t>
+        <w:t>제품 소유 방화벽 규칙과 Agent 원격 업무 API는 같은 고정 Viewer IPv4를 허용합니다. 외부 방화벽 규칙은 변경하지 않으며, Agent PC의 로컬 준비 상태 점검만 예외입니다. Agent는 Setup에서 선택하거나 직접 추가해 확정한 관리망의 Telnet/23만 사용합니다.</w:t>
       </w:r>
     </w:p>
     <w:p>
@@ -5983,7 +6019,7 @@
                 <w:rFonts w:ascii="맑은 고딕" w:hAnsi="맑은 고딕" w:eastAsia="맑은 고딕" w:cs="맑은 고딕"/>
                 <w:sz w:val="16"/>
               </w:rPr>
-              <w:t>TARGET_NOT_ALLOWED</w:t>
+              <w:t>SETUP_EXISTING_NETWORKS_NOT_LOADED</w:t>
             </w:r>
           </w:p>
         </w:tc>
@@ -6008,7 +6044,7 @@
                 <w:rFonts w:ascii="맑은 고딕" w:hAnsi="맑은 고딕" w:eastAsia="맑은 고딕" w:cs="맑은 고딕"/>
                 <w:sz w:val="16"/>
               </w:rPr>
-              <w:t>장비 IPv4가 Setup에서 선택한 관리망 내부인지 확인</w:t>
+              <w:t>기존 관리망을 자동 복원하지 못함. 승인된 관리망을 다시 선택하거나 IPv4/prefix로 직접 추가</w:t>
             </w:r>
           </w:p>
         </w:tc>
@@ -6036,6 +6072,59 @@
                 <w:rFonts w:ascii="맑은 고딕" w:hAnsi="맑은 고딕" w:eastAsia="맑은 고딕" w:cs="맑은 고딕"/>
                 <w:sz w:val="16"/>
               </w:rPr>
+              <w:t>TARGET_NOT_ALLOWED</w:t>
+            </w:r>
+          </w:p>
+        </w:tc>
+        <w:tc>
+          <w:tcPr>
+            <w:tcW w:type="dxa" w:w="5060"/>
+            <w:shd w:fill="FAFBFC"/>
+            <w:tcMar>
+              <w:top w:w="80" w:type="dxa"/>
+              <w:start w:w="120" w:type="dxa"/>
+              <w:bottom w:w="80" w:type="dxa"/>
+              <w:end w:w="120" w:type="dxa"/>
+            </w:tcMar>
+            <w:vAlign w:val="center"/>
+          </w:tcPr>
+          <w:p>
+            <w:pPr>
+              <w:spacing w:before="0" w:after="0" w:line="240" w:lineRule="auto"/>
+              <w:jc w:val="left"/>
+            </w:pPr>
+            <w:r>
+              <w:rPr>
+                <w:rFonts w:ascii="맑은 고딕" w:hAnsi="맑은 고딕" w:eastAsia="맑은 고딕" w:cs="맑은 고딕"/>
+                <w:sz w:val="16"/>
+              </w:rPr>
+              <w:t>장비 IPv4가 Setup에서 선택·추가한 관리망 내부인지 확인. 필요하면 승인된 사설 CIDR을 Setup에서 추가</w:t>
+            </w:r>
+          </w:p>
+        </w:tc>
+      </w:tr>
+      <w:tr>
+        <w:tc>
+          <w:tcPr>
+            <w:tcW w:type="dxa" w:w="4300"/>
+            <w:tcMar>
+              <w:top w:w="80" w:type="dxa"/>
+              <w:start w:w="120" w:type="dxa"/>
+              <w:bottom w:w="80" w:type="dxa"/>
+              <w:end w:w="120" w:type="dxa"/>
+            </w:tcMar>
+            <w:vAlign w:val="center"/>
+          </w:tcPr>
+          <w:p>
+            <w:pPr>
+              <w:spacing w:before="0" w:after="0" w:line="240" w:lineRule="auto"/>
+              <w:jc w:val="left"/>
+            </w:pPr>
+            <w:r>
+              <w:rPr>
+                <w:rFonts w:ascii="맑은 고딕" w:hAnsi="맑은 고딕" w:eastAsia="맑은 고딕" w:cs="맑은 고딕"/>
+                <w:sz w:val="16"/>
+              </w:rPr>
               <w:t>TCP_TIMEOUT</w:t>
             </w:r>
           </w:p>
@@ -6043,7 +6132,6 @@
         <w:tc>
           <w:tcPr>
             <w:tcW w:type="dxa" w:w="5060"/>
-            <w:shd w:fill="FAFBFC"/>
             <w:tcMar>
               <w:top w:w="80" w:type="dxa"/>
               <w:start w:w="120" w:type="dxa"/>
@@ -6071,6 +6159,7 @@
         <w:tc>
           <w:tcPr>
             <w:tcW w:type="dxa" w:w="4300"/>
+            <w:shd w:fill="FAFBFC"/>
             <w:tcMar>
               <w:top w:w="80" w:type="dxa"/>
               <w:start w:w="120" w:type="dxa"/>
@@ -6096,6 +6185,7 @@
         <w:tc>
           <w:tcPr>
             <w:tcW w:type="dxa" w:w="5060"/>
+            <w:shd w:fill="FAFBFC"/>
             <w:tcMar>
               <w:top w:w="80" w:type="dxa"/>
               <w:start w:w="120" w:type="dxa"/>
@@ -6123,7 +6213,6 @@
         <w:tc>
           <w:tcPr>
             <w:tcW w:type="dxa" w:w="4300"/>
-            <w:shd w:fill="FAFBFC"/>
             <w:tcMar>
               <w:top w:w="80" w:type="dxa"/>
               <w:start w:w="120" w:type="dxa"/>
@@ -6149,7 +6238,6 @@
         <w:tc>
           <w:tcPr>
             <w:tcW w:type="dxa" w:w="5060"/>
-            <w:shd w:fill="FAFBFC"/>
             <w:tcMar>
               <w:top w:w="80" w:type="dxa"/>
               <w:start w:w="120" w:type="dxa"/>
@@ -6177,6 +6265,7 @@
         <w:tc>
           <w:tcPr>
             <w:tcW w:type="dxa" w:w="4300"/>
+            <w:shd w:fill="FAFBFC"/>
             <w:tcMar>
               <w:top w:w="80" w:type="dxa"/>
               <w:start w:w="120" w:type="dxa"/>
@@ -6202,6 +6291,7 @@
         <w:tc>
           <w:tcPr>
             <w:tcW w:type="dxa" w:w="5060"/>
+            <w:shd w:fill="FAFBFC"/>
             <w:tcMar>
               <w:top w:w="80" w:type="dxa"/>
               <w:start w:w="120" w:type="dxa"/>
@@ -6229,7 +6319,6 @@
         <w:tc>
           <w:tcPr>
             <w:tcW w:type="dxa" w:w="4300"/>
-            <w:shd w:fill="FAFBFC"/>
             <w:tcMar>
               <w:top w:w="80" w:type="dxa"/>
               <w:start w:w="120" w:type="dxa"/>
@@ -6255,7 +6344,6 @@
         <w:tc>
           <w:tcPr>
             <w:tcW w:type="dxa" w:w="5060"/>
-            <w:shd w:fill="FAFBFC"/>
             <w:tcMar>
               <w:top w:w="80" w:type="dxa"/>
               <w:start w:w="120" w:type="dxa"/>
@@ -6283,6 +6371,7 @@
         <w:tc>
           <w:tcPr>
             <w:tcW w:type="dxa" w:w="4300"/>
+            <w:shd w:fill="FAFBFC"/>
             <w:tcMar>
               <w:top w:w="80" w:type="dxa"/>
               <w:start w:w="120" w:type="dxa"/>
@@ -6308,6 +6397,7 @@
         <w:tc>
           <w:tcPr>
             <w:tcW w:type="dxa" w:w="5060"/>
+            <w:shd w:fill="FAFBFC"/>
             <w:tcMar>
               <w:top w:w="80" w:type="dxa"/>
               <w:start w:w="120" w:type="dxa"/>
@@ -6335,7 +6425,6 @@
         <w:tc>
           <w:tcPr>
             <w:tcW w:type="dxa" w:w="4300"/>
-            <w:shd w:fill="FAFBFC"/>
             <w:tcMar>
               <w:top w:w="80" w:type="dxa"/>
               <w:start w:w="120" w:type="dxa"/>
@@ -6361,7 +6450,6 @@
         <w:tc>
           <w:tcPr>
             <w:tcW w:type="dxa" w:w="5060"/>
-            <w:shd w:fill="FAFBFC"/>
             <w:tcMar>
               <w:top w:w="80" w:type="dxa"/>
               <w:start w:w="120" w:type="dxa"/>
@@ -6389,6 +6477,7 @@
         <w:tc>
           <w:tcPr>
             <w:tcW w:type="dxa" w:w="4300"/>
+            <w:shd w:fill="FAFBFC"/>
             <w:tcMar>
               <w:top w:w="80" w:type="dxa"/>
               <w:start w:w="120" w:type="dxa"/>
@@ -6414,6 +6503,7 @@
         <w:tc>
           <w:tcPr>
             <w:tcW w:type="dxa" w:w="5060"/>
+            <w:shd w:fill="FAFBFC"/>
             <w:tcMar>
               <w:top w:w="80" w:type="dxa"/>
               <w:start w:w="120" w:type="dxa"/>
@@ -6441,7 +6531,6 @@
         <w:tc>
           <w:tcPr>
             <w:tcW w:type="dxa" w:w="4300"/>
-            <w:shd w:fill="FAFBFC"/>
             <w:tcMar>
               <w:top w:w="80" w:type="dxa"/>
               <w:start w:w="120" w:type="dxa"/>
@@ -6467,7 +6556,6 @@
         <w:tc>
           <w:tcPr>
             <w:tcW w:type="dxa" w:w="5060"/>
-            <w:shd w:fill="FAFBFC"/>
             <w:tcMar>
               <w:top w:w="80" w:type="dxa"/>
               <w:start w:w="120" w:type="dxa"/>
@@ -6495,6 +6583,7 @@
         <w:tc>
           <w:tcPr>
             <w:tcW w:type="dxa" w:w="4300"/>
+            <w:shd w:fill="FAFBFC"/>
             <w:tcMar>
               <w:top w:w="80" w:type="dxa"/>
               <w:start w:w="120" w:type="dxa"/>
@@ -6520,6 +6609,7 @@
         <w:tc>
           <w:tcPr>
             <w:tcW w:type="dxa" w:w="5060"/>
+            <w:shd w:fill="FAFBFC"/>
             <w:tcMar>
               <w:top w:w="80" w:type="dxa"/>
               <w:start w:w="120" w:type="dxa"/>
@@ -6547,7 +6637,6 @@
         <w:tc>
           <w:tcPr>
             <w:tcW w:type="dxa" w:w="4300"/>
-            <w:shd w:fill="FAFBFC"/>
             <w:tcMar>
               <w:top w:w="80" w:type="dxa"/>
               <w:start w:w="120" w:type="dxa"/>
@@ -6573,7 +6662,6 @@
         <w:tc>
           <w:tcPr>
             <w:tcW w:type="dxa" w:w="5060"/>
-            <w:shd w:fill="FAFBFC"/>
             <w:tcMar>
               <w:top w:w="80" w:type="dxa"/>
               <w:start w:w="120" w:type="dxa"/>
@@ -6601,6 +6689,7 @@
         <w:tc>
           <w:tcPr>
             <w:tcW w:type="dxa" w:w="4300"/>
+            <w:shd w:fill="FAFBFC"/>
             <w:tcMar>
               <w:top w:w="80" w:type="dxa"/>
               <w:start w:w="120" w:type="dxa"/>
@@ -6626,6 +6715,7 @@
         <w:tc>
           <w:tcPr>
             <w:tcW w:type="dxa" w:w="5060"/>
+            <w:shd w:fill="FAFBFC"/>
             <w:tcMar>
               <w:top w:w="80" w:type="dxa"/>
               <w:start w:w="120" w:type="dxa"/>
@@ -6653,7 +6743,6 @@
         <w:tc>
           <w:tcPr>
             <w:tcW w:type="dxa" w:w="4300"/>
-            <w:shd w:fill="FAFBFC"/>
             <w:tcMar>
               <w:top w:w="80" w:type="dxa"/>
               <w:start w:w="120" w:type="dxa"/>
@@ -6679,7 +6768,6 @@
         <w:tc>
           <w:tcPr>
             <w:tcW w:type="dxa" w:w="5060"/>
-            <w:shd w:fill="FAFBFC"/>
             <w:tcMar>
               <w:top w:w="80" w:type="dxa"/>
               <w:start w:w="120" w:type="dxa"/>
@@ -6707,6 +6795,7 @@
         <w:tc>
           <w:tcPr>
             <w:tcW w:type="dxa" w:w="4300"/>
+            <w:shd w:fill="FAFBFC"/>
             <w:tcMar>
               <w:top w:w="80" w:type="dxa"/>
               <w:start w:w="120" w:type="dxa"/>
@@ -6732,6 +6821,7 @@
         <w:tc>
           <w:tcPr>
             <w:tcW w:type="dxa" w:w="5060"/>
+            <w:shd w:fill="FAFBFC"/>
             <w:tcMar>
               <w:top w:w="80" w:type="dxa"/>
               <w:start w:w="120" w:type="dxa"/>
@@ -6759,7 +6849,6 @@
         <w:tc>
           <w:tcPr>
             <w:tcW w:type="dxa" w:w="4300"/>
-            <w:shd w:fill="FAFBFC"/>
             <w:tcMar>
               <w:top w:w="80" w:type="dxa"/>
               <w:start w:w="120" w:type="dxa"/>
@@ -6785,7 +6874,6 @@
         <w:tc>
           <w:tcPr>
             <w:tcW w:type="dxa" w:w="5060"/>
-            <w:shd w:fill="FAFBFC"/>
             <w:tcMar>
               <w:top w:w="80" w:type="dxa"/>
               <w:start w:w="120" w:type="dxa"/>
@@ -6813,6 +6901,7 @@
         <w:tc>
           <w:tcPr>
             <w:tcW w:type="dxa" w:w="4300"/>
+            <w:shd w:fill="FAFBFC"/>
             <w:tcMar>
               <w:top w:w="80" w:type="dxa"/>
               <w:start w:w="120" w:type="dxa"/>
@@ -6838,6 +6927,7 @@
         <w:tc>
           <w:tcPr>
             <w:tcW w:type="dxa" w:w="5060"/>
+            <w:shd w:fill="FAFBFC"/>
             <w:tcMar>
               <w:top w:w="80" w:type="dxa"/>
               <w:start w:w="120" w:type="dxa"/>
@@ -6865,7 +6955,6 @@
         <w:tc>
           <w:tcPr>
             <w:tcW w:type="dxa" w:w="4300"/>
-            <w:shd w:fill="FAFBFC"/>
             <w:tcMar>
               <w:top w:w="80" w:type="dxa"/>
               <w:start w:w="120" w:type="dxa"/>
@@ -6891,7 +6980,6 @@
         <w:tc>
           <w:tcPr>
             <w:tcW w:type="dxa" w:w="5060"/>
-            <w:shd w:fill="FAFBFC"/>
             <w:tcMar>
               <w:top w:w="80" w:type="dxa"/>
               <w:start w:w="120" w:type="dxa"/>
@@ -6919,6 +7007,7 @@
         <w:tc>
           <w:tcPr>
             <w:tcW w:type="dxa" w:w="4300"/>
+            <w:shd w:fill="FAFBFC"/>
             <w:tcMar>
               <w:top w:w="80" w:type="dxa"/>
               <w:start w:w="120" w:type="dxa"/>
@@ -6944,6 +7033,7 @@
         <w:tc>
           <w:tcPr>
             <w:tcW w:type="dxa" w:w="5060"/>
+            <w:shd w:fill="FAFBFC"/>
             <w:tcMar>
               <w:top w:w="80" w:type="dxa"/>
               <w:start w:w="120" w:type="dxa"/>
@@ -7601,7 +7691,7 @@
         <w:color w:val="64748B"/>
         <w:sz w:val="17"/>
       </w:rPr>
-      <w:t xml:space="preserve">v0.10.3-poc  |  </w:t>
+      <w:t xml:space="preserve">v0.10.4-poc  |  </w:t>
     </w:r>
     <w:r>
       <w:rPr>
@@ -7632,7 +7722,7 @@
         <w:color w:val="64748B"/>
         <w:sz w:val="17"/>
       </w:rPr>
-      <w:t>v0.10.3-poc  |  2026-07-29</w:t>
+      <w:t>v0.10.4-poc  |  2026-07-29</w:t>
     </w:r>
   </w:p>
 </w:ftr>

</xml_diff>

<commit_message>
Fix Agent firewall readback verification
</commit_message>
<xml_diff>
--- a/docs/SamsungSwitchWatch_User_Manual_KO.docx
+++ b/docs/SamsungSwitchWatch_User_Manual_KO.docx
@@ -1132,7 +1132,7 @@
           <w:color w:val="16324F"/>
           <w:sz w:val="21"/>
         </w:rPr>
-        <w:t>0.10.4-poc는 코드 서명되지 않은 시험판입니다. 압축을 풀기 전에 Agent와 Viewer ZIP의 SHA-256을 해당 GitHub Release 본문에 표시된 값과 비교하고 사내 보안 반입 절차를 완료하세요. SmartScreen 또는 EDR 경고를 우회하지 않습니다.</w:t>
+        <w:t>0.10.5-poc는 코드 서명되지 않은 시험판입니다. 압축을 풀기 전에 Agent와 Viewer ZIP의 SHA-256을 해당 GitHub Release 본문에 표시된 값과 비교하고 사내 보안 반입 절차를 완료하세요. SmartScreen 또는 EDR 경고를 우회하지 않습니다.</w:t>
       </w:r>
     </w:p>
     <w:p>
@@ -1280,6 +1280,34 @@
           <w:sz w:val="21"/>
         </w:rPr>
         <w:t>다른 프로그램이 만든 인바운드 허용 규칙이 있으면 FIREWALL_OVERLAP_PROTECTED 경고를 표시하지만 해당 규칙은 변경하지 않고 설치를 계속합니다. 설치 후 제품 소유 Viewer /32 규칙과 Agent 내부 Viewer IPv4 검증을 함께 적용합니다.</w:t>
+      </w:r>
+    </w:p>
+    <w:p>
+      <w:pPr>
+        <w:keepLines/>
+        <w:spacing w:before="80" w:after="160" w:line="283" w:lineRule="auto"/>
+        <w:ind w:left="115" w:right="58"/>
+        <w:shd w:fill="E8EEF5"/>
+        <w:pBdr>
+          <w:left w:val="single" w:sz="16" w:space="8" w:color="2E74B5"/>
+        </w:pBdr>
+      </w:pPr>
+      <w:r>
+        <w:rPr>
+          <w:rFonts w:ascii="맑은 고딕" w:hAnsi="맑은 고딕" w:eastAsia="맑은 고딕" w:cs="맑은 고딕"/>
+          <w:b/>
+          <w:color w:val="2E74B5"/>
+          <w:sz w:val="21"/>
+        </w:rPr>
+        <w:t xml:space="preserve">Windows의 /32 표시 차이는 자동 처리  </w:t>
+      </w:r>
+      <w:r>
+        <w:rPr>
+          <w:rFonts w:ascii="맑은 고딕" w:hAnsi="맑은 고딕" w:eastAsia="맑은 고딕" w:cs="맑은 고딕"/>
+          <w:color w:val="16324F"/>
+          <w:sz w:val="21"/>
+        </w:rPr>
+        <w:t>Windows가 같은 Viewer 단일 호스트를 IP, IP/32 또는 IP/255.255.255.255로 반환해도 Setup은 같은 주소인지 의미 기준으로 확인합니다. 다른 prefix, 주소 목록·범위, Any, LocalSubnet과 IPv6는 허용하지 않습니다. Enabled·Inbound·Allow·TCP·18443·Domain/Private·Edge Traversal 비활성 조건도 모두 그대로 확인합니다.</w:t>
       </w:r>
     </w:p>
     <w:p>
@@ -1486,7 +1514,7 @@
           <w:color w:val="16324F"/>
           <w:sz w:val="21"/>
         </w:rPr>
-        <w:t>Agent Setup에 설치 실패가 표시되면 실패 단계와 Cause를 먼저 확인하세요. 설치 성공 뒤 AGENT_CONNECTION_REFUSED가 보이면 Viewer에 스위치 IP, Viewer PC 주소 또는 localhost가 아니라 Agent를 설치한 PC 주소를 입력했는지 먼저 확인하세요. 그 다음 Agent Setup의 검사에서 SamsungSwitchWatchAgent 서비스와 TCP/18443을 점검합니다. AGENT_CLIENT_NOT_ALLOWED이면 현재 Viewer PC의 고정 IPv4를 Agent Setup에 다시 입력하고 설치/업데이트합니다. 서비스를 수동 등록하지 말고 0.10.4-poc Agent Setup을 사용하세요.</w:t>
+        <w:t>Agent Setup에 설치 실패가 표시되면 실패 단계와 Cause를 먼저 확인하세요. SETUP_FIREWALL_FAILED는 적용 직후 최대 2초 동안 재확인해도 제품 방화벽 규칙이 정확하지 않다는 뜻입니다. Setup은 실제 주소 대신 안전한 불일치 코드를 표시하고 설치 전 상태로 복구합니다. 규칙을 Any, LocalSubnet 또는 넓은 대역으로 수동 확대하지 마세요. 설치 성공 뒤 AGENT_CONNECTION_REFUSED가 보이면 Viewer에 스위치 IP, Viewer PC 주소 또는 localhost가 아니라 Agent를 설치한 PC 주소를 입력했는지 먼저 확인하세요. 그 다음 Agent Setup의 검사에서 SamsungSwitchWatchAgent 서비스와 TCP/18443을 점검합니다. AGENT_CLIENT_NOT_ALLOWED이면 현재 Viewer PC의 고정 IPv4를 Agent Setup에 다시 입력하고 설치/업데이트합니다. 서비스를 수동 등록하지 말고 0.10.5-poc Agent Setup을 사용하세요.</w:t>
       </w:r>
     </w:p>
     <w:p>
@@ -1533,7 +1561,7 @@
           <w:color w:val="16324F"/>
           <w:sz w:val="21"/>
         </w:rPr>
-        <w:t>이전 Viewer가 실행 중이면 새 Viewer는 같은 사용자 데이터를 동시에 쓰지 않도록 실행을 차단하고 전환 순서를 표시합니다. 기존 트레이 아이콘에서 '프로그램 종료'를 선택한 뒤 Win+R에서 shell:startup을 열어 'Samsung Switch Watch' 바로 가기를 삭제합니다. 이어 shell:programs에서도 같은 이름의 이전 시작 메뉴 바로 가기를 삭제하고 새 Viewer를 다시 실행하세요. 기존 Agent 연결과 장비 정보는 유지됩니다. 창이 바로 보이지 않으면 알림 영역에서 대시보드를 열고 실행 경로가 새 0.10.4-poc 폴더인지 확인하세요.</w:t>
+        <w:t>이전 Viewer가 실행 중이면 새 Viewer는 같은 사용자 데이터를 동시에 쓰지 않도록 실행을 차단하고 전환 순서를 표시합니다. 기존 트레이 아이콘에서 '프로그램 종료'를 선택한 뒤 Win+R에서 shell:startup을 열어 'Samsung Switch Watch' 바로 가기를 삭제합니다. 이어 shell:programs에서도 같은 이름의 이전 시작 메뉴 바로 가기를 삭제하고 새 Viewer를 다시 실행하세요. 기존 Agent 연결과 장비 정보는 유지됩니다. 창이 바로 보이지 않으면 알림 영역에서 대시보드를 열고 실행 경로가 새 0.10.5-poc 폴더인지 확인하세요.</w:t>
       </w:r>
     </w:p>
     <w:p>
@@ -1631,7 +1659,7 @@
           <w:color w:val="16324F"/>
           <w:sz w:val="21"/>
         </w:rPr>
-        <w:t>0.10.4-poc는 코드 서명되지 않아 SmartScreen이나 사내 EDR이 차단할 수 있습니다. ZIP을 완전히 압축 해제하고 Viewer EXE와 제공된 DLL이 같은 폴더에 있는지 확인하세요. EDR·AppLocker·WDAC가 차단하면 우회하지 말고 공식 ZIP의 버전·해시와 차단 기록을 보안 담당자에게 전달하세요.</w:t>
+        <w:t>0.10.5-poc는 코드 서명되지 않아 SmartScreen이나 사내 EDR이 차단할 수 있습니다. ZIP을 완전히 압축 해제하고 Viewer EXE와 제공된 DLL이 같은 폴더에 있는지 확인하세요. EDR·AppLocker·WDAC가 차단하면 우회하지 말고 공식 ZIP의 버전·해시와 차단 기록을 보안 담당자에게 전달하세요.</w:t>
       </w:r>
     </w:p>
     <w:p>
@@ -5886,7 +5914,7 @@
                 <w:rFonts w:ascii="맑은 고딕" w:hAnsi="맑은 고딕" w:eastAsia="맑은 고딕" w:cs="맑은 고딕"/>
                 <w:sz w:val="16"/>
               </w:rPr>
-              <w:t>Windows 방화벽 서비스 → 제품 규칙 이름 충돌 → 기본 인바운드·그룹 정책</w:t>
+              <w:t>안전한 불일치 코드 기록 → rollback 완료 확인 → 방화벽 서비스·Domain/Private·그룹 정책</w:t>
             </w:r>
           </w:p>
         </w:tc>
@@ -7126,6 +7154,34 @@
     </w:p>
     <w:p>
       <w:pPr>
+        <w:keepLines/>
+        <w:spacing w:before="80" w:after="160" w:line="283" w:lineRule="auto"/>
+        <w:ind w:left="115" w:right="58"/>
+        <w:shd w:fill="FFF8E8"/>
+        <w:pBdr>
+          <w:left w:val="single" w:sz="16" w:space="8" w:color="8A5A00"/>
+        </w:pBdr>
+      </w:pPr>
+      <w:r>
+        <w:rPr>
+          <w:rFonts w:ascii="맑은 고딕" w:hAnsi="맑은 고딕" w:eastAsia="맑은 고딕" w:cs="맑은 고딕"/>
+          <w:b/>
+          <w:color w:val="8A5A00"/>
+          <w:sz w:val="21"/>
+        </w:rPr>
+        <w:t xml:space="preserve">방화벽 검증 실패 시  </w:t>
+      </w:r>
+      <w:r>
+        <w:rPr>
+          <w:rFonts w:ascii="맑은 고딕" w:hAnsi="맑은 고딕" w:eastAsia="맑은 고딕" w:cs="맑은 고딕"/>
+          <w:color w:val="16324F"/>
+          <w:sz w:val="21"/>
+        </w:rPr>
+        <w:t>FIREWALL_REMOTE_ADDRESS_MISMATCH 같은 코드는 어떤 필드가 안전 기준과 달랐는지만 알려 주며 실제 Viewer 주소나 규칙 원문은 포함하지 않습니다. Windows의 정상적인 IP/32와 IP/255.255.255.255 표기 차이는 자동 처리됩니다. Setup이 rollback을 완료한 뒤 같은 Release ZIP으로 검사를 다시 실행하고, 계속 실패하면 코드만 Windows 관리자에게 전달하세요. 규칙을 직접 넓혀 우회하지 마세요.</w:t>
+      </w:r>
+    </w:p>
+    <w:p>
+      <w:pPr>
         <w:pStyle w:val="Heading2"/>
         <w:pageBreakBefore w:val="0"/>
         <w:numPr>
@@ -7691,7 +7747,7 @@
         <w:color w:val="64748B"/>
         <w:sz w:val="17"/>
       </w:rPr>
-      <w:t xml:space="preserve">v0.10.4-poc  |  </w:t>
+      <w:t xml:space="preserve">v0.10.5-poc  |  </w:t>
     </w:r>
     <w:r>
       <w:rPr>
@@ -7722,7 +7778,7 @@
         <w:color w:val="64748B"/>
         <w:sz w:val="17"/>
       </w:rPr>
-      <w:t>v0.10.4-poc  |  2026-07-29</w:t>
+      <w:t>v0.10.5-poc  |  2026-07-29</w:t>
     </w:r>
   </w:p>
 </w:ftr>

</xml_diff>

<commit_message>
Fix Agent firewall readback verification (#40)
Accept Windows dotted-mask firewall readback for an exact Viewer host, retain strict rule checks, retry bounded readback, and update tests, documentation, Figma references, and v0.10.5-poc packaging metadata.
</commit_message>
<xml_diff>
--- a/docs/SamsungSwitchWatch_User_Manual_KO.docx
+++ b/docs/SamsungSwitchWatch_User_Manual_KO.docx
@@ -1132,7 +1132,7 @@
           <w:color w:val="16324F"/>
           <w:sz w:val="21"/>
         </w:rPr>
-        <w:t>0.10.4-poc는 코드 서명되지 않은 시험판입니다. 압축을 풀기 전에 Agent와 Viewer ZIP의 SHA-256을 해당 GitHub Release 본문에 표시된 값과 비교하고 사내 보안 반입 절차를 완료하세요. SmartScreen 또는 EDR 경고를 우회하지 않습니다.</w:t>
+        <w:t>0.10.5-poc는 코드 서명되지 않은 시험판입니다. 압축을 풀기 전에 Agent와 Viewer ZIP의 SHA-256을 해당 GitHub Release 본문에 표시된 값과 비교하고 사내 보안 반입 절차를 완료하세요. SmartScreen 또는 EDR 경고를 우회하지 않습니다.</w:t>
       </w:r>
     </w:p>
     <w:p>
@@ -1280,6 +1280,34 @@
           <w:sz w:val="21"/>
         </w:rPr>
         <w:t>다른 프로그램이 만든 인바운드 허용 규칙이 있으면 FIREWALL_OVERLAP_PROTECTED 경고를 표시하지만 해당 규칙은 변경하지 않고 설치를 계속합니다. 설치 후 제품 소유 Viewer /32 규칙과 Agent 내부 Viewer IPv4 검증을 함께 적용합니다.</w:t>
+      </w:r>
+    </w:p>
+    <w:p>
+      <w:pPr>
+        <w:keepLines/>
+        <w:spacing w:before="80" w:after="160" w:line="283" w:lineRule="auto"/>
+        <w:ind w:left="115" w:right="58"/>
+        <w:shd w:fill="E8EEF5"/>
+        <w:pBdr>
+          <w:left w:val="single" w:sz="16" w:space="8" w:color="2E74B5"/>
+        </w:pBdr>
+      </w:pPr>
+      <w:r>
+        <w:rPr>
+          <w:rFonts w:ascii="맑은 고딕" w:hAnsi="맑은 고딕" w:eastAsia="맑은 고딕" w:cs="맑은 고딕"/>
+          <w:b/>
+          <w:color w:val="2E74B5"/>
+          <w:sz w:val="21"/>
+        </w:rPr>
+        <w:t xml:space="preserve">Windows의 /32 표시 차이는 자동 처리  </w:t>
+      </w:r>
+      <w:r>
+        <w:rPr>
+          <w:rFonts w:ascii="맑은 고딕" w:hAnsi="맑은 고딕" w:eastAsia="맑은 고딕" w:cs="맑은 고딕"/>
+          <w:color w:val="16324F"/>
+          <w:sz w:val="21"/>
+        </w:rPr>
+        <w:t>Windows가 같은 Viewer 단일 호스트를 IP, IP/32 또는 IP/255.255.255.255로 반환해도 Setup은 같은 주소인지 의미 기준으로 확인합니다. 다른 prefix, 주소 목록·범위, Any, LocalSubnet과 IPv6는 허용하지 않습니다. Enabled·Inbound·Allow·TCP·18443·Domain/Private·Edge Traversal 비활성 조건도 모두 그대로 확인합니다.</w:t>
       </w:r>
     </w:p>
     <w:p>
@@ -1486,7 +1514,7 @@
           <w:color w:val="16324F"/>
           <w:sz w:val="21"/>
         </w:rPr>
-        <w:t>Agent Setup에 설치 실패가 표시되면 실패 단계와 Cause를 먼저 확인하세요. 설치 성공 뒤 AGENT_CONNECTION_REFUSED가 보이면 Viewer에 스위치 IP, Viewer PC 주소 또는 localhost가 아니라 Agent를 설치한 PC 주소를 입력했는지 먼저 확인하세요. 그 다음 Agent Setup의 검사에서 SamsungSwitchWatchAgent 서비스와 TCP/18443을 점검합니다. AGENT_CLIENT_NOT_ALLOWED이면 현재 Viewer PC의 고정 IPv4를 Agent Setup에 다시 입력하고 설치/업데이트합니다. 서비스를 수동 등록하지 말고 0.10.4-poc Agent Setup을 사용하세요.</w:t>
+        <w:t>Agent Setup에 설치 실패가 표시되면 실패 단계와 Cause를 먼저 확인하세요. SETUP_FIREWALL_FAILED는 적용 직후 최대 2초 동안 재확인해도 제품 방화벽 규칙이 정확하지 않다는 뜻입니다. Setup은 실제 주소 대신 안전한 불일치 코드를 표시하고 설치 전 상태로 복구합니다. 규칙을 Any, LocalSubnet 또는 넓은 대역으로 수동 확대하지 마세요. 설치 성공 뒤 AGENT_CONNECTION_REFUSED가 보이면 Viewer에 스위치 IP, Viewer PC 주소 또는 localhost가 아니라 Agent를 설치한 PC 주소를 입력했는지 먼저 확인하세요. 그 다음 Agent Setup의 검사에서 SamsungSwitchWatchAgent 서비스와 TCP/18443을 점검합니다. AGENT_CLIENT_NOT_ALLOWED이면 현재 Viewer PC의 고정 IPv4를 Agent Setup에 다시 입력하고 설치/업데이트합니다. 서비스를 수동 등록하지 말고 0.10.5-poc Agent Setup을 사용하세요.</w:t>
       </w:r>
     </w:p>
     <w:p>
@@ -1533,7 +1561,7 @@
           <w:color w:val="16324F"/>
           <w:sz w:val="21"/>
         </w:rPr>
-        <w:t>이전 Viewer가 실행 중이면 새 Viewer는 같은 사용자 데이터를 동시에 쓰지 않도록 실행을 차단하고 전환 순서를 표시합니다. 기존 트레이 아이콘에서 '프로그램 종료'를 선택한 뒤 Win+R에서 shell:startup을 열어 'Samsung Switch Watch' 바로 가기를 삭제합니다. 이어 shell:programs에서도 같은 이름의 이전 시작 메뉴 바로 가기를 삭제하고 새 Viewer를 다시 실행하세요. 기존 Agent 연결과 장비 정보는 유지됩니다. 창이 바로 보이지 않으면 알림 영역에서 대시보드를 열고 실행 경로가 새 0.10.4-poc 폴더인지 확인하세요.</w:t>
+        <w:t>이전 Viewer가 실행 중이면 새 Viewer는 같은 사용자 데이터를 동시에 쓰지 않도록 실행을 차단하고 전환 순서를 표시합니다. 기존 트레이 아이콘에서 '프로그램 종료'를 선택한 뒤 Win+R에서 shell:startup을 열어 'Samsung Switch Watch' 바로 가기를 삭제합니다. 이어 shell:programs에서도 같은 이름의 이전 시작 메뉴 바로 가기를 삭제하고 새 Viewer를 다시 실행하세요. 기존 Agent 연결과 장비 정보는 유지됩니다. 창이 바로 보이지 않으면 알림 영역에서 대시보드를 열고 실행 경로가 새 0.10.5-poc 폴더인지 확인하세요.</w:t>
       </w:r>
     </w:p>
     <w:p>
@@ -1631,7 +1659,7 @@
           <w:color w:val="16324F"/>
           <w:sz w:val="21"/>
         </w:rPr>
-        <w:t>0.10.4-poc는 코드 서명되지 않아 SmartScreen이나 사내 EDR이 차단할 수 있습니다. ZIP을 완전히 압축 해제하고 Viewer EXE와 제공된 DLL이 같은 폴더에 있는지 확인하세요. EDR·AppLocker·WDAC가 차단하면 우회하지 말고 공식 ZIP의 버전·해시와 차단 기록을 보안 담당자에게 전달하세요.</w:t>
+        <w:t>0.10.5-poc는 코드 서명되지 않아 SmartScreen이나 사내 EDR이 차단할 수 있습니다. ZIP을 완전히 압축 해제하고 Viewer EXE와 제공된 DLL이 같은 폴더에 있는지 확인하세요. EDR·AppLocker·WDAC가 차단하면 우회하지 말고 공식 ZIP의 버전·해시와 차단 기록을 보안 담당자에게 전달하세요.</w:t>
       </w:r>
     </w:p>
     <w:p>
@@ -5886,7 +5914,7 @@
                 <w:rFonts w:ascii="맑은 고딕" w:hAnsi="맑은 고딕" w:eastAsia="맑은 고딕" w:cs="맑은 고딕"/>
                 <w:sz w:val="16"/>
               </w:rPr>
-              <w:t>Windows 방화벽 서비스 → 제품 규칙 이름 충돌 → 기본 인바운드·그룹 정책</w:t>
+              <w:t>안전한 불일치 코드 기록 → rollback 완료 확인 → 방화벽 서비스·Domain/Private·그룹 정책</w:t>
             </w:r>
           </w:p>
         </w:tc>
@@ -7126,6 +7154,34 @@
     </w:p>
     <w:p>
       <w:pPr>
+        <w:keepLines/>
+        <w:spacing w:before="80" w:after="160" w:line="283" w:lineRule="auto"/>
+        <w:ind w:left="115" w:right="58"/>
+        <w:shd w:fill="FFF8E8"/>
+        <w:pBdr>
+          <w:left w:val="single" w:sz="16" w:space="8" w:color="8A5A00"/>
+        </w:pBdr>
+      </w:pPr>
+      <w:r>
+        <w:rPr>
+          <w:rFonts w:ascii="맑은 고딕" w:hAnsi="맑은 고딕" w:eastAsia="맑은 고딕" w:cs="맑은 고딕"/>
+          <w:b/>
+          <w:color w:val="8A5A00"/>
+          <w:sz w:val="21"/>
+        </w:rPr>
+        <w:t xml:space="preserve">방화벽 검증 실패 시  </w:t>
+      </w:r>
+      <w:r>
+        <w:rPr>
+          <w:rFonts w:ascii="맑은 고딕" w:hAnsi="맑은 고딕" w:eastAsia="맑은 고딕" w:cs="맑은 고딕"/>
+          <w:color w:val="16324F"/>
+          <w:sz w:val="21"/>
+        </w:rPr>
+        <w:t>FIREWALL_REMOTE_ADDRESS_MISMATCH 같은 코드는 어떤 필드가 안전 기준과 달랐는지만 알려 주며 실제 Viewer 주소나 규칙 원문은 포함하지 않습니다. Windows의 정상적인 IP/32와 IP/255.255.255.255 표기 차이는 자동 처리됩니다. Setup이 rollback을 완료한 뒤 같은 Release ZIP으로 검사를 다시 실행하고, 계속 실패하면 코드만 Windows 관리자에게 전달하세요. 규칙을 직접 넓혀 우회하지 마세요.</w:t>
+      </w:r>
+    </w:p>
+    <w:p>
+      <w:pPr>
         <w:pStyle w:val="Heading2"/>
         <w:pageBreakBefore w:val="0"/>
         <w:numPr>
@@ -7691,7 +7747,7 @@
         <w:color w:val="64748B"/>
         <w:sz w:val="17"/>
       </w:rPr>
-      <w:t xml:space="preserve">v0.10.4-poc  |  </w:t>
+      <w:t xml:space="preserve">v0.10.5-poc  |  </w:t>
     </w:r>
     <w:r>
       <w:rPr>
@@ -7722,7 +7778,7 @@
         <w:color w:val="64748B"/>
         <w:sz w:val="17"/>
       </w:rPr>
-      <w:t>v0.10.4-poc  |  2026-07-29</w:t>
+      <w:t>v0.10.5-poc  |  2026-07-29</w:t>
     </w:r>
   </w:p>
 </w:ftr>

</xml_diff>

<commit_message>
feat: add explicit same-PC Agent preflight
</commit_message>
<xml_diff>
--- a/docs/SamsungSwitchWatch_User_Manual_KO.docx
+++ b/docs/SamsungSwitchWatch_User_Manual_KO.docx
@@ -533,7 +533,7 @@
         <w:rPr>
           <w:rFonts w:ascii="맑은 고딕" w:hAnsi="맑은 고딕" w:eastAsia="맑은 고딕" w:cs="맑은 고딕"/>
         </w:rPr>
-        <w:t>고정 Viewer IPv4를 입력하고 자동 검색된 관리망을 선택합니다. 목록에 없으면 승인된 사설 관리망을 직접 추가해 합계 1~2개로 설치합니다.</w:t>
+        <w:t>원격 Viewer의 고정 IPv4를 입력하고 자동 검색된 관리망을 선택합니다. 동일 PC 사전 테스트라면 '이 PC 주소 넣기'로 실제 사설 IPv4를 사용합니다.</w:t>
       </w:r>
     </w:p>
     <w:p>
@@ -561,7 +561,7 @@
         <w:rPr>
           <w:rFonts w:ascii="맑은 고딕" w:hAnsi="맑은 고딕" w:eastAsia="맑은 고딕" w:cs="맑은 고딕"/>
         </w:rPr>
-        <w:t>Viewer가 열리면 Agent를 설치한 원격 PC의 주소만 입력합니다. HTTPS/18443은 자동입니다.</w:t>
+        <w:t>Viewer가 열리면 Agent PC 주소를 입력합니다. 같은 PC에서 먼저 확인할 때만 '이 PC에서 사전 테스트'를 직접 누릅니다.</w:t>
       </w:r>
     </w:p>
     <w:p>
@@ -1132,7 +1132,7 @@
           <w:color w:val="16324F"/>
           <w:sz w:val="21"/>
         </w:rPr>
-        <w:t>0.10.5-poc는 코드 서명되지 않은 시험판입니다. 압축을 풀기 전에 Agent와 Viewer ZIP의 SHA-256을 해당 GitHub Release 본문에 표시된 값과 비교하고 사내 보안 반입 절차를 완료하세요. SmartScreen 또는 EDR 경고를 우회하지 않습니다.</w:t>
+        <w:t>0.10.6-poc는 코드 서명되지 않은 시험판입니다. 압축을 풀기 전에 Agent와 Viewer ZIP의 SHA-256을 해당 GitHub Release 본문에 표시된 값과 비교하고 사내 보안 반입 절차를 완료하세요. SmartScreen 또는 EDR 경고를 우회하지 않습니다.</w:t>
       </w:r>
     </w:p>
     <w:p>
@@ -1174,7 +1174,21 @@
         <w:rPr>
           <w:rFonts w:ascii="맑은 고딕" w:hAnsi="맑은 고딕" w:eastAsia="맑은 고딕" w:cs="맑은 고딕"/>
         </w:rPr>
-        <w:t>고정 Viewer PC IPv4를 입력하고 자동 검색된 관리망을 선택합니다. 목록에 없으면 승인된 RFC1918 관리망을 IPv4/prefix로 직접 추가합니다.</w:t>
+        <w:t>원격 Viewer PC의 고정 IPv4를 입력합니다. 동일 PC 사전 테스트라면 '이 PC 주소 넣기'로 표시된 실제 RFC1918 사설 IPv4를 사용합니다.</w:t>
+      </w:r>
+    </w:p>
+    <w:p>
+      <w:pPr>
+        <w:numPr>
+          <w:ilvl w:val="0"/>
+          <w:numId w:val="13"/>
+        </w:numPr>
+      </w:pPr>
+      <w:r>
+        <w:rPr>
+          <w:rFonts w:ascii="맑은 고딕" w:hAnsi="맑은 고딕" w:eastAsia="맑은 고딕" w:cs="맑은 고딕"/>
+        </w:rPr>
+        <w:t>자동 검색된 관리망을 선택합니다. 목록에 없으면 승인된 RFC1918 관리망을 IPv4/prefix로 직접 추가합니다.</w:t>
       </w:r>
     </w:p>
     <w:p>
@@ -1214,8 +1228,8 @@
       <w:r>
         <w:drawing>
           <wp:inline xmlns:a="http://schemas.openxmlformats.org/drawingml/2006/main" xmlns:pic="http://schemas.openxmlformats.org/drawingml/2006/picture">
-            <wp:extent cx="4114800" cy="3789947"/>
-            <wp:docPr id="1" name="Picture 1" title="Agent Setup 화면" descr="고정 Viewer IPv4, 자동 검색 관리망, 정규화된 직접 추가 관리망을 확인하는 Agent Setup 화면"/>
+            <wp:extent cx="4114800" cy="4439652"/>
+            <wp:docPr id="1" name="Picture 1" title="Agent Setup 화면" descr="이 PC 주소 넣기, 고정 Viewer IPv4, 자동 검색 관리망과 정규화된 직접 추가 관리망을 확인하는 Agent Setup 화면"/>
             <wp:cNvGraphicFramePr>
               <a:graphicFrameLocks noChangeAspect="1"/>
             </wp:cNvGraphicFramePr>
@@ -1235,7 +1249,7 @@
                   <pic:spPr>
                     <a:xfrm>
                       <a:off x="0" y="0"/>
-                      <a:ext cx="4114800" cy="3789947"/>
+                      <a:ext cx="4114800" cy="4439652"/>
                     </a:xfrm>
                     <a:prstGeom prst="rect"/>
                   </pic:spPr>
@@ -1251,7 +1265,7 @@
         <w:pStyle w:val="Caption"/>
       </w:pPr>
       <w:r>
-        <w:t>그림 1. Agent 서비스 설치와 자동·직접 추가 관리망 범위 확인</w:t>
+        <w:t>그림 1. 동일 PC 주소 도우미와 Agent 서비스 설치 범위 확인</w:t>
       </w:r>
     </w:p>
     <w:p>
@@ -1514,7 +1528,7 @@
           <w:color w:val="16324F"/>
           <w:sz w:val="21"/>
         </w:rPr>
-        <w:t>Agent Setup에 설치 실패가 표시되면 실패 단계와 Cause를 먼저 확인하세요. SETUP_FIREWALL_FAILED는 적용 직후 최대 2초 동안 재확인해도 제품 방화벽 규칙이 정확하지 않다는 뜻입니다. Setup은 실제 주소 대신 안전한 불일치 코드를 표시하고 설치 전 상태로 복구합니다. 규칙을 Any, LocalSubnet 또는 넓은 대역으로 수동 확대하지 마세요. 설치 성공 뒤 AGENT_CONNECTION_REFUSED가 보이면 Viewer에 스위치 IP, Viewer PC 주소 또는 localhost가 아니라 Agent를 설치한 PC 주소를 입력했는지 먼저 확인하세요. 그 다음 Agent Setup의 검사에서 SamsungSwitchWatchAgent 서비스와 TCP/18443을 점검합니다. AGENT_CLIENT_NOT_ALLOWED이면 현재 Viewer PC의 고정 IPv4를 Agent Setup에 다시 입력하고 설치/업데이트합니다. 서비스를 수동 등록하지 말고 0.10.5-poc Agent Setup을 사용하세요.</w:t>
+        <w:t>Agent Setup에 설치 실패가 표시되면 실패 단계와 Cause를 먼저 확인하세요. SETUP_FIREWALL_FAILED는 적용 직후 최대 2초 동안 재확인해도 제품 방화벽 규칙이 정확하지 않다는 뜻입니다. Setup은 실제 주소 대신 안전한 불일치 코드를 표시하고 설치 전 상태로 복구합니다. 규칙을 Any, LocalSubnet 또는 넓은 대역으로 수동 확대하지 마세요. 설치 성공 뒤 AGENT_CONNECTION_REFUSED가 보이면 Viewer에 스위치 IP나 localhost가 아니라 Agent를 설치한 PC의 실제 주소를 입력했는지 먼저 확인하세요. 동일 PC 사전 테스트도 localhost 대신 이 PC의 실제 RFC1918 사설 IPv4를 사용합니다. 그 다음 Agent Setup의 검사에서 SamsungSwitchWatchAgent 서비스와 TCP/18443을 점검합니다. AGENT_CLIENT_NOT_ALLOWED이면 현재 Viewer PC의 고정 IPv4를 Agent Setup에 다시 입력하고 설치/업데이트합니다. 서비스를 수동 등록하지 말고 0.10.6-poc Agent Setup을 사용하세요.</w:t>
       </w:r>
     </w:p>
     <w:p>
@@ -1561,7 +1575,7 @@
           <w:color w:val="16324F"/>
           <w:sz w:val="21"/>
         </w:rPr>
-        <w:t>이전 Viewer가 실행 중이면 새 Viewer는 같은 사용자 데이터를 동시에 쓰지 않도록 실행을 차단하고 전환 순서를 표시합니다. 기존 트레이 아이콘에서 '프로그램 종료'를 선택한 뒤 Win+R에서 shell:startup을 열어 'Samsung Switch Watch' 바로 가기를 삭제합니다. 이어 shell:programs에서도 같은 이름의 이전 시작 메뉴 바로 가기를 삭제하고 새 Viewer를 다시 실행하세요. 기존 Agent 연결과 장비 정보는 유지됩니다. 창이 바로 보이지 않으면 알림 영역에서 대시보드를 열고 실행 경로가 새 0.10.5-poc 폴더인지 확인하세요.</w:t>
+        <w:t>이전 Viewer가 실행 중이면 새 Viewer는 같은 사용자 데이터를 동시에 쓰지 않도록 실행을 차단하고 전환 순서를 표시합니다. 기존 트레이 아이콘에서 '프로그램 종료'를 선택한 뒤 Win+R에서 shell:startup을 열어 'Samsung Switch Watch' 바로 가기를 삭제합니다. 이어 shell:programs에서도 같은 이름의 이전 시작 메뉴 바로 가기를 삭제하고 새 Viewer를 다시 실행하세요. 기존 Agent 연결과 장비 정보는 유지됩니다. 창이 바로 보이지 않으면 알림 영역에서 대시보드를 열고 실행 경로가 새 0.10.6-poc 폴더인지 확인하세요.</w:t>
       </w:r>
     </w:p>
     <w:p>
@@ -1659,7 +1673,7 @@
           <w:color w:val="16324F"/>
           <w:sz w:val="21"/>
         </w:rPr>
-        <w:t>0.10.5-poc는 코드 서명되지 않아 SmartScreen이나 사내 EDR이 차단할 수 있습니다. ZIP을 완전히 압축 해제하고 Viewer EXE와 제공된 DLL이 같은 폴더에 있는지 확인하세요. EDR·AppLocker·WDAC가 차단하면 우회하지 말고 공식 ZIP의 버전·해시와 차단 기록을 보안 담당자에게 전달하세요.</w:t>
+        <w:t>0.10.6-poc는 코드 서명되지 않아 SmartScreen이나 사내 EDR이 차단할 수 있습니다. ZIP을 완전히 압축 해제하고 Viewer EXE와 제공된 DLL이 같은 폴더에 있는지 확인하세요. EDR·AppLocker·WDAC가 차단하면 우회하지 말고 공식 ZIP의 버전·해시와 차단 기록을 보안 담당자에게 전달하세요.</w:t>
       </w:r>
     </w:p>
     <w:p>
@@ -1718,8 +1732,8 @@
       <w:r>
         <w:drawing>
           <wp:inline xmlns:a="http://schemas.openxmlformats.org/drawingml/2006/main" xmlns:pic="http://schemas.openxmlformats.org/drawingml/2006/picture">
-            <wp:extent cx="2194560" cy="1840599"/>
-            <wp:docPr id="2" name="Picture 2" title="Agent 연결 창" descr="Agent 주소만 입력하고 HTTPS 포트 18443을 자동 사용하는 연결 설정 창"/>
+            <wp:extent cx="2651760" cy="3635477"/>
+            <wp:docPr id="2" name="Picture 2" title="Agent 연결 창" descr="이 PC에서 사전 테스트 결과와 원격 Agent 주소 입력을 함께 보여 주는 연결 설정 창"/>
             <wp:cNvGraphicFramePr>
               <a:graphicFrameLocks noChangeAspect="1"/>
             </wp:cNvGraphicFramePr>
@@ -1739,7 +1753,7 @@
                   <pic:spPr>
                     <a:xfrm>
                       <a:off x="0" y="0"/>
-                      <a:ext cx="2194560" cy="1840599"/>
+                      <a:ext cx="2651760" cy="3635477"/>
                     </a:xfrm>
                     <a:prstGeom prst="rect"/>
                   </pic:spPr>
@@ -1755,7 +1769,7 @@
         <w:pStyle w:val="Caption"/>
       </w:pPr>
       <w:r>
-        <w:t>그림 2. Agent 주소만 입력하는 연결 설정</w:t>
+        <w:t>그림 2. 동일 PC Agent/API 사전 테스트와 원격 연결 설정</w:t>
       </w:r>
     </w:p>
     <w:p>
@@ -1771,7 +1785,23 @@
           <w:rFonts w:ascii="맑은 고딕" w:hAnsi="맑은 고딕" w:eastAsia="맑은 고딕" w:cs="맑은 고딕"/>
           <w:sz w:val="22"/>
         </w:rPr>
-        <w:t>Agent를 설치한 원격 PC의 IPv4 또는 사내 DNS 이름만 입력합니다. 스위치 IP, Viewer PC 주소와 localhost는 두 프로그램이 같은 PC가 아닌 한 입력하지 않습니다.</w:t>
+        <w:t>Agent를 설치한 원격 PC의 IPv4 또는 사내 DNS 이름만 입력합니다. 스위치 IP나 Viewer PC 주소를 입력하지 않습니다.</w:t>
+      </w:r>
+    </w:p>
+    <w:p>
+      <w:pPr>
+        <w:numPr>
+          <w:ilvl w:val="0"/>
+          <w:numId w:val="10"/>
+        </w:numPr>
+        <w:spacing w:before="0" w:after="120" w:line="300" w:lineRule="auto"/>
+      </w:pPr>
+      <w:r>
+        <w:rPr>
+          <w:rFonts w:ascii="맑은 고딕" w:hAnsi="맑은 고딕" w:eastAsia="맑은 고딕" w:cs="맑은 고딕"/>
+          <w:sz w:val="22"/>
+        </w:rPr>
+        <w:t>Agent와 Viewer가 같은 PC여도 localhost, localhost. 또는 127.x.x.x를 사용하지 않고 실제 RFC1918 사설 IPv4를 사용합니다.</w:t>
       </w:r>
     </w:p>
     <w:p>
@@ -1788,6 +1818,34 @@
           <w:sz w:val="22"/>
         </w:rPr>
         <w:t>https://, 포트, 인증서 지문과 페어링 토큰은 입력하지 않습니다. 정상 Agent 교체나 재설치가 확실할 때만 '이 Agent로 다시 연결'을 사용합니다.</w:t>
+      </w:r>
+    </w:p>
+    <w:p>
+      <w:pPr>
+        <w:keepLines/>
+        <w:spacing w:before="80" w:after="160" w:line="283" w:lineRule="auto"/>
+        <w:ind w:left="115" w:right="58"/>
+        <w:shd w:fill="E8EEF5"/>
+        <w:pBdr>
+          <w:left w:val="single" w:sz="16" w:space="8" w:color="2E74B5"/>
+        </w:pBdr>
+      </w:pPr>
+      <w:r>
+        <w:rPr>
+          <w:rFonts w:ascii="맑은 고딕" w:hAnsi="맑은 고딕" w:eastAsia="맑은 고딕" w:cs="맑은 고딕"/>
+          <w:b/>
+          <w:color w:val="2E74B5"/>
+          <w:sz w:val="21"/>
+        </w:rPr>
+        <w:t xml:space="preserve">동일 PC에서 먼저 확인  </w:t>
+      </w:r>
+      <w:r>
+        <w:rPr>
+          <w:rFonts w:ascii="맑은 고딕" w:hAnsi="맑은 고딕" w:eastAsia="맑은 고딕" w:cs="맑은 고딕"/>
+          <w:color w:val="16324F"/>
+          <w:sz w:val="21"/>
+        </w:rPr>
+        <w:t>Agent와 Viewer를 같은 PC에 설치했다면 Viewer의 '이 PC에서 사전 테스트'를 직접 누릅니다. 이 기능은 자동으로 실행되지 않으며 사설 IPv4 후보를 최대 6개, 후보당 7초, 전체 30초 안에서 확인합니다. 성공은 Agent 서비스, TCP/18443, HTTPS, Agent API와 같은 버전만 뜻합니다. 스위치 자격 증명과 명령은 사용하지 않으며, 장비는 저장 후 '장비 관리 → 접속 시험'에서 별도로 확인합니다. 실제 원격 배치 전에는 Agent Setup에 원격 Viewer 고정 IPv4를 다시 적용하고 원격 Viewer PC에서 연결 진단을 반복하세요.</w:t>
       </w:r>
     </w:p>
     <w:p>
@@ -7338,7 +7396,7 @@
                 <w:rFonts w:ascii="맑은 고딕" w:hAnsi="맑은 고딕" w:eastAsia="맑은 고딕" w:cs="맑은 고딕"/>
                 <w:sz w:val="16"/>
               </w:rPr>
-              <w:t>Agent 연결에 실제 Agent PC 주소를 입력합니다. 원격 구성에서는 localhost나 스위치 IP를 사용하지 않습니다.</w:t>
+              <w:t>Agent 연결에 실제 Agent PC 주소를 입력합니다. 동일 PC와 원격 구성 모두 localhost나 스위치 IP를 사용하지 않습니다.</w:t>
             </w:r>
           </w:p>
         </w:tc>
@@ -7445,6 +7503,60 @@
                 <w:sz w:val="16"/>
               </w:rPr>
               <w:t>연결 설정의 주소 → DNS/IPv4 → TCP/18443 → HTTPS → Agent API/버전 단계 중 처음 실패한 항목을 확인합니다.</w:t>
+            </w:r>
+          </w:p>
+        </w:tc>
+      </w:tr>
+      <w:tr>
+        <w:tc>
+          <w:tcPr>
+            <w:tcW w:type="dxa" w:w="1900"/>
+            <w:shd w:fill="FAFBFC"/>
+            <w:tcMar>
+              <w:top w:w="80" w:type="dxa"/>
+              <w:start w:w="120" w:type="dxa"/>
+              <w:bottom w:w="80" w:type="dxa"/>
+              <w:end w:w="120" w:type="dxa"/>
+            </w:tcMar>
+            <w:vAlign w:val="center"/>
+          </w:tcPr>
+          <w:p>
+            <w:pPr>
+              <w:spacing w:before="0" w:after="0" w:line="240" w:lineRule="auto"/>
+              <w:jc w:val="left"/>
+            </w:pPr>
+            <w:r>
+              <w:rPr>
+                <w:rFonts w:ascii="맑은 고딕" w:hAnsi="맑은 고딕" w:eastAsia="맑은 고딕" w:cs="맑은 고딕"/>
+                <w:sz w:val="16"/>
+              </w:rPr>
+              <w:t>동일 PC 시험</w:t>
+            </w:r>
+          </w:p>
+        </w:tc>
+        <w:tc>
+          <w:tcPr>
+            <w:tcW w:type="dxa" w:w="7460"/>
+            <w:shd w:fill="FAFBFC"/>
+            <w:tcMar>
+              <w:top w:w="80" w:type="dxa"/>
+              <w:start w:w="120" w:type="dxa"/>
+              <w:bottom w:w="80" w:type="dxa"/>
+              <w:end w:w="120" w:type="dxa"/>
+            </w:tcMar>
+            <w:vAlign w:val="center"/>
+          </w:tcPr>
+          <w:p>
+            <w:pPr>
+              <w:spacing w:before="0" w:after="0" w:line="240" w:lineRule="auto"/>
+              <w:jc w:val="left"/>
+            </w:pPr>
+            <w:r>
+              <w:rPr>
+                <w:rFonts w:ascii="맑은 고딕" w:hAnsi="맑은 고딕" w:eastAsia="맑은 고딕" w:cs="맑은 고딕"/>
+                <w:sz w:val="16"/>
+              </w:rPr>
+              <w:t>이 PC에서 사전 테스트는 Agent/API까지만 확인합니다. 스위치와 원격 Viewer 경로는 별도 확인합니다.</w:t>
             </w:r>
           </w:p>
         </w:tc>
@@ -7668,7 +7780,23 @@
           <w:rFonts w:ascii="맑은 고딕" w:hAnsi="맑은 고딕" w:eastAsia="맑은 고딕" w:cs="맑은 고딕"/>
           <w:sz w:val="20"/>
         </w:rPr>
-        <w:t>Agent 서비스가 창 없이 Running이고 Viewer가 주소만으로 HTTPS 연결되는지 확인</w:t>
+        <w:t>Agent 서비스가 창 없이 Running이고 Viewer가 실제 사설 IPv4로 HTTPS 연결되는지 확인</w:t>
+      </w:r>
+    </w:p>
+    <w:p>
+      <w:pPr>
+        <w:numPr>
+          <w:ilvl w:val="0"/>
+          <w:numId w:val="10"/>
+        </w:numPr>
+        <w:spacing w:before="0" w:after="40" w:line="252" w:lineRule="auto"/>
+      </w:pPr>
+      <w:r>
+        <w:rPr>
+          <w:rFonts w:ascii="맑은 고딕" w:hAnsi="맑은 고딕" w:eastAsia="맑은 고딕" w:cs="맑은 고딕"/>
+          <w:sz w:val="20"/>
+        </w:rPr>
+        <w:t>동일 PC 사전 테스트 성공 뒤 원격 Viewer 고정 IPv4를 Setup에 다시 적용하고 원격 PC에서 재검증</w:t>
       </w:r>
     </w:p>
     <w:p>
@@ -7747,7 +7875,7 @@
         <w:color w:val="64748B"/>
         <w:sz w:val="17"/>
       </w:rPr>
-      <w:t xml:space="preserve">v0.10.5-poc  |  </w:t>
+      <w:t xml:space="preserve">v0.10.6-poc  |  </w:t>
     </w:r>
     <w:r>
       <w:rPr>
@@ -7778,7 +7906,7 @@
         <w:color w:val="64748B"/>
         <w:sz w:val="17"/>
       </w:rPr>
-      <w:t>v0.10.5-poc  |  2026-07-29</w:t>
+      <w:t>v0.10.6-poc  |  2026-07-29</w:t>
     </w:r>
   </w:p>
 </w:ftr>

</xml_diff>

<commit_message>
fix(agent-setup): add explicit safe recovery workflow
</commit_message>
<xml_diff>
--- a/docs/SamsungSwitchWatch_User_Manual_KO.docx
+++ b/docs/SamsungSwitchWatch_User_Manual_KO.docx
@@ -1132,7 +1132,7 @@
           <w:color w:val="16324F"/>
           <w:sz w:val="21"/>
         </w:rPr>
-        <w:t>0.10.6-poc는 코드 서명되지 않은 시험판입니다. 압축을 풀기 전에 Agent와 Viewer ZIP의 SHA-256을 해당 GitHub Release 본문에 표시된 값과 비교하고 사내 보안 반입 절차를 완료하세요. SmartScreen 또는 EDR 경고를 우회하지 않습니다.</w:t>
+        <w:t>0.10.7-poc는 코드 서명되지 않은 시험판입니다. 압축을 풀기 전에 Agent와 Viewer ZIP의 SHA-256을 해당 GitHub Release 본문에 표시된 값과 비교하고 사내 보안 반입 절차를 완료하세요. SmartScreen 또는 EDR 경고를 우회하지 않습니다.</w:t>
       </w:r>
     </w:p>
     <w:p>
@@ -1216,7 +1216,21 @@
         <w:rPr>
           <w:rFonts w:ascii="맑은 고딕" w:hAnsi="맑은 고딕" w:eastAsia="맑은 고딕" w:cs="맑은 고딕"/>
         </w:rPr>
-        <w:t>검사를 실행한 뒤 설치/업데이트를 누르고 SamsungSwitchWatchAgent 서비스가 실행 중인지 확인합니다.</w:t>
+        <w:t>Setup이 중단된 이전 설치 기록을 발견하면 설치/업데이트가 잠깁니다. '이전 상태 복구'를 먼저 누르고 복구 완료를 확인합니다.</w:t>
+      </w:r>
+    </w:p>
+    <w:p>
+      <w:pPr>
+        <w:numPr>
+          <w:ilvl w:val="0"/>
+          <w:numId w:val="13"/>
+        </w:numPr>
+      </w:pPr>
+      <w:r>
+        <w:rPr>
+          <w:rFonts w:ascii="맑은 고딕" w:hAnsi="맑은 고딕" w:eastAsia="맑은 고딕" w:cs="맑은 고딕"/>
+        </w:rPr>
+        <w:t>복구 성공 뒤 설치는 자동으로 시작되지 않습니다. 별도로 '설치 / 업데이트'를 누른 뒤 SamsungSwitchWatchAgent 서비스가 실행 중인지 확인합니다.</w:t>
       </w:r>
     </w:p>
     <w:p>
@@ -1229,7 +1243,7 @@
         <w:drawing>
           <wp:inline xmlns:a="http://schemas.openxmlformats.org/drawingml/2006/main" xmlns:pic="http://schemas.openxmlformats.org/drawingml/2006/picture">
             <wp:extent cx="4114800" cy="4439652"/>
-            <wp:docPr id="1" name="Picture 1" title="Agent Setup 화면" descr="이 PC 주소 넣기, 고정 Viewer IPv4, 자동 검색 관리망과 정규화된 직접 추가 관리망을 확인하는 Agent Setup 화면"/>
+            <wp:docPr id="1" name="Picture 1" title="Agent Setup 화면" descr="중단된 이전 설치 기록을 감지하여 이전 상태 복구 버튼만 활성화하고 설치 업데이트 버튼은 비활성화한 Agent Setup 화면"/>
             <wp:cNvGraphicFramePr>
               <a:graphicFrameLocks noChangeAspect="1"/>
             </wp:cNvGraphicFramePr>
@@ -1265,7 +1279,35 @@
         <w:pStyle w:val="Caption"/>
       </w:pPr>
       <w:r>
-        <w:t>그림 1. 동일 PC 주소 도우미와 Agent 서비스 설치 범위 확인</w:t>
+        <w:t>그림 1. 이전 상태 복구가 필요한 안전 대기 화면</w:t>
+      </w:r>
+    </w:p>
+    <w:p>
+      <w:pPr>
+        <w:keepLines/>
+        <w:spacing w:before="80" w:after="160" w:line="283" w:lineRule="auto"/>
+        <w:ind w:left="115" w:right="58"/>
+        <w:shd w:fill="FFF8E8"/>
+        <w:pBdr>
+          <w:left w:val="single" w:sz="16" w:space="8" w:color="8A5A00"/>
+        </w:pBdr>
+      </w:pPr>
+      <w:r>
+        <w:rPr>
+          <w:rFonts w:ascii="맑은 고딕" w:hAnsi="맑은 고딕" w:eastAsia="맑은 고딕" w:cs="맑은 고딕"/>
+          <w:b/>
+          <w:color w:val="8A5A00"/>
+          <w:sz w:val="21"/>
+        </w:rPr>
+        <w:t xml:space="preserve">복구 대기 화면  </w:t>
+      </w:r>
+      <w:r>
+        <w:rPr>
+          <w:rFonts w:ascii="맑은 고딕" w:hAnsi="맑은 고딕" w:eastAsia="맑은 고딕" w:cs="맑은 고딕"/>
+          <w:color w:val="16324F"/>
+          <w:sz w:val="21"/>
+        </w:rPr>
+        <w:t>Setup은 시작할 때 이전 작업의 journal을 읽기 전용으로 확인합니다. 안전하게 복구할 수 있는 기록이면 '이전 상태 복구'만 활성화하고 설치/업데이트는 비활성화합니다. 이 확인만으로 파일·서비스·방화벽을 변경하거나 복구를 자동 실행하지 않습니다. 복구 성공 뒤에도 설치는 자동으로 이어지지 않으므로 운영자가 결과를 확인한 뒤 설치/업데이트를 별도로 시작합니다.</w:t>
       </w:r>
     </w:p>
     <w:p>
@@ -1472,7 +1514,35 @@
           <w:color w:val="16324F"/>
           <w:sz w:val="21"/>
         </w:rPr>
-        <w:t>Setup은 BUILD-MANIFEST.json과 Agent 실행 파일 SHA-256을 확인하고, Program Files의 임시 staging에 복사한 파일을 다시 검사한 뒤 교체합니다. 서비스·프로그램·방화벽 변경 중 실패하면 설치 전 상태로 자동 복구하고, 완전히 복구하지 못하면 SETUP_ROLLBACK_FAILED를 표시합니다.</w:t>
+        <w:t>Setup은 BUILD-MANIFEST.json과 Agent 실행 파일 SHA-256을 확인하고, Program Files의 임시 staging에 복사한 파일을 다시 검사한 뒤 교체합니다. 서비스·프로그램·방화벽 변경 중 현재 작업이 실패하면 설치 전 상태로 되돌리기를 시도합니다. 다음 실행에서 완료되지 않은 journal이 남아 있으면 자동 복구하지 않고 별도의 '이전 상태 복구' 작업을 요구합니다. 복구까지 실패하면 최초 설치 실패 코드를 별도로 유지하고 SETUP_ROLLBACK_FAILED와 실패한 ROLLBACK_* 단계를 함께 표시합니다.</w:t>
+      </w:r>
+    </w:p>
+    <w:p>
+      <w:pPr>
+        <w:keepLines/>
+        <w:spacing w:before="80" w:after="160" w:line="283" w:lineRule="auto"/>
+        <w:ind w:left="115" w:right="58"/>
+        <w:shd w:fill="E8EEF5"/>
+        <w:pBdr>
+          <w:left w:val="single" w:sz="16" w:space="8" w:color="2E74B5"/>
+        </w:pBdr>
+      </w:pPr>
+      <w:r>
+        <w:rPr>
+          <w:rFonts w:ascii="맑은 고딕" w:hAnsi="맑은 고딕" w:eastAsia="맑은 고딕" w:cs="맑은 고딕"/>
+          <w:b/>
+          <w:color w:val="2E74B5"/>
+          <w:sz w:val="21"/>
+        </w:rPr>
+        <w:t xml:space="preserve">실패할 때만 진단정보 복사  </w:t>
+      </w:r>
+      <w:r>
+        <w:rPr>
+          <w:rFonts w:ascii="맑은 고딕" w:hAnsi="맑은 고딕" w:eastAsia="맑은 고딕" w:cs="맑은 고딕"/>
+          <w:color w:val="16324F"/>
+          <w:sz w:val="21"/>
+        </w:rPr>
+        <w:t>설치 또는 복구가 실패한 경우에만 '진단정보 복사' 버튼이 나타납니다. 복사 내용에는 프로그램 버전, UTC 시각, 작업 종류, 최초 실패 코드, ROLLBACK_* 코드, journal 단계와 파일·서비스 존재 여부만 포함됩니다. 실제 IP/CIDR, PC·사용자 이름, 절대 경로, 계정, 비밀번호, 인증서, 방화벽 규칙 원문과 장비 명령·출력은 포함하지 않으며 별도 로그 파일로 저장하지 않습니다.</w:t>
       </w:r>
     </w:p>
     <w:p>
@@ -1528,7 +1598,7 @@
           <w:color w:val="16324F"/>
           <w:sz w:val="21"/>
         </w:rPr>
-        <w:t>Agent Setup에 설치 실패가 표시되면 실패 단계와 Cause를 먼저 확인하세요. SETUP_FIREWALL_FAILED는 적용 직후 최대 2초 동안 재확인해도 제품 방화벽 규칙이 정확하지 않다는 뜻입니다. Setup은 실제 주소 대신 안전한 불일치 코드를 표시하고 설치 전 상태로 복구합니다. 규칙을 Any, LocalSubnet 또는 넓은 대역으로 수동 확대하지 마세요. 설치 성공 뒤 AGENT_CONNECTION_REFUSED가 보이면 Viewer에 스위치 IP나 localhost가 아니라 Agent를 설치한 PC의 실제 주소를 입력했는지 먼저 확인하세요. 동일 PC 사전 테스트도 localhost 대신 이 PC의 실제 RFC1918 사설 IPv4를 사용합니다. 그 다음 Agent Setup의 검사에서 SamsungSwitchWatchAgent 서비스와 TCP/18443을 점검합니다. AGENT_CLIENT_NOT_ALLOWED이면 현재 Viewer PC의 고정 IPv4를 Agent Setup에 다시 입력하고 설치/업데이트합니다. 서비스를 수동 등록하지 말고 0.10.6-poc Agent Setup을 사용하세요.</w:t>
+        <w:t>Agent Setup에 설치 실패가 표시되면 실패 단계와 Cause를 먼저 확인하세요. SETUP_FIREWALL_FAILED는 적용 직후 최대 2초 동안 재확인해도 제품 방화벽 규칙이 정확하지 않다는 뜻입니다. Setup은 실제 주소 대신 안전한 불일치 코드를 표시하고 설치 전 상태로 복구합니다. 규칙을 Any, LocalSubnet 또는 넓은 대역으로 수동 확대하지 마세요. 설치 성공 뒤 AGENT_CONNECTION_REFUSED가 보이면 Viewer에 스위치 IP나 localhost가 아니라 Agent를 설치한 PC의 실제 주소를 입력했는지 먼저 확인하세요. 동일 PC 사전 테스트도 localhost 대신 이 PC의 실제 RFC1918 사설 IPv4를 사용합니다. 그 다음 Agent Setup의 검사에서 SamsungSwitchWatchAgent 서비스와 TCP/18443을 점검합니다. AGENT_CLIENT_NOT_ALLOWED이면 현재 Viewer PC의 고정 IPv4를 Agent Setup에 다시 입력하고 설치/업데이트합니다. 서비스를 수동 등록하지 말고 0.10.7-poc Agent Setup을 사용하세요.</w:t>
       </w:r>
     </w:p>
     <w:p>
@@ -1575,7 +1645,7 @@
           <w:color w:val="16324F"/>
           <w:sz w:val="21"/>
         </w:rPr>
-        <w:t>이전 Viewer가 실행 중이면 새 Viewer는 같은 사용자 데이터를 동시에 쓰지 않도록 실행을 차단하고 전환 순서를 표시합니다. 기존 트레이 아이콘에서 '프로그램 종료'를 선택한 뒤 Win+R에서 shell:startup을 열어 'Samsung Switch Watch' 바로 가기를 삭제합니다. 이어 shell:programs에서도 같은 이름의 이전 시작 메뉴 바로 가기를 삭제하고 새 Viewer를 다시 실행하세요. 기존 Agent 연결과 장비 정보는 유지됩니다. 창이 바로 보이지 않으면 알림 영역에서 대시보드를 열고 실행 경로가 새 0.10.6-poc 폴더인지 확인하세요.</w:t>
+        <w:t>이전 Viewer가 실행 중이면 새 Viewer는 같은 사용자 데이터를 동시에 쓰지 않도록 실행을 차단하고 전환 순서를 표시합니다. 기존 트레이 아이콘에서 '프로그램 종료'를 선택한 뒤 Win+R에서 shell:startup을 열어 'Samsung Switch Watch' 바로 가기를 삭제합니다. 이어 shell:programs에서도 같은 이름의 이전 시작 메뉴 바로 가기를 삭제하고 새 Viewer를 다시 실행하세요. 기존 Agent 연결과 장비 정보는 유지됩니다. 창이 바로 보이지 않으면 알림 영역에서 대시보드를 열고 실행 경로가 새 0.10.7-poc 폴더인지 확인하세요.</w:t>
       </w:r>
     </w:p>
     <w:p>
@@ -1673,7 +1743,7 @@
           <w:color w:val="16324F"/>
           <w:sz w:val="21"/>
         </w:rPr>
-        <w:t>0.10.6-poc는 코드 서명되지 않아 SmartScreen이나 사내 EDR이 차단할 수 있습니다. ZIP을 완전히 압축 해제하고 Viewer EXE와 제공된 DLL이 같은 폴더에 있는지 확인하세요. EDR·AppLocker·WDAC가 차단하면 우회하지 말고 공식 ZIP의 버전·해시와 차단 기록을 보안 담당자에게 전달하세요.</w:t>
+        <w:t>0.10.7-poc는 코드 서명되지 않아 SmartScreen이나 사내 EDR이 차단할 수 있습니다. ZIP을 완전히 압축 해제하고 Viewer EXE와 제공된 DLL이 같은 폴더에 있는지 확인하세요. EDR·AppLocker·WDAC가 차단하면 우회하지 말고 공식 ZIP의 버전·해시와 차단 기록을 보안 담당자에게 전달하세요.</w:t>
       </w:r>
     </w:p>
     <w:p>
@@ -1851,7 +1921,7 @@
     <w:p>
       <w:pPr>
         <w:pStyle w:val="Heading1"/>
-        <w:pageBreakBefore/>
+        <w:pageBreakBefore w:val="0"/>
         <w:numPr>
           <w:ilvl w:val="0"/>
           <w:numId w:val="11"/>
@@ -6052,7 +6122,7 @@
                 <w:rFonts w:ascii="맑은 고딕" w:hAnsi="맑은 고딕" w:eastAsia="맑은 고딕" w:cs="맑은 고딕"/>
                 <w:sz w:val="16"/>
               </w:rPr>
-              <w:t>SETUP_ROLLBACK_FAILED</w:t>
+              <w:t>SETUP_RECOVERY_REQUIRED</w:t>
             </w:r>
           </w:p>
         </w:tc>
@@ -6078,7 +6148,7 @@
                 <w:rFonts w:ascii="맑은 고딕" w:hAnsi="맑은 고딕" w:eastAsia="맑은 고딕" w:cs="맑은 고딕"/>
                 <w:sz w:val="16"/>
               </w:rPr>
-              <w:t>재실행하지 말고 표시 단계와 보존된 백업을 Windows 관리자에게 전달</w:t>
+              <w:t>설치/업데이트를 누르지 말고 '이전 상태 복구' 실행 → 복구 완료 확인 → 설치/업데이트를 별도로 시작</w:t>
             </w:r>
           </w:p>
         </w:tc>
@@ -6105,6 +6175,377 @@
                 <w:rFonts w:ascii="맑은 고딕" w:hAnsi="맑은 고딕" w:eastAsia="맑은 고딕" w:cs="맑은 고딕"/>
                 <w:sz w:val="16"/>
               </w:rPr>
+              <w:t>SETUP_ROLLBACK_FAILED</w:t>
+            </w:r>
+          </w:p>
+        </w:tc>
+        <w:tc>
+          <w:tcPr>
+            <w:tcW w:type="dxa" w:w="5060"/>
+            <w:tcMar>
+              <w:top w:w="80" w:type="dxa"/>
+              <w:start w:w="120" w:type="dxa"/>
+              <w:bottom w:w="80" w:type="dxa"/>
+              <w:end w:w="120" w:type="dxa"/>
+            </w:tcMar>
+            <w:vAlign w:val="center"/>
+          </w:tcPr>
+          <w:p>
+            <w:pPr>
+              <w:spacing w:before="0" w:after="0" w:line="240" w:lineRule="auto"/>
+              <w:jc w:val="left"/>
+            </w:pPr>
+            <w:r>
+              <w:rPr>
+                <w:rFonts w:ascii="맑은 고딕" w:hAnsi="맑은 고딕" w:eastAsia="맑은 고딕" w:cs="맑은 고딕"/>
+                <w:sz w:val="16"/>
+              </w:rPr>
+              <w:t>'진단정보 복사'로 최초 실패 코드와 ROLLBACK_* 단계 확인 → 증거 폴더를 그대로 보존 → Windows 관리자에게 전달</w:t>
+            </w:r>
+          </w:p>
+        </w:tc>
+      </w:tr>
+      <w:tr>
+        <w:tc>
+          <w:tcPr>
+            <w:tcW w:type="dxa" w:w="4300"/>
+            <w:shd w:fill="FAFBFC"/>
+            <w:tcMar>
+              <w:top w:w="80" w:type="dxa"/>
+              <w:start w:w="120" w:type="dxa"/>
+              <w:bottom w:w="80" w:type="dxa"/>
+              <w:end w:w="120" w:type="dxa"/>
+            </w:tcMar>
+            <w:vAlign w:val="center"/>
+          </w:tcPr>
+          <w:p>
+            <w:pPr>
+              <w:spacing w:before="0" w:after="0" w:line="240" w:lineRule="auto"/>
+              <w:jc w:val="left"/>
+            </w:pPr>
+            <w:r>
+              <w:rPr>
+                <w:rFonts w:ascii="맑은 고딕" w:hAnsi="맑은 고딕" w:eastAsia="맑은 고딕" w:cs="맑은 고딕"/>
+                <w:sz w:val="16"/>
+              </w:rPr>
+              <w:t>ROLLBACK_STATE_MISMATCH</w:t>
+            </w:r>
+          </w:p>
+        </w:tc>
+        <w:tc>
+          <w:tcPr>
+            <w:tcW w:type="dxa" w:w="5060"/>
+            <w:shd w:fill="FAFBFC"/>
+            <w:tcMar>
+              <w:top w:w="80" w:type="dxa"/>
+              <w:start w:w="120" w:type="dxa"/>
+              <w:bottom w:w="80" w:type="dxa"/>
+              <w:end w:w="120" w:type="dxa"/>
+            </w:tcMar>
+            <w:vAlign w:val="center"/>
+          </w:tcPr>
+          <w:p>
+            <w:pPr>
+              <w:spacing w:before="0" w:after="0" w:line="240" w:lineRule="auto"/>
+              <w:jc w:val="left"/>
+            </w:pPr>
+            <w:r>
+              <w:rPr>
+                <w:rFonts w:ascii="맑은 고딕" w:hAnsi="맑은 고딕" w:eastAsia="맑은 고딕" w:cs="맑은 고딕"/>
+                <w:sz w:val="16"/>
+              </w:rPr>
+              <w:t>복구 기록과 현재 설치 상태가 다름. 복구·설치 재시도와 파일 수동 정리를 중지</w:t>
+            </w:r>
+          </w:p>
+        </w:tc>
+      </w:tr>
+      <w:tr>
+        <w:tc>
+          <w:tcPr>
+            <w:tcW w:type="dxa" w:w="4300"/>
+            <w:tcMar>
+              <w:top w:w="80" w:type="dxa"/>
+              <w:start w:w="120" w:type="dxa"/>
+              <w:bottom w:w="80" w:type="dxa"/>
+              <w:end w:w="120" w:type="dxa"/>
+            </w:tcMar>
+            <w:vAlign w:val="center"/>
+          </w:tcPr>
+          <w:p>
+            <w:pPr>
+              <w:spacing w:before="0" w:after="0" w:line="240" w:lineRule="auto"/>
+              <w:jc w:val="left"/>
+            </w:pPr>
+            <w:r>
+              <w:rPr>
+                <w:rFonts w:ascii="맑은 고딕" w:hAnsi="맑은 고딕" w:eastAsia="맑은 고딕" w:cs="맑은 고딕"/>
+                <w:sz w:val="16"/>
+              </w:rPr>
+              <w:t>ROLLBACK_SERVICE_STOP_FAILED</w:t>
+            </w:r>
+          </w:p>
+        </w:tc>
+        <w:tc>
+          <w:tcPr>
+            <w:tcW w:type="dxa" w:w="5060"/>
+            <w:tcMar>
+              <w:top w:w="80" w:type="dxa"/>
+              <w:start w:w="120" w:type="dxa"/>
+              <w:bottom w:w="80" w:type="dxa"/>
+              <w:end w:w="120" w:type="dxa"/>
+            </w:tcMar>
+            <w:vAlign w:val="center"/>
+          </w:tcPr>
+          <w:p>
+            <w:pPr>
+              <w:spacing w:before="0" w:after="0" w:line="240" w:lineRule="auto"/>
+              <w:jc w:val="left"/>
+            </w:pPr>
+            <w:r>
+              <w:rPr>
+                <w:rFonts w:ascii="맑은 고딕" w:hAnsi="맑은 고딕" w:eastAsia="맑은 고딕" w:cs="맑은 고딕"/>
+                <w:sz w:val="16"/>
+              </w:rPr>
+              <w:t>SamsungSwitchWatchAgent 중지 상태와 서비스 제어 권한 확인</w:t>
+            </w:r>
+          </w:p>
+        </w:tc>
+      </w:tr>
+      <w:tr>
+        <w:tc>
+          <w:tcPr>
+            <w:tcW w:type="dxa" w:w="4300"/>
+            <w:shd w:fill="FAFBFC"/>
+            <w:tcMar>
+              <w:top w:w="80" w:type="dxa"/>
+              <w:start w:w="120" w:type="dxa"/>
+              <w:bottom w:w="80" w:type="dxa"/>
+              <w:end w:w="120" w:type="dxa"/>
+            </w:tcMar>
+            <w:vAlign w:val="center"/>
+          </w:tcPr>
+          <w:p>
+            <w:pPr>
+              <w:spacing w:before="0" w:after="0" w:line="240" w:lineRule="auto"/>
+              <w:jc w:val="left"/>
+            </w:pPr>
+            <w:r>
+              <w:rPr>
+                <w:rFonts w:ascii="맑은 고딕" w:hAnsi="맑은 고딕" w:eastAsia="맑은 고딕" w:cs="맑은 고딕"/>
+                <w:sz w:val="16"/>
+              </w:rPr>
+              <w:t>ROLLBACK_FILE_RESTORE_FAILED / ROLLBACK_DATA_CLEANUP_FAILED</w:t>
+            </w:r>
+          </w:p>
+        </w:tc>
+        <w:tc>
+          <w:tcPr>
+            <w:tcW w:type="dxa" w:w="5060"/>
+            <w:shd w:fill="FAFBFC"/>
+            <w:tcMar>
+              <w:top w:w="80" w:type="dxa"/>
+              <w:start w:w="120" w:type="dxa"/>
+              <w:bottom w:w="80" w:type="dxa"/>
+              <w:end w:w="120" w:type="dxa"/>
+            </w:tcMar>
+            <w:vAlign w:val="center"/>
+          </w:tcPr>
+          <w:p>
+            <w:pPr>
+              <w:spacing w:before="0" w:after="0" w:line="240" w:lineRule="auto"/>
+              <w:jc w:val="left"/>
+            </w:pPr>
+            <w:r>
+              <w:rPr>
+                <w:rFonts w:ascii="맑은 고딕" w:hAnsi="맑은 고딕" w:eastAsia="맑은 고딕" w:cs="맑은 고딕"/>
+                <w:sz w:val="16"/>
+              </w:rPr>
+              <w:t>Program Files·ProgramData 권한, 파일 잠금, 백신·EDR 격리 확인. 증거 폴더는 보존</w:t>
+            </w:r>
+          </w:p>
+        </w:tc>
+      </w:tr>
+      <w:tr>
+        <w:tc>
+          <w:tcPr>
+            <w:tcW w:type="dxa" w:w="4300"/>
+            <w:tcMar>
+              <w:top w:w="80" w:type="dxa"/>
+              <w:start w:w="120" w:type="dxa"/>
+              <w:bottom w:w="80" w:type="dxa"/>
+              <w:end w:w="120" w:type="dxa"/>
+            </w:tcMar>
+            <w:vAlign w:val="center"/>
+          </w:tcPr>
+          <w:p>
+            <w:pPr>
+              <w:spacing w:before="0" w:after="0" w:line="240" w:lineRule="auto"/>
+              <w:jc w:val="left"/>
+            </w:pPr>
+            <w:r>
+              <w:rPr>
+                <w:rFonts w:ascii="맑은 고딕" w:hAnsi="맑은 고딕" w:eastAsia="맑은 고딕" w:cs="맑은 고딕"/>
+                <w:sz w:val="16"/>
+              </w:rPr>
+              <w:t>ROLLBACK_SERVICE_RESTORE_FAILED</w:t>
+            </w:r>
+          </w:p>
+        </w:tc>
+        <w:tc>
+          <w:tcPr>
+            <w:tcW w:type="dxa" w:w="5060"/>
+            <w:tcMar>
+              <w:top w:w="80" w:type="dxa"/>
+              <w:start w:w="120" w:type="dxa"/>
+              <w:bottom w:w="80" w:type="dxa"/>
+              <w:end w:w="120" w:type="dxa"/>
+            </w:tcMar>
+            <w:vAlign w:val="center"/>
+          </w:tcPr>
+          <w:p>
+            <w:pPr>
+              <w:spacing w:before="0" w:after="0" w:line="240" w:lineRule="auto"/>
+              <w:jc w:val="left"/>
+            </w:pPr>
+            <w:r>
+              <w:rPr>
+                <w:rFonts w:ascii="맑은 고딕" w:hAnsi="맑은 고딕" w:eastAsia="맑은 고딕" w:cs="맑은 고딕"/>
+                <w:sz w:val="16"/>
+              </w:rPr>
+              <w:t>파일 복구 완료 여부를 먼저 확인한 뒤 기존 서비스 설정·시작 실패를 Windows 관리자에게 전달</w:t>
+            </w:r>
+          </w:p>
+        </w:tc>
+      </w:tr>
+      <w:tr>
+        <w:tc>
+          <w:tcPr>
+            <w:tcW w:type="dxa" w:w="4300"/>
+            <w:shd w:fill="FAFBFC"/>
+            <w:tcMar>
+              <w:top w:w="80" w:type="dxa"/>
+              <w:start w:w="120" w:type="dxa"/>
+              <w:bottom w:w="80" w:type="dxa"/>
+              <w:end w:w="120" w:type="dxa"/>
+            </w:tcMar>
+            <w:vAlign w:val="center"/>
+          </w:tcPr>
+          <w:p>
+            <w:pPr>
+              <w:spacing w:before="0" w:after="0" w:line="240" w:lineRule="auto"/>
+              <w:jc w:val="left"/>
+            </w:pPr>
+            <w:r>
+              <w:rPr>
+                <w:rFonts w:ascii="맑은 고딕" w:hAnsi="맑은 고딕" w:eastAsia="맑은 고딕" w:cs="맑은 고딕"/>
+                <w:sz w:val="16"/>
+              </w:rPr>
+              <w:t>ROLLBACK_HTTPS_FIREWALL_RESTORE_FAILED / ROLLBACK_LEGACY_FIREWALL_RESTORE_FAILED</w:t>
+            </w:r>
+          </w:p>
+        </w:tc>
+        <w:tc>
+          <w:tcPr>
+            <w:tcW w:type="dxa" w:w="5060"/>
+            <w:shd w:fill="FAFBFC"/>
+            <w:tcMar>
+              <w:top w:w="80" w:type="dxa"/>
+              <w:start w:w="120" w:type="dxa"/>
+              <w:bottom w:w="80" w:type="dxa"/>
+              <w:end w:w="120" w:type="dxa"/>
+            </w:tcMar>
+            <w:vAlign w:val="center"/>
+          </w:tcPr>
+          <w:p>
+            <w:pPr>
+              <w:spacing w:before="0" w:after="0" w:line="240" w:lineRule="auto"/>
+              <w:jc w:val="left"/>
+            </w:pPr>
+            <w:r>
+              <w:rPr>
+                <w:rFonts w:ascii="맑은 고딕" w:hAnsi="맑은 고딕" w:eastAsia="맑은 고딕" w:cs="맑은 고딕"/>
+                <w:sz w:val="16"/>
+              </w:rPr>
+              <w:t>제품 HTTPS 규칙과 이전 legacy 규칙의 개별 복원 실패. 규칙 범위를 수동 확대하지 않음</w:t>
+            </w:r>
+          </w:p>
+        </w:tc>
+      </w:tr>
+      <w:tr>
+        <w:tc>
+          <w:tcPr>
+            <w:tcW w:type="dxa" w:w="4300"/>
+            <w:tcMar>
+              <w:top w:w="80" w:type="dxa"/>
+              <w:start w:w="120" w:type="dxa"/>
+              <w:bottom w:w="80" w:type="dxa"/>
+              <w:end w:w="120" w:type="dxa"/>
+            </w:tcMar>
+            <w:vAlign w:val="center"/>
+          </w:tcPr>
+          <w:p>
+            <w:pPr>
+              <w:spacing w:before="0" w:after="0" w:line="240" w:lineRule="auto"/>
+              <w:jc w:val="left"/>
+            </w:pPr>
+            <w:r>
+              <w:rPr>
+                <w:rFonts w:ascii="맑은 고딕" w:hAnsi="맑은 고딕" w:eastAsia="맑은 고딕" w:cs="맑은 고딕"/>
+                <w:sz w:val="16"/>
+              </w:rPr>
+              <w:t>ROLLBACK_JOURNAL_WRITE_FAILED / ROLLBACK_EVIDENCE_CLEANUP_FAILED</w:t>
+            </w:r>
+          </w:p>
+        </w:tc>
+        <w:tc>
+          <w:tcPr>
+            <w:tcW w:type="dxa" w:w="5060"/>
+            <w:tcMar>
+              <w:top w:w="80" w:type="dxa"/>
+              <w:start w:w="120" w:type="dxa"/>
+              <w:bottom w:w="80" w:type="dxa"/>
+              <w:end w:w="120" w:type="dxa"/>
+            </w:tcMar>
+            <w:vAlign w:val="center"/>
+          </w:tcPr>
+          <w:p>
+            <w:pPr>
+              <w:spacing w:before="0" w:after="0" w:line="240" w:lineRule="auto"/>
+              <w:jc w:val="left"/>
+            </w:pPr>
+            <w:r>
+              <w:rPr>
+                <w:rFonts w:ascii="맑은 고딕" w:hAnsi="맑은 고딕" w:eastAsia="맑은 고딕" w:cs="맑은 고딕"/>
+                <w:sz w:val="16"/>
+              </w:rPr>
+              <w:t>journal 또는 증거 정리 단계 실패. 남은 기록·폴더를 삭제하지 않고 진단정보 전달</w:t>
+            </w:r>
+          </w:p>
+        </w:tc>
+      </w:tr>
+      <w:tr>
+        <w:tc>
+          <w:tcPr>
+            <w:tcW w:type="dxa" w:w="4300"/>
+            <w:shd w:fill="FAFBFC"/>
+            <w:tcMar>
+              <w:top w:w="80" w:type="dxa"/>
+              <w:start w:w="120" w:type="dxa"/>
+              <w:bottom w:w="80" w:type="dxa"/>
+              <w:end w:w="120" w:type="dxa"/>
+            </w:tcMar>
+            <w:vAlign w:val="center"/>
+          </w:tcPr>
+          <w:p>
+            <w:pPr>
+              <w:spacing w:before="0" w:after="0" w:line="240" w:lineRule="auto"/>
+              <w:jc w:val="left"/>
+            </w:pPr>
+            <w:r>
+              <w:rPr>
+                <w:rFonts w:ascii="맑은 고딕" w:hAnsi="맑은 고딕" w:eastAsia="맑은 고딕" w:cs="맑은 고딕"/>
+                <w:sz w:val="16"/>
+              </w:rPr>
               <w:t>SETUP_EXISTING_NETWORKS_NOT_LOADED</w:t>
             </w:r>
           </w:p>
@@ -6112,6 +6553,7 @@
         <w:tc>
           <w:tcPr>
             <w:tcW w:type="dxa" w:w="5060"/>
+            <w:shd w:fill="FAFBFC"/>
             <w:tcMar>
               <w:top w:w="80" w:type="dxa"/>
               <w:start w:w="120" w:type="dxa"/>
@@ -6139,7 +6581,6 @@
         <w:tc>
           <w:tcPr>
             <w:tcW w:type="dxa" w:w="4300"/>
-            <w:shd w:fill="FAFBFC"/>
             <w:tcMar>
               <w:top w:w="80" w:type="dxa"/>
               <w:start w:w="120" w:type="dxa"/>
@@ -6165,7 +6606,6 @@
         <w:tc>
           <w:tcPr>
             <w:tcW w:type="dxa" w:w="5060"/>
-            <w:shd w:fill="FAFBFC"/>
             <w:tcMar>
               <w:top w:w="80" w:type="dxa"/>
               <w:start w:w="120" w:type="dxa"/>
@@ -6193,6 +6633,7 @@
         <w:tc>
           <w:tcPr>
             <w:tcW w:type="dxa" w:w="4300"/>
+            <w:shd w:fill="FAFBFC"/>
             <w:tcMar>
               <w:top w:w="80" w:type="dxa"/>
               <w:start w:w="120" w:type="dxa"/>
@@ -6218,6 +6659,7 @@
         <w:tc>
           <w:tcPr>
             <w:tcW w:type="dxa" w:w="5060"/>
+            <w:shd w:fill="FAFBFC"/>
             <w:tcMar>
               <w:top w:w="80" w:type="dxa"/>
               <w:start w:w="120" w:type="dxa"/>
@@ -6245,7 +6687,6 @@
         <w:tc>
           <w:tcPr>
             <w:tcW w:type="dxa" w:w="4300"/>
-            <w:shd w:fill="FAFBFC"/>
             <w:tcMar>
               <w:top w:w="80" w:type="dxa"/>
               <w:start w:w="120" w:type="dxa"/>
@@ -6271,7 +6712,6 @@
         <w:tc>
           <w:tcPr>
             <w:tcW w:type="dxa" w:w="5060"/>
-            <w:shd w:fill="FAFBFC"/>
             <w:tcMar>
               <w:top w:w="80" w:type="dxa"/>
               <w:start w:w="120" w:type="dxa"/>
@@ -6299,6 +6739,7 @@
         <w:tc>
           <w:tcPr>
             <w:tcW w:type="dxa" w:w="4300"/>
+            <w:shd w:fill="FAFBFC"/>
             <w:tcMar>
               <w:top w:w="80" w:type="dxa"/>
               <w:start w:w="120" w:type="dxa"/>
@@ -6324,6 +6765,7 @@
         <w:tc>
           <w:tcPr>
             <w:tcW w:type="dxa" w:w="5060"/>
+            <w:shd w:fill="FAFBFC"/>
             <w:tcMar>
               <w:top w:w="80" w:type="dxa"/>
               <w:start w:w="120" w:type="dxa"/>
@@ -6351,7 +6793,6 @@
         <w:tc>
           <w:tcPr>
             <w:tcW w:type="dxa" w:w="4300"/>
-            <w:shd w:fill="FAFBFC"/>
             <w:tcMar>
               <w:top w:w="80" w:type="dxa"/>
               <w:start w:w="120" w:type="dxa"/>
@@ -6377,7 +6818,6 @@
         <w:tc>
           <w:tcPr>
             <w:tcW w:type="dxa" w:w="5060"/>
-            <w:shd w:fill="FAFBFC"/>
             <w:tcMar>
               <w:top w:w="80" w:type="dxa"/>
               <w:start w:w="120" w:type="dxa"/>
@@ -6405,6 +6845,7 @@
         <w:tc>
           <w:tcPr>
             <w:tcW w:type="dxa" w:w="4300"/>
+            <w:shd w:fill="FAFBFC"/>
             <w:tcMar>
               <w:top w:w="80" w:type="dxa"/>
               <w:start w:w="120" w:type="dxa"/>
@@ -6430,6 +6871,7 @@
         <w:tc>
           <w:tcPr>
             <w:tcW w:type="dxa" w:w="5060"/>
+            <w:shd w:fill="FAFBFC"/>
             <w:tcMar>
               <w:top w:w="80" w:type="dxa"/>
               <w:start w:w="120" w:type="dxa"/>
@@ -6457,7 +6899,6 @@
         <w:tc>
           <w:tcPr>
             <w:tcW w:type="dxa" w:w="4300"/>
-            <w:shd w:fill="FAFBFC"/>
             <w:tcMar>
               <w:top w:w="80" w:type="dxa"/>
               <w:start w:w="120" w:type="dxa"/>
@@ -6483,7 +6924,6 @@
         <w:tc>
           <w:tcPr>
             <w:tcW w:type="dxa" w:w="5060"/>
-            <w:shd w:fill="FAFBFC"/>
             <w:tcMar>
               <w:top w:w="80" w:type="dxa"/>
               <w:start w:w="120" w:type="dxa"/>
@@ -6511,6 +6951,7 @@
         <w:tc>
           <w:tcPr>
             <w:tcW w:type="dxa" w:w="4300"/>
+            <w:shd w:fill="FAFBFC"/>
             <w:tcMar>
               <w:top w:w="80" w:type="dxa"/>
               <w:start w:w="120" w:type="dxa"/>
@@ -6536,6 +6977,7 @@
         <w:tc>
           <w:tcPr>
             <w:tcW w:type="dxa" w:w="5060"/>
+            <w:shd w:fill="FAFBFC"/>
             <w:tcMar>
               <w:top w:w="80" w:type="dxa"/>
               <w:start w:w="120" w:type="dxa"/>
@@ -6563,7 +7005,6 @@
         <w:tc>
           <w:tcPr>
             <w:tcW w:type="dxa" w:w="4300"/>
-            <w:shd w:fill="FAFBFC"/>
             <w:tcMar>
               <w:top w:w="80" w:type="dxa"/>
               <w:start w:w="120" w:type="dxa"/>
@@ -6589,7 +7030,6 @@
         <w:tc>
           <w:tcPr>
             <w:tcW w:type="dxa" w:w="5060"/>
-            <w:shd w:fill="FAFBFC"/>
             <w:tcMar>
               <w:top w:w="80" w:type="dxa"/>
               <w:start w:w="120" w:type="dxa"/>
@@ -6617,6 +7057,7 @@
         <w:tc>
           <w:tcPr>
             <w:tcW w:type="dxa" w:w="4300"/>
+            <w:shd w:fill="FAFBFC"/>
             <w:tcMar>
               <w:top w:w="80" w:type="dxa"/>
               <w:start w:w="120" w:type="dxa"/>
@@ -6642,6 +7083,7 @@
         <w:tc>
           <w:tcPr>
             <w:tcW w:type="dxa" w:w="5060"/>
+            <w:shd w:fill="FAFBFC"/>
             <w:tcMar>
               <w:top w:w="80" w:type="dxa"/>
               <w:start w:w="120" w:type="dxa"/>
@@ -6669,7 +7111,6 @@
         <w:tc>
           <w:tcPr>
             <w:tcW w:type="dxa" w:w="4300"/>
-            <w:shd w:fill="FAFBFC"/>
             <w:tcMar>
               <w:top w:w="80" w:type="dxa"/>
               <w:start w:w="120" w:type="dxa"/>
@@ -6695,7 +7136,6 @@
         <w:tc>
           <w:tcPr>
             <w:tcW w:type="dxa" w:w="5060"/>
-            <w:shd w:fill="FAFBFC"/>
             <w:tcMar>
               <w:top w:w="80" w:type="dxa"/>
               <w:start w:w="120" w:type="dxa"/>
@@ -6723,6 +7163,7 @@
         <w:tc>
           <w:tcPr>
             <w:tcW w:type="dxa" w:w="4300"/>
+            <w:shd w:fill="FAFBFC"/>
             <w:tcMar>
               <w:top w:w="80" w:type="dxa"/>
               <w:start w:w="120" w:type="dxa"/>
@@ -6748,6 +7189,7 @@
         <w:tc>
           <w:tcPr>
             <w:tcW w:type="dxa" w:w="5060"/>
+            <w:shd w:fill="FAFBFC"/>
             <w:tcMar>
               <w:top w:w="80" w:type="dxa"/>
               <w:start w:w="120" w:type="dxa"/>
@@ -6775,7 +7217,6 @@
         <w:tc>
           <w:tcPr>
             <w:tcW w:type="dxa" w:w="4300"/>
-            <w:shd w:fill="FAFBFC"/>
             <w:tcMar>
               <w:top w:w="80" w:type="dxa"/>
               <w:start w:w="120" w:type="dxa"/>
@@ -6801,7 +7242,6 @@
         <w:tc>
           <w:tcPr>
             <w:tcW w:type="dxa" w:w="5060"/>
-            <w:shd w:fill="FAFBFC"/>
             <w:tcMar>
               <w:top w:w="80" w:type="dxa"/>
               <w:start w:w="120" w:type="dxa"/>
@@ -6829,6 +7269,7 @@
         <w:tc>
           <w:tcPr>
             <w:tcW w:type="dxa" w:w="4300"/>
+            <w:shd w:fill="FAFBFC"/>
             <w:tcMar>
               <w:top w:w="80" w:type="dxa"/>
               <w:start w:w="120" w:type="dxa"/>
@@ -6854,6 +7295,7 @@
         <w:tc>
           <w:tcPr>
             <w:tcW w:type="dxa" w:w="5060"/>
+            <w:shd w:fill="FAFBFC"/>
             <w:tcMar>
               <w:top w:w="80" w:type="dxa"/>
               <w:start w:w="120" w:type="dxa"/>
@@ -6881,7 +7323,6 @@
         <w:tc>
           <w:tcPr>
             <w:tcW w:type="dxa" w:w="4300"/>
-            <w:shd w:fill="FAFBFC"/>
             <w:tcMar>
               <w:top w:w="80" w:type="dxa"/>
               <w:start w:w="120" w:type="dxa"/>
@@ -6907,7 +7348,6 @@
         <w:tc>
           <w:tcPr>
             <w:tcW w:type="dxa" w:w="5060"/>
-            <w:shd w:fill="FAFBFC"/>
             <w:tcMar>
               <w:top w:w="80" w:type="dxa"/>
               <w:start w:w="120" w:type="dxa"/>
@@ -6935,6 +7375,7 @@
         <w:tc>
           <w:tcPr>
             <w:tcW w:type="dxa" w:w="4300"/>
+            <w:shd w:fill="FAFBFC"/>
             <w:tcMar>
               <w:top w:w="80" w:type="dxa"/>
               <w:start w:w="120" w:type="dxa"/>
@@ -6960,6 +7401,7 @@
         <w:tc>
           <w:tcPr>
             <w:tcW w:type="dxa" w:w="5060"/>
+            <w:shd w:fill="FAFBFC"/>
             <w:tcMar>
               <w:top w:w="80" w:type="dxa"/>
               <w:start w:w="120" w:type="dxa"/>
@@ -6987,7 +7429,6 @@
         <w:tc>
           <w:tcPr>
             <w:tcW w:type="dxa" w:w="4300"/>
-            <w:shd w:fill="FAFBFC"/>
             <w:tcMar>
               <w:top w:w="80" w:type="dxa"/>
               <w:start w:w="120" w:type="dxa"/>
@@ -7013,7 +7454,6 @@
         <w:tc>
           <w:tcPr>
             <w:tcW w:type="dxa" w:w="5060"/>
-            <w:shd w:fill="FAFBFC"/>
             <w:tcMar>
               <w:top w:w="80" w:type="dxa"/>
               <w:start w:w="120" w:type="dxa"/>
@@ -7041,6 +7481,7 @@
         <w:tc>
           <w:tcPr>
             <w:tcW w:type="dxa" w:w="4300"/>
+            <w:shd w:fill="FAFBFC"/>
             <w:tcMar>
               <w:top w:w="80" w:type="dxa"/>
               <w:start w:w="120" w:type="dxa"/>
@@ -7066,6 +7507,7 @@
         <w:tc>
           <w:tcPr>
             <w:tcW w:type="dxa" w:w="5060"/>
+            <w:shd w:fill="FAFBFC"/>
             <w:tcMar>
               <w:top w:w="80" w:type="dxa"/>
               <w:start w:w="120" w:type="dxa"/>
@@ -7093,7 +7535,6 @@
         <w:tc>
           <w:tcPr>
             <w:tcW w:type="dxa" w:w="4300"/>
-            <w:shd w:fill="FAFBFC"/>
             <w:tcMar>
               <w:top w:w="80" w:type="dxa"/>
               <w:start w:w="120" w:type="dxa"/>
@@ -7119,7 +7560,6 @@
         <w:tc>
           <w:tcPr>
             <w:tcW w:type="dxa" w:w="5060"/>
-            <w:shd w:fill="FAFBFC"/>
             <w:tcMar>
               <w:top w:w="80" w:type="dxa"/>
               <w:start w:w="120" w:type="dxa"/>
@@ -7199,7 +7639,7 @@
           <w:color w:val="B42318"/>
           <w:sz w:val="21"/>
         </w:rPr>
-        <w:t xml:space="preserve">자동 복구 실패 시  </w:t>
+        <w:t xml:space="preserve">이전 상태 복구가 필요한 경우  </w:t>
       </w:r>
       <w:r>
         <w:rPr>
@@ -7207,7 +7647,7 @@
           <w:color w:val="16324F"/>
           <w:sz w:val="21"/>
         </w:rPr>
-        <w:t>설치 도중 실패하면 Setup이 이전 프로그램·서비스·방화벽 상태를 되돌립니다. SETUP_ROLLBACK_FAILED가 표시되면 남은 .__staging_, .__backup_, .__failed_ 폴더를 삭제·이동·이름 변경하지 말고 표시된 단계와 오류 코드를 사내 Windows 관리자에게 전달하세요.</w:t>
+        <w:t>Setup은 남아 있는 journal을 읽기 전용으로 확인하고 SETUP_RECOVERY_REQUIRED를 표시합니다. 이때 설치/업데이트는 잠겨 있으며 복구가 자동으로 시작되지 않습니다. '이전 상태 복구'를 직접 실행하고, 성공한 경우에만 결과를 확인한 뒤 설치/업데이트를 별도로 시작하세요. 실패하면 '진단정보 복사'로 최초 실패 코드와 ROLLBACK_* 단계를 전달합니다. .__staging_, .__backup_, .__failed_ 폴더와 journal은 원인 확인 증거이므로 삭제·이동·이름 변경하지 마세요.</w:t>
       </w:r>
     </w:p>
     <w:p>
@@ -7875,7 +8315,7 @@
         <w:color w:val="64748B"/>
         <w:sz w:val="17"/>
       </w:rPr>
-      <w:t xml:space="preserve">v0.10.6-poc  |  </w:t>
+      <w:t xml:space="preserve">v0.10.7-poc  |  </w:t>
     </w:r>
     <w:r>
       <w:rPr>
@@ -7906,7 +8346,7 @@
         <w:color w:val="64748B"/>
         <w:sz w:val="17"/>
       </w:rPr>
-      <w:t>v0.10.6-poc  |  2026-07-29</w:t>
+      <w:t>v0.10.7-poc  |  2026-07-29</w:t>
     </w:r>
   </w:p>
 </w:ftr>

</xml_diff>

<commit_message>
feat: add sanitized field diagnostics
</commit_message>
<xml_diff>
--- a/docs/SamsungSwitchWatch_User_Manual_KO.docx
+++ b/docs/SamsungSwitchWatch_User_Manual_KO.docx
@@ -533,7 +533,7 @@
         <w:rPr>
           <w:rFonts w:ascii="맑은 고딕" w:hAnsi="맑은 고딕" w:eastAsia="맑은 고딕" w:cs="맑은 고딕"/>
         </w:rPr>
-        <w:t>원격 Viewer의 고정 IPv4를 입력하고 자동 검색된 관리망을 선택합니다. 동일 PC 사전 테스트라면 '이 PC 주소 넣기'로 실제 사설 IPv4를 사용합니다.</w:t>
+        <w:t>Agent PC 주소가 아닌 원격 Viewer의 고정 IPv4를 입력하고 자동 검색된 관리망을 선택합니다. 같은 PC 시험이라면 '같은 PC 시험용 주소'로 실제 사설 IPv4를 사용합니다.</w:t>
       </w:r>
     </w:p>
     <w:p>
@@ -561,7 +561,7 @@
         <w:rPr>
           <w:rFonts w:ascii="맑은 고딕" w:hAnsi="맑은 고딕" w:eastAsia="맑은 고딕" w:cs="맑은 고딕"/>
         </w:rPr>
-        <w:t>Viewer가 열리면 Agent PC 주소를 입력합니다. 같은 PC에서 먼저 확인할 때만 '이 PC에서 사전 테스트'를 직접 누릅니다.</w:t>
+        <w:t>Viewer가 열리면 Agent PC 주소를 입력합니다. 같은 PC에서 먼저 확인할 때만 'Agent와 Viewer가 같은 PC일 때 테스트'를 직접 누릅니다.</w:t>
       </w:r>
     </w:p>
     <w:p>
@@ -1132,7 +1132,7 @@
           <w:color w:val="16324F"/>
           <w:sz w:val="21"/>
         </w:rPr>
-        <w:t>0.10.7-poc는 코드 서명되지 않은 시험판입니다. 압축을 풀기 전에 Agent와 Viewer ZIP의 SHA-256을 해당 GitHub Release 본문에 표시된 값과 비교하고 사내 보안 반입 절차를 완료하세요. SmartScreen 또는 EDR 경고를 우회하지 않습니다.</w:t>
+        <w:t>0.10.8-poc는 코드 서명되지 않은 시험판입니다. 압축을 풀기 전에 Agent와 Viewer ZIP의 SHA-256을 해당 GitHub Release 본문에 표시된 값과 비교하고 사내 보안 반입 절차를 완료하세요. SmartScreen 또는 EDR 경고를 우회하지 않습니다.</w:t>
       </w:r>
     </w:p>
     <w:p>
@@ -1174,7 +1174,7 @@
         <w:rPr>
           <w:rFonts w:ascii="맑은 고딕" w:hAnsi="맑은 고딕" w:eastAsia="맑은 고딕" w:cs="맑은 고딕"/>
         </w:rPr>
-        <w:t>원격 Viewer PC의 고정 IPv4를 입력합니다. 동일 PC 사전 테스트라면 '이 PC 주소 넣기'로 표시된 실제 RFC1918 사설 IPv4를 사용합니다.</w:t>
+        <w:t>'허용할 Viewer PC 고정 IPv4 · Agent PC 주소 아님'에 원격 Viewer 주소를 입력합니다. 같은 PC 시험이라면 '같은 PC 시험용 주소'로 표시된 실제 RFC1918 사설 IPv4를 사용합니다.</w:t>
       </w:r>
     </w:p>
     <w:p>
@@ -1562,6 +1562,34 @@
           <w:color w:val="2E74B5"/>
           <w:sz w:val="21"/>
         </w:rPr>
+        <w:t xml:space="preserve">성공·실패 후 익명 진단 저장  </w:t>
+      </w:r>
+      <w:r>
+        <w:rPr>
+          <w:rFonts w:ascii="맑은 고딕" w:hAnsi="맑은 고딕" w:eastAsia="맑은 고딕" w:cs="맑은 고딕"/>
+          <w:color w:val="16324F"/>
+          <w:sz w:val="21"/>
+        </w:rPr>
+        <w:t>검사, 설치 또는 복구가 끝나면 '익명 진단 저장'으로 SSW_FIELD_DIAGNOSTIC/1 UTF-8 BOM TXT를 수동 저장할 수 있습니다. 자동 저장하지 않으며 제품·Windows 버전, 안전한 단계·결과·오류·조치 코드와 제한된 소요 시간만 포함합니다. 실제 IP/CIDR, PC·사용자명, 계정, 인증서 정보, 절대 경로, 방화벽·예외 원문, 명령과 장비 출력은 포함하지 않습니다. 저장 실패는 DIAGNOSTIC_WRITE_FAILED로 표시됩니다.</w:t>
+      </w:r>
+    </w:p>
+    <w:p>
+      <w:pPr>
+        <w:keepLines/>
+        <w:spacing w:before="80" w:after="160" w:line="283" w:lineRule="auto"/>
+        <w:ind w:left="115" w:right="58"/>
+        <w:shd w:fill="E8EEF5"/>
+        <w:pBdr>
+          <w:left w:val="single" w:sz="16" w:space="8" w:color="2E74B5"/>
+        </w:pBdr>
+      </w:pPr>
+      <w:r>
+        <w:rPr>
+          <w:rFonts w:ascii="맑은 고딕" w:hAnsi="맑은 고딕" w:eastAsia="맑은 고딕" w:cs="맑은 고딕"/>
+          <w:b/>
+          <w:color w:val="2E74B5"/>
+          <w:sz w:val="21"/>
+        </w:rPr>
         <w:t xml:space="preserve">네트워크 정책 변경  </w:t>
       </w:r>
       <w:r>
@@ -1598,7 +1626,7 @@
           <w:color w:val="16324F"/>
           <w:sz w:val="21"/>
         </w:rPr>
-        <w:t>Agent Setup에 설치 실패가 표시되면 실패 단계와 Cause를 먼저 확인하세요. SETUP_FIREWALL_FAILED는 적용 직후 최대 2초 동안 재확인해도 제품 방화벽 규칙이 정확하지 않다는 뜻입니다. Setup은 실제 주소 대신 안전한 불일치 코드를 표시하고 설치 전 상태로 복구합니다. 규칙을 Any, LocalSubnet 또는 넓은 대역으로 수동 확대하지 마세요. 설치 성공 뒤 AGENT_CONNECTION_REFUSED가 보이면 Viewer에 스위치 IP나 localhost가 아니라 Agent를 설치한 PC의 실제 주소를 입력했는지 먼저 확인하세요. 동일 PC 사전 테스트도 localhost 대신 이 PC의 실제 RFC1918 사설 IPv4를 사용합니다. 그 다음 Agent Setup의 검사에서 SamsungSwitchWatchAgent 서비스와 TCP/18443을 점검합니다. AGENT_CLIENT_NOT_ALLOWED이면 현재 Viewer PC의 고정 IPv4를 Agent Setup에 다시 입력하고 설치/업데이트합니다. 서비스를 수동 등록하지 말고 0.10.7-poc Agent Setup을 사용하세요.</w:t>
+        <w:t>Agent Setup에 설치 실패가 표시되면 실패 단계와 Cause를 먼저 확인하세요. SETUP_FIREWALL_FAILED는 적용 직후 최대 2초 동안 재확인해도 제품 방화벽 규칙이 정확하지 않다는 뜻입니다. Setup은 실제 주소 대신 안전한 불일치 코드를 표시하고 설치 전 상태로 복구합니다. 규칙을 Any, LocalSubnet 또는 넓은 대역으로 수동 확대하지 마세요. 설치 성공 뒤 AGENT_CONNECTION_REFUSED가 보이면 Viewer에 스위치 IP나 localhost가 아니라 Agent를 설치한 PC의 실제 주소를 입력했는지 먼저 확인하세요. 동일 PC 사전 테스트도 localhost 대신 이 PC의 실제 RFC1918 사설 IPv4를 사용합니다. 그 다음 Agent Setup의 검사에서 SamsungSwitchWatchAgent 서비스와 TCP/18443을 점검합니다. AGENT_CLIENT_NOT_ALLOWED이면 현재 Viewer PC의 고정 IPv4를 Agent Setup에 다시 입력하고 설치/업데이트합니다. 서비스를 수동 등록하지 말고 0.10.8-poc Agent Setup을 사용하세요.</w:t>
       </w:r>
     </w:p>
     <w:p>
@@ -1645,7 +1673,7 @@
           <w:color w:val="16324F"/>
           <w:sz w:val="21"/>
         </w:rPr>
-        <w:t>이전 Viewer가 실행 중이면 새 Viewer는 같은 사용자 데이터를 동시에 쓰지 않도록 실행을 차단하고 전환 순서를 표시합니다. 기존 트레이 아이콘에서 '프로그램 종료'를 선택한 뒤 Win+R에서 shell:startup을 열어 'Samsung Switch Watch' 바로 가기를 삭제합니다. 이어 shell:programs에서도 같은 이름의 이전 시작 메뉴 바로 가기를 삭제하고 새 Viewer를 다시 실행하세요. 기존 Agent 연결과 장비 정보는 유지됩니다. 창이 바로 보이지 않으면 알림 영역에서 대시보드를 열고 실행 경로가 새 0.10.7-poc 폴더인지 확인하세요.</w:t>
+        <w:t>이전 Viewer가 실행 중이면 새 Viewer는 같은 사용자 데이터를 동시에 쓰지 않도록 실행을 차단하고 전환 순서를 표시합니다. 기존 트레이 아이콘에서 '프로그램 종료'를 선택한 뒤 Win+R에서 shell:startup을 열어 'Samsung Switch Watch' 바로 가기를 삭제합니다. 이어 shell:programs에서도 같은 이름의 이전 시작 메뉴 바로 가기를 삭제하고 새 Viewer를 다시 실행하세요. 기존 Agent 연결과 장비 정보는 유지됩니다. 창이 바로 보이지 않으면 알림 영역에서 대시보드를 열고 실행 경로가 새 0.10.8-poc 폴더인지 확인하세요.</w:t>
       </w:r>
     </w:p>
     <w:p>
@@ -1743,7 +1771,7 @@
           <w:color w:val="16324F"/>
           <w:sz w:val="21"/>
         </w:rPr>
-        <w:t>0.10.7-poc는 코드 서명되지 않아 SmartScreen이나 사내 EDR이 차단할 수 있습니다. ZIP을 완전히 압축 해제하고 Viewer EXE와 제공된 DLL이 같은 폴더에 있는지 확인하세요. EDR·AppLocker·WDAC가 차단하면 우회하지 말고 공식 ZIP의 버전·해시와 차단 기록을 보안 담당자에게 전달하세요.</w:t>
+        <w:t>0.10.8-poc는 코드 서명되지 않아 SmartScreen이나 사내 EDR이 차단할 수 있습니다. ZIP을 완전히 압축 해제하고 Viewer EXE와 제공된 DLL이 같은 폴더에 있는지 확인하세요. EDR·AppLocker·WDAC가 차단하면 우회하지 말고 공식 ZIP의 버전·해시와 차단 기록을 보안 담당자에게 전달하세요.</w:t>
       </w:r>
     </w:p>
     <w:p>
@@ -1803,7 +1831,7 @@
         <w:drawing>
           <wp:inline xmlns:a="http://schemas.openxmlformats.org/drawingml/2006/main" xmlns:pic="http://schemas.openxmlformats.org/drawingml/2006/picture">
             <wp:extent cx="2651760" cy="3635477"/>
-            <wp:docPr id="2" name="Picture 2" title="Agent 연결 창" descr="이 PC에서 사전 테스트 결과와 원격 Agent 주소 입력을 함께 보여 주는 연결 설정 창"/>
+            <wp:docPr id="2" name="Picture 2" title="Agent 연결 창" descr="같은 PC 테스트 결과, 익명 진단 저장과 원격 Agent 주소 입력을 함께 보여 주는 연결 설정 창"/>
             <wp:cNvGraphicFramePr>
               <a:graphicFrameLocks noChangeAspect="1"/>
             </wp:cNvGraphicFramePr>
@@ -1839,7 +1867,7 @@
         <w:pStyle w:val="Caption"/>
       </w:pPr>
       <w:r>
-        <w:t>그림 2. 동일 PC Agent/API 사전 테스트와 원격 연결 설정</w:t>
+        <w:t>그림 2. 같은 PC Agent/API 테스트, 익명 진단 저장과 원격 연결 설정</w:t>
       </w:r>
     </w:p>
     <w:p>
@@ -1915,7 +1943,35 @@
           <w:color w:val="16324F"/>
           <w:sz w:val="21"/>
         </w:rPr>
-        <w:t>Agent와 Viewer를 같은 PC에 설치했다면 Viewer의 '이 PC에서 사전 테스트'를 직접 누릅니다. 이 기능은 자동으로 실행되지 않으며 사설 IPv4 후보를 최대 6개, 후보당 7초, 전체 30초 안에서 확인합니다. 성공은 Agent 서비스, TCP/18443, HTTPS, Agent API와 같은 버전만 뜻합니다. 스위치 자격 증명과 명령은 사용하지 않으며, 장비는 저장 후 '장비 관리 → 접속 시험'에서 별도로 확인합니다. 실제 원격 배치 전에는 Agent Setup에 원격 Viewer 고정 IPv4를 다시 적용하고 원격 Viewer PC에서 연결 진단을 반복하세요.</w:t>
+        <w:t>Agent와 Viewer를 같은 PC에 설치했다면 Viewer의 'Agent와 Viewer가 같은 PC일 때 테스트'를 직접 누릅니다. 이 기능은 자동으로 실행되지 않으며 사설 IPv4 후보를 최대 6개, 후보당 7초, 전체 30초 안에서 확인합니다. 성공은 Agent 서비스, TCP/18443, HTTPS, Agent API와 같은 버전만 뜻합니다. 스위치 자격 증명과 명령은 사용하지 않으며, 장비는 저장 후 '장비 관리 → 접속 시험'에서 별도로 확인합니다. 실제 원격 배치 전에는 Agent Setup에 원격 Viewer 고정 IPv4를 다시 적용하고 원격 Viewer PC에서 연결 진단을 반복하세요.</w:t>
+      </w:r>
+    </w:p>
+    <w:p>
+      <w:pPr>
+        <w:keepLines/>
+        <w:spacing w:before="80" w:after="160" w:line="283" w:lineRule="auto"/>
+        <w:ind w:left="115" w:right="58"/>
+        <w:shd w:fill="E8EEF5"/>
+        <w:pBdr>
+          <w:left w:val="single" w:sz="16" w:space="8" w:color="2E74B5"/>
+        </w:pBdr>
+      </w:pPr>
+      <w:r>
+        <w:rPr>
+          <w:rFonts w:ascii="맑은 고딕" w:hAnsi="맑은 고딕" w:eastAsia="맑은 고딕" w:cs="맑은 고딕"/>
+          <w:b/>
+          <w:color w:val="2E74B5"/>
+          <w:sz w:val="21"/>
+        </w:rPr>
+        <w:t xml:space="preserve">Agent 연결 익명 진단  </w:t>
+      </w:r>
+      <w:r>
+        <w:rPr>
+          <w:rFonts w:ascii="맑은 고딕" w:hAnsi="맑은 고딕" w:eastAsia="맑은 고딕" w:cs="맑은 고딕"/>
+          <w:color w:val="16324F"/>
+          <w:sz w:val="21"/>
+        </w:rPr>
+        <w:t>일반 연결과 같은 PC 테스트가 성공 또는 실패로 끝나면 '익명 진단 저장'을 사용할 수 있습니다. 주소·DNS·TCP/18443·HTTPS·Identity 단계 상태와 제한된 소요 시간, 후보 수와 확인된 Agent/API 버전만 기록하며 입력 주소, DNS 이름, PC·사용자명, 계정, 경로, 예외 원문과 장비 명령·출력은 제외합니다. 연결 성공 뒤 창은 저장 결과를 보여 주며, 필요하면 진단을 저장한 다음 닫습니다.</w:t>
       </w:r>
     </w:p>
     <w:p>
@@ -7996,7 +8052,7 @@
                 <w:rFonts w:ascii="맑은 고딕" w:hAnsi="맑은 고딕" w:eastAsia="맑은 고딕" w:cs="맑은 고딕"/>
                 <w:sz w:val="16"/>
               </w:rPr>
-              <w:t>이 PC에서 사전 테스트는 Agent/API까지만 확인합니다. 스위치와 원격 Viewer 경로는 별도 확인합니다.</w:t>
+              <w:t>Agent와 Viewer가 같은 PC일 때 테스트는 Agent/API까지만 확인합니다. 스위치와 원격 Viewer 경로는 별도 확인합니다.</w:t>
             </w:r>
           </w:p>
         </w:tc>
@@ -8032,7 +8088,7 @@
           <w:color w:val="16324F"/>
           <w:sz w:val="21"/>
         </w:rPr>
-        <w:t>진단 JSON에는 원문이 없어야 합니다. 실제 회사 IP, 계정명, 비밀번호, 장비 출력이 보이면 공유하지 마세요.</w:t>
+        <w:t>익명 진단 TXT에는 원문이 없어야 합니다. 실제 회사 IP, 계정명, 비밀번호, 장비 출력이 보이면 공유하지 마세요.</w:t>
       </w:r>
     </w:p>
     <w:p>
@@ -8315,7 +8371,7 @@
         <w:color w:val="64748B"/>
         <w:sz w:val="17"/>
       </w:rPr>
-      <w:t xml:space="preserve">v0.10.7-poc  |  </w:t>
+      <w:t xml:space="preserve">v0.10.8-poc  |  </w:t>
     </w:r>
     <w:r>
       <w:rPr>
@@ -8346,7 +8402,7 @@
         <w:color w:val="64748B"/>
         <w:sz w:val="17"/>
       </w:rPr>
-      <w:t>v0.10.7-poc  |  2026-07-29</w:t>
+      <w:t>v0.10.8-poc  |  2026-07-29</w:t>
     </w:r>
   </w:p>
 </w:ftr>

</xml_diff>

<commit_message>
feat: add sanitized field diagnostics (#44)
Validated by Windows CI, downloaded artifact hash verification, 820 tests, and mock/demo WPF inspection.
</commit_message>
<xml_diff>
--- a/docs/SamsungSwitchWatch_User_Manual_KO.docx
+++ b/docs/SamsungSwitchWatch_User_Manual_KO.docx
@@ -533,7 +533,7 @@
         <w:rPr>
           <w:rFonts w:ascii="맑은 고딕" w:hAnsi="맑은 고딕" w:eastAsia="맑은 고딕" w:cs="맑은 고딕"/>
         </w:rPr>
-        <w:t>원격 Viewer의 고정 IPv4를 입력하고 자동 검색된 관리망을 선택합니다. 동일 PC 사전 테스트라면 '이 PC 주소 넣기'로 실제 사설 IPv4를 사용합니다.</w:t>
+        <w:t>Agent PC 주소가 아닌 원격 Viewer의 고정 IPv4를 입력하고 자동 검색된 관리망을 선택합니다. 같은 PC 시험이라면 '같은 PC 시험용 주소'로 실제 사설 IPv4를 사용합니다.</w:t>
       </w:r>
     </w:p>
     <w:p>
@@ -561,7 +561,7 @@
         <w:rPr>
           <w:rFonts w:ascii="맑은 고딕" w:hAnsi="맑은 고딕" w:eastAsia="맑은 고딕" w:cs="맑은 고딕"/>
         </w:rPr>
-        <w:t>Viewer가 열리면 Agent PC 주소를 입력합니다. 같은 PC에서 먼저 확인할 때만 '이 PC에서 사전 테스트'를 직접 누릅니다.</w:t>
+        <w:t>Viewer가 열리면 Agent PC 주소를 입력합니다. 같은 PC에서 먼저 확인할 때만 'Agent와 Viewer가 같은 PC일 때 테스트'를 직접 누릅니다.</w:t>
       </w:r>
     </w:p>
     <w:p>
@@ -1132,7 +1132,7 @@
           <w:color w:val="16324F"/>
           <w:sz w:val="21"/>
         </w:rPr>
-        <w:t>0.10.7-poc는 코드 서명되지 않은 시험판입니다. 압축을 풀기 전에 Agent와 Viewer ZIP의 SHA-256을 해당 GitHub Release 본문에 표시된 값과 비교하고 사내 보안 반입 절차를 완료하세요. SmartScreen 또는 EDR 경고를 우회하지 않습니다.</w:t>
+        <w:t>0.10.8-poc는 코드 서명되지 않은 시험판입니다. 압축을 풀기 전에 Agent와 Viewer ZIP의 SHA-256을 해당 GitHub Release 본문에 표시된 값과 비교하고 사내 보안 반입 절차를 완료하세요. SmartScreen 또는 EDR 경고를 우회하지 않습니다.</w:t>
       </w:r>
     </w:p>
     <w:p>
@@ -1174,7 +1174,7 @@
         <w:rPr>
           <w:rFonts w:ascii="맑은 고딕" w:hAnsi="맑은 고딕" w:eastAsia="맑은 고딕" w:cs="맑은 고딕"/>
         </w:rPr>
-        <w:t>원격 Viewer PC의 고정 IPv4를 입력합니다. 동일 PC 사전 테스트라면 '이 PC 주소 넣기'로 표시된 실제 RFC1918 사설 IPv4를 사용합니다.</w:t>
+        <w:t>'허용할 Viewer PC 고정 IPv4 · Agent PC 주소 아님'에 원격 Viewer 주소를 입력합니다. 같은 PC 시험이라면 '같은 PC 시험용 주소'로 표시된 실제 RFC1918 사설 IPv4를 사용합니다.</w:t>
       </w:r>
     </w:p>
     <w:p>
@@ -1562,6 +1562,34 @@
           <w:color w:val="2E74B5"/>
           <w:sz w:val="21"/>
         </w:rPr>
+        <w:t xml:space="preserve">성공·실패 후 익명 진단 저장  </w:t>
+      </w:r>
+      <w:r>
+        <w:rPr>
+          <w:rFonts w:ascii="맑은 고딕" w:hAnsi="맑은 고딕" w:eastAsia="맑은 고딕" w:cs="맑은 고딕"/>
+          <w:color w:val="16324F"/>
+          <w:sz w:val="21"/>
+        </w:rPr>
+        <w:t>검사, 설치 또는 복구가 끝나면 '익명 진단 저장'으로 SSW_FIELD_DIAGNOSTIC/1 UTF-8 BOM TXT를 수동 저장할 수 있습니다. 자동 저장하지 않으며 제품·Windows 버전, 안전한 단계·결과·오류·조치 코드와 제한된 소요 시간만 포함합니다. 실제 IP/CIDR, PC·사용자명, 계정, 인증서 정보, 절대 경로, 방화벽·예외 원문, 명령과 장비 출력은 포함하지 않습니다. 저장 실패는 DIAGNOSTIC_WRITE_FAILED로 표시됩니다.</w:t>
+      </w:r>
+    </w:p>
+    <w:p>
+      <w:pPr>
+        <w:keepLines/>
+        <w:spacing w:before="80" w:after="160" w:line="283" w:lineRule="auto"/>
+        <w:ind w:left="115" w:right="58"/>
+        <w:shd w:fill="E8EEF5"/>
+        <w:pBdr>
+          <w:left w:val="single" w:sz="16" w:space="8" w:color="2E74B5"/>
+        </w:pBdr>
+      </w:pPr>
+      <w:r>
+        <w:rPr>
+          <w:rFonts w:ascii="맑은 고딕" w:hAnsi="맑은 고딕" w:eastAsia="맑은 고딕" w:cs="맑은 고딕"/>
+          <w:b/>
+          <w:color w:val="2E74B5"/>
+          <w:sz w:val="21"/>
+        </w:rPr>
         <w:t xml:space="preserve">네트워크 정책 변경  </w:t>
       </w:r>
       <w:r>
@@ -1598,7 +1626,7 @@
           <w:color w:val="16324F"/>
           <w:sz w:val="21"/>
         </w:rPr>
-        <w:t>Agent Setup에 설치 실패가 표시되면 실패 단계와 Cause를 먼저 확인하세요. SETUP_FIREWALL_FAILED는 적용 직후 최대 2초 동안 재확인해도 제품 방화벽 규칙이 정확하지 않다는 뜻입니다. Setup은 실제 주소 대신 안전한 불일치 코드를 표시하고 설치 전 상태로 복구합니다. 규칙을 Any, LocalSubnet 또는 넓은 대역으로 수동 확대하지 마세요. 설치 성공 뒤 AGENT_CONNECTION_REFUSED가 보이면 Viewer에 스위치 IP나 localhost가 아니라 Agent를 설치한 PC의 실제 주소를 입력했는지 먼저 확인하세요. 동일 PC 사전 테스트도 localhost 대신 이 PC의 실제 RFC1918 사설 IPv4를 사용합니다. 그 다음 Agent Setup의 검사에서 SamsungSwitchWatchAgent 서비스와 TCP/18443을 점검합니다. AGENT_CLIENT_NOT_ALLOWED이면 현재 Viewer PC의 고정 IPv4를 Agent Setup에 다시 입력하고 설치/업데이트합니다. 서비스를 수동 등록하지 말고 0.10.7-poc Agent Setup을 사용하세요.</w:t>
+        <w:t>Agent Setup에 설치 실패가 표시되면 실패 단계와 Cause를 먼저 확인하세요. SETUP_FIREWALL_FAILED는 적용 직후 최대 2초 동안 재확인해도 제품 방화벽 규칙이 정확하지 않다는 뜻입니다. Setup은 실제 주소 대신 안전한 불일치 코드를 표시하고 설치 전 상태로 복구합니다. 규칙을 Any, LocalSubnet 또는 넓은 대역으로 수동 확대하지 마세요. 설치 성공 뒤 AGENT_CONNECTION_REFUSED가 보이면 Viewer에 스위치 IP나 localhost가 아니라 Agent를 설치한 PC의 실제 주소를 입력했는지 먼저 확인하세요. 동일 PC 사전 테스트도 localhost 대신 이 PC의 실제 RFC1918 사설 IPv4를 사용합니다. 그 다음 Agent Setup의 검사에서 SamsungSwitchWatchAgent 서비스와 TCP/18443을 점검합니다. AGENT_CLIENT_NOT_ALLOWED이면 현재 Viewer PC의 고정 IPv4를 Agent Setup에 다시 입력하고 설치/업데이트합니다. 서비스를 수동 등록하지 말고 0.10.8-poc Agent Setup을 사용하세요.</w:t>
       </w:r>
     </w:p>
     <w:p>
@@ -1645,7 +1673,7 @@
           <w:color w:val="16324F"/>
           <w:sz w:val="21"/>
         </w:rPr>
-        <w:t>이전 Viewer가 실행 중이면 새 Viewer는 같은 사용자 데이터를 동시에 쓰지 않도록 실행을 차단하고 전환 순서를 표시합니다. 기존 트레이 아이콘에서 '프로그램 종료'를 선택한 뒤 Win+R에서 shell:startup을 열어 'Samsung Switch Watch' 바로 가기를 삭제합니다. 이어 shell:programs에서도 같은 이름의 이전 시작 메뉴 바로 가기를 삭제하고 새 Viewer를 다시 실행하세요. 기존 Agent 연결과 장비 정보는 유지됩니다. 창이 바로 보이지 않으면 알림 영역에서 대시보드를 열고 실행 경로가 새 0.10.7-poc 폴더인지 확인하세요.</w:t>
+        <w:t>이전 Viewer가 실행 중이면 새 Viewer는 같은 사용자 데이터를 동시에 쓰지 않도록 실행을 차단하고 전환 순서를 표시합니다. 기존 트레이 아이콘에서 '프로그램 종료'를 선택한 뒤 Win+R에서 shell:startup을 열어 'Samsung Switch Watch' 바로 가기를 삭제합니다. 이어 shell:programs에서도 같은 이름의 이전 시작 메뉴 바로 가기를 삭제하고 새 Viewer를 다시 실행하세요. 기존 Agent 연결과 장비 정보는 유지됩니다. 창이 바로 보이지 않으면 알림 영역에서 대시보드를 열고 실행 경로가 새 0.10.8-poc 폴더인지 확인하세요.</w:t>
       </w:r>
     </w:p>
     <w:p>
@@ -1743,7 +1771,7 @@
           <w:color w:val="16324F"/>
           <w:sz w:val="21"/>
         </w:rPr>
-        <w:t>0.10.7-poc는 코드 서명되지 않아 SmartScreen이나 사내 EDR이 차단할 수 있습니다. ZIP을 완전히 압축 해제하고 Viewer EXE와 제공된 DLL이 같은 폴더에 있는지 확인하세요. EDR·AppLocker·WDAC가 차단하면 우회하지 말고 공식 ZIP의 버전·해시와 차단 기록을 보안 담당자에게 전달하세요.</w:t>
+        <w:t>0.10.8-poc는 코드 서명되지 않아 SmartScreen이나 사내 EDR이 차단할 수 있습니다. ZIP을 완전히 압축 해제하고 Viewer EXE와 제공된 DLL이 같은 폴더에 있는지 확인하세요. EDR·AppLocker·WDAC가 차단하면 우회하지 말고 공식 ZIP의 버전·해시와 차단 기록을 보안 담당자에게 전달하세요.</w:t>
       </w:r>
     </w:p>
     <w:p>
@@ -1803,7 +1831,7 @@
         <w:drawing>
           <wp:inline xmlns:a="http://schemas.openxmlformats.org/drawingml/2006/main" xmlns:pic="http://schemas.openxmlformats.org/drawingml/2006/picture">
             <wp:extent cx="2651760" cy="3635477"/>
-            <wp:docPr id="2" name="Picture 2" title="Agent 연결 창" descr="이 PC에서 사전 테스트 결과와 원격 Agent 주소 입력을 함께 보여 주는 연결 설정 창"/>
+            <wp:docPr id="2" name="Picture 2" title="Agent 연결 창" descr="같은 PC 테스트 결과, 익명 진단 저장과 원격 Agent 주소 입력을 함께 보여 주는 연결 설정 창"/>
             <wp:cNvGraphicFramePr>
               <a:graphicFrameLocks noChangeAspect="1"/>
             </wp:cNvGraphicFramePr>
@@ -1839,7 +1867,7 @@
         <w:pStyle w:val="Caption"/>
       </w:pPr>
       <w:r>
-        <w:t>그림 2. 동일 PC Agent/API 사전 테스트와 원격 연결 설정</w:t>
+        <w:t>그림 2. 같은 PC Agent/API 테스트, 익명 진단 저장과 원격 연결 설정</w:t>
       </w:r>
     </w:p>
     <w:p>
@@ -1915,7 +1943,35 @@
           <w:color w:val="16324F"/>
           <w:sz w:val="21"/>
         </w:rPr>
-        <w:t>Agent와 Viewer를 같은 PC에 설치했다면 Viewer의 '이 PC에서 사전 테스트'를 직접 누릅니다. 이 기능은 자동으로 실행되지 않으며 사설 IPv4 후보를 최대 6개, 후보당 7초, 전체 30초 안에서 확인합니다. 성공은 Agent 서비스, TCP/18443, HTTPS, Agent API와 같은 버전만 뜻합니다. 스위치 자격 증명과 명령은 사용하지 않으며, 장비는 저장 후 '장비 관리 → 접속 시험'에서 별도로 확인합니다. 실제 원격 배치 전에는 Agent Setup에 원격 Viewer 고정 IPv4를 다시 적용하고 원격 Viewer PC에서 연결 진단을 반복하세요.</w:t>
+        <w:t>Agent와 Viewer를 같은 PC에 설치했다면 Viewer의 'Agent와 Viewer가 같은 PC일 때 테스트'를 직접 누릅니다. 이 기능은 자동으로 실행되지 않으며 사설 IPv4 후보를 최대 6개, 후보당 7초, 전체 30초 안에서 확인합니다. 성공은 Agent 서비스, TCP/18443, HTTPS, Agent API와 같은 버전만 뜻합니다. 스위치 자격 증명과 명령은 사용하지 않으며, 장비는 저장 후 '장비 관리 → 접속 시험'에서 별도로 확인합니다. 실제 원격 배치 전에는 Agent Setup에 원격 Viewer 고정 IPv4를 다시 적용하고 원격 Viewer PC에서 연결 진단을 반복하세요.</w:t>
+      </w:r>
+    </w:p>
+    <w:p>
+      <w:pPr>
+        <w:keepLines/>
+        <w:spacing w:before="80" w:after="160" w:line="283" w:lineRule="auto"/>
+        <w:ind w:left="115" w:right="58"/>
+        <w:shd w:fill="E8EEF5"/>
+        <w:pBdr>
+          <w:left w:val="single" w:sz="16" w:space="8" w:color="2E74B5"/>
+        </w:pBdr>
+      </w:pPr>
+      <w:r>
+        <w:rPr>
+          <w:rFonts w:ascii="맑은 고딕" w:hAnsi="맑은 고딕" w:eastAsia="맑은 고딕" w:cs="맑은 고딕"/>
+          <w:b/>
+          <w:color w:val="2E74B5"/>
+          <w:sz w:val="21"/>
+        </w:rPr>
+        <w:t xml:space="preserve">Agent 연결 익명 진단  </w:t>
+      </w:r>
+      <w:r>
+        <w:rPr>
+          <w:rFonts w:ascii="맑은 고딕" w:hAnsi="맑은 고딕" w:eastAsia="맑은 고딕" w:cs="맑은 고딕"/>
+          <w:color w:val="16324F"/>
+          <w:sz w:val="21"/>
+        </w:rPr>
+        <w:t>일반 연결과 같은 PC 테스트가 성공 또는 실패로 끝나면 '익명 진단 저장'을 사용할 수 있습니다. 주소·DNS·TCP/18443·HTTPS·Identity 단계 상태와 제한된 소요 시간, 후보 수와 확인된 Agent/API 버전만 기록하며 입력 주소, DNS 이름, PC·사용자명, 계정, 경로, 예외 원문과 장비 명령·출력은 제외합니다. 연결 성공 뒤 창은 저장 결과를 보여 주며, 필요하면 진단을 저장한 다음 닫습니다.</w:t>
       </w:r>
     </w:p>
     <w:p>
@@ -7996,7 +8052,7 @@
                 <w:rFonts w:ascii="맑은 고딕" w:hAnsi="맑은 고딕" w:eastAsia="맑은 고딕" w:cs="맑은 고딕"/>
                 <w:sz w:val="16"/>
               </w:rPr>
-              <w:t>이 PC에서 사전 테스트는 Agent/API까지만 확인합니다. 스위치와 원격 Viewer 경로는 별도 확인합니다.</w:t>
+              <w:t>Agent와 Viewer가 같은 PC일 때 테스트는 Agent/API까지만 확인합니다. 스위치와 원격 Viewer 경로는 별도 확인합니다.</w:t>
             </w:r>
           </w:p>
         </w:tc>
@@ -8032,7 +8088,7 @@
           <w:color w:val="16324F"/>
           <w:sz w:val="21"/>
         </w:rPr>
-        <w:t>진단 JSON에는 원문이 없어야 합니다. 실제 회사 IP, 계정명, 비밀번호, 장비 출력이 보이면 공유하지 마세요.</w:t>
+        <w:t>익명 진단 TXT에는 원문이 없어야 합니다. 실제 회사 IP, 계정명, 비밀번호, 장비 출력이 보이면 공유하지 마세요.</w:t>
       </w:r>
     </w:p>
     <w:p>
@@ -8315,7 +8371,7 @@
         <w:color w:val="64748B"/>
         <w:sz w:val="17"/>
       </w:rPr>
-      <w:t xml:space="preserve">v0.10.7-poc  |  </w:t>
+      <w:t xml:space="preserve">v0.10.8-poc  |  </w:t>
     </w:r>
     <w:r>
       <w:rPr>
@@ -8346,7 +8402,7 @@
         <w:color w:val="64748B"/>
         <w:sz w:val="17"/>
       </w:rPr>
-      <w:t>v0.10.7-poc  |  2026-07-29</w:t>
+      <w:t>v0.10.8-poc  |  2026-07-29</w:t>
     </w:r>
   </w:p>
 </w:ftr>

</xml_diff>

<commit_message>
fix(agent-setup): harden recovery evidence cleanup
</commit_message>
<xml_diff>
--- a/docs/SamsungSwitchWatch_User_Manual_KO.docx
+++ b/docs/SamsungSwitchWatch_User_Manual_KO.docx
@@ -167,6 +167,7 @@
       <w:tr>
         <w:trPr>
           <w:tblHeader w:val="true"/>
+          <w:cantSplit w:val="true"/>
         </w:trPr>
         <w:tc>
           <w:tcPr>
@@ -254,6 +255,9 @@
         </w:tc>
       </w:tr>
       <w:tr>
+        <w:trPr>
+          <w:cantSplit w:val="true"/>
+        </w:trPr>
         <w:tc>
           <w:tcPr>
             <w:tcW w:type="dxa" w:w="1600"/>
@@ -331,6 +335,9 @@
         </w:tc>
       </w:tr>
       <w:tr>
+        <w:trPr>
+          <w:cantSplit w:val="true"/>
+        </w:trPr>
         <w:tc>
           <w:tcPr>
             <w:tcW w:type="dxa" w:w="1600"/>
@@ -411,6 +418,9 @@
         </w:tc>
       </w:tr>
       <w:tr>
+        <w:trPr>
+          <w:cantSplit w:val="true"/>
+        </w:trPr>
         <w:tc>
           <w:tcPr>
             <w:tcW w:type="dxa" w:w="1600"/>
@@ -728,6 +738,7 @@
       <w:tr>
         <w:trPr>
           <w:tblHeader w:val="true"/>
+          <w:cantSplit w:val="true"/>
         </w:trPr>
         <w:tc>
           <w:tcPr>
@@ -815,6 +826,9 @@
         </w:tc>
       </w:tr>
       <w:tr>
+        <w:trPr>
+          <w:cantSplit w:val="true"/>
+        </w:trPr>
         <w:tc>
           <w:tcPr>
             <w:tcW w:type="dxa" w:w="1900"/>
@@ -892,6 +906,9 @@
         </w:tc>
       </w:tr>
       <w:tr>
+        <w:trPr>
+          <w:cantSplit w:val="true"/>
+        </w:trPr>
         <w:tc>
           <w:tcPr>
             <w:tcW w:type="dxa" w:w="1900"/>
@@ -1132,7 +1149,7 @@
           <w:color w:val="16324F"/>
           <w:sz w:val="21"/>
         </w:rPr>
-        <w:t>0.10.8-poc는 코드 서명되지 않은 시험판입니다. 압축을 풀기 전에 Agent와 Viewer ZIP의 SHA-256을 해당 GitHub Release 본문에 표시된 값과 비교하고 사내 보안 반입 절차를 완료하세요. SmartScreen 또는 EDR 경고를 우회하지 않습니다.</w:t>
+        <w:t>0.10.9-poc는 코드 서명되지 않은 시험판입니다. 압축을 풀기 전에 Agent와 Viewer ZIP의 SHA-256을 해당 GitHub Release 본문에 표시된 값과 비교하고 사내 보안 반입 절차를 완료하세요. SmartScreen 또는 EDR 경고를 우회하지 않습니다.</w:t>
       </w:r>
     </w:p>
     <w:p>
@@ -1216,7 +1233,7 @@
         <w:rPr>
           <w:rFonts w:ascii="맑은 고딕" w:hAnsi="맑은 고딕" w:eastAsia="맑은 고딕" w:cs="맑은 고딕"/>
         </w:rPr>
-        <w:t>Setup이 중단된 이전 설치 기록을 발견하면 설치/업데이트가 잠깁니다. '이전 상태 복구'를 먼저 누르고 복구 완료를 확인합니다.</w:t>
+        <w:t>Setup이 중단된 이전 설치 기록을 발견하면 설치/업데이트가 잠깁니다. '이전 상태 복구'를 먼저 누르고 새 작업 기록 검사까지 완료됐는지 확인합니다.</w:t>
       </w:r>
     </w:p>
     <w:p>
@@ -1230,7 +1247,7 @@
         <w:rPr>
           <w:rFonts w:ascii="맑은 고딕" w:hAnsi="맑은 고딕" w:eastAsia="맑은 고딕" w:cs="맑은 고딕"/>
         </w:rPr>
-        <w:t>복구 성공 뒤 설치는 자동으로 시작되지 않습니다. 별도로 '설치 / 업데이트'를 누른 뒤 SamsungSwitchWatchAgent 서비스가 실행 중인지 확인합니다.</w:t>
+        <w:t>정리 대상과 작업 기록이 모두 사라진 경우에만 복구 성공으로 표시됩니다. 별도로 '설치 / 업데이트'를 누른 뒤 SamsungSwitchWatchAgent 서비스가 실행 중인지 확인합니다.</w:t>
       </w:r>
     </w:p>
     <w:p>
@@ -1242,7 +1259,7 @@
       <w:r>
         <w:drawing>
           <wp:inline xmlns:a="http://schemas.openxmlformats.org/drawingml/2006/main" xmlns:pic="http://schemas.openxmlformats.org/drawingml/2006/picture">
-            <wp:extent cx="4114800" cy="4439652"/>
+            <wp:extent cx="4114800" cy="4872789"/>
             <wp:docPr id="1" name="Picture 1" title="Agent Setup 화면" descr="중단된 이전 설치 기록을 감지하여 이전 상태 복구 버튼만 활성화하고 설치 업데이트 버튼은 비활성화한 Agent Setup 화면"/>
             <wp:cNvGraphicFramePr>
               <a:graphicFrameLocks noChangeAspect="1"/>
@@ -1263,7 +1280,7 @@
                   <pic:spPr>
                     <a:xfrm>
                       <a:off x="0" y="0"/>
-                      <a:ext cx="4114800" cy="4439652"/>
+                      <a:ext cx="4114800" cy="4872789"/>
                     </a:xfrm>
                     <a:prstGeom prst="rect"/>
                   </pic:spPr>
@@ -1307,7 +1324,84 @@
           <w:color w:val="16324F"/>
           <w:sz w:val="21"/>
         </w:rPr>
-        <w:t>Setup은 시작할 때 이전 작업의 journal을 읽기 전용으로 확인합니다. 안전하게 복구할 수 있는 기록이면 '이전 상태 복구'만 활성화하고 설치/업데이트는 비활성화합니다. 이 확인만으로 파일·서비스·방화벽을 변경하거나 복구를 자동 실행하지 않습니다. 복구 성공 뒤에도 설치는 자동으로 이어지지 않으므로 운영자가 결과를 확인한 뒤 설치/업데이트를 별도로 시작합니다.</w:t>
+        <w:t>Setup은 시작할 때 이전 작업의 journal을 읽기 전용으로 확인합니다. 안전하게 복구할 수 있는 기록이면 '이전 상태 복구'만 활성화하고 설치/업데이트는 비활성화합니다. 이 확인만으로 파일·서비스·방화벽을 변경하거나 복구를 자동 실행하지 않습니다. 검증된 정리 대상이 실제로 사라지고 새 journal 검사에서도 미완료 작업이 없어야만 복구 성공과 설치 버튼 활성화를 표시합니다. 설치는 자동으로 이어지지 않으므로 운영자가 별도로 시작합니다.</w:t>
+      </w:r>
+    </w:p>
+    <w:p>
+      <w:pPr>
+        <w:keepNext/>
+        <w:spacing w:before="80" w:after="0"/>
+        <w:jc w:val="center"/>
+      </w:pPr>
+      <w:r>
+        <w:drawing>
+          <wp:inline xmlns:a="http://schemas.openxmlformats.org/drawingml/2006/main" xmlns:pic="http://schemas.openxmlformats.org/drawingml/2006/picture">
+            <wp:extent cx="4114800" cy="4872789"/>
+            <wp:docPr id="2" name="Picture 2" title="Agent Setup 복구 실패 화면" descr="복구 자료 정리가 끝나지 않아 설치를 계속 잠그고 작업 기록 보존, 복구 재시도와 익명 진단 저장을 안내하는 Agent Setup 화면"/>
+            <wp:cNvGraphicFramePr>
+              <a:graphicFrameLocks noChangeAspect="1"/>
+            </wp:cNvGraphicFramePr>
+            <a:graphic>
+              <a:graphicData uri="http://schemas.openxmlformats.org/drawingml/2006/picture">
+                <pic:pic>
+                  <pic:nvPicPr>
+                    <pic:cNvPr id="0" name="00-agent-setup-recovery-failed.png"/>
+                    <pic:cNvPicPr/>
+                  </pic:nvPicPr>
+                  <pic:blipFill>
+                    <a:blip r:embed="rId14"/>
+                    <a:stretch>
+                      <a:fillRect/>
+                    </a:stretch>
+                  </pic:blipFill>
+                  <pic:spPr>
+                    <a:xfrm>
+                      <a:off x="0" y="0"/>
+                      <a:ext cx="4114800" cy="4872789"/>
+                    </a:xfrm>
+                    <a:prstGeom prst="rect"/>
+                  </pic:spPr>
+                </pic:pic>
+              </a:graphicData>
+            </a:graphic>
+          </wp:inline>
+        </w:drawing>
+      </w:r>
+    </w:p>
+    <w:p>
+      <w:pPr>
+        <w:pStyle w:val="Caption"/>
+      </w:pPr>
+      <w:r>
+        <w:t>그림 2. 복구 자료 정리 실패와 설치 차단 화면</w:t>
+      </w:r>
+    </w:p>
+    <w:p>
+      <w:pPr>
+        <w:keepLines/>
+        <w:spacing w:before="80" w:after="160" w:line="283" w:lineRule="auto"/>
+        <w:ind w:left="115" w:right="58"/>
+        <w:shd w:fill="FEF2F2"/>
+        <w:pBdr>
+          <w:left w:val="single" w:sz="16" w:space="8" w:color="B42318"/>
+        </w:pBdr>
+      </w:pPr>
+      <w:r>
+        <w:rPr>
+          <w:rFonts w:ascii="맑은 고딕" w:hAnsi="맑은 고딕" w:eastAsia="맑은 고딕" w:cs="맑은 고딕"/>
+          <w:b/>
+          <w:color w:val="B42318"/>
+          <w:sz w:val="21"/>
+        </w:rPr>
+        <w:t xml:space="preserve">복구 자료 정리가 끝나지 않은 경우  </w:t>
+      </w:r>
+      <w:r>
+        <w:rPr>
+          <w:rFonts w:ascii="맑은 고딕" w:hAnsi="맑은 고딕" w:eastAsia="맑은 고딕" w:cs="맑은 고딕"/>
+          <w:color w:val="16324F"/>
+          <w:sz w:val="21"/>
+        </w:rPr>
+        <w:t>화면 상단에 SETUP_ROLLBACK_FAILED가 표시되고 복구 자료 정리 분류 아래 ROLLBACK_JOURNAL_CLEANUP_FAILED 같은 대상별 코드가 표시되면, staging·backup·failed·journal 중 검증된 정리 대상을 최대 3회 시도하고 실패한 시도 사이 250ms 대기한 뒤에도 남아 있다는 뜻입니다. 설치 버튼은 계속 잠기며 화면에서 '복구 다시 시도'를 사용할 수 있습니다. 반복되면 '익명 진단 저장'을 사용하고, 폴더나 journal을 수동으로 삭제하지 마세요.</w:t>
       </w:r>
     </w:p>
     <w:p>
@@ -1514,7 +1608,7 @@
           <w:color w:val="16324F"/>
           <w:sz w:val="21"/>
         </w:rPr>
-        <w:t>Setup은 BUILD-MANIFEST.json과 Agent 실행 파일 SHA-256을 확인하고, Program Files의 임시 staging에 복사한 파일을 다시 검사한 뒤 교체합니다. 서비스·프로그램·방화벽 변경 중 현재 작업이 실패하면 설치 전 상태로 되돌리기를 시도합니다. 다음 실행에서 완료되지 않은 journal이 남아 있으면 자동 복구하지 않고 별도의 '이전 상태 복구' 작업을 요구합니다. 복구까지 실패하면 최초 설치 실패 코드를 별도로 유지하고 SETUP_ROLLBACK_FAILED와 실패한 ROLLBACK_* 단계를 함께 표시합니다.</w:t>
+        <w:t>Setup은 BUILD-MANIFEST.json과 Agent 실행 파일 SHA-256을 확인하고, Program Files의 임시 staging에 복사한 파일을 다시 검사한 뒤 교체합니다. 서비스·프로그램·방화벽 변경 중 현재 작업이 실패하면 설치 전 상태로 되돌리기를 시도합니다. 다음 실행에서 완료되지 않은 journal이 남아 있으면 자동 복구하지 않고 별도의 '이전 상태 복구' 작업을 요구합니다. staging·backup·failed·journal 정리가 잠시 실패하면 정확히 검증된 대상만 최대 3회 시도하고 실패한 시도 사이 250ms 대기한 뒤 삭제 결과를 확인합니다. 복구까지 실패하면 최초 설치 실패 코드를 별도로 유지하고 SETUP_ROLLBACK_FAILED와 실패한 ROLLBACK_* 단계를 함께 표시합니다.</w:t>
       </w:r>
     </w:p>
     <w:p>
@@ -1626,7 +1720,7 @@
           <w:color w:val="16324F"/>
           <w:sz w:val="21"/>
         </w:rPr>
-        <w:t>Agent Setup에 설치 실패가 표시되면 실패 단계와 Cause를 먼저 확인하세요. SETUP_FIREWALL_FAILED는 적용 직후 최대 2초 동안 재확인해도 제품 방화벽 규칙이 정확하지 않다는 뜻입니다. Setup은 실제 주소 대신 안전한 불일치 코드를 표시하고 설치 전 상태로 복구합니다. 규칙을 Any, LocalSubnet 또는 넓은 대역으로 수동 확대하지 마세요. 설치 성공 뒤 AGENT_CONNECTION_REFUSED가 보이면 Viewer에 스위치 IP나 localhost가 아니라 Agent를 설치한 PC의 실제 주소를 입력했는지 먼저 확인하세요. 동일 PC 사전 테스트도 localhost 대신 이 PC의 실제 RFC1918 사설 IPv4를 사용합니다. 그 다음 Agent Setup의 검사에서 SamsungSwitchWatchAgent 서비스와 TCP/18443을 점검합니다. AGENT_CLIENT_NOT_ALLOWED이면 현재 Viewer PC의 고정 IPv4를 Agent Setup에 다시 입력하고 설치/업데이트합니다. 서비스를 수동 등록하지 말고 0.10.8-poc Agent Setup을 사용하세요.</w:t>
+        <w:t>Agent Setup에 설치 실패가 표시되면 실패 단계와 Cause를 먼저 확인하세요. SETUP_FIREWALL_FAILED는 적용 직후 최대 2초 동안 재확인해도 제품 방화벽 규칙이 정확하지 않다는 뜻입니다. Setup은 실제 주소 대신 안전한 불일치 코드를 표시하고 설치 전 상태로 복구합니다. 규칙을 Any, LocalSubnet 또는 넓은 대역으로 수동 확대하지 마세요. 설치 성공 뒤 AGENT_CONNECTION_REFUSED가 보이면 Viewer에 스위치 IP나 localhost가 아니라 Agent를 설치한 PC의 실제 주소를 입력했는지 먼저 확인하세요. 동일 PC 사전 테스트도 localhost 대신 이 PC의 실제 RFC1918 사설 IPv4를 사용합니다. 그 다음 Agent Setup의 검사에서 SamsungSwitchWatchAgent 서비스와 TCP/18443을 점검합니다. AGENT_CLIENT_NOT_ALLOWED이면 현재 Viewer PC의 고정 IPv4를 Agent Setup에 다시 입력하고 설치/업데이트합니다. 서비스를 수동 등록하지 말고 0.10.9-poc Agent Setup을 사용하세요.</w:t>
       </w:r>
     </w:p>
     <w:p>
@@ -1673,7 +1767,7 @@
           <w:color w:val="16324F"/>
           <w:sz w:val="21"/>
         </w:rPr>
-        <w:t>이전 Viewer가 실행 중이면 새 Viewer는 같은 사용자 데이터를 동시에 쓰지 않도록 실행을 차단하고 전환 순서를 표시합니다. 기존 트레이 아이콘에서 '프로그램 종료'를 선택한 뒤 Win+R에서 shell:startup을 열어 'Samsung Switch Watch' 바로 가기를 삭제합니다. 이어 shell:programs에서도 같은 이름의 이전 시작 메뉴 바로 가기를 삭제하고 새 Viewer를 다시 실행하세요. 기존 Agent 연결과 장비 정보는 유지됩니다. 창이 바로 보이지 않으면 알림 영역에서 대시보드를 열고 실행 경로가 새 0.10.8-poc 폴더인지 확인하세요.</w:t>
+        <w:t>이전 Viewer가 실행 중이면 새 Viewer는 같은 사용자 데이터를 동시에 쓰지 않도록 실행을 차단하고 전환 순서를 표시합니다. 기존 트레이 아이콘에서 '프로그램 종료'를 선택한 뒤 Win+R에서 shell:startup을 열어 'Samsung Switch Watch' 바로 가기를 삭제합니다. 이어 shell:programs에서도 같은 이름의 이전 시작 메뉴 바로 가기를 삭제하고 새 Viewer를 다시 실행하세요. 기존 Agent 연결과 장비 정보는 유지됩니다. 창이 바로 보이지 않으면 알림 영역에서 대시보드를 열고 실행 경로가 새 0.10.9-poc 폴더인지 확인하세요.</w:t>
       </w:r>
     </w:p>
     <w:p>
@@ -1771,7 +1865,7 @@
           <w:color w:val="16324F"/>
           <w:sz w:val="21"/>
         </w:rPr>
-        <w:t>0.10.8-poc는 코드 서명되지 않아 SmartScreen이나 사내 EDR이 차단할 수 있습니다. ZIP을 완전히 압축 해제하고 Viewer EXE와 제공된 DLL이 같은 폴더에 있는지 확인하세요. EDR·AppLocker·WDAC가 차단하면 우회하지 말고 공식 ZIP의 버전·해시와 차단 기록을 보안 담당자에게 전달하세요.</w:t>
+        <w:t>0.10.9-poc는 코드 서명되지 않아 SmartScreen이나 사내 EDR이 차단할 수 있습니다. ZIP을 완전히 압축 해제하고 Viewer EXE와 제공된 DLL이 같은 폴더에 있는지 확인하세요. EDR·AppLocker·WDAC가 차단하면 우회하지 말고 공식 ZIP의 버전·해시와 차단 기록을 보안 담당자에게 전달하세요.</w:t>
       </w:r>
     </w:p>
     <w:p>
@@ -1831,7 +1925,7 @@
         <w:drawing>
           <wp:inline xmlns:a="http://schemas.openxmlformats.org/drawingml/2006/main" xmlns:pic="http://schemas.openxmlformats.org/drawingml/2006/picture">
             <wp:extent cx="2651760" cy="3635477"/>
-            <wp:docPr id="2" name="Picture 2" title="Agent 연결 창" descr="같은 PC 테스트 결과, 익명 진단 저장과 원격 Agent 주소 입력을 함께 보여 주는 연결 설정 창"/>
+            <wp:docPr id="3" name="Picture 3" title="Agent 연결 창" descr="같은 PC 테스트 결과, 익명 진단 저장과 원격 Agent 주소 입력을 함께 보여 주는 연결 설정 창"/>
             <wp:cNvGraphicFramePr>
               <a:graphicFrameLocks noChangeAspect="1"/>
             </wp:cNvGraphicFramePr>
@@ -1843,7 +1937,7 @@
                     <pic:cNvPicPr/>
                   </pic:nvPicPr>
                   <pic:blipFill>
-                    <a:blip r:embed="rId14"/>
+                    <a:blip r:embed="rId15"/>
                     <a:stretch>
                       <a:fillRect/>
                     </a:stretch>
@@ -1867,7 +1961,7 @@
         <w:pStyle w:val="Caption"/>
       </w:pPr>
       <w:r>
-        <w:t>그림 2. 같은 PC Agent/API 테스트, 익명 진단 저장과 원격 연결 설정</w:t>
+        <w:t>그림 3. 같은 PC Agent/API 테스트, 익명 진단 저장과 원격 연결 설정</w:t>
       </w:r>
     </w:p>
     <w:p>
@@ -2003,7 +2097,7 @@
         <w:drawing>
           <wp:inline xmlns:a="http://schemas.openxmlformats.org/drawingml/2006/main" xmlns:pic="http://schemas.openxmlformats.org/drawingml/2006/picture">
             <wp:extent cx="5029200" cy="3540967"/>
-            <wp:docPr id="3" name="Picture 3" title="장비 관리 창" descr="장비명, 모델, IPv4, 계정 ID, 로그인 비밀번호, enable 비밀번호와 감시 설정을 입력하는 창"/>
+            <wp:docPr id="4" name="Picture 4" title="장비 관리 창" descr="장비명, 모델, IPv4, 계정 ID, 로그인 비밀번호, enable 비밀번호와 감시 설정을 입력하는 창"/>
             <wp:cNvGraphicFramePr>
               <a:graphicFrameLocks noChangeAspect="1"/>
             </wp:cNvGraphicFramePr>
@@ -2015,7 +2109,7 @@
                     <pic:cNvPicPr/>
                   </pic:nvPicPr>
                   <pic:blipFill>
-                    <a:blip r:embed="rId15"/>
+                    <a:blip r:embed="rId16"/>
                     <a:stretch>
                       <a:fillRect/>
                     </a:stretch>
@@ -2039,7 +2133,7 @@
         <w:pStyle w:val="Caption"/>
       </w:pPr>
       <w:r>
-        <w:t>그림 3. Viewer가 보관하는 장비 및 계정 입력 화면</w:t>
+        <w:t>그림 4. Viewer가 보관하는 장비 및 계정 입력 화면</w:t>
       </w:r>
     </w:p>
     <w:tbl>
@@ -2065,6 +2159,7 @@
       <w:tr>
         <w:trPr>
           <w:tblHeader w:val="true"/>
+          <w:cantSplit w:val="true"/>
         </w:trPr>
         <w:tc>
           <w:tcPr>
@@ -2152,6 +2247,9 @@
         </w:tc>
       </w:tr>
       <w:tr>
+        <w:trPr>
+          <w:cantSplit w:val="true"/>
+        </w:trPr>
         <w:tc>
           <w:tcPr>
             <w:tcW w:type="dxa" w:w="1900"/>
@@ -2229,6 +2327,9 @@
         </w:tc>
       </w:tr>
       <w:tr>
+        <w:trPr>
+          <w:cantSplit w:val="true"/>
+        </w:trPr>
         <w:tc>
           <w:tcPr>
             <w:tcW w:type="dxa" w:w="1900"/>
@@ -2309,6 +2410,9 @@
         </w:tc>
       </w:tr>
       <w:tr>
+        <w:trPr>
+          <w:cantSplit w:val="true"/>
+        </w:trPr>
         <w:tc>
           <w:tcPr>
             <w:tcW w:type="dxa" w:w="1900"/>
@@ -2386,6 +2490,9 @@
         </w:tc>
       </w:tr>
       <w:tr>
+        <w:trPr>
+          <w:cantSplit w:val="true"/>
+        </w:trPr>
         <w:tc>
           <w:tcPr>
             <w:tcW w:type="dxa" w:w="1900"/>
@@ -2466,6 +2573,9 @@
         </w:tc>
       </w:tr>
       <w:tr>
+        <w:trPr>
+          <w:cantSplit w:val="true"/>
+        </w:trPr>
         <w:tc>
           <w:tcPr>
             <w:tcW w:type="dxa" w:w="1900"/>
@@ -2543,6 +2653,9 @@
         </w:tc>
       </w:tr>
       <w:tr>
+        <w:trPr>
+          <w:cantSplit w:val="true"/>
+        </w:trPr>
         <w:tc>
           <w:tcPr>
             <w:tcW w:type="dxa" w:w="1900"/>
@@ -2623,6 +2736,9 @@
         </w:tc>
       </w:tr>
       <w:tr>
+        <w:trPr>
+          <w:cantSplit w:val="true"/>
+        </w:trPr>
         <w:tc>
           <w:tcPr>
             <w:tcW w:type="dxa" w:w="1900"/>
@@ -2774,7 +2890,7 @@
         <w:drawing>
           <wp:inline xmlns:a="http://schemas.openxmlformats.org/drawingml/2006/main" xmlns:pic="http://schemas.openxmlformats.org/drawingml/2006/picture">
             <wp:extent cx="3977639" cy="2486024"/>
-            <wp:docPr id="4" name="Picture 4" title="장비 명령 실행 화면" descr="show port status를 입력하고 데모 스위치의 익명화된 결과를 확인하는 장비 명령 탭"/>
+            <wp:docPr id="5" name="Picture 5" title="장비 명령 실행 화면" descr="show port status를 입력하고 데모 스위치의 익명화된 결과를 확인하는 장비 명령 탭"/>
             <wp:cNvGraphicFramePr>
               <a:graphicFrameLocks noChangeAspect="1"/>
             </wp:cNvGraphicFramePr>
@@ -2786,7 +2902,7 @@
                     <pic:cNvPicPr/>
                   </pic:nvPicPr>
                   <pic:blipFill>
-                    <a:blip r:embed="rId16"/>
+                    <a:blip r:embed="rId17"/>
                     <a:stretch>
                       <a:fillRect/>
                     </a:stretch>
@@ -2810,7 +2926,7 @@
         <w:pStyle w:val="Caption"/>
       </w:pPr>
       <w:r>
-        <w:t>그림 4. 한 줄 show 명령 실행과 메모리 내 결과 확인</w:t>
+        <w:t>그림 5. 한 줄 show 명령 실행과 메모리 내 결과 확인</w:t>
       </w:r>
     </w:p>
     <w:tbl>
@@ -2836,6 +2952,7 @@
       <w:tr>
         <w:trPr>
           <w:tblHeader w:val="true"/>
+          <w:cantSplit w:val="true"/>
         </w:trPr>
         <w:tc>
           <w:tcPr>
@@ -2923,6 +3040,9 @@
         </w:tc>
       </w:tr>
       <w:tr>
+        <w:trPr>
+          <w:cantSplit w:val="true"/>
+        </w:trPr>
         <w:tc>
           <w:tcPr>
             <w:tcW w:type="dxa" w:w="1300"/>
@@ -3000,6 +3120,9 @@
         </w:tc>
       </w:tr>
       <w:tr>
+        <w:trPr>
+          <w:cantSplit w:val="true"/>
+        </w:trPr>
         <w:tc>
           <w:tcPr>
             <w:tcW w:type="dxa" w:w="1300"/>
@@ -3080,6 +3203,9 @@
         </w:tc>
       </w:tr>
       <w:tr>
+        <w:trPr>
+          <w:cantSplit w:val="true"/>
+        </w:trPr>
         <w:tc>
           <w:tcPr>
             <w:tcW w:type="dxa" w:w="1300"/>
@@ -3292,6 +3418,7 @@
       <w:tr>
         <w:trPr>
           <w:tblHeader w:val="true"/>
+          <w:cantSplit w:val="true"/>
         </w:trPr>
         <w:tc>
           <w:tcPr>
@@ -3379,6 +3506,9 @@
         </w:tc>
       </w:tr>
       <w:tr>
+        <w:trPr>
+          <w:cantSplit w:val="true"/>
+        </w:trPr>
         <w:tc>
           <w:tcPr>
             <w:tcW w:type="dxa" w:w="1800"/>
@@ -3456,6 +3586,9 @@
         </w:tc>
       </w:tr>
       <w:tr>
+        <w:trPr>
+          <w:cantSplit w:val="true"/>
+        </w:trPr>
         <w:tc>
           <w:tcPr>
             <w:tcW w:type="dxa" w:w="1800"/>
@@ -3842,7 +3975,7 @@
         <w:drawing>
           <wp:inline xmlns:a="http://schemas.openxmlformats.org/drawingml/2006/main" xmlns:pic="http://schemas.openxmlformats.org/drawingml/2006/picture">
             <wp:extent cx="4754880" cy="2971800"/>
-            <wp:docPr id="5" name="Picture 5" title="Viewer 대시보드" descr="장비 목록, 선택 장비 상태, 최근 이벤트와 Viewer 감시 상태를 보여 주는 대시보드"/>
+            <wp:docPr id="6" name="Picture 6" title="Viewer 대시보드" descr="장비 목록, 선택 장비 상태, 최근 이벤트와 Viewer 감시 상태를 보여 주는 대시보드"/>
             <wp:cNvGraphicFramePr>
               <a:graphicFrameLocks noChangeAspect="1"/>
             </wp:cNvGraphicFramePr>
@@ -3854,7 +3987,7 @@
                     <pic:cNvPicPr/>
                   </pic:nvPicPr>
                   <pic:blipFill>
-                    <a:blip r:embed="rId17"/>
+                    <a:blip r:embed="rId18"/>
                     <a:stretch>
                       <a:fillRect/>
                     </a:stretch>
@@ -3878,7 +4011,7 @@
         <w:pStyle w:val="Caption"/>
       </w:pPr>
       <w:r>
-        <w:t>그림 5. Viewer 중심 대시보드 전체 화면</w:t>
+        <w:t>그림 6. Viewer 중심 대시보드 전체 화면</w:t>
       </w:r>
     </w:p>
     <w:tbl>
@@ -3903,6 +4036,7 @@
       <w:tr>
         <w:trPr>
           <w:tblHeader w:val="true"/>
+          <w:cantSplit w:val="true"/>
         </w:trPr>
         <w:tc>
           <w:tcPr>
@@ -3962,6 +4096,9 @@
         </w:tc>
       </w:tr>
       <w:tr>
+        <w:trPr>
+          <w:cantSplit w:val="true"/>
+        </w:trPr>
         <w:tc>
           <w:tcPr>
             <w:tcW w:type="dxa" w:w="1800"/>
@@ -4014,6 +4151,9 @@
         </w:tc>
       </w:tr>
       <w:tr>
+        <w:trPr>
+          <w:cantSplit w:val="true"/>
+        </w:trPr>
         <w:tc>
           <w:tcPr>
             <w:tcW w:type="dxa" w:w="1800"/>
@@ -4068,6 +4208,9 @@
         </w:tc>
       </w:tr>
       <w:tr>
+        <w:trPr>
+          <w:cantSplit w:val="true"/>
+        </w:trPr>
         <w:tc>
           <w:tcPr>
             <w:tcW w:type="dxa" w:w="1800"/>
@@ -4120,6 +4263,9 @@
         </w:tc>
       </w:tr>
       <w:tr>
+        <w:trPr>
+          <w:cantSplit w:val="true"/>
+        </w:trPr>
         <w:tc>
           <w:tcPr>
             <w:tcW w:type="dxa" w:w="1800"/>
@@ -4174,6 +4320,9 @@
         </w:tc>
       </w:tr>
       <w:tr>
+        <w:trPr>
+          <w:cantSplit w:val="true"/>
+        </w:trPr>
         <w:tc>
           <w:tcPr>
             <w:tcW w:type="dxa" w:w="1800"/>
@@ -4226,6 +4375,9 @@
         </w:tc>
       </w:tr>
       <w:tr>
+        <w:trPr>
+          <w:cantSplit w:val="true"/>
+        </w:trPr>
         <w:tc>
           <w:tcPr>
             <w:tcW w:type="dxa" w:w="1800"/>
@@ -4358,7 +4510,7 @@
         <w:drawing>
           <wp:inline xmlns:a="http://schemas.openxmlformats.org/drawingml/2006/main" xmlns:pic="http://schemas.openxmlformats.org/drawingml/2006/picture">
             <wp:extent cx="2971800" cy="1816099"/>
-            <wp:docPr id="6" name="Picture 6" title="항상 위 미니 창" descr="정상, 경고, 장애 수와 최근 문제를 보여 주는 작은 항상 위 창"/>
+            <wp:docPr id="7" name="Picture 7" title="항상 위 미니 창" descr="정상, 경고, 장애 수와 최근 문제를 보여 주는 작은 항상 위 창"/>
             <wp:cNvGraphicFramePr>
               <a:graphicFrameLocks noChangeAspect="1"/>
             </wp:cNvGraphicFramePr>
@@ -4370,7 +4522,7 @@
                     <pic:cNvPicPr/>
                   </pic:nvPicPr>
                   <pic:blipFill>
-                    <a:blip r:embed="rId18"/>
+                    <a:blip r:embed="rId19"/>
                     <a:stretch>
                       <a:fillRect/>
                     </a:stretch>
@@ -4394,7 +4546,7 @@
         <w:pStyle w:val="Caption"/>
       </w:pPr>
       <w:r>
-        <w:t>그림 6. 반복 운영용 미니 창</w:t>
+        <w:t>그림 7. 반복 운영용 미니 창</w:t>
       </w:r>
     </w:p>
     <w:p>
@@ -4407,7 +4559,7 @@
         <w:drawing>
           <wp:inline xmlns:a="http://schemas.openxmlformats.org/drawingml/2006/main" xmlns:pic="http://schemas.openxmlformats.org/drawingml/2006/picture">
             <wp:extent cx="3154680" cy="1296924"/>
-            <wp:docPr id="7" name="Picture 7" title="장애 알림 팝업" descr="데모 업링크 포트 Down 장애와 발생 시각을 보여 주는 알림 팝업"/>
+            <wp:docPr id="8" name="Picture 8" title="장애 알림 팝업" descr="데모 업링크 포트 Down 장애와 발생 시각을 보여 주는 알림 팝업"/>
             <wp:cNvGraphicFramePr>
               <a:graphicFrameLocks noChangeAspect="1"/>
             </wp:cNvGraphicFramePr>
@@ -4419,7 +4571,7 @@
                     <pic:cNvPicPr/>
                   </pic:nvPicPr>
                   <pic:blipFill>
-                    <a:blip r:embed="rId19"/>
+                    <a:blip r:embed="rId20"/>
                     <a:stretch>
                       <a:fillRect/>
                     </a:stretch>
@@ -4443,7 +4595,7 @@
         <w:pStyle w:val="Caption"/>
       </w:pPr>
       <w:r>
-        <w:t>그림 7. 새 장애 알림 팝업</w:t>
+        <w:t>그림 8. 새 장애 알림 팝업</w:t>
       </w:r>
     </w:p>
     <w:p>
@@ -4568,6 +4720,7 @@
       <w:tr>
         <w:trPr>
           <w:tblHeader w:val="true"/>
+          <w:cantSplit w:val="true"/>
         </w:trPr>
         <w:tc>
           <w:tcPr>
@@ -4655,6 +4808,9 @@
         </w:tc>
       </w:tr>
       <w:tr>
+        <w:trPr>
+          <w:cantSplit w:val="true"/>
+        </w:trPr>
         <w:tc>
           <w:tcPr>
             <w:tcW w:type="dxa" w:w="2200"/>
@@ -4734,6 +4890,9 @@
         </w:tc>
       </w:tr>
       <w:tr>
+        <w:trPr>
+          <w:cantSplit w:val="true"/>
+        </w:trPr>
         <w:tc>
           <w:tcPr>
             <w:tcW w:type="dxa" w:w="2200"/>
@@ -4814,6 +4973,9 @@
         </w:tc>
       </w:tr>
       <w:tr>
+        <w:trPr>
+          <w:cantSplit w:val="true"/>
+        </w:trPr>
         <w:tc>
           <w:tcPr>
             <w:tcW w:type="dxa" w:w="2200"/>
@@ -4891,6 +5053,9 @@
         </w:tc>
       </w:tr>
       <w:tr>
+        <w:trPr>
+          <w:cantSplit w:val="true"/>
+        </w:trPr>
         <w:tc>
           <w:tcPr>
             <w:tcW w:type="dxa" w:w="2200"/>
@@ -4971,6 +5136,9 @@
         </w:tc>
       </w:tr>
       <w:tr>
+        <w:trPr>
+          <w:cantSplit w:val="true"/>
+        </w:trPr>
         <w:tc>
           <w:tcPr>
             <w:tcW w:type="dxa" w:w="2200"/>
@@ -5048,6 +5216,9 @@
         </w:tc>
       </w:tr>
       <w:tr>
+        <w:trPr>
+          <w:cantSplit w:val="true"/>
+        </w:trPr>
         <w:tc>
           <w:tcPr>
             <w:tcW w:type="dxa" w:w="2200"/>
@@ -5130,6 +5301,9 @@
         </w:tc>
       </w:tr>
       <w:tr>
+        <w:trPr>
+          <w:cantSplit w:val="true"/>
+        </w:trPr>
         <w:tc>
           <w:tcPr>
             <w:tcW w:type="dxa" w:w="2200"/>
@@ -5207,6 +5381,9 @@
         </w:tc>
       </w:tr>
       <w:tr>
+        <w:trPr>
+          <w:cantSplit w:val="true"/>
+        </w:trPr>
         <w:tc>
           <w:tcPr>
             <w:tcW w:type="dxa" w:w="2200"/>
@@ -5409,6 +5586,7 @@
       <w:tr>
         <w:trPr>
           <w:tblHeader w:val="true"/>
+          <w:cantSplit w:val="true"/>
         </w:trPr>
         <w:tc>
           <w:tcPr>
@@ -5468,6 +5646,9 @@
         </w:tc>
       </w:tr>
       <w:tr>
+        <w:trPr>
+          <w:cantSplit w:val="true"/>
+        </w:trPr>
         <w:tc>
           <w:tcPr>
             <w:tcW w:type="dxa" w:w="4300"/>
@@ -5520,6 +5701,9 @@
         </w:tc>
       </w:tr>
       <w:tr>
+        <w:trPr>
+          <w:cantSplit w:val="true"/>
+        </w:trPr>
         <w:tc>
           <w:tcPr>
             <w:tcW w:type="dxa" w:w="4300"/>
@@ -5574,6 +5758,9 @@
         </w:tc>
       </w:tr>
       <w:tr>
+        <w:trPr>
+          <w:cantSplit w:val="true"/>
+        </w:trPr>
         <w:tc>
           <w:tcPr>
             <w:tcW w:type="dxa" w:w="4300"/>
@@ -5626,6 +5813,9 @@
         </w:tc>
       </w:tr>
       <w:tr>
+        <w:trPr>
+          <w:cantSplit w:val="true"/>
+        </w:trPr>
         <w:tc>
           <w:tcPr>
             <w:tcW w:type="dxa" w:w="4300"/>
@@ -5680,6 +5870,9 @@
         </w:tc>
       </w:tr>
       <w:tr>
+        <w:trPr>
+          <w:cantSplit w:val="true"/>
+        </w:trPr>
         <w:tc>
           <w:tcPr>
             <w:tcW w:type="dxa" w:w="4300"/>
@@ -5732,6 +5925,9 @@
         </w:tc>
       </w:tr>
       <w:tr>
+        <w:trPr>
+          <w:cantSplit w:val="true"/>
+        </w:trPr>
         <w:tc>
           <w:tcPr>
             <w:tcW w:type="dxa" w:w="4300"/>
@@ -5786,6 +5982,9 @@
         </w:tc>
       </w:tr>
       <w:tr>
+        <w:trPr>
+          <w:cantSplit w:val="true"/>
+        </w:trPr>
         <w:tc>
           <w:tcPr>
             <w:tcW w:type="dxa" w:w="4300"/>
@@ -5838,6 +6037,9 @@
         </w:tc>
       </w:tr>
       <w:tr>
+        <w:trPr>
+          <w:cantSplit w:val="true"/>
+        </w:trPr>
         <w:tc>
           <w:tcPr>
             <w:tcW w:type="dxa" w:w="4300"/>
@@ -5892,6 +6094,9 @@
         </w:tc>
       </w:tr>
       <w:tr>
+        <w:trPr>
+          <w:cantSplit w:val="true"/>
+        </w:trPr>
         <w:tc>
           <w:tcPr>
             <w:tcW w:type="dxa" w:w="4300"/>
@@ -5944,6 +6149,9 @@
         </w:tc>
       </w:tr>
       <w:tr>
+        <w:trPr>
+          <w:cantSplit w:val="true"/>
+        </w:trPr>
         <w:tc>
           <w:tcPr>
             <w:tcW w:type="dxa" w:w="4300"/>
@@ -5998,6 +6206,9 @@
         </w:tc>
       </w:tr>
       <w:tr>
+        <w:trPr>
+          <w:cantSplit w:val="true"/>
+        </w:trPr>
         <w:tc>
           <w:tcPr>
             <w:tcW w:type="dxa" w:w="4300"/>
@@ -6050,6 +6261,9 @@
         </w:tc>
       </w:tr>
       <w:tr>
+        <w:trPr>
+          <w:cantSplit w:val="true"/>
+        </w:trPr>
         <w:tc>
           <w:tcPr>
             <w:tcW w:type="dxa" w:w="4300"/>
@@ -6104,6 +6318,9 @@
         </w:tc>
       </w:tr>
       <w:tr>
+        <w:trPr>
+          <w:cantSplit w:val="true"/>
+        </w:trPr>
         <w:tc>
           <w:tcPr>
             <w:tcW w:type="dxa" w:w="4300"/>
@@ -6156,6 +6373,9 @@
         </w:tc>
       </w:tr>
       <w:tr>
+        <w:trPr>
+          <w:cantSplit w:val="true"/>
+        </w:trPr>
         <w:tc>
           <w:tcPr>
             <w:tcW w:type="dxa" w:w="4300"/>
@@ -6210,6 +6430,9 @@
         </w:tc>
       </w:tr>
       <w:tr>
+        <w:trPr>
+          <w:cantSplit w:val="true"/>
+        </w:trPr>
         <w:tc>
           <w:tcPr>
             <w:tcW w:type="dxa" w:w="4300"/>
@@ -6262,6 +6485,9 @@
         </w:tc>
       </w:tr>
       <w:tr>
+        <w:trPr>
+          <w:cantSplit w:val="true"/>
+        </w:trPr>
         <w:tc>
           <w:tcPr>
             <w:tcW w:type="dxa" w:w="4300"/>
@@ -6316,6 +6542,9 @@
         </w:tc>
       </w:tr>
       <w:tr>
+        <w:trPr>
+          <w:cantSplit w:val="true"/>
+        </w:trPr>
         <w:tc>
           <w:tcPr>
             <w:tcW w:type="dxa" w:w="4300"/>
@@ -6368,6 +6597,9 @@
         </w:tc>
       </w:tr>
       <w:tr>
+        <w:trPr>
+          <w:cantSplit w:val="true"/>
+        </w:trPr>
         <w:tc>
           <w:tcPr>
             <w:tcW w:type="dxa" w:w="4300"/>
@@ -6422,6 +6654,9 @@
         </w:tc>
       </w:tr>
       <w:tr>
+        <w:trPr>
+          <w:cantSplit w:val="true"/>
+        </w:trPr>
         <w:tc>
           <w:tcPr>
             <w:tcW w:type="dxa" w:w="4300"/>
@@ -6474,6 +6709,9 @@
         </w:tc>
       </w:tr>
       <w:tr>
+        <w:trPr>
+          <w:cantSplit w:val="true"/>
+        </w:trPr>
         <w:tc>
           <w:tcPr>
             <w:tcW w:type="dxa" w:w="4300"/>
@@ -6528,6 +6766,9 @@
         </w:tc>
       </w:tr>
       <w:tr>
+        <w:trPr>
+          <w:cantSplit w:val="true"/>
+        </w:trPr>
         <w:tc>
           <w:tcPr>
             <w:tcW w:type="dxa" w:w="4300"/>
@@ -6574,12 +6815,127 @@
                 <w:rFonts w:ascii="맑은 고딕" w:hAnsi="맑은 고딕" w:eastAsia="맑은 고딕" w:cs="맑은 고딕"/>
                 <w:sz w:val="16"/>
               </w:rPr>
-              <w:t>journal 또는 증거 정리 단계 실패. 남은 기록·폴더를 삭제하지 않고 진단정보 전달</w:t>
+              <w:t>journal 또는 복구 증거 정리 단계 실패. 아래 대상별 안전 코드를 확인하고 남은 기록·폴더는 보존</w:t>
             </w:r>
           </w:p>
         </w:tc>
       </w:tr>
       <w:tr>
+        <w:trPr>
+          <w:cantSplit w:val="true"/>
+        </w:trPr>
+        <w:tc>
+          <w:tcPr>
+            <w:tcW w:type="dxa" w:w="4300"/>
+            <w:shd w:fill="FAFBFC"/>
+            <w:tcMar>
+              <w:top w:w="80" w:type="dxa"/>
+              <w:start w:w="120" w:type="dxa"/>
+              <w:bottom w:w="80" w:type="dxa"/>
+              <w:end w:w="120" w:type="dxa"/>
+            </w:tcMar>
+            <w:vAlign w:val="center"/>
+          </w:tcPr>
+          <w:p>
+            <w:pPr>
+              <w:spacing w:before="0" w:after="0" w:line="240" w:lineRule="auto"/>
+              <w:jc w:val="left"/>
+            </w:pPr>
+            <w:r>
+              <w:rPr>
+                <w:rFonts w:ascii="맑은 고딕" w:hAnsi="맑은 고딕" w:eastAsia="맑은 고딕" w:cs="맑은 고딕"/>
+                <w:sz w:val="16"/>
+              </w:rPr>
+              <w:t>ROLLBACK_STAGING_CLEANUP_FAILED / ROLLBACK_BACKUP_CLEANUP_FAILED</w:t>
+            </w:r>
+          </w:p>
+        </w:tc>
+        <w:tc>
+          <w:tcPr>
+            <w:tcW w:type="dxa" w:w="5060"/>
+            <w:shd w:fill="FAFBFC"/>
+            <w:tcMar>
+              <w:top w:w="80" w:type="dxa"/>
+              <w:start w:w="120" w:type="dxa"/>
+              <w:bottom w:w="80" w:type="dxa"/>
+              <w:end w:w="120" w:type="dxa"/>
+            </w:tcMar>
+            <w:vAlign w:val="center"/>
+          </w:tcPr>
+          <w:p>
+            <w:pPr>
+              <w:spacing w:before="0" w:after="0" w:line="240" w:lineRule="auto"/>
+              <w:jc w:val="left"/>
+            </w:pPr>
+            <w:r>
+              <w:rPr>
+                <w:rFonts w:ascii="맑은 고딕" w:hAnsi="맑은 고딕" w:eastAsia="맑은 고딕" w:cs="맑은 고딕"/>
+                <w:sz w:val="16"/>
+              </w:rPr>
+              <w:t>현재 작업의 staging 또는 backup 자료 정리 실패. 수동 삭제 없이 익명 진단 전달</w:t>
+            </w:r>
+          </w:p>
+        </w:tc>
+      </w:tr>
+      <w:tr>
+        <w:trPr>
+          <w:cantSplit w:val="true"/>
+        </w:trPr>
+        <w:tc>
+          <w:tcPr>
+            <w:tcW w:type="dxa" w:w="4300"/>
+            <w:tcMar>
+              <w:top w:w="80" w:type="dxa"/>
+              <w:start w:w="120" w:type="dxa"/>
+              <w:bottom w:w="80" w:type="dxa"/>
+              <w:end w:w="120" w:type="dxa"/>
+            </w:tcMar>
+            <w:vAlign w:val="center"/>
+          </w:tcPr>
+          <w:p>
+            <w:pPr>
+              <w:spacing w:before="0" w:after="0" w:line="240" w:lineRule="auto"/>
+              <w:jc w:val="left"/>
+            </w:pPr>
+            <w:r>
+              <w:rPr>
+                <w:rFonts w:ascii="맑은 고딕" w:hAnsi="맑은 고딕" w:eastAsia="맑은 고딕" w:cs="맑은 고딕"/>
+                <w:sz w:val="16"/>
+              </w:rPr>
+              <w:t>ROLLBACK_FAILED_DIRECTORY_CLEANUP_FAILED / ROLLBACK_JOURNAL_CLEANUP_FAILED</w:t>
+            </w:r>
+          </w:p>
+        </w:tc>
+        <w:tc>
+          <w:tcPr>
+            <w:tcW w:type="dxa" w:w="5060"/>
+            <w:tcMar>
+              <w:top w:w="80" w:type="dxa"/>
+              <w:start w:w="120" w:type="dxa"/>
+              <w:bottom w:w="80" w:type="dxa"/>
+              <w:end w:w="120" w:type="dxa"/>
+            </w:tcMar>
+            <w:vAlign w:val="center"/>
+          </w:tcPr>
+          <w:p>
+            <w:pPr>
+              <w:spacing w:before="0" w:after="0" w:line="240" w:lineRule="auto"/>
+              <w:jc w:val="left"/>
+            </w:pPr>
+            <w:r>
+              <w:rPr>
+                <w:rFonts w:ascii="맑은 고딕" w:hAnsi="맑은 고딕" w:eastAsia="맑은 고딕" w:cs="맑은 고딕"/>
+                <w:sz w:val="16"/>
+              </w:rPr>
+              <w:t>현재 작업의 failed 자료 또는 journal 정리·삭제 확인 실패. 설치는 잠긴 상태로 유지</w:t>
+            </w:r>
+          </w:p>
+        </w:tc>
+      </w:tr>
+      <w:tr>
+        <w:trPr>
+          <w:cantSplit w:val="true"/>
+        </w:trPr>
         <w:tc>
           <w:tcPr>
             <w:tcW w:type="dxa" w:w="4300"/>
@@ -6634,6 +6990,9 @@
         </w:tc>
       </w:tr>
       <w:tr>
+        <w:trPr>
+          <w:cantSplit w:val="true"/>
+        </w:trPr>
         <w:tc>
           <w:tcPr>
             <w:tcW w:type="dxa" w:w="4300"/>
@@ -6686,6 +7045,9 @@
         </w:tc>
       </w:tr>
       <w:tr>
+        <w:trPr>
+          <w:cantSplit w:val="true"/>
+        </w:trPr>
         <w:tc>
           <w:tcPr>
             <w:tcW w:type="dxa" w:w="4300"/>
@@ -6740,6 +7102,9 @@
         </w:tc>
       </w:tr>
       <w:tr>
+        <w:trPr>
+          <w:cantSplit w:val="true"/>
+        </w:trPr>
         <w:tc>
           <w:tcPr>
             <w:tcW w:type="dxa" w:w="4300"/>
@@ -6792,6 +7157,9 @@
         </w:tc>
       </w:tr>
       <w:tr>
+        <w:trPr>
+          <w:cantSplit w:val="true"/>
+        </w:trPr>
         <w:tc>
           <w:tcPr>
             <w:tcW w:type="dxa" w:w="4300"/>
@@ -6846,6 +7214,9 @@
         </w:tc>
       </w:tr>
       <w:tr>
+        <w:trPr>
+          <w:cantSplit w:val="true"/>
+        </w:trPr>
         <w:tc>
           <w:tcPr>
             <w:tcW w:type="dxa" w:w="4300"/>
@@ -6898,6 +7269,9 @@
         </w:tc>
       </w:tr>
       <w:tr>
+        <w:trPr>
+          <w:cantSplit w:val="true"/>
+        </w:trPr>
         <w:tc>
           <w:tcPr>
             <w:tcW w:type="dxa" w:w="4300"/>
@@ -6952,6 +7326,9 @@
         </w:tc>
       </w:tr>
       <w:tr>
+        <w:trPr>
+          <w:cantSplit w:val="true"/>
+        </w:trPr>
         <w:tc>
           <w:tcPr>
             <w:tcW w:type="dxa" w:w="4300"/>
@@ -7004,6 +7381,9 @@
         </w:tc>
       </w:tr>
       <w:tr>
+        <w:trPr>
+          <w:cantSplit w:val="true"/>
+        </w:trPr>
         <w:tc>
           <w:tcPr>
             <w:tcW w:type="dxa" w:w="4300"/>
@@ -7058,6 +7438,9 @@
         </w:tc>
       </w:tr>
       <w:tr>
+        <w:trPr>
+          <w:cantSplit w:val="true"/>
+        </w:trPr>
         <w:tc>
           <w:tcPr>
             <w:tcW w:type="dxa" w:w="4300"/>
@@ -7110,6 +7493,9 @@
         </w:tc>
       </w:tr>
       <w:tr>
+        <w:trPr>
+          <w:cantSplit w:val="true"/>
+        </w:trPr>
         <w:tc>
           <w:tcPr>
             <w:tcW w:type="dxa" w:w="4300"/>
@@ -7164,6 +7550,9 @@
         </w:tc>
       </w:tr>
       <w:tr>
+        <w:trPr>
+          <w:cantSplit w:val="true"/>
+        </w:trPr>
         <w:tc>
           <w:tcPr>
             <w:tcW w:type="dxa" w:w="4300"/>
@@ -7216,6 +7605,9 @@
         </w:tc>
       </w:tr>
       <w:tr>
+        <w:trPr>
+          <w:cantSplit w:val="true"/>
+        </w:trPr>
         <w:tc>
           <w:tcPr>
             <w:tcW w:type="dxa" w:w="4300"/>
@@ -7270,6 +7662,9 @@
         </w:tc>
       </w:tr>
       <w:tr>
+        <w:trPr>
+          <w:cantSplit w:val="true"/>
+        </w:trPr>
         <w:tc>
           <w:tcPr>
             <w:tcW w:type="dxa" w:w="4300"/>
@@ -7322,6 +7717,9 @@
         </w:tc>
       </w:tr>
       <w:tr>
+        <w:trPr>
+          <w:cantSplit w:val="true"/>
+        </w:trPr>
         <w:tc>
           <w:tcPr>
             <w:tcW w:type="dxa" w:w="4300"/>
@@ -7376,6 +7774,9 @@
         </w:tc>
       </w:tr>
       <w:tr>
+        <w:trPr>
+          <w:cantSplit w:val="true"/>
+        </w:trPr>
         <w:tc>
           <w:tcPr>
             <w:tcW w:type="dxa" w:w="4300"/>
@@ -7428,6 +7829,9 @@
         </w:tc>
       </w:tr>
       <w:tr>
+        <w:trPr>
+          <w:cantSplit w:val="true"/>
+        </w:trPr>
         <w:tc>
           <w:tcPr>
             <w:tcW w:type="dxa" w:w="4300"/>
@@ -7482,6 +7886,9 @@
         </w:tc>
       </w:tr>
       <w:tr>
+        <w:trPr>
+          <w:cantSplit w:val="true"/>
+        </w:trPr>
         <w:tc>
           <w:tcPr>
             <w:tcW w:type="dxa" w:w="4300"/>
@@ -7534,6 +7941,9 @@
         </w:tc>
       </w:tr>
       <w:tr>
+        <w:trPr>
+          <w:cantSplit w:val="true"/>
+        </w:trPr>
         <w:tc>
           <w:tcPr>
             <w:tcW w:type="dxa" w:w="4300"/>
@@ -7588,6 +7998,9 @@
         </w:tc>
       </w:tr>
       <w:tr>
+        <w:trPr>
+          <w:cantSplit w:val="true"/>
+        </w:trPr>
         <w:tc>
           <w:tcPr>
             <w:tcW w:type="dxa" w:w="4300"/>
@@ -7703,7 +8116,7 @@
           <w:color w:val="16324F"/>
           <w:sz w:val="21"/>
         </w:rPr>
-        <w:t>Setup은 남아 있는 journal을 읽기 전용으로 확인하고 SETUP_RECOVERY_REQUIRED를 표시합니다. 이때 설치/업데이트는 잠겨 있으며 복구가 자동으로 시작되지 않습니다. '이전 상태 복구'를 직접 실행하고, 성공한 경우에만 결과를 확인한 뒤 설치/업데이트를 별도로 시작하세요. 실패하면 '진단정보 복사'로 최초 실패 코드와 ROLLBACK_* 단계를 전달합니다. .__staging_, .__backup_, .__failed_ 폴더와 journal은 원인 확인 증거이므로 삭제·이동·이름 변경하지 마세요.</w:t>
+        <w:t>Setup은 남아 있는 journal을 읽기 전용으로 확인하고 SETUP_RECOVERY_REQUIRED를 표시합니다. 이때 설치/업데이트는 잠겨 있으며 복구가 자동으로 시작되지 않습니다. '이전 상태 복구'를 직접 실행하세요. 정리 대상 삭제와 새 journal 검사가 모두 성공한 경우에만 설치 버튼이 활성화되며, 결과를 확인한 뒤 설치/업데이트를 별도로 시작합니다. 실패하면 '진단정보 복사'로 최초 실패 코드와 실제 경로가 없는 ROLLBACK_* 안전 단계를 전달합니다. .__staging_, .__backup_, .__failed_ 폴더와 journal은 원인 확인 증거이므로 삭제·이동·이름 변경하지 마세요.</w:t>
       </w:r>
     </w:p>
     <w:p>
@@ -7787,6 +8200,7 @@
       <w:tr>
         <w:trPr>
           <w:tblHeader w:val="true"/>
+          <w:cantSplit w:val="true"/>
         </w:trPr>
         <w:tc>
           <w:tcPr>
@@ -7846,6 +8260,9 @@
         </w:tc>
       </w:tr>
       <w:tr>
+        <w:trPr>
+          <w:cantSplit w:val="true"/>
+        </w:trPr>
         <w:tc>
           <w:tcPr>
             <w:tcW w:type="dxa" w:w="1900"/>
@@ -7898,6 +8315,9 @@
         </w:tc>
       </w:tr>
       <w:tr>
+        <w:trPr>
+          <w:cantSplit w:val="true"/>
+        </w:trPr>
         <w:tc>
           <w:tcPr>
             <w:tcW w:type="dxa" w:w="1900"/>
@@ -7952,6 +8372,9 @@
         </w:tc>
       </w:tr>
       <w:tr>
+        <w:trPr>
+          <w:cantSplit w:val="true"/>
+        </w:trPr>
         <w:tc>
           <w:tcPr>
             <w:tcW w:type="dxa" w:w="1900"/>
@@ -8004,6 +8427,9 @@
         </w:tc>
       </w:tr>
       <w:tr>
+        <w:trPr>
+          <w:cantSplit w:val="true"/>
+        </w:trPr>
         <w:tc>
           <w:tcPr>
             <w:tcW w:type="dxa" w:w="1900"/>
@@ -8371,7 +8797,7 @@
         <w:color w:val="64748B"/>
         <w:sz w:val="17"/>
       </w:rPr>
-      <w:t xml:space="preserve">v0.10.8-poc  |  </w:t>
+      <w:t xml:space="preserve">v0.10.9-poc  |  </w:t>
     </w:r>
     <w:r>
       <w:rPr>
@@ -8402,7 +8828,7 @@
         <w:color w:val="64748B"/>
         <w:sz w:val="17"/>
       </w:rPr>
-      <w:t>v0.10.8-poc  |  2026-07-29</w:t>
+      <w:t>v0.10.9-poc  |  2026-07-30</w:t>
     </w:r>
   </w:p>
 </w:ftr>

</xml_diff>

<commit_message>
fix(agent-setup): harden recovery evidence cleanup (#45)
Fail closed when interrupted Agent setup cleanup evidence remains, surface target-specific recovery failures, and synchronize the v0.10.9-poc operator documentation.
</commit_message>
<xml_diff>
--- a/docs/SamsungSwitchWatch_User_Manual_KO.docx
+++ b/docs/SamsungSwitchWatch_User_Manual_KO.docx
@@ -167,6 +167,7 @@
       <w:tr>
         <w:trPr>
           <w:tblHeader w:val="true"/>
+          <w:cantSplit w:val="true"/>
         </w:trPr>
         <w:tc>
           <w:tcPr>
@@ -254,6 +255,9 @@
         </w:tc>
       </w:tr>
       <w:tr>
+        <w:trPr>
+          <w:cantSplit w:val="true"/>
+        </w:trPr>
         <w:tc>
           <w:tcPr>
             <w:tcW w:type="dxa" w:w="1600"/>
@@ -331,6 +335,9 @@
         </w:tc>
       </w:tr>
       <w:tr>
+        <w:trPr>
+          <w:cantSplit w:val="true"/>
+        </w:trPr>
         <w:tc>
           <w:tcPr>
             <w:tcW w:type="dxa" w:w="1600"/>
@@ -411,6 +418,9 @@
         </w:tc>
       </w:tr>
       <w:tr>
+        <w:trPr>
+          <w:cantSplit w:val="true"/>
+        </w:trPr>
         <w:tc>
           <w:tcPr>
             <w:tcW w:type="dxa" w:w="1600"/>
@@ -728,6 +738,7 @@
       <w:tr>
         <w:trPr>
           <w:tblHeader w:val="true"/>
+          <w:cantSplit w:val="true"/>
         </w:trPr>
         <w:tc>
           <w:tcPr>
@@ -815,6 +826,9 @@
         </w:tc>
       </w:tr>
       <w:tr>
+        <w:trPr>
+          <w:cantSplit w:val="true"/>
+        </w:trPr>
         <w:tc>
           <w:tcPr>
             <w:tcW w:type="dxa" w:w="1900"/>
@@ -892,6 +906,9 @@
         </w:tc>
       </w:tr>
       <w:tr>
+        <w:trPr>
+          <w:cantSplit w:val="true"/>
+        </w:trPr>
         <w:tc>
           <w:tcPr>
             <w:tcW w:type="dxa" w:w="1900"/>
@@ -1132,7 +1149,7 @@
           <w:color w:val="16324F"/>
           <w:sz w:val="21"/>
         </w:rPr>
-        <w:t>0.10.8-poc는 코드 서명되지 않은 시험판입니다. 압축을 풀기 전에 Agent와 Viewer ZIP의 SHA-256을 해당 GitHub Release 본문에 표시된 값과 비교하고 사내 보안 반입 절차를 완료하세요. SmartScreen 또는 EDR 경고를 우회하지 않습니다.</w:t>
+        <w:t>0.10.9-poc는 코드 서명되지 않은 시험판입니다. 압축을 풀기 전에 Agent와 Viewer ZIP의 SHA-256을 해당 GitHub Release 본문에 표시된 값과 비교하고 사내 보안 반입 절차를 완료하세요. SmartScreen 또는 EDR 경고를 우회하지 않습니다.</w:t>
       </w:r>
     </w:p>
     <w:p>
@@ -1216,7 +1233,7 @@
         <w:rPr>
           <w:rFonts w:ascii="맑은 고딕" w:hAnsi="맑은 고딕" w:eastAsia="맑은 고딕" w:cs="맑은 고딕"/>
         </w:rPr>
-        <w:t>Setup이 중단된 이전 설치 기록을 발견하면 설치/업데이트가 잠깁니다. '이전 상태 복구'를 먼저 누르고 복구 완료를 확인합니다.</w:t>
+        <w:t>Setup이 중단된 이전 설치 기록을 발견하면 설치/업데이트가 잠깁니다. '이전 상태 복구'를 먼저 누르고 새 작업 기록 검사까지 완료됐는지 확인합니다.</w:t>
       </w:r>
     </w:p>
     <w:p>
@@ -1230,7 +1247,7 @@
         <w:rPr>
           <w:rFonts w:ascii="맑은 고딕" w:hAnsi="맑은 고딕" w:eastAsia="맑은 고딕" w:cs="맑은 고딕"/>
         </w:rPr>
-        <w:t>복구 성공 뒤 설치는 자동으로 시작되지 않습니다. 별도로 '설치 / 업데이트'를 누른 뒤 SamsungSwitchWatchAgent 서비스가 실행 중인지 확인합니다.</w:t>
+        <w:t>정리 대상과 작업 기록이 모두 사라진 경우에만 복구 성공으로 표시됩니다. 별도로 '설치 / 업데이트'를 누른 뒤 SamsungSwitchWatchAgent 서비스가 실행 중인지 확인합니다.</w:t>
       </w:r>
     </w:p>
     <w:p>
@@ -1242,7 +1259,7 @@
       <w:r>
         <w:drawing>
           <wp:inline xmlns:a="http://schemas.openxmlformats.org/drawingml/2006/main" xmlns:pic="http://schemas.openxmlformats.org/drawingml/2006/picture">
-            <wp:extent cx="4114800" cy="4439652"/>
+            <wp:extent cx="4114800" cy="4872789"/>
             <wp:docPr id="1" name="Picture 1" title="Agent Setup 화면" descr="중단된 이전 설치 기록을 감지하여 이전 상태 복구 버튼만 활성화하고 설치 업데이트 버튼은 비활성화한 Agent Setup 화면"/>
             <wp:cNvGraphicFramePr>
               <a:graphicFrameLocks noChangeAspect="1"/>
@@ -1263,7 +1280,7 @@
                   <pic:spPr>
                     <a:xfrm>
                       <a:off x="0" y="0"/>
-                      <a:ext cx="4114800" cy="4439652"/>
+                      <a:ext cx="4114800" cy="4872789"/>
                     </a:xfrm>
                     <a:prstGeom prst="rect"/>
                   </pic:spPr>
@@ -1307,7 +1324,84 @@
           <w:color w:val="16324F"/>
           <w:sz w:val="21"/>
         </w:rPr>
-        <w:t>Setup은 시작할 때 이전 작업의 journal을 읽기 전용으로 확인합니다. 안전하게 복구할 수 있는 기록이면 '이전 상태 복구'만 활성화하고 설치/업데이트는 비활성화합니다. 이 확인만으로 파일·서비스·방화벽을 변경하거나 복구를 자동 실행하지 않습니다. 복구 성공 뒤에도 설치는 자동으로 이어지지 않으므로 운영자가 결과를 확인한 뒤 설치/업데이트를 별도로 시작합니다.</w:t>
+        <w:t>Setup은 시작할 때 이전 작업의 journal을 읽기 전용으로 확인합니다. 안전하게 복구할 수 있는 기록이면 '이전 상태 복구'만 활성화하고 설치/업데이트는 비활성화합니다. 이 확인만으로 파일·서비스·방화벽을 변경하거나 복구를 자동 실행하지 않습니다. 검증된 정리 대상이 실제로 사라지고 새 journal 검사에서도 미완료 작업이 없어야만 복구 성공과 설치 버튼 활성화를 표시합니다. 설치는 자동으로 이어지지 않으므로 운영자가 별도로 시작합니다.</w:t>
+      </w:r>
+    </w:p>
+    <w:p>
+      <w:pPr>
+        <w:keepNext/>
+        <w:spacing w:before="80" w:after="0"/>
+        <w:jc w:val="center"/>
+      </w:pPr>
+      <w:r>
+        <w:drawing>
+          <wp:inline xmlns:a="http://schemas.openxmlformats.org/drawingml/2006/main" xmlns:pic="http://schemas.openxmlformats.org/drawingml/2006/picture">
+            <wp:extent cx="4114800" cy="4872789"/>
+            <wp:docPr id="2" name="Picture 2" title="Agent Setup 복구 실패 화면" descr="복구 자료 정리가 끝나지 않아 설치를 계속 잠그고 작업 기록 보존, 복구 재시도와 익명 진단 저장을 안내하는 Agent Setup 화면"/>
+            <wp:cNvGraphicFramePr>
+              <a:graphicFrameLocks noChangeAspect="1"/>
+            </wp:cNvGraphicFramePr>
+            <a:graphic>
+              <a:graphicData uri="http://schemas.openxmlformats.org/drawingml/2006/picture">
+                <pic:pic>
+                  <pic:nvPicPr>
+                    <pic:cNvPr id="0" name="00-agent-setup-recovery-failed.png"/>
+                    <pic:cNvPicPr/>
+                  </pic:nvPicPr>
+                  <pic:blipFill>
+                    <a:blip r:embed="rId14"/>
+                    <a:stretch>
+                      <a:fillRect/>
+                    </a:stretch>
+                  </pic:blipFill>
+                  <pic:spPr>
+                    <a:xfrm>
+                      <a:off x="0" y="0"/>
+                      <a:ext cx="4114800" cy="4872789"/>
+                    </a:xfrm>
+                    <a:prstGeom prst="rect"/>
+                  </pic:spPr>
+                </pic:pic>
+              </a:graphicData>
+            </a:graphic>
+          </wp:inline>
+        </w:drawing>
+      </w:r>
+    </w:p>
+    <w:p>
+      <w:pPr>
+        <w:pStyle w:val="Caption"/>
+      </w:pPr>
+      <w:r>
+        <w:t>그림 2. 복구 자료 정리 실패와 설치 차단 화면</w:t>
+      </w:r>
+    </w:p>
+    <w:p>
+      <w:pPr>
+        <w:keepLines/>
+        <w:spacing w:before="80" w:after="160" w:line="283" w:lineRule="auto"/>
+        <w:ind w:left="115" w:right="58"/>
+        <w:shd w:fill="FEF2F2"/>
+        <w:pBdr>
+          <w:left w:val="single" w:sz="16" w:space="8" w:color="B42318"/>
+        </w:pBdr>
+      </w:pPr>
+      <w:r>
+        <w:rPr>
+          <w:rFonts w:ascii="맑은 고딕" w:hAnsi="맑은 고딕" w:eastAsia="맑은 고딕" w:cs="맑은 고딕"/>
+          <w:b/>
+          <w:color w:val="B42318"/>
+          <w:sz w:val="21"/>
+        </w:rPr>
+        <w:t xml:space="preserve">복구 자료 정리가 끝나지 않은 경우  </w:t>
+      </w:r>
+      <w:r>
+        <w:rPr>
+          <w:rFonts w:ascii="맑은 고딕" w:hAnsi="맑은 고딕" w:eastAsia="맑은 고딕" w:cs="맑은 고딕"/>
+          <w:color w:val="16324F"/>
+          <w:sz w:val="21"/>
+        </w:rPr>
+        <w:t>화면 상단에 SETUP_ROLLBACK_FAILED가 표시되고 복구 자료 정리 분류 아래 ROLLBACK_JOURNAL_CLEANUP_FAILED 같은 대상별 코드가 표시되면, staging·backup·failed·journal 중 검증된 정리 대상을 최대 3회 시도하고 실패한 시도 사이 250ms 대기한 뒤에도 남아 있다는 뜻입니다. 설치 버튼은 계속 잠기며 화면에서 '복구 다시 시도'를 사용할 수 있습니다. 반복되면 '익명 진단 저장'을 사용하고, 폴더나 journal을 수동으로 삭제하지 마세요.</w:t>
       </w:r>
     </w:p>
     <w:p>
@@ -1514,7 +1608,7 @@
           <w:color w:val="16324F"/>
           <w:sz w:val="21"/>
         </w:rPr>
-        <w:t>Setup은 BUILD-MANIFEST.json과 Agent 실행 파일 SHA-256을 확인하고, Program Files의 임시 staging에 복사한 파일을 다시 검사한 뒤 교체합니다. 서비스·프로그램·방화벽 변경 중 현재 작업이 실패하면 설치 전 상태로 되돌리기를 시도합니다. 다음 실행에서 완료되지 않은 journal이 남아 있으면 자동 복구하지 않고 별도의 '이전 상태 복구' 작업을 요구합니다. 복구까지 실패하면 최초 설치 실패 코드를 별도로 유지하고 SETUP_ROLLBACK_FAILED와 실패한 ROLLBACK_* 단계를 함께 표시합니다.</w:t>
+        <w:t>Setup은 BUILD-MANIFEST.json과 Agent 실행 파일 SHA-256을 확인하고, Program Files의 임시 staging에 복사한 파일을 다시 검사한 뒤 교체합니다. 서비스·프로그램·방화벽 변경 중 현재 작업이 실패하면 설치 전 상태로 되돌리기를 시도합니다. 다음 실행에서 완료되지 않은 journal이 남아 있으면 자동 복구하지 않고 별도의 '이전 상태 복구' 작업을 요구합니다. staging·backup·failed·journal 정리가 잠시 실패하면 정확히 검증된 대상만 최대 3회 시도하고 실패한 시도 사이 250ms 대기한 뒤 삭제 결과를 확인합니다. 복구까지 실패하면 최초 설치 실패 코드를 별도로 유지하고 SETUP_ROLLBACK_FAILED와 실패한 ROLLBACK_* 단계를 함께 표시합니다.</w:t>
       </w:r>
     </w:p>
     <w:p>
@@ -1626,7 +1720,7 @@
           <w:color w:val="16324F"/>
           <w:sz w:val="21"/>
         </w:rPr>
-        <w:t>Agent Setup에 설치 실패가 표시되면 실패 단계와 Cause를 먼저 확인하세요. SETUP_FIREWALL_FAILED는 적용 직후 최대 2초 동안 재확인해도 제품 방화벽 규칙이 정확하지 않다는 뜻입니다. Setup은 실제 주소 대신 안전한 불일치 코드를 표시하고 설치 전 상태로 복구합니다. 규칙을 Any, LocalSubnet 또는 넓은 대역으로 수동 확대하지 마세요. 설치 성공 뒤 AGENT_CONNECTION_REFUSED가 보이면 Viewer에 스위치 IP나 localhost가 아니라 Agent를 설치한 PC의 실제 주소를 입력했는지 먼저 확인하세요. 동일 PC 사전 테스트도 localhost 대신 이 PC의 실제 RFC1918 사설 IPv4를 사용합니다. 그 다음 Agent Setup의 검사에서 SamsungSwitchWatchAgent 서비스와 TCP/18443을 점검합니다. AGENT_CLIENT_NOT_ALLOWED이면 현재 Viewer PC의 고정 IPv4를 Agent Setup에 다시 입력하고 설치/업데이트합니다. 서비스를 수동 등록하지 말고 0.10.8-poc Agent Setup을 사용하세요.</w:t>
+        <w:t>Agent Setup에 설치 실패가 표시되면 실패 단계와 Cause를 먼저 확인하세요. SETUP_FIREWALL_FAILED는 적용 직후 최대 2초 동안 재확인해도 제품 방화벽 규칙이 정확하지 않다는 뜻입니다. Setup은 실제 주소 대신 안전한 불일치 코드를 표시하고 설치 전 상태로 복구합니다. 규칙을 Any, LocalSubnet 또는 넓은 대역으로 수동 확대하지 마세요. 설치 성공 뒤 AGENT_CONNECTION_REFUSED가 보이면 Viewer에 스위치 IP나 localhost가 아니라 Agent를 설치한 PC의 실제 주소를 입력했는지 먼저 확인하세요. 동일 PC 사전 테스트도 localhost 대신 이 PC의 실제 RFC1918 사설 IPv4를 사용합니다. 그 다음 Agent Setup의 검사에서 SamsungSwitchWatchAgent 서비스와 TCP/18443을 점검합니다. AGENT_CLIENT_NOT_ALLOWED이면 현재 Viewer PC의 고정 IPv4를 Agent Setup에 다시 입력하고 설치/업데이트합니다. 서비스를 수동 등록하지 말고 0.10.9-poc Agent Setup을 사용하세요.</w:t>
       </w:r>
     </w:p>
     <w:p>
@@ -1673,7 +1767,7 @@
           <w:color w:val="16324F"/>
           <w:sz w:val="21"/>
         </w:rPr>
-        <w:t>이전 Viewer가 실행 중이면 새 Viewer는 같은 사용자 데이터를 동시에 쓰지 않도록 실행을 차단하고 전환 순서를 표시합니다. 기존 트레이 아이콘에서 '프로그램 종료'를 선택한 뒤 Win+R에서 shell:startup을 열어 'Samsung Switch Watch' 바로 가기를 삭제합니다. 이어 shell:programs에서도 같은 이름의 이전 시작 메뉴 바로 가기를 삭제하고 새 Viewer를 다시 실행하세요. 기존 Agent 연결과 장비 정보는 유지됩니다. 창이 바로 보이지 않으면 알림 영역에서 대시보드를 열고 실행 경로가 새 0.10.8-poc 폴더인지 확인하세요.</w:t>
+        <w:t>이전 Viewer가 실행 중이면 새 Viewer는 같은 사용자 데이터를 동시에 쓰지 않도록 실행을 차단하고 전환 순서를 표시합니다. 기존 트레이 아이콘에서 '프로그램 종료'를 선택한 뒤 Win+R에서 shell:startup을 열어 'Samsung Switch Watch' 바로 가기를 삭제합니다. 이어 shell:programs에서도 같은 이름의 이전 시작 메뉴 바로 가기를 삭제하고 새 Viewer를 다시 실행하세요. 기존 Agent 연결과 장비 정보는 유지됩니다. 창이 바로 보이지 않으면 알림 영역에서 대시보드를 열고 실행 경로가 새 0.10.9-poc 폴더인지 확인하세요.</w:t>
       </w:r>
     </w:p>
     <w:p>
@@ -1771,7 +1865,7 @@
           <w:color w:val="16324F"/>
           <w:sz w:val="21"/>
         </w:rPr>
-        <w:t>0.10.8-poc는 코드 서명되지 않아 SmartScreen이나 사내 EDR이 차단할 수 있습니다. ZIP을 완전히 압축 해제하고 Viewer EXE와 제공된 DLL이 같은 폴더에 있는지 확인하세요. EDR·AppLocker·WDAC가 차단하면 우회하지 말고 공식 ZIP의 버전·해시와 차단 기록을 보안 담당자에게 전달하세요.</w:t>
+        <w:t>0.10.9-poc는 코드 서명되지 않아 SmartScreen이나 사내 EDR이 차단할 수 있습니다. ZIP을 완전히 압축 해제하고 Viewer EXE와 제공된 DLL이 같은 폴더에 있는지 확인하세요. EDR·AppLocker·WDAC가 차단하면 우회하지 말고 공식 ZIP의 버전·해시와 차단 기록을 보안 담당자에게 전달하세요.</w:t>
       </w:r>
     </w:p>
     <w:p>
@@ -1831,7 +1925,7 @@
         <w:drawing>
           <wp:inline xmlns:a="http://schemas.openxmlformats.org/drawingml/2006/main" xmlns:pic="http://schemas.openxmlformats.org/drawingml/2006/picture">
             <wp:extent cx="2651760" cy="3635477"/>
-            <wp:docPr id="2" name="Picture 2" title="Agent 연결 창" descr="같은 PC 테스트 결과, 익명 진단 저장과 원격 Agent 주소 입력을 함께 보여 주는 연결 설정 창"/>
+            <wp:docPr id="3" name="Picture 3" title="Agent 연결 창" descr="같은 PC 테스트 결과, 익명 진단 저장과 원격 Agent 주소 입력을 함께 보여 주는 연결 설정 창"/>
             <wp:cNvGraphicFramePr>
               <a:graphicFrameLocks noChangeAspect="1"/>
             </wp:cNvGraphicFramePr>
@@ -1843,7 +1937,7 @@
                     <pic:cNvPicPr/>
                   </pic:nvPicPr>
                   <pic:blipFill>
-                    <a:blip r:embed="rId14"/>
+                    <a:blip r:embed="rId15"/>
                     <a:stretch>
                       <a:fillRect/>
                     </a:stretch>
@@ -1867,7 +1961,7 @@
         <w:pStyle w:val="Caption"/>
       </w:pPr>
       <w:r>
-        <w:t>그림 2. 같은 PC Agent/API 테스트, 익명 진단 저장과 원격 연결 설정</w:t>
+        <w:t>그림 3. 같은 PC Agent/API 테스트, 익명 진단 저장과 원격 연결 설정</w:t>
       </w:r>
     </w:p>
     <w:p>
@@ -2003,7 +2097,7 @@
         <w:drawing>
           <wp:inline xmlns:a="http://schemas.openxmlformats.org/drawingml/2006/main" xmlns:pic="http://schemas.openxmlformats.org/drawingml/2006/picture">
             <wp:extent cx="5029200" cy="3540967"/>
-            <wp:docPr id="3" name="Picture 3" title="장비 관리 창" descr="장비명, 모델, IPv4, 계정 ID, 로그인 비밀번호, enable 비밀번호와 감시 설정을 입력하는 창"/>
+            <wp:docPr id="4" name="Picture 4" title="장비 관리 창" descr="장비명, 모델, IPv4, 계정 ID, 로그인 비밀번호, enable 비밀번호와 감시 설정을 입력하는 창"/>
             <wp:cNvGraphicFramePr>
               <a:graphicFrameLocks noChangeAspect="1"/>
             </wp:cNvGraphicFramePr>
@@ -2015,7 +2109,7 @@
                     <pic:cNvPicPr/>
                   </pic:nvPicPr>
                   <pic:blipFill>
-                    <a:blip r:embed="rId15"/>
+                    <a:blip r:embed="rId16"/>
                     <a:stretch>
                       <a:fillRect/>
                     </a:stretch>
@@ -2039,7 +2133,7 @@
         <w:pStyle w:val="Caption"/>
       </w:pPr>
       <w:r>
-        <w:t>그림 3. Viewer가 보관하는 장비 및 계정 입력 화면</w:t>
+        <w:t>그림 4. Viewer가 보관하는 장비 및 계정 입력 화면</w:t>
       </w:r>
     </w:p>
     <w:tbl>
@@ -2065,6 +2159,7 @@
       <w:tr>
         <w:trPr>
           <w:tblHeader w:val="true"/>
+          <w:cantSplit w:val="true"/>
         </w:trPr>
         <w:tc>
           <w:tcPr>
@@ -2152,6 +2247,9 @@
         </w:tc>
       </w:tr>
       <w:tr>
+        <w:trPr>
+          <w:cantSplit w:val="true"/>
+        </w:trPr>
         <w:tc>
           <w:tcPr>
             <w:tcW w:type="dxa" w:w="1900"/>
@@ -2229,6 +2327,9 @@
         </w:tc>
       </w:tr>
       <w:tr>
+        <w:trPr>
+          <w:cantSplit w:val="true"/>
+        </w:trPr>
         <w:tc>
           <w:tcPr>
             <w:tcW w:type="dxa" w:w="1900"/>
@@ -2309,6 +2410,9 @@
         </w:tc>
       </w:tr>
       <w:tr>
+        <w:trPr>
+          <w:cantSplit w:val="true"/>
+        </w:trPr>
         <w:tc>
           <w:tcPr>
             <w:tcW w:type="dxa" w:w="1900"/>
@@ -2386,6 +2490,9 @@
         </w:tc>
       </w:tr>
       <w:tr>
+        <w:trPr>
+          <w:cantSplit w:val="true"/>
+        </w:trPr>
         <w:tc>
           <w:tcPr>
             <w:tcW w:type="dxa" w:w="1900"/>
@@ -2466,6 +2573,9 @@
         </w:tc>
       </w:tr>
       <w:tr>
+        <w:trPr>
+          <w:cantSplit w:val="true"/>
+        </w:trPr>
         <w:tc>
           <w:tcPr>
             <w:tcW w:type="dxa" w:w="1900"/>
@@ -2543,6 +2653,9 @@
         </w:tc>
       </w:tr>
       <w:tr>
+        <w:trPr>
+          <w:cantSplit w:val="true"/>
+        </w:trPr>
         <w:tc>
           <w:tcPr>
             <w:tcW w:type="dxa" w:w="1900"/>
@@ -2623,6 +2736,9 @@
         </w:tc>
       </w:tr>
       <w:tr>
+        <w:trPr>
+          <w:cantSplit w:val="true"/>
+        </w:trPr>
         <w:tc>
           <w:tcPr>
             <w:tcW w:type="dxa" w:w="1900"/>
@@ -2774,7 +2890,7 @@
         <w:drawing>
           <wp:inline xmlns:a="http://schemas.openxmlformats.org/drawingml/2006/main" xmlns:pic="http://schemas.openxmlformats.org/drawingml/2006/picture">
             <wp:extent cx="3977639" cy="2486024"/>
-            <wp:docPr id="4" name="Picture 4" title="장비 명령 실행 화면" descr="show port status를 입력하고 데모 스위치의 익명화된 결과를 확인하는 장비 명령 탭"/>
+            <wp:docPr id="5" name="Picture 5" title="장비 명령 실행 화면" descr="show port status를 입력하고 데모 스위치의 익명화된 결과를 확인하는 장비 명령 탭"/>
             <wp:cNvGraphicFramePr>
               <a:graphicFrameLocks noChangeAspect="1"/>
             </wp:cNvGraphicFramePr>
@@ -2786,7 +2902,7 @@
                     <pic:cNvPicPr/>
                   </pic:nvPicPr>
                   <pic:blipFill>
-                    <a:blip r:embed="rId16"/>
+                    <a:blip r:embed="rId17"/>
                     <a:stretch>
                       <a:fillRect/>
                     </a:stretch>
@@ -2810,7 +2926,7 @@
         <w:pStyle w:val="Caption"/>
       </w:pPr>
       <w:r>
-        <w:t>그림 4. 한 줄 show 명령 실행과 메모리 내 결과 확인</w:t>
+        <w:t>그림 5. 한 줄 show 명령 실행과 메모리 내 결과 확인</w:t>
       </w:r>
     </w:p>
     <w:tbl>
@@ -2836,6 +2952,7 @@
       <w:tr>
         <w:trPr>
           <w:tblHeader w:val="true"/>
+          <w:cantSplit w:val="true"/>
         </w:trPr>
         <w:tc>
           <w:tcPr>
@@ -2923,6 +3040,9 @@
         </w:tc>
       </w:tr>
       <w:tr>
+        <w:trPr>
+          <w:cantSplit w:val="true"/>
+        </w:trPr>
         <w:tc>
           <w:tcPr>
             <w:tcW w:type="dxa" w:w="1300"/>
@@ -3000,6 +3120,9 @@
         </w:tc>
       </w:tr>
       <w:tr>
+        <w:trPr>
+          <w:cantSplit w:val="true"/>
+        </w:trPr>
         <w:tc>
           <w:tcPr>
             <w:tcW w:type="dxa" w:w="1300"/>
@@ -3080,6 +3203,9 @@
         </w:tc>
       </w:tr>
       <w:tr>
+        <w:trPr>
+          <w:cantSplit w:val="true"/>
+        </w:trPr>
         <w:tc>
           <w:tcPr>
             <w:tcW w:type="dxa" w:w="1300"/>
@@ -3292,6 +3418,7 @@
       <w:tr>
         <w:trPr>
           <w:tblHeader w:val="true"/>
+          <w:cantSplit w:val="true"/>
         </w:trPr>
         <w:tc>
           <w:tcPr>
@@ -3379,6 +3506,9 @@
         </w:tc>
       </w:tr>
       <w:tr>
+        <w:trPr>
+          <w:cantSplit w:val="true"/>
+        </w:trPr>
         <w:tc>
           <w:tcPr>
             <w:tcW w:type="dxa" w:w="1800"/>
@@ -3456,6 +3586,9 @@
         </w:tc>
       </w:tr>
       <w:tr>
+        <w:trPr>
+          <w:cantSplit w:val="true"/>
+        </w:trPr>
         <w:tc>
           <w:tcPr>
             <w:tcW w:type="dxa" w:w="1800"/>
@@ -3842,7 +3975,7 @@
         <w:drawing>
           <wp:inline xmlns:a="http://schemas.openxmlformats.org/drawingml/2006/main" xmlns:pic="http://schemas.openxmlformats.org/drawingml/2006/picture">
             <wp:extent cx="4754880" cy="2971800"/>
-            <wp:docPr id="5" name="Picture 5" title="Viewer 대시보드" descr="장비 목록, 선택 장비 상태, 최근 이벤트와 Viewer 감시 상태를 보여 주는 대시보드"/>
+            <wp:docPr id="6" name="Picture 6" title="Viewer 대시보드" descr="장비 목록, 선택 장비 상태, 최근 이벤트와 Viewer 감시 상태를 보여 주는 대시보드"/>
             <wp:cNvGraphicFramePr>
               <a:graphicFrameLocks noChangeAspect="1"/>
             </wp:cNvGraphicFramePr>
@@ -3854,7 +3987,7 @@
                     <pic:cNvPicPr/>
                   </pic:nvPicPr>
                   <pic:blipFill>
-                    <a:blip r:embed="rId17"/>
+                    <a:blip r:embed="rId18"/>
                     <a:stretch>
                       <a:fillRect/>
                     </a:stretch>
@@ -3878,7 +4011,7 @@
         <w:pStyle w:val="Caption"/>
       </w:pPr>
       <w:r>
-        <w:t>그림 5. Viewer 중심 대시보드 전체 화면</w:t>
+        <w:t>그림 6. Viewer 중심 대시보드 전체 화면</w:t>
       </w:r>
     </w:p>
     <w:tbl>
@@ -3903,6 +4036,7 @@
       <w:tr>
         <w:trPr>
           <w:tblHeader w:val="true"/>
+          <w:cantSplit w:val="true"/>
         </w:trPr>
         <w:tc>
           <w:tcPr>
@@ -3962,6 +4096,9 @@
         </w:tc>
       </w:tr>
       <w:tr>
+        <w:trPr>
+          <w:cantSplit w:val="true"/>
+        </w:trPr>
         <w:tc>
           <w:tcPr>
             <w:tcW w:type="dxa" w:w="1800"/>
@@ -4014,6 +4151,9 @@
         </w:tc>
       </w:tr>
       <w:tr>
+        <w:trPr>
+          <w:cantSplit w:val="true"/>
+        </w:trPr>
         <w:tc>
           <w:tcPr>
             <w:tcW w:type="dxa" w:w="1800"/>
@@ -4068,6 +4208,9 @@
         </w:tc>
       </w:tr>
       <w:tr>
+        <w:trPr>
+          <w:cantSplit w:val="true"/>
+        </w:trPr>
         <w:tc>
           <w:tcPr>
             <w:tcW w:type="dxa" w:w="1800"/>
@@ -4120,6 +4263,9 @@
         </w:tc>
       </w:tr>
       <w:tr>
+        <w:trPr>
+          <w:cantSplit w:val="true"/>
+        </w:trPr>
         <w:tc>
           <w:tcPr>
             <w:tcW w:type="dxa" w:w="1800"/>
@@ -4174,6 +4320,9 @@
         </w:tc>
       </w:tr>
       <w:tr>
+        <w:trPr>
+          <w:cantSplit w:val="true"/>
+        </w:trPr>
         <w:tc>
           <w:tcPr>
             <w:tcW w:type="dxa" w:w="1800"/>
@@ -4226,6 +4375,9 @@
         </w:tc>
       </w:tr>
       <w:tr>
+        <w:trPr>
+          <w:cantSplit w:val="true"/>
+        </w:trPr>
         <w:tc>
           <w:tcPr>
             <w:tcW w:type="dxa" w:w="1800"/>
@@ -4358,7 +4510,7 @@
         <w:drawing>
           <wp:inline xmlns:a="http://schemas.openxmlformats.org/drawingml/2006/main" xmlns:pic="http://schemas.openxmlformats.org/drawingml/2006/picture">
             <wp:extent cx="2971800" cy="1816099"/>
-            <wp:docPr id="6" name="Picture 6" title="항상 위 미니 창" descr="정상, 경고, 장애 수와 최근 문제를 보여 주는 작은 항상 위 창"/>
+            <wp:docPr id="7" name="Picture 7" title="항상 위 미니 창" descr="정상, 경고, 장애 수와 최근 문제를 보여 주는 작은 항상 위 창"/>
             <wp:cNvGraphicFramePr>
               <a:graphicFrameLocks noChangeAspect="1"/>
             </wp:cNvGraphicFramePr>
@@ -4370,7 +4522,7 @@
                     <pic:cNvPicPr/>
                   </pic:nvPicPr>
                   <pic:blipFill>
-                    <a:blip r:embed="rId18"/>
+                    <a:blip r:embed="rId19"/>
                     <a:stretch>
                       <a:fillRect/>
                     </a:stretch>
@@ -4394,7 +4546,7 @@
         <w:pStyle w:val="Caption"/>
       </w:pPr>
       <w:r>
-        <w:t>그림 6. 반복 운영용 미니 창</w:t>
+        <w:t>그림 7. 반복 운영용 미니 창</w:t>
       </w:r>
     </w:p>
     <w:p>
@@ -4407,7 +4559,7 @@
         <w:drawing>
           <wp:inline xmlns:a="http://schemas.openxmlformats.org/drawingml/2006/main" xmlns:pic="http://schemas.openxmlformats.org/drawingml/2006/picture">
             <wp:extent cx="3154680" cy="1296924"/>
-            <wp:docPr id="7" name="Picture 7" title="장애 알림 팝업" descr="데모 업링크 포트 Down 장애와 발생 시각을 보여 주는 알림 팝업"/>
+            <wp:docPr id="8" name="Picture 8" title="장애 알림 팝업" descr="데모 업링크 포트 Down 장애와 발생 시각을 보여 주는 알림 팝업"/>
             <wp:cNvGraphicFramePr>
               <a:graphicFrameLocks noChangeAspect="1"/>
             </wp:cNvGraphicFramePr>
@@ -4419,7 +4571,7 @@
                     <pic:cNvPicPr/>
                   </pic:nvPicPr>
                   <pic:blipFill>
-                    <a:blip r:embed="rId19"/>
+                    <a:blip r:embed="rId20"/>
                     <a:stretch>
                       <a:fillRect/>
                     </a:stretch>
@@ -4443,7 +4595,7 @@
         <w:pStyle w:val="Caption"/>
       </w:pPr>
       <w:r>
-        <w:t>그림 7. 새 장애 알림 팝업</w:t>
+        <w:t>그림 8. 새 장애 알림 팝업</w:t>
       </w:r>
     </w:p>
     <w:p>
@@ -4568,6 +4720,7 @@
       <w:tr>
         <w:trPr>
           <w:tblHeader w:val="true"/>
+          <w:cantSplit w:val="true"/>
         </w:trPr>
         <w:tc>
           <w:tcPr>
@@ -4655,6 +4808,9 @@
         </w:tc>
       </w:tr>
       <w:tr>
+        <w:trPr>
+          <w:cantSplit w:val="true"/>
+        </w:trPr>
         <w:tc>
           <w:tcPr>
             <w:tcW w:type="dxa" w:w="2200"/>
@@ -4734,6 +4890,9 @@
         </w:tc>
       </w:tr>
       <w:tr>
+        <w:trPr>
+          <w:cantSplit w:val="true"/>
+        </w:trPr>
         <w:tc>
           <w:tcPr>
             <w:tcW w:type="dxa" w:w="2200"/>
@@ -4814,6 +4973,9 @@
         </w:tc>
       </w:tr>
       <w:tr>
+        <w:trPr>
+          <w:cantSplit w:val="true"/>
+        </w:trPr>
         <w:tc>
           <w:tcPr>
             <w:tcW w:type="dxa" w:w="2200"/>
@@ -4891,6 +5053,9 @@
         </w:tc>
       </w:tr>
       <w:tr>
+        <w:trPr>
+          <w:cantSplit w:val="true"/>
+        </w:trPr>
         <w:tc>
           <w:tcPr>
             <w:tcW w:type="dxa" w:w="2200"/>
@@ -4971,6 +5136,9 @@
         </w:tc>
       </w:tr>
       <w:tr>
+        <w:trPr>
+          <w:cantSplit w:val="true"/>
+        </w:trPr>
         <w:tc>
           <w:tcPr>
             <w:tcW w:type="dxa" w:w="2200"/>
@@ -5048,6 +5216,9 @@
         </w:tc>
       </w:tr>
       <w:tr>
+        <w:trPr>
+          <w:cantSplit w:val="true"/>
+        </w:trPr>
         <w:tc>
           <w:tcPr>
             <w:tcW w:type="dxa" w:w="2200"/>
@@ -5130,6 +5301,9 @@
         </w:tc>
       </w:tr>
       <w:tr>
+        <w:trPr>
+          <w:cantSplit w:val="true"/>
+        </w:trPr>
         <w:tc>
           <w:tcPr>
             <w:tcW w:type="dxa" w:w="2200"/>
@@ -5207,6 +5381,9 @@
         </w:tc>
       </w:tr>
       <w:tr>
+        <w:trPr>
+          <w:cantSplit w:val="true"/>
+        </w:trPr>
         <w:tc>
           <w:tcPr>
             <w:tcW w:type="dxa" w:w="2200"/>
@@ -5409,6 +5586,7 @@
       <w:tr>
         <w:trPr>
           <w:tblHeader w:val="true"/>
+          <w:cantSplit w:val="true"/>
         </w:trPr>
         <w:tc>
           <w:tcPr>
@@ -5468,6 +5646,9 @@
         </w:tc>
       </w:tr>
       <w:tr>
+        <w:trPr>
+          <w:cantSplit w:val="true"/>
+        </w:trPr>
         <w:tc>
           <w:tcPr>
             <w:tcW w:type="dxa" w:w="4300"/>
@@ -5520,6 +5701,9 @@
         </w:tc>
       </w:tr>
       <w:tr>
+        <w:trPr>
+          <w:cantSplit w:val="true"/>
+        </w:trPr>
         <w:tc>
           <w:tcPr>
             <w:tcW w:type="dxa" w:w="4300"/>
@@ -5574,6 +5758,9 @@
         </w:tc>
       </w:tr>
       <w:tr>
+        <w:trPr>
+          <w:cantSplit w:val="true"/>
+        </w:trPr>
         <w:tc>
           <w:tcPr>
             <w:tcW w:type="dxa" w:w="4300"/>
@@ -5626,6 +5813,9 @@
         </w:tc>
       </w:tr>
       <w:tr>
+        <w:trPr>
+          <w:cantSplit w:val="true"/>
+        </w:trPr>
         <w:tc>
           <w:tcPr>
             <w:tcW w:type="dxa" w:w="4300"/>
@@ -5680,6 +5870,9 @@
         </w:tc>
       </w:tr>
       <w:tr>
+        <w:trPr>
+          <w:cantSplit w:val="true"/>
+        </w:trPr>
         <w:tc>
           <w:tcPr>
             <w:tcW w:type="dxa" w:w="4300"/>
@@ -5732,6 +5925,9 @@
         </w:tc>
       </w:tr>
       <w:tr>
+        <w:trPr>
+          <w:cantSplit w:val="true"/>
+        </w:trPr>
         <w:tc>
           <w:tcPr>
             <w:tcW w:type="dxa" w:w="4300"/>
@@ -5786,6 +5982,9 @@
         </w:tc>
       </w:tr>
       <w:tr>
+        <w:trPr>
+          <w:cantSplit w:val="true"/>
+        </w:trPr>
         <w:tc>
           <w:tcPr>
             <w:tcW w:type="dxa" w:w="4300"/>
@@ -5838,6 +6037,9 @@
         </w:tc>
       </w:tr>
       <w:tr>
+        <w:trPr>
+          <w:cantSplit w:val="true"/>
+        </w:trPr>
         <w:tc>
           <w:tcPr>
             <w:tcW w:type="dxa" w:w="4300"/>
@@ -5892,6 +6094,9 @@
         </w:tc>
       </w:tr>
       <w:tr>
+        <w:trPr>
+          <w:cantSplit w:val="true"/>
+        </w:trPr>
         <w:tc>
           <w:tcPr>
             <w:tcW w:type="dxa" w:w="4300"/>
@@ -5944,6 +6149,9 @@
         </w:tc>
       </w:tr>
       <w:tr>
+        <w:trPr>
+          <w:cantSplit w:val="true"/>
+        </w:trPr>
         <w:tc>
           <w:tcPr>
             <w:tcW w:type="dxa" w:w="4300"/>
@@ -5998,6 +6206,9 @@
         </w:tc>
       </w:tr>
       <w:tr>
+        <w:trPr>
+          <w:cantSplit w:val="true"/>
+        </w:trPr>
         <w:tc>
           <w:tcPr>
             <w:tcW w:type="dxa" w:w="4300"/>
@@ -6050,6 +6261,9 @@
         </w:tc>
       </w:tr>
       <w:tr>
+        <w:trPr>
+          <w:cantSplit w:val="true"/>
+        </w:trPr>
         <w:tc>
           <w:tcPr>
             <w:tcW w:type="dxa" w:w="4300"/>
@@ -6104,6 +6318,9 @@
         </w:tc>
       </w:tr>
       <w:tr>
+        <w:trPr>
+          <w:cantSplit w:val="true"/>
+        </w:trPr>
         <w:tc>
           <w:tcPr>
             <w:tcW w:type="dxa" w:w="4300"/>
@@ -6156,6 +6373,9 @@
         </w:tc>
       </w:tr>
       <w:tr>
+        <w:trPr>
+          <w:cantSplit w:val="true"/>
+        </w:trPr>
         <w:tc>
           <w:tcPr>
             <w:tcW w:type="dxa" w:w="4300"/>
@@ -6210,6 +6430,9 @@
         </w:tc>
       </w:tr>
       <w:tr>
+        <w:trPr>
+          <w:cantSplit w:val="true"/>
+        </w:trPr>
         <w:tc>
           <w:tcPr>
             <w:tcW w:type="dxa" w:w="4300"/>
@@ -6262,6 +6485,9 @@
         </w:tc>
       </w:tr>
       <w:tr>
+        <w:trPr>
+          <w:cantSplit w:val="true"/>
+        </w:trPr>
         <w:tc>
           <w:tcPr>
             <w:tcW w:type="dxa" w:w="4300"/>
@@ -6316,6 +6542,9 @@
         </w:tc>
       </w:tr>
       <w:tr>
+        <w:trPr>
+          <w:cantSplit w:val="true"/>
+        </w:trPr>
         <w:tc>
           <w:tcPr>
             <w:tcW w:type="dxa" w:w="4300"/>
@@ -6368,6 +6597,9 @@
         </w:tc>
       </w:tr>
       <w:tr>
+        <w:trPr>
+          <w:cantSplit w:val="true"/>
+        </w:trPr>
         <w:tc>
           <w:tcPr>
             <w:tcW w:type="dxa" w:w="4300"/>
@@ -6422,6 +6654,9 @@
         </w:tc>
       </w:tr>
       <w:tr>
+        <w:trPr>
+          <w:cantSplit w:val="true"/>
+        </w:trPr>
         <w:tc>
           <w:tcPr>
             <w:tcW w:type="dxa" w:w="4300"/>
@@ -6474,6 +6709,9 @@
         </w:tc>
       </w:tr>
       <w:tr>
+        <w:trPr>
+          <w:cantSplit w:val="true"/>
+        </w:trPr>
         <w:tc>
           <w:tcPr>
             <w:tcW w:type="dxa" w:w="4300"/>
@@ -6528,6 +6766,9 @@
         </w:tc>
       </w:tr>
       <w:tr>
+        <w:trPr>
+          <w:cantSplit w:val="true"/>
+        </w:trPr>
         <w:tc>
           <w:tcPr>
             <w:tcW w:type="dxa" w:w="4300"/>
@@ -6574,12 +6815,127 @@
                 <w:rFonts w:ascii="맑은 고딕" w:hAnsi="맑은 고딕" w:eastAsia="맑은 고딕" w:cs="맑은 고딕"/>
                 <w:sz w:val="16"/>
               </w:rPr>
-              <w:t>journal 또는 증거 정리 단계 실패. 남은 기록·폴더를 삭제하지 않고 진단정보 전달</w:t>
+              <w:t>journal 또는 복구 증거 정리 단계 실패. 아래 대상별 안전 코드를 확인하고 남은 기록·폴더는 보존</w:t>
             </w:r>
           </w:p>
         </w:tc>
       </w:tr>
       <w:tr>
+        <w:trPr>
+          <w:cantSplit w:val="true"/>
+        </w:trPr>
+        <w:tc>
+          <w:tcPr>
+            <w:tcW w:type="dxa" w:w="4300"/>
+            <w:shd w:fill="FAFBFC"/>
+            <w:tcMar>
+              <w:top w:w="80" w:type="dxa"/>
+              <w:start w:w="120" w:type="dxa"/>
+              <w:bottom w:w="80" w:type="dxa"/>
+              <w:end w:w="120" w:type="dxa"/>
+            </w:tcMar>
+            <w:vAlign w:val="center"/>
+          </w:tcPr>
+          <w:p>
+            <w:pPr>
+              <w:spacing w:before="0" w:after="0" w:line="240" w:lineRule="auto"/>
+              <w:jc w:val="left"/>
+            </w:pPr>
+            <w:r>
+              <w:rPr>
+                <w:rFonts w:ascii="맑은 고딕" w:hAnsi="맑은 고딕" w:eastAsia="맑은 고딕" w:cs="맑은 고딕"/>
+                <w:sz w:val="16"/>
+              </w:rPr>
+              <w:t>ROLLBACK_STAGING_CLEANUP_FAILED / ROLLBACK_BACKUP_CLEANUP_FAILED</w:t>
+            </w:r>
+          </w:p>
+        </w:tc>
+        <w:tc>
+          <w:tcPr>
+            <w:tcW w:type="dxa" w:w="5060"/>
+            <w:shd w:fill="FAFBFC"/>
+            <w:tcMar>
+              <w:top w:w="80" w:type="dxa"/>
+              <w:start w:w="120" w:type="dxa"/>
+              <w:bottom w:w="80" w:type="dxa"/>
+              <w:end w:w="120" w:type="dxa"/>
+            </w:tcMar>
+            <w:vAlign w:val="center"/>
+          </w:tcPr>
+          <w:p>
+            <w:pPr>
+              <w:spacing w:before="0" w:after="0" w:line="240" w:lineRule="auto"/>
+              <w:jc w:val="left"/>
+            </w:pPr>
+            <w:r>
+              <w:rPr>
+                <w:rFonts w:ascii="맑은 고딕" w:hAnsi="맑은 고딕" w:eastAsia="맑은 고딕" w:cs="맑은 고딕"/>
+                <w:sz w:val="16"/>
+              </w:rPr>
+              <w:t>현재 작업의 staging 또는 backup 자료 정리 실패. 수동 삭제 없이 익명 진단 전달</w:t>
+            </w:r>
+          </w:p>
+        </w:tc>
+      </w:tr>
+      <w:tr>
+        <w:trPr>
+          <w:cantSplit w:val="true"/>
+        </w:trPr>
+        <w:tc>
+          <w:tcPr>
+            <w:tcW w:type="dxa" w:w="4300"/>
+            <w:tcMar>
+              <w:top w:w="80" w:type="dxa"/>
+              <w:start w:w="120" w:type="dxa"/>
+              <w:bottom w:w="80" w:type="dxa"/>
+              <w:end w:w="120" w:type="dxa"/>
+            </w:tcMar>
+            <w:vAlign w:val="center"/>
+          </w:tcPr>
+          <w:p>
+            <w:pPr>
+              <w:spacing w:before="0" w:after="0" w:line="240" w:lineRule="auto"/>
+              <w:jc w:val="left"/>
+            </w:pPr>
+            <w:r>
+              <w:rPr>
+                <w:rFonts w:ascii="맑은 고딕" w:hAnsi="맑은 고딕" w:eastAsia="맑은 고딕" w:cs="맑은 고딕"/>
+                <w:sz w:val="16"/>
+              </w:rPr>
+              <w:t>ROLLBACK_FAILED_DIRECTORY_CLEANUP_FAILED / ROLLBACK_JOURNAL_CLEANUP_FAILED</w:t>
+            </w:r>
+          </w:p>
+        </w:tc>
+        <w:tc>
+          <w:tcPr>
+            <w:tcW w:type="dxa" w:w="5060"/>
+            <w:tcMar>
+              <w:top w:w="80" w:type="dxa"/>
+              <w:start w:w="120" w:type="dxa"/>
+              <w:bottom w:w="80" w:type="dxa"/>
+              <w:end w:w="120" w:type="dxa"/>
+            </w:tcMar>
+            <w:vAlign w:val="center"/>
+          </w:tcPr>
+          <w:p>
+            <w:pPr>
+              <w:spacing w:before="0" w:after="0" w:line="240" w:lineRule="auto"/>
+              <w:jc w:val="left"/>
+            </w:pPr>
+            <w:r>
+              <w:rPr>
+                <w:rFonts w:ascii="맑은 고딕" w:hAnsi="맑은 고딕" w:eastAsia="맑은 고딕" w:cs="맑은 고딕"/>
+                <w:sz w:val="16"/>
+              </w:rPr>
+              <w:t>현재 작업의 failed 자료 또는 journal 정리·삭제 확인 실패. 설치는 잠긴 상태로 유지</w:t>
+            </w:r>
+          </w:p>
+        </w:tc>
+      </w:tr>
+      <w:tr>
+        <w:trPr>
+          <w:cantSplit w:val="true"/>
+        </w:trPr>
         <w:tc>
           <w:tcPr>
             <w:tcW w:type="dxa" w:w="4300"/>
@@ -6634,6 +6990,9 @@
         </w:tc>
       </w:tr>
       <w:tr>
+        <w:trPr>
+          <w:cantSplit w:val="true"/>
+        </w:trPr>
         <w:tc>
           <w:tcPr>
             <w:tcW w:type="dxa" w:w="4300"/>
@@ -6686,6 +7045,9 @@
         </w:tc>
       </w:tr>
       <w:tr>
+        <w:trPr>
+          <w:cantSplit w:val="true"/>
+        </w:trPr>
         <w:tc>
           <w:tcPr>
             <w:tcW w:type="dxa" w:w="4300"/>
@@ -6740,6 +7102,9 @@
         </w:tc>
       </w:tr>
       <w:tr>
+        <w:trPr>
+          <w:cantSplit w:val="true"/>
+        </w:trPr>
         <w:tc>
           <w:tcPr>
             <w:tcW w:type="dxa" w:w="4300"/>
@@ -6792,6 +7157,9 @@
         </w:tc>
       </w:tr>
       <w:tr>
+        <w:trPr>
+          <w:cantSplit w:val="true"/>
+        </w:trPr>
         <w:tc>
           <w:tcPr>
             <w:tcW w:type="dxa" w:w="4300"/>
@@ -6846,6 +7214,9 @@
         </w:tc>
       </w:tr>
       <w:tr>
+        <w:trPr>
+          <w:cantSplit w:val="true"/>
+        </w:trPr>
         <w:tc>
           <w:tcPr>
             <w:tcW w:type="dxa" w:w="4300"/>
@@ -6898,6 +7269,9 @@
         </w:tc>
       </w:tr>
       <w:tr>
+        <w:trPr>
+          <w:cantSplit w:val="true"/>
+        </w:trPr>
         <w:tc>
           <w:tcPr>
             <w:tcW w:type="dxa" w:w="4300"/>
@@ -6952,6 +7326,9 @@
         </w:tc>
       </w:tr>
       <w:tr>
+        <w:trPr>
+          <w:cantSplit w:val="true"/>
+        </w:trPr>
         <w:tc>
           <w:tcPr>
             <w:tcW w:type="dxa" w:w="4300"/>
@@ -7004,6 +7381,9 @@
         </w:tc>
       </w:tr>
       <w:tr>
+        <w:trPr>
+          <w:cantSplit w:val="true"/>
+        </w:trPr>
         <w:tc>
           <w:tcPr>
             <w:tcW w:type="dxa" w:w="4300"/>
@@ -7058,6 +7438,9 @@
         </w:tc>
       </w:tr>
       <w:tr>
+        <w:trPr>
+          <w:cantSplit w:val="true"/>
+        </w:trPr>
         <w:tc>
           <w:tcPr>
             <w:tcW w:type="dxa" w:w="4300"/>
@@ -7110,6 +7493,9 @@
         </w:tc>
       </w:tr>
       <w:tr>
+        <w:trPr>
+          <w:cantSplit w:val="true"/>
+        </w:trPr>
         <w:tc>
           <w:tcPr>
             <w:tcW w:type="dxa" w:w="4300"/>
@@ -7164,6 +7550,9 @@
         </w:tc>
       </w:tr>
       <w:tr>
+        <w:trPr>
+          <w:cantSplit w:val="true"/>
+        </w:trPr>
         <w:tc>
           <w:tcPr>
             <w:tcW w:type="dxa" w:w="4300"/>
@@ -7216,6 +7605,9 @@
         </w:tc>
       </w:tr>
       <w:tr>
+        <w:trPr>
+          <w:cantSplit w:val="true"/>
+        </w:trPr>
         <w:tc>
           <w:tcPr>
             <w:tcW w:type="dxa" w:w="4300"/>
@@ -7270,6 +7662,9 @@
         </w:tc>
       </w:tr>
       <w:tr>
+        <w:trPr>
+          <w:cantSplit w:val="true"/>
+        </w:trPr>
         <w:tc>
           <w:tcPr>
             <w:tcW w:type="dxa" w:w="4300"/>
@@ -7322,6 +7717,9 @@
         </w:tc>
       </w:tr>
       <w:tr>
+        <w:trPr>
+          <w:cantSplit w:val="true"/>
+        </w:trPr>
         <w:tc>
           <w:tcPr>
             <w:tcW w:type="dxa" w:w="4300"/>
@@ -7376,6 +7774,9 @@
         </w:tc>
       </w:tr>
       <w:tr>
+        <w:trPr>
+          <w:cantSplit w:val="true"/>
+        </w:trPr>
         <w:tc>
           <w:tcPr>
             <w:tcW w:type="dxa" w:w="4300"/>
@@ -7428,6 +7829,9 @@
         </w:tc>
       </w:tr>
       <w:tr>
+        <w:trPr>
+          <w:cantSplit w:val="true"/>
+        </w:trPr>
         <w:tc>
           <w:tcPr>
             <w:tcW w:type="dxa" w:w="4300"/>
@@ -7482,6 +7886,9 @@
         </w:tc>
       </w:tr>
       <w:tr>
+        <w:trPr>
+          <w:cantSplit w:val="true"/>
+        </w:trPr>
         <w:tc>
           <w:tcPr>
             <w:tcW w:type="dxa" w:w="4300"/>
@@ -7534,6 +7941,9 @@
         </w:tc>
       </w:tr>
       <w:tr>
+        <w:trPr>
+          <w:cantSplit w:val="true"/>
+        </w:trPr>
         <w:tc>
           <w:tcPr>
             <w:tcW w:type="dxa" w:w="4300"/>
@@ -7588,6 +7998,9 @@
         </w:tc>
       </w:tr>
       <w:tr>
+        <w:trPr>
+          <w:cantSplit w:val="true"/>
+        </w:trPr>
         <w:tc>
           <w:tcPr>
             <w:tcW w:type="dxa" w:w="4300"/>
@@ -7703,7 +8116,7 @@
           <w:color w:val="16324F"/>
           <w:sz w:val="21"/>
         </w:rPr>
-        <w:t>Setup은 남아 있는 journal을 읽기 전용으로 확인하고 SETUP_RECOVERY_REQUIRED를 표시합니다. 이때 설치/업데이트는 잠겨 있으며 복구가 자동으로 시작되지 않습니다. '이전 상태 복구'를 직접 실행하고, 성공한 경우에만 결과를 확인한 뒤 설치/업데이트를 별도로 시작하세요. 실패하면 '진단정보 복사'로 최초 실패 코드와 ROLLBACK_* 단계를 전달합니다. .__staging_, .__backup_, .__failed_ 폴더와 journal은 원인 확인 증거이므로 삭제·이동·이름 변경하지 마세요.</w:t>
+        <w:t>Setup은 남아 있는 journal을 읽기 전용으로 확인하고 SETUP_RECOVERY_REQUIRED를 표시합니다. 이때 설치/업데이트는 잠겨 있으며 복구가 자동으로 시작되지 않습니다. '이전 상태 복구'를 직접 실행하세요. 정리 대상 삭제와 새 journal 검사가 모두 성공한 경우에만 설치 버튼이 활성화되며, 결과를 확인한 뒤 설치/업데이트를 별도로 시작합니다. 실패하면 '진단정보 복사'로 최초 실패 코드와 실제 경로가 없는 ROLLBACK_* 안전 단계를 전달합니다. .__staging_, .__backup_, .__failed_ 폴더와 journal은 원인 확인 증거이므로 삭제·이동·이름 변경하지 마세요.</w:t>
       </w:r>
     </w:p>
     <w:p>
@@ -7787,6 +8200,7 @@
       <w:tr>
         <w:trPr>
           <w:tblHeader w:val="true"/>
+          <w:cantSplit w:val="true"/>
         </w:trPr>
         <w:tc>
           <w:tcPr>
@@ -7846,6 +8260,9 @@
         </w:tc>
       </w:tr>
       <w:tr>
+        <w:trPr>
+          <w:cantSplit w:val="true"/>
+        </w:trPr>
         <w:tc>
           <w:tcPr>
             <w:tcW w:type="dxa" w:w="1900"/>
@@ -7898,6 +8315,9 @@
         </w:tc>
       </w:tr>
       <w:tr>
+        <w:trPr>
+          <w:cantSplit w:val="true"/>
+        </w:trPr>
         <w:tc>
           <w:tcPr>
             <w:tcW w:type="dxa" w:w="1900"/>
@@ -7952,6 +8372,9 @@
         </w:tc>
       </w:tr>
       <w:tr>
+        <w:trPr>
+          <w:cantSplit w:val="true"/>
+        </w:trPr>
         <w:tc>
           <w:tcPr>
             <w:tcW w:type="dxa" w:w="1900"/>
@@ -8004,6 +8427,9 @@
         </w:tc>
       </w:tr>
       <w:tr>
+        <w:trPr>
+          <w:cantSplit w:val="true"/>
+        </w:trPr>
         <w:tc>
           <w:tcPr>
             <w:tcW w:type="dxa" w:w="1900"/>
@@ -8371,7 +8797,7 @@
         <w:color w:val="64748B"/>
         <w:sz w:val="17"/>
       </w:rPr>
-      <w:t xml:space="preserve">v0.10.8-poc  |  </w:t>
+      <w:t xml:space="preserve">v0.10.9-poc  |  </w:t>
     </w:r>
     <w:r>
       <w:rPr>
@@ -8402,7 +8828,7 @@
         <w:color w:val="64748B"/>
         <w:sz w:val="17"/>
       </w:rPr>
-      <w:t>v0.10.8-poc  |  2026-07-29</w:t>
+      <w:t>v0.10.9-poc  |  2026-07-30</w:t>
     </w:r>
   </w:p>
 </w:ftr>

</xml_diff>

<commit_message>
feat: add offline SWD1 support codes
</commit_message>
<xml_diff>
--- a/docs/SamsungSwitchWatch_User_Manual_KO.docx
+++ b/docs/SamsungSwitchWatch_User_Manual_KO.docx
@@ -1149,7 +1149,7 @@
           <w:color w:val="16324F"/>
           <w:sz w:val="21"/>
         </w:rPr>
-        <w:t>0.10.9-poc는 코드 서명되지 않은 시험판입니다. 압축을 풀기 전에 Agent와 Viewer ZIP의 SHA-256을 해당 GitHub Release 본문에 표시된 값과 비교하고 사내 보안 반입 절차를 완료하세요. SmartScreen 또는 EDR 경고를 우회하지 않습니다.</w:t>
+        <w:t>0.10.10-poc는 코드 서명되지 않은 시험판입니다. 압축을 풀기 전에 Agent와 Viewer ZIP의 SHA-256을 해당 GitHub Release 본문에 표시된 값과 비교하고 사내 보안 반입 절차를 완료하세요. SmartScreen 또는 EDR 경고를 우회하지 않습니다.</w:t>
       </w:r>
     </w:p>
     <w:p>
@@ -1402,6 +1402,34 @@
           <w:sz w:val="21"/>
         </w:rPr>
         <w:t>화면 상단에 SETUP_ROLLBACK_FAILED가 표시되고 복구 자료 정리 분류 아래 ROLLBACK_JOURNAL_CLEANUP_FAILED 같은 대상별 코드가 표시되면, staging·backup·failed·journal 중 검증된 정리 대상을 최대 3회 시도하고 실패한 시도 사이 250ms 대기한 뒤에도 남아 있다는 뜻입니다. 설치 버튼은 계속 잠기며 화면에서 '복구 다시 시도'를 사용할 수 있습니다. 반복되면 '익명 진단 저장'을 사용하고, 폴더나 journal을 수동으로 삭제하지 마세요.</w:t>
+      </w:r>
+    </w:p>
+    <w:p>
+      <w:pPr>
+        <w:keepLines/>
+        <w:spacing w:before="80" w:after="160" w:line="283" w:lineRule="auto"/>
+        <w:ind w:left="115" w:right="58"/>
+        <w:shd w:fill="FFF8E8"/>
+        <w:pBdr>
+          <w:left w:val="single" w:sz="16" w:space="8" w:color="8A5A00"/>
+        </w:pBdr>
+      </w:pPr>
+      <w:r>
+        <w:rPr>
+          <w:rFonts w:ascii="맑은 고딕" w:hAnsi="맑은 고딕" w:eastAsia="맑은 고딕" w:cs="맑은 고딕"/>
+          <w:b/>
+          <w:color w:val="8A5A00"/>
+          <w:sz w:val="21"/>
+        </w:rPr>
+        <w:t xml:space="preserve">짧은 SWD1 지원 코드  </w:t>
+      </w:r>
+      <w:r>
+        <w:rPr>
+          <w:rFonts w:ascii="맑은 고딕" w:hAnsi="맑은 고딕" w:eastAsia="맑은 고딕" w:cs="맑은 고딕"/>
+          <w:color w:val="16324F"/>
+          <w:sz w:val="21"/>
+        </w:rPr>
+        <w:t>실패하면 '지원 코드 · 이 코드만 전달하세요' 아래 SWD1-XXXX-XXXX-XXXX-XXXX 형식의 읽기 전용 코드가 표시됩니다. 별도 복사 버튼은 없으며 코드만 선택해 Ctrl+C로 복사합니다. 전화나 메신저로 짧은 장애 분류를 전달할 때 사용하세요. 이 코드는 오프라인에서 생성되고 CRC로 입력 오타를 확인하지만 비밀값, 인증·페어링 토큰 또는 인증서 지문이 아닙니다. 새 작업과 성공 화면에서는 이전 코드가 지워집니다.</w:t>
       </w:r>
     </w:p>
     <w:p>
@@ -1720,7 +1748,7 @@
           <w:color w:val="16324F"/>
           <w:sz w:val="21"/>
         </w:rPr>
-        <w:t>Agent Setup에 설치 실패가 표시되면 실패 단계와 Cause를 먼저 확인하세요. SETUP_FIREWALL_FAILED는 적용 직후 최대 2초 동안 재확인해도 제품 방화벽 규칙이 정확하지 않다는 뜻입니다. Setup은 실제 주소 대신 안전한 불일치 코드를 표시하고 설치 전 상태로 복구합니다. 규칙을 Any, LocalSubnet 또는 넓은 대역으로 수동 확대하지 마세요. 설치 성공 뒤 AGENT_CONNECTION_REFUSED가 보이면 Viewer에 스위치 IP나 localhost가 아니라 Agent를 설치한 PC의 실제 주소를 입력했는지 먼저 확인하세요. 동일 PC 사전 테스트도 localhost 대신 이 PC의 실제 RFC1918 사설 IPv4를 사용합니다. 그 다음 Agent Setup의 검사에서 SamsungSwitchWatchAgent 서비스와 TCP/18443을 점검합니다. AGENT_CLIENT_NOT_ALLOWED이면 현재 Viewer PC의 고정 IPv4를 Agent Setup에 다시 입력하고 설치/업데이트합니다. 서비스를 수동 등록하지 말고 0.10.9-poc Agent Setup을 사용하세요.</w:t>
+        <w:t>Agent Setup에 설치 실패가 표시되면 실패 단계와 Cause를 먼저 확인하세요. SETUP_FIREWALL_FAILED는 적용 직후 최대 2초 동안 재확인해도 제품 방화벽 규칙이 정확하지 않다는 뜻입니다. Setup은 실제 주소 대신 안전한 불일치 코드를 표시하고 설치 전 상태로 복구합니다. 규칙을 Any, LocalSubnet 또는 넓은 대역으로 수동 확대하지 마세요. 설치 성공 뒤 AGENT_CONNECTION_REFUSED가 보이면 Viewer에 스위치 IP나 localhost가 아니라 Agent를 설치한 PC의 실제 주소를 입력했는지 먼저 확인하세요. 동일 PC 사전 테스트도 localhost 대신 이 PC의 실제 RFC1918 사설 IPv4를 사용합니다. 그 다음 Agent Setup의 검사에서 SamsungSwitchWatchAgent 서비스와 TCP/18443을 점검합니다. AGENT_CLIENT_NOT_ALLOWED이면 현재 Viewer PC의 고정 IPv4를 Agent Setup에 다시 입력하고 설치/업데이트합니다. 서비스를 수동 등록하지 말고 0.10.10-poc Agent Setup을 사용하세요.</w:t>
       </w:r>
     </w:p>
     <w:p>
@@ -1767,7 +1795,7 @@
           <w:color w:val="16324F"/>
           <w:sz w:val="21"/>
         </w:rPr>
-        <w:t>이전 Viewer가 실행 중이면 새 Viewer는 같은 사용자 데이터를 동시에 쓰지 않도록 실행을 차단하고 전환 순서를 표시합니다. 기존 트레이 아이콘에서 '프로그램 종료'를 선택한 뒤 Win+R에서 shell:startup을 열어 'Samsung Switch Watch' 바로 가기를 삭제합니다. 이어 shell:programs에서도 같은 이름의 이전 시작 메뉴 바로 가기를 삭제하고 새 Viewer를 다시 실행하세요. 기존 Agent 연결과 장비 정보는 유지됩니다. 창이 바로 보이지 않으면 알림 영역에서 대시보드를 열고 실행 경로가 새 0.10.9-poc 폴더인지 확인하세요.</w:t>
+        <w:t>이전 Viewer가 실행 중이면 새 Viewer는 같은 사용자 데이터를 동시에 쓰지 않도록 실행을 차단하고 전환 순서를 표시합니다. 기존 트레이 아이콘에서 '프로그램 종료'를 선택한 뒤 Win+R에서 shell:startup을 열어 'Samsung Switch Watch' 바로 가기를 삭제합니다. 이어 shell:programs에서도 같은 이름의 이전 시작 메뉴 바로 가기를 삭제하고 새 Viewer를 다시 실행하세요. 기존 Agent 연결과 장비 정보는 유지됩니다. 창이 바로 보이지 않으면 알림 영역에서 대시보드를 열고 실행 경로가 새 0.10.10-poc 폴더인지 확인하세요.</w:t>
       </w:r>
     </w:p>
     <w:p>
@@ -1865,7 +1893,7 @@
           <w:color w:val="16324F"/>
           <w:sz w:val="21"/>
         </w:rPr>
-        <w:t>0.10.9-poc는 코드 서명되지 않아 SmartScreen이나 사내 EDR이 차단할 수 있습니다. ZIP을 완전히 압축 해제하고 Viewer EXE와 제공된 DLL이 같은 폴더에 있는지 확인하세요. EDR·AppLocker·WDAC가 차단하면 우회하지 말고 공식 ZIP의 버전·해시와 차단 기록을 보안 담당자에게 전달하세요.</w:t>
+        <w:t>0.10.10-poc는 코드 서명되지 않아 SmartScreen이나 사내 EDR이 차단할 수 있습니다. ZIP을 완전히 압축 해제하고 Viewer EXE와 제공된 DLL이 같은 폴더에 있는지 확인하세요. EDR·AppLocker·WDAC가 차단하면 우회하지 말고 공식 ZIP의 버전·해시와 차단 기록을 보안 담당자에게 전달하세요.</w:t>
       </w:r>
     </w:p>
     <w:p>
@@ -1924,7 +1952,7 @@
       <w:r>
         <w:drawing>
           <wp:inline xmlns:a="http://schemas.openxmlformats.org/drawingml/2006/main" xmlns:pic="http://schemas.openxmlformats.org/drawingml/2006/picture">
-            <wp:extent cx="2651760" cy="3635477"/>
+            <wp:extent cx="3200400" cy="4387645"/>
             <wp:docPr id="3" name="Picture 3" title="Agent 연결 창" descr="같은 PC 테스트 결과, 익명 진단 저장과 원격 Agent 주소 입력을 함께 보여 주는 연결 설정 창"/>
             <wp:cNvGraphicFramePr>
               <a:graphicFrameLocks noChangeAspect="1"/>
@@ -1945,7 +1973,7 @@
                   <pic:spPr>
                     <a:xfrm>
                       <a:off x="0" y="0"/>
-                      <a:ext cx="2651760" cy="3635477"/>
+                      <a:ext cx="3200400" cy="4387645"/>
                     </a:xfrm>
                     <a:prstGeom prst="rect"/>
                   </pic:spPr>
@@ -1962,6 +1990,55 @@
       </w:pPr>
       <w:r>
         <w:t>그림 3. 같은 PC Agent/API 테스트, 익명 진단 저장과 원격 연결 설정</w:t>
+      </w:r>
+    </w:p>
+    <w:p>
+      <w:pPr>
+        <w:keepNext/>
+        <w:spacing w:before="80" w:after="0"/>
+        <w:jc w:val="center"/>
+      </w:pPr>
+      <w:r>
+        <w:drawing>
+          <wp:inline xmlns:a="http://schemas.openxmlformats.org/drawingml/2006/main" xmlns:pic="http://schemas.openxmlformats.org/drawingml/2006/picture">
+            <wp:extent cx="3200400" cy="3778250"/>
+            <wp:docPr id="4" name="Picture 4" title="Agent 연결 실패와 지원 코드" descr="TCP 18443 연결 거부 단계와 선택 가능한 SWD1 지원 코드를 함께 표시하는 Viewer Agent 연결 실패 창"/>
+            <wp:cNvGraphicFramePr>
+              <a:graphicFrameLocks noChangeAspect="1"/>
+            </wp:cNvGraphicFramePr>
+            <a:graphic>
+              <a:graphicData uri="http://schemas.openxmlformats.org/drawingml/2006/picture">
+                <pic:pic>
+                  <pic:nvPicPr>
+                    <pic:cNvPr id="0" name="02-agent-connection-failed.png"/>
+                    <pic:cNvPicPr/>
+                  </pic:nvPicPr>
+                  <pic:blipFill>
+                    <a:blip r:embed="rId16"/>
+                    <a:stretch>
+                      <a:fillRect/>
+                    </a:stretch>
+                  </pic:blipFill>
+                  <pic:spPr>
+                    <a:xfrm>
+                      <a:off x="0" y="0"/>
+                      <a:ext cx="3200400" cy="3778250"/>
+                    </a:xfrm>
+                    <a:prstGeom prst="rect"/>
+                  </pic:spPr>
+                </pic:pic>
+              </a:graphicData>
+            </a:graphic>
+          </wp:inline>
+        </w:drawing>
+      </w:r>
+    </w:p>
+    <w:p>
+      <w:pPr>
+        <w:pStyle w:val="Caption"/>
+      </w:pPr>
+      <w:r>
+        <w:t>그림 4. Viewer Agent 연결 실패와 짧은 SWD1 지원 코드</w:t>
       </w:r>
     </w:p>
     <w:p>
@@ -2070,6 +2147,34 @@
     </w:p>
     <w:p>
       <w:pPr>
+        <w:keepLines/>
+        <w:spacing w:before="80" w:after="160" w:line="283" w:lineRule="auto"/>
+        <w:ind w:left="115" w:right="58"/>
+        <w:shd w:fill="FFF8E8"/>
+        <w:pBdr>
+          <w:left w:val="single" w:sz="16" w:space="8" w:color="8A5A00"/>
+        </w:pBdr>
+      </w:pPr>
+      <w:r>
+        <w:rPr>
+          <w:rFonts w:ascii="맑은 고딕" w:hAnsi="맑은 고딕" w:eastAsia="맑은 고딕" w:cs="맑은 고딕"/>
+          <w:b/>
+          <w:color w:val="8A5A00"/>
+          <w:sz w:val="21"/>
+        </w:rPr>
+        <w:t xml:space="preserve">세 가지 진단을 구분하세요  </w:t>
+      </w:r>
+      <w:r>
+        <w:rPr>
+          <w:rFonts w:ascii="맑은 고딕" w:hAnsi="맑은 고딕" w:eastAsia="맑은 고딕" w:cs="맑은 고딕"/>
+          <w:color w:val="16324F"/>
+          <w:sz w:val="21"/>
+        </w:rPr>
+        <w:t>SWD1은 Agent Setup 또는 Viewer 연결 실패를 전화·메신저로 짧게 전달하는 코드입니다. Agent Setup의 '진단정보 복사'는 실패 전용 긴 비식별 요약을 클립보드에 복사하고, '익명 진단 저장'은 작업이나 연결 검사가 끝난 뒤 SSW_FIELD_DIAGNOSTIC/1 상세 TXT를 사용자가 선택해 저장합니다. SWD1은 기존 진단을 대체하지 않으며 접속 권한을 부여하지 않습니다.</w:t>
+      </w:r>
+    </w:p>
+    <w:p>
+      <w:pPr>
         <w:pStyle w:val="Heading1"/>
         <w:pageBreakBefore w:val="0"/>
         <w:numPr>
@@ -2097,7 +2202,7 @@
         <w:drawing>
           <wp:inline xmlns:a="http://schemas.openxmlformats.org/drawingml/2006/main" xmlns:pic="http://schemas.openxmlformats.org/drawingml/2006/picture">
             <wp:extent cx="5029200" cy="3540967"/>
-            <wp:docPr id="4" name="Picture 4" title="장비 관리 창" descr="장비명, 모델, IPv4, 계정 ID, 로그인 비밀번호, enable 비밀번호와 감시 설정을 입력하는 창"/>
+            <wp:docPr id="5" name="Picture 5" title="장비 관리 창" descr="장비명, 모델, IPv4, 계정 ID, 로그인 비밀번호, enable 비밀번호와 감시 설정을 입력하는 창"/>
             <wp:cNvGraphicFramePr>
               <a:graphicFrameLocks noChangeAspect="1"/>
             </wp:cNvGraphicFramePr>
@@ -2109,7 +2214,7 @@
                     <pic:cNvPicPr/>
                   </pic:nvPicPr>
                   <pic:blipFill>
-                    <a:blip r:embed="rId16"/>
+                    <a:blip r:embed="rId17"/>
                     <a:stretch>
                       <a:fillRect/>
                     </a:stretch>
@@ -2133,7 +2238,7 @@
         <w:pStyle w:val="Caption"/>
       </w:pPr>
       <w:r>
-        <w:t>그림 4. Viewer가 보관하는 장비 및 계정 입력 화면</w:t>
+        <w:t>그림 5. Viewer가 보관하는 장비 및 계정 입력 화면</w:t>
       </w:r>
     </w:p>
     <w:tbl>
@@ -2890,7 +2995,7 @@
         <w:drawing>
           <wp:inline xmlns:a="http://schemas.openxmlformats.org/drawingml/2006/main" xmlns:pic="http://schemas.openxmlformats.org/drawingml/2006/picture">
             <wp:extent cx="3977639" cy="2486024"/>
-            <wp:docPr id="5" name="Picture 5" title="장비 명령 실행 화면" descr="show port status를 입력하고 데모 스위치의 익명화된 결과를 확인하는 장비 명령 탭"/>
+            <wp:docPr id="6" name="Picture 6" title="장비 명령 실행 화면" descr="show port status를 입력하고 데모 스위치의 익명화된 결과를 확인하는 장비 명령 탭"/>
             <wp:cNvGraphicFramePr>
               <a:graphicFrameLocks noChangeAspect="1"/>
             </wp:cNvGraphicFramePr>
@@ -2902,7 +3007,7 @@
                     <pic:cNvPicPr/>
                   </pic:nvPicPr>
                   <pic:blipFill>
-                    <a:blip r:embed="rId17"/>
+                    <a:blip r:embed="rId18"/>
                     <a:stretch>
                       <a:fillRect/>
                     </a:stretch>
@@ -2926,7 +3031,7 @@
         <w:pStyle w:val="Caption"/>
       </w:pPr>
       <w:r>
-        <w:t>그림 5. 한 줄 show 명령 실행과 메모리 내 결과 확인</w:t>
+        <w:t>그림 6. 한 줄 show 명령 실행과 메모리 내 결과 확인</w:t>
       </w:r>
     </w:p>
     <w:tbl>
@@ -3975,7 +4080,7 @@
         <w:drawing>
           <wp:inline xmlns:a="http://schemas.openxmlformats.org/drawingml/2006/main" xmlns:pic="http://schemas.openxmlformats.org/drawingml/2006/picture">
             <wp:extent cx="4754880" cy="2971800"/>
-            <wp:docPr id="6" name="Picture 6" title="Viewer 대시보드" descr="장비 목록, 선택 장비 상태, 최근 이벤트와 Viewer 감시 상태를 보여 주는 대시보드"/>
+            <wp:docPr id="7" name="Picture 7" title="Viewer 대시보드" descr="장비 목록, 선택 장비 상태, 최근 이벤트와 Viewer 감시 상태를 보여 주는 대시보드"/>
             <wp:cNvGraphicFramePr>
               <a:graphicFrameLocks noChangeAspect="1"/>
             </wp:cNvGraphicFramePr>
@@ -3987,7 +4092,7 @@
                     <pic:cNvPicPr/>
                   </pic:nvPicPr>
                   <pic:blipFill>
-                    <a:blip r:embed="rId18"/>
+                    <a:blip r:embed="rId19"/>
                     <a:stretch>
                       <a:fillRect/>
                     </a:stretch>
@@ -4011,7 +4116,7 @@
         <w:pStyle w:val="Caption"/>
       </w:pPr>
       <w:r>
-        <w:t>그림 6. Viewer 중심 대시보드 전체 화면</w:t>
+        <w:t>그림 7. Viewer 중심 대시보드 전체 화면</w:t>
       </w:r>
     </w:p>
     <w:tbl>
@@ -4510,7 +4615,7 @@
         <w:drawing>
           <wp:inline xmlns:a="http://schemas.openxmlformats.org/drawingml/2006/main" xmlns:pic="http://schemas.openxmlformats.org/drawingml/2006/picture">
             <wp:extent cx="2971800" cy="1816099"/>
-            <wp:docPr id="7" name="Picture 7" title="항상 위 미니 창" descr="정상, 경고, 장애 수와 최근 문제를 보여 주는 작은 항상 위 창"/>
+            <wp:docPr id="8" name="Picture 8" title="항상 위 미니 창" descr="정상, 경고, 장애 수와 최근 문제를 보여 주는 작은 항상 위 창"/>
             <wp:cNvGraphicFramePr>
               <a:graphicFrameLocks noChangeAspect="1"/>
             </wp:cNvGraphicFramePr>
@@ -4522,7 +4627,7 @@
                     <pic:cNvPicPr/>
                   </pic:nvPicPr>
                   <pic:blipFill>
-                    <a:blip r:embed="rId19"/>
+                    <a:blip r:embed="rId20"/>
                     <a:stretch>
                       <a:fillRect/>
                     </a:stretch>
@@ -4546,7 +4651,7 @@
         <w:pStyle w:val="Caption"/>
       </w:pPr>
       <w:r>
-        <w:t>그림 7. 반복 운영용 미니 창</w:t>
+        <w:t>그림 8. 반복 운영용 미니 창</w:t>
       </w:r>
     </w:p>
     <w:p>
@@ -4559,7 +4664,7 @@
         <w:drawing>
           <wp:inline xmlns:a="http://schemas.openxmlformats.org/drawingml/2006/main" xmlns:pic="http://schemas.openxmlformats.org/drawingml/2006/picture">
             <wp:extent cx="3154680" cy="1296924"/>
-            <wp:docPr id="8" name="Picture 8" title="장애 알림 팝업" descr="데모 업링크 포트 Down 장애와 발생 시각을 보여 주는 알림 팝업"/>
+            <wp:docPr id="9" name="Picture 9" title="장애 알림 팝업" descr="데모 업링크 포트 Down 장애와 발생 시각을 보여 주는 알림 팝업"/>
             <wp:cNvGraphicFramePr>
               <a:graphicFrameLocks noChangeAspect="1"/>
             </wp:cNvGraphicFramePr>
@@ -4571,7 +4676,7 @@
                     <pic:cNvPicPr/>
                   </pic:nvPicPr>
                   <pic:blipFill>
-                    <a:blip r:embed="rId20"/>
+                    <a:blip r:embed="rId21"/>
                     <a:stretch>
                       <a:fillRect/>
                     </a:stretch>
@@ -4595,7 +4700,7 @@
         <w:pStyle w:val="Caption"/>
       </w:pPr>
       <w:r>
-        <w:t>그림 8. 새 장애 알림 팝업</w:t>
+        <w:t>그림 9. 새 장애 알림 팝업</w:t>
       </w:r>
     </w:p>
     <w:p>
@@ -8797,7 +8902,7 @@
         <w:color w:val="64748B"/>
         <w:sz w:val="17"/>
       </w:rPr>
-      <w:t xml:space="preserve">v0.10.9-poc  |  </w:t>
+      <w:t xml:space="preserve">v0.10.10-poc  |  </w:t>
     </w:r>
     <w:r>
       <w:rPr>
@@ -8828,7 +8933,7 @@
         <w:color w:val="64748B"/>
         <w:sz w:val="17"/>
       </w:rPr>
-      <w:t>v0.10.9-poc  |  2026-07-30</w:t>
+      <w:t>v0.10.10-poc  |  2026-07-30</w:t>
     </w:r>
   </w:p>
 </w:ftr>

</xml_diff>

<commit_message>
feat: add offline SWD1 support codes (#46)
Show a short, offline, sanitized support code only on Agent Setup and Viewer connection failures. Preserve the existing diagnostic formats and runtime ownership model; update tests, manuals, Figma handoff, and the 0.10.10-poc release contract.
</commit_message>
<xml_diff>
--- a/docs/SamsungSwitchWatch_User_Manual_KO.docx
+++ b/docs/SamsungSwitchWatch_User_Manual_KO.docx
@@ -1149,7 +1149,7 @@
           <w:color w:val="16324F"/>
           <w:sz w:val="21"/>
         </w:rPr>
-        <w:t>0.10.9-poc는 코드 서명되지 않은 시험판입니다. 압축을 풀기 전에 Agent와 Viewer ZIP의 SHA-256을 해당 GitHub Release 본문에 표시된 값과 비교하고 사내 보안 반입 절차를 완료하세요. SmartScreen 또는 EDR 경고를 우회하지 않습니다.</w:t>
+        <w:t>0.10.10-poc는 코드 서명되지 않은 시험판입니다. 압축을 풀기 전에 Agent와 Viewer ZIP의 SHA-256을 해당 GitHub Release 본문에 표시된 값과 비교하고 사내 보안 반입 절차를 완료하세요. SmartScreen 또는 EDR 경고를 우회하지 않습니다.</w:t>
       </w:r>
     </w:p>
     <w:p>
@@ -1402,6 +1402,34 @@
           <w:sz w:val="21"/>
         </w:rPr>
         <w:t>화면 상단에 SETUP_ROLLBACK_FAILED가 표시되고 복구 자료 정리 분류 아래 ROLLBACK_JOURNAL_CLEANUP_FAILED 같은 대상별 코드가 표시되면, staging·backup·failed·journal 중 검증된 정리 대상을 최대 3회 시도하고 실패한 시도 사이 250ms 대기한 뒤에도 남아 있다는 뜻입니다. 설치 버튼은 계속 잠기며 화면에서 '복구 다시 시도'를 사용할 수 있습니다. 반복되면 '익명 진단 저장'을 사용하고, 폴더나 journal을 수동으로 삭제하지 마세요.</w:t>
+      </w:r>
+    </w:p>
+    <w:p>
+      <w:pPr>
+        <w:keepLines/>
+        <w:spacing w:before="80" w:after="160" w:line="283" w:lineRule="auto"/>
+        <w:ind w:left="115" w:right="58"/>
+        <w:shd w:fill="FFF8E8"/>
+        <w:pBdr>
+          <w:left w:val="single" w:sz="16" w:space="8" w:color="8A5A00"/>
+        </w:pBdr>
+      </w:pPr>
+      <w:r>
+        <w:rPr>
+          <w:rFonts w:ascii="맑은 고딕" w:hAnsi="맑은 고딕" w:eastAsia="맑은 고딕" w:cs="맑은 고딕"/>
+          <w:b/>
+          <w:color w:val="8A5A00"/>
+          <w:sz w:val="21"/>
+        </w:rPr>
+        <w:t xml:space="preserve">짧은 SWD1 지원 코드  </w:t>
+      </w:r>
+      <w:r>
+        <w:rPr>
+          <w:rFonts w:ascii="맑은 고딕" w:hAnsi="맑은 고딕" w:eastAsia="맑은 고딕" w:cs="맑은 고딕"/>
+          <w:color w:val="16324F"/>
+          <w:sz w:val="21"/>
+        </w:rPr>
+        <w:t>실패하면 '지원 코드 · 이 코드만 전달하세요' 아래 SWD1-XXXX-XXXX-XXXX-XXXX 형식의 읽기 전용 코드가 표시됩니다. 별도 복사 버튼은 없으며 코드만 선택해 Ctrl+C로 복사합니다. 전화나 메신저로 짧은 장애 분류를 전달할 때 사용하세요. 이 코드는 오프라인에서 생성되고 CRC로 입력 오타를 확인하지만 비밀값, 인증·페어링 토큰 또는 인증서 지문이 아닙니다. 새 작업과 성공 화면에서는 이전 코드가 지워집니다.</w:t>
       </w:r>
     </w:p>
     <w:p>
@@ -1720,7 +1748,7 @@
           <w:color w:val="16324F"/>
           <w:sz w:val="21"/>
         </w:rPr>
-        <w:t>Agent Setup에 설치 실패가 표시되면 실패 단계와 Cause를 먼저 확인하세요. SETUP_FIREWALL_FAILED는 적용 직후 최대 2초 동안 재확인해도 제품 방화벽 규칙이 정확하지 않다는 뜻입니다. Setup은 실제 주소 대신 안전한 불일치 코드를 표시하고 설치 전 상태로 복구합니다. 규칙을 Any, LocalSubnet 또는 넓은 대역으로 수동 확대하지 마세요. 설치 성공 뒤 AGENT_CONNECTION_REFUSED가 보이면 Viewer에 스위치 IP나 localhost가 아니라 Agent를 설치한 PC의 실제 주소를 입력했는지 먼저 확인하세요. 동일 PC 사전 테스트도 localhost 대신 이 PC의 실제 RFC1918 사설 IPv4를 사용합니다. 그 다음 Agent Setup의 검사에서 SamsungSwitchWatchAgent 서비스와 TCP/18443을 점검합니다. AGENT_CLIENT_NOT_ALLOWED이면 현재 Viewer PC의 고정 IPv4를 Agent Setup에 다시 입력하고 설치/업데이트합니다. 서비스를 수동 등록하지 말고 0.10.9-poc Agent Setup을 사용하세요.</w:t>
+        <w:t>Agent Setup에 설치 실패가 표시되면 실패 단계와 Cause를 먼저 확인하세요. SETUP_FIREWALL_FAILED는 적용 직후 최대 2초 동안 재확인해도 제품 방화벽 규칙이 정확하지 않다는 뜻입니다. Setup은 실제 주소 대신 안전한 불일치 코드를 표시하고 설치 전 상태로 복구합니다. 규칙을 Any, LocalSubnet 또는 넓은 대역으로 수동 확대하지 마세요. 설치 성공 뒤 AGENT_CONNECTION_REFUSED가 보이면 Viewer에 스위치 IP나 localhost가 아니라 Agent를 설치한 PC의 실제 주소를 입력했는지 먼저 확인하세요. 동일 PC 사전 테스트도 localhost 대신 이 PC의 실제 RFC1918 사설 IPv4를 사용합니다. 그 다음 Agent Setup의 검사에서 SamsungSwitchWatchAgent 서비스와 TCP/18443을 점검합니다. AGENT_CLIENT_NOT_ALLOWED이면 현재 Viewer PC의 고정 IPv4를 Agent Setup에 다시 입력하고 설치/업데이트합니다. 서비스를 수동 등록하지 말고 0.10.10-poc Agent Setup을 사용하세요.</w:t>
       </w:r>
     </w:p>
     <w:p>
@@ -1767,7 +1795,7 @@
           <w:color w:val="16324F"/>
           <w:sz w:val="21"/>
         </w:rPr>
-        <w:t>이전 Viewer가 실행 중이면 새 Viewer는 같은 사용자 데이터를 동시에 쓰지 않도록 실행을 차단하고 전환 순서를 표시합니다. 기존 트레이 아이콘에서 '프로그램 종료'를 선택한 뒤 Win+R에서 shell:startup을 열어 'Samsung Switch Watch' 바로 가기를 삭제합니다. 이어 shell:programs에서도 같은 이름의 이전 시작 메뉴 바로 가기를 삭제하고 새 Viewer를 다시 실행하세요. 기존 Agent 연결과 장비 정보는 유지됩니다. 창이 바로 보이지 않으면 알림 영역에서 대시보드를 열고 실행 경로가 새 0.10.9-poc 폴더인지 확인하세요.</w:t>
+        <w:t>이전 Viewer가 실행 중이면 새 Viewer는 같은 사용자 데이터를 동시에 쓰지 않도록 실행을 차단하고 전환 순서를 표시합니다. 기존 트레이 아이콘에서 '프로그램 종료'를 선택한 뒤 Win+R에서 shell:startup을 열어 'Samsung Switch Watch' 바로 가기를 삭제합니다. 이어 shell:programs에서도 같은 이름의 이전 시작 메뉴 바로 가기를 삭제하고 새 Viewer를 다시 실행하세요. 기존 Agent 연결과 장비 정보는 유지됩니다. 창이 바로 보이지 않으면 알림 영역에서 대시보드를 열고 실행 경로가 새 0.10.10-poc 폴더인지 확인하세요.</w:t>
       </w:r>
     </w:p>
     <w:p>
@@ -1865,7 +1893,7 @@
           <w:color w:val="16324F"/>
           <w:sz w:val="21"/>
         </w:rPr>
-        <w:t>0.10.9-poc는 코드 서명되지 않아 SmartScreen이나 사내 EDR이 차단할 수 있습니다. ZIP을 완전히 압축 해제하고 Viewer EXE와 제공된 DLL이 같은 폴더에 있는지 확인하세요. EDR·AppLocker·WDAC가 차단하면 우회하지 말고 공식 ZIP의 버전·해시와 차단 기록을 보안 담당자에게 전달하세요.</w:t>
+        <w:t>0.10.10-poc는 코드 서명되지 않아 SmartScreen이나 사내 EDR이 차단할 수 있습니다. ZIP을 완전히 압축 해제하고 Viewer EXE와 제공된 DLL이 같은 폴더에 있는지 확인하세요. EDR·AppLocker·WDAC가 차단하면 우회하지 말고 공식 ZIP의 버전·해시와 차단 기록을 보안 담당자에게 전달하세요.</w:t>
       </w:r>
     </w:p>
     <w:p>
@@ -1924,7 +1952,7 @@
       <w:r>
         <w:drawing>
           <wp:inline xmlns:a="http://schemas.openxmlformats.org/drawingml/2006/main" xmlns:pic="http://schemas.openxmlformats.org/drawingml/2006/picture">
-            <wp:extent cx="2651760" cy="3635477"/>
+            <wp:extent cx="3200400" cy="4387645"/>
             <wp:docPr id="3" name="Picture 3" title="Agent 연결 창" descr="같은 PC 테스트 결과, 익명 진단 저장과 원격 Agent 주소 입력을 함께 보여 주는 연결 설정 창"/>
             <wp:cNvGraphicFramePr>
               <a:graphicFrameLocks noChangeAspect="1"/>
@@ -1945,7 +1973,7 @@
                   <pic:spPr>
                     <a:xfrm>
                       <a:off x="0" y="0"/>
-                      <a:ext cx="2651760" cy="3635477"/>
+                      <a:ext cx="3200400" cy="4387645"/>
                     </a:xfrm>
                     <a:prstGeom prst="rect"/>
                   </pic:spPr>
@@ -1962,6 +1990,55 @@
       </w:pPr>
       <w:r>
         <w:t>그림 3. 같은 PC Agent/API 테스트, 익명 진단 저장과 원격 연결 설정</w:t>
+      </w:r>
+    </w:p>
+    <w:p>
+      <w:pPr>
+        <w:keepNext/>
+        <w:spacing w:before="80" w:after="0"/>
+        <w:jc w:val="center"/>
+      </w:pPr>
+      <w:r>
+        <w:drawing>
+          <wp:inline xmlns:a="http://schemas.openxmlformats.org/drawingml/2006/main" xmlns:pic="http://schemas.openxmlformats.org/drawingml/2006/picture">
+            <wp:extent cx="3200400" cy="3778250"/>
+            <wp:docPr id="4" name="Picture 4" title="Agent 연결 실패와 지원 코드" descr="TCP 18443 연결 거부 단계와 선택 가능한 SWD1 지원 코드를 함께 표시하는 Viewer Agent 연결 실패 창"/>
+            <wp:cNvGraphicFramePr>
+              <a:graphicFrameLocks noChangeAspect="1"/>
+            </wp:cNvGraphicFramePr>
+            <a:graphic>
+              <a:graphicData uri="http://schemas.openxmlformats.org/drawingml/2006/picture">
+                <pic:pic>
+                  <pic:nvPicPr>
+                    <pic:cNvPr id="0" name="02-agent-connection-failed.png"/>
+                    <pic:cNvPicPr/>
+                  </pic:nvPicPr>
+                  <pic:blipFill>
+                    <a:blip r:embed="rId16"/>
+                    <a:stretch>
+                      <a:fillRect/>
+                    </a:stretch>
+                  </pic:blipFill>
+                  <pic:spPr>
+                    <a:xfrm>
+                      <a:off x="0" y="0"/>
+                      <a:ext cx="3200400" cy="3778250"/>
+                    </a:xfrm>
+                    <a:prstGeom prst="rect"/>
+                  </pic:spPr>
+                </pic:pic>
+              </a:graphicData>
+            </a:graphic>
+          </wp:inline>
+        </w:drawing>
+      </w:r>
+    </w:p>
+    <w:p>
+      <w:pPr>
+        <w:pStyle w:val="Caption"/>
+      </w:pPr>
+      <w:r>
+        <w:t>그림 4. Viewer Agent 연결 실패와 짧은 SWD1 지원 코드</w:t>
       </w:r>
     </w:p>
     <w:p>
@@ -2070,6 +2147,34 @@
     </w:p>
     <w:p>
       <w:pPr>
+        <w:keepLines/>
+        <w:spacing w:before="80" w:after="160" w:line="283" w:lineRule="auto"/>
+        <w:ind w:left="115" w:right="58"/>
+        <w:shd w:fill="FFF8E8"/>
+        <w:pBdr>
+          <w:left w:val="single" w:sz="16" w:space="8" w:color="8A5A00"/>
+        </w:pBdr>
+      </w:pPr>
+      <w:r>
+        <w:rPr>
+          <w:rFonts w:ascii="맑은 고딕" w:hAnsi="맑은 고딕" w:eastAsia="맑은 고딕" w:cs="맑은 고딕"/>
+          <w:b/>
+          <w:color w:val="8A5A00"/>
+          <w:sz w:val="21"/>
+        </w:rPr>
+        <w:t xml:space="preserve">세 가지 진단을 구분하세요  </w:t>
+      </w:r>
+      <w:r>
+        <w:rPr>
+          <w:rFonts w:ascii="맑은 고딕" w:hAnsi="맑은 고딕" w:eastAsia="맑은 고딕" w:cs="맑은 고딕"/>
+          <w:color w:val="16324F"/>
+          <w:sz w:val="21"/>
+        </w:rPr>
+        <w:t>SWD1은 Agent Setup 또는 Viewer 연결 실패를 전화·메신저로 짧게 전달하는 코드입니다. Agent Setup의 '진단정보 복사'는 실패 전용 긴 비식별 요약을 클립보드에 복사하고, '익명 진단 저장'은 작업이나 연결 검사가 끝난 뒤 SSW_FIELD_DIAGNOSTIC/1 상세 TXT를 사용자가 선택해 저장합니다. SWD1은 기존 진단을 대체하지 않으며 접속 권한을 부여하지 않습니다.</w:t>
+      </w:r>
+    </w:p>
+    <w:p>
+      <w:pPr>
         <w:pStyle w:val="Heading1"/>
         <w:pageBreakBefore w:val="0"/>
         <w:numPr>
@@ -2097,7 +2202,7 @@
         <w:drawing>
           <wp:inline xmlns:a="http://schemas.openxmlformats.org/drawingml/2006/main" xmlns:pic="http://schemas.openxmlformats.org/drawingml/2006/picture">
             <wp:extent cx="5029200" cy="3540967"/>
-            <wp:docPr id="4" name="Picture 4" title="장비 관리 창" descr="장비명, 모델, IPv4, 계정 ID, 로그인 비밀번호, enable 비밀번호와 감시 설정을 입력하는 창"/>
+            <wp:docPr id="5" name="Picture 5" title="장비 관리 창" descr="장비명, 모델, IPv4, 계정 ID, 로그인 비밀번호, enable 비밀번호와 감시 설정을 입력하는 창"/>
             <wp:cNvGraphicFramePr>
               <a:graphicFrameLocks noChangeAspect="1"/>
             </wp:cNvGraphicFramePr>
@@ -2109,7 +2214,7 @@
                     <pic:cNvPicPr/>
                   </pic:nvPicPr>
                   <pic:blipFill>
-                    <a:blip r:embed="rId16"/>
+                    <a:blip r:embed="rId17"/>
                     <a:stretch>
                       <a:fillRect/>
                     </a:stretch>
@@ -2133,7 +2238,7 @@
         <w:pStyle w:val="Caption"/>
       </w:pPr>
       <w:r>
-        <w:t>그림 4. Viewer가 보관하는 장비 및 계정 입력 화면</w:t>
+        <w:t>그림 5. Viewer가 보관하는 장비 및 계정 입력 화면</w:t>
       </w:r>
     </w:p>
     <w:tbl>
@@ -2890,7 +2995,7 @@
         <w:drawing>
           <wp:inline xmlns:a="http://schemas.openxmlformats.org/drawingml/2006/main" xmlns:pic="http://schemas.openxmlformats.org/drawingml/2006/picture">
             <wp:extent cx="3977639" cy="2486024"/>
-            <wp:docPr id="5" name="Picture 5" title="장비 명령 실행 화면" descr="show port status를 입력하고 데모 스위치의 익명화된 결과를 확인하는 장비 명령 탭"/>
+            <wp:docPr id="6" name="Picture 6" title="장비 명령 실행 화면" descr="show port status를 입력하고 데모 스위치의 익명화된 결과를 확인하는 장비 명령 탭"/>
             <wp:cNvGraphicFramePr>
               <a:graphicFrameLocks noChangeAspect="1"/>
             </wp:cNvGraphicFramePr>
@@ -2902,7 +3007,7 @@
                     <pic:cNvPicPr/>
                   </pic:nvPicPr>
                   <pic:blipFill>
-                    <a:blip r:embed="rId17"/>
+                    <a:blip r:embed="rId18"/>
                     <a:stretch>
                       <a:fillRect/>
                     </a:stretch>
@@ -2926,7 +3031,7 @@
         <w:pStyle w:val="Caption"/>
       </w:pPr>
       <w:r>
-        <w:t>그림 5. 한 줄 show 명령 실행과 메모리 내 결과 확인</w:t>
+        <w:t>그림 6. 한 줄 show 명령 실행과 메모리 내 결과 확인</w:t>
       </w:r>
     </w:p>
     <w:tbl>
@@ -3975,7 +4080,7 @@
         <w:drawing>
           <wp:inline xmlns:a="http://schemas.openxmlformats.org/drawingml/2006/main" xmlns:pic="http://schemas.openxmlformats.org/drawingml/2006/picture">
             <wp:extent cx="4754880" cy="2971800"/>
-            <wp:docPr id="6" name="Picture 6" title="Viewer 대시보드" descr="장비 목록, 선택 장비 상태, 최근 이벤트와 Viewer 감시 상태를 보여 주는 대시보드"/>
+            <wp:docPr id="7" name="Picture 7" title="Viewer 대시보드" descr="장비 목록, 선택 장비 상태, 최근 이벤트와 Viewer 감시 상태를 보여 주는 대시보드"/>
             <wp:cNvGraphicFramePr>
               <a:graphicFrameLocks noChangeAspect="1"/>
             </wp:cNvGraphicFramePr>
@@ -3987,7 +4092,7 @@
                     <pic:cNvPicPr/>
                   </pic:nvPicPr>
                   <pic:blipFill>
-                    <a:blip r:embed="rId18"/>
+                    <a:blip r:embed="rId19"/>
                     <a:stretch>
                       <a:fillRect/>
                     </a:stretch>
@@ -4011,7 +4116,7 @@
         <w:pStyle w:val="Caption"/>
       </w:pPr>
       <w:r>
-        <w:t>그림 6. Viewer 중심 대시보드 전체 화면</w:t>
+        <w:t>그림 7. Viewer 중심 대시보드 전체 화면</w:t>
       </w:r>
     </w:p>
     <w:tbl>
@@ -4510,7 +4615,7 @@
         <w:drawing>
           <wp:inline xmlns:a="http://schemas.openxmlformats.org/drawingml/2006/main" xmlns:pic="http://schemas.openxmlformats.org/drawingml/2006/picture">
             <wp:extent cx="2971800" cy="1816099"/>
-            <wp:docPr id="7" name="Picture 7" title="항상 위 미니 창" descr="정상, 경고, 장애 수와 최근 문제를 보여 주는 작은 항상 위 창"/>
+            <wp:docPr id="8" name="Picture 8" title="항상 위 미니 창" descr="정상, 경고, 장애 수와 최근 문제를 보여 주는 작은 항상 위 창"/>
             <wp:cNvGraphicFramePr>
               <a:graphicFrameLocks noChangeAspect="1"/>
             </wp:cNvGraphicFramePr>
@@ -4522,7 +4627,7 @@
                     <pic:cNvPicPr/>
                   </pic:nvPicPr>
                   <pic:blipFill>
-                    <a:blip r:embed="rId19"/>
+                    <a:blip r:embed="rId20"/>
                     <a:stretch>
                       <a:fillRect/>
                     </a:stretch>
@@ -4546,7 +4651,7 @@
         <w:pStyle w:val="Caption"/>
       </w:pPr>
       <w:r>
-        <w:t>그림 7. 반복 운영용 미니 창</w:t>
+        <w:t>그림 8. 반복 운영용 미니 창</w:t>
       </w:r>
     </w:p>
     <w:p>
@@ -4559,7 +4664,7 @@
         <w:drawing>
           <wp:inline xmlns:a="http://schemas.openxmlformats.org/drawingml/2006/main" xmlns:pic="http://schemas.openxmlformats.org/drawingml/2006/picture">
             <wp:extent cx="3154680" cy="1296924"/>
-            <wp:docPr id="8" name="Picture 8" title="장애 알림 팝업" descr="데모 업링크 포트 Down 장애와 발생 시각을 보여 주는 알림 팝업"/>
+            <wp:docPr id="9" name="Picture 9" title="장애 알림 팝업" descr="데모 업링크 포트 Down 장애와 발생 시각을 보여 주는 알림 팝업"/>
             <wp:cNvGraphicFramePr>
               <a:graphicFrameLocks noChangeAspect="1"/>
             </wp:cNvGraphicFramePr>
@@ -4571,7 +4676,7 @@
                     <pic:cNvPicPr/>
                   </pic:nvPicPr>
                   <pic:blipFill>
-                    <a:blip r:embed="rId20"/>
+                    <a:blip r:embed="rId21"/>
                     <a:stretch>
                       <a:fillRect/>
                     </a:stretch>
@@ -4595,7 +4700,7 @@
         <w:pStyle w:val="Caption"/>
       </w:pPr>
       <w:r>
-        <w:t>그림 8. 새 장애 알림 팝업</w:t>
+        <w:t>그림 9. 새 장애 알림 팝업</w:t>
       </w:r>
     </w:p>
     <w:p>
@@ -8797,7 +8902,7 @@
         <w:color w:val="64748B"/>
         <w:sz w:val="17"/>
       </w:rPr>
-      <w:t xml:space="preserve">v0.10.9-poc  |  </w:t>
+      <w:t xml:space="preserve">v0.10.10-poc  |  </w:t>
     </w:r>
     <w:r>
       <w:rPr>
@@ -8828,7 +8933,7 @@
         <w:color w:val="64748B"/>
         <w:sz w:val="17"/>
       </w:rPr>
-      <w:t>v0.10.9-poc  |  2026-07-30</w:t>
+      <w:t>v0.10.10-poc  |  2026-07-30</w:t>
     </w:r>
   </w:p>
 </w:ftr>

</xml_diff>

<commit_message>
fix(agent-setup): harden readiness and rollback
</commit_message>
<xml_diff>
--- a/docs/SamsungSwitchWatch_User_Manual_KO.docx
+++ b/docs/SamsungSwitchWatch_User_Manual_KO.docx
@@ -1149,7 +1149,7 @@
           <w:color w:val="16324F"/>
           <w:sz w:val="21"/>
         </w:rPr>
-        <w:t>0.10.10-poc는 코드 서명되지 않은 시험판입니다. 압축을 풀기 전에 Agent와 Viewer ZIP의 SHA-256을 해당 GitHub Release 본문에 표시된 값과 비교하고 사내 보안 반입 절차를 완료하세요. SmartScreen 또는 EDR 경고를 우회하지 않습니다.</w:t>
+        <w:t>0.10.11-poc는 코드 서명되지 않은 시험판입니다. 압축을 풀기 전에 Agent와 Viewer ZIP의 SHA-256을 해당 GitHub Release 본문에 표시된 값과 비교하고 사내 보안 반입 절차를 완료하세요. SmartScreen 또는 EDR 경고를 우회하지 않습니다.</w:t>
       </w:r>
     </w:p>
     <w:p>
@@ -1636,7 +1636,7 @@
           <w:color w:val="16324F"/>
           <w:sz w:val="21"/>
         </w:rPr>
-        <w:t>Setup은 BUILD-MANIFEST.json과 Agent 실행 파일 SHA-256을 확인하고, Program Files의 임시 staging에 복사한 파일을 다시 검사한 뒤 교체합니다. 서비스·프로그램·방화벽 변경 중 현재 작업이 실패하면 설치 전 상태로 되돌리기를 시도합니다. 다음 실행에서 완료되지 않은 journal이 남아 있으면 자동 복구하지 않고 별도의 '이전 상태 복구' 작업을 요구합니다. staging·backup·failed·journal 정리가 잠시 실패하면 정확히 검증된 대상만 최대 3회 시도하고 실패한 시도 사이 250ms 대기한 뒤 삭제 결과를 확인합니다. 복구까지 실패하면 최초 설치 실패 코드를 별도로 유지하고 SETUP_ROLLBACK_FAILED와 실패한 ROLLBACK_* 단계를 함께 표시합니다.</w:t>
+        <w:t>Setup은 BUILD-MANIFEST.json과 Agent 실행 파일 SHA-256을 확인하고, Program Files의 임시 staging에 복사한 파일을 다시 검사한 뒤 교체합니다. 서비스·프로그램·방화벽 변경 중 현재 작업이 실패하면 설치 전 상태로 되돌리기를 시도합니다. 다음 실행에서 완료되지 않은 journal이 남아 있으면 자동 복구하지 않고 별도의 '이전 상태 복구' 작업을 요구합니다. 새 서비스의 자동 재시작은 readiness 성공 뒤에만 적용하고, 검사 중에는 현재 서비스 PID와 TCP/18443 소유를 매번 다시 확인합니다. rollback 전에는 관찰한 서비스 프로세스 종료를 확인하고 프로그램 폴더의 일시적 잠금만 최대 5회 제한적으로 재시도합니다. staging·backup·failed·journal 정리가 잠시 실패하면 정확히 검증된 대상만 최대 3회 시도하고 실패한 시도 사이 250ms 대기한 뒤 삭제 결과를 확인합니다. 복구까지 실패하면 최초 설치 실패 코드를 별도로 유지하고 SETUP_ROLLBACK_FAILED와 실패한 ROLLBACK_* 단계를 함께 표시합니다.</w:t>
       </w:r>
     </w:p>
     <w:p>
@@ -1664,7 +1664,7 @@
           <w:color w:val="16324F"/>
           <w:sz w:val="21"/>
         </w:rPr>
-        <w:t>설치 또는 복구가 실패한 경우에만 '진단정보 복사' 버튼이 나타납니다. 복사 내용에는 프로그램 버전, UTC 시각, 작업 종류, 최초 실패 코드, ROLLBACK_* 코드, journal 단계와 파일·서비스 존재 여부만 포함됩니다. 실제 IP/CIDR, PC·사용자 이름, 절대 경로, 계정, 비밀번호, 인증서, 방화벽 규칙 원문과 장비 명령·출력은 포함하지 않으며 별도 로그 파일로 저장하지 않습니다.</w:t>
+        <w:t>설치 또는 복구가 실패한 경우에만 '진단정보 복사' 버튼이 나타납니다. 복사 내용에는 프로그램 버전, UTC 시각, 작업 종류, 최초 실패 코드, ROLLBACK_* 코드, journal 단계와 파일·서비스 존재 여부, 안전한 readiness 하위 원인만 포함됩니다. 실제 서비스 PID, IP/CIDR, PC·사용자 이름, 절대 경로, 계정, 비밀번호, 인증서, 방화벽 규칙 원문과 장비 명령·출력은 포함하지 않으며 별도 로그 파일로 저장하지 않습니다.</w:t>
       </w:r>
     </w:p>
     <w:p>
@@ -1748,7 +1748,7 @@
           <w:color w:val="16324F"/>
           <w:sz w:val="21"/>
         </w:rPr>
-        <w:t>Agent Setup에 설치 실패가 표시되면 실패 단계와 Cause를 먼저 확인하세요. SETUP_FIREWALL_FAILED는 적용 직후 최대 2초 동안 재확인해도 제품 방화벽 규칙이 정확하지 않다는 뜻입니다. Setup은 실제 주소 대신 안전한 불일치 코드를 표시하고 설치 전 상태로 복구합니다. 규칙을 Any, LocalSubnet 또는 넓은 대역으로 수동 확대하지 마세요. 설치 성공 뒤 AGENT_CONNECTION_REFUSED가 보이면 Viewer에 스위치 IP나 localhost가 아니라 Agent를 설치한 PC의 실제 주소를 입력했는지 먼저 확인하세요. 동일 PC 사전 테스트도 localhost 대신 이 PC의 실제 RFC1918 사설 IPv4를 사용합니다. 그 다음 Agent Setup의 검사에서 SamsungSwitchWatchAgent 서비스와 TCP/18443을 점검합니다. AGENT_CLIENT_NOT_ALLOWED이면 현재 Viewer PC의 고정 IPv4를 Agent Setup에 다시 입력하고 설치/업데이트합니다. 서비스를 수동 등록하지 말고 0.10.10-poc Agent Setup을 사용하세요.</w:t>
+        <w:t>Agent Setup에 설치 실패가 표시되면 실패 단계와 Cause를 먼저 확인하세요. SETUP_FIREWALL_FAILED는 적용 직후 최대 2초 동안 재확인해도 제품 방화벽 규칙이 정확하지 않다는 뜻입니다. Setup은 실제 주소 대신 안전한 불일치 코드를 표시하고 설치 전 상태로 복구합니다. 규칙을 Any, LocalSubnet 또는 넓은 대역으로 수동 확대하지 마세요. 설치 성공 뒤 AGENT_CONNECTION_REFUSED가 보이면 Viewer에 스위치 IP나 localhost가 아니라 Agent를 설치한 PC의 실제 주소를 입력했는지 먼저 확인하세요. 동일 PC 사전 테스트도 localhost 대신 이 PC의 실제 RFC1918 사설 IPv4를 사용합니다. 그 다음 Agent Setup의 검사에서 SamsungSwitchWatchAgent 서비스와 TCP/18443을 점검합니다. AGENT_CLIENT_NOT_ALLOWED이면 현재 Viewer PC의 고정 IPv4를 Agent Setup에 다시 입력하고 설치/업데이트합니다. 서비스를 수동 등록하지 말고 0.10.11-poc Agent Setup을 사용하세요.</w:t>
       </w:r>
     </w:p>
     <w:p>
@@ -1795,7 +1795,7 @@
           <w:color w:val="16324F"/>
           <w:sz w:val="21"/>
         </w:rPr>
-        <w:t>이전 Viewer가 실행 중이면 새 Viewer는 같은 사용자 데이터를 동시에 쓰지 않도록 실행을 차단하고 전환 순서를 표시합니다. 기존 트레이 아이콘에서 '프로그램 종료'를 선택한 뒤 Win+R에서 shell:startup을 열어 'Samsung Switch Watch' 바로 가기를 삭제합니다. 이어 shell:programs에서도 같은 이름의 이전 시작 메뉴 바로 가기를 삭제하고 새 Viewer를 다시 실행하세요. 기존 Agent 연결과 장비 정보는 유지됩니다. 창이 바로 보이지 않으면 알림 영역에서 대시보드를 열고 실행 경로가 새 0.10.10-poc 폴더인지 확인하세요.</w:t>
+        <w:t>이전 Viewer가 실행 중이면 새 Viewer는 같은 사용자 데이터를 동시에 쓰지 않도록 실행을 차단하고 전환 순서를 표시합니다. 기존 트레이 아이콘에서 '프로그램 종료'를 선택한 뒤 Win+R에서 shell:startup을 열어 'Samsung Switch Watch' 바로 가기를 삭제합니다. 이어 shell:programs에서도 같은 이름의 이전 시작 메뉴 바로 가기를 삭제하고 새 Viewer를 다시 실행하세요. 기존 Agent 연결과 장비 정보는 유지됩니다. 창이 바로 보이지 않으면 알림 영역에서 대시보드를 열고 실행 경로가 새 0.10.11-poc 폴더인지 확인하세요.</w:t>
       </w:r>
     </w:p>
     <w:p>
@@ -1893,7 +1893,7 @@
           <w:color w:val="16324F"/>
           <w:sz w:val="21"/>
         </w:rPr>
-        <w:t>0.10.10-poc는 코드 서명되지 않아 SmartScreen이나 사내 EDR이 차단할 수 있습니다. ZIP을 완전히 압축 해제하고 Viewer EXE와 제공된 DLL이 같은 폴더에 있는지 확인하세요. EDR·AppLocker·WDAC가 차단하면 우회하지 말고 공식 ZIP의 버전·해시와 차단 기록을 보안 담당자에게 전달하세요.</w:t>
+        <w:t>0.10.11-poc는 코드 서명되지 않아 SmartScreen이나 사내 EDR이 차단할 수 있습니다. ZIP을 완전히 압축 해제하고 Viewer EXE와 제공된 DLL이 같은 폴더에 있는지 확인하세요. EDR·AppLocker·WDAC가 차단하면 우회하지 말고 공식 ZIP의 버전·해시와 차단 기록을 보안 담당자에게 전달하세요.</w:t>
       </w:r>
     </w:p>
     <w:p>
@@ -6472,7 +6472,7 @@
                 <w:rFonts w:ascii="맑은 고딕" w:hAnsi="맑은 고딕" w:eastAsia="맑은 고딕" w:cs="맑은 고딕"/>
                 <w:sz w:val="16"/>
               </w:rPr>
-              <w:t>서비스 실행 → 로컬 HTTPS/18443 → Agent 설정과 Windows 이벤트</w:t>
+              <w:t>화면의 AgentHealthCode로 서비스·TCP/18443·HTTPS·응답·API/제품 버전 단계 확인 → 같은 설치 반복 대신 Windows 이벤트·EDR 확인</w:t>
             </w:r>
           </w:p>
         </w:tc>
@@ -8902,7 +8902,7 @@
         <w:color w:val="64748B"/>
         <w:sz w:val="17"/>
       </w:rPr>
-      <w:t xml:space="preserve">v0.10.10-poc  |  </w:t>
+      <w:t xml:space="preserve">v0.10.11-poc  |  </w:t>
     </w:r>
     <w:r>
       <w:rPr>
@@ -8933,7 +8933,7 @@
         <w:color w:val="64748B"/>
         <w:sz w:val="17"/>
       </w:rPr>
-      <w:t>v0.10.10-poc  |  2026-07-30</w:t>
+      <w:t>v0.10.11-poc  |  2026-07-30</w:t>
     </w:r>
   </w:p>
 </w:ftr>

</xml_diff>

<commit_message>
fix(agent-setup): harden readiness and rollback (#47)
</commit_message>
<xml_diff>
--- a/docs/SamsungSwitchWatch_User_Manual_KO.docx
+++ b/docs/SamsungSwitchWatch_User_Manual_KO.docx
@@ -1149,7 +1149,7 @@
           <w:color w:val="16324F"/>
           <w:sz w:val="21"/>
         </w:rPr>
-        <w:t>0.10.10-poc는 코드 서명되지 않은 시험판입니다. 압축을 풀기 전에 Agent와 Viewer ZIP의 SHA-256을 해당 GitHub Release 본문에 표시된 값과 비교하고 사내 보안 반입 절차를 완료하세요. SmartScreen 또는 EDR 경고를 우회하지 않습니다.</w:t>
+        <w:t>0.10.11-poc는 코드 서명되지 않은 시험판입니다. 압축을 풀기 전에 Agent와 Viewer ZIP의 SHA-256을 해당 GitHub Release 본문에 표시된 값과 비교하고 사내 보안 반입 절차를 완료하세요. SmartScreen 또는 EDR 경고를 우회하지 않습니다.</w:t>
       </w:r>
     </w:p>
     <w:p>
@@ -1636,7 +1636,7 @@
           <w:color w:val="16324F"/>
           <w:sz w:val="21"/>
         </w:rPr>
-        <w:t>Setup은 BUILD-MANIFEST.json과 Agent 실행 파일 SHA-256을 확인하고, Program Files의 임시 staging에 복사한 파일을 다시 검사한 뒤 교체합니다. 서비스·프로그램·방화벽 변경 중 현재 작업이 실패하면 설치 전 상태로 되돌리기를 시도합니다. 다음 실행에서 완료되지 않은 journal이 남아 있으면 자동 복구하지 않고 별도의 '이전 상태 복구' 작업을 요구합니다. staging·backup·failed·journal 정리가 잠시 실패하면 정확히 검증된 대상만 최대 3회 시도하고 실패한 시도 사이 250ms 대기한 뒤 삭제 결과를 확인합니다. 복구까지 실패하면 최초 설치 실패 코드를 별도로 유지하고 SETUP_ROLLBACK_FAILED와 실패한 ROLLBACK_* 단계를 함께 표시합니다.</w:t>
+        <w:t>Setup은 BUILD-MANIFEST.json과 Agent 실행 파일 SHA-256을 확인하고, Program Files의 임시 staging에 복사한 파일을 다시 검사한 뒤 교체합니다. 서비스·프로그램·방화벽 변경 중 현재 작업이 실패하면 설치 전 상태로 되돌리기를 시도합니다. 다음 실행에서 완료되지 않은 journal이 남아 있으면 자동 복구하지 않고 별도의 '이전 상태 복구' 작업을 요구합니다. 새 서비스의 자동 재시작은 readiness 성공 뒤에만 적용하고, 검사 중에는 현재 서비스 PID와 TCP/18443 소유를 매번 다시 확인합니다. rollback 전에는 관찰한 서비스 프로세스 종료를 확인하고 프로그램 폴더의 일시적 잠금만 최대 5회 제한적으로 재시도합니다. staging·backup·failed·journal 정리가 잠시 실패하면 정확히 검증된 대상만 최대 3회 시도하고 실패한 시도 사이 250ms 대기한 뒤 삭제 결과를 확인합니다. 복구까지 실패하면 최초 설치 실패 코드를 별도로 유지하고 SETUP_ROLLBACK_FAILED와 실패한 ROLLBACK_* 단계를 함께 표시합니다.</w:t>
       </w:r>
     </w:p>
     <w:p>
@@ -1664,7 +1664,7 @@
           <w:color w:val="16324F"/>
           <w:sz w:val="21"/>
         </w:rPr>
-        <w:t>설치 또는 복구가 실패한 경우에만 '진단정보 복사' 버튼이 나타납니다. 복사 내용에는 프로그램 버전, UTC 시각, 작업 종류, 최초 실패 코드, ROLLBACK_* 코드, journal 단계와 파일·서비스 존재 여부만 포함됩니다. 실제 IP/CIDR, PC·사용자 이름, 절대 경로, 계정, 비밀번호, 인증서, 방화벽 규칙 원문과 장비 명령·출력은 포함하지 않으며 별도 로그 파일로 저장하지 않습니다.</w:t>
+        <w:t>설치 또는 복구가 실패한 경우에만 '진단정보 복사' 버튼이 나타납니다. 복사 내용에는 프로그램 버전, UTC 시각, 작업 종류, 최초 실패 코드, ROLLBACK_* 코드, journal 단계와 파일·서비스 존재 여부, 안전한 readiness 하위 원인만 포함됩니다. 실제 서비스 PID, IP/CIDR, PC·사용자 이름, 절대 경로, 계정, 비밀번호, 인증서, 방화벽 규칙 원문과 장비 명령·출력은 포함하지 않으며 별도 로그 파일로 저장하지 않습니다.</w:t>
       </w:r>
     </w:p>
     <w:p>
@@ -1748,7 +1748,7 @@
           <w:color w:val="16324F"/>
           <w:sz w:val="21"/>
         </w:rPr>
-        <w:t>Agent Setup에 설치 실패가 표시되면 실패 단계와 Cause를 먼저 확인하세요. SETUP_FIREWALL_FAILED는 적용 직후 최대 2초 동안 재확인해도 제품 방화벽 규칙이 정확하지 않다는 뜻입니다. Setup은 실제 주소 대신 안전한 불일치 코드를 표시하고 설치 전 상태로 복구합니다. 규칙을 Any, LocalSubnet 또는 넓은 대역으로 수동 확대하지 마세요. 설치 성공 뒤 AGENT_CONNECTION_REFUSED가 보이면 Viewer에 스위치 IP나 localhost가 아니라 Agent를 설치한 PC의 실제 주소를 입력했는지 먼저 확인하세요. 동일 PC 사전 테스트도 localhost 대신 이 PC의 실제 RFC1918 사설 IPv4를 사용합니다. 그 다음 Agent Setup의 검사에서 SamsungSwitchWatchAgent 서비스와 TCP/18443을 점검합니다. AGENT_CLIENT_NOT_ALLOWED이면 현재 Viewer PC의 고정 IPv4를 Agent Setup에 다시 입력하고 설치/업데이트합니다. 서비스를 수동 등록하지 말고 0.10.10-poc Agent Setup을 사용하세요.</w:t>
+        <w:t>Agent Setup에 설치 실패가 표시되면 실패 단계와 Cause를 먼저 확인하세요. SETUP_FIREWALL_FAILED는 적용 직후 최대 2초 동안 재확인해도 제품 방화벽 규칙이 정확하지 않다는 뜻입니다. Setup은 실제 주소 대신 안전한 불일치 코드를 표시하고 설치 전 상태로 복구합니다. 규칙을 Any, LocalSubnet 또는 넓은 대역으로 수동 확대하지 마세요. 설치 성공 뒤 AGENT_CONNECTION_REFUSED가 보이면 Viewer에 스위치 IP나 localhost가 아니라 Agent를 설치한 PC의 실제 주소를 입력했는지 먼저 확인하세요. 동일 PC 사전 테스트도 localhost 대신 이 PC의 실제 RFC1918 사설 IPv4를 사용합니다. 그 다음 Agent Setup의 검사에서 SamsungSwitchWatchAgent 서비스와 TCP/18443을 점검합니다. AGENT_CLIENT_NOT_ALLOWED이면 현재 Viewer PC의 고정 IPv4를 Agent Setup에 다시 입력하고 설치/업데이트합니다. 서비스를 수동 등록하지 말고 0.10.11-poc Agent Setup을 사용하세요.</w:t>
       </w:r>
     </w:p>
     <w:p>
@@ -1795,7 +1795,7 @@
           <w:color w:val="16324F"/>
           <w:sz w:val="21"/>
         </w:rPr>
-        <w:t>이전 Viewer가 실행 중이면 새 Viewer는 같은 사용자 데이터를 동시에 쓰지 않도록 실행을 차단하고 전환 순서를 표시합니다. 기존 트레이 아이콘에서 '프로그램 종료'를 선택한 뒤 Win+R에서 shell:startup을 열어 'Samsung Switch Watch' 바로 가기를 삭제합니다. 이어 shell:programs에서도 같은 이름의 이전 시작 메뉴 바로 가기를 삭제하고 새 Viewer를 다시 실행하세요. 기존 Agent 연결과 장비 정보는 유지됩니다. 창이 바로 보이지 않으면 알림 영역에서 대시보드를 열고 실행 경로가 새 0.10.10-poc 폴더인지 확인하세요.</w:t>
+        <w:t>이전 Viewer가 실행 중이면 새 Viewer는 같은 사용자 데이터를 동시에 쓰지 않도록 실행을 차단하고 전환 순서를 표시합니다. 기존 트레이 아이콘에서 '프로그램 종료'를 선택한 뒤 Win+R에서 shell:startup을 열어 'Samsung Switch Watch' 바로 가기를 삭제합니다. 이어 shell:programs에서도 같은 이름의 이전 시작 메뉴 바로 가기를 삭제하고 새 Viewer를 다시 실행하세요. 기존 Agent 연결과 장비 정보는 유지됩니다. 창이 바로 보이지 않으면 알림 영역에서 대시보드를 열고 실행 경로가 새 0.10.11-poc 폴더인지 확인하세요.</w:t>
       </w:r>
     </w:p>
     <w:p>
@@ -1893,7 +1893,7 @@
           <w:color w:val="16324F"/>
           <w:sz w:val="21"/>
         </w:rPr>
-        <w:t>0.10.10-poc는 코드 서명되지 않아 SmartScreen이나 사내 EDR이 차단할 수 있습니다. ZIP을 완전히 압축 해제하고 Viewer EXE와 제공된 DLL이 같은 폴더에 있는지 확인하세요. EDR·AppLocker·WDAC가 차단하면 우회하지 말고 공식 ZIP의 버전·해시와 차단 기록을 보안 담당자에게 전달하세요.</w:t>
+        <w:t>0.10.11-poc는 코드 서명되지 않아 SmartScreen이나 사내 EDR이 차단할 수 있습니다. ZIP을 완전히 압축 해제하고 Viewer EXE와 제공된 DLL이 같은 폴더에 있는지 확인하세요. EDR·AppLocker·WDAC가 차단하면 우회하지 말고 공식 ZIP의 버전·해시와 차단 기록을 보안 담당자에게 전달하세요.</w:t>
       </w:r>
     </w:p>
     <w:p>
@@ -6472,7 +6472,7 @@
                 <w:rFonts w:ascii="맑은 고딕" w:hAnsi="맑은 고딕" w:eastAsia="맑은 고딕" w:cs="맑은 고딕"/>
                 <w:sz w:val="16"/>
               </w:rPr>
-              <w:t>서비스 실행 → 로컬 HTTPS/18443 → Agent 설정과 Windows 이벤트</w:t>
+              <w:t>화면의 AgentHealthCode로 서비스·TCP/18443·HTTPS·응답·API/제품 버전 단계 확인 → 같은 설치 반복 대신 Windows 이벤트·EDR 확인</w:t>
             </w:r>
           </w:p>
         </w:tc>
@@ -8902,7 +8902,7 @@
         <w:color w:val="64748B"/>
         <w:sz w:val="17"/>
       </w:rPr>
-      <w:t xml:space="preserve">v0.10.10-poc  |  </w:t>
+      <w:t xml:space="preserve">v0.10.11-poc  |  </w:t>
     </w:r>
     <w:r>
       <w:rPr>
@@ -8933,7 +8933,7 @@
         <w:color w:val="64748B"/>
         <w:sz w:val="17"/>
       </w:rPr>
-      <w:t>v0.10.10-poc  |  2026-07-30</w:t>
+      <w:t>v0.10.11-poc  |  2026-07-30</w:t>
     </w:r>
   </w:p>
 </w:ftr>

</xml_diff>

<commit_message>
stabilize setup diagnostics and viewer state
</commit_message>
<xml_diff>
--- a/docs/SamsungSwitchWatch_User_Manual_KO.docx
+++ b/docs/SamsungSwitchWatch_User_Manual_KO.docx
@@ -119,6 +119,7 @@
     <w:p>
       <w:pPr>
         <w:keepLines/>
+        <w:pageBreakBefore w:val="0"/>
         <w:spacing w:before="80" w:after="160" w:line="283" w:lineRule="auto"/>
         <w:ind w:left="115" w:right="58"/>
         <w:shd w:fill="E8EEF5"/>
@@ -619,6 +620,7 @@
     <w:p>
       <w:pPr>
         <w:keepLines/>
+        <w:pageBreakBefore w:val="0"/>
         <w:spacing w:before="80" w:after="160" w:line="283" w:lineRule="auto"/>
         <w:ind w:left="115" w:right="58"/>
         <w:shd w:fill="FFF8E8"/>
@@ -1061,6 +1063,7 @@
     <w:p>
       <w:pPr>
         <w:keepLines/>
+        <w:pageBreakBefore w:val="0"/>
         <w:spacing w:before="80" w:after="160" w:line="283" w:lineRule="auto"/>
         <w:ind w:left="115" w:right="58"/>
         <w:shd w:fill="FEF2F2"/>
@@ -1127,6 +1130,7 @@
     <w:p>
       <w:pPr>
         <w:keepLines/>
+        <w:pageBreakBefore w:val="0"/>
         <w:spacing w:before="80" w:after="160" w:line="283" w:lineRule="auto"/>
         <w:ind w:left="115" w:right="58"/>
         <w:shd w:fill="FEF2F2"/>
@@ -1149,7 +1153,7 @@
           <w:color w:val="16324F"/>
           <w:sz w:val="21"/>
         </w:rPr>
-        <w:t>0.10.11-poc는 코드 서명되지 않은 시험판입니다. 압축을 풀기 전에 Agent와 Viewer ZIP의 SHA-256을 해당 GitHub Release 본문에 표시된 값과 비교하고 사내 보안 반입 절차를 완료하세요. SmartScreen 또는 EDR 경고를 우회하지 않습니다.</w:t>
+        <w:t>0.10.12-poc는 코드 서명되지 않은 시험판입니다. 압축을 풀기 전에 Agent와 Viewer ZIP의 SHA-256을 해당 GitHub Release 본문에 표시된 값과 비교하고 사내 보안 반입 절차를 완료하세요. SmartScreen 또는 EDR 경고를 우회하지 않습니다.</w:t>
       </w:r>
     </w:p>
     <w:p>
@@ -1302,6 +1306,7 @@
     <w:p>
       <w:pPr>
         <w:keepLines/>
+        <w:pageBreakBefore w:val="0"/>
         <w:spacing w:before="80" w:after="160" w:line="283" w:lineRule="auto"/>
         <w:ind w:left="115" w:right="58"/>
         <w:shd w:fill="FFF8E8"/>
@@ -1379,6 +1384,7 @@
     <w:p>
       <w:pPr>
         <w:keepLines/>
+        <w:pageBreakBefore w:val="0"/>
         <w:spacing w:before="80" w:after="160" w:line="283" w:lineRule="auto"/>
         <w:ind w:left="115" w:right="58"/>
         <w:shd w:fill="FEF2F2"/>
@@ -1407,6 +1413,7 @@
     <w:p>
       <w:pPr>
         <w:keepLines/>
+        <w:pageBreakBefore w:val="0"/>
         <w:spacing w:before="80" w:after="160" w:line="283" w:lineRule="auto"/>
         <w:ind w:left="115" w:right="58"/>
         <w:shd w:fill="FFF8E8"/>
@@ -1435,6 +1442,7 @@
     <w:p>
       <w:pPr>
         <w:keepLines/>
+        <w:pageBreakBefore w:val="0"/>
         <w:spacing w:before="80" w:after="160" w:line="283" w:lineRule="auto"/>
         <w:ind w:left="115" w:right="58"/>
         <w:shd w:fill="FFF8E8"/>
@@ -1463,6 +1471,7 @@
     <w:p>
       <w:pPr>
         <w:keepLines/>
+        <w:pageBreakBefore w:val="0"/>
         <w:spacing w:before="80" w:after="160" w:line="283" w:lineRule="auto"/>
         <w:ind w:left="115" w:right="58"/>
         <w:shd w:fill="E8EEF5"/>
@@ -1586,6 +1595,7 @@
     <w:p>
       <w:pPr>
         <w:keepLines/>
+        <w:pageBreakBefore w:val="0"/>
         <w:spacing w:before="80" w:after="160" w:line="283" w:lineRule="auto"/>
         <w:ind w:left="115" w:right="58"/>
         <w:shd w:fill="FEF2F2"/>
@@ -1613,7 +1623,23 @@
     </w:p>
     <w:p>
       <w:pPr>
+        <w:pStyle w:val="Heading2"/>
+        <w:pageBreakBefore/>
+      </w:pPr>
+      <w:r>
+        <w:rPr>
+          <w:rFonts w:ascii="맑은 고딕" w:hAnsi="맑은 고딕" w:eastAsia="맑은 고딕" w:cs="맑은 고딕"/>
+          <w:b/>
+          <w:color w:val="2E74B5"/>
+          <w:sz w:val="26"/>
+        </w:rPr>
+        <w:t>설치 안정성과 진단</w:t>
+      </w:r>
+    </w:p>
+    <w:p>
+      <w:pPr>
         <w:keepLines/>
+        <w:pageBreakBefore w:val="0"/>
         <w:spacing w:before="80" w:after="160" w:line="283" w:lineRule="auto"/>
         <w:ind w:left="115" w:right="58"/>
         <w:shd w:fill="E8EEF5"/>
@@ -1642,6 +1668,7 @@
     <w:p>
       <w:pPr>
         <w:keepLines/>
+        <w:pageBreakBefore w:val="0"/>
         <w:spacing w:before="80" w:after="160" w:line="283" w:lineRule="auto"/>
         <w:ind w:left="115" w:right="58"/>
         <w:shd w:fill="E8EEF5"/>
@@ -1670,6 +1697,7 @@
     <w:p>
       <w:pPr>
         <w:keepLines/>
+        <w:pageBreakBefore w:val="0"/>
         <w:spacing w:before="80" w:after="160" w:line="283" w:lineRule="auto"/>
         <w:ind w:left="115" w:right="58"/>
         <w:shd w:fill="E8EEF5"/>
@@ -1698,6 +1726,7 @@
     <w:p>
       <w:pPr>
         <w:keepLines/>
+        <w:pageBreakBefore w:val="0"/>
         <w:spacing w:before="80" w:after="160" w:line="283" w:lineRule="auto"/>
         <w:ind w:left="115" w:right="58"/>
         <w:shd w:fill="E8EEF5"/>
@@ -1725,7 +1754,23 @@
     </w:p>
     <w:p>
       <w:pPr>
+        <w:pStyle w:val="Heading2"/>
+        <w:pageBreakBefore/>
+      </w:pPr>
+      <w:r>
+        <w:rPr>
+          <w:rFonts w:ascii="맑은 고딕" w:hAnsi="맑은 고딕" w:eastAsia="맑은 고딕" w:cs="맑은 고딕"/>
+          <w:b/>
+          <w:color w:val="2E74B5"/>
+          <w:sz w:val="26"/>
+        </w:rPr>
+        <w:t>설치·연결 오류 확인</w:t>
+      </w:r>
+    </w:p>
+    <w:p>
+      <w:pPr>
         <w:keepLines/>
+        <w:pageBreakBefore w:val="0"/>
         <w:spacing w:before="80" w:after="160" w:line="283" w:lineRule="auto"/>
         <w:ind w:left="115" w:right="58"/>
         <w:shd w:fill="FEF2F2"/>
@@ -1748,7 +1793,7 @@
           <w:color w:val="16324F"/>
           <w:sz w:val="21"/>
         </w:rPr>
-        <w:t>Agent Setup에 설치 실패가 표시되면 실패 단계와 Cause를 먼저 확인하세요. SETUP_FIREWALL_FAILED는 적용 직후 최대 2초 동안 재확인해도 제품 방화벽 규칙이 정확하지 않다는 뜻입니다. Setup은 실제 주소 대신 안전한 불일치 코드를 표시하고 설치 전 상태로 복구합니다. 규칙을 Any, LocalSubnet 또는 넓은 대역으로 수동 확대하지 마세요. 설치 성공 뒤 AGENT_CONNECTION_REFUSED가 보이면 Viewer에 스위치 IP나 localhost가 아니라 Agent를 설치한 PC의 실제 주소를 입력했는지 먼저 확인하세요. 동일 PC 사전 테스트도 localhost 대신 이 PC의 실제 RFC1918 사설 IPv4를 사용합니다. 그 다음 Agent Setup의 검사에서 SamsungSwitchWatchAgent 서비스와 TCP/18443을 점검합니다. AGENT_CLIENT_NOT_ALLOWED이면 현재 Viewer PC의 고정 IPv4를 Agent Setup에 다시 입력하고 설치/업데이트합니다. 서비스를 수동 등록하지 말고 0.10.11-poc Agent Setup을 사용하세요.</w:t>
+        <w:t>Agent Setup에 설치 실패가 표시되면 실패 단계와 Cause를 먼저 확인하세요. SETUP_FIREWALL_FAILED는 적용 직후 최대 2초 동안 재확인해도 제품 방화벽 규칙이 정확하지 않다는 뜻입니다. Setup은 실제 주소 대신 안전한 불일치 코드를 표시하고 설치 전 상태로 복구합니다. 규칙을 Any, LocalSubnet 또는 넓은 대역으로 수동 확대하지 마세요. 설치 성공 뒤 AGENT_CONNECTION_REFUSED가 보이면 Viewer에 스위치 IP나 localhost가 아니라 Agent를 설치한 PC의 실제 주소를 입력했는지 먼저 확인하세요. 동일 PC 사전 테스트도 localhost 대신 이 PC의 실제 RFC1918 사설 IPv4를 사용합니다. 그 다음 Agent Setup의 검사에서 SamsungSwitchWatchAgent 서비스와 TCP/18443을 점검합니다. AGENT_CLIENT_NOT_ALLOWED이면 현재 Viewer PC의 고정 IPv4를 Agent Setup에 다시 입력하고 설치/업데이트합니다. 서비스를 수동 등록하지 말고 0.10.12-poc Agent Setup을 사용하세요.</w:t>
       </w:r>
     </w:p>
     <w:p>
@@ -1773,6 +1818,7 @@
     <w:p>
       <w:pPr>
         <w:keepLines/>
+        <w:pageBreakBefore w:val="0"/>
         <w:spacing w:before="80" w:after="160" w:line="283" w:lineRule="auto"/>
         <w:ind w:left="115" w:right="58"/>
         <w:shd w:fill="FFF8E8"/>
@@ -1795,7 +1841,7 @@
           <w:color w:val="16324F"/>
           <w:sz w:val="21"/>
         </w:rPr>
-        <w:t>이전 Viewer가 실행 중이면 새 Viewer는 같은 사용자 데이터를 동시에 쓰지 않도록 실행을 차단하고 전환 순서를 표시합니다. 기존 트레이 아이콘에서 '프로그램 종료'를 선택한 뒤 Win+R에서 shell:startup을 열어 'Samsung Switch Watch' 바로 가기를 삭제합니다. 이어 shell:programs에서도 같은 이름의 이전 시작 메뉴 바로 가기를 삭제하고 새 Viewer를 다시 실행하세요. 기존 Agent 연결과 장비 정보는 유지됩니다. 창이 바로 보이지 않으면 알림 영역에서 대시보드를 열고 실행 경로가 새 0.10.11-poc 폴더인지 확인하세요.</w:t>
+        <w:t>이전 Viewer가 실행 중이면 새 Viewer는 같은 사용자 데이터를 동시에 쓰지 않도록 실행을 차단하고 전환 순서를 표시합니다. 기존 트레이 아이콘에서 '프로그램 종료'를 선택한 뒤 Win+R에서 shell:startup을 열어 'Samsung Switch Watch' 바로 가기를 삭제합니다. 이어 shell:programs에서도 같은 이름의 이전 시작 메뉴 바로 가기를 삭제하고 새 Viewer를 다시 실행하세요. 기존 Agent 연결과 장비 정보는 유지됩니다. 창이 바로 보이지 않으면 알림 영역에서 대시보드를 열고 실행 경로가 새 0.10.12-poc 폴더인지 확인하세요.</w:t>
       </w:r>
     </w:p>
     <w:p>
@@ -1843,6 +1889,7 @@
     <w:p>
       <w:pPr>
         <w:keepLines/>
+        <w:pageBreakBefore w:val="0"/>
         <w:spacing w:before="80" w:after="160" w:line="283" w:lineRule="auto"/>
         <w:ind w:left="115" w:right="58"/>
         <w:shd w:fill="E8EEF5"/>
@@ -1871,6 +1918,7 @@
     <w:p>
       <w:pPr>
         <w:keepLines/>
+        <w:pageBreakBefore w:val="0"/>
         <w:spacing w:before="80" w:after="160" w:line="283" w:lineRule="auto"/>
         <w:ind w:left="115" w:right="58"/>
         <w:shd w:fill="FEF2F2"/>
@@ -1893,12 +1941,13 @@
           <w:color w:val="16324F"/>
           <w:sz w:val="21"/>
         </w:rPr>
-        <w:t>0.10.11-poc는 코드 서명되지 않아 SmartScreen이나 사내 EDR이 차단할 수 있습니다. ZIP을 완전히 압축 해제하고 Viewer EXE와 제공된 DLL이 같은 폴더에 있는지 확인하세요. EDR·AppLocker·WDAC가 차단하면 우회하지 말고 공식 ZIP의 버전·해시와 차단 기록을 보안 담당자에게 전달하세요.</w:t>
+        <w:t>0.10.12-poc는 코드 서명되지 않아 SmartScreen이나 사내 EDR이 차단할 수 있습니다. ZIP을 완전히 압축 해제하고 Viewer EXE와 제공된 DLL이 같은 폴더에 있는지 확인하세요. EDR·AppLocker·WDAC가 차단하면 우회하지 말고 공식 ZIP의 버전·해시와 차단 기록을 보안 담당자에게 전달하세요.</w:t>
       </w:r>
     </w:p>
     <w:p>
       <w:pPr>
         <w:keepLines/>
+        <w:pageBreakBefore w:val="0"/>
         <w:spacing w:before="80" w:after="160" w:line="283" w:lineRule="auto"/>
         <w:ind w:left="115" w:right="58"/>
         <w:shd w:fill="E8EEF5"/>
@@ -1990,6 +2039,21 @@
       </w:pPr>
       <w:r>
         <w:t>그림 3. 같은 PC Agent/API 테스트, 익명 진단 저장과 원격 연결 설정</w:t>
+      </w:r>
+    </w:p>
+    <w:p>
+      <w:pPr>
+        <w:pStyle w:val="Heading3"/>
+        <w:pageBreakBefore/>
+      </w:pPr>
+      <w:r>
+        <w:rPr>
+          <w:rFonts w:ascii="맑은 고딕" w:hAnsi="맑은 고딕" w:eastAsia="맑은 고딕" w:cs="맑은 고딕"/>
+          <w:b/>
+          <w:color w:val="1F4D78"/>
+          <w:sz w:val="24"/>
+        </w:rPr>
+        <w:t>연결 실패 화면과 확인 순서</w:t>
       </w:r>
     </w:p>
     <w:p>
@@ -2092,6 +2156,7 @@
     <w:p>
       <w:pPr>
         <w:keepLines/>
+        <w:pageBreakBefore w:val="0"/>
         <w:spacing w:before="80" w:after="160" w:line="283" w:lineRule="auto"/>
         <w:ind w:left="115" w:right="58"/>
         <w:shd w:fill="E8EEF5"/>
@@ -2119,7 +2184,23 @@
     </w:p>
     <w:p>
       <w:pPr>
+        <w:pStyle w:val="Heading2"/>
+        <w:pageBreakBefore/>
+      </w:pPr>
+      <w:r>
+        <w:rPr>
+          <w:rFonts w:ascii="맑은 고딕" w:hAnsi="맑은 고딕" w:eastAsia="맑은 고딕" w:cs="맑은 고딕"/>
+          <w:b/>
+          <w:color w:val="2E74B5"/>
+          <w:sz w:val="26"/>
+        </w:rPr>
+        <w:t>연결 진단과 지원 정보</w:t>
+      </w:r>
+    </w:p>
+    <w:p>
+      <w:pPr>
         <w:keepLines/>
+        <w:pageBreakBefore w:val="0"/>
         <w:spacing w:before="80" w:after="160" w:line="283" w:lineRule="auto"/>
         <w:ind w:left="115" w:right="58"/>
         <w:shd w:fill="E8EEF5"/>
@@ -2148,6 +2229,7 @@
     <w:p>
       <w:pPr>
         <w:keepLines/>
+        <w:pageBreakBefore w:val="0"/>
         <w:spacing w:before="80" w:after="160" w:line="283" w:lineRule="auto"/>
         <w:ind w:left="115" w:right="58"/>
         <w:shd w:fill="FFF8E8"/>
@@ -2239,6 +2321,21 @@
       </w:pPr>
       <w:r>
         <w:t>그림 5. Viewer가 보관하는 장비 및 계정 입력 화면</w:t>
+      </w:r>
+    </w:p>
+    <w:p>
+      <w:pPr>
+        <w:pStyle w:val="Heading3"/>
+        <w:pageBreakBefore/>
+      </w:pPr>
+      <w:r>
+        <w:rPr>
+          <w:rFonts w:ascii="맑은 고딕" w:hAnsi="맑은 고딕" w:eastAsia="맑은 고딕" w:cs="맑은 고딕"/>
+          <w:b/>
+          <w:color w:val="1F4D78"/>
+          <w:sz w:val="24"/>
+        </w:rPr>
+        <w:t>장비 입력 항목</w:t>
       </w:r>
     </w:p>
     <w:tbl>
@@ -2929,6 +3026,7 @@
     <w:p>
       <w:pPr>
         <w:keepLines/>
+        <w:pageBreakBefore w:val="0"/>
         <w:spacing w:before="80" w:after="160" w:line="283" w:lineRule="auto"/>
         <w:ind w:left="115" w:right="58"/>
         <w:shd w:fill="FFF8E8"/>
@@ -3444,6 +3542,7 @@
     <w:p>
       <w:pPr>
         <w:keepLines/>
+        <w:pageBreakBefore w:val="0"/>
         <w:spacing w:before="80" w:after="160" w:line="283" w:lineRule="auto"/>
         <w:ind w:left="115" w:right="58"/>
         <w:shd w:fill="FEF2F2"/>
@@ -3878,6 +3977,7 @@
     <w:p>
       <w:pPr>
         <w:keepLines/>
+        <w:pageBreakBefore w:val="0"/>
         <w:spacing w:before="80" w:after="160" w:line="283" w:lineRule="auto"/>
         <w:ind w:left="115" w:right="58"/>
         <w:shd w:fill="FFF8E8"/>
@@ -3906,6 +4006,7 @@
     <w:p>
       <w:pPr>
         <w:keepLines/>
+        <w:pageBreakBefore w:val="0"/>
         <w:spacing w:before="80" w:after="160" w:line="283" w:lineRule="auto"/>
         <w:ind w:left="115" w:right="58"/>
         <w:shd w:fill="FEF2F2"/>
@@ -3934,6 +4035,7 @@
     <w:p>
       <w:pPr>
         <w:keepLines/>
+        <w:pageBreakBefore w:val="0"/>
         <w:spacing w:before="80" w:after="160" w:line="283" w:lineRule="auto"/>
         <w:ind w:left="115" w:right="58"/>
         <w:shd w:fill="FFF8E8"/>
@@ -5644,6 +5746,7 @@
     <w:p>
       <w:pPr>
         <w:keepLines/>
+        <w:pageBreakBefore w:val="0"/>
         <w:spacing w:before="80" w:after="160" w:line="283" w:lineRule="auto"/>
         <w:ind w:left="115" w:right="58"/>
         <w:shd w:fill="FEF2F2"/>
@@ -8166,6 +8269,7 @@
     <w:p>
       <w:pPr>
         <w:keepLines/>
+        <w:pageBreakBefore w:val="0"/>
         <w:spacing w:before="80" w:after="160" w:line="283" w:lineRule="auto"/>
         <w:ind w:left="115" w:right="58"/>
         <w:shd w:fill="FEF2F2"/>
@@ -8199,6 +8303,7 @@
     <w:p>
       <w:pPr>
         <w:keepLines/>
+        <w:pageBreakBefore w:val="0"/>
         <w:spacing w:before="80" w:after="160" w:line="283" w:lineRule="auto"/>
         <w:ind w:left="115" w:right="58"/>
         <w:shd w:fill="FEF2F2"/>
@@ -8227,6 +8332,7 @@
     <w:p>
       <w:pPr>
         <w:keepLines/>
+        <w:pageBreakBefore w:val="0"/>
         <w:spacing w:before="80" w:after="160" w:line="283" w:lineRule="auto"/>
         <w:ind w:left="115" w:right="58"/>
         <w:shd w:fill="FFF8E8"/>
@@ -8597,6 +8703,7 @@
     <w:p>
       <w:pPr>
         <w:keepLines/>
+        <w:pageBreakBefore w:val="0"/>
         <w:spacing w:before="80" w:after="160" w:line="283" w:lineRule="auto"/>
         <w:ind w:left="115" w:right="58"/>
         <w:shd w:fill="FFF8E8"/>
@@ -8750,6 +8857,7 @@
     <w:p>
       <w:pPr>
         <w:keepLines/>
+        <w:pageBreakBefore w:val="0"/>
         <w:spacing w:before="80" w:after="160" w:line="283" w:lineRule="auto"/>
         <w:ind w:left="115" w:right="58"/>
         <w:shd w:fill="FEF2F2"/>
@@ -8902,7 +9010,7 @@
         <w:color w:val="64748B"/>
         <w:sz w:val="17"/>
       </w:rPr>
-      <w:t xml:space="preserve">v0.10.11-poc  |  </w:t>
+      <w:t xml:space="preserve">v0.10.12-poc  |  </w:t>
     </w:r>
     <w:r>
       <w:rPr>
@@ -8933,7 +9041,7 @@
         <w:color w:val="64748B"/>
         <w:sz w:val="17"/>
       </w:rPr>
-      <w:t>v0.10.11-poc  |  2026-07-30</w:t>
+      <w:t>v0.10.12-poc  |  2026-07-30</w:t>
     </w:r>
   </w:p>
 </w:ftr>

</xml_diff>

<commit_message>
Improve Agent local HTTPS diagnostics
</commit_message>
<xml_diff>
--- a/docs/SamsungSwitchWatch_User_Manual_KO.docx
+++ b/docs/SamsungSwitchWatch_User_Manual_KO.docx
@@ -1153,7 +1153,7 @@
           <w:color w:val="16324F"/>
           <w:sz w:val="21"/>
         </w:rPr>
-        <w:t>0.10.12-poc는 코드 서명되지 않은 시험판입니다. 압축을 풀기 전에 Agent와 Viewer ZIP의 SHA-256을 해당 GitHub Release 본문에 표시된 값과 비교하고 사내 보안 반입 절차를 완료하세요. SmartScreen 또는 EDR 경고를 우회하지 않습니다.</w:t>
+        <w:t>0.10.13-poc는 코드 서명되지 않은 시험판입니다. 압축을 풀기 전에 Agent와 Viewer ZIP의 SHA-256을 해당 GitHub Release 본문에 표시된 값과 비교하고 사내 보안 반입 절차를 완료하세요. SmartScreen 또는 EDR 경고를 우회하지 않습니다.</w:t>
       </w:r>
     </w:p>
     <w:p>
@@ -1436,7 +1436,7 @@
           <w:color w:val="16324F"/>
           <w:sz w:val="21"/>
         </w:rPr>
-        <w:t>실패하면 '지원 코드 · 이 코드만 전달하세요' 아래 SWD1-XXXX-XXXX-XXXX-XXXX 형식의 읽기 전용 코드가 표시됩니다. 별도 복사 버튼은 없으며 코드만 선택해 Ctrl+C로 복사합니다. 전화나 메신저로 짧은 장애 분류를 전달할 때 사용하세요. 이 코드는 오프라인에서 생성되고 CRC로 입력 오타를 확인하지만 비밀값, 인증·페어링 토큰 또는 인증서 지문이 아닙니다. 새 작업과 성공 화면에서는 이전 코드가 지워집니다.</w:t>
+        <w:t>실패하면 '지원 코드 · 이 코드만 전달하세요' 아래 SWD1-XXXX-XXXX-XXXX-XXXX 형식의 읽기 전용 코드가 표시됩니다. 별도 복사 버튼은 없으며 코드만 선택해 Ctrl+C로 복사합니다. 전화나 메신저로 짧은 장애 분류를 전달할 때 사용하세요. 이 코드는 오프라인에서 생성되고 CRC로 입력 오타를 확인하지만 비밀값, 인증·페어링 토큰 또는 인증서 지문이 아닙니다. 로컬 HTTPS의 다섯 세부 원인은 기존 SWD1/1 형식과 호환되도록 HTTPS 요청 실패라는 상위 분류로만 담깁니다. 정확한 세부 코드와 안전 관측값은 같은 실패 화면의 진단정보를 함께 확인하세요. 새 작업과 성공 화면에서는 이전 코드가 지워집니다.</w:t>
       </w:r>
     </w:p>
     <w:p>
@@ -1700,6 +1700,614 @@
         <w:pageBreakBefore w:val="0"/>
         <w:spacing w:before="80" w:after="160" w:line="283" w:lineRule="auto"/>
         <w:ind w:left="115" w:right="58"/>
+        <w:shd w:fill="FEF2F2"/>
+        <w:pBdr>
+          <w:left w:val="single" w:sz="16" w:space="8" w:color="B42318"/>
+        </w:pBdr>
+      </w:pPr>
+      <w:r>
+        <w:rPr>
+          <w:rFonts w:ascii="맑은 고딕" w:hAnsi="맑은 고딕" w:eastAsia="맑은 고딕" w:cs="맑은 고딕"/>
+          <w:b/>
+          <w:color w:val="B42318"/>
+          <w:sz w:val="21"/>
+        </w:rPr>
+        <w:t xml:space="preserve">로컬 HTTPS 실패는 Agent PC 내부 구간  </w:t>
+      </w:r>
+      <w:r>
+        <w:rPr>
+          <w:rFonts w:ascii="맑은 고딕" w:hAnsi="맑은 고딕" w:eastAsia="맑은 고딕" w:cs="맑은 고딕"/>
+          <w:color w:val="16324F"/>
+          <w:sz w:val="21"/>
+        </w:rPr>
+        <w:t>HTTPS_TLS_FAILED, HTTPS_REQUEST_TIMEOUT, HTTPS_CONNECTION_RESET, HTTPS_EOF, HTTPS_CONNECT_FAILED는 Setup → 127.0.0.1:18443 → Agent 서비스 사이의 로컬 준비 상태 확인 실패입니다. 이 다섯 코드는 Viewer IP나 스위치 관리망 문제를 뜻하지 않습니다. 같은 설치를 반복하기보다 코드와 아래 안전 관측값을 확인한 뒤 Agent PC의 Windows 이벤트, TLS 정책, 백신·EDR 개입 여부를 점검하세요.</w:t>
+      </w:r>
+    </w:p>
+    <w:tbl>
+      <w:tblPr>
+        <w:tblW w:type="dxa" w:w="9360"/>
+        <w:tblLayout w:type="fixed"/>
+        <w:tblLook w:firstColumn="1" w:firstRow="1" w:lastColumn="0" w:lastRow="0" w:noHBand="0" w:noVBand="1" w:val="04A0"/>
+        <w:tblInd w:w="120" w:type="dxa"/>
+        <w:tblBorders>
+          <w:top w:val="single" w:sz="6" w:space="0" w:color="CBD5E1"/>
+          <w:left w:val="single" w:sz="6" w:space="0" w:color="CBD5E1"/>
+          <w:bottom w:val="single" w:sz="6" w:space="0" w:color="CBD5E1"/>
+          <w:right w:val="single" w:sz="6" w:space="0" w:color="CBD5E1"/>
+          <w:insideH w:val="single" w:sz="6" w:space="0" w:color="CBD5E1"/>
+          <w:insideV w:val="single" w:sz="6" w:space="0" w:color="CBD5E1"/>
+        </w:tblBorders>
+      </w:tblPr>
+      <w:tblGrid>
+        <w:gridCol w:w="2900"/>
+        <w:gridCol w:w="6460"/>
+      </w:tblGrid>
+      <w:tr>
+        <w:trPr>
+          <w:tblHeader w:val="true"/>
+          <w:cantSplit w:val="true"/>
+        </w:trPr>
+        <w:tc>
+          <w:tcPr>
+            <w:tcW w:type="dxa" w:w="2900"/>
+            <w:tcMar>
+              <w:top w:w="80" w:type="dxa"/>
+              <w:start w:w="120" w:type="dxa"/>
+              <w:bottom w:w="80" w:type="dxa"/>
+              <w:end w:w="120" w:type="dxa"/>
+            </w:tcMar>
+            <w:vAlign w:val="center"/>
+            <w:shd w:fill="E8EEF5"/>
+          </w:tcPr>
+          <w:p>
+            <w:pPr>
+              <w:spacing w:before="0" w:after="0" w:line="264" w:lineRule="auto"/>
+              <w:jc w:val="center"/>
+            </w:pPr>
+            <w:r>
+              <w:rPr>
+                <w:rFonts w:ascii="맑은 고딕" w:hAnsi="맑은 고딕" w:eastAsia="맑은 고딕" w:cs="맑은 고딕"/>
+                <w:b/>
+                <w:color w:val="16324F"/>
+                <w:sz w:val="17"/>
+              </w:rPr>
+              <w:t>안전 진단 항목</w:t>
+            </w:r>
+          </w:p>
+        </w:tc>
+        <w:tc>
+          <w:tcPr>
+            <w:tcW w:type="dxa" w:w="6460"/>
+            <w:tcMar>
+              <w:top w:w="80" w:type="dxa"/>
+              <w:start w:w="120" w:type="dxa"/>
+              <w:bottom w:w="80" w:type="dxa"/>
+              <w:end w:w="120" w:type="dxa"/>
+            </w:tcMar>
+            <w:vAlign w:val="center"/>
+            <w:shd w:fill="E8EEF5"/>
+          </w:tcPr>
+          <w:p>
+            <w:pPr>
+              <w:spacing w:before="0" w:after="0" w:line="264" w:lineRule="auto"/>
+              <w:jc w:val="center"/>
+            </w:pPr>
+            <w:r>
+              <w:rPr>
+                <w:rFonts w:ascii="맑은 고딕" w:hAnsi="맑은 고딕" w:eastAsia="맑은 고딕" w:cs="맑은 고딕"/>
+                <w:b/>
+                <w:color w:val="16324F"/>
+                <w:sz w:val="17"/>
+              </w:rPr>
+              <w:t>의미</w:t>
+            </w:r>
+          </w:p>
+        </w:tc>
+      </w:tr>
+      <w:tr>
+        <w:trPr>
+          <w:cantSplit w:val="true"/>
+        </w:trPr>
+        <w:tc>
+          <w:tcPr>
+            <w:tcW w:type="dxa" w:w="2900"/>
+            <w:tcMar>
+              <w:top w:w="80" w:type="dxa"/>
+              <w:start w:w="120" w:type="dxa"/>
+              <w:bottom w:w="80" w:type="dxa"/>
+              <w:end w:w="120" w:type="dxa"/>
+            </w:tcMar>
+            <w:vAlign w:val="center"/>
+          </w:tcPr>
+          <w:p>
+            <w:pPr>
+              <w:spacing w:before="0" w:after="0" w:line="240" w:lineRule="auto"/>
+              <w:jc w:val="left"/>
+            </w:pPr>
+            <w:r>
+              <w:rPr>
+                <w:rFonts w:ascii="맑은 고딕" w:hAnsi="맑은 고딕" w:eastAsia="맑은 고딕" w:cs="맑은 고딕"/>
+                <w:sz w:val="16"/>
+              </w:rPr>
+              <w:t>AgentHealthCode</w:t>
+            </w:r>
+          </w:p>
+        </w:tc>
+        <w:tc>
+          <w:tcPr>
+            <w:tcW w:type="dxa" w:w="6460"/>
+            <w:tcMar>
+              <w:top w:w="80" w:type="dxa"/>
+              <w:start w:w="120" w:type="dxa"/>
+              <w:bottom w:w="80" w:type="dxa"/>
+              <w:end w:w="120" w:type="dxa"/>
+            </w:tcMar>
+            <w:vAlign w:val="center"/>
+          </w:tcPr>
+          <w:p>
+            <w:pPr>
+              <w:spacing w:before="0" w:after="0" w:line="240" w:lineRule="auto"/>
+              <w:jc w:val="left"/>
+            </w:pPr>
+            <w:r>
+              <w:rPr>
+                <w:rFonts w:ascii="맑은 고딕" w:hAnsi="맑은 고딕" w:eastAsia="맑은 고딕" w:cs="맑은 고딕"/>
+                <w:sz w:val="16"/>
+              </w:rPr>
+              <w:t>로컬 HTTPS 실패의 다섯 세부 분류 중 하나</w:t>
+            </w:r>
+          </w:p>
+        </w:tc>
+      </w:tr>
+      <w:tr>
+        <w:trPr>
+          <w:cantSplit w:val="true"/>
+        </w:trPr>
+        <w:tc>
+          <w:tcPr>
+            <w:tcW w:type="dxa" w:w="2900"/>
+            <w:shd w:fill="FAFBFC"/>
+            <w:tcMar>
+              <w:top w:w="80" w:type="dxa"/>
+              <w:start w:w="120" w:type="dxa"/>
+              <w:bottom w:w="80" w:type="dxa"/>
+              <w:end w:w="120" w:type="dxa"/>
+            </w:tcMar>
+            <w:vAlign w:val="center"/>
+          </w:tcPr>
+          <w:p>
+            <w:pPr>
+              <w:spacing w:before="0" w:after="0" w:line="240" w:lineRule="auto"/>
+              <w:jc w:val="left"/>
+            </w:pPr>
+            <w:r>
+              <w:rPr>
+                <w:rFonts w:ascii="맑은 고딕" w:hAnsi="맑은 고딕" w:eastAsia="맑은 고딕" w:cs="맑은 고딕"/>
+                <w:sz w:val="16"/>
+              </w:rPr>
+              <w:t>ServiceRunningObserved</w:t>
+            </w:r>
+          </w:p>
+        </w:tc>
+        <w:tc>
+          <w:tcPr>
+            <w:tcW w:type="dxa" w:w="6460"/>
+            <w:shd w:fill="FAFBFC"/>
+            <w:tcMar>
+              <w:top w:w="80" w:type="dxa"/>
+              <w:start w:w="120" w:type="dxa"/>
+              <w:bottom w:w="80" w:type="dxa"/>
+              <w:end w:w="120" w:type="dxa"/>
+            </w:tcMar>
+            <w:vAlign w:val="center"/>
+          </w:tcPr>
+          <w:p>
+            <w:pPr>
+              <w:spacing w:before="0" w:after="0" w:line="240" w:lineRule="auto"/>
+              <w:jc w:val="left"/>
+            </w:pPr>
+            <w:r>
+              <w:rPr>
+                <w:rFonts w:ascii="맑은 고딕" w:hAnsi="맑은 고딕" w:eastAsia="맑은 고딕" w:cs="맑은 고딕"/>
+                <w:sz w:val="16"/>
+              </w:rPr>
+              <w:t>검사 중 Agent 서비스 Running을 관찰했는지 여부</w:t>
+            </w:r>
+          </w:p>
+        </w:tc>
+      </w:tr>
+      <w:tr>
+        <w:trPr>
+          <w:cantSplit w:val="true"/>
+        </w:trPr>
+        <w:tc>
+          <w:tcPr>
+            <w:tcW w:type="dxa" w:w="2900"/>
+            <w:tcMar>
+              <w:top w:w="80" w:type="dxa"/>
+              <w:start w:w="120" w:type="dxa"/>
+              <w:bottom w:w="80" w:type="dxa"/>
+              <w:end w:w="120" w:type="dxa"/>
+            </w:tcMar>
+            <w:vAlign w:val="center"/>
+          </w:tcPr>
+          <w:p>
+            <w:pPr>
+              <w:spacing w:before="0" w:after="0" w:line="240" w:lineRule="auto"/>
+              <w:jc w:val="left"/>
+            </w:pPr>
+            <w:r>
+              <w:rPr>
+                <w:rFonts w:ascii="맑은 고딕" w:hAnsi="맑은 고딕" w:eastAsia="맑은 고딕" w:cs="맑은 고딕"/>
+                <w:sz w:val="16"/>
+              </w:rPr>
+              <w:t>ListenerOwnedObserved</w:t>
+            </w:r>
+          </w:p>
+        </w:tc>
+        <w:tc>
+          <w:tcPr>
+            <w:tcW w:type="dxa" w:w="6460"/>
+            <w:tcMar>
+              <w:top w:w="80" w:type="dxa"/>
+              <w:start w:w="120" w:type="dxa"/>
+              <w:bottom w:w="80" w:type="dxa"/>
+              <w:end w:w="120" w:type="dxa"/>
+            </w:tcMar>
+            <w:vAlign w:val="center"/>
+          </w:tcPr>
+          <w:p>
+            <w:pPr>
+              <w:spacing w:before="0" w:after="0" w:line="240" w:lineRule="auto"/>
+              <w:jc w:val="left"/>
+            </w:pPr>
+            <w:r>
+              <w:rPr>
+                <w:rFonts w:ascii="맑은 고딕" w:hAnsi="맑은 고딕" w:eastAsia="맑은 고딕" w:cs="맑은 고딕"/>
+                <w:sz w:val="16"/>
+              </w:rPr>
+              <w:t>기대 서비스가 TCP/18443 listener를 소유함을 관찰했는지 여부</w:t>
+            </w:r>
+          </w:p>
+        </w:tc>
+      </w:tr>
+      <w:tr>
+        <w:trPr>
+          <w:cantSplit w:val="true"/>
+        </w:trPr>
+        <w:tc>
+          <w:tcPr>
+            <w:tcW w:type="dxa" w:w="2900"/>
+            <w:shd w:fill="FAFBFC"/>
+            <w:tcMar>
+              <w:top w:w="80" w:type="dxa"/>
+              <w:start w:w="120" w:type="dxa"/>
+              <w:bottom w:w="80" w:type="dxa"/>
+              <w:end w:w="120" w:type="dxa"/>
+            </w:tcMar>
+            <w:vAlign w:val="center"/>
+          </w:tcPr>
+          <w:p>
+            <w:pPr>
+              <w:spacing w:before="0" w:after="0" w:line="240" w:lineRule="auto"/>
+              <w:jc w:val="left"/>
+            </w:pPr>
+            <w:r>
+              <w:rPr>
+                <w:rFonts w:ascii="맑은 고딕" w:hAnsi="맑은 고딕" w:eastAsia="맑은 고딕" w:cs="맑은 고딕"/>
+                <w:sz w:val="16"/>
+              </w:rPr>
+              <w:t>HttpAttemptCount</w:t>
+            </w:r>
+          </w:p>
+        </w:tc>
+        <w:tc>
+          <w:tcPr>
+            <w:tcW w:type="dxa" w:w="6460"/>
+            <w:shd w:fill="FAFBFC"/>
+            <w:tcMar>
+              <w:top w:w="80" w:type="dxa"/>
+              <w:start w:w="120" w:type="dxa"/>
+              <w:bottom w:w="80" w:type="dxa"/>
+              <w:end w:w="120" w:type="dxa"/>
+            </w:tcMar>
+            <w:vAlign w:val="center"/>
+          </w:tcPr>
+          <w:p>
+            <w:pPr>
+              <w:spacing w:before="0" w:after="0" w:line="240" w:lineRule="auto"/>
+              <w:jc w:val="left"/>
+            </w:pPr>
+            <w:r>
+              <w:rPr>
+                <w:rFonts w:ascii="맑은 고딕" w:hAnsi="맑은 고딕" w:eastAsia="맑은 고딕" w:cs="맑은 고딕"/>
+                <w:sz w:val="16"/>
+              </w:rPr>
+              <w:t>로컬 HTTPS 요청을 시도한 제한된 횟수</w:t>
+            </w:r>
+          </w:p>
+        </w:tc>
+      </w:tr>
+      <w:tr>
+        <w:trPr>
+          <w:cantSplit w:val="true"/>
+        </w:trPr>
+        <w:tc>
+          <w:tcPr>
+            <w:tcW w:type="dxa" w:w="2900"/>
+            <w:tcMar>
+              <w:top w:w="80" w:type="dxa"/>
+              <w:start w:w="120" w:type="dxa"/>
+              <w:bottom w:w="80" w:type="dxa"/>
+              <w:end w:w="120" w:type="dxa"/>
+            </w:tcMar>
+            <w:vAlign w:val="center"/>
+          </w:tcPr>
+          <w:p>
+            <w:pPr>
+              <w:spacing w:before="0" w:after="0" w:line="240" w:lineRule="auto"/>
+              <w:jc w:val="left"/>
+            </w:pPr>
+            <w:r>
+              <w:rPr>
+                <w:rFonts w:ascii="맑은 고딕" w:hAnsi="맑은 고딕" w:eastAsia="맑은 고딕" w:cs="맑은 고딕"/>
+                <w:sz w:val="16"/>
+              </w:rPr>
+              <w:t>LastTransportPhase</w:t>
+            </w:r>
+          </w:p>
+        </w:tc>
+        <w:tc>
+          <w:tcPr>
+            <w:tcW w:type="dxa" w:w="6460"/>
+            <w:tcMar>
+              <w:top w:w="80" w:type="dxa"/>
+              <w:start w:w="120" w:type="dxa"/>
+              <w:bottom w:w="80" w:type="dxa"/>
+              <w:end w:w="120" w:type="dxa"/>
+            </w:tcMar>
+            <w:vAlign w:val="center"/>
+          </w:tcPr>
+          <w:p>
+            <w:pPr>
+              <w:spacing w:before="0" w:after="0" w:line="240" w:lineRule="auto"/>
+              <w:jc w:val="left"/>
+            </w:pPr>
+            <w:r>
+              <w:rPr>
+                <w:rFonts w:ascii="맑은 고딕" w:hAnsi="맑은 고딕" w:eastAsia="맑은 고딕" w:cs="맑은 고딕"/>
+                <w:sz w:val="16"/>
+              </w:rPr>
+              <w:t>ListenerOwned, RequestStarted, ResponseHeaders 등 마지막 안전 단계</w:t>
+            </w:r>
+          </w:p>
+        </w:tc>
+      </w:tr>
+      <w:tr>
+        <w:trPr>
+          <w:cantSplit w:val="true"/>
+        </w:trPr>
+        <w:tc>
+          <w:tcPr>
+            <w:tcW w:type="dxa" w:w="2900"/>
+            <w:shd w:fill="FAFBFC"/>
+            <w:tcMar>
+              <w:top w:w="80" w:type="dxa"/>
+              <w:start w:w="120" w:type="dxa"/>
+              <w:bottom w:w="80" w:type="dxa"/>
+              <w:end w:w="120" w:type="dxa"/>
+            </w:tcMar>
+            <w:vAlign w:val="center"/>
+          </w:tcPr>
+          <w:p>
+            <w:pPr>
+              <w:spacing w:before="0" w:after="0" w:line="240" w:lineRule="auto"/>
+              <w:jc w:val="left"/>
+            </w:pPr>
+            <w:r>
+              <w:rPr>
+                <w:rFonts w:ascii="맑은 고딕" w:hAnsi="맑은 고딕" w:eastAsia="맑은 고딕" w:cs="맑은 고딕"/>
+                <w:sz w:val="16"/>
+              </w:rPr>
+              <w:t>AgentRestartObserved</w:t>
+            </w:r>
+          </w:p>
+        </w:tc>
+        <w:tc>
+          <w:tcPr>
+            <w:tcW w:type="dxa" w:w="6460"/>
+            <w:shd w:fill="FAFBFC"/>
+            <w:tcMar>
+              <w:top w:w="80" w:type="dxa"/>
+              <w:start w:w="120" w:type="dxa"/>
+              <w:bottom w:w="80" w:type="dxa"/>
+              <w:end w:w="120" w:type="dxa"/>
+            </w:tcMar>
+            <w:vAlign w:val="center"/>
+          </w:tcPr>
+          <w:p>
+            <w:pPr>
+              <w:spacing w:before="0" w:after="0" w:line="240" w:lineRule="auto"/>
+              <w:jc w:val="left"/>
+            </w:pPr>
+            <w:r>
+              <w:rPr>
+                <w:rFonts w:ascii="맑은 고딕" w:hAnsi="맑은 고딕" w:eastAsia="맑은 고딕" w:cs="맑은 고딕"/>
+                <w:sz w:val="16"/>
+              </w:rPr>
+              <w:t>검사 중 Agent 서비스 프로세스 재시작을 관찰했는지 여부</w:t>
+            </w:r>
+          </w:p>
+        </w:tc>
+      </w:tr>
+    </w:tbl>
+    <w:p>
+      <w:pPr>
+        <w:spacing w:after="60"/>
+      </w:pPr>
+    </w:p>
+    <w:p>
+      <w:pPr>
+        <w:pStyle w:val="CodeBlock"/>
+        <w:keepLines/>
+        <w:shd w:fill="F4F6F9"/>
+        <w:pBdr>
+          <w:left w:val="single" w:sz="10" w:space="8" w:color="64748B"/>
+        </w:pBdr>
+      </w:pPr>
+      <w:r>
+        <w:rPr>
+          <w:rFonts w:ascii="Consolas" w:hAnsi="Consolas" w:eastAsia="Consolas" w:cs="Consolas"/>
+          <w:color w:val="243447"/>
+          <w:sz w:val="17"/>
+        </w:rPr>
+        <w:t>AgentHealthCode=HTTPS_REQUEST_TIMEOUT</w:t>
+      </w:r>
+      <w:r>
+        <w:br/>
+      </w:r>
+      <w:r>
+        <w:rPr>
+          <w:rFonts w:ascii="Consolas" w:hAnsi="Consolas" w:eastAsia="Consolas" w:cs="Consolas"/>
+          <w:color w:val="243447"/>
+          <w:sz w:val="17"/>
+        </w:rPr>
+        <w:t>ServiceRunningObserved=TRUE</w:t>
+      </w:r>
+      <w:r>
+        <w:br/>
+      </w:r>
+      <w:r>
+        <w:rPr>
+          <w:rFonts w:ascii="Consolas" w:hAnsi="Consolas" w:eastAsia="Consolas" w:cs="Consolas"/>
+          <w:color w:val="243447"/>
+          <w:sz w:val="17"/>
+        </w:rPr>
+        <w:t>ListenerOwnedObserved=TRUE</w:t>
+      </w:r>
+      <w:r>
+        <w:br/>
+      </w:r>
+      <w:r>
+        <w:rPr>
+          <w:rFonts w:ascii="Consolas" w:hAnsi="Consolas" w:eastAsia="Consolas" w:cs="Consolas"/>
+          <w:color w:val="243447"/>
+          <w:sz w:val="17"/>
+        </w:rPr>
+        <w:t>HttpAttemptCount=3</w:t>
+      </w:r>
+      <w:r>
+        <w:br/>
+      </w:r>
+      <w:r>
+        <w:rPr>
+          <w:rFonts w:ascii="Consolas" w:hAnsi="Consolas" w:eastAsia="Consolas" w:cs="Consolas"/>
+          <w:color w:val="243447"/>
+          <w:sz w:val="17"/>
+        </w:rPr>
+        <w:t>LastTransportPhase=REQUEST_STARTED</w:t>
+      </w:r>
+      <w:r>
+        <w:br/>
+      </w:r>
+      <w:r>
+        <w:rPr>
+          <w:rFonts w:ascii="Consolas" w:hAnsi="Consolas" w:eastAsia="Consolas" w:cs="Consolas"/>
+          <w:color w:val="243447"/>
+          <w:sz w:val="17"/>
+        </w:rPr>
+        <w:t>AgentRestartObserved=FALSE</w:t>
+      </w:r>
+      <w:r>
+        <w:br/>
+      </w:r>
+      <w:r>
+        <w:rPr>
+          <w:rFonts w:ascii="Consolas" w:hAnsi="Consolas" w:eastAsia="Consolas" w:cs="Consolas"/>
+          <w:color w:val="243447"/>
+          <w:sz w:val="17"/>
+        </w:rPr>
+      </w:r>
+      <w:r>
+        <w:br/>
+      </w:r>
+      <w:r>
+        <w:rPr>
+          <w:rFonts w:ascii="Consolas" w:hAnsi="Consolas" w:eastAsia="Consolas" w:cs="Consolas"/>
+          <w:color w:val="243447"/>
+          <w:sz w:val="17"/>
+        </w:rPr>
+        <w:t>Stage.01.Code=SERVICE_STARTED</w:t>
+      </w:r>
+      <w:r>
+        <w:br/>
+      </w:r>
+      <w:r>
+        <w:rPr>
+          <w:rFonts w:ascii="Consolas" w:hAnsi="Consolas" w:eastAsia="Consolas" w:cs="Consolas"/>
+          <w:color w:val="243447"/>
+          <w:sz w:val="17"/>
+        </w:rPr>
+        <w:t>Stage.02.Code=SETUP_HEALTH_FAILED</w:t>
+      </w:r>
+      <w:r>
+        <w:br/>
+      </w:r>
+      <w:r>
+        <w:rPr>
+          <w:rFonts w:ascii="Consolas" w:hAnsi="Consolas" w:eastAsia="Consolas" w:cs="Consolas"/>
+          <w:color w:val="243447"/>
+          <w:sz w:val="17"/>
+        </w:rPr>
+        <w:t>Stage.03.Code=ROLLBACK_COMPLETED</w:t>
+      </w:r>
+      <w:r>
+        <w:br/>
+      </w:r>
+      <w:r>
+        <w:rPr>
+          <w:rFonts w:ascii="Consolas" w:hAnsi="Consolas" w:eastAsia="Consolas" w:cs="Consolas"/>
+          <w:color w:val="243447"/>
+          <w:sz w:val="17"/>
+        </w:rPr>
+        <w:t xml:space="preserve">        </w:t>
+      </w:r>
+    </w:p>
+    <w:p>
+      <w:pPr>
+        <w:keepLines/>
+        <w:pageBreakBefore w:val="0"/>
+        <w:spacing w:before="80" w:after="160" w:line="283" w:lineRule="auto"/>
+        <w:ind w:left="115" w:right="58"/>
+        <w:shd w:fill="E8EEF5"/>
+        <w:pBdr>
+          <w:left w:val="single" w:sz="16" w:space="8" w:color="2E74B5"/>
+        </w:pBdr>
+      </w:pPr>
+      <w:r>
+        <w:rPr>
+          <w:rFonts w:ascii="맑은 고딕" w:hAnsi="맑은 고딕" w:eastAsia="맑은 고딕" w:cs="맑은 고딕"/>
+          <w:b/>
+          <w:color w:val="2E74B5"/>
+          <w:sz w:val="21"/>
+        </w:rPr>
+        <w:t xml:space="preserve">진단만 세분화됨  </w:t>
+      </w:r>
+      <w:r>
+        <w:rPr>
+          <w:rFonts w:ascii="맑은 고딕" w:hAnsi="맑은 고딕" w:eastAsia="맑은 고딕" w:cs="맑은 고딕"/>
+          <w:color w:val="16324F"/>
+          <w:sz w:val="21"/>
+        </w:rPr>
+        <w:t>SERVICE_STARTED → SETUP_HEALTH_FAILED → ROLLBACK_COMPLETED 순서와 각 단계 소요 시간은 실패 위치를 구분하기 위한 기록입니다. 설치, 방화벽, Agent 신원, rollback과 보안 검증 흐름은 바뀌지 않습니다. TRUE는 검사 중 관찰한 사실일 뿐 현재 상태를 영구 보장하지 않으며, FALSE는 반드시 반대 상태를 확인했다는 뜻이 아니라 관찰하지 못했음을 뜻할 수 있습니다.</w:t>
+      </w:r>
+    </w:p>
+    <w:p>
+      <w:pPr>
+        <w:keepLines/>
+        <w:pageBreakBefore w:val="0"/>
+        <w:spacing w:before="80" w:after="160" w:line="283" w:lineRule="auto"/>
+        <w:ind w:left="115" w:right="58"/>
         <w:shd w:fill="E8EEF5"/>
         <w:pBdr>
           <w:left w:val="single" w:sz="16" w:space="8" w:color="2E74B5"/>
@@ -1793,7 +2401,7 @@
           <w:color w:val="16324F"/>
           <w:sz w:val="21"/>
         </w:rPr>
-        <w:t>Agent Setup에 설치 실패가 표시되면 실패 단계와 Cause를 먼저 확인하세요. SETUP_FIREWALL_FAILED는 적용 직후 최대 2초 동안 재확인해도 제품 방화벽 규칙이 정확하지 않다는 뜻입니다. Setup은 실제 주소 대신 안전한 불일치 코드를 표시하고 설치 전 상태로 복구합니다. 규칙을 Any, LocalSubnet 또는 넓은 대역으로 수동 확대하지 마세요. 설치 성공 뒤 AGENT_CONNECTION_REFUSED가 보이면 Viewer에 스위치 IP나 localhost가 아니라 Agent를 설치한 PC의 실제 주소를 입력했는지 먼저 확인하세요. 동일 PC 사전 테스트도 localhost 대신 이 PC의 실제 RFC1918 사설 IPv4를 사용합니다. 그 다음 Agent Setup의 검사에서 SamsungSwitchWatchAgent 서비스와 TCP/18443을 점검합니다. AGENT_CLIENT_NOT_ALLOWED이면 현재 Viewer PC의 고정 IPv4를 Agent Setup에 다시 입력하고 설치/업데이트합니다. 서비스를 수동 등록하지 말고 0.10.12-poc Agent Setup을 사용하세요.</w:t>
+        <w:t>Agent Setup에 설치 실패가 표시되면 실패 단계와 Cause를 먼저 확인하세요. SETUP_FIREWALL_FAILED는 적용 직후 최대 2초 동안 재확인해도 제품 방화벽 규칙이 정확하지 않다는 뜻입니다. Setup은 실제 주소 대신 안전한 불일치 코드를 표시하고 설치 전 상태로 복구합니다. 규칙을 Any, LocalSubnet 또는 넓은 대역으로 수동 확대하지 마세요. 설치 성공 뒤 AGENT_CONNECTION_REFUSED가 보이면 Viewer에 스위치 IP나 localhost가 아니라 Agent를 설치한 PC의 실제 주소를 입력했는지 먼저 확인하세요. 동일 PC 사전 테스트도 localhost 대신 이 PC의 실제 RFC1918 사설 IPv4를 사용합니다. 그 다음 Agent Setup의 검사에서 SamsungSwitchWatchAgent 서비스와 TCP/18443을 점검합니다. AGENT_CLIENT_NOT_ALLOWED이면 현재 Viewer PC의 고정 IPv4를 Agent Setup에 다시 입력하고 설치/업데이트합니다. 서비스를 수동 등록하지 말고 0.10.13-poc Agent Setup을 사용하세요.</w:t>
       </w:r>
     </w:p>
     <w:p>
@@ -1841,7 +2449,7 @@
           <w:color w:val="16324F"/>
           <w:sz w:val="21"/>
         </w:rPr>
-        <w:t>이전 Viewer가 실행 중이면 새 Viewer는 같은 사용자 데이터를 동시에 쓰지 않도록 실행을 차단하고 전환 순서를 표시합니다. 기존 트레이 아이콘에서 '프로그램 종료'를 선택한 뒤 Win+R에서 shell:startup을 열어 'Samsung Switch Watch' 바로 가기를 삭제합니다. 이어 shell:programs에서도 같은 이름의 이전 시작 메뉴 바로 가기를 삭제하고 새 Viewer를 다시 실행하세요. 기존 Agent 연결과 장비 정보는 유지됩니다. 창이 바로 보이지 않으면 알림 영역에서 대시보드를 열고 실행 경로가 새 0.10.12-poc 폴더인지 확인하세요.</w:t>
+        <w:t>이전 Viewer가 실행 중이면 새 Viewer는 같은 사용자 데이터를 동시에 쓰지 않도록 실행을 차단하고 전환 순서를 표시합니다. 기존 트레이 아이콘에서 '프로그램 종료'를 선택한 뒤 Win+R에서 shell:startup을 열어 'Samsung Switch Watch' 바로 가기를 삭제합니다. 이어 shell:programs에서도 같은 이름의 이전 시작 메뉴 바로 가기를 삭제하고 새 Viewer를 다시 실행하세요. 기존 Agent 연결과 장비 정보는 유지됩니다. 창이 바로 보이지 않으면 알림 영역에서 대시보드를 열고 실행 경로가 새 0.10.13-poc 폴더인지 확인하세요.</w:t>
       </w:r>
     </w:p>
     <w:p>
@@ -1941,7 +2549,7 @@
           <w:color w:val="16324F"/>
           <w:sz w:val="21"/>
         </w:rPr>
-        <w:t>0.10.12-poc는 코드 서명되지 않아 SmartScreen이나 사내 EDR이 차단할 수 있습니다. ZIP을 완전히 압축 해제하고 Viewer EXE와 제공된 DLL이 같은 폴더에 있는지 확인하세요. EDR·AppLocker·WDAC가 차단하면 우회하지 말고 공식 ZIP의 버전·해시와 차단 기록을 보안 담당자에게 전달하세요.</w:t>
+        <w:t>0.10.13-poc는 코드 서명되지 않아 SmartScreen이나 사내 EDR이 차단할 수 있습니다. ZIP을 완전히 압축 해제하고 Viewer EXE와 제공된 DLL이 같은 폴더에 있는지 확인하세요. EDR·AppLocker·WDAC가 차단하면 우회하지 말고 공식 ZIP의 버전·해시와 차단 기록을 보안 담당자에게 전달하세요.</w:t>
       </w:r>
     </w:p>
     <w:p>
@@ -6575,7 +7183,7 @@
                 <w:rFonts w:ascii="맑은 고딕" w:hAnsi="맑은 고딕" w:eastAsia="맑은 고딕" w:cs="맑은 고딕"/>
                 <w:sz w:val="16"/>
               </w:rPr>
-              <w:t>화면의 AgentHealthCode로 서비스·TCP/18443·HTTPS·응답·API/제품 버전 단계 확인 → 같은 설치 반복 대신 Windows 이벤트·EDR 확인</w:t>
+              <w:t>Agent PC 내부 Setup → 127.0.0.1:18443 → Agent 서비스 구간 확인 → AgentHealthCode와 안전 관측값 확인 → 같은 설치 반복 대신 Windows 이벤트·TLS 정책·EDR 확인</w:t>
             </w:r>
           </w:p>
         </w:tc>
@@ -9010,7 +9618,7 @@
         <w:color w:val="64748B"/>
         <w:sz w:val="17"/>
       </w:rPr>
-      <w:t xml:space="preserve">v0.10.12-poc  |  </w:t>
+      <w:t xml:space="preserve">v0.10.13-poc  |  </w:t>
     </w:r>
     <w:r>
       <w:rPr>
@@ -9041,7 +9649,7 @@
         <w:color w:val="64748B"/>
         <w:sz w:val="17"/>
       </w:rPr>
-      <w:t>v0.10.12-poc  |  2026-07-30</w:t>
+      <w:t>v0.10.13-poc  |  2026-08-04</w:t>
     </w:r>
   </w:p>
 </w:ftr>

</xml_diff>

<commit_message>
Make anonymous diagnostics photo-friendly
</commit_message>
<xml_diff>
--- a/docs/SamsungSwitchWatch_User_Manual_KO.docx
+++ b/docs/SamsungSwitchWatch_User_Manual_KO.docx
@@ -1153,7 +1153,7 @@
           <w:color w:val="16324F"/>
           <w:sz w:val="21"/>
         </w:rPr>
-        <w:t>0.10.13-poc는 코드 서명되지 않은 시험판입니다. 압축을 풀기 전에 Agent와 Viewer ZIP의 SHA-256을 해당 GitHub Release 본문에 표시된 값과 비교하고 사내 보안 반입 절차를 완료하세요. SmartScreen 또는 EDR 경고를 우회하지 않습니다.</w:t>
+        <w:t>0.10.14-poc는 코드 서명되지 않은 시험판입니다. 압축을 풀기 전에 Agent와 Viewer ZIP의 SHA-256을 해당 GitHub Release 본문에 표시된 값과 비교하고 사내 보안 반입 절차를 완료하세요. SmartScreen 또는 EDR 경고를 우회하지 않습니다.</w:t>
       </w:r>
     </w:p>
     <w:p>
@@ -2161,7 +2161,7 @@
           <w:color w:val="243447"/>
           <w:sz w:val="17"/>
         </w:rPr>
-        <w:t>AgentHealthCode=HTTPS_REQUEST_TIMEOUT</w:t>
+        <w:t>SSW_FIELD_DIAGNOSTIC/2</w:t>
       </w:r>
       <w:r>
         <w:br/>
@@ -2172,7 +2172,7 @@
           <w:color w:val="243447"/>
           <w:sz w:val="17"/>
         </w:rPr>
-        <w:t>ServiceRunningObserved=TRUE</w:t>
+        <w:t>Component=AGENT_SETUP</w:t>
       </w:r>
       <w:r>
         <w:br/>
@@ -2183,7 +2183,7 @@
           <w:color w:val="243447"/>
           <w:sz w:val="17"/>
         </w:rPr>
-        <w:t>ListenerOwnedObserved=TRUE</w:t>
+        <w:t>ProductVersion=0.10.14-poc</w:t>
       </w:r>
       <w:r>
         <w:br/>
@@ -2194,7 +2194,7 @@
           <w:color w:val="243447"/>
           <w:sz w:val="17"/>
         </w:rPr>
-        <w:t>HttpAttemptCount=3</w:t>
+        <w:t>Environment=20260804T120000000Z|WIN_10_0_26100_0|X64</w:t>
       </w:r>
       <w:r>
         <w:br/>
@@ -2205,7 +2205,7 @@
           <w:color w:val="243447"/>
           <w:sz w:val="17"/>
         </w:rPr>
-        <w:t>LastTransportPhase=REQUEST_STARTED</w:t>
+        <w:t>Run=INSTALL|FAILURE|64182</w:t>
       </w:r>
       <w:r>
         <w:br/>
@@ -2216,7 +2216,7 @@
           <w:color w:val="243447"/>
           <w:sz w:val="17"/>
         </w:rPr>
-        <w:t>AgentRestartObserved=FALSE</w:t>
+        <w:t>FailedStage=READINESS</w:t>
       </w:r>
       <w:r>
         <w:br/>
@@ -2227,6 +2227,7 @@
           <w:color w:val="243447"/>
           <w:sz w:val="17"/>
         </w:rPr>
+        <w:t>ErrorCode=SETUP_HEALTH_FAILED</w:t>
       </w:r>
       <w:r>
         <w:br/>
@@ -2237,7 +2238,7 @@
           <w:color w:val="243447"/>
           <w:sz w:val="17"/>
         </w:rPr>
-        <w:t>Stage.01.Code=SERVICE_STARTED</w:t>
+        <w:t>Failure=SETUP_HEALTH_FAILED|CLASSIFIED|62011</w:t>
       </w:r>
       <w:r>
         <w:br/>
@@ -2248,7 +2249,7 @@
           <w:color w:val="243447"/>
           <w:sz w:val="17"/>
         </w:rPr>
-        <w:t>Stage.02.Code=SETUP_HEALTH_FAILED</w:t>
+        <w:t>Action=CHECK_AGENT_READINESS</w:t>
       </w:r>
       <w:r>
         <w:br/>
@@ -2259,7 +2260,29 @@
           <w:color w:val="243447"/>
           <w:sz w:val="17"/>
         </w:rPr>
-        <w:t>Stage.03.Code=ROLLBACK_COMPLETED</w:t>
+        <w:t>State=PASS|NONE|CONFIGURED|CONFIGURED|PASS|FAIL</w:t>
+      </w:r>
+      <w:r>
+        <w:br/>
+      </w:r>
+      <w:r>
+        <w:rPr>
+          <w:rFonts w:ascii="Consolas" w:hAnsi="Consolas" w:eastAsia="Consolas" w:cs="Consolas"/>
+          <w:color w:val="243447"/>
+          <w:sz w:val="17"/>
+        </w:rPr>
+        <w:t>Health=HTTPS_REQUEST_TIMEOUT|FTT|3|REQUEST_STARTED</w:t>
+      </w:r>
+      <w:r>
+        <w:br/>
+      </w:r>
+      <w:r>
+        <w:rPr>
+          <w:rFonts w:ascii="Consolas" w:hAnsi="Consolas" w:eastAsia="Consolas" w:cs="Consolas"/>
+          <w:color w:val="243447"/>
+          <w:sz w:val="17"/>
+        </w:rPr>
+        <w:t>Stages=7|SERVICE_STARTED:S&gt;SETUP_HEALTH_FAILED:F&gt;ROLLBACK_COMPLETED:S</w:t>
       </w:r>
       <w:r>
         <w:br/>
@@ -2299,7 +2322,7 @@
           <w:color w:val="16324F"/>
           <w:sz w:val="21"/>
         </w:rPr>
-        <w:t>SERVICE_STARTED → SETUP_HEALTH_FAILED → ROLLBACK_COMPLETED 순서와 각 단계 소요 시간은 실패 위치를 구분하기 위한 기록입니다. 설치, 방화벽, Agent 신원, rollback과 보안 검증 흐름은 바뀌지 않습니다. TRUE는 검사 중 관찰한 사실일 뿐 현재 상태를 영구 보장하지 않으며, FALSE는 반드시 반대 상태를 확인했다는 뜻이 아니라 관찰하지 못했음을 뜻할 수 있습니다.</w:t>
+        <w:t>SERVICE_STARTED → SETUP_HEALTH_FAILED → ROLLBACK_COMPLETED 순서와 각 단계 소요 시간은 실패 위치를 구분하기 위한 기록입니다. 설치, 방화벽, Agent 신원, rollback과 보안 검증 흐름은 바뀌지 않습니다. Health의 세 글자는 재시작·서비스·listener 순서이며 T는 검사 중 관찰함, F는 관찰하지 못함을 뜻합니다. 이 값은 현재 상태를 영구 보장하지 않습니다.</w:t>
       </w:r>
     </w:p>
     <w:p>
@@ -2328,7 +2351,7 @@
           <w:color w:val="16324F"/>
           <w:sz w:val="21"/>
         </w:rPr>
-        <w:t>검사, 설치 또는 복구가 끝나면 '익명 진단 저장'으로 SSW_FIELD_DIAGNOSTIC/1 UTF-8 BOM TXT를 수동 저장할 수 있습니다. 자동 저장하지 않으며 제품·Windows 버전, 안전한 단계·결과·오류·조치 코드와 제한된 소요 시간만 포함합니다. 실제 IP/CIDR, PC·사용자명, 계정, 인증서 정보, 절대 경로, 방화벽·예외 원문, 명령과 장비 출력은 포함하지 않습니다. 저장 실패는 DIAGNOSTIC_WRITE_FAILED로 표시됩니다.</w:t>
+        <w:t>검사, 설치 또는 복구가 끝나면 '익명 진단 저장'으로 SSW_FIELD_DIAGNOSTIC/2 UTF-8 BOM TXT를 수동 저장할 수 있습니다. 사진 한 장으로 전달할 수 있도록 최대 12줄, 줄당 88자로 제한하며 제품·Windows 버전, 안전한 단계·결과·오류·조치 코드와 핵심 상태를 보존합니다. 실제 IP/CIDR, PC·사용자명, 계정, 인증서 정보, 절대 경로, 방화벽·예외 원문, 명령과 장비 출력은 포함하지 않습니다. 과거 /1 파일은 재현 도구에서 계속 분석할 수 있으며 저장 실패는 DIAGNOSTIC_WRITE_FAILED로 표시됩니다.</w:t>
       </w:r>
     </w:p>
     <w:p>
@@ -2401,7 +2424,7 @@
           <w:color w:val="16324F"/>
           <w:sz w:val="21"/>
         </w:rPr>
-        <w:t>Agent Setup에 설치 실패가 표시되면 실패 단계와 Cause를 먼저 확인하세요. SETUP_FIREWALL_FAILED는 적용 직후 최대 2초 동안 재확인해도 제품 방화벽 규칙이 정확하지 않다는 뜻입니다. Setup은 실제 주소 대신 안전한 불일치 코드를 표시하고 설치 전 상태로 복구합니다. 규칙을 Any, LocalSubnet 또는 넓은 대역으로 수동 확대하지 마세요. 설치 성공 뒤 AGENT_CONNECTION_REFUSED가 보이면 Viewer에 스위치 IP나 localhost가 아니라 Agent를 설치한 PC의 실제 주소를 입력했는지 먼저 확인하세요. 동일 PC 사전 테스트도 localhost 대신 이 PC의 실제 RFC1918 사설 IPv4를 사용합니다. 그 다음 Agent Setup의 검사에서 SamsungSwitchWatchAgent 서비스와 TCP/18443을 점검합니다. AGENT_CLIENT_NOT_ALLOWED이면 현재 Viewer PC의 고정 IPv4를 Agent Setup에 다시 입력하고 설치/업데이트합니다. 서비스를 수동 등록하지 말고 0.10.13-poc Agent Setup을 사용하세요.</w:t>
+        <w:t>Agent Setup에 설치 실패가 표시되면 실패 단계와 Cause를 먼저 확인하세요. SETUP_FIREWALL_FAILED는 적용 직후 최대 2초 동안 재확인해도 제품 방화벽 규칙이 정확하지 않다는 뜻입니다. Setup은 실제 주소 대신 안전한 불일치 코드를 표시하고 설치 전 상태로 복구합니다. 규칙을 Any, LocalSubnet 또는 넓은 대역으로 수동 확대하지 마세요. 설치 성공 뒤 AGENT_CONNECTION_REFUSED가 보이면 Viewer에 스위치 IP나 localhost가 아니라 Agent를 설치한 PC의 실제 주소를 입력했는지 먼저 확인하세요. 동일 PC 사전 테스트도 localhost 대신 이 PC의 실제 RFC1918 사설 IPv4를 사용합니다. 그 다음 Agent Setup의 검사에서 SamsungSwitchWatchAgent 서비스와 TCP/18443을 점검합니다. AGENT_CLIENT_NOT_ALLOWED이면 현재 Viewer PC의 고정 IPv4를 Agent Setup에 다시 입력하고 설치/업데이트합니다. 서비스를 수동 등록하지 말고 0.10.14-poc Agent Setup을 사용하세요.</w:t>
       </w:r>
     </w:p>
     <w:p>
@@ -2449,7 +2472,7 @@
           <w:color w:val="16324F"/>
           <w:sz w:val="21"/>
         </w:rPr>
-        <w:t>이전 Viewer가 실행 중이면 새 Viewer는 같은 사용자 데이터를 동시에 쓰지 않도록 실행을 차단하고 전환 순서를 표시합니다. 기존 트레이 아이콘에서 '프로그램 종료'를 선택한 뒤 Win+R에서 shell:startup을 열어 'Samsung Switch Watch' 바로 가기를 삭제합니다. 이어 shell:programs에서도 같은 이름의 이전 시작 메뉴 바로 가기를 삭제하고 새 Viewer를 다시 실행하세요. 기존 Agent 연결과 장비 정보는 유지됩니다. 창이 바로 보이지 않으면 알림 영역에서 대시보드를 열고 실행 경로가 새 0.10.13-poc 폴더인지 확인하세요.</w:t>
+        <w:t>이전 Viewer가 실행 중이면 새 Viewer는 같은 사용자 데이터를 동시에 쓰지 않도록 실행을 차단하고 전환 순서를 표시합니다. 기존 트레이 아이콘에서 '프로그램 종료'를 선택한 뒤 Win+R에서 shell:startup을 열어 'Samsung Switch Watch' 바로 가기를 삭제합니다. 이어 shell:programs에서도 같은 이름의 이전 시작 메뉴 바로 가기를 삭제하고 새 Viewer를 다시 실행하세요. 기존 Agent 연결과 장비 정보는 유지됩니다. 창이 바로 보이지 않으면 알림 영역에서 대시보드를 열고 실행 경로가 새 0.10.14-poc 폴더인지 확인하세요.</w:t>
       </w:r>
     </w:p>
     <w:p>
@@ -2549,7 +2572,7 @@
           <w:color w:val="16324F"/>
           <w:sz w:val="21"/>
         </w:rPr>
-        <w:t>0.10.13-poc는 코드 서명되지 않아 SmartScreen이나 사내 EDR이 차단할 수 있습니다. ZIP을 완전히 압축 해제하고 Viewer EXE와 제공된 DLL이 같은 폴더에 있는지 확인하세요. EDR·AppLocker·WDAC가 차단하면 우회하지 말고 공식 ZIP의 버전·해시와 차단 기록을 보안 담당자에게 전달하세요.</w:t>
+        <w:t>0.10.14-poc는 코드 서명되지 않아 SmartScreen이나 사내 EDR이 차단할 수 있습니다. ZIP을 완전히 압축 해제하고 Viewer EXE와 제공된 DLL이 같은 폴더에 있는지 확인하세요. EDR·AppLocker·WDAC가 차단하면 우회하지 말고 공식 ZIP의 버전·해시와 차단 기록을 보안 담당자에게 전달하세요.</w:t>
       </w:r>
     </w:p>
     <w:p>
@@ -2831,7 +2854,7 @@
           <w:color w:val="16324F"/>
           <w:sz w:val="21"/>
         </w:rPr>
-        <w:t>일반 연결과 같은 PC 테스트가 성공 또는 실패로 끝나면 '익명 진단 저장'을 사용할 수 있습니다. 주소·DNS·TCP/18443·HTTPS·Identity 단계 상태와 제한된 소요 시간, 후보 수와 확인된 Agent/API 버전만 기록하며 입력 주소, DNS 이름, PC·사용자명, 계정, 경로, 예외 원문과 장비 명령·출력은 제외합니다. 연결 성공 뒤 창은 저장 결과를 보여 주며, 필요하면 진단을 저장한 다음 닫습니다.</w:t>
+        <w:t>일반 연결과 같은 PC 테스트가 성공 또는 실패로 끝나면 '익명 진단 저장'을 사용할 수 있습니다. 사진 한 장용 최대 12줄 TXT에는 주소·DNS·TCP/18443·HTTPS·Identity 단계 상태와 제한된 소요 시간, 후보 수와 확인된 Agent/API 버전만 기록하며 입력 주소, DNS 이름, PC·사용자명, 계정, 경로, 예외 원문과 장비 명령·출력은 제외합니다. 연결 성공 뒤 창은 저장 결과를 보여 주며, 필요하면 진단을 저장한 다음 닫습니다.</w:t>
       </w:r>
     </w:p>
     <w:p>
@@ -2860,7 +2883,7 @@
           <w:color w:val="16324F"/>
           <w:sz w:val="21"/>
         </w:rPr>
-        <w:t>SWD1은 Agent Setup 또는 Viewer 연결 실패를 전화·메신저로 짧게 전달하는 코드입니다. Agent Setup의 '진단정보 복사'는 실패 전용 긴 비식별 요약을 클립보드에 복사하고, '익명 진단 저장'은 작업이나 연결 검사가 끝난 뒤 SSW_FIELD_DIAGNOSTIC/1 상세 TXT를 사용자가 선택해 저장합니다. SWD1은 기존 진단을 대체하지 않으며 접속 권한을 부여하지 않습니다.</w:t>
+        <w:t>SWD1은 Agent Setup 또는 Viewer 연결 실패를 전화·메신저로 짧게 전달하는 코드입니다. Agent Setup의 '진단정보 복사'는 실패 전용 긴 비식별 요약을 클립보드에 복사하고, '익명 진단 저장'은 작업이나 연결 검사가 끝난 뒤 SSW_FIELD_DIAGNOSTIC/2 한 장용 TXT를 사용자가 선택해 저장합니다. SWD1은 기존 진단을 대체하지 않으며 접속 권한을 부여하지 않습니다.</w:t>
       </w:r>
     </w:p>
     <w:p>
@@ -9618,7 +9641,7 @@
         <w:color w:val="64748B"/>
         <w:sz w:val="17"/>
       </w:rPr>
-      <w:t xml:space="preserve">v0.10.13-poc  |  </w:t>
+      <w:t xml:space="preserve">v0.10.14-poc  |  </w:t>
     </w:r>
     <w:r>
       <w:rPr>
@@ -9649,7 +9672,7 @@
         <w:color w:val="64748B"/>
         <w:sz w:val="17"/>
       </w:rPr>
-      <w:t>v0.10.13-poc  |  2026-08-04</w:t>
+      <w:t>v0.10.14-poc  |  2026-08-04</w:t>
     </w:r>
   </w:p>
 </w:ftr>

</xml_diff>

<commit_message>
Make anonymous diagnostics photo-friendly (#50)
</commit_message>
<xml_diff>
--- a/docs/SamsungSwitchWatch_User_Manual_KO.docx
+++ b/docs/SamsungSwitchWatch_User_Manual_KO.docx
@@ -1153,7 +1153,7 @@
           <w:color w:val="16324F"/>
           <w:sz w:val="21"/>
         </w:rPr>
-        <w:t>0.10.13-poc는 코드 서명되지 않은 시험판입니다. 압축을 풀기 전에 Agent와 Viewer ZIP의 SHA-256을 해당 GitHub Release 본문에 표시된 값과 비교하고 사내 보안 반입 절차를 완료하세요. SmartScreen 또는 EDR 경고를 우회하지 않습니다.</w:t>
+        <w:t>0.10.14-poc는 코드 서명되지 않은 시험판입니다. 압축을 풀기 전에 Agent와 Viewer ZIP의 SHA-256을 해당 GitHub Release 본문에 표시된 값과 비교하고 사내 보안 반입 절차를 완료하세요. SmartScreen 또는 EDR 경고를 우회하지 않습니다.</w:t>
       </w:r>
     </w:p>
     <w:p>
@@ -2161,7 +2161,7 @@
           <w:color w:val="243447"/>
           <w:sz w:val="17"/>
         </w:rPr>
-        <w:t>AgentHealthCode=HTTPS_REQUEST_TIMEOUT</w:t>
+        <w:t>SSW_FIELD_DIAGNOSTIC/2</w:t>
       </w:r>
       <w:r>
         <w:br/>
@@ -2172,7 +2172,7 @@
           <w:color w:val="243447"/>
           <w:sz w:val="17"/>
         </w:rPr>
-        <w:t>ServiceRunningObserved=TRUE</w:t>
+        <w:t>Component=AGENT_SETUP</w:t>
       </w:r>
       <w:r>
         <w:br/>
@@ -2183,7 +2183,7 @@
           <w:color w:val="243447"/>
           <w:sz w:val="17"/>
         </w:rPr>
-        <w:t>ListenerOwnedObserved=TRUE</w:t>
+        <w:t>ProductVersion=0.10.14-poc</w:t>
       </w:r>
       <w:r>
         <w:br/>
@@ -2194,7 +2194,7 @@
           <w:color w:val="243447"/>
           <w:sz w:val="17"/>
         </w:rPr>
-        <w:t>HttpAttemptCount=3</w:t>
+        <w:t>Environment=20260804T120000000Z|WIN_10_0_26100_0|X64</w:t>
       </w:r>
       <w:r>
         <w:br/>
@@ -2205,7 +2205,7 @@
           <w:color w:val="243447"/>
           <w:sz w:val="17"/>
         </w:rPr>
-        <w:t>LastTransportPhase=REQUEST_STARTED</w:t>
+        <w:t>Run=INSTALL|FAILURE|64182</w:t>
       </w:r>
       <w:r>
         <w:br/>
@@ -2216,7 +2216,7 @@
           <w:color w:val="243447"/>
           <w:sz w:val="17"/>
         </w:rPr>
-        <w:t>AgentRestartObserved=FALSE</w:t>
+        <w:t>FailedStage=READINESS</w:t>
       </w:r>
       <w:r>
         <w:br/>
@@ -2227,6 +2227,7 @@
           <w:color w:val="243447"/>
           <w:sz w:val="17"/>
         </w:rPr>
+        <w:t>ErrorCode=SETUP_HEALTH_FAILED</w:t>
       </w:r>
       <w:r>
         <w:br/>
@@ -2237,7 +2238,7 @@
           <w:color w:val="243447"/>
           <w:sz w:val="17"/>
         </w:rPr>
-        <w:t>Stage.01.Code=SERVICE_STARTED</w:t>
+        <w:t>Failure=SETUP_HEALTH_FAILED|CLASSIFIED|62011</w:t>
       </w:r>
       <w:r>
         <w:br/>
@@ -2248,7 +2249,7 @@
           <w:color w:val="243447"/>
           <w:sz w:val="17"/>
         </w:rPr>
-        <w:t>Stage.02.Code=SETUP_HEALTH_FAILED</w:t>
+        <w:t>Action=CHECK_AGENT_READINESS</w:t>
       </w:r>
       <w:r>
         <w:br/>
@@ -2259,7 +2260,29 @@
           <w:color w:val="243447"/>
           <w:sz w:val="17"/>
         </w:rPr>
-        <w:t>Stage.03.Code=ROLLBACK_COMPLETED</w:t>
+        <w:t>State=PASS|NONE|CONFIGURED|CONFIGURED|PASS|FAIL</w:t>
+      </w:r>
+      <w:r>
+        <w:br/>
+      </w:r>
+      <w:r>
+        <w:rPr>
+          <w:rFonts w:ascii="Consolas" w:hAnsi="Consolas" w:eastAsia="Consolas" w:cs="Consolas"/>
+          <w:color w:val="243447"/>
+          <w:sz w:val="17"/>
+        </w:rPr>
+        <w:t>Health=HTTPS_REQUEST_TIMEOUT|FTT|3|REQUEST_STARTED</w:t>
+      </w:r>
+      <w:r>
+        <w:br/>
+      </w:r>
+      <w:r>
+        <w:rPr>
+          <w:rFonts w:ascii="Consolas" w:hAnsi="Consolas" w:eastAsia="Consolas" w:cs="Consolas"/>
+          <w:color w:val="243447"/>
+          <w:sz w:val="17"/>
+        </w:rPr>
+        <w:t>Stages=7|SERVICE_STARTED:S&gt;SETUP_HEALTH_FAILED:F&gt;ROLLBACK_COMPLETED:S</w:t>
       </w:r>
       <w:r>
         <w:br/>
@@ -2299,7 +2322,7 @@
           <w:color w:val="16324F"/>
           <w:sz w:val="21"/>
         </w:rPr>
-        <w:t>SERVICE_STARTED → SETUP_HEALTH_FAILED → ROLLBACK_COMPLETED 순서와 각 단계 소요 시간은 실패 위치를 구분하기 위한 기록입니다. 설치, 방화벽, Agent 신원, rollback과 보안 검증 흐름은 바뀌지 않습니다. TRUE는 검사 중 관찰한 사실일 뿐 현재 상태를 영구 보장하지 않으며, FALSE는 반드시 반대 상태를 확인했다는 뜻이 아니라 관찰하지 못했음을 뜻할 수 있습니다.</w:t>
+        <w:t>SERVICE_STARTED → SETUP_HEALTH_FAILED → ROLLBACK_COMPLETED 순서와 각 단계 소요 시간은 실패 위치를 구분하기 위한 기록입니다. 설치, 방화벽, Agent 신원, rollback과 보안 검증 흐름은 바뀌지 않습니다. Health의 세 글자는 재시작·서비스·listener 순서이며 T는 검사 중 관찰함, F는 관찰하지 못함을 뜻합니다. 이 값은 현재 상태를 영구 보장하지 않습니다.</w:t>
       </w:r>
     </w:p>
     <w:p>
@@ -2328,7 +2351,7 @@
           <w:color w:val="16324F"/>
           <w:sz w:val="21"/>
         </w:rPr>
-        <w:t>검사, 설치 또는 복구가 끝나면 '익명 진단 저장'으로 SSW_FIELD_DIAGNOSTIC/1 UTF-8 BOM TXT를 수동 저장할 수 있습니다. 자동 저장하지 않으며 제품·Windows 버전, 안전한 단계·결과·오류·조치 코드와 제한된 소요 시간만 포함합니다. 실제 IP/CIDR, PC·사용자명, 계정, 인증서 정보, 절대 경로, 방화벽·예외 원문, 명령과 장비 출력은 포함하지 않습니다. 저장 실패는 DIAGNOSTIC_WRITE_FAILED로 표시됩니다.</w:t>
+        <w:t>검사, 설치 또는 복구가 끝나면 '익명 진단 저장'으로 SSW_FIELD_DIAGNOSTIC/2 UTF-8 BOM TXT를 수동 저장할 수 있습니다. 사진 한 장으로 전달할 수 있도록 최대 12줄, 줄당 88자로 제한하며 제품·Windows 버전, 안전한 단계·결과·오류·조치 코드와 핵심 상태를 보존합니다. 실제 IP/CIDR, PC·사용자명, 계정, 인증서 정보, 절대 경로, 방화벽·예외 원문, 명령과 장비 출력은 포함하지 않습니다. 과거 /1 파일은 재현 도구에서 계속 분석할 수 있으며 저장 실패는 DIAGNOSTIC_WRITE_FAILED로 표시됩니다.</w:t>
       </w:r>
     </w:p>
     <w:p>
@@ -2401,7 +2424,7 @@
           <w:color w:val="16324F"/>
           <w:sz w:val="21"/>
         </w:rPr>
-        <w:t>Agent Setup에 설치 실패가 표시되면 실패 단계와 Cause를 먼저 확인하세요. SETUP_FIREWALL_FAILED는 적용 직후 최대 2초 동안 재확인해도 제품 방화벽 규칙이 정확하지 않다는 뜻입니다. Setup은 실제 주소 대신 안전한 불일치 코드를 표시하고 설치 전 상태로 복구합니다. 규칙을 Any, LocalSubnet 또는 넓은 대역으로 수동 확대하지 마세요. 설치 성공 뒤 AGENT_CONNECTION_REFUSED가 보이면 Viewer에 스위치 IP나 localhost가 아니라 Agent를 설치한 PC의 실제 주소를 입력했는지 먼저 확인하세요. 동일 PC 사전 테스트도 localhost 대신 이 PC의 실제 RFC1918 사설 IPv4를 사용합니다. 그 다음 Agent Setup의 검사에서 SamsungSwitchWatchAgent 서비스와 TCP/18443을 점검합니다. AGENT_CLIENT_NOT_ALLOWED이면 현재 Viewer PC의 고정 IPv4를 Agent Setup에 다시 입력하고 설치/업데이트합니다. 서비스를 수동 등록하지 말고 0.10.13-poc Agent Setup을 사용하세요.</w:t>
+        <w:t>Agent Setup에 설치 실패가 표시되면 실패 단계와 Cause를 먼저 확인하세요. SETUP_FIREWALL_FAILED는 적용 직후 최대 2초 동안 재확인해도 제품 방화벽 규칙이 정확하지 않다는 뜻입니다. Setup은 실제 주소 대신 안전한 불일치 코드를 표시하고 설치 전 상태로 복구합니다. 규칙을 Any, LocalSubnet 또는 넓은 대역으로 수동 확대하지 마세요. 설치 성공 뒤 AGENT_CONNECTION_REFUSED가 보이면 Viewer에 스위치 IP나 localhost가 아니라 Agent를 설치한 PC의 실제 주소를 입력했는지 먼저 확인하세요. 동일 PC 사전 테스트도 localhost 대신 이 PC의 실제 RFC1918 사설 IPv4를 사용합니다. 그 다음 Agent Setup의 검사에서 SamsungSwitchWatchAgent 서비스와 TCP/18443을 점검합니다. AGENT_CLIENT_NOT_ALLOWED이면 현재 Viewer PC의 고정 IPv4를 Agent Setup에 다시 입력하고 설치/업데이트합니다. 서비스를 수동 등록하지 말고 0.10.14-poc Agent Setup을 사용하세요.</w:t>
       </w:r>
     </w:p>
     <w:p>
@@ -2449,7 +2472,7 @@
           <w:color w:val="16324F"/>
           <w:sz w:val="21"/>
         </w:rPr>
-        <w:t>이전 Viewer가 실행 중이면 새 Viewer는 같은 사용자 데이터를 동시에 쓰지 않도록 실행을 차단하고 전환 순서를 표시합니다. 기존 트레이 아이콘에서 '프로그램 종료'를 선택한 뒤 Win+R에서 shell:startup을 열어 'Samsung Switch Watch' 바로 가기를 삭제합니다. 이어 shell:programs에서도 같은 이름의 이전 시작 메뉴 바로 가기를 삭제하고 새 Viewer를 다시 실행하세요. 기존 Agent 연결과 장비 정보는 유지됩니다. 창이 바로 보이지 않으면 알림 영역에서 대시보드를 열고 실행 경로가 새 0.10.13-poc 폴더인지 확인하세요.</w:t>
+        <w:t>이전 Viewer가 실행 중이면 새 Viewer는 같은 사용자 데이터를 동시에 쓰지 않도록 실행을 차단하고 전환 순서를 표시합니다. 기존 트레이 아이콘에서 '프로그램 종료'를 선택한 뒤 Win+R에서 shell:startup을 열어 'Samsung Switch Watch' 바로 가기를 삭제합니다. 이어 shell:programs에서도 같은 이름의 이전 시작 메뉴 바로 가기를 삭제하고 새 Viewer를 다시 실행하세요. 기존 Agent 연결과 장비 정보는 유지됩니다. 창이 바로 보이지 않으면 알림 영역에서 대시보드를 열고 실행 경로가 새 0.10.14-poc 폴더인지 확인하세요.</w:t>
       </w:r>
     </w:p>
     <w:p>
@@ -2549,7 +2572,7 @@
           <w:color w:val="16324F"/>
           <w:sz w:val="21"/>
         </w:rPr>
-        <w:t>0.10.13-poc는 코드 서명되지 않아 SmartScreen이나 사내 EDR이 차단할 수 있습니다. ZIP을 완전히 압축 해제하고 Viewer EXE와 제공된 DLL이 같은 폴더에 있는지 확인하세요. EDR·AppLocker·WDAC가 차단하면 우회하지 말고 공식 ZIP의 버전·해시와 차단 기록을 보안 담당자에게 전달하세요.</w:t>
+        <w:t>0.10.14-poc는 코드 서명되지 않아 SmartScreen이나 사내 EDR이 차단할 수 있습니다. ZIP을 완전히 압축 해제하고 Viewer EXE와 제공된 DLL이 같은 폴더에 있는지 확인하세요. EDR·AppLocker·WDAC가 차단하면 우회하지 말고 공식 ZIP의 버전·해시와 차단 기록을 보안 담당자에게 전달하세요.</w:t>
       </w:r>
     </w:p>
     <w:p>
@@ -2831,7 +2854,7 @@
           <w:color w:val="16324F"/>
           <w:sz w:val="21"/>
         </w:rPr>
-        <w:t>일반 연결과 같은 PC 테스트가 성공 또는 실패로 끝나면 '익명 진단 저장'을 사용할 수 있습니다. 주소·DNS·TCP/18443·HTTPS·Identity 단계 상태와 제한된 소요 시간, 후보 수와 확인된 Agent/API 버전만 기록하며 입력 주소, DNS 이름, PC·사용자명, 계정, 경로, 예외 원문과 장비 명령·출력은 제외합니다. 연결 성공 뒤 창은 저장 결과를 보여 주며, 필요하면 진단을 저장한 다음 닫습니다.</w:t>
+        <w:t>일반 연결과 같은 PC 테스트가 성공 또는 실패로 끝나면 '익명 진단 저장'을 사용할 수 있습니다. 사진 한 장용 최대 12줄 TXT에는 주소·DNS·TCP/18443·HTTPS·Identity 단계 상태와 제한된 소요 시간, 후보 수와 확인된 Agent/API 버전만 기록하며 입력 주소, DNS 이름, PC·사용자명, 계정, 경로, 예외 원문과 장비 명령·출력은 제외합니다. 연결 성공 뒤 창은 저장 결과를 보여 주며, 필요하면 진단을 저장한 다음 닫습니다.</w:t>
       </w:r>
     </w:p>
     <w:p>
@@ -2860,7 +2883,7 @@
           <w:color w:val="16324F"/>
           <w:sz w:val="21"/>
         </w:rPr>
-        <w:t>SWD1은 Agent Setup 또는 Viewer 연결 실패를 전화·메신저로 짧게 전달하는 코드입니다. Agent Setup의 '진단정보 복사'는 실패 전용 긴 비식별 요약을 클립보드에 복사하고, '익명 진단 저장'은 작업이나 연결 검사가 끝난 뒤 SSW_FIELD_DIAGNOSTIC/1 상세 TXT를 사용자가 선택해 저장합니다. SWD1은 기존 진단을 대체하지 않으며 접속 권한을 부여하지 않습니다.</w:t>
+        <w:t>SWD1은 Agent Setup 또는 Viewer 연결 실패를 전화·메신저로 짧게 전달하는 코드입니다. Agent Setup의 '진단정보 복사'는 실패 전용 긴 비식별 요약을 클립보드에 복사하고, '익명 진단 저장'은 작업이나 연결 검사가 끝난 뒤 SSW_FIELD_DIAGNOSTIC/2 한 장용 TXT를 사용자가 선택해 저장합니다. SWD1은 기존 진단을 대체하지 않으며 접속 권한을 부여하지 않습니다.</w:t>
       </w:r>
     </w:p>
     <w:p>
@@ -9618,7 +9641,7 @@
         <w:color w:val="64748B"/>
         <w:sz w:val="17"/>
       </w:rPr>
-      <w:t xml:space="preserve">v0.10.13-poc  |  </w:t>
+      <w:t xml:space="preserve">v0.10.14-poc  |  </w:t>
     </w:r>
     <w:r>
       <w:rPr>
@@ -9649,7 +9672,7 @@
         <w:color w:val="64748B"/>
         <w:sz w:val="17"/>
       </w:rPr>
-      <w:t>v0.10.13-poc  |  2026-08-04</w:t>
+      <w:t>v0.10.14-poc  |  2026-08-04</w:t>
     </w:r>
   </w:p>
 </w:ftr>

</xml_diff>

<commit_message>
Fix Agent setup HTTPS readiness on Windows
</commit_message>
<xml_diff>
--- a/docs/SamsungSwitchWatch_User_Manual_KO.docx
+++ b/docs/SamsungSwitchWatch_User_Manual_KO.docx
@@ -1153,7 +1153,7 @@
           <w:color w:val="16324F"/>
           <w:sz w:val="21"/>
         </w:rPr>
-        <w:t>0.10.14-poc는 코드 서명되지 않은 시험판입니다. 압축을 풀기 전에 Agent와 Viewer ZIP의 SHA-256을 해당 GitHub Release 본문에 표시된 값과 비교하고 사내 보안 반입 절차를 완료하세요. SmartScreen 또는 EDR 경고를 우회하지 않습니다.</w:t>
+        <w:t>0.10.15-poc는 코드 서명되지 않은 시험판입니다. 압축을 풀기 전에 Agent와 Viewer ZIP의 SHA-256을 해당 GitHub Release 본문에 표시된 값과 비교하고 사내 보안 반입 절차를 완료하세요. SmartScreen 또는 EDR 경고를 우회하지 않습니다.</w:t>
       </w:r>
     </w:p>
     <w:p>
@@ -2183,7 +2183,7 @@
           <w:color w:val="243447"/>
           <w:sz w:val="17"/>
         </w:rPr>
-        <w:t>ProductVersion=0.10.14-poc</w:t>
+        <w:t>ProductVersion=0.10.15-poc</w:t>
       </w:r>
       <w:r>
         <w:br/>
@@ -2424,7 +2424,7 @@
           <w:color w:val="16324F"/>
           <w:sz w:val="21"/>
         </w:rPr>
-        <w:t>Agent Setup에 설치 실패가 표시되면 실패 단계와 Cause를 먼저 확인하세요. SETUP_FIREWALL_FAILED는 적용 직후 최대 2초 동안 재확인해도 제품 방화벽 규칙이 정확하지 않다는 뜻입니다. Setup은 실제 주소 대신 안전한 불일치 코드를 표시하고 설치 전 상태로 복구합니다. 규칙을 Any, LocalSubnet 또는 넓은 대역으로 수동 확대하지 마세요. 설치 성공 뒤 AGENT_CONNECTION_REFUSED가 보이면 Viewer에 스위치 IP나 localhost가 아니라 Agent를 설치한 PC의 실제 주소를 입력했는지 먼저 확인하세요. 동일 PC 사전 테스트도 localhost 대신 이 PC의 실제 RFC1918 사설 IPv4를 사용합니다. 그 다음 Agent Setup의 검사에서 SamsungSwitchWatchAgent 서비스와 TCP/18443을 점검합니다. AGENT_CLIENT_NOT_ALLOWED이면 현재 Viewer PC의 고정 IPv4를 Agent Setup에 다시 입력하고 설치/업데이트합니다. 서비스를 수동 등록하지 말고 0.10.14-poc Agent Setup을 사용하세요.</w:t>
+        <w:t>Agent Setup에 설치 실패가 표시되면 실패 단계와 Cause를 먼저 확인하세요. SETUP_FIREWALL_FAILED는 적용 직후 최대 2초 동안 재확인해도 제품 방화벽 규칙이 정확하지 않다는 뜻입니다. Setup은 실제 주소 대신 안전한 불일치 코드를 표시하고 설치 전 상태로 복구합니다. 규칙을 Any, LocalSubnet 또는 넓은 대역으로 수동 확대하지 마세요. 설치 성공 뒤 AGENT_CONNECTION_REFUSED가 보이면 Viewer에 스위치 IP나 localhost가 아니라 Agent를 설치한 PC의 실제 주소를 입력했는지 먼저 확인하세요. 동일 PC 사전 테스트도 localhost 대신 이 PC의 실제 RFC1918 사설 IPv4를 사용합니다. 그 다음 Agent Setup의 검사에서 SamsungSwitchWatchAgent 서비스와 TCP/18443을 점검합니다. AGENT_CLIENT_NOT_ALLOWED이면 현재 Viewer PC의 고정 IPv4를 Agent Setup에 다시 입력하고 설치/업데이트합니다. 서비스를 수동 등록하지 말고 0.10.15-poc Agent Setup을 사용하세요.</w:t>
       </w:r>
     </w:p>
     <w:p>
@@ -2472,7 +2472,7 @@
           <w:color w:val="16324F"/>
           <w:sz w:val="21"/>
         </w:rPr>
-        <w:t>이전 Viewer가 실행 중이면 새 Viewer는 같은 사용자 데이터를 동시에 쓰지 않도록 실행을 차단하고 전환 순서를 표시합니다. 기존 트레이 아이콘에서 '프로그램 종료'를 선택한 뒤 Win+R에서 shell:startup을 열어 'Samsung Switch Watch' 바로 가기를 삭제합니다. 이어 shell:programs에서도 같은 이름의 이전 시작 메뉴 바로 가기를 삭제하고 새 Viewer를 다시 실행하세요. 기존 Agent 연결과 장비 정보는 유지됩니다. 창이 바로 보이지 않으면 알림 영역에서 대시보드를 열고 실행 경로가 새 0.10.14-poc 폴더인지 확인하세요.</w:t>
+        <w:t>이전 Viewer가 실행 중이면 새 Viewer는 같은 사용자 데이터를 동시에 쓰지 않도록 실행을 차단하고 전환 순서를 표시합니다. 기존 트레이 아이콘에서 '프로그램 종료'를 선택한 뒤 Win+R에서 shell:startup을 열어 'Samsung Switch Watch' 바로 가기를 삭제합니다. 이어 shell:programs에서도 같은 이름의 이전 시작 메뉴 바로 가기를 삭제하고 새 Viewer를 다시 실행하세요. 기존 Agent 연결과 장비 정보는 유지됩니다. 창이 바로 보이지 않으면 알림 영역에서 대시보드를 열고 실행 경로가 새 0.10.15-poc 폴더인지 확인하세요.</w:t>
       </w:r>
     </w:p>
     <w:p>
@@ -2572,7 +2572,7 @@
           <w:color w:val="16324F"/>
           <w:sz w:val="21"/>
         </w:rPr>
-        <w:t>0.10.14-poc는 코드 서명되지 않아 SmartScreen이나 사내 EDR이 차단할 수 있습니다. ZIP을 완전히 압축 해제하고 Viewer EXE와 제공된 DLL이 같은 폴더에 있는지 확인하세요. EDR·AppLocker·WDAC가 차단하면 우회하지 말고 공식 ZIP의 버전·해시와 차단 기록을 보안 담당자에게 전달하세요.</w:t>
+        <w:t>0.10.15-poc는 코드 서명되지 않아 SmartScreen이나 사내 EDR이 차단할 수 있습니다. ZIP을 완전히 압축 해제하고 Viewer EXE와 제공된 DLL이 같은 폴더에 있는지 확인하세요. EDR·AppLocker·WDAC가 차단하면 우회하지 말고 공식 ZIP의 버전·해시와 차단 기록을 보안 담당자에게 전달하세요.</w:t>
       </w:r>
     </w:p>
     <w:p>
@@ -9641,7 +9641,7 @@
         <w:color w:val="64748B"/>
         <w:sz w:val="17"/>
       </w:rPr>
-      <w:t xml:space="preserve">v0.10.14-poc  |  </w:t>
+      <w:t xml:space="preserve">v0.10.15-poc  |  </w:t>
     </w:r>
     <w:r>
       <w:rPr>
@@ -9672,7 +9672,7 @@
         <w:color w:val="64748B"/>
         <w:sz w:val="17"/>
       </w:rPr>
-      <w:t>v0.10.14-poc  |  2026-08-04</w:t>
+      <w:t>v0.10.15-poc  |  2026-08-04</w:t>
     </w:r>
   </w:p>
 </w:ftr>

</xml_diff>

<commit_message>
Relax Agent firewall readiness gate
</commit_message>
<xml_diff>
--- a/docs/SamsungSwitchWatch_User_Manual_KO.docx
+++ b/docs/SamsungSwitchWatch_User_Manual_KO.docx
@@ -1153,7 +1153,7 @@
           <w:color w:val="16324F"/>
           <w:sz w:val="21"/>
         </w:rPr>
-        <w:t>0.10.15-poc는 코드 서명되지 않은 시험판입니다. 압축을 풀기 전에 Agent와 Viewer ZIP의 SHA-256을 해당 GitHub Release 본문에 표시된 값과 비교하고 사내 보안 반입 절차를 완료하세요. SmartScreen 또는 EDR 경고를 우회하지 않습니다.</w:t>
+        <w:t>0.10.16-poc는 코드 서명되지 않은 시험판입니다. 압축을 풀기 전에 Agent와 Viewer ZIP의 SHA-256을 해당 GitHub Release 본문에 표시된 값과 비교하고 사내 보안 반입 절차를 완료하세요. SmartScreen 또는 EDR 경고를 우회하지 않습니다.</w:t>
       </w:r>
     </w:p>
     <w:p>
@@ -1474,6 +1474,35 @@
         <w:pageBreakBefore w:val="0"/>
         <w:spacing w:before="80" w:after="160" w:line="283" w:lineRule="auto"/>
         <w:ind w:left="115" w:right="58"/>
+        <w:shd w:fill="FFF8E8"/>
+        <w:pBdr>
+          <w:left w:val="single" w:sz="16" w:space="8" w:color="8A5A00"/>
+        </w:pBdr>
+      </w:pPr>
+      <w:r>
+        <w:rPr>
+          <w:rFonts w:ascii="맑은 고딕" w:hAnsi="맑은 고딕" w:eastAsia="맑은 고딕" w:cs="맑은 고딕"/>
+          <w:b/>
+          <w:color w:val="8A5A00"/>
+          <w:sz w:val="21"/>
+        </w:rPr>
+        <w:t xml:space="preserve">방화벽 확인 경고는 Agent 설치 실패가 아님  </w:t>
+      </w:r>
+      <w:r>
+        <w:rPr>
+          <w:rFonts w:ascii="맑은 고딕" w:hAnsi="맑은 고딕" w:eastAsia="맑은 고딕" w:cs="맑은 고딕"/>
+          <w:color w:val="16324F"/>
+          <w:sz w:val="21"/>
+        </w:rPr>
+        <w:t>제품 Viewer /32 규칙의 적용·재조회 또는 회사 GPO 확인이 실패하면 FIREWALL_REMOTE_ACCESS_UNCONFIRMED 경고와 '설치 완료 · 원격 Viewer 연결 확인 필요'를 표시합니다. 로컬 HTTPS/API/버전이 정상인 Agent 서비스와 프로그램은 유지하며, 방화벽 변경분만 설치 전 상태로 복원을 시도하고 결과를 경고에 남깁니다. Viewer에서 연결 테스트를 실행하고 TCP/18443이 실패할 때만 Windows 관리자에게 방화벽·GPO 경로를 요청하세요. Setup은 Any, LocalSubnet 또는 넓은 대역 규칙을 대신 만들지 않습니다.</w:t>
+      </w:r>
+    </w:p>
+    <w:p>
+      <w:pPr>
+        <w:keepLines/>
+        <w:pageBreakBefore w:val="0"/>
+        <w:spacing w:before="80" w:after="160" w:line="283" w:lineRule="auto"/>
+        <w:ind w:left="115" w:right="58"/>
         <w:shd w:fill="E8EEF5"/>
         <w:pBdr>
           <w:left w:val="single" w:sz="16" w:space="8" w:color="2E74B5"/>
@@ -1662,7 +1691,7 @@
           <w:color w:val="16324F"/>
           <w:sz w:val="21"/>
         </w:rPr>
-        <w:t>Setup은 BUILD-MANIFEST.json과 Agent 실행 파일 SHA-256을 확인하고, Program Files의 임시 staging에 복사한 파일을 다시 검사한 뒤 교체합니다. 서비스·프로그램·방화벽 변경 중 현재 작업이 실패하면 설치 전 상태로 되돌리기를 시도합니다. 다음 실행에서 완료되지 않은 journal이 남아 있으면 자동 복구하지 않고 별도의 '이전 상태 복구' 작업을 요구합니다. 새 서비스의 자동 재시작은 readiness 성공 뒤에만 적용하고, 검사 중에는 현재 서비스 PID와 TCP/18443 소유를 매번 다시 확인합니다. rollback 전에는 관찰한 서비스 프로세스 종료를 확인하고 프로그램 폴더의 일시적 잠금만 최대 5회 제한적으로 재시도합니다. staging·backup·failed·journal 정리가 잠시 실패하면 정확히 검증된 대상만 최대 3회 시도하고 실패한 시도 사이 250ms 대기한 뒤 삭제 결과를 확인합니다. 복구까지 실패하면 최초 설치 실패 코드를 별도로 유지하고 SETUP_ROLLBACK_FAILED와 실패한 ROLLBACK_* 단계를 함께 표시합니다.</w:t>
+        <w:t>Setup은 BUILD-MANIFEST.json과 Agent 실행 파일 SHA-256을 확인하고, Program Files의 임시 staging에 복사한 파일을 다시 검사한 뒤 교체합니다. 서비스·프로그램 또는 로컬 HTTPS/API/버전 확인이 실패하면 설치 전 상태로 되돌리기를 시도합니다. 방화벽·GPO·규칙 적용/재조회만 실패하면 방화벽 변경분 복원을 시도하고 Agent 설치는 경고 상태로 유지합니다. 다음 실행에서 완료되지 않은 journal이 남아 있으면 자동 복구하지 않고 별도의 '이전 상태 복구' 작업을 요구합니다. 새 서비스의 자동 재시작은 readiness 성공 뒤에만 적용하고, 검사 중에는 현재 서비스 PID와 TCP/18443 소유를 매번 다시 확인합니다. rollback 전에는 관찰한 서비스 프로세스 종료를 확인하고 프로그램 폴더의 일시적 잠금만 최대 5회 제한적으로 재시도합니다. staging·backup·failed·journal 정리가 잠시 실패하면 정확히 검증된 대상만 최대 3회 시도하고 실패한 시도 사이 250ms 대기한 뒤 삭제 결과를 확인합니다. 복구까지 실패하면 최초 설치 실패 코드를 별도로 유지하고 SETUP_ROLLBACK_FAILED와 실패한 ROLLBACK_* 단계를 함께 표시합니다.</w:t>
       </w:r>
     </w:p>
     <w:p>
@@ -2183,7 +2212,7 @@
           <w:color w:val="243447"/>
           <w:sz w:val="17"/>
         </w:rPr>
-        <w:t>ProductVersion=0.10.15-poc</w:t>
+        <w:t>ProductVersion=0.10.16-poc</w:t>
       </w:r>
       <w:r>
         <w:br/>
@@ -2416,7 +2445,7 @@
           <w:color w:val="B42318"/>
           <w:sz w:val="21"/>
         </w:rPr>
-        <w:t xml:space="preserve">설치 실패와 Viewer 연결 거부  </w:t>
+        <w:t xml:space="preserve">설치 경고와 Viewer 연결 거부  </w:t>
       </w:r>
       <w:r>
         <w:rPr>
@@ -2424,7 +2453,7 @@
           <w:color w:val="16324F"/>
           <w:sz w:val="21"/>
         </w:rPr>
-        <w:t>Agent Setup에 설치 실패가 표시되면 실패 단계와 Cause를 먼저 확인하세요. SETUP_FIREWALL_FAILED는 적용 직후 최대 2초 동안 재확인해도 제품 방화벽 규칙이 정확하지 않다는 뜻입니다. Setup은 실제 주소 대신 안전한 불일치 코드를 표시하고 설치 전 상태로 복구합니다. 규칙을 Any, LocalSubnet 또는 넓은 대역으로 수동 확대하지 마세요. 설치 성공 뒤 AGENT_CONNECTION_REFUSED가 보이면 Viewer에 스위치 IP나 localhost가 아니라 Agent를 설치한 PC의 실제 주소를 입력했는지 먼저 확인하세요. 동일 PC 사전 테스트도 localhost 대신 이 PC의 실제 RFC1918 사설 IPv4를 사용합니다. 그 다음 Agent Setup의 검사에서 SamsungSwitchWatchAgent 서비스와 TCP/18443을 점검합니다. AGENT_CLIENT_NOT_ALLOWED이면 현재 Viewer PC의 고정 IPv4를 Agent Setup에 다시 입력하고 설치/업데이트합니다. 서비스를 수동 등록하지 말고 0.10.15-poc Agent Setup을 사용하세요.</w:t>
+        <w:t>Agent Setup에 FIREWALL_REMOTE_ACCESS_UNCONFIRMED가 표시되면 Agent 설치는 완료됐지만 제품 방화벽 규칙의 적용·재조회 또는 회사 GPO를 확인하지 못했다는 뜻입니다. Viewer에서 연결 테스트를 실행하고, TCP/18443이 실패할 때 Windows 관리자에게 확인하세요. 규칙을 Any, LocalSubnet 또는 넓은 대역으로 수동 확대하지 마세요. AGENT_CONNECTION_REFUSED가 보이면 Viewer에 스위치 IP나 localhost가 아니라 Agent를 설치한 PC의 실제 주소를 입력했는지 먼저 확인하세요. 동일 PC 사전 테스트도 localhost 대신 이 PC의 실제 RFC1918 사설 IPv4를 사용합니다. 그 다음 Agent Setup의 검사에서 SamsungSwitchWatchAgent 서비스와 TCP/18443을 점검합니다. TCP 단계는 성공하고 HTTPS 단계가 실패하면 방화벽이 아니라 Agent PC의 로컬 HTTPS/TLS 준비 상태를 확인합니다. AGENT_CLIENT_NOT_ALLOWED이면 현재 Viewer PC의 고정 IPv4를 Agent Setup에 다시 입력하고 설치/업데이트합니다. 서비스를 수동 등록하지 말고 0.10.16-poc Agent Setup을 사용하세요.</w:t>
       </w:r>
     </w:p>
     <w:p>
@@ -2472,7 +2501,7 @@
           <w:color w:val="16324F"/>
           <w:sz w:val="21"/>
         </w:rPr>
-        <w:t>이전 Viewer가 실행 중이면 새 Viewer는 같은 사용자 데이터를 동시에 쓰지 않도록 실행을 차단하고 전환 순서를 표시합니다. 기존 트레이 아이콘에서 '프로그램 종료'를 선택한 뒤 Win+R에서 shell:startup을 열어 'Samsung Switch Watch' 바로 가기를 삭제합니다. 이어 shell:programs에서도 같은 이름의 이전 시작 메뉴 바로 가기를 삭제하고 새 Viewer를 다시 실행하세요. 기존 Agent 연결과 장비 정보는 유지됩니다. 창이 바로 보이지 않으면 알림 영역에서 대시보드를 열고 실행 경로가 새 0.10.15-poc 폴더인지 확인하세요.</w:t>
+        <w:t>이전 Viewer가 실행 중이면 새 Viewer는 같은 사용자 데이터를 동시에 쓰지 않도록 실행을 차단하고 전환 순서를 표시합니다. 기존 트레이 아이콘에서 '프로그램 종료'를 선택한 뒤 Win+R에서 shell:startup을 열어 'Samsung Switch Watch' 바로 가기를 삭제합니다. 이어 shell:programs에서도 같은 이름의 이전 시작 메뉴 바로 가기를 삭제하고 새 Viewer를 다시 실행하세요. 기존 Agent 연결과 장비 정보는 유지됩니다. 창이 바로 보이지 않으면 알림 영역에서 대시보드를 열고 실행 경로가 새 0.10.16-poc 폴더인지 확인하세요.</w:t>
       </w:r>
     </w:p>
     <w:p>
@@ -2572,7 +2601,7 @@
           <w:color w:val="16324F"/>
           <w:sz w:val="21"/>
         </w:rPr>
-        <w:t>0.10.15-poc는 코드 서명되지 않아 SmartScreen이나 사내 EDR이 차단할 수 있습니다. ZIP을 완전히 압축 해제하고 Viewer EXE와 제공된 DLL이 같은 폴더에 있는지 확인하세요. EDR·AppLocker·WDAC가 차단하면 우회하지 말고 공식 ZIP의 버전·해시와 차단 기록을 보안 담당자에게 전달하세요.</w:t>
+        <w:t>0.10.16-poc는 코드 서명되지 않아 SmartScreen이나 사내 EDR이 차단할 수 있습니다. ZIP을 완전히 압축 해제하고 Viewer EXE와 제공된 DLL이 같은 폴더에 있는지 확인하세요. EDR·AppLocker·WDAC가 차단하면 우회하지 말고 공식 ZIP의 버전·해시와 차단 기록을 보안 담당자에게 전달하세요.</w:t>
       </w:r>
     </w:p>
     <w:p>
@@ -6870,7 +6899,7 @@
                 <w:rFonts w:ascii="맑은 고딕" w:hAnsi="맑은 고딕" w:eastAsia="맑은 고딕" w:cs="맑은 고딕"/>
                 <w:sz w:val="16"/>
               </w:rPr>
-              <w:t>Agent Setup의 준비 상태 → PC 교체 여부 → HTTPS 신원 파일</w:t>
+              <w:t>TCP 성공 확인 → Agent PC의 로컬 HTTPS/TLS 준비 상태 → PC 교체 여부와 HTTPS 신원</w:t>
             </w:r>
           </w:p>
         </w:tc>
@@ -7125,7 +7154,7 @@
                 <w:rFonts w:ascii="맑은 고딕" w:hAnsi="맑은 고딕" w:eastAsia="맑은 고딕" w:cs="맑은 고딕"/>
                 <w:sz w:val="16"/>
               </w:rPr>
-              <w:t>SETUP_FIREWALL_FAILED</w:t>
+              <w:t>FIREWALL_REMOTE_ACCESS_UNCONFIRMED</w:t>
             </w:r>
           </w:p>
         </w:tc>
@@ -7151,7 +7180,7 @@
                 <w:rFonts w:ascii="맑은 고딕" w:hAnsi="맑은 고딕" w:eastAsia="맑은 고딕" w:cs="맑은 고딕"/>
                 <w:sz w:val="16"/>
               </w:rPr>
-              <w:t>안전한 불일치 코드 기록 → rollback 완료 확인 → 방화벽 서비스·Domain/Private·그룹 정책</w:t>
+              <w:t>Agent 설치 유지 확인 → Viewer 연결 테스트 → TCP 실패 시 방화벽 서비스·Domain/Private·회사 GPO 확인</w:t>
             </w:r>
           </w:p>
         </w:tc>
@@ -7181,6 +7210,62 @@
                 <w:rFonts w:ascii="맑은 고딕" w:hAnsi="맑은 고딕" w:eastAsia="맑은 고딕" w:cs="맑은 고딕"/>
                 <w:sz w:val="16"/>
               </w:rPr>
+              <w:t>SETUP_FIREWALL_FAILED</w:t>
+            </w:r>
+          </w:p>
+        </w:tc>
+        <w:tc>
+          <w:tcPr>
+            <w:tcW w:type="dxa" w:w="5060"/>
+            <w:tcMar>
+              <w:top w:w="80" w:type="dxa"/>
+              <w:start w:w="120" w:type="dxa"/>
+              <w:bottom w:w="80" w:type="dxa"/>
+              <w:end w:w="120" w:type="dxa"/>
+            </w:tcMar>
+            <w:vAlign w:val="center"/>
+          </w:tcPr>
+          <w:p>
+            <w:pPr>
+              <w:spacing w:before="0" w:after="0" w:line="240" w:lineRule="auto"/>
+              <w:jc w:val="left"/>
+            </w:pPr>
+            <w:r>
+              <w:rPr>
+                <w:rFonts w:ascii="맑은 고딕" w:hAnsi="맑은 고딕" w:eastAsia="맑은 고딕" w:cs="맑은 고딕"/>
+                <w:sz w:val="16"/>
+              </w:rPr>
+              <w:t>이전 버전/복구 호환 경로 → 안전한 불일치 코드와 rollback 상태 확인</w:t>
+            </w:r>
+          </w:p>
+        </w:tc>
+      </w:tr>
+      <w:tr>
+        <w:trPr>
+          <w:cantSplit w:val="true"/>
+        </w:trPr>
+        <w:tc>
+          <w:tcPr>
+            <w:tcW w:type="dxa" w:w="4300"/>
+            <w:shd w:fill="FAFBFC"/>
+            <w:tcMar>
+              <w:top w:w="80" w:type="dxa"/>
+              <w:start w:w="120" w:type="dxa"/>
+              <w:bottom w:w="80" w:type="dxa"/>
+              <w:end w:w="120" w:type="dxa"/>
+            </w:tcMar>
+            <w:vAlign w:val="center"/>
+          </w:tcPr>
+          <w:p>
+            <w:pPr>
+              <w:spacing w:before="0" w:after="0" w:line="240" w:lineRule="auto"/>
+              <w:jc w:val="left"/>
+            </w:pPr>
+            <w:r>
+              <w:rPr>
+                <w:rFonts w:ascii="맑은 고딕" w:hAnsi="맑은 고딕" w:eastAsia="맑은 고딕" w:cs="맑은 고딕"/>
+                <w:sz w:val="16"/>
+              </w:rPr>
               <w:t>SETUP_HEALTH_FAILED</w:t>
             </w:r>
           </w:p>
@@ -7188,6 +7273,7 @@
         <w:tc>
           <w:tcPr>
             <w:tcW w:type="dxa" w:w="5060"/>
+            <w:shd w:fill="FAFBFC"/>
             <w:tcMar>
               <w:top w:w="80" w:type="dxa"/>
               <w:start w:w="120" w:type="dxa"/>
@@ -7218,7 +7304,6 @@
         <w:tc>
           <w:tcPr>
             <w:tcW w:type="dxa" w:w="4300"/>
-            <w:shd w:fill="FAFBFC"/>
             <w:tcMar>
               <w:top w:w="80" w:type="dxa"/>
               <w:start w:w="120" w:type="dxa"/>
@@ -7244,7 +7329,6 @@
         <w:tc>
           <w:tcPr>
             <w:tcW w:type="dxa" w:w="5060"/>
-            <w:shd w:fill="FAFBFC"/>
             <w:tcMar>
               <w:top w:w="80" w:type="dxa"/>
               <w:start w:w="120" w:type="dxa"/>
@@ -7275,6 +7359,7 @@
         <w:tc>
           <w:tcPr>
             <w:tcW w:type="dxa" w:w="4300"/>
+            <w:shd w:fill="FAFBFC"/>
             <w:tcMar>
               <w:top w:w="80" w:type="dxa"/>
               <w:start w:w="120" w:type="dxa"/>
@@ -7300,6 +7385,7 @@
         <w:tc>
           <w:tcPr>
             <w:tcW w:type="dxa" w:w="5060"/>
+            <w:shd w:fill="FAFBFC"/>
             <w:tcMar>
               <w:top w:w="80" w:type="dxa"/>
               <w:start w:w="120" w:type="dxa"/>
@@ -7330,7 +7416,6 @@
         <w:tc>
           <w:tcPr>
             <w:tcW w:type="dxa" w:w="4300"/>
-            <w:shd w:fill="FAFBFC"/>
             <w:tcMar>
               <w:top w:w="80" w:type="dxa"/>
               <w:start w:w="120" w:type="dxa"/>
@@ -7356,7 +7441,6 @@
         <w:tc>
           <w:tcPr>
             <w:tcW w:type="dxa" w:w="5060"/>
-            <w:shd w:fill="FAFBFC"/>
             <w:tcMar>
               <w:top w:w="80" w:type="dxa"/>
               <w:start w:w="120" w:type="dxa"/>
@@ -7387,6 +7471,7 @@
         <w:tc>
           <w:tcPr>
             <w:tcW w:type="dxa" w:w="4300"/>
+            <w:shd w:fill="FAFBFC"/>
             <w:tcMar>
               <w:top w:w="80" w:type="dxa"/>
               <w:start w:w="120" w:type="dxa"/>
@@ -7412,6 +7497,7 @@
         <w:tc>
           <w:tcPr>
             <w:tcW w:type="dxa" w:w="5060"/>
+            <w:shd w:fill="FAFBFC"/>
             <w:tcMar>
               <w:top w:w="80" w:type="dxa"/>
               <w:start w:w="120" w:type="dxa"/>
@@ -7442,7 +7528,6 @@
         <w:tc>
           <w:tcPr>
             <w:tcW w:type="dxa" w:w="4300"/>
-            <w:shd w:fill="FAFBFC"/>
             <w:tcMar>
               <w:top w:w="80" w:type="dxa"/>
               <w:start w:w="120" w:type="dxa"/>
@@ -7468,7 +7553,6 @@
         <w:tc>
           <w:tcPr>
             <w:tcW w:type="dxa" w:w="5060"/>
-            <w:shd w:fill="FAFBFC"/>
             <w:tcMar>
               <w:top w:w="80" w:type="dxa"/>
               <w:start w:w="120" w:type="dxa"/>
@@ -7499,6 +7583,7 @@
         <w:tc>
           <w:tcPr>
             <w:tcW w:type="dxa" w:w="4300"/>
+            <w:shd w:fill="FAFBFC"/>
             <w:tcMar>
               <w:top w:w="80" w:type="dxa"/>
               <w:start w:w="120" w:type="dxa"/>
@@ -7524,6 +7609,7 @@
         <w:tc>
           <w:tcPr>
             <w:tcW w:type="dxa" w:w="5060"/>
+            <w:shd w:fill="FAFBFC"/>
             <w:tcMar>
               <w:top w:w="80" w:type="dxa"/>
               <w:start w:w="120" w:type="dxa"/>
@@ -7554,7 +7640,6 @@
         <w:tc>
           <w:tcPr>
             <w:tcW w:type="dxa" w:w="4300"/>
-            <w:shd w:fill="FAFBFC"/>
             <w:tcMar>
               <w:top w:w="80" w:type="dxa"/>
               <w:start w:w="120" w:type="dxa"/>
@@ -7580,7 +7665,6 @@
         <w:tc>
           <w:tcPr>
             <w:tcW w:type="dxa" w:w="5060"/>
-            <w:shd w:fill="FAFBFC"/>
             <w:tcMar>
               <w:top w:w="80" w:type="dxa"/>
               <w:start w:w="120" w:type="dxa"/>
@@ -7611,6 +7695,7 @@
         <w:tc>
           <w:tcPr>
             <w:tcW w:type="dxa" w:w="4300"/>
+            <w:shd w:fill="FAFBFC"/>
             <w:tcMar>
               <w:top w:w="80" w:type="dxa"/>
               <w:start w:w="120" w:type="dxa"/>
@@ -7636,6 +7721,7 @@
         <w:tc>
           <w:tcPr>
             <w:tcW w:type="dxa" w:w="5060"/>
+            <w:shd w:fill="FAFBFC"/>
             <w:tcMar>
               <w:top w:w="80" w:type="dxa"/>
               <w:start w:w="120" w:type="dxa"/>
@@ -7666,7 +7752,6 @@
         <w:tc>
           <w:tcPr>
             <w:tcW w:type="dxa" w:w="4300"/>
-            <w:shd w:fill="FAFBFC"/>
             <w:tcMar>
               <w:top w:w="80" w:type="dxa"/>
               <w:start w:w="120" w:type="dxa"/>
@@ -7692,7 +7777,6 @@
         <w:tc>
           <w:tcPr>
             <w:tcW w:type="dxa" w:w="5060"/>
-            <w:shd w:fill="FAFBFC"/>
             <w:tcMar>
               <w:top w:w="80" w:type="dxa"/>
               <w:start w:w="120" w:type="dxa"/>
@@ -7723,6 +7807,7 @@
         <w:tc>
           <w:tcPr>
             <w:tcW w:type="dxa" w:w="4300"/>
+            <w:shd w:fill="FAFBFC"/>
             <w:tcMar>
               <w:top w:w="80" w:type="dxa"/>
               <w:start w:w="120" w:type="dxa"/>
@@ -7748,6 +7833,7 @@
         <w:tc>
           <w:tcPr>
             <w:tcW w:type="dxa" w:w="5060"/>
+            <w:shd w:fill="FAFBFC"/>
             <w:tcMar>
               <w:top w:w="80" w:type="dxa"/>
               <w:start w:w="120" w:type="dxa"/>
@@ -7778,7 +7864,6 @@
         <w:tc>
           <w:tcPr>
             <w:tcW w:type="dxa" w:w="4300"/>
-            <w:shd w:fill="FAFBFC"/>
             <w:tcMar>
               <w:top w:w="80" w:type="dxa"/>
               <w:start w:w="120" w:type="dxa"/>
@@ -7804,7 +7889,6 @@
         <w:tc>
           <w:tcPr>
             <w:tcW w:type="dxa" w:w="5060"/>
-            <w:shd w:fill="FAFBFC"/>
             <w:tcMar>
               <w:top w:w="80" w:type="dxa"/>
               <w:start w:w="120" w:type="dxa"/>
@@ -7835,6 +7919,7 @@
         <w:tc>
           <w:tcPr>
             <w:tcW w:type="dxa" w:w="4300"/>
+            <w:shd w:fill="FAFBFC"/>
             <w:tcMar>
               <w:top w:w="80" w:type="dxa"/>
               <w:start w:w="120" w:type="dxa"/>
@@ -7860,6 +7945,7 @@
         <w:tc>
           <w:tcPr>
             <w:tcW w:type="dxa" w:w="5060"/>
+            <w:shd w:fill="FAFBFC"/>
             <w:tcMar>
               <w:top w:w="80" w:type="dxa"/>
               <w:start w:w="120" w:type="dxa"/>
@@ -7890,7 +7976,6 @@
         <w:tc>
           <w:tcPr>
             <w:tcW w:type="dxa" w:w="4300"/>
-            <w:shd w:fill="FAFBFC"/>
             <w:tcMar>
               <w:top w:w="80" w:type="dxa"/>
               <w:start w:w="120" w:type="dxa"/>
@@ -7916,7 +8001,6 @@
         <w:tc>
           <w:tcPr>
             <w:tcW w:type="dxa" w:w="5060"/>
-            <w:shd w:fill="FAFBFC"/>
             <w:tcMar>
               <w:top w:w="80" w:type="dxa"/>
               <w:start w:w="120" w:type="dxa"/>
@@ -7947,6 +8031,7 @@
         <w:tc>
           <w:tcPr>
             <w:tcW w:type="dxa" w:w="4300"/>
+            <w:shd w:fill="FAFBFC"/>
             <w:tcMar>
               <w:top w:w="80" w:type="dxa"/>
               <w:start w:w="120" w:type="dxa"/>
@@ -7972,6 +8057,7 @@
         <w:tc>
           <w:tcPr>
             <w:tcW w:type="dxa" w:w="5060"/>
+            <w:shd w:fill="FAFBFC"/>
             <w:tcMar>
               <w:top w:w="80" w:type="dxa"/>
               <w:start w:w="120" w:type="dxa"/>
@@ -8002,7 +8088,6 @@
         <w:tc>
           <w:tcPr>
             <w:tcW w:type="dxa" w:w="4300"/>
-            <w:shd w:fill="FAFBFC"/>
             <w:tcMar>
               <w:top w:w="80" w:type="dxa"/>
               <w:start w:w="120" w:type="dxa"/>
@@ -8028,7 +8113,6 @@
         <w:tc>
           <w:tcPr>
             <w:tcW w:type="dxa" w:w="5060"/>
-            <w:shd w:fill="FAFBFC"/>
             <w:tcMar>
               <w:top w:w="80" w:type="dxa"/>
               <w:start w:w="120" w:type="dxa"/>
@@ -8059,6 +8143,7 @@
         <w:tc>
           <w:tcPr>
             <w:tcW w:type="dxa" w:w="4300"/>
+            <w:shd w:fill="FAFBFC"/>
             <w:tcMar>
               <w:top w:w="80" w:type="dxa"/>
               <w:start w:w="120" w:type="dxa"/>
@@ -8084,6 +8169,7 @@
         <w:tc>
           <w:tcPr>
             <w:tcW w:type="dxa" w:w="5060"/>
+            <w:shd w:fill="FAFBFC"/>
             <w:tcMar>
               <w:top w:w="80" w:type="dxa"/>
               <w:start w:w="120" w:type="dxa"/>
@@ -8114,7 +8200,6 @@
         <w:tc>
           <w:tcPr>
             <w:tcW w:type="dxa" w:w="4300"/>
-            <w:shd w:fill="FAFBFC"/>
             <w:tcMar>
               <w:top w:w="80" w:type="dxa"/>
               <w:start w:w="120" w:type="dxa"/>
@@ -8140,7 +8225,6 @@
         <w:tc>
           <w:tcPr>
             <w:tcW w:type="dxa" w:w="5060"/>
-            <w:shd w:fill="FAFBFC"/>
             <w:tcMar>
               <w:top w:w="80" w:type="dxa"/>
               <w:start w:w="120" w:type="dxa"/>
@@ -8171,6 +8255,7 @@
         <w:tc>
           <w:tcPr>
             <w:tcW w:type="dxa" w:w="4300"/>
+            <w:shd w:fill="FAFBFC"/>
             <w:tcMar>
               <w:top w:w="80" w:type="dxa"/>
               <w:start w:w="120" w:type="dxa"/>
@@ -8196,6 +8281,7 @@
         <w:tc>
           <w:tcPr>
             <w:tcW w:type="dxa" w:w="5060"/>
+            <w:shd w:fill="FAFBFC"/>
             <w:tcMar>
               <w:top w:w="80" w:type="dxa"/>
               <w:start w:w="120" w:type="dxa"/>
@@ -8226,7 +8312,6 @@
         <w:tc>
           <w:tcPr>
             <w:tcW w:type="dxa" w:w="4300"/>
-            <w:shd w:fill="FAFBFC"/>
             <w:tcMar>
               <w:top w:w="80" w:type="dxa"/>
               <w:start w:w="120" w:type="dxa"/>
@@ -8252,7 +8337,6 @@
         <w:tc>
           <w:tcPr>
             <w:tcW w:type="dxa" w:w="5060"/>
-            <w:shd w:fill="FAFBFC"/>
             <w:tcMar>
               <w:top w:w="80" w:type="dxa"/>
               <w:start w:w="120" w:type="dxa"/>
@@ -8283,6 +8367,7 @@
         <w:tc>
           <w:tcPr>
             <w:tcW w:type="dxa" w:w="4300"/>
+            <w:shd w:fill="FAFBFC"/>
             <w:tcMar>
               <w:top w:w="80" w:type="dxa"/>
               <w:start w:w="120" w:type="dxa"/>
@@ -8308,6 +8393,7 @@
         <w:tc>
           <w:tcPr>
             <w:tcW w:type="dxa" w:w="5060"/>
+            <w:shd w:fill="FAFBFC"/>
             <w:tcMar>
               <w:top w:w="80" w:type="dxa"/>
               <w:start w:w="120" w:type="dxa"/>
@@ -8338,7 +8424,6 @@
         <w:tc>
           <w:tcPr>
             <w:tcW w:type="dxa" w:w="4300"/>
-            <w:shd w:fill="FAFBFC"/>
             <w:tcMar>
               <w:top w:w="80" w:type="dxa"/>
               <w:start w:w="120" w:type="dxa"/>
@@ -8364,7 +8449,6 @@
         <w:tc>
           <w:tcPr>
             <w:tcW w:type="dxa" w:w="5060"/>
-            <w:shd w:fill="FAFBFC"/>
             <w:tcMar>
               <w:top w:w="80" w:type="dxa"/>
               <w:start w:w="120" w:type="dxa"/>
@@ -8395,6 +8479,7 @@
         <w:tc>
           <w:tcPr>
             <w:tcW w:type="dxa" w:w="4300"/>
+            <w:shd w:fill="FAFBFC"/>
             <w:tcMar>
               <w:top w:w="80" w:type="dxa"/>
               <w:start w:w="120" w:type="dxa"/>
@@ -8420,6 +8505,7 @@
         <w:tc>
           <w:tcPr>
             <w:tcW w:type="dxa" w:w="5060"/>
+            <w:shd w:fill="FAFBFC"/>
             <w:tcMar>
               <w:top w:w="80" w:type="dxa"/>
               <w:start w:w="120" w:type="dxa"/>
@@ -8450,7 +8536,6 @@
         <w:tc>
           <w:tcPr>
             <w:tcW w:type="dxa" w:w="4300"/>
-            <w:shd w:fill="FAFBFC"/>
             <w:tcMar>
               <w:top w:w="80" w:type="dxa"/>
               <w:start w:w="120" w:type="dxa"/>
@@ -8476,7 +8561,6 @@
         <w:tc>
           <w:tcPr>
             <w:tcW w:type="dxa" w:w="5060"/>
-            <w:shd w:fill="FAFBFC"/>
             <w:tcMar>
               <w:top w:w="80" w:type="dxa"/>
               <w:start w:w="120" w:type="dxa"/>
@@ -8507,6 +8591,7 @@
         <w:tc>
           <w:tcPr>
             <w:tcW w:type="dxa" w:w="4300"/>
+            <w:shd w:fill="FAFBFC"/>
             <w:tcMar>
               <w:top w:w="80" w:type="dxa"/>
               <w:start w:w="120" w:type="dxa"/>
@@ -8532,6 +8617,7 @@
         <w:tc>
           <w:tcPr>
             <w:tcW w:type="dxa" w:w="5060"/>
+            <w:shd w:fill="FAFBFC"/>
             <w:tcMar>
               <w:top w:w="80" w:type="dxa"/>
               <w:start w:w="120" w:type="dxa"/>
@@ -8562,7 +8648,6 @@
         <w:tc>
           <w:tcPr>
             <w:tcW w:type="dxa" w:w="4300"/>
-            <w:shd w:fill="FAFBFC"/>
             <w:tcMar>
               <w:top w:w="80" w:type="dxa"/>
               <w:start w:w="120" w:type="dxa"/>
@@ -8588,7 +8673,6 @@
         <w:tc>
           <w:tcPr>
             <w:tcW w:type="dxa" w:w="5060"/>
-            <w:shd w:fill="FAFBFC"/>
             <w:tcMar>
               <w:top w:w="80" w:type="dxa"/>
               <w:start w:w="120" w:type="dxa"/>
@@ -8619,6 +8703,7 @@
         <w:tc>
           <w:tcPr>
             <w:tcW w:type="dxa" w:w="4300"/>
+            <w:shd w:fill="FAFBFC"/>
             <w:tcMar>
               <w:top w:w="80" w:type="dxa"/>
               <w:start w:w="120" w:type="dxa"/>
@@ -8644,6 +8729,7 @@
         <w:tc>
           <w:tcPr>
             <w:tcW w:type="dxa" w:w="5060"/>
+            <w:shd w:fill="FAFBFC"/>
             <w:tcMar>
               <w:top w:w="80" w:type="dxa"/>
               <w:start w:w="120" w:type="dxa"/>
@@ -8674,7 +8760,6 @@
         <w:tc>
           <w:tcPr>
             <w:tcW w:type="dxa" w:w="4300"/>
-            <w:shd w:fill="FAFBFC"/>
             <w:tcMar>
               <w:top w:w="80" w:type="dxa"/>
               <w:start w:w="120" w:type="dxa"/>
@@ -8700,7 +8785,6 @@
         <w:tc>
           <w:tcPr>
             <w:tcW w:type="dxa" w:w="5060"/>
-            <w:shd w:fill="FAFBFC"/>
             <w:tcMar>
               <w:top w:w="80" w:type="dxa"/>
               <w:start w:w="120" w:type="dxa"/>
@@ -8731,6 +8815,7 @@
         <w:tc>
           <w:tcPr>
             <w:tcW w:type="dxa" w:w="4300"/>
+            <w:shd w:fill="FAFBFC"/>
             <w:tcMar>
               <w:top w:w="80" w:type="dxa"/>
               <w:start w:w="120" w:type="dxa"/>
@@ -8756,6 +8841,7 @@
         <w:tc>
           <w:tcPr>
             <w:tcW w:type="dxa" w:w="5060"/>
+            <w:shd w:fill="FAFBFC"/>
             <w:tcMar>
               <w:top w:w="80" w:type="dxa"/>
               <w:start w:w="120" w:type="dxa"/>
@@ -8786,7 +8872,6 @@
         <w:tc>
           <w:tcPr>
             <w:tcW w:type="dxa" w:w="4300"/>
-            <w:shd w:fill="FAFBFC"/>
             <w:tcMar>
               <w:top w:w="80" w:type="dxa"/>
               <w:start w:w="120" w:type="dxa"/>
@@ -8812,7 +8897,6 @@
         <w:tc>
           <w:tcPr>
             <w:tcW w:type="dxa" w:w="5060"/>
-            <w:shd w:fill="FAFBFC"/>
             <w:tcMar>
               <w:top w:w="80" w:type="dxa"/>
               <w:start w:w="120" w:type="dxa"/>
@@ -8843,6 +8927,7 @@
         <w:tc>
           <w:tcPr>
             <w:tcW w:type="dxa" w:w="4300"/>
+            <w:shd w:fill="FAFBFC"/>
             <w:tcMar>
               <w:top w:w="80" w:type="dxa"/>
               <w:start w:w="120" w:type="dxa"/>
@@ -8868,6 +8953,7 @@
         <w:tc>
           <w:tcPr>
             <w:tcW w:type="dxa" w:w="5060"/>
+            <w:shd w:fill="FAFBFC"/>
             <w:tcMar>
               <w:top w:w="80" w:type="dxa"/>
               <w:start w:w="120" w:type="dxa"/>
@@ -8986,7 +9072,7 @@
           <w:color w:val="16324F"/>
           <w:sz w:val="21"/>
         </w:rPr>
-        <w:t>FIREWALL_REMOTE_ADDRESS_MISMATCH 같은 코드는 어떤 필드가 안전 기준과 달랐는지만 알려 주며 실제 Viewer 주소나 규칙 원문은 포함하지 않습니다. Windows의 정상적인 IP/32와 IP/255.255.255.255 표기 차이는 자동 처리됩니다. Setup이 rollback을 완료한 뒤 같은 Release ZIP으로 검사를 다시 실행하고, 계속 실패하면 코드만 Windows 관리자에게 전달하세요. 규칙을 직접 넓혀 우회하지 마세요.</w:t>
+        <w:t>FIREWALL_REMOTE_ADDRESS_MISMATCH 같은 코드는 어떤 필드가 안전 기준과 달랐는지만 알려 주며 실제 Viewer 주소나 규칙 원문은 포함하지 않습니다. Windows의 정상적인 IP/32와 IP/255.255.255.255 표기 차이는 자동 처리됩니다. FIREWALL_REMOTE_ACCESS_UNCONFIRMED이면 Agent 설치는 유지되며 Viewer 연결 테스트로 원격 TCP/18443을 확인합니다. 실패하면 코드만 Windows 관리자에게 전달하고, 규칙을 직접 넓혀 우회하지 마세요.</w:t>
       </w:r>
     </w:p>
     <w:p>
@@ -9641,7 +9727,7 @@
         <w:color w:val="64748B"/>
         <w:sz w:val="17"/>
       </w:rPr>
-      <w:t xml:space="preserve">v0.10.15-poc  |  </w:t>
+      <w:t xml:space="preserve">v0.10.16-poc  |  </w:t>
     </w:r>
     <w:r>
       <w:rPr>
@@ -9672,7 +9758,7 @@
         <w:color w:val="64748B"/>
         <w:sz w:val="17"/>
       </w:rPr>
-      <w:t>v0.10.15-poc  |  2026-08-04</w:t>
+      <w:t>v0.10.16-poc  |  2026-08-04</w:t>
     </w:r>
   </w:p>
 </w:ftr>

</xml_diff>

<commit_message>
Simplify Agent setup and Viewer connection for v0.11.0
</commit_message>
<xml_diff>
--- a/docs/SamsungSwitchWatch_User_Manual_KO.docx
+++ b/docs/SamsungSwitchWatch_User_Manual_KO.docx
@@ -544,7 +544,7 @@
         <w:rPr>
           <w:rFonts w:ascii="맑은 고딕" w:hAnsi="맑은 고딕" w:eastAsia="맑은 고딕" w:cs="맑은 고딕"/>
         </w:rPr>
-        <w:t>Agent PC 주소가 아닌 원격 Viewer의 고정 IPv4를 입력하고 자동 검색된 관리망을 선택합니다. 같은 PC 시험이라면 '같은 PC 시험용 주소'로 실제 사설 IPv4를 사용합니다.</w:t>
+        <w:t>Agent Setup에는 Viewer IP나 관리망 CIDR을 입력하지 않습니다. 설치 내용을 확인하고 '설치 / 업데이트'를 누릅니다.</w:t>
       </w:r>
     </w:p>
     <w:p>
@@ -572,7 +572,7 @@
         <w:rPr>
           <w:rFonts w:ascii="맑은 고딕" w:hAnsi="맑은 고딕" w:eastAsia="맑은 고딕" w:cs="맑은 고딕"/>
         </w:rPr>
-        <w:t>Viewer가 열리면 Agent PC 주소를 입력합니다. 같은 PC에서 먼저 확인할 때만 'Agent와 Viewer가 같은 PC일 때 테스트'를 직접 누릅니다.</w:t>
+        <w:t>Viewer의 Agent 연결에서 Agent PC 주소만 입력하고 '연결 확인 및 저장'을 누릅니다.</w:t>
       </w:r>
     </w:p>
     <w:p>
@@ -902,7 +902,7 @@
                 <w:rFonts w:ascii="맑은 고딕" w:hAnsi="맑은 고딕" w:eastAsia="맑은 고딕" w:cs="맑은 고딕"/>
                 <w:sz w:val="18"/>
               </w:rPr>
-              <w:t>Viewer /32 방화벽과 Agent의 동일 IPv4 재검증</w:t>
+              <w:t>10/8, 172.16/12, 192.168/16 사설 주소에서 접근</w:t>
             </w:r>
           </w:p>
         </w:tc>
@@ -985,7 +985,7 @@
                 <w:rFonts w:ascii="맑은 고딕" w:hAnsi="맑은 고딕" w:eastAsia="맑은 고딕" w:cs="맑은 고딕"/>
                 <w:sz w:val="18"/>
               </w:rPr>
-              <w:t>설치 시 선택·추가한 관리망만 허용</w:t>
+              <w:t>같은 RFC1918 사설 주소의 장비만 허용</w:t>
             </w:r>
           </w:p>
         </w:tc>
@@ -1153,7 +1153,7 @@
           <w:color w:val="16324F"/>
           <w:sz w:val="21"/>
         </w:rPr>
-        <w:t>0.10.16-poc는 코드 서명되지 않은 시험판입니다. 압축을 풀기 전에 Agent와 Viewer ZIP의 SHA-256을 해당 GitHub Release 본문에 표시된 값과 비교하고 사내 보안 반입 절차를 완료하세요. SmartScreen 또는 EDR 경고를 우회하지 않습니다.</w:t>
+        <w:t>0.11.0-poc는 코드 서명되지 않은 시험판입니다. 압축을 풀기 전에 Agent와 Viewer ZIP의 SHA-256을 해당 GitHub Release 본문에 표시된 값과 비교하고 사내 보안 반입 절차를 완료하세요. SmartScreen 또는 EDR 경고를 우회하지 않습니다.</w:t>
       </w:r>
     </w:p>
     <w:p>
@@ -1195,35 +1195,7 @@
         <w:rPr>
           <w:rFonts w:ascii="맑은 고딕" w:hAnsi="맑은 고딕" w:eastAsia="맑은 고딕" w:cs="맑은 고딕"/>
         </w:rPr>
-        <w:t>'허용할 Viewer PC 고정 IPv4 · Agent PC 주소 아님'에 원격 Viewer 주소를 입력합니다. 같은 PC 시험이라면 '같은 PC 시험용 주소'로 표시된 실제 RFC1918 사설 IPv4를 사용합니다.</w:t>
-      </w:r>
-    </w:p>
-    <w:p>
-      <w:pPr>
-        <w:numPr>
-          <w:ilvl w:val="0"/>
-          <w:numId w:val="13"/>
-        </w:numPr>
-      </w:pPr>
-      <w:r>
-        <w:rPr>
-          <w:rFonts w:ascii="맑은 고딕" w:hAnsi="맑은 고딕" w:eastAsia="맑은 고딕" w:cs="맑은 고딕"/>
-        </w:rPr>
-        <w:t>자동 검색된 관리망을 선택합니다. 목록에 없으면 승인된 RFC1918 관리망을 IPv4/prefix로 직접 추가합니다.</w:t>
-      </w:r>
-    </w:p>
-    <w:p>
-      <w:pPr>
-        <w:numPr>
-          <w:ilvl w:val="0"/>
-          <w:numId w:val="13"/>
-        </w:numPr>
-      </w:pPr>
-      <w:r>
-        <w:rPr>
-          <w:rFonts w:ascii="맑은 고딕" w:hAnsi="맑은 고딕" w:eastAsia="맑은 고딕" w:cs="맑은 고딕"/>
-        </w:rPr>
-        <w:t>직접 입력한 주소가 네트워크 주소로 정규화되었는지 확인하고, 자동 선택과 직접 추가를 합해 1~2개인지 확인합니다.</w:t>
+        <w:t>설치 내용을 확인합니다. Viewer와 스위치 허용 범위는 RFC1918 사설 대역으로 자동 적용되므로 별도 입력이 없습니다.</w:t>
       </w:r>
     </w:p>
     <w:p>
@@ -1251,7 +1223,7 @@
         <w:rPr>
           <w:rFonts w:ascii="맑은 고딕" w:hAnsi="맑은 고딕" w:eastAsia="맑은 고딕" w:cs="맑은 고딕"/>
         </w:rPr>
-        <w:t>정리 대상과 작업 기록이 모두 사라진 경우에만 복구 성공으로 표시됩니다. 별도로 '설치 / 업데이트'를 누른 뒤 SamsungSwitchWatchAgent 서비스가 실행 중인지 확인합니다.</w:t>
+        <w:t>'설치 / 업데이트'를 누르면 자동 점검과 설치가 이어집니다. 완료 또는 '설치 완료 · 연결 확인 필요' 경고를 확인합니다.</w:t>
       </w:r>
     </w:p>
     <w:p>
@@ -1263,8 +1235,8 @@
       <w:r>
         <w:drawing>
           <wp:inline xmlns:a="http://schemas.openxmlformats.org/drawingml/2006/main" xmlns:pic="http://schemas.openxmlformats.org/drawingml/2006/picture">
-            <wp:extent cx="4114800" cy="4872789"/>
-            <wp:docPr id="1" name="Picture 1" title="Agent Setup 화면" descr="중단된 이전 설치 기록을 감지하여 이전 상태 복구 버튼만 활성화하고 설치 업데이트 버튼은 비활성화한 Agent Setup 화면"/>
+            <wp:extent cx="4114800" cy="3789947"/>
+            <wp:docPr id="1" name="Picture 1" title="Agent Setup 화면" descr="Viewer IP와 관리망 CIDR 입력 없이 설치 내용과 설치 버튼을 보여 주는 Agent Setup 화면"/>
             <wp:cNvGraphicFramePr>
               <a:graphicFrameLocks noChangeAspect="1"/>
             </wp:cNvGraphicFramePr>
@@ -1284,7 +1256,7 @@
                   <pic:spPr>
                     <a:xfrm>
                       <a:off x="0" y="0"/>
-                      <a:ext cx="4114800" cy="4872789"/>
+                      <a:ext cx="4114800" cy="3789947"/>
                     </a:xfrm>
                     <a:prstGeom prst="rect"/>
                   </pic:spPr>
@@ -1300,7 +1272,7 @@
         <w:pStyle w:val="Caption"/>
       </w:pPr>
       <w:r>
-        <w:t>그림 1. 이전 상태 복구가 필요한 안전 대기 화면</w:t>
+        <w:t>그림 1. 별도 네트워크 입력이 없는 Agent Setup 화면</w:t>
       </w:r>
     </w:p>
     <w:p>
@@ -1309,19 +1281,19 @@
         <w:pageBreakBefore w:val="0"/>
         <w:spacing w:before="80" w:after="160" w:line="283" w:lineRule="auto"/>
         <w:ind w:left="115" w:right="58"/>
-        <w:shd w:fill="FFF8E8"/>
+        <w:shd w:fill="E8EEF5"/>
         <w:pBdr>
-          <w:left w:val="single" w:sz="16" w:space="8" w:color="8A5A00"/>
+          <w:left w:val="single" w:sz="16" w:space="8" w:color="2E74B5"/>
         </w:pBdr>
       </w:pPr>
       <w:r>
         <w:rPr>
           <w:rFonts w:ascii="맑은 고딕" w:hAnsi="맑은 고딕" w:eastAsia="맑은 고딕" w:cs="맑은 고딕"/>
           <w:b/>
-          <w:color w:val="8A5A00"/>
+          <w:color w:val="2E74B5"/>
           <w:sz w:val="21"/>
         </w:rPr>
-        <w:t xml:space="preserve">복구 대기 화면  </w:t>
+        <w:t xml:space="preserve">입력 없이 설치  </w:t>
       </w:r>
       <w:r>
         <w:rPr>
@@ -1329,7 +1301,7 @@
           <w:color w:val="16324F"/>
           <w:sz w:val="21"/>
         </w:rPr>
-        <w:t>Setup은 시작할 때 이전 작업의 journal을 읽기 전용으로 확인합니다. 안전하게 복구할 수 있는 기록이면 '이전 상태 복구'만 활성화하고 설치/업데이트는 비활성화합니다. 이 확인만으로 파일·서비스·방화벽을 변경하거나 복구를 자동 실행하지 않습니다. 검증된 정리 대상이 실제로 사라지고 새 journal 검사에서도 미완료 작업이 없어야만 복구 성공과 설치 버튼 활성화를 표시합니다. 설치는 자동으로 이어지지 않으므로 운영자가 별도로 시작합니다.</w:t>
+        <w:t>Setup은 제품 파일, Windows 서비스와 방화벽 규칙을 준비합니다. Viewer IP와 스위치 CIDR은 요구하지 않습니다. Agent는 10/8, 172.16/12, 192.168/16에서 들어오는 Viewer 요청과 같은 사설 대역의 Telnet/23 장비만 자동으로 허용합니다.</w:t>
       </w:r>
     </w:p>
     <w:p>
@@ -1465,7 +1437,7 @@
           <w:color w:val="16324F"/>
           <w:sz w:val="21"/>
         </w:rPr>
-        <w:t>다른 프로그램이 만든 인바운드 허용 규칙이 있으면 FIREWALL_OVERLAP_PROTECTED 경고를 표시하지만 해당 규칙은 변경하지 않고 설치를 계속합니다. 설치 후 제품 소유 Viewer /32 규칙과 Agent 내부 Viewer IPv4 검증을 함께 적용합니다.</w:t>
+        <w:t>다른 프로그램이 만든 인바운드 허용 규칙이 있으면 FIREWALL_OVERLAP_PROTECTED 경고를 표시하지만 해당 규칙은 변경하지 않고 설치를 계속합니다. 제품 규칙은 RFC1918 사설 원격 주소, Domain/Private 프로필과 TCP/18443을 대상으로 시도합니다.</w:t>
       </w:r>
     </w:p>
     <w:p>
@@ -1494,7 +1466,7 @@
           <w:color w:val="16324F"/>
           <w:sz w:val="21"/>
         </w:rPr>
-        <w:t>제품 Viewer /32 규칙의 적용·재조회 또는 회사 GPO 확인이 실패하면 FIREWALL_REMOTE_ACCESS_UNCONFIRMED 경고와 '설치 완료 · 원격 Viewer 연결 확인 필요'를 표시합니다. 로컬 HTTPS/API/버전이 정상인 Agent 서비스와 프로그램은 유지하며, 방화벽 변경분만 설치 전 상태로 복원을 시도하고 결과를 경고에 남깁니다. Viewer에서 연결 테스트를 실행하고 TCP/18443이 실패할 때만 Windows 관리자에게 방화벽·GPO 경로를 요청하세요. Setup은 Any, LocalSubnet 또는 넓은 대역 규칙을 대신 만들지 않습니다.</w:t>
+        <w:t>제품 규칙의 적용·재조회 또는 회사 GPO 확인이 실패해도 Agent 서비스와 프로그램은 설치된 상태로 유지됩니다. 화면에는 설치 실패가 아니라 연결 확인 경고가 표시됩니다. Viewer에서 연결 테스트를 실행하고 TCP/18443이 실패할 때만 Windows 관리자에게 방화벽·GPO 경로 확인을 요청하세요.</w:t>
       </w:r>
     </w:p>
     <w:p>
@@ -1515,7 +1487,7 @@
           <w:color w:val="2E74B5"/>
           <w:sz w:val="21"/>
         </w:rPr>
-        <w:t xml:space="preserve">Windows의 /32 표시 차이는 자동 처리  </w:t>
+        <w:t xml:space="preserve">방화벽은 보조 수단  </w:t>
       </w:r>
       <w:r>
         <w:rPr>
@@ -1523,7 +1495,7 @@
           <w:color w:val="16324F"/>
           <w:sz w:val="21"/>
         </w:rPr>
-        <w:t>Windows가 같은 Viewer 단일 호스트를 IP, IP/32 또는 IP/255.255.255.255로 반환해도 Setup은 같은 주소인지 의미 기준으로 확인합니다. 다른 prefix, 주소 목록·범위, Any, LocalSubnet과 IPv6는 허용하지 않습니다. Enabled·Inbound·Allow·TCP·18443·Domain/Private·Edge Traversal 비활성 조건도 모두 그대로 확인합니다.</w:t>
+        <w:t>방화벽 규칙은 원격 연결을 돕기 위한 최선 노력 단계입니다. 규칙 생성 실패가 프로그램 파일과 서비스 설치를 취소하지 않습니다. Agent 자체도 Viewer와 장비 주소가 RFC1918 사설 범위인지 다시 확인합니다.</w:t>
       </w:r>
     </w:p>
     <w:p>
@@ -1535,50 +1507,6 @@
           <w:left w:val="single" w:sz="10" w:space="8" w:color="64748B"/>
         </w:pBdr>
       </w:pPr>
-      <w:r>
-        <w:rPr>
-          <w:rFonts w:ascii="Consolas" w:hAnsi="Consolas" w:eastAsia="Consolas" w:cs="Consolas"/>
-          <w:color w:val="243447"/>
-          <w:sz w:val="17"/>
-        </w:rPr>
-        <w:t>Viewer PC IPv4 예     : 10.20.30.25</w:t>
-      </w:r>
-      <w:r>
-        <w:br/>
-      </w:r>
-      <w:r>
-        <w:rPr>
-          <w:rFonts w:ascii="Consolas" w:hAnsi="Consolas" w:eastAsia="Consolas" w:cs="Consolas"/>
-          <w:color w:val="243447"/>
-          <w:sz w:val="17"/>
-        </w:rPr>
-        <w:t>자동 검색 관리망     : 10.50.0.0/24</w:t>
-      </w:r>
-      <w:r>
-        <w:br/>
-      </w:r>
-      <w:r>
-        <w:rPr>
-          <w:rFonts w:ascii="Consolas" w:hAnsi="Consolas" w:eastAsia="Consolas" w:cs="Consolas"/>
-          <w:color w:val="243447"/>
-          <w:sz w:val="17"/>
-        </w:rPr>
-        <w:t>직접 추가 입력       : 172.20.40.25/24</w:t>
-      </w:r>
-      <w:r>
-        <w:br/>
-      </w:r>
-      <w:r>
-        <w:rPr>
-          <w:rFonts w:ascii="Consolas" w:hAnsi="Consolas" w:eastAsia="Consolas" w:cs="Consolas"/>
-          <w:color w:val="243447"/>
-          <w:sz w:val="17"/>
-        </w:rPr>
-        <w:t>정규화 결과          : 172.20.40.0/24</w:t>
-      </w:r>
-      <w:r>
-        <w:br/>
-      </w:r>
       <w:r>
         <w:rPr>
           <w:rFonts w:ascii="Consolas" w:hAnsi="Consolas" w:eastAsia="Consolas" w:cs="Consolas"/>
@@ -1618,6 +1546,28 @@
           <w:color w:val="243447"/>
           <w:sz w:val="17"/>
         </w:rPr>
+        <w:t>Viewer 허용 범위      : 10/8, 172.16/12, 192.168/16</w:t>
+      </w:r>
+      <w:r>
+        <w:br/>
+      </w:r>
+      <w:r>
+        <w:rPr>
+          <w:rFonts w:ascii="Consolas" w:hAnsi="Consolas" w:eastAsia="Consolas" w:cs="Consolas"/>
+          <w:color w:val="243447"/>
+          <w:sz w:val="17"/>
+        </w:rPr>
+        <w:t>장비 허용 범위        : 10/8, 172.16/12, 192.168/16 · Telnet/23</w:t>
+      </w:r>
+      <w:r>
+        <w:br/>
+      </w:r>
+      <w:r>
+        <w:rPr>
+          <w:rFonts w:ascii="Consolas" w:hAnsi="Consolas" w:eastAsia="Consolas" w:cs="Consolas"/>
+          <w:color w:val="243447"/>
+          <w:sz w:val="17"/>
+        </w:rPr>
         <w:t xml:space="preserve">        </w:t>
       </w:r>
     </w:p>
@@ -1647,7 +1597,7 @@
           <w:color w:val="16324F"/>
           <w:sz w:val="21"/>
         </w:rPr>
-        <w:t>Agent 프로그램은 %ProgramFiles%\SamsungSwitchWatch\Agent, HTTPS 신원과 데이터는 %ProgramData%\SamsungSwitchWatch에 둡니다. Setup이 경로 신뢰 검사를 통과하지 못하면 설치를 중단합니다. 폴더를 강제로 삭제하거나 소유권을 바꿔 우회하지 말고 Windows 관리자에게 실패 코드를 전달하세요.</w:t>
+        <w:t>Agent 프로그램은 %ProgramFiles%\SamsungSwitchWatch\Agent에 둡니다. 실행할 때마다 새 HTTPS 인증서를 만들고 Windows Schannel용 임시 사용자 키 컨테이너를 프로세스 수명 동안만 사용합니다. Agent 종료 시 이를 정리하며 영구 인증서 지문이나 페어링 자료는 저장하지 않습니다. Setup이 경로 신뢰 검사를 통과하지 못하면 설치를 중단합니다. 폴더를 강제로 삭제하거나 소유권을 바꿔 우회하지 말고 Windows 관리자에게 실패 코드를 전달하세요.</w:t>
       </w:r>
     </w:p>
     <w:p>
@@ -1691,7 +1641,7 @@
           <w:color w:val="16324F"/>
           <w:sz w:val="21"/>
         </w:rPr>
-        <w:t>Setup은 BUILD-MANIFEST.json과 Agent 실행 파일 SHA-256을 확인하고, Program Files의 임시 staging에 복사한 파일을 다시 검사한 뒤 교체합니다. 서비스·프로그램 또는 로컬 HTTPS/API/버전 확인이 실패하면 설치 전 상태로 되돌리기를 시도합니다. 방화벽·GPO·규칙 적용/재조회만 실패하면 방화벽 변경분 복원을 시도하고 Agent 설치는 경고 상태로 유지합니다. 다음 실행에서 완료되지 않은 journal이 남아 있으면 자동 복구하지 않고 별도의 '이전 상태 복구' 작업을 요구합니다. 새 서비스의 자동 재시작은 readiness 성공 뒤에만 적용하고, 검사 중에는 현재 서비스 PID와 TCP/18443 소유를 매번 다시 확인합니다. rollback 전에는 관찰한 서비스 프로세스 종료를 확인하고 프로그램 폴더의 일시적 잠금만 최대 5회 제한적으로 재시도합니다. staging·backup·failed·journal 정리가 잠시 실패하면 정확히 검증된 대상만 최대 3회 시도하고 실패한 시도 사이 250ms 대기한 뒤 삭제 결과를 확인합니다. 복구까지 실패하면 최초 설치 실패 코드를 별도로 유지하고 SETUP_ROLLBACK_FAILED와 실패한 ROLLBACK_* 단계를 함께 표시합니다.</w:t>
+        <w:t>Setup은 BUILD-MANIFEST.json과 Agent 실행 파일 SHA-256을 확인하고, Program Files의 임시 staging에 복사한 파일을 다시 검사한 뒤 교체합니다. 패키지·파일·서비스 변경 자체가 실패한 경우에만 설치 전 상태로 되돌리기를 시도합니다. 서비스가 설치·시작된 뒤 로컬 HTTPS/API/버전 또는 방화벽 준비 상태를 확인하지 못한 경우에는 설치를 되돌리지 않고 AGENT_LOCAL_CONNECTION_UNCONFIRMED 경고로 남깁니다. 다음 실행에서 완료되지 않은 journal이 남아 있으면 자동 복구하지 않고 별도의 '이전 상태 복구' 작업을 요구합니다. 검사 중에는 현재 서비스 PID와 TCP/18443 소유를 매번 다시 확인합니다. rollback 전에는 관찰한 서비스 프로세스 종료를 확인하고 프로그램 폴더의 일시적 잠금만 최대 5회 제한적으로 재시도합니다. staging·backup·failed·journal 정리가 잠시 실패하면 정확히 검증된 대상만 최대 3회 시도하고 실패한 시도 사이 250ms 대기한 뒤 삭제 결과를 확인합니다. 변경 자체의 복구까지 실패하면 최초 설치 실패 코드를 별도로 유지하고 SETUP_ROLLBACK_FAILED와 실패한 ROLLBACK_* 단계를 함께 표시합니다.</w:t>
       </w:r>
     </w:p>
     <w:p>
@@ -1729,16 +1679,16 @@
         <w:pageBreakBefore w:val="0"/>
         <w:spacing w:before="80" w:after="160" w:line="283" w:lineRule="auto"/>
         <w:ind w:left="115" w:right="58"/>
-        <w:shd w:fill="FEF2F2"/>
+        <w:shd w:fill="FFF8E8"/>
         <w:pBdr>
-          <w:left w:val="single" w:sz="16" w:space="8" w:color="B42318"/>
+          <w:left w:val="single" w:sz="16" w:space="8" w:color="8A5A00"/>
         </w:pBdr>
       </w:pPr>
       <w:r>
         <w:rPr>
           <w:rFonts w:ascii="맑은 고딕" w:hAnsi="맑은 고딕" w:eastAsia="맑은 고딕" w:cs="맑은 고딕"/>
           <w:b/>
-          <w:color w:val="B42318"/>
+          <w:color w:val="8A5A00"/>
           <w:sz w:val="21"/>
         </w:rPr>
         <w:t xml:space="preserve">로컬 HTTPS 실패는 Agent PC 내부 구간  </w:t>
@@ -1749,7 +1699,7 @@
           <w:color w:val="16324F"/>
           <w:sz w:val="21"/>
         </w:rPr>
-        <w:t>HTTPS_TLS_FAILED, HTTPS_REQUEST_TIMEOUT, HTTPS_CONNECTION_RESET, HTTPS_EOF, HTTPS_CONNECT_FAILED는 Setup → 127.0.0.1:18443 → Agent 서비스 사이의 로컬 준비 상태 확인 실패입니다. 이 다섯 코드는 Viewer IP나 스위치 관리망 문제를 뜻하지 않습니다. 같은 설치를 반복하기보다 코드와 아래 안전 관측값을 확인한 뒤 Agent PC의 Windows 이벤트, TLS 정책, 백신·EDR 개입 여부를 점검하세요.</w:t>
+        <w:t>HTTPS_TLS_FAILED, HTTPS_REQUEST_TIMEOUT, HTTPS_CONNECTION_RESET, HTTPS_EOF, HTTPS_CONNECT_FAILED는 Setup → 127.0.0.1:18443 → Agent 서비스 사이의 로컬 준비 상태 확인 실패입니다. 이 다섯 코드는 Viewer IP나 스위치 관리망 문제를 뜻하지 않으며 설치된 서비스와 파일을 되돌리는 사유도 아닙니다. Viewer 연결 테스트로 실제 사용 가능 여부를 확인하고 실패하면 Agent PC의 Windows 이벤트, TLS 정책과 백신·EDR 개입 여부를 점검하세요.</w:t>
       </w:r>
     </w:p>
     <w:tbl>
@@ -2190,7 +2140,7 @@
           <w:color w:val="243447"/>
           <w:sz w:val="17"/>
         </w:rPr>
-        <w:t>SSW_FIELD_DIAGNOSTIC/2</w:t>
+        <w:t>화면 상태 : 설치 완료 · 연결 확인 필요</w:t>
       </w:r>
       <w:r>
         <w:br/>
@@ -2201,7 +2151,7 @@
           <w:color w:val="243447"/>
           <w:sz w:val="17"/>
         </w:rPr>
-        <w:t>Component=AGENT_SETUP</w:t>
+        <w:t>경고 코드 : AGENT_LOCAL_CONNECTION_UNCONFIRMED</w:t>
       </w:r>
       <w:r>
         <w:br/>
@@ -2212,7 +2162,7 @@
           <w:color w:val="243447"/>
           <w:sz w:val="17"/>
         </w:rPr>
-        <w:t>ProductVersion=0.10.16-poc</w:t>
+        <w:t>설치 결과 : Agent 서비스와 프로그램은 유지</w:t>
       </w:r>
       <w:r>
         <w:br/>
@@ -2223,95 +2173,7 @@
           <w:color w:val="243447"/>
           <w:sz w:val="17"/>
         </w:rPr>
-        <w:t>Environment=20260804T120000000Z|WIN_10_0_26100_0|X64</w:t>
-      </w:r>
-      <w:r>
-        <w:br/>
-      </w:r>
-      <w:r>
-        <w:rPr>
-          <w:rFonts w:ascii="Consolas" w:hAnsi="Consolas" w:eastAsia="Consolas" w:cs="Consolas"/>
-          <w:color w:val="243447"/>
-          <w:sz w:val="17"/>
-        </w:rPr>
-        <w:t>Run=INSTALL|FAILURE|64182</w:t>
-      </w:r>
-      <w:r>
-        <w:br/>
-      </w:r>
-      <w:r>
-        <w:rPr>
-          <w:rFonts w:ascii="Consolas" w:hAnsi="Consolas" w:eastAsia="Consolas" w:cs="Consolas"/>
-          <w:color w:val="243447"/>
-          <w:sz w:val="17"/>
-        </w:rPr>
-        <w:t>FailedStage=READINESS</w:t>
-      </w:r>
-      <w:r>
-        <w:br/>
-      </w:r>
-      <w:r>
-        <w:rPr>
-          <w:rFonts w:ascii="Consolas" w:hAnsi="Consolas" w:eastAsia="Consolas" w:cs="Consolas"/>
-          <w:color w:val="243447"/>
-          <w:sz w:val="17"/>
-        </w:rPr>
-        <w:t>ErrorCode=SETUP_HEALTH_FAILED</w:t>
-      </w:r>
-      <w:r>
-        <w:br/>
-      </w:r>
-      <w:r>
-        <w:rPr>
-          <w:rFonts w:ascii="Consolas" w:hAnsi="Consolas" w:eastAsia="Consolas" w:cs="Consolas"/>
-          <w:color w:val="243447"/>
-          <w:sz w:val="17"/>
-        </w:rPr>
-        <w:t>Failure=SETUP_HEALTH_FAILED|CLASSIFIED|62011</w:t>
-      </w:r>
-      <w:r>
-        <w:br/>
-      </w:r>
-      <w:r>
-        <w:rPr>
-          <w:rFonts w:ascii="Consolas" w:hAnsi="Consolas" w:eastAsia="Consolas" w:cs="Consolas"/>
-          <w:color w:val="243447"/>
-          <w:sz w:val="17"/>
-        </w:rPr>
-        <w:t>Action=CHECK_AGENT_READINESS</w:t>
-      </w:r>
-      <w:r>
-        <w:br/>
-      </w:r>
-      <w:r>
-        <w:rPr>
-          <w:rFonts w:ascii="Consolas" w:hAnsi="Consolas" w:eastAsia="Consolas" w:cs="Consolas"/>
-          <w:color w:val="243447"/>
-          <w:sz w:val="17"/>
-        </w:rPr>
-        <w:t>State=PASS|NONE|CONFIGURED|CONFIGURED|PASS|FAIL</w:t>
-      </w:r>
-      <w:r>
-        <w:br/>
-      </w:r>
-      <w:r>
-        <w:rPr>
-          <w:rFonts w:ascii="Consolas" w:hAnsi="Consolas" w:eastAsia="Consolas" w:cs="Consolas"/>
-          <w:color w:val="243447"/>
-          <w:sz w:val="17"/>
-        </w:rPr>
-        <w:t>Health=HTTPS_REQUEST_TIMEOUT|FTT|3|REQUEST_STARTED</w:t>
-      </w:r>
-      <w:r>
-        <w:br/>
-      </w:r>
-      <w:r>
-        <w:rPr>
-          <w:rFonts w:ascii="Consolas" w:hAnsi="Consolas" w:eastAsia="Consolas" w:cs="Consolas"/>
-          <w:color w:val="243447"/>
-          <w:sz w:val="17"/>
-        </w:rPr>
-        <w:t>Stages=7|SERVICE_STARTED:S&gt;SETUP_HEALTH_FAILED:F&gt;ROLLBACK_COMPLETED:S</w:t>
+        <w:t>다음 조치 : Viewer에서 Agent 연결 확인 및 저장</w:t>
       </w:r>
       <w:r>
         <w:br/>
@@ -2351,7 +2213,7 @@
           <w:color w:val="16324F"/>
           <w:sz w:val="21"/>
         </w:rPr>
-        <w:t>SERVICE_STARTED → SETUP_HEALTH_FAILED → ROLLBACK_COMPLETED 순서와 각 단계 소요 시간은 실패 위치를 구분하기 위한 기록입니다. 설치, 방화벽, Agent 신원, rollback과 보안 검증 흐름은 바뀌지 않습니다. Health의 세 글자는 재시작·서비스·listener 순서이며 T는 검사 중 관찰함, F는 관찰하지 못함을 뜻합니다. 이 값은 현재 상태를 영구 보장하지 않습니다.</w:t>
+        <w:t>설치 완료 경고는 파일·서비스 설치 완료와 연결 준비 미확인을 구분합니다. 이 경우 rollback은 실행하지 않습니다. 익명 진단의 Health 값과 단계 시간은 원인 분류용이며 현재 상태를 영구 보장하지 않습니다.</w:t>
       </w:r>
     </w:p>
     <w:p>
@@ -2401,7 +2263,7 @@
           <w:color w:val="2E74B5"/>
           <w:sz w:val="21"/>
         </w:rPr>
-        <w:t xml:space="preserve">네트워크 정책 변경  </w:t>
+        <w:t xml:space="preserve">네트워크 정책은 자동 적용  </w:t>
       </w:r>
       <w:r>
         <w:rPr>
@@ -2409,7 +2271,7 @@
           <w:color w:val="16324F"/>
           <w:sz w:val="21"/>
         </w:rPr>
-        <w:t>Viewer PC 주소나 스위치 관리망이 바뀌면 같은 Release의 Agent Setup을 다시 열어 고정 Viewer IPv4와 자동 검색 또는 직접 추가 관리망을 검토합니다. 직접 입력은 네트워크 주소로 자동 정규화되며 RFC1918 범위만 허용됩니다. 검사에서 서비스, TCP/18443 listener, 방화벽, Agent 내부 Viewer 허용 주소, 활성 프로필과 live/ready를 확인합니다.</w:t>
+        <w:t>Viewer PC 주소나 스위치 관리망이 바뀌어도 CIDR을 다시 입력하지 않습니다. Viewer와 스위치가 10/8, 172.16/12 또는 192.168/16에 있고 Agent까지 라우팅 가능한지 확인합니다. 공인 주소와 그 밖의 특수 주소는 허용되지 않습니다.</w:t>
       </w:r>
     </w:p>
     <w:p>
@@ -2453,7 +2315,7 @@
           <w:color w:val="16324F"/>
           <w:sz w:val="21"/>
         </w:rPr>
-        <w:t>Agent Setup에 FIREWALL_REMOTE_ACCESS_UNCONFIRMED가 표시되면 Agent 설치는 완료됐지만 제품 방화벽 규칙의 적용·재조회 또는 회사 GPO를 확인하지 못했다는 뜻입니다. Viewer에서 연결 테스트를 실행하고, TCP/18443이 실패할 때 Windows 관리자에게 확인하세요. 규칙을 Any, LocalSubnet 또는 넓은 대역으로 수동 확대하지 마세요. AGENT_CONNECTION_REFUSED가 보이면 Viewer에 스위치 IP나 localhost가 아니라 Agent를 설치한 PC의 실제 주소를 입력했는지 먼저 확인하세요. 동일 PC 사전 테스트도 localhost 대신 이 PC의 실제 RFC1918 사설 IPv4를 사용합니다. 그 다음 Agent Setup의 검사에서 SamsungSwitchWatchAgent 서비스와 TCP/18443을 점검합니다. TCP 단계는 성공하고 HTTPS 단계가 실패하면 방화벽이 아니라 Agent PC의 로컬 HTTPS/TLS 준비 상태를 확인합니다. AGENT_CLIENT_NOT_ALLOWED이면 현재 Viewer PC의 고정 IPv4를 Agent Setup에 다시 입력하고 설치/업데이트합니다. 서비스를 수동 등록하지 말고 0.10.16-poc Agent Setup을 사용하세요.</w:t>
+        <w:t>Agent Setup에 AGENT_LOCAL_CONNECTION_UNCONFIRMED 또는 FIREWALL_REMOTE_ACCESS_UNCONFIRMED가 표시되면 Agent 서비스와 프로그램은 설치됐지만 연결 준비를 확인하지 못했다는 뜻입니다. Viewer에서 연결 테스트를 실행하고, TCP/18443이 실패할 때 Windows 관리자에게 확인하세요. 규칙을 AGENT_CONNECTION_REFUSED가 보이면 Viewer에 스위치 IP나 localhost가 아니라 Agent를 설치한 PC의 실제 주소를 입력했는지 먼저 확인하세요. 같은 PC 시험에서는 해당 PC의 사설 IPv4 또는 localhost를 사용할 수 있습니다. 그 다음 Windows 서비스에서 SamsungSwitchWatchAgent가 Running인지 확인하고 TCP/18443을 점검합니다. TCP 단계는 성공하고 HTTPS 단계가 실패하면 방화벽이 아니라 Agent PC의 로컬 HTTPS/TLS 준비 상태를 확인합니다. AGENT_CLIENT_NOT_ALLOWED이면 Viewer 주소가 RFC1918 사설 범위인지 확인합니다. 서비스를 수동 등록하지 말고 0.11.0-poc Agent Setup을 사용하세요.</w:t>
       </w:r>
     </w:p>
     <w:p>
@@ -2501,7 +2363,7 @@
           <w:color w:val="16324F"/>
           <w:sz w:val="21"/>
         </w:rPr>
-        <w:t>이전 Viewer가 실행 중이면 새 Viewer는 같은 사용자 데이터를 동시에 쓰지 않도록 실행을 차단하고 전환 순서를 표시합니다. 기존 트레이 아이콘에서 '프로그램 종료'를 선택한 뒤 Win+R에서 shell:startup을 열어 'Samsung Switch Watch' 바로 가기를 삭제합니다. 이어 shell:programs에서도 같은 이름의 이전 시작 메뉴 바로 가기를 삭제하고 새 Viewer를 다시 실행하세요. 기존 Agent 연결과 장비 정보는 유지됩니다. 창이 바로 보이지 않으면 알림 영역에서 대시보드를 열고 실행 경로가 새 0.10.16-poc 폴더인지 확인하세요.</w:t>
+        <w:t>이전 Viewer가 실행 중이면 새 Viewer는 같은 사용자 데이터를 동시에 쓰지 않도록 실행을 차단하고 전환 순서를 표시합니다. 기존 트레이 아이콘에서 '프로그램 종료'를 선택한 뒤 Win+R에서 shell:startup을 열어 'Samsung Switch Watch' 바로 가기를 삭제합니다. 이어 shell:programs에서도 같은 이름의 이전 시작 메뉴 바로 가기를 삭제하고 새 Viewer를 다시 실행하세요. 기존 Agent 연결과 장비 정보는 유지됩니다. 창이 바로 보이지 않으면 알림 영역에서 대시보드를 열고 실행 경로가 새 0.11.0-poc 폴더인지 확인하세요. API v4가 호환되면 Agent와 Viewer의 세부 버전이 달라도 경고만 표시하고 연결됩니다.</w:t>
       </w:r>
     </w:p>
     <w:p>
@@ -2572,7 +2434,7 @@
           <w:color w:val="16324F"/>
           <w:sz w:val="21"/>
         </w:rPr>
-        <w:t>Viewer는 압축 해제한 폴더에서 실행합니다. 장비 목록, DPAPI 자격 증명, 감시 이력과 화면 설정은 %LOCALAPPDATA%\SamsungSwitchWatch에 보존됩니다. Viewer 폴더를 교체해도 자료는 유지되지만 항상 Agent와 같은 Release를 사용하세요.</w:t>
+        <w:t>Viewer는 압축 해제한 폴더에서 실행합니다. 장비 목록, DPAPI 자격 증명, 감시 이력과 화면 설정은 %LOCALAPPDATA%\SamsungSwitchWatch에 보존됩니다. Viewer 폴더를 교체해도 자료는 유지되지만 문제 재현과 지원을 단순하게 하려면 Agent와 같은 Release 사용을 권장합니다. API v4가 호환되면 세부 버전이 달라도 연결은 유지되고 경고만 표시됩니다.</w:t>
       </w:r>
     </w:p>
     <w:p>
@@ -2601,7 +2463,7 @@
           <w:color w:val="16324F"/>
           <w:sz w:val="21"/>
         </w:rPr>
-        <w:t>0.10.16-poc는 코드 서명되지 않아 SmartScreen이나 사내 EDR이 차단할 수 있습니다. ZIP을 완전히 압축 해제하고 Viewer EXE와 제공된 DLL이 같은 폴더에 있는지 확인하세요. EDR·AppLocker·WDAC가 차단하면 우회하지 말고 공식 ZIP의 버전·해시와 차단 기록을 보안 담당자에게 전달하세요.</w:t>
+        <w:t>0.11.0-poc는 코드 서명되지 않아 SmartScreen이나 사내 EDR이 차단할 수 있습니다. ZIP을 완전히 압축 해제하고 Viewer EXE와 제공된 DLL이 같은 폴더에 있는지 확인하세요. EDR·AppLocker·WDAC가 차단하면 우회하지 말고 공식 ZIP의 버전·해시와 차단 기록을 보안 담당자에게 전달하세요.</w:t>
       </w:r>
     </w:p>
     <w:p>
@@ -2661,8 +2523,8 @@
       <w:r>
         <w:drawing>
           <wp:inline xmlns:a="http://schemas.openxmlformats.org/drawingml/2006/main" xmlns:pic="http://schemas.openxmlformats.org/drawingml/2006/picture">
-            <wp:extent cx="3200400" cy="4387645"/>
-            <wp:docPr id="3" name="Picture 3" title="Agent 연결 창" descr="같은 PC 테스트 결과, 익명 진단 저장과 원격 Agent 주소 입력을 함께 보여 주는 연결 설정 창"/>
+            <wp:extent cx="3200400" cy="4037427"/>
+            <wp:docPr id="3" name="Picture 3" title="Agent 연결 창" descr="Agent PC 주소 하나와 자동 HTTPS 연결 단계, 연결 확인 및 저장 버튼을 보여 주는 연결 설정 창"/>
             <wp:cNvGraphicFramePr>
               <a:graphicFrameLocks noChangeAspect="1"/>
             </wp:cNvGraphicFramePr>
@@ -2682,7 +2544,7 @@
                   <pic:spPr>
                     <a:xfrm>
                       <a:off x="0" y="0"/>
-                      <a:ext cx="3200400" cy="4387645"/>
+                      <a:ext cx="3200400" cy="4037427"/>
                     </a:xfrm>
                     <a:prstGeom prst="rect"/>
                   </pic:spPr>
@@ -2698,7 +2560,7 @@
         <w:pStyle w:val="Caption"/>
       </w:pPr>
       <w:r>
-        <w:t>그림 3. 같은 PC Agent/API 테스트, 익명 진단 저장과 원격 연결 설정</w:t>
+        <w:t>그림 3. Agent 주소만 입력하는 연결 설정</w:t>
       </w:r>
     </w:p>
     <w:p>
@@ -2725,7 +2587,7 @@
       <w:r>
         <w:drawing>
           <wp:inline xmlns:a="http://schemas.openxmlformats.org/drawingml/2006/main" xmlns:pic="http://schemas.openxmlformats.org/drawingml/2006/picture">
-            <wp:extent cx="3200400" cy="3778250"/>
+            <wp:extent cx="3200400" cy="4037427"/>
             <wp:docPr id="4" name="Picture 4" title="Agent 연결 실패와 지원 코드" descr="TCP 18443 연결 거부 단계와 선택 가능한 SWD1 지원 코드를 함께 표시하는 Viewer Agent 연결 실패 창"/>
             <wp:cNvGraphicFramePr>
               <a:graphicFrameLocks noChangeAspect="1"/>
@@ -2746,7 +2608,7 @@
                   <pic:spPr>
                     <a:xfrm>
                       <a:off x="0" y="0"/>
-                      <a:ext cx="3200400" cy="3778250"/>
+                      <a:ext cx="3200400" cy="4037427"/>
                     </a:xfrm>
                     <a:prstGeom prst="rect"/>
                   </pic:spPr>
@@ -2794,7 +2656,7 @@
           <w:rFonts w:ascii="맑은 고딕" w:hAnsi="맑은 고딕" w:eastAsia="맑은 고딕" w:cs="맑은 고딕"/>
           <w:sz w:val="22"/>
         </w:rPr>
-        <w:t>Agent와 Viewer가 같은 PC여도 localhost, localhost. 또는 127.x.x.x를 사용하지 않고 실제 RFC1918 사설 IPv4를 사용합니다.</w:t>
+        <w:t>Agent와 Viewer가 같은 PC라면 localhost 또는 해당 PC의 사설 IPv4를 사용할 수 있습니다.</w:t>
       </w:r>
     </w:p>
     <w:p>
@@ -2810,7 +2672,7 @@
           <w:rFonts w:ascii="맑은 고딕" w:hAnsi="맑은 고딕" w:eastAsia="맑은 고딕" w:cs="맑은 고딕"/>
           <w:sz w:val="22"/>
         </w:rPr>
-        <w:t>https://, 포트, 인증서 지문과 페어링 토큰은 입력하지 않습니다. 정상 Agent 교체나 재설치가 확실할 때만 '이 Agent로 다시 연결'을 사용합니다.</w:t>
+        <w:t>https://, 포트, 인증서 지문과 페어링 토큰은 입력하지 않습니다. HTTPS/TCP 18443과 Agent 인증서 확인은 프로그램이 자동 처리합니다.</w:t>
       </w:r>
     </w:p>
     <w:p>
@@ -2839,7 +2701,7 @@
           <w:color w:val="16324F"/>
           <w:sz w:val="21"/>
         </w:rPr>
-        <w:t>Agent와 Viewer를 같은 PC에 설치했다면 Viewer의 'Agent와 Viewer가 같은 PC일 때 테스트'를 직접 누릅니다. 이 기능은 자동으로 실행되지 않으며 사설 IPv4 후보를 최대 6개, 후보당 7초, 전체 30초 안에서 확인합니다. 성공은 Agent 서비스, TCP/18443, HTTPS, Agent API와 같은 버전만 뜻합니다. 스위치 자격 증명과 명령은 사용하지 않으며, 장비는 저장 후 '장비 관리 → 접속 시험'에서 별도로 확인합니다. 실제 원격 배치 전에는 Agent Setup에 원격 Viewer 고정 IPv4를 다시 적용하고 원격 Viewer PC에서 연결 진단을 반복하세요.</w:t>
+        <w:t>Agent와 Viewer를 같은 PC에 설치했다면 Agent PC 주소에 localhost 또는 해당 PC의 사설 IPv4를 입력하고 일반 연결 확인을 실행합니다. 성공은 Agent 서비스, TCP/18443, HTTPS와 Agent API만 뜻합니다. 스위치 자격 증명과 명령은 사용하지 않으며, 장비는 저장 후 '장비 관리 → 접속 시험'에서 별도로 확인합니다. 실제 원격 배치 전에는 원격 Viewer PC에서 Agent PC 주소로 연결 확인을 다시 실행하세요.</w:t>
       </w:r>
     </w:p>
     <w:p>
@@ -2883,7 +2745,7 @@
           <w:color w:val="16324F"/>
           <w:sz w:val="21"/>
         </w:rPr>
-        <w:t>일반 연결과 같은 PC 테스트가 성공 또는 실패로 끝나면 '익명 진단 저장'을 사용할 수 있습니다. 사진 한 장용 최대 12줄 TXT에는 주소·DNS·TCP/18443·HTTPS·Identity 단계 상태와 제한된 소요 시간, 후보 수와 확인된 Agent/API 버전만 기록하며 입력 주소, DNS 이름, PC·사용자명, 계정, 경로, 예외 원문과 장비 명령·출력은 제외합니다. 연결 성공 뒤 창은 저장 결과를 보여 주며, 필요하면 진단을 저장한 다음 닫습니다.</w:t>
+        <w:t>Agent 연결 확인이 성공 또는 실패로 끝나면 '익명 진단 저장'을 사용할 수 있습니다. 사진 한 장용 최대 12줄 TXT에는 주소·DNS·TCP/18443·HTTPS·Agent API 단계 상태와 제한된 소요 시간과 확인된 Agent/API 버전만 기록하며 입력 주소, DNS 이름, PC·사용자명, 계정, 경로, 예외 원문과 장비 명령·출력은 제외합니다. 연결 성공 뒤 창은 저장 결과를 보여 주며, 필요하면 진단을 저장한 다음 닫습니다.</w:t>
       </w:r>
     </w:p>
     <w:p>
@@ -3346,7 +3208,7 @@
                 <w:rFonts w:ascii="맑은 고딕" w:hAnsi="맑은 고딕" w:eastAsia="맑은 고딕" w:cs="맑은 고딕"/>
                 <w:sz w:val="18"/>
               </w:rPr>
-              <w:t>Agent Setup에서 선택한 관리망에 속한 스위치 관리 IPv4</w:t>
+              <w:t>10/8, 172.16/12 또는 192.168/16의 스위치 관리 IPv4</w:t>
             </w:r>
           </w:p>
         </w:tc>
@@ -3709,7 +3571,7 @@
           <w:color w:val="16324F"/>
           <w:sz w:val="21"/>
         </w:rPr>
-        <w:t>실패한 장비도 저장할 수 있지만 '접속 미확인'으로 표시되고 주기 감시는 강제로 꺼집니다. 주소, Agent 허용 IP, ID/PW와 enable 필요 여부를 바로잡은 뒤 다시 시험하세요.</w:t>
+        <w:t>실패한 장비도 저장할 수 있지만 '접속 미확인'으로 표시되고 주기 감시는 강제로 꺼집니다. 주소가 사설 대역인지, ID/PW와 enable 필요 여부를 바로잡은 뒤 다시 시험하세요.</w:t>
       </w:r>
     </w:p>
     <w:p>
@@ -6108,7 +5970,7 @@
                 <w:rFonts w:ascii="맑은 고딕" w:hAnsi="맑은 고딕" w:eastAsia="맑은 고딕" w:cs="맑은 고딕"/>
                 <w:sz w:val="18"/>
               </w:rPr>
-              <w:t>Agent HTTPS 신원</w:t>
+              <w:t>Agent HTTPS 인증서</w:t>
             </w:r>
           </w:p>
         </w:tc>
@@ -6134,9 +5996,7 @@
                 <w:rFonts w:ascii="맑은 고딕" w:hAnsi="맑은 고딕" w:eastAsia="맑은 고딕" w:cs="맑은 고딕"/>
                 <w:sz w:val="18"/>
               </w:rPr>
-              <w:t>%ProgramData%\</w:t>
-              <w:br/>
-              <w:t>SamsungSwitchWatch</w:t>
+              <w:t>Agent 프로세스 메모리</w:t>
             </w:r>
           </w:p>
         </w:tc>
@@ -6162,7 +6022,7 @@
                 <w:rFonts w:ascii="맑은 고딕" w:hAnsi="맑은 고딕" w:eastAsia="맑은 고딕" w:cs="맑은 고딕"/>
                 <w:sz w:val="18"/>
               </w:rPr>
-              <w:t>DPAPI LocalMachine + SYSTEM/Administrators/서비스 SID ACL</w:t>
+              <w:t>서비스 시작마다 새로 생성, 종료 시 소멸</w:t>
             </w:r>
           </w:p>
         </w:tc>
@@ -6242,7 +6102,7 @@
                 <w:rFonts w:ascii="맑은 고딕" w:hAnsi="맑은 고딕" w:eastAsia="맑은 고딕" w:cs="맑은 고딕"/>
                 <w:sz w:val="18"/>
               </w:rPr>
-              <w:t>Viewer 주소와 선택 관리망에 맞춰 Setup이 생성</w:t>
+              <w:t>RFC1918 Viewer/장비 정책과 TCP 포트</w:t>
             </w:r>
           </w:p>
         </w:tc>
@@ -6365,7 +6225,7 @@
           <w:rFonts w:ascii="맑은 고딕" w:hAnsi="맑은 고딕" w:eastAsia="맑은 고딕" w:cs="맑은 고딕"/>
           <w:sz w:val="22"/>
         </w:rPr>
-        <w:t>기존 Agent HTTPS 신원과 유효한 실행 설정은 같은 PC의 업데이트에서 보존합니다.</w:t>
+        <w:t>Viewer는 Agent 인증서 지문이나 페어링 토큰을 저장하지 않습니다. HTTPS는 전송 내용을 암호화하지만 Agent PC 신원을 별도로 인증하는 구조는 아닙니다.</w:t>
       </w:r>
     </w:p>
     <w:p>
@@ -6381,7 +6241,7 @@
           <w:rFonts w:ascii="맑은 고딕" w:hAnsi="맑은 고딕" w:eastAsia="맑은 고딕" w:cs="맑은 고딕"/>
           <w:sz w:val="22"/>
         </w:rPr>
-        <w:t>제품 소유 방화벽 규칙과 Agent 원격 업무 API는 같은 고정 Viewer IPv4를 허용합니다. 외부 방화벽 규칙은 변경하지 않으며, Agent PC의 로컬 준비 상태 점검만 예외입니다. Agent는 Setup에서 선택하거나 직접 추가해 확정한 관리망의 Telnet/23만 사용합니다.</w:t>
+        <w:t>제품 방화벽 규칙과 Agent 업무 API는 RFC1918 사설 Viewer 주소를 허용합니다. Agent는 RFC1918 사설 장비의 Telnet/23만 사용합니다.</w:t>
       </w:r>
     </w:p>
     <w:p>
@@ -6620,7 +6480,7 @@
                 <w:rFonts w:ascii="맑은 고딕" w:hAnsi="맑은 고딕" w:eastAsia="맑은 고딕" w:cs="맑은 고딕"/>
                 <w:sz w:val="16"/>
               </w:rPr>
-              <w:t>실제 Agent PC 주소 → Agent Setup 검사 → 고정 Viewer IP → 원격 TCP/18443</w:t>
+              <w:t>실제 Agent PC 주소 → 서비스 Running → 원격 TCP/18443</w:t>
             </w:r>
           </w:p>
         </w:tc>
@@ -6675,7 +6535,7 @@
                 <w:rFonts w:ascii="맑은 고딕" w:hAnsi="맑은 고딕" w:eastAsia="맑은 고딕" w:cs="맑은 고딕"/>
                 <w:sz w:val="16"/>
               </w:rPr>
-              <w:t>Agent PC에서 Setup 재실행 → 현재 Viewer 고정 IPv4 입력 → 설치/업데이트</w:t>
+              <w:t>Viewer 주소가 10/8, 172.16/12 또는 192.168/16인지 확인</w:t>
             </w:r>
           </w:p>
         </w:tc>
@@ -6762,7 +6622,7 @@
                 <w:rFonts w:ascii="맑은 고딕" w:hAnsi="맑은 고딕" w:eastAsia="맑은 고딕" w:cs="맑은 고딕"/>
                 <w:sz w:val="16"/>
               </w:rPr>
-              <w:t>AGENT_VERSION_MISMATCH</w:t>
+              <w:t>Agent/Viewer 버전 차이 경고</w:t>
             </w:r>
           </w:p>
         </w:tc>
@@ -6787,7 +6647,7 @@
                 <w:rFonts w:ascii="맑은 고딕" w:hAnsi="맑은 고딕" w:eastAsia="맑은 고딕" w:cs="맑은 고딕"/>
                 <w:sz w:val="16"/>
               </w:rPr>
-              <w:t>같은 Release의 Agent ZIP과 Viewer ZIP으로 함께 업데이트</w:t>
+              <w:t>API v4 호환이면 그대로 연결 가능. 문제 재현 시 같은 Release로 맞춤</w:t>
             </w:r>
           </w:p>
         </w:tc>
@@ -6818,7 +6678,7 @@
                 <w:rFonts w:ascii="맑은 고딕" w:hAnsi="맑은 고딕" w:eastAsia="맑은 고딕" w:cs="맑은 고딕"/>
                 <w:sz w:val="16"/>
               </w:rPr>
-              <w:t>AGENT_IDENTITY_CHANGED</w:t>
+              <w:t>AGENT_PROTOCOL_MISMATCH</w:t>
             </w:r>
           </w:p>
         </w:tc>
@@ -6844,7 +6704,7 @@
                 <w:rFonts w:ascii="맑은 고딕" w:hAnsi="맑은 고딕" w:eastAsia="맑은 고딕" w:cs="맑은 고딕"/>
                 <w:sz w:val="16"/>
               </w:rPr>
-              <w:t>Agent PC 교체/재설치 사실을 관리자에게 확인한 뒤 다시 연결</w:t>
+              <w:t>Agent API가 v4인지 확인하고 같은 Release로 업데이트</w:t>
             </w:r>
           </w:p>
         </w:tc>
@@ -6874,7 +6734,7 @@
                 <w:rFonts w:ascii="맑은 고딕" w:hAnsi="맑은 고딕" w:eastAsia="맑은 고딕" w:cs="맑은 고딕"/>
                 <w:sz w:val="16"/>
               </w:rPr>
-              <w:t>AGENT_PROTOCOL_MISMATCH / TLS_IDENTITY_INVALID</w:t>
+              <w:t>SETUP_PACKAGE_NOT_FOUND</w:t>
             </w:r>
           </w:p>
         </w:tc>
@@ -6899,7 +6759,7 @@
                 <w:rFonts w:ascii="맑은 고딕" w:hAnsi="맑은 고딕" w:eastAsia="맑은 고딕" w:cs="맑은 고딕"/>
                 <w:sz w:val="16"/>
               </w:rPr>
-              <w:t>TCP 성공 확인 → Agent PC의 로컬 HTTPS/TLS 준비 상태 → PC 교체 여부와 HTTPS 신원</w:t>
+              <w:t>Agent ZIP 전체 압축 해제 → Setup과 Agent EXE·BUILD-MANIFEST 존재 확인</w:t>
             </w:r>
           </w:p>
         </w:tc>
@@ -6930,7 +6790,7 @@
                 <w:rFonts w:ascii="맑은 고딕" w:hAnsi="맑은 고딕" w:eastAsia="맑은 고딕" w:cs="맑은 고딕"/>
                 <w:sz w:val="16"/>
               </w:rPr>
-              <w:t>SETUP_PACKAGE_NOT_FOUND</w:t>
+              <w:t>SETUP_PACKAGE_HASH_MISMATCH</w:t>
             </w:r>
           </w:p>
         </w:tc>
@@ -6938,61 +6798,6 @@
           <w:tcPr>
             <w:tcW w:type="dxa" w:w="5060"/>
             <w:shd w:fill="FAFBFC"/>
-            <w:tcMar>
-              <w:top w:w="80" w:type="dxa"/>
-              <w:start w:w="120" w:type="dxa"/>
-              <w:bottom w:w="80" w:type="dxa"/>
-              <w:end w:w="120" w:type="dxa"/>
-            </w:tcMar>
-            <w:vAlign w:val="center"/>
-          </w:tcPr>
-          <w:p>
-            <w:pPr>
-              <w:spacing w:before="0" w:after="0" w:line="240" w:lineRule="auto"/>
-              <w:jc w:val="left"/>
-            </w:pPr>
-            <w:r>
-              <w:rPr>
-                <w:rFonts w:ascii="맑은 고딕" w:hAnsi="맑은 고딕" w:eastAsia="맑은 고딕" w:cs="맑은 고딕"/>
-                <w:sz w:val="16"/>
-              </w:rPr>
-              <w:t>Agent ZIP 전체 압축 해제 → Setup과 Agent EXE·BUILD-MANIFEST 존재 확인</w:t>
-            </w:r>
-          </w:p>
-        </w:tc>
-      </w:tr>
-      <w:tr>
-        <w:trPr>
-          <w:cantSplit w:val="true"/>
-        </w:trPr>
-        <w:tc>
-          <w:tcPr>
-            <w:tcW w:type="dxa" w:w="4300"/>
-            <w:tcMar>
-              <w:top w:w="80" w:type="dxa"/>
-              <w:start w:w="120" w:type="dxa"/>
-              <w:bottom w:w="80" w:type="dxa"/>
-              <w:end w:w="120" w:type="dxa"/>
-            </w:tcMar>
-            <w:vAlign w:val="center"/>
-          </w:tcPr>
-          <w:p>
-            <w:pPr>
-              <w:spacing w:before="0" w:after="0" w:line="240" w:lineRule="auto"/>
-              <w:jc w:val="left"/>
-            </w:pPr>
-            <w:r>
-              <w:rPr>
-                <w:rFonts w:ascii="맑은 고딕" w:hAnsi="맑은 고딕" w:eastAsia="맑은 고딕" w:cs="맑은 고딕"/>
-                <w:sz w:val="16"/>
-              </w:rPr>
-              <w:t>SETUP_PACKAGE_HASH_MISMATCH</w:t>
-            </w:r>
-          </w:p>
-        </w:tc>
-        <w:tc>
-          <w:tcPr>
-            <w:tcW w:type="dxa" w:w="5060"/>
             <w:tcMar>
               <w:top w:w="80" w:type="dxa"/>
               <w:start w:w="120" w:type="dxa"/>
@@ -7023,7 +6828,6 @@
         <w:tc>
           <w:tcPr>
             <w:tcW w:type="dxa" w:w="4300"/>
-            <w:shd w:fill="FAFBFC"/>
             <w:tcMar>
               <w:top w:w="80" w:type="dxa"/>
               <w:start w:w="120" w:type="dxa"/>
@@ -7049,7 +6853,6 @@
         <w:tc>
           <w:tcPr>
             <w:tcW w:type="dxa" w:w="5060"/>
-            <w:shd w:fill="FAFBFC"/>
             <w:tcMar>
               <w:top w:w="80" w:type="dxa"/>
               <w:start w:w="120" w:type="dxa"/>
@@ -7080,6 +6883,7 @@
         <w:tc>
           <w:tcPr>
             <w:tcW w:type="dxa" w:w="4300"/>
+            <w:shd w:fill="FAFBFC"/>
             <w:tcMar>
               <w:top w:w="80" w:type="dxa"/>
               <w:start w:w="120" w:type="dxa"/>
@@ -7105,6 +6909,7 @@
         <w:tc>
           <w:tcPr>
             <w:tcW w:type="dxa" w:w="5060"/>
+            <w:shd w:fill="FAFBFC"/>
             <w:tcMar>
               <w:top w:w="80" w:type="dxa"/>
               <w:start w:w="120" w:type="dxa"/>
@@ -7123,7 +6928,62 @@
                 <w:rFonts w:ascii="맑은 고딕" w:hAnsi="맑은 고딕" w:eastAsia="맑은 고딕" w:cs="맑은 고딕"/>
                 <w:sz w:val="16"/>
               </w:rPr>
-              <w:t>외부 규칙은 보존됨 → Viewer 고정 IPv4 확인 → 설치/업데이트 계속</w:t>
+              <w:t>외부 규칙은 보존됨 → 설치 계속 → Viewer 연결 테스트</w:t>
+            </w:r>
+          </w:p>
+        </w:tc>
+      </w:tr>
+      <w:tr>
+        <w:trPr>
+          <w:cantSplit w:val="true"/>
+        </w:trPr>
+        <w:tc>
+          <w:tcPr>
+            <w:tcW w:type="dxa" w:w="4300"/>
+            <w:tcMar>
+              <w:top w:w="80" w:type="dxa"/>
+              <w:start w:w="120" w:type="dxa"/>
+              <w:bottom w:w="80" w:type="dxa"/>
+              <w:end w:w="120" w:type="dxa"/>
+            </w:tcMar>
+            <w:vAlign w:val="center"/>
+          </w:tcPr>
+          <w:p>
+            <w:pPr>
+              <w:spacing w:before="0" w:after="0" w:line="240" w:lineRule="auto"/>
+              <w:jc w:val="left"/>
+            </w:pPr>
+            <w:r>
+              <w:rPr>
+                <w:rFonts w:ascii="맑은 고딕" w:hAnsi="맑은 고딕" w:eastAsia="맑은 고딕" w:cs="맑은 고딕"/>
+                <w:sz w:val="16"/>
+              </w:rPr>
+              <w:t>FIREWALL_REMOTE_ACCESS_UNCONFIRMED</w:t>
+            </w:r>
+          </w:p>
+        </w:tc>
+        <w:tc>
+          <w:tcPr>
+            <w:tcW w:type="dxa" w:w="5060"/>
+            <w:tcMar>
+              <w:top w:w="80" w:type="dxa"/>
+              <w:start w:w="120" w:type="dxa"/>
+              <w:bottom w:w="80" w:type="dxa"/>
+              <w:end w:w="120" w:type="dxa"/>
+            </w:tcMar>
+            <w:vAlign w:val="center"/>
+          </w:tcPr>
+          <w:p>
+            <w:pPr>
+              <w:spacing w:before="0" w:after="0" w:line="240" w:lineRule="auto"/>
+              <w:jc w:val="left"/>
+            </w:pPr>
+            <w:r>
+              <w:rPr>
+                <w:rFonts w:ascii="맑은 고딕" w:hAnsi="맑은 고딕" w:eastAsia="맑은 고딕" w:cs="맑은 고딕"/>
+                <w:sz w:val="16"/>
+              </w:rPr>
+              <w:t>Agent 설치 유지 확인 → Viewer 연결 테스트 → TCP 실패 시 방화벽 서비스·Domain/Private·회사 GPO 확인</w:t>
             </w:r>
           </w:p>
         </w:tc>
@@ -7154,7 +7014,7 @@
                 <w:rFonts w:ascii="맑은 고딕" w:hAnsi="맑은 고딕" w:eastAsia="맑은 고딕" w:cs="맑은 고딕"/>
                 <w:sz w:val="16"/>
               </w:rPr>
-              <w:t>FIREWALL_REMOTE_ACCESS_UNCONFIRMED</w:t>
+              <w:t>AGENT_LOCAL_CONNECTION_UNCONFIRMED</w:t>
             </w:r>
           </w:p>
         </w:tc>
@@ -7180,119 +7040,7 @@
                 <w:rFonts w:ascii="맑은 고딕" w:hAnsi="맑은 고딕" w:eastAsia="맑은 고딕" w:cs="맑은 고딕"/>
                 <w:sz w:val="16"/>
               </w:rPr>
-              <w:t>Agent 설치 유지 확인 → Viewer 연결 테스트 → TCP 실패 시 방화벽 서비스·Domain/Private·회사 GPO 확인</w:t>
-            </w:r>
-          </w:p>
-        </w:tc>
-      </w:tr>
-      <w:tr>
-        <w:trPr>
-          <w:cantSplit w:val="true"/>
-        </w:trPr>
-        <w:tc>
-          <w:tcPr>
-            <w:tcW w:type="dxa" w:w="4300"/>
-            <w:tcMar>
-              <w:top w:w="80" w:type="dxa"/>
-              <w:start w:w="120" w:type="dxa"/>
-              <w:bottom w:w="80" w:type="dxa"/>
-              <w:end w:w="120" w:type="dxa"/>
-            </w:tcMar>
-            <w:vAlign w:val="center"/>
-          </w:tcPr>
-          <w:p>
-            <w:pPr>
-              <w:spacing w:before="0" w:after="0" w:line="240" w:lineRule="auto"/>
-              <w:jc w:val="left"/>
-            </w:pPr>
-            <w:r>
-              <w:rPr>
-                <w:rFonts w:ascii="맑은 고딕" w:hAnsi="맑은 고딕" w:eastAsia="맑은 고딕" w:cs="맑은 고딕"/>
-                <w:sz w:val="16"/>
-              </w:rPr>
-              <w:t>SETUP_FIREWALL_FAILED</w:t>
-            </w:r>
-          </w:p>
-        </w:tc>
-        <w:tc>
-          <w:tcPr>
-            <w:tcW w:type="dxa" w:w="5060"/>
-            <w:tcMar>
-              <w:top w:w="80" w:type="dxa"/>
-              <w:start w:w="120" w:type="dxa"/>
-              <w:bottom w:w="80" w:type="dxa"/>
-              <w:end w:w="120" w:type="dxa"/>
-            </w:tcMar>
-            <w:vAlign w:val="center"/>
-          </w:tcPr>
-          <w:p>
-            <w:pPr>
-              <w:spacing w:before="0" w:after="0" w:line="240" w:lineRule="auto"/>
-              <w:jc w:val="left"/>
-            </w:pPr>
-            <w:r>
-              <w:rPr>
-                <w:rFonts w:ascii="맑은 고딕" w:hAnsi="맑은 고딕" w:eastAsia="맑은 고딕" w:cs="맑은 고딕"/>
-                <w:sz w:val="16"/>
-              </w:rPr>
-              <w:t>이전 버전/복구 호환 경로 → 안전한 불일치 코드와 rollback 상태 확인</w:t>
-            </w:r>
-          </w:p>
-        </w:tc>
-      </w:tr>
-      <w:tr>
-        <w:trPr>
-          <w:cantSplit w:val="true"/>
-        </w:trPr>
-        <w:tc>
-          <w:tcPr>
-            <w:tcW w:type="dxa" w:w="4300"/>
-            <w:shd w:fill="FAFBFC"/>
-            <w:tcMar>
-              <w:top w:w="80" w:type="dxa"/>
-              <w:start w:w="120" w:type="dxa"/>
-              <w:bottom w:w="80" w:type="dxa"/>
-              <w:end w:w="120" w:type="dxa"/>
-            </w:tcMar>
-            <w:vAlign w:val="center"/>
-          </w:tcPr>
-          <w:p>
-            <w:pPr>
-              <w:spacing w:before="0" w:after="0" w:line="240" w:lineRule="auto"/>
-              <w:jc w:val="left"/>
-            </w:pPr>
-            <w:r>
-              <w:rPr>
-                <w:rFonts w:ascii="맑은 고딕" w:hAnsi="맑은 고딕" w:eastAsia="맑은 고딕" w:cs="맑은 고딕"/>
-                <w:sz w:val="16"/>
-              </w:rPr>
-              <w:t>SETUP_HEALTH_FAILED</w:t>
-            </w:r>
-          </w:p>
-        </w:tc>
-        <w:tc>
-          <w:tcPr>
-            <w:tcW w:type="dxa" w:w="5060"/>
-            <w:shd w:fill="FAFBFC"/>
-            <w:tcMar>
-              <w:top w:w="80" w:type="dxa"/>
-              <w:start w:w="120" w:type="dxa"/>
-              <w:bottom w:w="80" w:type="dxa"/>
-              <w:end w:w="120" w:type="dxa"/>
-            </w:tcMar>
-            <w:vAlign w:val="center"/>
-          </w:tcPr>
-          <w:p>
-            <w:pPr>
-              <w:spacing w:before="0" w:after="0" w:line="240" w:lineRule="auto"/>
-              <w:jc w:val="left"/>
-            </w:pPr>
-            <w:r>
-              <w:rPr>
-                <w:rFonts w:ascii="맑은 고딕" w:hAnsi="맑은 고딕" w:eastAsia="맑은 고딕" w:cs="맑은 고딕"/>
-                <w:sz w:val="16"/>
-              </w:rPr>
-              <w:t>Agent PC 내부 Setup → 127.0.0.1:18443 → Agent 서비스 구간 확인 → AgentHealthCode와 안전 관측값 확인 → 같은 설치 반복 대신 Windows 이벤트·TLS 정책·EDR 확인</w:t>
+              <w:t>설치는 유지됨 → Viewer 연결 테스트 → 실패 시 Agent 서비스·로컬 HTTPS·EDR 확인</w:t>
             </w:r>
           </w:p>
         </w:tc>
@@ -7882,7 +7630,7 @@
                 <w:rFonts w:ascii="맑은 고딕" w:hAnsi="맑은 고딕" w:eastAsia="맑은 고딕" w:cs="맑은 고딕"/>
                 <w:sz w:val="16"/>
               </w:rPr>
-              <w:t>SETUP_EXISTING_NETWORKS_NOT_LOADED</w:t>
+              <w:t>TARGET_NOT_ALLOWED</w:t>
             </w:r>
           </w:p>
         </w:tc>
@@ -7907,7 +7655,7 @@
                 <w:rFonts w:ascii="맑은 고딕" w:hAnsi="맑은 고딕" w:eastAsia="맑은 고딕" w:cs="맑은 고딕"/>
                 <w:sz w:val="16"/>
               </w:rPr>
-              <w:t>기존 관리망을 자동 복원하지 못함. 승인된 관리망을 다시 선택하거나 IPv4/prefix로 직접 추가</w:t>
+              <w:t>장비 IPv4가 10/8, 172.16/12 또는 192.168/16인지 확인</w:t>
             </w:r>
           </w:p>
         </w:tc>
@@ -7938,7 +7686,7 @@
                 <w:rFonts w:ascii="맑은 고딕" w:hAnsi="맑은 고딕" w:eastAsia="맑은 고딕" w:cs="맑은 고딕"/>
                 <w:sz w:val="16"/>
               </w:rPr>
-              <w:t>TARGET_NOT_ALLOWED</w:t>
+              <w:t>TCP_TIMEOUT</w:t>
             </w:r>
           </w:p>
         </w:tc>
@@ -7946,61 +7694,6 @@
           <w:tcPr>
             <w:tcW w:type="dxa" w:w="5060"/>
             <w:shd w:fill="FAFBFC"/>
-            <w:tcMar>
-              <w:top w:w="80" w:type="dxa"/>
-              <w:start w:w="120" w:type="dxa"/>
-              <w:bottom w:w="80" w:type="dxa"/>
-              <w:end w:w="120" w:type="dxa"/>
-            </w:tcMar>
-            <w:vAlign w:val="center"/>
-          </w:tcPr>
-          <w:p>
-            <w:pPr>
-              <w:spacing w:before="0" w:after="0" w:line="240" w:lineRule="auto"/>
-              <w:jc w:val="left"/>
-            </w:pPr>
-            <w:r>
-              <w:rPr>
-                <w:rFonts w:ascii="맑은 고딕" w:hAnsi="맑은 고딕" w:eastAsia="맑은 고딕" w:cs="맑은 고딕"/>
-                <w:sz w:val="16"/>
-              </w:rPr>
-              <w:t>장비 IPv4가 Setup에서 선택·추가한 관리망 내부인지 확인. 필요하면 승인된 사설 CIDR을 Setup에서 추가</w:t>
-            </w:r>
-          </w:p>
-        </w:tc>
-      </w:tr>
-      <w:tr>
-        <w:trPr>
-          <w:cantSplit w:val="true"/>
-        </w:trPr>
-        <w:tc>
-          <w:tcPr>
-            <w:tcW w:type="dxa" w:w="4300"/>
-            <w:tcMar>
-              <w:top w:w="80" w:type="dxa"/>
-              <w:start w:w="120" w:type="dxa"/>
-              <w:bottom w:w="80" w:type="dxa"/>
-              <w:end w:w="120" w:type="dxa"/>
-            </w:tcMar>
-            <w:vAlign w:val="center"/>
-          </w:tcPr>
-          <w:p>
-            <w:pPr>
-              <w:spacing w:before="0" w:after="0" w:line="240" w:lineRule="auto"/>
-              <w:jc w:val="left"/>
-            </w:pPr>
-            <w:r>
-              <w:rPr>
-                <w:rFonts w:ascii="맑은 고딕" w:hAnsi="맑은 고딕" w:eastAsia="맑은 고딕" w:cs="맑은 고딕"/>
-                <w:sz w:val="16"/>
-              </w:rPr>
-              <w:t>TCP_TIMEOUT</w:t>
-            </w:r>
-          </w:p>
-        </w:tc>
-        <w:tc>
-          <w:tcPr>
-            <w:tcW w:type="dxa" w:w="5060"/>
             <w:tcMar>
               <w:top w:w="80" w:type="dxa"/>
               <w:start w:w="120" w:type="dxa"/>
@@ -8031,7 +7724,6 @@
         <w:tc>
           <w:tcPr>
             <w:tcW w:type="dxa" w:w="4300"/>
-            <w:shd w:fill="FAFBFC"/>
             <w:tcMar>
               <w:top w:w="80" w:type="dxa"/>
               <w:start w:w="120" w:type="dxa"/>
@@ -8057,7 +7749,6 @@
         <w:tc>
           <w:tcPr>
             <w:tcW w:type="dxa" w:w="5060"/>
-            <w:shd w:fill="FAFBFC"/>
             <w:tcMar>
               <w:top w:w="80" w:type="dxa"/>
               <w:start w:w="120" w:type="dxa"/>
@@ -8088,6 +7779,7 @@
         <w:tc>
           <w:tcPr>
             <w:tcW w:type="dxa" w:w="4300"/>
+            <w:shd w:fill="FAFBFC"/>
             <w:tcMar>
               <w:top w:w="80" w:type="dxa"/>
               <w:start w:w="120" w:type="dxa"/>
@@ -8113,6 +7805,7 @@
         <w:tc>
           <w:tcPr>
             <w:tcW w:type="dxa" w:w="5060"/>
+            <w:shd w:fill="FAFBFC"/>
             <w:tcMar>
               <w:top w:w="80" w:type="dxa"/>
               <w:start w:w="120" w:type="dxa"/>
@@ -8143,7 +7836,6 @@
         <w:tc>
           <w:tcPr>
             <w:tcW w:type="dxa" w:w="4300"/>
-            <w:shd w:fill="FAFBFC"/>
             <w:tcMar>
               <w:top w:w="80" w:type="dxa"/>
               <w:start w:w="120" w:type="dxa"/>
@@ -8169,7 +7861,6 @@
         <w:tc>
           <w:tcPr>
             <w:tcW w:type="dxa" w:w="5060"/>
-            <w:shd w:fill="FAFBFC"/>
             <w:tcMar>
               <w:top w:w="80" w:type="dxa"/>
               <w:start w:w="120" w:type="dxa"/>
@@ -8200,6 +7891,7 @@
         <w:tc>
           <w:tcPr>
             <w:tcW w:type="dxa" w:w="4300"/>
+            <w:shd w:fill="FAFBFC"/>
             <w:tcMar>
               <w:top w:w="80" w:type="dxa"/>
               <w:start w:w="120" w:type="dxa"/>
@@ -8225,6 +7917,7 @@
         <w:tc>
           <w:tcPr>
             <w:tcW w:type="dxa" w:w="5060"/>
+            <w:shd w:fill="FAFBFC"/>
             <w:tcMar>
               <w:top w:w="80" w:type="dxa"/>
               <w:start w:w="120" w:type="dxa"/>
@@ -8255,7 +7948,6 @@
         <w:tc>
           <w:tcPr>
             <w:tcW w:type="dxa" w:w="4300"/>
-            <w:shd w:fill="FAFBFC"/>
             <w:tcMar>
               <w:top w:w="80" w:type="dxa"/>
               <w:start w:w="120" w:type="dxa"/>
@@ -8281,7 +7973,6 @@
         <w:tc>
           <w:tcPr>
             <w:tcW w:type="dxa" w:w="5060"/>
-            <w:shd w:fill="FAFBFC"/>
             <w:tcMar>
               <w:top w:w="80" w:type="dxa"/>
               <w:start w:w="120" w:type="dxa"/>
@@ -8312,6 +8003,7 @@
         <w:tc>
           <w:tcPr>
             <w:tcW w:type="dxa" w:w="4300"/>
+            <w:shd w:fill="FAFBFC"/>
             <w:tcMar>
               <w:top w:w="80" w:type="dxa"/>
               <w:start w:w="120" w:type="dxa"/>
@@ -8337,6 +8029,7 @@
         <w:tc>
           <w:tcPr>
             <w:tcW w:type="dxa" w:w="5060"/>
+            <w:shd w:fill="FAFBFC"/>
             <w:tcMar>
               <w:top w:w="80" w:type="dxa"/>
               <w:start w:w="120" w:type="dxa"/>
@@ -8367,7 +8060,6 @@
         <w:tc>
           <w:tcPr>
             <w:tcW w:type="dxa" w:w="4300"/>
-            <w:shd w:fill="FAFBFC"/>
             <w:tcMar>
               <w:top w:w="80" w:type="dxa"/>
               <w:start w:w="120" w:type="dxa"/>
@@ -8393,7 +8085,6 @@
         <w:tc>
           <w:tcPr>
             <w:tcW w:type="dxa" w:w="5060"/>
-            <w:shd w:fill="FAFBFC"/>
             <w:tcMar>
               <w:top w:w="80" w:type="dxa"/>
               <w:start w:w="120" w:type="dxa"/>
@@ -8424,6 +8115,7 @@
         <w:tc>
           <w:tcPr>
             <w:tcW w:type="dxa" w:w="4300"/>
+            <w:shd w:fill="FAFBFC"/>
             <w:tcMar>
               <w:top w:w="80" w:type="dxa"/>
               <w:start w:w="120" w:type="dxa"/>
@@ -8449,6 +8141,7 @@
         <w:tc>
           <w:tcPr>
             <w:tcW w:type="dxa" w:w="5060"/>
+            <w:shd w:fill="FAFBFC"/>
             <w:tcMar>
               <w:top w:w="80" w:type="dxa"/>
               <w:start w:w="120" w:type="dxa"/>
@@ -8479,7 +8172,6 @@
         <w:tc>
           <w:tcPr>
             <w:tcW w:type="dxa" w:w="4300"/>
-            <w:shd w:fill="FAFBFC"/>
             <w:tcMar>
               <w:top w:w="80" w:type="dxa"/>
               <w:start w:w="120" w:type="dxa"/>
@@ -8505,7 +8197,6 @@
         <w:tc>
           <w:tcPr>
             <w:tcW w:type="dxa" w:w="5060"/>
-            <w:shd w:fill="FAFBFC"/>
             <w:tcMar>
               <w:top w:w="80" w:type="dxa"/>
               <w:start w:w="120" w:type="dxa"/>
@@ -8536,6 +8227,7 @@
         <w:tc>
           <w:tcPr>
             <w:tcW w:type="dxa" w:w="4300"/>
+            <w:shd w:fill="FAFBFC"/>
             <w:tcMar>
               <w:top w:w="80" w:type="dxa"/>
               <w:start w:w="120" w:type="dxa"/>
@@ -8561,6 +8253,7 @@
         <w:tc>
           <w:tcPr>
             <w:tcW w:type="dxa" w:w="5060"/>
+            <w:shd w:fill="FAFBFC"/>
             <w:tcMar>
               <w:top w:w="80" w:type="dxa"/>
               <w:start w:w="120" w:type="dxa"/>
@@ -8591,7 +8284,6 @@
         <w:tc>
           <w:tcPr>
             <w:tcW w:type="dxa" w:w="4300"/>
-            <w:shd w:fill="FAFBFC"/>
             <w:tcMar>
               <w:top w:w="80" w:type="dxa"/>
               <w:start w:w="120" w:type="dxa"/>
@@ -8617,7 +8309,6 @@
         <w:tc>
           <w:tcPr>
             <w:tcW w:type="dxa" w:w="5060"/>
-            <w:shd w:fill="FAFBFC"/>
             <w:tcMar>
               <w:top w:w="80" w:type="dxa"/>
               <w:start w:w="120" w:type="dxa"/>
@@ -8648,6 +8339,7 @@
         <w:tc>
           <w:tcPr>
             <w:tcW w:type="dxa" w:w="4300"/>
+            <w:shd w:fill="FAFBFC"/>
             <w:tcMar>
               <w:top w:w="80" w:type="dxa"/>
               <w:start w:w="120" w:type="dxa"/>
@@ -8673,6 +8365,7 @@
         <w:tc>
           <w:tcPr>
             <w:tcW w:type="dxa" w:w="5060"/>
+            <w:shd w:fill="FAFBFC"/>
             <w:tcMar>
               <w:top w:w="80" w:type="dxa"/>
               <w:start w:w="120" w:type="dxa"/>
@@ -8703,7 +8396,6 @@
         <w:tc>
           <w:tcPr>
             <w:tcW w:type="dxa" w:w="4300"/>
-            <w:shd w:fill="FAFBFC"/>
             <w:tcMar>
               <w:top w:w="80" w:type="dxa"/>
               <w:start w:w="120" w:type="dxa"/>
@@ -8729,7 +8421,6 @@
         <w:tc>
           <w:tcPr>
             <w:tcW w:type="dxa" w:w="5060"/>
-            <w:shd w:fill="FAFBFC"/>
             <w:tcMar>
               <w:top w:w="80" w:type="dxa"/>
               <w:start w:w="120" w:type="dxa"/>
@@ -8760,6 +8451,7 @@
         <w:tc>
           <w:tcPr>
             <w:tcW w:type="dxa" w:w="4300"/>
+            <w:shd w:fill="FAFBFC"/>
             <w:tcMar>
               <w:top w:w="80" w:type="dxa"/>
               <w:start w:w="120" w:type="dxa"/>
@@ -8785,6 +8477,7 @@
         <w:tc>
           <w:tcPr>
             <w:tcW w:type="dxa" w:w="5060"/>
+            <w:shd w:fill="FAFBFC"/>
             <w:tcMar>
               <w:top w:w="80" w:type="dxa"/>
               <w:start w:w="120" w:type="dxa"/>
@@ -8815,7 +8508,6 @@
         <w:tc>
           <w:tcPr>
             <w:tcW w:type="dxa" w:w="4300"/>
-            <w:shd w:fill="FAFBFC"/>
             <w:tcMar>
               <w:top w:w="80" w:type="dxa"/>
               <w:start w:w="120" w:type="dxa"/>
@@ -8841,7 +8533,6 @@
         <w:tc>
           <w:tcPr>
             <w:tcW w:type="dxa" w:w="5060"/>
-            <w:shd w:fill="FAFBFC"/>
             <w:tcMar>
               <w:top w:w="80" w:type="dxa"/>
               <w:start w:w="120" w:type="dxa"/>
@@ -8872,6 +8563,7 @@
         <w:tc>
           <w:tcPr>
             <w:tcW w:type="dxa" w:w="4300"/>
+            <w:shd w:fill="FAFBFC"/>
             <w:tcMar>
               <w:top w:w="80" w:type="dxa"/>
               <w:start w:w="120" w:type="dxa"/>
@@ -8897,6 +8589,7 @@
         <w:tc>
           <w:tcPr>
             <w:tcW w:type="dxa" w:w="5060"/>
+            <w:shd w:fill="FAFBFC"/>
             <w:tcMar>
               <w:top w:w="80" w:type="dxa"/>
               <w:start w:w="120" w:type="dxa"/>
@@ -8927,7 +8620,6 @@
         <w:tc>
           <w:tcPr>
             <w:tcW w:type="dxa" w:w="4300"/>
-            <w:shd w:fill="FAFBFC"/>
             <w:tcMar>
               <w:top w:w="80" w:type="dxa"/>
               <w:start w:w="120" w:type="dxa"/>
@@ -8953,7 +8645,6 @@
         <w:tc>
           <w:tcPr>
             <w:tcW w:type="dxa" w:w="5060"/>
-            <w:shd w:fill="FAFBFC"/>
             <w:tcMar>
               <w:top w:w="80" w:type="dxa"/>
               <w:start w:w="120" w:type="dxa"/>
@@ -9072,7 +8763,7 @@
           <w:color w:val="16324F"/>
           <w:sz w:val="21"/>
         </w:rPr>
-        <w:t>FIREWALL_REMOTE_ADDRESS_MISMATCH 같은 코드는 어떤 필드가 안전 기준과 달랐는지만 알려 주며 실제 Viewer 주소나 규칙 원문은 포함하지 않습니다. Windows의 정상적인 IP/32와 IP/255.255.255.255 표기 차이는 자동 처리됩니다. FIREWALL_REMOTE_ACCESS_UNCONFIRMED이면 Agent 설치는 유지되며 Viewer 연결 테스트로 원격 TCP/18443을 확인합니다. 실패하면 코드만 Windows 관리자에게 전달하고, 규칙을 직접 넓혀 우회하지 마세요.</w:t>
+        <w:t>FIREWALL_REMOTE_ADDRESS_MISMATCH 같은 코드는 어떤 필드가 안전 기준과 달랐는지만 알려 주며 실제 주소나 규칙 원문은 포함하지 않습니다. FIREWALL_REMOTE_ACCESS_UNCONFIRMED이면 Agent 설치는 유지되며 Viewer 연결 테스트로 원격 TCP/18443을 확인합니다. 실패하면 코드만 Windows 관리자에게 전달하세요.</w:t>
       </w:r>
     </w:p>
     <w:p>
@@ -9103,7 +8794,7 @@
         <w:rPr>
           <w:rFonts w:ascii="맑은 고딕" w:hAnsi="맑은 고딕" w:eastAsia="맑은 고딕" w:cs="맑은 고딕"/>
         </w:rPr>
-        <w:t>Agent PC에서는 Agent Setup을 다시 열고 검사를 실행합니다. Viewer에서는 Agent 연결 진단을 실행합니다. 두 화면의 단계와 안정 오류 코드만 기록하고 실제 IP, 계정, 비밀번호와 장비 원문은 외부로 전달하지 않습니다.</w:t>
+        <w:t>Agent PC에서는 Windows 서비스에서 Agent 상태를 확인하고 필요하면 Agent Setup을 다시 실행합니다. Viewer에서는 Agent 연결 진단을 실행합니다. 두 화면의 단계와 안정 오류 코드만 기록하고 실제 IP, 계정, 비밀번호와 장비 원문은 외부로 전달하지 않습니다.</w:t>
       </w:r>
     </w:p>
     <w:tbl>
@@ -9237,7 +8928,7 @@
                 <w:rFonts w:ascii="맑은 고딕" w:hAnsi="맑은 고딕" w:eastAsia="맑은 고딕" w:cs="맑은 고딕"/>
                 <w:sz w:val="16"/>
               </w:rPr>
-              <w:t>Agent 연결에 실제 Agent PC 주소를 입력합니다. 동일 PC와 원격 구성 모두 localhost나 스위치 IP를 사용하지 않습니다.</w:t>
+              <w:t>Agent 연결에 Agent PC 주소를 입력합니다. 원격 구성에서는 스위치 IP나 Viewer PC 주소를 사용하지 않습니다.</w:t>
             </w:r>
           </w:p>
         </w:tc>
@@ -9294,7 +8985,7 @@
                 <w:rFonts w:ascii="맑은 고딕" w:hAnsi="맑은 고딕" w:eastAsia="맑은 고딕" w:cs="맑은 고딕"/>
                 <w:sz w:val="16"/>
               </w:rPr>
-              <w:t>Agent Setup의 사전 점검에서 패키지, 서비스, 방화벽과 Agent 준비 상태를 확인합니다.</w:t>
+              <w:t>Agent Setup의 설치/업데이트 결과에서 패키지, 서비스, 방화벽과 Agent 준비 상태를 확인합니다.</w:t>
             </w:r>
           </w:p>
         </w:tc>
@@ -9406,7 +9097,7 @@
                 <w:rFonts w:ascii="맑은 고딕" w:hAnsi="맑은 고딕" w:eastAsia="맑은 고딕" w:cs="맑은 고딕"/>
                 <w:sz w:val="16"/>
               </w:rPr>
-              <w:t>Agent와 Viewer가 같은 PC일 때 테스트는 Agent/API까지만 확인합니다. 스위치와 원격 Viewer 경로는 별도 확인합니다.</w:t>
+              <w:t>Agent 주소에 localhost 또는 해당 PC의 사설 IPv4를 입력해 Agent/API까지만 확인합니다. 스위치와 원격 Viewer 경로는 별도 확인합니다.</w:t>
             </w:r>
           </w:p>
         </w:tc>
@@ -9509,7 +9200,7 @@
         <w:rPr>
           <w:rFonts w:ascii="맑은 고딕" w:hAnsi="맑은 고딕" w:eastAsia="맑은 고딕" w:cs="맑은 고딕"/>
         </w:rPr>
-        <w:t>Agent PC에서 SamsungSwitchWatch.Agent.Setup.exe를 실행합니다. 기존 신원과 유효한 정책은 보존됩니다.</w:t>
+        <w:t>Agent PC에서 SamsungSwitchWatch.Agent.Setup.exe를 실행합니다. 입력 없이 설치/업데이트를 진행합니다.</w:t>
       </w:r>
     </w:p>
     <w:p>
@@ -9568,7 +9259,7 @@
         <w:rPr>
           <w:rFonts w:ascii="맑은 고딕" w:hAnsi="맑은 고딕" w:eastAsia="맑은 고딕" w:cs="맑은 고딕"/>
         </w:rPr>
-        <w:t>서비스와 방화벽을 변경하므로 Agent 제거는 사내 Windows 관리자가 승인된 관리 절차로 수행합니다. 공개 패키지에는 제거 스크립트를 포함하지 않습니다. HTTPS 신원과 %ProgramData% 데이터의 영구 삭제는 Viewer의 신원 변경 경고를 발생시키므로 별도 승인 없이 삭제하지 않습니다.</w:t>
+        <w:t>서비스와 방화벽을 변경하므로 Agent 제거는 사내 Windows 관리자가 승인된 관리 절차로 수행합니다. 공개 패키지에는 제거 스크립트를 포함하지 않습니다. 설치 폴더와 서비스는 별도 승인 없이 수동 삭제하지 않습니다.</w:t>
       </w:r>
     </w:p>
     <w:p>
@@ -9589,7 +9280,7 @@
           <w:color w:val="B42318"/>
           <w:sz w:val="21"/>
         </w:rPr>
-        <w:t xml:space="preserve">데이터 삭제  </w:t>
+        <w:t xml:space="preserve">설치 자료 삭제  </w:t>
       </w:r>
       <w:r>
         <w:rPr>
@@ -9597,7 +9288,7 @@
           <w:color w:val="16324F"/>
           <w:sz w:val="21"/>
         </w:rPr>
-        <w:t>Agent HTTPS 신원과 설치 데이터를 삭제하면 복구할 수 없고 이후 Viewer에서 신원 변경 경고가 발생합니다.</w:t>
+        <w:t>Program Files의 Agent 폴더와 Windows 서비스를 수동 삭제하면 업데이트와 복구가 어려워질 수 있습니다.</w:t>
       </w:r>
     </w:p>
     <w:p>
@@ -9648,7 +9339,7 @@
           <w:rFonts w:ascii="맑은 고딕" w:hAnsi="맑은 고딕" w:eastAsia="맑은 고딕" w:cs="맑은 고딕"/>
           <w:sz w:val="20"/>
         </w:rPr>
-        <w:t>동일 PC 사전 테스트 성공 뒤 원격 Viewer 고정 IPv4를 Setup에 다시 적용하고 원격 PC에서 재검증</w:t>
+        <w:t>동일 PC 연결 확인 뒤 실제 원격 Viewer에서 Agent PC 주소로 다시 연결 확인</w:t>
       </w:r>
     </w:p>
     <w:p>
@@ -9727,7 +9418,7 @@
         <w:color w:val="64748B"/>
         <w:sz w:val="17"/>
       </w:rPr>
-      <w:t xml:space="preserve">v0.10.16-poc  |  </w:t>
+      <w:t xml:space="preserve">v0.11.0-poc  |  </w:t>
     </w:r>
     <w:r>
       <w:rPr>
@@ -9758,7 +9449,7 @@
         <w:color w:val="64748B"/>
         <w:sz w:val="17"/>
       </w:rPr>
-      <w:t>v0.10.16-poc  |  2026-08-04</w:t>
+      <w:t>v0.11.0-poc  |  2026-08-04</w:t>
     </w:r>
   </w:p>
 </w:ftr>

</xml_diff>

<commit_message>
fix: harden Samsung Telnet collection timeouts
</commit_message>
<xml_diff>
--- a/docs/SamsungSwitchWatch_User_Manual_KO.docx
+++ b/docs/SamsungSwitchWatch_User_Manual_KO.docx
@@ -184,6 +184,7 @@
           </w:tcPr>
           <w:p>
             <w:pPr>
+              <w:keepNext/>
               <w:spacing w:before="0" w:after="0" w:line="264" w:lineRule="auto"/>
               <w:jc w:val="center"/>
             </w:pPr>
@@ -212,6 +213,7 @@
           </w:tcPr>
           <w:p>
             <w:pPr>
+              <w:keepNext/>
               <w:spacing w:before="0" w:after="0" w:line="264" w:lineRule="auto"/>
               <w:jc w:val="center"/>
             </w:pPr>
@@ -240,6 +242,7 @@
           </w:tcPr>
           <w:p>
             <w:pPr>
+              <w:keepNext/>
               <w:spacing w:before="0" w:after="0" w:line="264" w:lineRule="auto"/>
               <w:jc w:val="center"/>
             </w:pPr>
@@ -387,7 +390,7 @@
                 <w:rFonts w:ascii="맑은 고딕" w:hAnsi="맑은 고딕" w:eastAsia="맑은 고딕" w:cs="맑은 고딕"/>
                 <w:sz w:val="18"/>
               </w:rPr>
-              <w:t>장비 등록, 접속 시험, show 명령, 주기 감시, 화면 표시</w:t>
+              <w:t>장비 등록, 로그인 확인, show 명령, 주기 감시, 화면 표시</w:t>
             </w:r>
           </w:p>
         </w:tc>
@@ -600,7 +603,7 @@
         <w:rPr>
           <w:rFonts w:ascii="맑은 고딕" w:hAnsi="맑은 고딕" w:eastAsia="맑은 고딕" w:cs="맑은 고딕"/>
         </w:rPr>
-        <w:t>접속 시험이 성공하면 저장하고, 필요할 때 주기 감시를 켭니다.</w:t>
+        <w:t>로그인 확인이 성공하면 저장하고, 수집 진단에서 포트·로그 명령을 확인한 뒤 필요할 때 주기 감시를 켭니다.</w:t>
       </w:r>
     </w:p>
     <w:p>
@@ -675,6 +678,35 @@
           <w:rFonts w:ascii="맑은 고딕" w:hAnsi="맑은 고딕" w:eastAsia="맑은 고딕" w:cs="맑은 고딕"/>
         </w:rPr>
         <w:t>Viewer가 요청할 때마다 Agent는 새 Telnet 세션을 열고 로그인, 필요 시 enable, 명령 실행, 로그아웃 순서로 처리합니다. 한 번의 요청이 끝나면 세션을 닫으므로 장비의 exec-timeout이 5분이어도 유휴 세션을 계속 붙잡지 않습니다.</w:t>
+      </w:r>
+    </w:p>
+    <w:p>
+      <w:pPr>
+        <w:keepLines/>
+        <w:pageBreakBefore w:val="0"/>
+        <w:spacing w:before="80" w:after="160" w:line="283" w:lineRule="auto"/>
+        <w:ind w:left="115" w:right="58"/>
+        <w:shd w:fill="E8EEF5"/>
+        <w:pBdr>
+          <w:left w:val="single" w:sz="16" w:space="8" w:color="2E74B5"/>
+        </w:pBdr>
+      </w:pPr>
+      <w:r>
+        <w:rPr>
+          <w:rFonts w:ascii="맑은 고딕" w:hAnsi="맑은 고딕" w:eastAsia="맑은 고딕" w:cs="맑은 고딕"/>
+          <w:b/>
+          <w:color w:val="2E74B5"/>
+          <w:sz w:val="21"/>
+        </w:rPr>
+        <w:t xml:space="preserve">명령 시간 제한  </w:t>
+      </w:r>
+      <w:r>
+        <w:rPr>
+          <w:rFonts w:ascii="맑은 고딕" w:hAnsi="맑은 고딕" w:eastAsia="맑은 고딕" w:cs="맑은 고딕"/>
+          <w:color w:val="16324F"/>
+          <w:sz w:val="21"/>
+        </w:rPr>
+        <w:t>포트 상태와 시스템 로그는 순차적인 개별 세션으로 수집합니다. 명령 시간 초과·출력 한도는 실패한 항목만 확인 불가로 표시하고 다른 항목을 계속 확인합니다. 명령은 30초 동안 새 응답이 없으면 중단하고, 출력이 계속되어도 전체 90초를 넘기지 않습니다. 같은 실패 명령은 현재 주기에서 즉시 재시도하지 않습니다. 인증·enable·TCP·세션 종료는 반복 로그인을 막기 위해 해당 장비 주기를 중단합니다. 이번 POC의 자동 감시 검증·지원 범위는 등록 장비 10대 이하입니다.</w:t>
       </w:r>
     </w:p>
     <w:p>
@@ -756,6 +788,7 @@
           </w:tcPr>
           <w:p>
             <w:pPr>
+              <w:keepNext/>
               <w:spacing w:before="0" w:after="0" w:line="264" w:lineRule="auto"/>
               <w:jc w:val="center"/>
             </w:pPr>
@@ -784,6 +817,7 @@
           </w:tcPr>
           <w:p>
             <w:pPr>
+              <w:keepNext/>
               <w:spacing w:before="0" w:after="0" w:line="264" w:lineRule="auto"/>
               <w:jc w:val="center"/>
             </w:pPr>
@@ -812,6 +846,7 @@
           </w:tcPr>
           <w:p>
             <w:pPr>
+              <w:keepNext/>
               <w:spacing w:before="0" w:after="0" w:line="264" w:lineRule="auto"/>
               <w:jc w:val="center"/>
             </w:pPr>
@@ -1153,7 +1188,7 @@
           <w:color w:val="16324F"/>
           <w:sz w:val="21"/>
         </w:rPr>
-        <w:t>0.11.0-poc는 코드 서명되지 않은 시험판입니다. 압축을 풀기 전에 Agent와 Viewer ZIP의 SHA-256을 해당 GitHub Release 본문에 표시된 값과 비교하고 사내 보안 반입 절차를 완료하세요. SmartScreen 또는 EDR 경고를 우회하지 않습니다.</w:t>
+        <w:t>0.11.1-poc는 코드 서명되지 않은 시험판입니다. 압축을 풀기 전에 Agent와 Viewer ZIP의 SHA-256을 해당 GitHub Release 본문에 표시된 값과 비교하고 사내 보안 반입 절차를 완료하세요. SmartScreen 또는 EDR 경고를 우회하지 않습니다.</w:t>
       </w:r>
     </w:p>
     <w:p>
@@ -1740,6 +1775,7 @@
           </w:tcPr>
           <w:p>
             <w:pPr>
+              <w:keepNext/>
               <w:spacing w:before="0" w:after="0" w:line="264" w:lineRule="auto"/>
               <w:jc w:val="center"/>
             </w:pPr>
@@ -1768,6 +1804,7 @@
           </w:tcPr>
           <w:p>
             <w:pPr>
+              <w:keepNext/>
               <w:spacing w:before="0" w:after="0" w:line="264" w:lineRule="auto"/>
               <w:jc w:val="center"/>
             </w:pPr>
@@ -2315,7 +2352,7 @@
           <w:color w:val="16324F"/>
           <w:sz w:val="21"/>
         </w:rPr>
-        <w:t>Agent Setup에 AGENT_LOCAL_CONNECTION_UNCONFIRMED 또는 FIREWALL_REMOTE_ACCESS_UNCONFIRMED가 표시되면 Agent 서비스와 프로그램은 설치됐지만 연결 준비를 확인하지 못했다는 뜻입니다. Viewer에서 연결 테스트를 실행하고, TCP/18443이 실패할 때 Windows 관리자에게 확인하세요. 규칙을 AGENT_CONNECTION_REFUSED가 보이면 Viewer에 스위치 IP나 localhost가 아니라 Agent를 설치한 PC의 실제 주소를 입력했는지 먼저 확인하세요. 같은 PC 시험에서는 해당 PC의 사설 IPv4 또는 localhost를 사용할 수 있습니다. 그 다음 Windows 서비스에서 SamsungSwitchWatchAgent가 Running인지 확인하고 TCP/18443을 점검합니다. TCP 단계는 성공하고 HTTPS 단계가 실패하면 방화벽이 아니라 Agent PC의 로컬 HTTPS/TLS 준비 상태를 확인합니다. AGENT_CLIENT_NOT_ALLOWED이면 Viewer 주소가 RFC1918 사설 범위인지 확인합니다. 서비스를 수동 등록하지 말고 0.11.0-poc Agent Setup을 사용하세요.</w:t>
+        <w:t>Agent Setup에 AGENT_LOCAL_CONNECTION_UNCONFIRMED 또는 FIREWALL_REMOTE_ACCESS_UNCONFIRMED가 표시되면 Agent 서비스와 프로그램은 설치됐지만 연결 준비를 확인하지 못했다는 뜻입니다. Viewer에서 연결 테스트를 실행하고, TCP/18443이 실패할 때 Windows 관리자에게 확인하세요. 규칙을 AGENT_CONNECTION_REFUSED가 보이면 Viewer에 스위치 IP나 localhost가 아니라 Agent를 설치한 PC의 실제 주소를 입력했는지 먼저 확인하세요. 같은 PC 시험에서는 해당 PC의 사설 IPv4 또는 localhost를 사용할 수 있습니다. 그 다음 Windows 서비스에서 SamsungSwitchWatchAgent가 Running인지 확인하고 TCP/18443을 점검합니다. TCP 단계는 성공하고 HTTPS 단계가 실패하면 방화벽이 아니라 Agent PC의 로컬 HTTPS/TLS 준비 상태를 확인합니다. AGENT_CLIENT_NOT_ALLOWED이면 Viewer 주소가 RFC1918 사설 범위인지 확인합니다. 서비스를 수동 등록하지 말고 0.11.1-poc Agent Setup을 사용하세요.</w:t>
       </w:r>
     </w:p>
     <w:p>
@@ -2363,7 +2400,7 @@
           <w:color w:val="16324F"/>
           <w:sz w:val="21"/>
         </w:rPr>
-        <w:t>이전 Viewer가 실행 중이면 새 Viewer는 같은 사용자 데이터를 동시에 쓰지 않도록 실행을 차단하고 전환 순서를 표시합니다. 기존 트레이 아이콘에서 '프로그램 종료'를 선택한 뒤 Win+R에서 shell:startup을 열어 'Samsung Switch Watch' 바로 가기를 삭제합니다. 이어 shell:programs에서도 같은 이름의 이전 시작 메뉴 바로 가기를 삭제하고 새 Viewer를 다시 실행하세요. 기존 Agent 연결과 장비 정보는 유지됩니다. 창이 바로 보이지 않으면 알림 영역에서 대시보드를 열고 실행 경로가 새 0.11.0-poc 폴더인지 확인하세요. API v4가 호환되면 Agent와 Viewer의 세부 버전이 달라도 경고만 표시하고 연결됩니다.</w:t>
+        <w:t>이전 Viewer가 실행 중이면 새 Viewer는 같은 사용자 데이터를 동시에 쓰지 않도록 실행을 차단하고 전환 순서를 표시합니다. 기존 트레이 아이콘에서 '프로그램 종료'를 선택한 뒤 Win+R에서 shell:startup을 열어 'Samsung Switch Watch' 바로 가기를 삭제합니다. 이어 shell:programs에서도 같은 이름의 이전 시작 메뉴 바로 가기를 삭제하고 새 Viewer를 다시 실행하세요. 기존 Agent 연결과 장비 정보는 유지됩니다. 창이 바로 보이지 않으면 알림 영역에서 대시보드를 열고 실행 경로가 새 0.11.1-poc 폴더인지 확인하세요. API v4가 호환되면 Agent와 Viewer의 세부 버전이 달라도 경고만 표시하고 연결됩니다.</w:t>
       </w:r>
     </w:p>
     <w:p>
@@ -2463,7 +2500,7 @@
           <w:color w:val="16324F"/>
           <w:sz w:val="21"/>
         </w:rPr>
-        <w:t>0.11.0-poc는 코드 서명되지 않아 SmartScreen이나 사내 EDR이 차단할 수 있습니다. ZIP을 완전히 압축 해제하고 Viewer EXE와 제공된 DLL이 같은 폴더에 있는지 확인하세요. EDR·AppLocker·WDAC가 차단하면 우회하지 말고 공식 ZIP의 버전·해시와 차단 기록을 보안 담당자에게 전달하세요.</w:t>
+        <w:t>0.11.1-poc는 코드 서명되지 않아 SmartScreen이나 사내 EDR이 차단할 수 있습니다. ZIP을 완전히 압축 해제하고 Viewer EXE와 제공된 DLL이 같은 폴더에 있는지 확인하세요. EDR·AppLocker·WDAC가 차단하면 우회하지 말고 공식 ZIP의 버전·해시와 차단 기록을 보안 담당자에게 전달하세요.</w:t>
       </w:r>
     </w:p>
     <w:p>
@@ -2701,13 +2738,13 @@
           <w:color w:val="16324F"/>
           <w:sz w:val="21"/>
         </w:rPr>
-        <w:t>Agent와 Viewer를 같은 PC에 설치했다면 Agent PC 주소에 localhost 또는 해당 PC의 사설 IPv4를 입력하고 일반 연결 확인을 실행합니다. 성공은 Agent 서비스, TCP/18443, HTTPS와 Agent API만 뜻합니다. 스위치 자격 증명과 명령은 사용하지 않으며, 장비는 저장 후 '장비 관리 → 접속 시험'에서 별도로 확인합니다. 실제 원격 배치 전에는 원격 Viewer PC에서 Agent PC 주소로 연결 확인을 다시 실행하세요.</w:t>
+        <w:t>Agent와 Viewer를 같은 PC에 설치했다면 Agent PC 주소에 localhost 또는 해당 PC의 사설 IPv4를 입력하고 일반 연결 확인을 실행합니다. 성공은 Agent 서비스, TCP/18443, HTTPS와 Agent API만 뜻합니다. 스위치 자격 증명과 명령은 사용하지 않으며, 장비는 저장 후 '장비 관리 → 로그인 확인'에서 계정과 프롬프트를 확인하고 수집 진단에서 실제 명령을 확인합니다. 실제 원격 배치 전에는 원격 Viewer PC에서 Agent PC 주소로 연결 확인을 다시 실행하세요.</w:t>
       </w:r>
     </w:p>
     <w:p>
       <w:pPr>
         <w:pStyle w:val="Heading2"/>
-        <w:pageBreakBefore/>
+        <w:pageBreakBefore w:val="0"/>
       </w:pPr>
       <w:r>
         <w:rPr>
@@ -2899,6 +2936,7 @@
           </w:tcPr>
           <w:p>
             <w:pPr>
+              <w:keepNext/>
               <w:spacing w:before="0" w:after="0" w:line="264" w:lineRule="auto"/>
               <w:jc w:val="center"/>
             </w:pPr>
@@ -2927,6 +2965,7 @@
           </w:tcPr>
           <w:p>
             <w:pPr>
+              <w:keepNext/>
               <w:spacing w:before="0" w:after="0" w:line="264" w:lineRule="auto"/>
               <w:jc w:val="center"/>
             </w:pPr>
@@ -2955,6 +2994,7 @@
           </w:tcPr>
           <w:p>
             <w:pPr>
+              <w:keepNext/>
               <w:spacing w:before="0" w:after="0" w:line="264" w:lineRule="auto"/>
               <w:jc w:val="center"/>
             </w:pPr>
@@ -3534,7 +3574,7 @@
                 <w:rFonts w:ascii="맑은 고딕" w:hAnsi="맑은 고딕" w:eastAsia="맑은 고딕" w:cs="맑은 고딕"/>
                 <w:sz w:val="18"/>
               </w:rPr>
-              <w:t>기본값 꺼짐, 접속 시험 성공 후 켤 수 있음</w:t>
+              <w:t>기본값 꺼짐, 로그인 확인 성공 후 켤 수 있음</w:t>
             </w:r>
           </w:p>
         </w:tc>
@@ -3563,7 +3603,7 @@
           <w:color w:val="8A5A00"/>
           <w:sz w:val="21"/>
         </w:rPr>
-        <w:t xml:space="preserve">접속 시험 실패  </w:t>
+        <w:t xml:space="preserve">로그인 확인 실패  </w:t>
       </w:r>
       <w:r>
         <w:rPr>
@@ -3571,7 +3611,7 @@
           <w:color w:val="16324F"/>
           <w:sz w:val="21"/>
         </w:rPr>
-        <w:t>실패한 장비도 저장할 수 있지만 '접속 미확인'으로 표시되고 주기 감시는 강제로 꺼집니다. 주소가 사설 대역인지, ID/PW와 enable 필요 여부를 바로잡은 뒤 다시 시험하세요.</w:t>
+        <w:t>실패한 장비도 저장할 수 있지만 '로그인 미확인'으로 표시되고 주기 감시는 강제로 꺼집니다. 주소가 사설 대역인지, ID/PW와 enable 필요 여부를 바로잡은 뒤 다시 확인하세요. 성공해도 조회 명령까지 검증된 것은 아니므로 수집 진단을 이어서 실행합니다.</w:t>
       </w:r>
     </w:p>
     <w:p>
@@ -3693,6 +3733,7 @@
           </w:tcPr>
           <w:p>
             <w:pPr>
+              <w:keepNext/>
               <w:spacing w:before="0" w:after="0" w:line="264" w:lineRule="auto"/>
               <w:jc w:val="center"/>
             </w:pPr>
@@ -3721,6 +3762,7 @@
           </w:tcPr>
           <w:p>
             <w:pPr>
+              <w:keepNext/>
               <w:spacing w:before="0" w:after="0" w:line="264" w:lineRule="auto"/>
               <w:jc w:val="center"/>
             </w:pPr>
@@ -3749,6 +3791,7 @@
           </w:tcPr>
           <w:p>
             <w:pPr>
+              <w:keepNext/>
               <w:spacing w:before="0" w:after="0" w:line="264" w:lineRule="auto"/>
               <w:jc w:val="center"/>
             </w:pPr>
@@ -4160,6 +4203,7 @@
           </w:tcPr>
           <w:p>
             <w:pPr>
+              <w:keepNext/>
               <w:spacing w:before="0" w:after="0" w:line="264" w:lineRule="auto"/>
               <w:jc w:val="center"/>
             </w:pPr>
@@ -4188,6 +4232,7 @@
           </w:tcPr>
           <w:p>
             <w:pPr>
+              <w:keepNext/>
               <w:spacing w:before="0" w:after="0" w:line="264" w:lineRule="auto"/>
               <w:jc w:val="center"/>
             </w:pPr>
@@ -4216,6 +4261,7 @@
           </w:tcPr>
           <w:p>
             <w:pPr>
+              <w:keepNext/>
               <w:spacing w:before="0" w:after="0" w:line="264" w:lineRule="auto"/>
               <w:jc w:val="center"/>
             </w:pPr>
@@ -4781,6 +4827,7 @@
           </w:tcPr>
           <w:p>
             <w:pPr>
+              <w:keepNext/>
               <w:spacing w:before="0" w:after="0" w:line="264" w:lineRule="auto"/>
               <w:jc w:val="center"/>
             </w:pPr>
@@ -4809,6 +4856,7 @@
           </w:tcPr>
           <w:p>
             <w:pPr>
+              <w:keepNext/>
               <w:spacing w:before="0" w:after="0" w:line="264" w:lineRule="auto"/>
               <w:jc w:val="center"/>
             </w:pPr>
@@ -5172,12 +5220,12 @@
           <w:ilvl w:val="0"/>
           <w:numId w:val="10"/>
         </w:numPr>
-        <w:spacing w:before="0" w:after="120" w:line="300" w:lineRule="auto"/>
+        <w:spacing w:before="0" w:after="80" w:line="283" w:lineRule="auto"/>
       </w:pPr>
       <w:r>
         <w:rPr>
           <w:rFonts w:ascii="맑은 고딕" w:hAnsi="맑은 고딕" w:eastAsia="맑은 고딕" w:cs="맑은 고딕"/>
-          <w:sz w:val="22"/>
+          <w:sz w:val="21"/>
         </w:rPr>
         <w:t>Agent 연결이 끊겼다고 모든 스위치를 Down으로 바꾸지 않습니다. 마지막 상태를 유지하고 '미확인'으로 표시합니다.</w:t>
       </w:r>
@@ -5188,12 +5236,12 @@
           <w:ilvl w:val="0"/>
           <w:numId w:val="10"/>
         </w:numPr>
-        <w:spacing w:before="0" w:after="120" w:line="300" w:lineRule="auto"/>
+        <w:spacing w:before="0" w:after="80" w:line="283" w:lineRule="auto"/>
       </w:pPr>
       <w:r>
         <w:rPr>
           <w:rFonts w:ascii="맑은 고딕" w:hAnsi="맑은 고딕" w:eastAsia="맑은 고딕" w:cs="맑은 고딕"/>
-          <w:sz w:val="22"/>
+          <w:sz w:val="21"/>
         </w:rPr>
         <w:t>이벤트 확인은 복구가 아니며, CSV/JSON 내보내기는 이벤트만 익명화하고 수동 명령 출력은 제외합니다.</w:t>
       </w:r>
@@ -5238,7 +5286,7 @@
       <w:r>
         <w:drawing>
           <wp:inline xmlns:a="http://schemas.openxmlformats.org/drawingml/2006/main" xmlns:pic="http://schemas.openxmlformats.org/drawingml/2006/picture">
-            <wp:extent cx="2971800" cy="1816099"/>
+            <wp:extent cx="2971800" cy="1556656"/>
             <wp:docPr id="8" name="Picture 8" title="항상 위 미니 창" descr="정상, 경고, 장애 수와 최근 문제를 보여 주는 작은 항상 위 창"/>
             <wp:cNvGraphicFramePr>
               <a:graphicFrameLocks noChangeAspect="1"/>
@@ -5259,7 +5307,7 @@
                   <pic:spPr>
                     <a:xfrm>
                       <a:off x="0" y="0"/>
-                      <a:ext cx="2971800" cy="1816099"/>
+                      <a:ext cx="2971800" cy="1556656"/>
                     </a:xfrm>
                     <a:prstGeom prst="rect"/>
                   </pic:spPr>
@@ -5287,7 +5335,7 @@
       <w:r>
         <w:drawing>
           <wp:inline xmlns:a="http://schemas.openxmlformats.org/drawingml/2006/main" xmlns:pic="http://schemas.openxmlformats.org/drawingml/2006/picture">
-            <wp:extent cx="3154680" cy="1296924"/>
+            <wp:extent cx="3154680" cy="1231827"/>
             <wp:docPr id="9" name="Picture 9" title="장애 알림 팝업" descr="데모 업링크 포트 Down 장애와 발생 시각을 보여 주는 알림 팝업"/>
             <wp:cNvGraphicFramePr>
               <a:graphicFrameLocks noChangeAspect="1"/>
@@ -5308,7 +5356,7 @@
                   <pic:spPr>
                     <a:xfrm>
                       <a:off x="0" y="0"/>
-                      <a:ext cx="3154680" cy="1296924"/>
+                      <a:ext cx="3154680" cy="1231827"/>
                     </a:xfrm>
                     <a:prstGeom prst="rect"/>
                   </pic:spPr>
@@ -5465,6 +5513,7 @@
           </w:tcPr>
           <w:p>
             <w:pPr>
+              <w:keepNext/>
               <w:spacing w:before="0" w:after="0" w:line="264" w:lineRule="auto"/>
               <w:jc w:val="center"/>
             </w:pPr>
@@ -5493,6 +5542,7 @@
           </w:tcPr>
           <w:p>
             <w:pPr>
+              <w:keepNext/>
               <w:spacing w:before="0" w:after="0" w:line="264" w:lineRule="auto"/>
               <w:jc w:val="center"/>
             </w:pPr>
@@ -5521,6 +5571,7 @@
           </w:tcPr>
           <w:p>
             <w:pPr>
+              <w:keepNext/>
               <w:spacing w:before="0" w:after="0" w:line="264" w:lineRule="auto"/>
               <w:jc w:val="center"/>
             </w:pPr>
@@ -6330,6 +6381,7 @@
           </w:tcPr>
           <w:p>
             <w:pPr>
+              <w:keepNext/>
               <w:spacing w:before="0" w:after="0" w:line="264" w:lineRule="auto"/>
               <w:jc w:val="center"/>
             </w:pPr>
@@ -6358,6 +6410,7 @@
           </w:tcPr>
           <w:p>
             <w:pPr>
+              <w:keepNext/>
               <w:spacing w:before="0" w:after="0" w:line="264" w:lineRule="auto"/>
               <w:jc w:val="center"/>
             </w:pPr>
@@ -7936,7 +7989,7 @@
                 <w:rFonts w:ascii="맑은 고딕" w:hAnsi="맑은 고딕" w:eastAsia="맑은 고딕" w:cs="맑은 고딕"/>
                 <w:sz w:val="16"/>
               </w:rPr>
-              <w:t>출력 페이징, 장비 부하, 프롬프트 복귀와 세션 시간 확인</w:t>
+              <w:t>30초 무응답 또는 90초 전체 제한. 실패한 수집 항목과 안전한 단계 확인</w:t>
             </w:r>
           </w:p>
         </w:tc>
@@ -8769,7 +8822,7 @@
     <w:p>
       <w:pPr>
         <w:pStyle w:val="Heading2"/>
-        <w:pageBreakBefore w:val="0"/>
+        <w:pageBreakBefore/>
         <w:numPr>
           <w:ilvl w:val="1"/>
           <w:numId w:val="11"/>
@@ -8835,6 +8888,7 @@
           </w:tcPr>
           <w:p>
             <w:pPr>
+              <w:keepNext/>
               <w:spacing w:before="0" w:after="0" w:line="264" w:lineRule="auto"/>
               <w:jc w:val="center"/>
             </w:pPr>
@@ -8863,6 +8917,7 @@
           </w:tcPr>
           <w:p>
             <w:pPr>
+              <w:keepNext/>
               <w:spacing w:before="0" w:after="0" w:line="264" w:lineRule="auto"/>
               <w:jc w:val="center"/>
             </w:pPr>
@@ -9228,7 +9283,7 @@
         <w:rPr>
           <w:rFonts w:ascii="맑은 고딕" w:hAnsi="맑은 고딕" w:eastAsia="맑은 고딕" w:cs="맑은 고딕"/>
         </w:rPr>
-        <w:t>Agent 연결, 장비 목록, 접속 시험, show 명령과 주기 감시를 순서대로 확인합니다.</w:t>
+        <w:t>Agent 연결, 장비 목록, 로그인 확인, 수집 진단, show 명령과 주기 감시를 순서대로 확인합니다.</w:t>
       </w:r>
     </w:p>
     <w:p>
@@ -9355,7 +9410,7 @@
           <w:rFonts w:ascii="맑은 고딕" w:hAnsi="맑은 고딕" w:eastAsia="맑은 고딕" w:cs="맑은 고딕"/>
           <w:sz w:val="20"/>
         </w:rPr>
-        <w:t>계정은 Viewer에만 저장되고 접속 시험 실패 장비의 주기 감시는 꺼지는지 확인</w:t>
+        <w:t>계정은 Viewer에만 저장되고 로그인 확인 실패 장비의 주기 감시는 꺼지는지 확인</w:t>
       </w:r>
     </w:p>
     <w:p>
@@ -9418,7 +9473,7 @@
         <w:color w:val="64748B"/>
         <w:sz w:val="17"/>
       </w:rPr>
-      <w:t xml:space="preserve">v0.11.0-poc  |  </w:t>
+      <w:t xml:space="preserve">v0.11.1-poc  |  </w:t>
     </w:r>
     <w:r>
       <w:rPr>
@@ -9449,7 +9504,7 @@
         <w:color w:val="64748B"/>
         <w:sz w:val="17"/>
       </w:rPr>
-      <w:t>v0.11.0-poc  |  2026-08-04</w:t>
+      <w:t>v0.11.1-poc  |  2026-08-05</w:t>
     </w:r>
   </w:p>
 </w:ftr>

</xml_diff>

<commit_message>
Fix Agent setup filesystem diagnostics
</commit_message>
<xml_diff>
--- a/docs/SamsungSwitchWatch_User_Manual_KO.docx
+++ b/docs/SamsungSwitchWatch_User_Manual_KO.docx
@@ -1188,7 +1188,7 @@
           <w:color w:val="16324F"/>
           <w:sz w:val="21"/>
         </w:rPr>
-        <w:t>0.11.1-poc는 코드 서명되지 않은 시험판입니다. 압축을 풀기 전에 Agent와 Viewer ZIP의 SHA-256을 해당 GitHub Release 본문에 표시된 값과 비교하고 사내 보안 반입 절차를 완료하세요. SmartScreen 또는 EDR 경고를 우회하지 않습니다.</w:t>
+        <w:t>0.11.2-poc는 코드 서명되지 않은 시험판입니다. 압축을 풀기 전에 Agent와 Viewer ZIP의 SHA-256을 해당 GitHub Release 본문에 표시된 값과 비교하고 사내 보안 반입 절차를 완료하세요. SmartScreen 또는 EDR 경고를 우회하지 않습니다.</w:t>
       </w:r>
     </w:p>
     <w:p>
@@ -2352,7 +2352,7 @@
           <w:color w:val="16324F"/>
           <w:sz w:val="21"/>
         </w:rPr>
-        <w:t>Agent Setup에 AGENT_LOCAL_CONNECTION_UNCONFIRMED 또는 FIREWALL_REMOTE_ACCESS_UNCONFIRMED가 표시되면 Agent 서비스와 프로그램은 설치됐지만 연결 준비를 확인하지 못했다는 뜻입니다. Viewer에서 연결 테스트를 실행하고, TCP/18443이 실패할 때 Windows 관리자에게 확인하세요. 규칙을 AGENT_CONNECTION_REFUSED가 보이면 Viewer에 스위치 IP나 localhost가 아니라 Agent를 설치한 PC의 실제 주소를 입력했는지 먼저 확인하세요. 같은 PC 시험에서는 해당 PC의 사설 IPv4 또는 localhost를 사용할 수 있습니다. 그 다음 Windows 서비스에서 SamsungSwitchWatchAgent가 Running인지 확인하고 TCP/18443을 점검합니다. TCP 단계는 성공하고 HTTPS 단계가 실패하면 방화벽이 아니라 Agent PC의 로컬 HTTPS/TLS 준비 상태를 확인합니다. AGENT_CLIENT_NOT_ALLOWED이면 Viewer 주소가 RFC1918 사설 범위인지 확인합니다. 서비스를 수동 등록하지 말고 0.11.1-poc Agent Setup을 사용하세요.</w:t>
+        <w:t>Agent Setup에 AGENT_LOCAL_CONNECTION_UNCONFIRMED 또는 FIREWALL_REMOTE_ACCESS_UNCONFIRMED가 표시되면 Agent 서비스와 프로그램은 설치됐지만 연결 준비를 확인하지 못했다는 뜻입니다. Viewer에서 연결 테스트를 실행하고, TCP/18443이 실패할 때 Windows 관리자에게 확인하세요. 규칙을 AGENT_CONNECTION_REFUSED가 보이면 Viewer에 스위치 IP나 localhost가 아니라 Agent를 설치한 PC의 실제 주소를 입력했는지 먼저 확인하세요. 같은 PC 시험에서는 해당 PC의 사설 IPv4 또는 localhost를 사용할 수 있습니다. 그 다음 Windows 서비스에서 SamsungSwitchWatchAgent가 Running인지 확인하고 TCP/18443을 점검합니다. TCP 단계는 성공하고 HTTPS 단계가 실패하면 방화벽이 아니라 Agent PC의 로컬 HTTPS/TLS 준비 상태를 확인합니다. AGENT_CLIENT_NOT_ALLOWED이면 Viewer 주소가 RFC1918 사설 범위인지 확인합니다. 서비스를 수동 등록하지 말고 0.11.2-poc Agent Setup을 사용하세요.</w:t>
       </w:r>
     </w:p>
     <w:p>
@@ -2400,7 +2400,7 @@
           <w:color w:val="16324F"/>
           <w:sz w:val="21"/>
         </w:rPr>
-        <w:t>이전 Viewer가 실행 중이면 새 Viewer는 같은 사용자 데이터를 동시에 쓰지 않도록 실행을 차단하고 전환 순서를 표시합니다. 기존 트레이 아이콘에서 '프로그램 종료'를 선택한 뒤 Win+R에서 shell:startup을 열어 'Samsung Switch Watch' 바로 가기를 삭제합니다. 이어 shell:programs에서도 같은 이름의 이전 시작 메뉴 바로 가기를 삭제하고 새 Viewer를 다시 실행하세요. 기존 Agent 연결과 장비 정보는 유지됩니다. 창이 바로 보이지 않으면 알림 영역에서 대시보드를 열고 실행 경로가 새 0.11.1-poc 폴더인지 확인하세요. API v4가 호환되면 Agent와 Viewer의 세부 버전이 달라도 경고만 표시하고 연결됩니다.</w:t>
+        <w:t>이전 Viewer가 실행 중이면 새 Viewer는 같은 사용자 데이터를 동시에 쓰지 않도록 실행을 차단하고 전환 순서를 표시합니다. 기존 트레이 아이콘에서 '프로그램 종료'를 선택한 뒤 Win+R에서 shell:startup을 열어 'Samsung Switch Watch' 바로 가기를 삭제합니다. 이어 shell:programs에서도 같은 이름의 이전 시작 메뉴 바로 가기를 삭제하고 새 Viewer를 다시 실행하세요. 기존 Agent 연결과 장비 정보는 유지됩니다. 창이 바로 보이지 않으면 알림 영역에서 대시보드를 열고 실행 경로가 새 0.11.2-poc 폴더인지 확인하세요. API v4가 호환되면 Agent와 Viewer의 세부 버전이 달라도 경고만 표시하고 연결됩니다.</w:t>
       </w:r>
     </w:p>
     <w:p>
@@ -2500,7 +2500,7 @@
           <w:color w:val="16324F"/>
           <w:sz w:val="21"/>
         </w:rPr>
-        <w:t>0.11.1-poc는 코드 서명되지 않아 SmartScreen이나 사내 EDR이 차단할 수 있습니다. ZIP을 완전히 압축 해제하고 Viewer EXE와 제공된 DLL이 같은 폴더에 있는지 확인하세요. EDR·AppLocker·WDAC가 차단하면 우회하지 말고 공식 ZIP의 버전·해시와 차단 기록을 보안 담당자에게 전달하세요.</w:t>
+        <w:t>0.11.2-poc는 코드 서명되지 않아 SmartScreen이나 사내 EDR이 차단할 수 있습니다. ZIP을 완전히 압축 해제하고 Viewer EXE와 제공된 DLL이 같은 폴더에 있는지 확인하세요. EDR·AppLocker·WDAC가 차단하면 우회하지 말고 공식 ZIP의 버전·해시와 차단 기록을 보안 담당자에게 전달하세요.</w:t>
       </w:r>
     </w:p>
     <w:p>
@@ -6955,6 +6955,118 @@
                 <w:rFonts w:ascii="맑은 고딕" w:hAnsi="맑은 고딕" w:eastAsia="맑은 고딕" w:cs="맑은 고딕"/>
                 <w:sz w:val="16"/>
               </w:rPr>
+              <w:t>SETUP_PATH_NOT_WRITABLE</w:t>
+            </w:r>
+          </w:p>
+        </w:tc>
+        <w:tc>
+          <w:tcPr>
+            <w:tcW w:type="dxa" w:w="5060"/>
+            <w:shd w:fill="FAFBFC"/>
+            <w:tcMar>
+              <w:top w:w="80" w:type="dxa"/>
+              <w:start w:w="120" w:type="dxa"/>
+              <w:bottom w:w="80" w:type="dxa"/>
+              <w:end w:w="120" w:type="dxa"/>
+            </w:tcMar>
+            <w:vAlign w:val="center"/>
+          </w:tcPr>
+          <w:p>
+            <w:pPr>
+              <w:spacing w:before="0" w:after="0" w:line="240" w:lineRule="auto"/>
+              <w:jc w:val="left"/>
+            </w:pPr>
+            <w:r>
+              <w:rPr>
+                <w:rFonts w:ascii="맑은 고딕" w:hAnsi="맑은 고딕" w:eastAsia="맑은 고딕" w:cs="맑은 고딕"/>
+                <w:sz w:val="16"/>
+              </w:rPr>
+              <w:t>제품 폴더 권한·파일 상태 확인 실패 → 잠시 후 한 번만 재시도 → 반복되면 지원 코드 전달</w:t>
+            </w:r>
+          </w:p>
+        </w:tc>
+      </w:tr>
+      <w:tr>
+        <w:trPr>
+          <w:cantSplit w:val="true"/>
+        </w:trPr>
+        <w:tc>
+          <w:tcPr>
+            <w:tcW w:type="dxa" w:w="4300"/>
+            <w:tcMar>
+              <w:top w:w="80" w:type="dxa"/>
+              <w:start w:w="120" w:type="dxa"/>
+              <w:bottom w:w="80" w:type="dxa"/>
+              <w:end w:w="120" w:type="dxa"/>
+            </w:tcMar>
+            <w:vAlign w:val="center"/>
+          </w:tcPr>
+          <w:p>
+            <w:pPr>
+              <w:spacing w:before="0" w:after="0" w:line="240" w:lineRule="auto"/>
+              <w:jc w:val="left"/>
+            </w:pPr>
+            <w:r>
+              <w:rPr>
+                <w:rFonts w:ascii="맑은 고딕" w:hAnsi="맑은 고딕" w:eastAsia="맑은 고딕" w:cs="맑은 고딕"/>
+                <w:sz w:val="16"/>
+              </w:rPr>
+              <w:t>SETUP_PATH_INVALID / SETUP_PATH_UNTRUSTED</w:t>
+            </w:r>
+          </w:p>
+        </w:tc>
+        <w:tc>
+          <w:tcPr>
+            <w:tcW w:type="dxa" w:w="5060"/>
+            <w:tcMar>
+              <w:top w:w="80" w:type="dxa"/>
+              <w:start w:w="120" w:type="dxa"/>
+              <w:bottom w:w="80" w:type="dxa"/>
+              <w:end w:w="120" w:type="dxa"/>
+            </w:tcMar>
+            <w:vAlign w:val="center"/>
+          </w:tcPr>
+          <w:p>
+            <w:pPr>
+              <w:spacing w:before="0" w:after="0" w:line="240" w:lineRule="auto"/>
+              <w:jc w:val="left"/>
+            </w:pPr>
+            <w:r>
+              <w:rPr>
+                <w:rFonts w:ascii="맑은 고딕" w:hAnsi="맑은 고딕" w:eastAsia="맑은 고딕" w:cs="맑은 고딕"/>
+                <w:sz w:val="16"/>
+              </w:rPr>
+              <w:t>반복 설치와 폴더·ACL 수동 변경 중지 → 지원 코드 전달</w:t>
+            </w:r>
+          </w:p>
+        </w:tc>
+      </w:tr>
+      <w:tr>
+        <w:trPr>
+          <w:cantSplit w:val="true"/>
+        </w:trPr>
+        <w:tc>
+          <w:tcPr>
+            <w:tcW w:type="dxa" w:w="4300"/>
+            <w:shd w:fill="FAFBFC"/>
+            <w:tcMar>
+              <w:top w:w="80" w:type="dxa"/>
+              <w:start w:w="120" w:type="dxa"/>
+              <w:bottom w:w="80" w:type="dxa"/>
+              <w:end w:w="120" w:type="dxa"/>
+            </w:tcMar>
+            <w:vAlign w:val="center"/>
+          </w:tcPr>
+          <w:p>
+            <w:pPr>
+              <w:spacing w:before="0" w:after="0" w:line="240" w:lineRule="auto"/>
+              <w:jc w:val="left"/>
+            </w:pPr>
+            <w:r>
+              <w:rPr>
+                <w:rFonts w:ascii="맑은 고딕" w:hAnsi="맑은 고딕" w:eastAsia="맑은 고딕" w:cs="맑은 고딕"/>
+                <w:sz w:val="16"/>
+              </w:rPr>
               <w:t>FIREWALL_OVERLAP_PROTECTED</w:t>
             </w:r>
           </w:p>
@@ -8753,7 +8865,7 @@
           <w:color w:val="16324F"/>
           <w:sz w:val="21"/>
         </w:rPr>
-        <w:t>SETUP_PATH_INVALID는 활성 install/data 트리의 소유권 또는 junction·symlink 검사가 실패했다는 뜻입니다. DataDirectory는 정확히 %ProgramData%\SamsungSwitchWatch만 허용하고 신규 설치의 빈 선점 폴더도 거부합니다. 폴더와 설치 이력을 보존한 채 사내 Windows 관리자에게 확인하세요.</w:t>
+        <w:t>SETUP_PATH_NOT_WRITABLE은 기존 Agent 제품 폴더의 권한 또는 파일 상태를 확인하지 못했다는 뜻이며 로컬 HTTPS나 방화벽 오류가 아닙니다. 잠시 후 한 번만 재시도하고 반복되면 지원 코드만 전달하세요. SETUP_PATH_INVALID는 경로 형식 오류, SETUP_PATH_UNTRUSTED는 소유권 또는 junction·symlink 신뢰 검사 실패입니다. 어떤 경우에도 제품 폴더와 ACL을 수동으로 삭제·변경하지 마세요.</w:t>
       </w:r>
     </w:p>
     <w:p>
@@ -9473,7 +9585,7 @@
         <w:color w:val="64748B"/>
         <w:sz w:val="17"/>
       </w:rPr>
-      <w:t xml:space="preserve">v0.11.1-poc  |  </w:t>
+      <w:t xml:space="preserve">v0.11.2-poc  |  </w:t>
     </w:r>
     <w:r>
       <w:rPr>
@@ -9504,7 +9616,7 @@
         <w:color w:val="64748B"/>
         <w:sz w:val="17"/>
       </w:rPr>
-      <w:t>v0.11.1-poc  |  2026-08-05</w:t>
+      <w:t>v0.11.2-poc  |  2026-08-05</w:t>
     </w:r>
   </w:p>
 </w:ftr>

</xml_diff>

<commit_message>
Fix Agent setup service diagnostics and recovery
</commit_message>
<xml_diff>
--- a/docs/SamsungSwitchWatch_User_Manual_KO.docx
+++ b/docs/SamsungSwitchWatch_User_Manual_KO.docx
@@ -1188,7 +1188,7 @@
           <w:color w:val="16324F"/>
           <w:sz w:val="21"/>
         </w:rPr>
-        <w:t>0.11.2-poc는 코드 서명되지 않은 시험판입니다. 압축을 풀기 전에 Agent와 Viewer ZIP의 SHA-256을 해당 GitHub Release 본문에 표시된 값과 비교하고 사내 보안 반입 절차를 완료하세요. SmartScreen 또는 EDR 경고를 우회하지 않습니다.</w:t>
+        <w:t>0.11.3-poc는 코드 서명되지 않은 시험판입니다. 압축을 풀기 전에 Agent와 Viewer ZIP의 SHA-256을 해당 GitHub Release 본문에 표시된 값과 비교하고 사내 보안 반입 절차를 완료하세요. SmartScreen 또는 EDR 경고를 우회하지 않습니다.</w:t>
       </w:r>
     </w:p>
     <w:p>
@@ -1677,6 +1677,35 @@
           <w:sz w:val="21"/>
         </w:rPr>
         <w:t>Setup은 BUILD-MANIFEST.json과 Agent 실행 파일 SHA-256을 확인하고, Program Files의 임시 staging에 복사한 파일을 다시 검사한 뒤 교체합니다. 패키지·파일·서비스 변경 자체가 실패한 경우에만 설치 전 상태로 되돌리기를 시도합니다. 서비스가 설치·시작된 뒤 로컬 HTTPS/API/버전 또는 방화벽 준비 상태를 확인하지 못한 경우에는 설치를 되돌리지 않고 AGENT_LOCAL_CONNECTION_UNCONFIRMED 경고로 남깁니다. 다음 실행에서 완료되지 않은 journal이 남아 있으면 자동 복구하지 않고 별도의 '이전 상태 복구' 작업을 요구합니다. 검사 중에는 현재 서비스 PID와 TCP/18443 소유를 매번 다시 확인합니다. rollback 전에는 관찰한 서비스 프로세스 종료를 확인하고 프로그램 폴더의 일시적 잠금만 최대 5회 제한적으로 재시도합니다. staging·backup·failed·journal 정리가 잠시 실패하면 정확히 검증된 대상만 최대 3회 시도하고 실패한 시도 사이 250ms 대기한 뒤 삭제 결과를 확인합니다. 변경 자체의 복구까지 실패하면 최초 설치 실패 코드를 별도로 유지하고 SETUP_ROLLBACK_FAILED와 실패한 ROLLBACK_* 단계를 함께 표시합니다.</w:t>
+      </w:r>
+    </w:p>
+    <w:p>
+      <w:pPr>
+        <w:keepLines/>
+        <w:pageBreakBefore w:val="0"/>
+        <w:spacing w:before="80" w:after="160" w:line="283" w:lineRule="auto"/>
+        <w:ind w:left="115" w:right="58"/>
+        <w:shd w:fill="E8EEF5"/>
+        <w:pBdr>
+          <w:left w:val="single" w:sz="16" w:space="8" w:color="2E74B5"/>
+        </w:pBdr>
+      </w:pPr>
+      <w:r>
+        <w:rPr>
+          <w:rFonts w:ascii="맑은 고딕" w:hAnsi="맑은 고딕" w:eastAsia="맑은 고딕" w:cs="맑은 고딕"/>
+          <w:b/>
+          <w:color w:val="2E74B5"/>
+          <w:sz w:val="21"/>
+        </w:rPr>
+        <w:t xml:space="preserve">서비스 조회는 한 번만 짧게 재시도  </w:t>
+      </w:r>
+      <w:r>
+        <w:rPr>
+          <w:rFonts w:ascii="맑은 고딕" w:hAnsi="맑은 고딕" w:eastAsia="맑은 고딕" w:cs="맑은 고딕"/>
+          <w:color w:val="16324F"/>
+          <w:sz w:val="21"/>
+        </w:rPr>
+        <w:t>설치/업데이트는 별도 사전 점검과 배포에서 같은 서비스 정보를 중복 조회하지 않습니다. 초기 조회가 일시적으로 실패하면 200ms 뒤 한 번만 다시 확인합니다. 계속 실패하면 파일·서비스·방화벽 변경 전에 SETUP_SERVICE_FAILED로 중단합니다. 기존 서비스의 보안 설명자만 읽을 수 없는 경우에는 조회 가능한 구성과 상태로 설치를 계속하되 기존 DACL은 변경하지 않습니다. 설명자를 확보한 경우에만 새 제한 DACL을 적용하고 실패 시 복원합니다.</w:t>
       </w:r>
     </w:p>
     <w:p>
@@ -2314,7 +2343,7 @@
     <w:p>
       <w:pPr>
         <w:pStyle w:val="Heading2"/>
-        <w:pageBreakBefore/>
+        <w:pageBreakBefore w:val="0"/>
       </w:pPr>
       <w:r>
         <w:rPr>
@@ -2352,7 +2381,7 @@
           <w:color w:val="16324F"/>
           <w:sz w:val="21"/>
         </w:rPr>
-        <w:t>Agent Setup에 AGENT_LOCAL_CONNECTION_UNCONFIRMED 또는 FIREWALL_REMOTE_ACCESS_UNCONFIRMED가 표시되면 Agent 서비스와 프로그램은 설치됐지만 연결 준비를 확인하지 못했다는 뜻입니다. Viewer에서 연결 테스트를 실행하고, TCP/18443이 실패할 때 Windows 관리자에게 확인하세요. 규칙을 AGENT_CONNECTION_REFUSED가 보이면 Viewer에 스위치 IP나 localhost가 아니라 Agent를 설치한 PC의 실제 주소를 입력했는지 먼저 확인하세요. 같은 PC 시험에서는 해당 PC의 사설 IPv4 또는 localhost를 사용할 수 있습니다. 그 다음 Windows 서비스에서 SamsungSwitchWatchAgent가 Running인지 확인하고 TCP/18443을 점검합니다. TCP 단계는 성공하고 HTTPS 단계가 실패하면 방화벽이 아니라 Agent PC의 로컬 HTTPS/TLS 준비 상태를 확인합니다. AGENT_CLIENT_NOT_ALLOWED이면 Viewer 주소가 RFC1918 사설 범위인지 확인합니다. 서비스를 수동 등록하지 말고 0.11.2-poc Agent Setup을 사용하세요.</w:t>
+        <w:t>Agent Setup에 AGENT_LOCAL_CONNECTION_UNCONFIRMED 또는 FIREWALL_REMOTE_ACCESS_UNCONFIRMED가 표시되면 Agent 서비스와 프로그램은 설치됐지만 연결 준비를 확인하지 못했다는 뜻입니다. Viewer에서 연결 테스트를 실행하고, TCP/18443이 실패할 때 Windows 관리자에게 확인하세요. 규칙을 AGENT_CONNECTION_REFUSED가 보이면 Viewer에 스위치 IP나 localhost가 아니라 Agent를 설치한 PC의 실제 주소를 입력했는지 먼저 확인하세요. 같은 PC 시험에서는 해당 PC의 사설 IPv4 또는 localhost를 사용할 수 있습니다. 그 다음 Windows 서비스에서 SamsungSwitchWatchAgent가 Running인지 확인하고 TCP/18443을 점검합니다. TCP 단계는 성공하고 HTTPS 단계가 실패하면 방화벽이 아니라 Agent PC의 로컬 HTTPS/TLS 준비 상태를 확인합니다. AGENT_CLIENT_NOT_ALLOWED이면 Viewer 주소가 RFC1918 사설 범위인지 확인합니다. 서비스를 수동 등록하지 말고 0.11.3-poc Agent Setup을 사용하세요.</w:t>
       </w:r>
     </w:p>
     <w:p>
@@ -2400,7 +2429,7 @@
           <w:color w:val="16324F"/>
           <w:sz w:val="21"/>
         </w:rPr>
-        <w:t>이전 Viewer가 실행 중이면 새 Viewer는 같은 사용자 데이터를 동시에 쓰지 않도록 실행을 차단하고 전환 순서를 표시합니다. 기존 트레이 아이콘에서 '프로그램 종료'를 선택한 뒤 Win+R에서 shell:startup을 열어 'Samsung Switch Watch' 바로 가기를 삭제합니다. 이어 shell:programs에서도 같은 이름의 이전 시작 메뉴 바로 가기를 삭제하고 새 Viewer를 다시 실행하세요. 기존 Agent 연결과 장비 정보는 유지됩니다. 창이 바로 보이지 않으면 알림 영역에서 대시보드를 열고 실행 경로가 새 0.11.2-poc 폴더인지 확인하세요. API v4가 호환되면 Agent와 Viewer의 세부 버전이 달라도 경고만 표시하고 연결됩니다.</w:t>
+        <w:t>이전 Viewer가 실행 중이면 새 Viewer는 같은 사용자 데이터를 동시에 쓰지 않도록 실행을 차단하고 전환 순서를 표시합니다. 기존 트레이 아이콘에서 '프로그램 종료'를 선택한 뒤 Win+R에서 shell:startup을 열어 'Samsung Switch Watch' 바로 가기를 삭제합니다. 이어 shell:programs에서도 같은 이름의 이전 시작 메뉴 바로 가기를 삭제하고 새 Viewer를 다시 실행하세요. 기존 Agent 연결과 장비 정보는 유지됩니다. 창이 바로 보이지 않으면 알림 영역에서 대시보드를 열고 실행 경로가 새 0.11.3-poc 폴더인지 확인하세요. API v4가 호환되면 Agent와 Viewer의 세부 버전이 달라도 경고만 표시하고 연결됩니다.</w:t>
       </w:r>
     </w:p>
     <w:p>
@@ -2500,7 +2529,7 @@
           <w:color w:val="16324F"/>
           <w:sz w:val="21"/>
         </w:rPr>
-        <w:t>0.11.2-poc는 코드 서명되지 않아 SmartScreen이나 사내 EDR이 차단할 수 있습니다. ZIP을 완전히 압축 해제하고 Viewer EXE와 제공된 DLL이 같은 폴더에 있는지 확인하세요. EDR·AppLocker·WDAC가 차단하면 우회하지 말고 공식 ZIP의 버전·해시와 차단 기록을 보안 담당자에게 전달하세요.</w:t>
+        <w:t>0.11.3-poc는 코드 서명되지 않아 SmartScreen이나 사내 EDR이 차단할 수 있습니다. ZIP을 완전히 압축 해제하고 Viewer EXE와 제공된 DLL이 같은 폴더에 있는지 확인하세요. EDR·AppLocker·WDAC가 차단하면 우회하지 말고 공식 ZIP의 버전·해시와 차단 기록을 보안 담당자에게 전달하세요.</w:t>
       </w:r>
     </w:p>
     <w:p>
@@ -9585,7 +9614,7 @@
         <w:color w:val="64748B"/>
         <w:sz w:val="17"/>
       </w:rPr>
-      <w:t xml:space="preserve">v0.11.2-poc  |  </w:t>
+      <w:t xml:space="preserve">v0.11.3-poc  |  </w:t>
     </w:r>
     <w:r>
       <w:rPr>
@@ -9616,7 +9645,7 @@
         <w:color w:val="64748B"/>
         <w:sz w:val="17"/>
       </w:rPr>
-      <w:t>v0.11.2-poc  |  2026-08-05</w:t>
+      <w:t>v0.11.3-poc  |  2026-08-05</w:t>
     </w:r>
   </w:p>
 </w:ftr>

</xml_diff>

<commit_message>
feat(viewer): add native per-user setup
</commit_message>
<xml_diff>
--- a/docs/SamsungSwitchWatch_User_Manual_KO.docx
+++ b/docs/SamsungSwitchWatch_User_Manual_KO.docx
@@ -561,7 +561,7 @@
         <w:rPr>
           <w:rFonts w:ascii="맑은 고딕" w:hAnsi="맑은 고딕" w:eastAsia="맑은 고딕" w:cs="맑은 고딕"/>
         </w:rPr>
-        <w:t>Viewer PC에서 Viewer ZIP을 풀고 SamsungSwitchWatch.Viewer.exe를 직접 실행합니다.</w:t>
+        <w:t>Viewer PC에서 Viewer ZIP을 풀고 SamsungSwitchWatch.Viewer.Setup.exe로 사용자 전용 설치를 진행합니다.</w:t>
       </w:r>
     </w:p>
     <w:p>
@@ -589,7 +589,7 @@
         <w:rPr>
           <w:rFonts w:ascii="맑은 고딕" w:hAnsi="맑은 고딕" w:eastAsia="맑은 고딕" w:cs="맑은 고딕"/>
         </w:rPr>
-        <w:t>장비 관리에서 장비명, 모델, IPv4, ID, 로그인 PW, 선택 사항인 enable PW를 입력합니다.</w:t>
+        <w:t>장비 관리에서 장비명, IPv4, ID, 로그인 PW, 선택 사항인 enable PW를 입력합니다. 모델은 장비 응답에서 자동 판별합니다.</w:t>
       </w:r>
     </w:p>
     <w:p>
@@ -617,36 +617,7 @@
         <w:rPr>
           <w:rFonts w:ascii="맑은 고딕" w:hAnsi="맑은 고딕" w:eastAsia="맑은 고딕" w:cs="맑은 고딕"/>
         </w:rPr>
-        <w:t>대시보드의 장비 명령 탭에서 한 줄 show 명령을 실행하고 결과를 확인합니다.</w:t>
-      </w:r>
-    </w:p>
-    <w:p>
-      <w:pPr>
-        <w:keepLines/>
-        <w:pageBreakBefore w:val="0"/>
-        <w:spacing w:before="80" w:after="160" w:line="283" w:lineRule="auto"/>
-        <w:ind w:left="115" w:right="58"/>
-        <w:shd w:fill="FFF8E8"/>
-        <w:pBdr>
-          <w:left w:val="single" w:sz="16" w:space="8" w:color="8A5A00"/>
-        </w:pBdr>
-      </w:pPr>
-      <w:r>
-        <w:rPr>
-          <w:rFonts w:ascii="맑은 고딕" w:hAnsi="맑은 고딕" w:eastAsia="맑은 고딕" w:cs="맑은 고딕"/>
-          <w:b/>
-          <w:color w:val="8A5A00"/>
-          <w:sz w:val="21"/>
-        </w:rPr>
-        <w:t xml:space="preserve">중요  </w:t>
-      </w:r>
-      <w:r>
-        <w:rPr>
-          <w:rFonts w:ascii="맑은 고딕" w:hAnsi="맑은 고딕" w:eastAsia="맑은 고딕" w:cs="맑은 고딕"/>
-          <w:color w:val="16324F"/>
-          <w:sz w:val="21"/>
-        </w:rPr>
-        <w:t>Viewer가 종료되면 주기 감시도 중단됩니다. Agent만 실행 중이라고 감시가 계속되는 구조가 아닙니다.</w:t>
+        <w:t>대시보드의 장비 명령 탭에서 한 줄 show 명령을 실행하고 결과를 확인합니다. Viewer를 종료하면 주기 감시도 함께 중단됩니다.</w:t>
       </w:r>
     </w:p>
     <w:p>
@@ -1092,7 +1063,7 @@
           <w:rFonts w:ascii="맑은 고딕" w:hAnsi="맑은 고딕" w:eastAsia="맑은 고딕" w:cs="맑은 고딕"/>
           <w:sz w:val="22"/>
         </w:rPr>
-        <w:t>Viewer는 압축 해제한 폴더에서 포터블로 실행하며, 현재 Windows 사용자 범위에서만 계정을 복호화합니다.</w:t>
+        <w:t>Viewer는 현재 사용자 LocalAppData의 고정 경로에 설치하며, 현재 Windows 사용자 범위에서만 계정을 복호화합니다.</w:t>
       </w:r>
     </w:p>
     <w:p>
@@ -1188,7 +1159,7 @@
           <w:color w:val="16324F"/>
           <w:sz w:val="21"/>
         </w:rPr>
-        <w:t>0.11.3-poc는 코드 서명되지 않은 시험판입니다. 압축을 풀기 전에 Agent와 Viewer ZIP의 SHA-256을 해당 GitHub Release 본문에 표시된 값과 비교하고 사내 보안 반입 절차를 완료하세요. SmartScreen 또는 EDR 경고를 우회하지 않습니다.</w:t>
+        <w:t>0.11.4-poc는 코드 서명되지 않은 시험판입니다. 압축을 풀기 전에 Agent와 Viewer ZIP의 SHA-256을 해당 GitHub Release 본문에 표시된 값과 비교하고 사내 보안 반입 절차를 완료하세요. SmartScreen 또는 EDR 경고를 우회하지 않습니다.</w:t>
       </w:r>
     </w:p>
     <w:p>
@@ -2381,7 +2352,7 @@
           <w:color w:val="16324F"/>
           <w:sz w:val="21"/>
         </w:rPr>
-        <w:t>Agent Setup에 AGENT_LOCAL_CONNECTION_UNCONFIRMED 또는 FIREWALL_REMOTE_ACCESS_UNCONFIRMED가 표시되면 Agent 서비스와 프로그램은 설치됐지만 연결 준비를 확인하지 못했다는 뜻입니다. Viewer에서 연결 테스트를 실행하고, TCP/18443이 실패할 때 Windows 관리자에게 확인하세요. 규칙을 AGENT_CONNECTION_REFUSED가 보이면 Viewer에 스위치 IP나 localhost가 아니라 Agent를 설치한 PC의 실제 주소를 입력했는지 먼저 확인하세요. 같은 PC 시험에서는 해당 PC의 사설 IPv4 또는 localhost를 사용할 수 있습니다. 그 다음 Windows 서비스에서 SamsungSwitchWatchAgent가 Running인지 확인하고 TCP/18443을 점검합니다. TCP 단계는 성공하고 HTTPS 단계가 실패하면 방화벽이 아니라 Agent PC의 로컬 HTTPS/TLS 준비 상태를 확인합니다. AGENT_CLIENT_NOT_ALLOWED이면 Viewer 주소가 RFC1918 사설 범위인지 확인합니다. 서비스를 수동 등록하지 말고 0.11.3-poc Agent Setup을 사용하세요.</w:t>
+        <w:t>Agent Setup에 AGENT_LOCAL_CONNECTION_UNCONFIRMED 또는 FIREWALL_REMOTE_ACCESS_UNCONFIRMED가 표시되면 Agent 서비스와 프로그램은 설치됐지만 연결 준비를 확인하지 못했다는 뜻입니다. Viewer에서 연결 테스트를 실행하고, TCP/18443이 실패할 때 Windows 관리자에게 확인하세요. 규칙을 AGENT_CONNECTION_REFUSED가 보이면 Viewer에 스위치 IP나 localhost가 아니라 Agent를 설치한 PC의 실제 주소를 입력했는지 먼저 확인하세요. 같은 PC 시험에서는 해당 PC의 사설 IPv4 또는 localhost를 사용할 수 있습니다. 그 다음 Windows 서비스에서 SamsungSwitchWatchAgent가 Running인지 확인하고 TCP/18443을 점검합니다. TCP 단계는 성공하고 HTTPS 단계가 실패하면 방화벽이 아니라 Agent PC의 로컬 HTTPS/TLS 준비 상태를 확인합니다. AGENT_CLIENT_NOT_ALLOWED이면 Viewer 주소가 RFC1918 사설 범위인지 확인합니다. 서비스를 수동 등록하지 말고 0.11.4-poc Agent Setup을 사용하세요.</w:t>
       </w:r>
     </w:p>
     <w:p>
@@ -2400,7 +2371,7 @@
           <w:color w:val="2E74B5"/>
           <w:sz w:val="26"/>
         </w:rPr>
-        <w:t>Viewer 실행</w:t>
+        <w:t>Viewer 설치와 실행</w:t>
       </w:r>
     </w:p>
     <w:p>
@@ -2421,7 +2392,7 @@
           <w:color w:val="8A5A00"/>
           <w:sz w:val="21"/>
         </w:rPr>
-        <w:t xml:space="preserve">0.9 설치형 Viewer에서 전환  </w:t>
+        <w:t xml:space="preserve">처음 전환할 때  </w:t>
       </w:r>
       <w:r>
         <w:rPr>
@@ -2429,7 +2400,7 @@
           <w:color w:val="16324F"/>
           <w:sz w:val="21"/>
         </w:rPr>
-        <w:t>이전 Viewer가 실행 중이면 새 Viewer는 같은 사용자 데이터를 동시에 쓰지 않도록 실행을 차단하고 전환 순서를 표시합니다. 기존 트레이 아이콘에서 '프로그램 종료'를 선택한 뒤 Win+R에서 shell:startup을 열어 'Samsung Switch Watch' 바로 가기를 삭제합니다. 이어 shell:programs에서도 같은 이름의 이전 시작 메뉴 바로 가기를 삭제하고 새 Viewer를 다시 실행하세요. 기존 Agent 연결과 장비 정보는 유지됩니다. 창이 바로 보이지 않으면 알림 영역에서 대시보드를 열고 실행 경로가 새 0.11.3-poc 폴더인지 확인하세요. API v4가 호환되면 Agent와 Viewer의 세부 버전이 달라도 경고만 표시하고 연결됩니다.</w:t>
+        <w:t>0.11.4 이후 Viewer가 실행 중이면 Setup이 저장·정리 종료를 요청하고 실제 종료를 확인한 뒤 진행합니다. 0.11.3 포터블 Viewer는 새 요청을 이해하지 못하므로 첫 전환 때 Setup이 수동 종료를 안내할 수 있습니다. Setup은 프로세스를 강제로 종료하지 않습니다. 기존 Agent 연결과 장비 정보는 그대로 유지됩니다. API v4가 호환되면 Agent와 Viewer의 세부 버전이 달라도 경고만 표시하고 연결됩니다.</w:t>
       </w:r>
     </w:p>
     <w:p>
@@ -2443,7 +2414,7 @@
         <w:rPr>
           <w:rFonts w:ascii="맑은 고딕" w:hAnsi="맑은 고딕" w:eastAsia="맑은 고딕" w:cs="맑은 고딕"/>
         </w:rPr>
-        <w:t>Viewer 릴리스 ZIP을 운영자 PC에서 계속 사용할 로컬 폴더에 압축 해제합니다.</w:t>
+        <w:t>Viewer 릴리스 ZIP을 운영자 PC의 로컬 임시 폴더에 완전히 압축 해제합니다.</w:t>
       </w:r>
     </w:p>
     <w:p>
@@ -2457,7 +2428,7 @@
         <w:rPr>
           <w:rFonts w:ascii="맑은 고딕" w:hAnsi="맑은 고딕" w:eastAsia="맑은 고딕" w:cs="맑은 고딕"/>
         </w:rPr>
-        <w:t>SamsungSwitchWatch.Viewer.exe를 더블클릭합니다.</w:t>
+        <w:t>SamsungSwitchWatch.Viewer.Setup.exe를 실행하고 '설치 / 업데이트'를 누릅니다.</w:t>
       </w:r>
     </w:p>
     <w:p>
@@ -2471,7 +2442,21 @@
         <w:rPr>
           <w:rFonts w:ascii="맑은 고딕" w:hAnsi="맑은 고딕" w:eastAsia="맑은 고딕" w:cs="맑은 고딕"/>
         </w:rPr>
-        <w:t>Viewer는 일반 사용자 권한으로 실행하며 설치, UAC와 Windows 로그인 자동 시작을 수행하지 않습니다.</w:t>
+        <w:t>UAC 없이 사용자 전용 고정 경로에 설치하고 Viewer를 자동 실행해 정상 실행 유지를 확인합니다.</w:t>
+      </w:r>
+    </w:p>
+    <w:p>
+      <w:pPr>
+        <w:numPr>
+          <w:ilvl w:val="0"/>
+          <w:numId w:val="14"/>
+        </w:numPr>
+      </w:pPr>
+      <w:r>
+        <w:rPr>
+          <w:rFonts w:ascii="맑은 고딕" w:hAnsi="맑은 고딕" w:eastAsia="맑은 고딕" w:cs="맑은 고딕"/>
+        </w:rPr>
+        <w:t>설치가 성공하면 ZIP을 압축 해제한 임시 폴더는 삭제해도 됩니다. Windows 로그인 자동 시작은 등록하지 않습니다.</w:t>
       </w:r>
     </w:p>
     <w:p>
@@ -2500,7 +2485,7 @@
           <w:color w:val="16324F"/>
           <w:sz w:val="21"/>
         </w:rPr>
-        <w:t>Viewer는 압축 해제한 폴더에서 실행합니다. 장비 목록, DPAPI 자격 증명, 감시 이력과 화면 설정은 %LOCALAPPDATA%\SamsungSwitchWatch에 보존됩니다. Viewer 폴더를 교체해도 자료는 유지되지만 문제 재현과 지원을 단순하게 하려면 Agent와 같은 Release 사용을 권장합니다. API v4가 호환되면 세부 버전이 달라도 연결은 유지되고 경고만 표시됩니다.</w:t>
+        <w:t>Viewer 프로그램은 %LOCALAPPDATA%\Programs\SamsungSwitchWatch\Viewer에 설치합니다. 장비 목록, DPAPI 자격 증명, 감시 이력과 화면 설정은 별도 데이터 경로인 %LOCALAPPDATA%\SamsungSwitchWatch에 보존됩니다. Viewer를 업데이트해도 자료는 유지되지만 문제 재현과 지원을 단순하게 하려면 Agent와 같은 Release 사용을 권장합니다. API v4가 호환되면 세부 버전이 달라도 연결은 유지되고 경고만 표시됩니다.</w:t>
       </w:r>
     </w:p>
     <w:p>
@@ -2521,7 +2506,7 @@
           <w:color w:val="B42318"/>
           <w:sz w:val="21"/>
         </w:rPr>
-        <w:t xml:space="preserve">Viewer가 실행되지 않는 경우  </w:t>
+        <w:t xml:space="preserve">Viewer Setup 또는 Viewer가 실행되지 않는 경우  </w:t>
       </w:r>
       <w:r>
         <w:rPr>
@@ -2529,7 +2514,7 @@
           <w:color w:val="16324F"/>
           <w:sz w:val="21"/>
         </w:rPr>
-        <w:t>0.11.3-poc는 코드 서명되지 않아 SmartScreen이나 사내 EDR이 차단할 수 있습니다. ZIP을 완전히 압축 해제하고 Viewer EXE와 제공된 DLL이 같은 폴더에 있는지 확인하세요. EDR·AppLocker·WDAC가 차단하면 우회하지 말고 공식 ZIP의 버전·해시와 차단 기록을 보안 담당자에게 전달하세요.</w:t>
+        <w:t>0.11.4-poc는 코드 서명되지 않아 SmartScreen이나 사내 EDR이 차단할 수 있습니다. ZIP을 완전히 압축 해제하고 Setup, Viewer EXE와 제공된 DLL이 같은 폴더에 있는지 확인하세요. EDR·AppLocker·WDAC가 차단하면 우회하지 말고 공식 ZIP의 버전·해시와 차단 기록을 보안 담당자에게 전달하세요.</w:t>
       </w:r>
     </w:p>
     <w:p>
@@ -2550,7 +2535,7 @@
           <w:color w:val="2E74B5"/>
           <w:sz w:val="21"/>
         </w:rPr>
-        <w:t xml:space="preserve">포터블 운영  </w:t>
+        <w:t xml:space="preserve">사용자 전용 설치  </w:t>
       </w:r>
       <w:r>
         <w:rPr>
@@ -2558,7 +2543,85 @@
           <w:color w:val="16324F"/>
           <w:sz w:val="21"/>
         </w:rPr>
-        <w:t>공개 Viewer 패키지에는 설치 스크립트와 자동 시작 기능이 없습니다. 필요하면 사용자가 직접 바로 가기를 만들고, 감시가 필요할 때 Viewer를 실행해 두세요.</w:t>
+        <w:t>Viewer Setup은 PowerShell, 인터넷, UAC와 관리자 권한 없이 고정 경로에 프로그램만 교체합니다. 바탕 화면과 시작 메뉴 바로 가기는 갱신하지만 자동 시작은 등록하지 않습니다. 설치 완료 전 실패하면 기존 설치는 복구하고 최초 설치는 미설치 상태로 정리하며 임의의 압축 해제 폴더는 삭제하지 않습니다.</w:t>
+      </w:r>
+    </w:p>
+    <w:p>
+      <w:pPr>
+        <w:keepLines/>
+        <w:pageBreakBefore w:val="0"/>
+        <w:spacing w:before="80" w:after="160" w:line="283" w:lineRule="auto"/>
+        <w:ind w:left="115" w:right="58"/>
+        <w:shd w:fill="FFF8E8"/>
+        <w:pBdr>
+          <w:left w:val="single" w:sz="16" w:space="8" w:color="8A5A00"/>
+        </w:pBdr>
+      </w:pPr>
+      <w:r>
+        <w:rPr>
+          <w:rFonts w:ascii="맑은 고딕" w:hAnsi="맑은 고딕" w:eastAsia="맑은 고딕" w:cs="맑은 고딕"/>
+          <w:b/>
+          <w:color w:val="8A5A00"/>
+          <w:sz w:val="21"/>
+        </w:rPr>
+        <w:t xml:space="preserve">이전 설치 복구가 필요한 경우  </w:t>
+      </w:r>
+      <w:r>
+        <w:rPr>
+          <w:rFonts w:ascii="맑은 고딕" w:hAnsi="맑은 고딕" w:eastAsia="맑은 고딕" w:cs="맑은 고딕"/>
+          <w:color w:val="16324F"/>
+          <w:sz w:val="21"/>
+        </w:rPr>
+        <w:t>Setup이 미완료 journal을 찾으면 설치/업데이트를 잠급니다. '이전 상태 복구'를 눌러 복구 완료를 확인한 다음 설치/업데이트를 별도로 다시 누르세요. 복구 성공이 설치를 자동으로 시작하지는 않습니다. 장비·연결·DPAPI·감시 데이터는 보존되고 Setup 전용 journal과 증거 파일만 정리됩니다.</w:t>
+      </w:r>
+    </w:p>
+    <w:p>
+      <w:pPr>
+        <w:keepNext/>
+        <w:spacing w:before="80" w:after="0"/>
+        <w:jc w:val="center"/>
+      </w:pPr>
+      <w:r>
+        <w:drawing>
+          <wp:inline xmlns:a="http://schemas.openxmlformats.org/drawingml/2006/main" xmlns:pic="http://schemas.openxmlformats.org/drawingml/2006/picture">
+            <wp:extent cx="4389120" cy="3511296"/>
+            <wp:docPr id="3" name="Picture 3" title="Viewer Setup 화면" descr="인터넷과 관리자 권한 없이 현재 사용자 전용 경로에 설치하고 사용자 데이터를 보존하는 Viewer Setup 화면"/>
+            <wp:cNvGraphicFramePr>
+              <a:graphicFrameLocks noChangeAspect="1"/>
+            </wp:cNvGraphicFramePr>
+            <a:graphic>
+              <a:graphicData uri="http://schemas.openxmlformats.org/drawingml/2006/picture">
+                <pic:pic>
+                  <pic:nvPicPr>
+                    <pic:cNvPr id="0" name="00-viewer-setup.png"/>
+                    <pic:cNvPicPr/>
+                  </pic:nvPicPr>
+                  <pic:blipFill>
+                    <a:blip r:embed="rId15"/>
+                    <a:stretch>
+                      <a:fillRect/>
+                    </a:stretch>
+                  </pic:blipFill>
+                  <pic:spPr>
+                    <a:xfrm>
+                      <a:off x="0" y="0"/>
+                      <a:ext cx="4389120" cy="3511296"/>
+                    </a:xfrm>
+                    <a:prstGeom prst="rect"/>
+                  </pic:spPr>
+                </pic:pic>
+              </a:graphicData>
+            </a:graphic>
+          </wp:inline>
+        </w:drawing>
+      </w:r>
+    </w:p>
+    <w:p>
+      <w:pPr>
+        <w:pStyle w:val="Caption"/>
+      </w:pPr>
+      <w:r>
+        <w:t>그림 3. 사용자 전용 Viewer 설치 및 업데이트 화면</w:t>
       </w:r>
     </w:p>
     <w:p>
@@ -2590,7 +2653,7 @@
         <w:drawing>
           <wp:inline xmlns:a="http://schemas.openxmlformats.org/drawingml/2006/main" xmlns:pic="http://schemas.openxmlformats.org/drawingml/2006/picture">
             <wp:extent cx="3200400" cy="4037427"/>
-            <wp:docPr id="3" name="Picture 3" title="Agent 연결 창" descr="Agent PC 주소 하나와 자동 HTTPS 연결 단계, 연결 확인 및 저장 버튼을 보여 주는 연결 설정 창"/>
+            <wp:docPr id="4" name="Picture 4" title="Agent 연결 창" descr="Agent PC 주소 하나와 자동 HTTPS 연결 단계, 연결 확인 및 저장 버튼을 보여 주는 연결 설정 창"/>
             <wp:cNvGraphicFramePr>
               <a:graphicFrameLocks noChangeAspect="1"/>
             </wp:cNvGraphicFramePr>
@@ -2602,7 +2665,7 @@
                     <pic:cNvPicPr/>
                   </pic:nvPicPr>
                   <pic:blipFill>
-                    <a:blip r:embed="rId15"/>
+                    <a:blip r:embed="rId16"/>
                     <a:stretch>
                       <a:fillRect/>
                     </a:stretch>
@@ -2626,7 +2689,7 @@
         <w:pStyle w:val="Caption"/>
       </w:pPr>
       <w:r>
-        <w:t>그림 3. Agent 주소만 입력하는 연결 설정</w:t>
+        <w:t>그림 4. Agent 주소만 입력하는 연결 설정</w:t>
       </w:r>
     </w:p>
     <w:p>
@@ -2654,7 +2717,7 @@
         <w:drawing>
           <wp:inline xmlns:a="http://schemas.openxmlformats.org/drawingml/2006/main" xmlns:pic="http://schemas.openxmlformats.org/drawingml/2006/picture">
             <wp:extent cx="3200400" cy="4037427"/>
-            <wp:docPr id="4" name="Picture 4" title="Agent 연결 실패와 지원 코드" descr="TCP 18443 연결 거부 단계와 선택 가능한 SWD1 지원 코드를 함께 표시하는 Viewer Agent 연결 실패 창"/>
+            <wp:docPr id="5" name="Picture 5" title="Agent 연결 실패와 지원 코드" descr="TCP 18443 연결 거부 단계와 선택 가능한 SWD1 지원 코드를 함께 표시하는 Viewer Agent 연결 실패 창"/>
             <wp:cNvGraphicFramePr>
               <a:graphicFrameLocks noChangeAspect="1"/>
             </wp:cNvGraphicFramePr>
@@ -2666,7 +2729,7 @@
                     <pic:cNvPicPr/>
                   </pic:nvPicPr>
                   <pic:blipFill>
-                    <a:blip r:embed="rId16"/>
+                    <a:blip r:embed="rId17"/>
                     <a:stretch>
                       <a:fillRect/>
                     </a:stretch>
@@ -2690,7 +2753,7 @@
         <w:pStyle w:val="Caption"/>
       </w:pPr>
       <w:r>
-        <w:t>그림 4. Viewer Agent 연결 실패와 짧은 SWD1 지원 코드</w:t>
+        <w:t>그림 5. Viewer Agent 연결 실패와 짧은 SWD1 지원 코드</w:t>
       </w:r>
     </w:p>
     <w:p>
@@ -2872,7 +2935,7 @@
         <w:drawing>
           <wp:inline xmlns:a="http://schemas.openxmlformats.org/drawingml/2006/main" xmlns:pic="http://schemas.openxmlformats.org/drawingml/2006/picture">
             <wp:extent cx="5029200" cy="3540967"/>
-            <wp:docPr id="5" name="Picture 5" title="장비 관리 창" descr="장비명, 모델, IPv4, 계정 ID, 로그인 비밀번호, enable 비밀번호와 감시 설정을 입력하는 창"/>
+            <wp:docPr id="6" name="Picture 6" title="장비 관리 창" descr="장비명, 모델, IPv4, 계정 ID, 로그인 비밀번호, enable 비밀번호와 감시 설정을 입력하는 창"/>
             <wp:cNvGraphicFramePr>
               <a:graphicFrameLocks noChangeAspect="1"/>
             </wp:cNvGraphicFramePr>
@@ -2884,7 +2947,7 @@
                     <pic:cNvPicPr/>
                   </pic:nvPicPr>
                   <pic:blipFill>
-                    <a:blip r:embed="rId17"/>
+                    <a:blip r:embed="rId18"/>
                     <a:stretch>
                       <a:fillRect/>
                     </a:stretch>
@@ -2908,7 +2971,7 @@
         <w:pStyle w:val="Caption"/>
       </w:pPr>
       <w:r>
-        <w:t>그림 5. Viewer가 보관하는 장비 및 계정 입력 화면</w:t>
+        <w:t>그림 6. Viewer가 보관하는 장비 및 계정 입력 화면</w:t>
       </w:r>
     </w:p>
     <w:p>
@@ -3684,7 +3747,7 @@
         <w:drawing>
           <wp:inline xmlns:a="http://schemas.openxmlformats.org/drawingml/2006/main" xmlns:pic="http://schemas.openxmlformats.org/drawingml/2006/picture">
             <wp:extent cx="3977639" cy="2486024"/>
-            <wp:docPr id="6" name="Picture 6" title="장비 명령 실행 화면" descr="show port status를 입력하고 데모 스위치의 익명화된 결과를 확인하는 장비 명령 탭"/>
+            <wp:docPr id="7" name="Picture 7" title="장비 명령 실행 화면" descr="show port status를 입력하고 데모 스위치의 익명화된 결과를 확인하는 장비 명령 탭"/>
             <wp:cNvGraphicFramePr>
               <a:graphicFrameLocks noChangeAspect="1"/>
             </wp:cNvGraphicFramePr>
@@ -3696,7 +3759,7 @@
                     <pic:cNvPicPr/>
                   </pic:nvPicPr>
                   <pic:blipFill>
-                    <a:blip r:embed="rId18"/>
+                    <a:blip r:embed="rId19"/>
                     <a:stretch>
                       <a:fillRect/>
                     </a:stretch>
@@ -3720,7 +3783,7 @@
         <w:pStyle w:val="Caption"/>
       </w:pPr>
       <w:r>
-        <w:t>그림 6. 한 줄 show 명령 실행과 메모리 내 결과 확인</w:t>
+        <w:t>그림 7. 한 줄 show 명령 실행과 메모리 내 결과 확인</w:t>
       </w:r>
     </w:p>
     <w:tbl>
@@ -4779,7 +4842,7 @@
         <w:drawing>
           <wp:inline xmlns:a="http://schemas.openxmlformats.org/drawingml/2006/main" xmlns:pic="http://schemas.openxmlformats.org/drawingml/2006/picture">
             <wp:extent cx="4754880" cy="2971800"/>
-            <wp:docPr id="7" name="Picture 7" title="Viewer 대시보드" descr="장비 목록, 선택 장비 상태, 최근 이벤트와 Viewer 감시 상태를 보여 주는 대시보드"/>
+            <wp:docPr id="8" name="Picture 8" title="Viewer 대시보드" descr="장비 목록, 선택 장비 상태, 최근 이벤트와 Viewer 감시 상태를 보여 주는 대시보드"/>
             <wp:cNvGraphicFramePr>
               <a:graphicFrameLocks noChangeAspect="1"/>
             </wp:cNvGraphicFramePr>
@@ -4791,7 +4854,7 @@
                     <pic:cNvPicPr/>
                   </pic:nvPicPr>
                   <pic:blipFill>
-                    <a:blip r:embed="rId19"/>
+                    <a:blip r:embed="rId20"/>
                     <a:stretch>
                       <a:fillRect/>
                     </a:stretch>
@@ -4815,7 +4878,7 @@
         <w:pStyle w:val="Caption"/>
       </w:pPr>
       <w:r>
-        <w:t>그림 7. Viewer 중심 대시보드 전체 화면</w:t>
+        <w:t>그림 8. Viewer 중심 대시보드 전체 화면</w:t>
       </w:r>
     </w:p>
     <w:tbl>
@@ -5316,7 +5379,7 @@
         <w:drawing>
           <wp:inline xmlns:a="http://schemas.openxmlformats.org/drawingml/2006/main" xmlns:pic="http://schemas.openxmlformats.org/drawingml/2006/picture">
             <wp:extent cx="2971800" cy="1556656"/>
-            <wp:docPr id="8" name="Picture 8" title="항상 위 미니 창" descr="정상, 경고, 장애 수와 최근 문제를 보여 주는 작은 항상 위 창"/>
+            <wp:docPr id="9" name="Picture 9" title="항상 위 미니 창" descr="정상, 경고, 장애 수와 최근 문제를 보여 주는 작은 항상 위 창"/>
             <wp:cNvGraphicFramePr>
               <a:graphicFrameLocks noChangeAspect="1"/>
             </wp:cNvGraphicFramePr>
@@ -5328,7 +5391,7 @@
                     <pic:cNvPicPr/>
                   </pic:nvPicPr>
                   <pic:blipFill>
-                    <a:blip r:embed="rId20"/>
+                    <a:blip r:embed="rId21"/>
                     <a:stretch>
                       <a:fillRect/>
                     </a:stretch>
@@ -5352,7 +5415,7 @@
         <w:pStyle w:val="Caption"/>
       </w:pPr>
       <w:r>
-        <w:t>그림 8. 반복 운영용 미니 창</w:t>
+        <w:t>그림 9. 반복 운영용 미니 창</w:t>
       </w:r>
     </w:p>
     <w:p>
@@ -5365,7 +5428,7 @@
         <w:drawing>
           <wp:inline xmlns:a="http://schemas.openxmlformats.org/drawingml/2006/main" xmlns:pic="http://schemas.openxmlformats.org/drawingml/2006/picture">
             <wp:extent cx="3154680" cy="1231827"/>
-            <wp:docPr id="9" name="Picture 9" title="장애 알림 팝업" descr="데모 업링크 포트 Down 장애와 발생 시각을 보여 주는 알림 팝업"/>
+            <wp:docPr id="10" name="Picture 10" title="장애 알림 팝업" descr="데모 업링크 포트 Down 장애와 발생 시각을 보여 주는 알림 팝업"/>
             <wp:cNvGraphicFramePr>
               <a:graphicFrameLocks noChangeAspect="1"/>
             </wp:cNvGraphicFramePr>
@@ -5377,7 +5440,7 @@
                     <pic:cNvPicPr/>
                   </pic:nvPicPr>
                   <pic:blipFill>
-                    <a:blip r:embed="rId21"/>
+                    <a:blip r:embed="rId22"/>
                     <a:stretch>
                       <a:fillRect/>
                     </a:stretch>
@@ -5401,7 +5464,7 @@
         <w:pStyle w:val="Caption"/>
       </w:pPr>
       <w:r>
-        <w:t>그림 9. 새 장애 알림 팝업</w:t>
+        <w:t>그림 10. 새 장애 알림 팝업</w:t>
       </w:r>
     </w:p>
     <w:p>
@@ -5666,9 +5729,9 @@
                 <w:rFonts w:ascii="맑은 고딕" w:hAnsi="맑은 고딕" w:eastAsia="맑은 고딕" w:cs="맑은 고딕"/>
                 <w:sz w:val="18"/>
               </w:rPr>
-              <w:t>사용자가 압축 해제한</w:t>
+              <w:t>%LOCALAPPDATA%\Programs\</w:t>
               <w:br/>
-              <w:t>로컬 폴더</w:t>
+              <w:t>SamsungSwitchWatch\Viewer</w:t>
             </w:r>
           </w:p>
         </w:tc>
@@ -5693,7 +5756,7 @@
                 <w:rFonts w:ascii="맑은 고딕" w:hAnsi="맑은 고딕" w:eastAsia="맑은 고딕" w:cs="맑은 고딕"/>
                 <w:sz w:val="18"/>
               </w:rPr>
-              <w:t>포터블, 일반 사용자 권한으로 실행</w:t>
+              <w:t>사용자 전용, 일반 사용자 권한으로 실행</w:t>
             </w:r>
           </w:p>
         </w:tc>
@@ -7824,6 +7887,398 @@
                 <w:rFonts w:ascii="맑은 고딕" w:hAnsi="맑은 고딕" w:eastAsia="맑은 고딕" w:cs="맑은 고딕"/>
                 <w:sz w:val="16"/>
               </w:rPr>
+              <w:t>VIEWER_SETUP_PACKAGE_INVALID</w:t>
+            </w:r>
+          </w:p>
+        </w:tc>
+        <w:tc>
+          <w:tcPr>
+            <w:tcW w:type="dxa" w:w="5060"/>
+            <w:tcMar>
+              <w:top w:w="80" w:type="dxa"/>
+              <w:start w:w="120" w:type="dxa"/>
+              <w:bottom w:w="80" w:type="dxa"/>
+              <w:end w:w="120" w:type="dxa"/>
+            </w:tcMar>
+            <w:vAlign w:val="center"/>
+          </w:tcPr>
+          <w:p>
+            <w:pPr>
+              <w:spacing w:before="0" w:after="0" w:line="240" w:lineRule="auto"/>
+              <w:jc w:val="left"/>
+            </w:pPr>
+            <w:r>
+              <w:rPr>
+                <w:rFonts w:ascii="맑은 고딕" w:hAnsi="맑은 고딕" w:eastAsia="맑은 고딕" w:cs="맑은 고딕"/>
+                <w:sz w:val="16"/>
+              </w:rPr>
+              <w:t>Viewer ZIP 전체를 새 로컬 폴더에 다시 압축 해제하고 공식 Release 해시 확인</w:t>
+            </w:r>
+          </w:p>
+        </w:tc>
+      </w:tr>
+      <w:tr>
+        <w:trPr>
+          <w:cantSplit w:val="true"/>
+        </w:trPr>
+        <w:tc>
+          <w:tcPr>
+            <w:tcW w:type="dxa" w:w="4300"/>
+            <w:shd w:fill="FAFBFC"/>
+            <w:tcMar>
+              <w:top w:w="80" w:type="dxa"/>
+              <w:start w:w="120" w:type="dxa"/>
+              <w:bottom w:w="80" w:type="dxa"/>
+              <w:end w:w="120" w:type="dxa"/>
+            </w:tcMar>
+            <w:vAlign w:val="center"/>
+          </w:tcPr>
+          <w:p>
+            <w:pPr>
+              <w:spacing w:before="0" w:after="0" w:line="240" w:lineRule="auto"/>
+              <w:jc w:val="left"/>
+            </w:pPr>
+            <w:r>
+              <w:rPr>
+                <w:rFonts w:ascii="맑은 고딕" w:hAnsi="맑은 고딕" w:eastAsia="맑은 고딕" w:cs="맑은 고딕"/>
+                <w:sz w:val="16"/>
+              </w:rPr>
+              <w:t>VIEWER_SETUP_VIEWER_RUNNING</w:t>
+            </w:r>
+          </w:p>
+        </w:tc>
+        <w:tc>
+          <w:tcPr>
+            <w:tcW w:type="dxa" w:w="5060"/>
+            <w:shd w:fill="FAFBFC"/>
+            <w:tcMar>
+              <w:top w:w="80" w:type="dxa"/>
+              <w:start w:w="120" w:type="dxa"/>
+              <w:bottom w:w="80" w:type="dxa"/>
+              <w:end w:w="120" w:type="dxa"/>
+            </w:tcMar>
+            <w:vAlign w:val="center"/>
+          </w:tcPr>
+          <w:p>
+            <w:pPr>
+              <w:spacing w:before="0" w:after="0" w:line="240" w:lineRule="auto"/>
+              <w:jc w:val="left"/>
+            </w:pPr>
+            <w:r>
+              <w:rPr>
+                <w:rFonts w:ascii="맑은 고딕" w:hAnsi="맑은 고딕" w:eastAsia="맑은 고딕" w:cs="맑은 고딕"/>
+                <w:sz w:val="16"/>
+              </w:rPr>
+              <w:t>트레이에서 기존 Viewer를 완전히 종료한 뒤 설치/업데이트 재시도</w:t>
+            </w:r>
+          </w:p>
+        </w:tc>
+      </w:tr>
+      <w:tr>
+        <w:trPr>
+          <w:cantSplit w:val="true"/>
+        </w:trPr>
+        <w:tc>
+          <w:tcPr>
+            <w:tcW w:type="dxa" w:w="4300"/>
+            <w:tcMar>
+              <w:top w:w="80" w:type="dxa"/>
+              <w:start w:w="120" w:type="dxa"/>
+              <w:bottom w:w="80" w:type="dxa"/>
+              <w:end w:w="120" w:type="dxa"/>
+            </w:tcMar>
+            <w:vAlign w:val="center"/>
+          </w:tcPr>
+          <w:p>
+            <w:pPr>
+              <w:spacing w:before="0" w:after="0" w:line="240" w:lineRule="auto"/>
+              <w:jc w:val="left"/>
+            </w:pPr>
+            <w:r>
+              <w:rPr>
+                <w:rFonts w:ascii="맑은 고딕" w:hAnsi="맑은 고딕" w:eastAsia="맑은 고딕" w:cs="맑은 고딕"/>
+                <w:sz w:val="16"/>
+              </w:rPr>
+              <w:t>VIEWER_SETUP_RECOVERY_REQUIRED</w:t>
+            </w:r>
+          </w:p>
+        </w:tc>
+        <w:tc>
+          <w:tcPr>
+            <w:tcW w:type="dxa" w:w="5060"/>
+            <w:tcMar>
+              <w:top w:w="80" w:type="dxa"/>
+              <w:start w:w="120" w:type="dxa"/>
+              <w:bottom w:w="80" w:type="dxa"/>
+              <w:end w:w="120" w:type="dxa"/>
+            </w:tcMar>
+            <w:vAlign w:val="center"/>
+          </w:tcPr>
+          <w:p>
+            <w:pPr>
+              <w:spacing w:before="0" w:after="0" w:line="240" w:lineRule="auto"/>
+              <w:jc w:val="left"/>
+            </w:pPr>
+            <w:r>
+              <w:rPr>
+                <w:rFonts w:ascii="맑은 고딕" w:hAnsi="맑은 고딕" w:eastAsia="맑은 고딕" w:cs="맑은 고딕"/>
+                <w:sz w:val="16"/>
+              </w:rPr>
+              <w:t>Viewer 설치는 잠긴 상태. 이전 상태 복구 완료 확인 뒤 설치/업데이트를 별도로 실행</w:t>
+            </w:r>
+          </w:p>
+        </w:tc>
+      </w:tr>
+      <w:tr>
+        <w:trPr>
+          <w:cantSplit w:val="true"/>
+        </w:trPr>
+        <w:tc>
+          <w:tcPr>
+            <w:tcW w:type="dxa" w:w="4300"/>
+            <w:shd w:fill="FAFBFC"/>
+            <w:tcMar>
+              <w:top w:w="80" w:type="dxa"/>
+              <w:start w:w="120" w:type="dxa"/>
+              <w:bottom w:w="80" w:type="dxa"/>
+              <w:end w:w="120" w:type="dxa"/>
+            </w:tcMar>
+            <w:vAlign w:val="center"/>
+          </w:tcPr>
+          <w:p>
+            <w:pPr>
+              <w:spacing w:before="0" w:after="0" w:line="240" w:lineRule="auto"/>
+              <w:jc w:val="left"/>
+            </w:pPr>
+            <w:r>
+              <w:rPr>
+                <w:rFonts w:ascii="맑은 고딕" w:hAnsi="맑은 고딕" w:eastAsia="맑은 고딕" w:cs="맑은 고딕"/>
+                <w:sz w:val="16"/>
+              </w:rPr>
+              <w:t>VIEWER_SETUP_ALREADY_RUNNING / VIEWER_SETUP_CANCELLED</w:t>
+            </w:r>
+          </w:p>
+        </w:tc>
+        <w:tc>
+          <w:tcPr>
+            <w:tcW w:type="dxa" w:w="5060"/>
+            <w:shd w:fill="FAFBFC"/>
+            <w:tcMar>
+              <w:top w:w="80" w:type="dxa"/>
+              <w:start w:w="120" w:type="dxa"/>
+              <w:bottom w:w="80" w:type="dxa"/>
+              <w:end w:w="120" w:type="dxa"/>
+            </w:tcMar>
+            <w:vAlign w:val="center"/>
+          </w:tcPr>
+          <w:p>
+            <w:pPr>
+              <w:spacing w:before="0" w:after="0" w:line="240" w:lineRule="auto"/>
+              <w:jc w:val="left"/>
+            </w:pPr>
+            <w:r>
+              <w:rPr>
+                <w:rFonts w:ascii="맑은 고딕" w:hAnsi="맑은 고딕" w:eastAsia="맑은 고딕" w:cs="맑은 고딕"/>
+                <w:sz w:val="16"/>
+              </w:rPr>
+              <w:t>다른 Setup 작업 종료 또는 취소 뒤 복구 필요 표시를 먼저 확인</w:t>
+            </w:r>
+          </w:p>
+        </w:tc>
+      </w:tr>
+      <w:tr>
+        <w:trPr>
+          <w:cantSplit w:val="true"/>
+        </w:trPr>
+        <w:tc>
+          <w:tcPr>
+            <w:tcW w:type="dxa" w:w="4300"/>
+            <w:tcMar>
+              <w:top w:w="80" w:type="dxa"/>
+              <w:start w:w="120" w:type="dxa"/>
+              <w:bottom w:w="80" w:type="dxa"/>
+              <w:end w:w="120" w:type="dxa"/>
+            </w:tcMar>
+            <w:vAlign w:val="center"/>
+          </w:tcPr>
+          <w:p>
+            <w:pPr>
+              <w:spacing w:before="0" w:after="0" w:line="240" w:lineRule="auto"/>
+              <w:jc w:val="left"/>
+            </w:pPr>
+            <w:r>
+              <w:rPr>
+                <w:rFonts w:ascii="맑은 고딕" w:hAnsi="맑은 고딕" w:eastAsia="맑은 고딕" w:cs="맑은 고딕"/>
+                <w:sz w:val="16"/>
+              </w:rPr>
+              <w:t>VIEWER_SETUP_PATH_INVALID / VIEWER_SETUP_PATH_NOT_WRITABLE / VIEWER_SETUP_INSTALL_WRITE_FAILED</w:t>
+            </w:r>
+          </w:p>
+        </w:tc>
+        <w:tc>
+          <w:tcPr>
+            <w:tcW w:type="dxa" w:w="5060"/>
+            <w:tcMar>
+              <w:top w:w="80" w:type="dxa"/>
+              <w:start w:w="120" w:type="dxa"/>
+              <w:bottom w:w="80" w:type="dxa"/>
+              <w:end w:w="120" w:type="dxa"/>
+            </w:tcMar>
+            <w:vAlign w:val="center"/>
+          </w:tcPr>
+          <w:p>
+            <w:pPr>
+              <w:spacing w:before="0" w:after="0" w:line="240" w:lineRule="auto"/>
+              <w:jc w:val="left"/>
+            </w:pPr>
+            <w:r>
+              <w:rPr>
+                <w:rFonts w:ascii="맑은 고딕" w:hAnsi="맑은 고딕" w:eastAsia="맑은 고딕" w:cs="맑은 고딕"/>
+                <w:sz w:val="16"/>
+              </w:rPr>
+              <w:t>공식 ZIP 위치, LocalAppData 쓰기 권한과 EDR 차단 기록 확인</w:t>
+            </w:r>
+          </w:p>
+        </w:tc>
+      </w:tr>
+      <w:tr>
+        <w:trPr>
+          <w:cantSplit w:val="true"/>
+        </w:trPr>
+        <w:tc>
+          <w:tcPr>
+            <w:tcW w:type="dxa" w:w="4300"/>
+            <w:shd w:fill="FAFBFC"/>
+            <w:tcMar>
+              <w:top w:w="80" w:type="dxa"/>
+              <w:start w:w="120" w:type="dxa"/>
+              <w:bottom w:w="80" w:type="dxa"/>
+              <w:end w:w="120" w:type="dxa"/>
+            </w:tcMar>
+            <w:vAlign w:val="center"/>
+          </w:tcPr>
+          <w:p>
+            <w:pPr>
+              <w:spacing w:before="0" w:after="0" w:line="240" w:lineRule="auto"/>
+              <w:jc w:val="left"/>
+            </w:pPr>
+            <w:r>
+              <w:rPr>
+                <w:rFonts w:ascii="맑은 고딕" w:hAnsi="맑은 고딕" w:eastAsia="맑은 고딕" w:cs="맑은 고딕"/>
+                <w:sz w:val="16"/>
+              </w:rPr>
+              <w:t>VIEWER_SETUP_SMOKE_FAILED / VIEWER_SETUP_LAUNCH_FAILED</w:t>
+            </w:r>
+          </w:p>
+        </w:tc>
+        <w:tc>
+          <w:tcPr>
+            <w:tcW w:type="dxa" w:w="5060"/>
+            <w:shd w:fill="FAFBFC"/>
+            <w:tcMar>
+              <w:top w:w="80" w:type="dxa"/>
+              <w:start w:w="120" w:type="dxa"/>
+              <w:bottom w:w="80" w:type="dxa"/>
+              <w:end w:w="120" w:type="dxa"/>
+            </w:tcMar>
+            <w:vAlign w:val="center"/>
+          </w:tcPr>
+          <w:p>
+            <w:pPr>
+              <w:spacing w:before="0" w:after="0" w:line="240" w:lineRule="auto"/>
+              <w:jc w:val="left"/>
+            </w:pPr>
+            <w:r>
+              <w:rPr>
+                <w:rFonts w:ascii="맑은 고딕" w:hAnsi="맑은 고딕" w:eastAsia="맑은 고딕" w:cs="맑은 고딕"/>
+                <w:sz w:val="16"/>
+              </w:rPr>
+              <w:t>새 Viewer 자체점검 또는 실행 유지 실패. 이전 설치 복구 결과와 EDR 차단 확인</w:t>
+            </w:r>
+          </w:p>
+        </w:tc>
+      </w:tr>
+      <w:tr>
+        <w:trPr>
+          <w:cantSplit w:val="true"/>
+        </w:trPr>
+        <w:tc>
+          <w:tcPr>
+            <w:tcW w:type="dxa" w:w="4300"/>
+            <w:tcMar>
+              <w:top w:w="80" w:type="dxa"/>
+              <w:start w:w="120" w:type="dxa"/>
+              <w:bottom w:w="80" w:type="dxa"/>
+              <w:end w:w="120" w:type="dxa"/>
+            </w:tcMar>
+            <w:vAlign w:val="center"/>
+          </w:tcPr>
+          <w:p>
+            <w:pPr>
+              <w:spacing w:before="0" w:after="0" w:line="240" w:lineRule="auto"/>
+              <w:jc w:val="left"/>
+            </w:pPr>
+            <w:r>
+              <w:rPr>
+                <w:rFonts w:ascii="맑은 고딕" w:hAnsi="맑은 고딕" w:eastAsia="맑은 고딕" w:cs="맑은 고딕"/>
+                <w:sz w:val="16"/>
+              </w:rPr>
+              <w:t>VIEWER_SETUP_ROLLBACK_FAILED</w:t>
+            </w:r>
+          </w:p>
+        </w:tc>
+        <w:tc>
+          <w:tcPr>
+            <w:tcW w:type="dxa" w:w="5060"/>
+            <w:tcMar>
+              <w:top w:w="80" w:type="dxa"/>
+              <w:start w:w="120" w:type="dxa"/>
+              <w:bottom w:w="80" w:type="dxa"/>
+              <w:end w:w="120" w:type="dxa"/>
+            </w:tcMar>
+            <w:vAlign w:val="center"/>
+          </w:tcPr>
+          <w:p>
+            <w:pPr>
+              <w:spacing w:before="0" w:after="0" w:line="240" w:lineRule="auto"/>
+              <w:jc w:val="left"/>
+            </w:pPr>
+            <w:r>
+              <w:rPr>
+                <w:rFonts w:ascii="맑은 고딕" w:hAnsi="맑은 고딕" w:eastAsia="맑은 고딕" w:cs="맑은 고딕"/>
+                <w:sz w:val="16"/>
+              </w:rPr>
+              <w:t>반복 설치와 폴더 수동 삭제를 중지하고 남은 Setup journal·증거를 Windows 관리자에게 전달</w:t>
+            </w:r>
+          </w:p>
+        </w:tc>
+      </w:tr>
+      <w:tr>
+        <w:trPr>
+          <w:cantSplit w:val="true"/>
+        </w:trPr>
+        <w:tc>
+          <w:tcPr>
+            <w:tcW w:type="dxa" w:w="4300"/>
+            <w:shd w:fill="FAFBFC"/>
+            <w:tcMar>
+              <w:top w:w="80" w:type="dxa"/>
+              <w:start w:w="120" w:type="dxa"/>
+              <w:bottom w:w="80" w:type="dxa"/>
+              <w:end w:w="120" w:type="dxa"/>
+            </w:tcMar>
+            <w:vAlign w:val="center"/>
+          </w:tcPr>
+          <w:p>
+            <w:pPr>
+              <w:spacing w:before="0" w:after="0" w:line="240" w:lineRule="auto"/>
+              <w:jc w:val="left"/>
+            </w:pPr>
+            <w:r>
+              <w:rPr>
+                <w:rFonts w:ascii="맑은 고딕" w:hAnsi="맑은 고딕" w:eastAsia="맑은 고딕" w:cs="맑은 고딕"/>
+                <w:sz w:val="16"/>
+              </w:rPr>
               <w:t>TARGET_NOT_ALLOWED</w:t>
             </w:r>
           </w:p>
@@ -7831,6 +8286,7 @@
         <w:tc>
           <w:tcPr>
             <w:tcW w:type="dxa" w:w="5060"/>
+            <w:shd w:fill="FAFBFC"/>
             <w:tcMar>
               <w:top w:w="80" w:type="dxa"/>
               <w:start w:w="120" w:type="dxa"/>
@@ -7861,7 +8317,6 @@
         <w:tc>
           <w:tcPr>
             <w:tcW w:type="dxa" w:w="4300"/>
-            <w:shd w:fill="FAFBFC"/>
             <w:tcMar>
               <w:top w:w="80" w:type="dxa"/>
               <w:start w:w="120" w:type="dxa"/>
@@ -7887,7 +8342,6 @@
         <w:tc>
           <w:tcPr>
             <w:tcW w:type="dxa" w:w="5060"/>
-            <w:shd w:fill="FAFBFC"/>
             <w:tcMar>
               <w:top w:w="80" w:type="dxa"/>
               <w:start w:w="120" w:type="dxa"/>
@@ -7918,6 +8372,7 @@
         <w:tc>
           <w:tcPr>
             <w:tcW w:type="dxa" w:w="4300"/>
+            <w:shd w:fill="FAFBFC"/>
             <w:tcMar>
               <w:top w:w="80" w:type="dxa"/>
               <w:start w:w="120" w:type="dxa"/>
@@ -7943,6 +8398,7 @@
         <w:tc>
           <w:tcPr>
             <w:tcW w:type="dxa" w:w="5060"/>
+            <w:shd w:fill="FAFBFC"/>
             <w:tcMar>
               <w:top w:w="80" w:type="dxa"/>
               <w:start w:w="120" w:type="dxa"/>
@@ -7973,7 +8429,6 @@
         <w:tc>
           <w:tcPr>
             <w:tcW w:type="dxa" w:w="4300"/>
-            <w:shd w:fill="FAFBFC"/>
             <w:tcMar>
               <w:top w:w="80" w:type="dxa"/>
               <w:start w:w="120" w:type="dxa"/>
@@ -7999,7 +8454,6 @@
         <w:tc>
           <w:tcPr>
             <w:tcW w:type="dxa" w:w="5060"/>
-            <w:shd w:fill="FAFBFC"/>
             <w:tcMar>
               <w:top w:w="80" w:type="dxa"/>
               <w:start w:w="120" w:type="dxa"/>
@@ -8030,6 +8484,7 @@
         <w:tc>
           <w:tcPr>
             <w:tcW w:type="dxa" w:w="4300"/>
+            <w:shd w:fill="FAFBFC"/>
             <w:tcMar>
               <w:top w:w="80" w:type="dxa"/>
               <w:start w:w="120" w:type="dxa"/>
@@ -8055,6 +8510,7 @@
         <w:tc>
           <w:tcPr>
             <w:tcW w:type="dxa" w:w="5060"/>
+            <w:shd w:fill="FAFBFC"/>
             <w:tcMar>
               <w:top w:w="80" w:type="dxa"/>
               <w:start w:w="120" w:type="dxa"/>
@@ -8085,7 +8541,6 @@
         <w:tc>
           <w:tcPr>
             <w:tcW w:type="dxa" w:w="4300"/>
-            <w:shd w:fill="FAFBFC"/>
             <w:tcMar>
               <w:top w:w="80" w:type="dxa"/>
               <w:start w:w="120" w:type="dxa"/>
@@ -8111,7 +8566,6 @@
         <w:tc>
           <w:tcPr>
             <w:tcW w:type="dxa" w:w="5060"/>
-            <w:shd w:fill="FAFBFC"/>
             <w:tcMar>
               <w:top w:w="80" w:type="dxa"/>
               <w:start w:w="120" w:type="dxa"/>
@@ -8142,6 +8596,7 @@
         <w:tc>
           <w:tcPr>
             <w:tcW w:type="dxa" w:w="4300"/>
+            <w:shd w:fill="FAFBFC"/>
             <w:tcMar>
               <w:top w:w="80" w:type="dxa"/>
               <w:start w:w="120" w:type="dxa"/>
@@ -8167,6 +8622,7 @@
         <w:tc>
           <w:tcPr>
             <w:tcW w:type="dxa" w:w="5060"/>
+            <w:shd w:fill="FAFBFC"/>
             <w:tcMar>
               <w:top w:w="80" w:type="dxa"/>
               <w:start w:w="120" w:type="dxa"/>
@@ -8197,7 +8653,6 @@
         <w:tc>
           <w:tcPr>
             <w:tcW w:type="dxa" w:w="4300"/>
-            <w:shd w:fill="FAFBFC"/>
             <w:tcMar>
               <w:top w:w="80" w:type="dxa"/>
               <w:start w:w="120" w:type="dxa"/>
@@ -8223,7 +8678,6 @@
         <w:tc>
           <w:tcPr>
             <w:tcW w:type="dxa" w:w="5060"/>
-            <w:shd w:fill="FAFBFC"/>
             <w:tcMar>
               <w:top w:w="80" w:type="dxa"/>
               <w:start w:w="120" w:type="dxa"/>
@@ -8254,6 +8708,7 @@
         <w:tc>
           <w:tcPr>
             <w:tcW w:type="dxa" w:w="4300"/>
+            <w:shd w:fill="FAFBFC"/>
             <w:tcMar>
               <w:top w:w="80" w:type="dxa"/>
               <w:start w:w="120" w:type="dxa"/>
@@ -8279,6 +8734,7 @@
         <w:tc>
           <w:tcPr>
             <w:tcW w:type="dxa" w:w="5060"/>
+            <w:shd w:fill="FAFBFC"/>
             <w:tcMar>
               <w:top w:w="80" w:type="dxa"/>
               <w:start w:w="120" w:type="dxa"/>
@@ -8309,7 +8765,6 @@
         <w:tc>
           <w:tcPr>
             <w:tcW w:type="dxa" w:w="4300"/>
-            <w:shd w:fill="FAFBFC"/>
             <w:tcMar>
               <w:top w:w="80" w:type="dxa"/>
               <w:start w:w="120" w:type="dxa"/>
@@ -8335,7 +8790,6 @@
         <w:tc>
           <w:tcPr>
             <w:tcW w:type="dxa" w:w="5060"/>
-            <w:shd w:fill="FAFBFC"/>
             <w:tcMar>
               <w:top w:w="80" w:type="dxa"/>
               <w:start w:w="120" w:type="dxa"/>
@@ -8366,6 +8820,7 @@
         <w:tc>
           <w:tcPr>
             <w:tcW w:type="dxa" w:w="4300"/>
+            <w:shd w:fill="FAFBFC"/>
             <w:tcMar>
               <w:top w:w="80" w:type="dxa"/>
               <w:start w:w="120" w:type="dxa"/>
@@ -8391,6 +8846,7 @@
         <w:tc>
           <w:tcPr>
             <w:tcW w:type="dxa" w:w="5060"/>
+            <w:shd w:fill="FAFBFC"/>
             <w:tcMar>
               <w:top w:w="80" w:type="dxa"/>
               <w:start w:w="120" w:type="dxa"/>
@@ -8421,7 +8877,6 @@
         <w:tc>
           <w:tcPr>
             <w:tcW w:type="dxa" w:w="4300"/>
-            <w:shd w:fill="FAFBFC"/>
             <w:tcMar>
               <w:top w:w="80" w:type="dxa"/>
               <w:start w:w="120" w:type="dxa"/>
@@ -8447,7 +8902,6 @@
         <w:tc>
           <w:tcPr>
             <w:tcW w:type="dxa" w:w="5060"/>
-            <w:shd w:fill="FAFBFC"/>
             <w:tcMar>
               <w:top w:w="80" w:type="dxa"/>
               <w:start w:w="120" w:type="dxa"/>
@@ -8478,6 +8932,7 @@
         <w:tc>
           <w:tcPr>
             <w:tcW w:type="dxa" w:w="4300"/>
+            <w:shd w:fill="FAFBFC"/>
             <w:tcMar>
               <w:top w:w="80" w:type="dxa"/>
               <w:start w:w="120" w:type="dxa"/>
@@ -8503,6 +8958,7 @@
         <w:tc>
           <w:tcPr>
             <w:tcW w:type="dxa" w:w="5060"/>
+            <w:shd w:fill="FAFBFC"/>
             <w:tcMar>
               <w:top w:w="80" w:type="dxa"/>
               <w:start w:w="120" w:type="dxa"/>
@@ -8533,7 +8989,6 @@
         <w:tc>
           <w:tcPr>
             <w:tcW w:type="dxa" w:w="4300"/>
-            <w:shd w:fill="FAFBFC"/>
             <w:tcMar>
               <w:top w:w="80" w:type="dxa"/>
               <w:start w:w="120" w:type="dxa"/>
@@ -8559,7 +9014,6 @@
         <w:tc>
           <w:tcPr>
             <w:tcW w:type="dxa" w:w="5060"/>
-            <w:shd w:fill="FAFBFC"/>
             <w:tcMar>
               <w:top w:w="80" w:type="dxa"/>
               <w:start w:w="120" w:type="dxa"/>
@@ -8590,6 +9044,7 @@
         <w:tc>
           <w:tcPr>
             <w:tcW w:type="dxa" w:w="4300"/>
+            <w:shd w:fill="FAFBFC"/>
             <w:tcMar>
               <w:top w:w="80" w:type="dxa"/>
               <w:start w:w="120" w:type="dxa"/>
@@ -8615,6 +9070,7 @@
         <w:tc>
           <w:tcPr>
             <w:tcW w:type="dxa" w:w="5060"/>
+            <w:shd w:fill="FAFBFC"/>
             <w:tcMar>
               <w:top w:w="80" w:type="dxa"/>
               <w:start w:w="120" w:type="dxa"/>
@@ -8645,7 +9101,6 @@
         <w:tc>
           <w:tcPr>
             <w:tcW w:type="dxa" w:w="4300"/>
-            <w:shd w:fill="FAFBFC"/>
             <w:tcMar>
               <w:top w:w="80" w:type="dxa"/>
               <w:start w:w="120" w:type="dxa"/>
@@ -8671,7 +9126,6 @@
         <w:tc>
           <w:tcPr>
             <w:tcW w:type="dxa" w:w="5060"/>
-            <w:shd w:fill="FAFBFC"/>
             <w:tcMar>
               <w:top w:w="80" w:type="dxa"/>
               <w:start w:w="120" w:type="dxa"/>
@@ -8702,6 +9156,7 @@
         <w:tc>
           <w:tcPr>
             <w:tcW w:type="dxa" w:w="4300"/>
+            <w:shd w:fill="FAFBFC"/>
             <w:tcMar>
               <w:top w:w="80" w:type="dxa"/>
               <w:start w:w="120" w:type="dxa"/>
@@ -8727,6 +9182,7 @@
         <w:tc>
           <w:tcPr>
             <w:tcW w:type="dxa" w:w="5060"/>
+            <w:shd w:fill="FAFBFC"/>
             <w:tcMar>
               <w:top w:w="80" w:type="dxa"/>
               <w:start w:w="120" w:type="dxa"/>
@@ -8757,7 +9213,6 @@
         <w:tc>
           <w:tcPr>
             <w:tcW w:type="dxa" w:w="4300"/>
-            <w:shd w:fill="FAFBFC"/>
             <w:tcMar>
               <w:top w:w="80" w:type="dxa"/>
               <w:start w:w="120" w:type="dxa"/>
@@ -8783,7 +9238,6 @@
         <w:tc>
           <w:tcPr>
             <w:tcW w:type="dxa" w:w="5060"/>
-            <w:shd w:fill="FAFBFC"/>
             <w:tcMar>
               <w:top w:w="80" w:type="dxa"/>
               <w:start w:w="120" w:type="dxa"/>
@@ -8814,6 +9268,7 @@
         <w:tc>
           <w:tcPr>
             <w:tcW w:type="dxa" w:w="4300"/>
+            <w:shd w:fill="FAFBFC"/>
             <w:tcMar>
               <w:top w:w="80" w:type="dxa"/>
               <w:start w:w="120" w:type="dxa"/>
@@ -8839,6 +9294,7 @@
         <w:tc>
           <w:tcPr>
             <w:tcW w:type="dxa" w:w="5060"/>
+            <w:shd w:fill="FAFBFC"/>
             <w:tcMar>
               <w:top w:w="80" w:type="dxa"/>
               <w:start w:w="120" w:type="dxa"/>
@@ -9410,7 +9866,7 @@
         <w:rPr>
           <w:rFonts w:ascii="맑은 고딕" w:hAnsi="맑은 고딕" w:eastAsia="맑은 고딕" w:cs="맑은 고딕"/>
         </w:rPr>
-        <w:t>Viewer PC에서 새 Viewer 패키지의 SamsungSwitchWatch.Viewer.exe를 직접 실행합니다.</w:t>
+        <w:t>Viewer PC에서 새 Viewer 패키지의 SamsungSwitchWatch.Viewer.Setup.exe로 설치/업데이트를 실행합니다.</w:t>
       </w:r>
     </w:p>
     <w:p>
@@ -9614,7 +10070,7 @@
         <w:color w:val="64748B"/>
         <w:sz w:val="17"/>
       </w:rPr>
-      <w:t xml:space="preserve">v0.11.3-poc  |  </w:t>
+      <w:t xml:space="preserve">v0.11.4-poc  |  </w:t>
     </w:r>
     <w:r>
       <w:rPr>
@@ -9645,7 +10101,7 @@
         <w:color w:val="64748B"/>
         <w:sz w:val="17"/>
       </w:rPr>
-      <w:t>v0.11.3-poc  |  2026-08-05</w:t>
+      <w:t>v0.11.4-poc  |  2026-08-05</w:t>
     </w:r>
   </w:p>
 </w:ftr>

</xml_diff>